<commit_message>
Build final MAVEB manuscript artifacts
</commit_message>
<xml_diff>
--- a/researchpaper/MAVEB_manuscript.docx
+++ b/researchpaper/MAVEB_manuscript.docx
@@ -188,7 +188,7 @@
         <w:t xml:space="preserve"> </w:t>
       </w:r>
       <w:r>
-        <w:t xml:space="preserve">(CBRC). CBRCrepresents a revision over a typed dependency graph with three edge semantics:</w:t>
+        <w:t xml:space="preserve">(CBRC). CBRC represents a revision over a typed dependency graph with three edge semantics:</w:t>
       </w:r>
       <w:r>
         <w:t xml:space="preserve"> </w:t>
@@ -258,7 +258,20 @@
         <w:t xml:space="preserve"> </w:t>
       </w:r>
       <w:r>
-        <w:t xml:space="preserve">is certified against one or more quantities of interest. A local result is accepted only if (1) exact predecessors are closed, (2) the conservative exterior bound lies inside the declared tolerance, and (3) calibrated regional work is lower than the independently measured full baseline. Unsupported coupling, unstable analytic structure, or an unfavorable work crossover returns</w:t>
+        <w:t xml:space="preserve">is certified against one or more quantities of interest. We call the worst normalized certificate-to-tolerance ratio the</w:t>
+      </w:r>
+      <w:r>
+        <w:t xml:space="preserve"> </w:t>
+      </w:r>
+      <w:r>
+        <w:rPr>
+          <w:iCs/>
+          <w:i/>
+        </w:rPr>
+        <w:t xml:space="preserve">revision criticality</w:t>
+      </w:r>
+      <w:r>
+        <w:t xml:space="preserve">; the boundary value is one. A local result is accepted only if (1) exact predecessors are closed, (2) revision criticality is at or below one for every protected output, and (3) calibrated regional work is lower than the independently measured full baseline. Unsupported coupling, supercritical residual influence, unstable analytic structure, or an unfavorable work crossover returns</w:t>
       </w:r>
       <w:r>
         <w:t xml:space="preserve"> </w:t>
@@ -595,7 +608,7 @@
         <w:pStyle w:val="BodyText"/>
       </w:pPr>
       <w:r>
-        <w:t xml:space="preserve">Our evaluation freezes both protocol and claim boundaries before interpreting the final campaign. Across 60 public RGB/SfM revisions, CBRCselects 44 certified-local repairs and 16 automatic full rebuilds. No certificate violation is observed, native and Python planner decisions agree on all cases, and 56 of 60 source edits exceed the protected RGB tolerance before repair, which rules out the trivial explanation that the campaign contains only visually irrelevant edits. A frozen isolated millisecond cost model reports a median selected heterogeneous work ratio of 0.36953 of</w:t>
+        <w:t xml:space="preserve">Our evaluation freezes both protocol and claim boundaries before interpreting the final campaign. Across 60 public RGB/SfM revisions, CBRC selects 44 certified-local repairs and 16 automatic full rebuilds. No certificate violation is observed, native and Python planner decisions agree on all cases, and 56 of 60 source edits exceed the protected RGB tolerance before repair, which rules out the trivial explanation that the campaign contains only visually irrelevant edits. A frozen isolated millisecond cost model reports a median selected heterogeneous work ratio of 0.36953 of</w:t>
       </w:r>
       <w:r>
         <w:t xml:space="preserve"> </w:t>
@@ -952,13 +965,13 @@
       </w:r>
     </w:p>
     <w:bookmarkEnd w:id="24"/>
-    <w:bookmarkStart w:id="25" w:name="X9a513f5c9e67cec8b12985e80e162e71f8bf261"/>
+    <w:bookmarkStart w:id="25" w:name="Xe058922cb2ad9f50eb5d0cc67129a8e54cd7c86"/>
     <w:p>
       <w:pPr>
         <w:pStyle w:val="Heading4"/>
       </w:pPr>
       <w:r>
-        <w:t xml:space="preserve">Incremental computation and error control.</w:t>
+        <w:t xml:space="preserve">Incremental rendering, change propagation, and goal-oriented error control.</w:t>
       </w:r>
     </w:p>
     <w:p>
@@ -966,7 +979,66 @@
         <w:pStyle w:val="FirstParagraph"/>
       </w:pPr>
       <w:r>
-        <w:t xml:space="preserve">The mathematical tools underlying CBRC are classical: graph closure, non-negative influence propagation, Neumann-series resolvents, norm bounds, and greedy search are not introduced by this work. The contribution lies in the captured-world specialization and the systems contract that keeps exact and approximate dependencies separate, binds the residual to an explicit output, compares regional work to an independent full baseline, and falsifies each selected repair against full replay. We therefore treat the mathematics as supporting machinery rather than as standalone novelty.</w:t>
+        <w:t xml:space="preserve">Graphics systems have long exploited dependency structure to avoid global recomputation. Bala et al. track dependencies between edited world regions and bounded-error radiance interpolants using ray segment trees</w:t>
+      </w:r>
+      <w:r>
+        <w:t xml:space="preserve"> </w:t>
+      </w:r>
+      <w:r>
+        <w:t xml:space="preserve">(Bala, Dorsey, and Teller 1999)</w:t>
+      </w:r>
+      <w:r>
+        <w:t xml:space="preserve">. Wörister et al. synthesize a dependency graph from scene-graph changes to rendering caches and update those caches incrementally</w:t>
+      </w:r>
+      <w:r>
+        <w:t xml:space="preserve"> </w:t>
+      </w:r>
+      <w:r>
+        <w:t xml:space="preserve">(Wörister et al. 2013)</w:t>
+      </w:r>
+      <w:r>
+        <w:t xml:space="preserve">. Outside graphics, self-adjusting computation formalizes correct change propagation under mutation and reuse</w:t>
+      </w:r>
+      <w:r>
+        <w:t xml:space="preserve"> </w:t>
+      </w:r>
+      <w:r>
+        <w:t xml:space="preserve">(Acar, Blume, and Donham 2013)</w:t>
+      </w:r>
+      <w:r>
+        <w:t xml:space="preserve">, while goal-oriented error estimation allocates numerical work to control error in selected quantities of interest rather than a global state norm</w:t>
+      </w:r>
+      <w:r>
+        <w:t xml:space="preserve"> </w:t>
+      </w:r>
+      <w:r>
+        <w:t xml:space="preserve">(Oden and Prudhomme 2001)</w:t>
+      </w:r>
+      <w:r>
+        <w:t xml:space="preserve">. These traditions overlap with individual ingredients of CBRC and are therefore important novelty boundaries.</w:t>
+      </w:r>
+    </w:p>
+    <w:p>
+      <w:pPr>
+        <w:pStyle w:val="BodyText"/>
+      </w:pPr>
+      <w:r>
+        <w:t xml:space="preserve">The mathematical tools underlying CBRC remain classical: graph closure, non-negative influence propagation, Neumann-series resolvents, norm bounds, and greedy search are not introduced by this work. The claimed contribution is the captured-world systems contract that combines cross-derived exact dependencies, conservative finite-change bounds, rendered-output quantities of interest, heterogeneous work crossover, fail-closed</w:t>
+      </w:r>
+      <w:r>
+        <w:t xml:space="preserve"> </w:t>
+      </w:r>
+      <w:r>
+        <w:rPr>
+          <w:smallCaps/>
+        </w:rPr>
+        <w:t xml:space="preserve">Full</w:t>
+      </w:r>
+      <w:r>
+        <w:t xml:space="preserve"> </w:t>
+      </w:r>
+      <w:r>
+        <w:t xml:space="preserve">fallback, and independent full-reference falsification in one revision decision. We therefore treat the mathematics as supporting machinery rather than as standalone novelty.</w:t>
       </w:r>
     </w:p>
     <w:bookmarkEnd w:id="25"/>
@@ -1852,7 +1924,7 @@
     </w:p>
     <w:bookmarkEnd w:id="30"/>
     <w:bookmarkEnd w:id="31"/>
-    <w:bookmarkStart w:id="38" w:name="criticality-bounded-revision-cones"/>
+    <w:bookmarkStart w:id="42" w:name="criticality-bounded-revision-cones"/>
     <w:p>
       <w:pPr>
         <w:pStyle w:val="Heading1"/>
@@ -2837,13 +2909,13 @@
       </w:r>
     </w:p>
     <w:bookmarkEnd w:id="34"/>
-    <w:bookmarkStart w:id="35" w:name="gaussian-display-space-bound"/>
+    <w:bookmarkStart w:id="35" w:name="revision-criticality"/>
     <w:p>
       <w:pPr>
         <w:pStyle w:val="Heading2"/>
       </w:pPr>
       <w:r>
-        <w:t xml:space="preserve">Gaussian display-space bound</w:t>
+        <w:t xml:space="preserve">Revision criticality</w:t>
       </w:r>
     </w:p>
     <w:p>
@@ -2851,233 +2923,7 @@
         <w:pStyle w:val="FirstParagraph"/>
       </w:pPr>
       <w:r>
-        <w:t xml:space="preserve">For a projected Gaussian</w:t>
-      </w:r>
-      <w:r>
-        <w:t xml:space="preserve"> </w:t>
-      </w:r>
-      <m:oMath>
-        <m:r>
-          <m:t>i</m:t>
-        </m:r>
-      </m:oMath>
-      <w:r>
-        <w:t xml:space="preserve"> </w:t>
-      </w:r>
-      <w:r>
-        <w:t xml:space="preserve">at pixel</w:t>
-      </w:r>
-      <w:r>
-        <w:t xml:space="preserve"> </w:t>
-      </w:r>
-      <m:oMath>
-        <m:r>
-          <m:t>p</m:t>
-        </m:r>
-      </m:oMath>
-      <w:r>
-        <w:t xml:space="preserve">, MAVEB uses an effective alpha model consistent with the renderer,</w:t>
-      </w:r>
-    </w:p>
-    <w:p>
-      <w:pPr>
-        <w:pStyle w:val="BodyText"/>
-      </w:pPr>
-      <m:oMathPara>
-        <m:oMathParaPr>
-          <m:jc m:val="center"/>
-        </m:oMathParaPr>
-        <m:oMath>
-          <m:sSub>
-            <m:e>
-              <m:r>
-                <m:t>α</m:t>
-              </m:r>
-            </m:e>
-            <m:sub>
-              <m:r>
-                <m:t>i</m:t>
-              </m:r>
-            </m:sub>
-          </m:sSub>
-          <m:d>
-            <m:dPr>
-              <m:begChr m:val="("/>
-              <m:endChr m:val=")"/>
-              <m:sepChr m:val=""/>
-              <m:grow/>
-            </m:dPr>
-            <m:e>
-              <m:r>
-                <m:t>p</m:t>
-              </m:r>
-            </m:e>
-          </m:d>
-          <m:r>
-            <m:rPr>
-              <m:sty m:val="p"/>
-            </m:rPr>
-            <m:t>=</m:t>
-          </m:r>
-          <m:sSub>
-            <m:e>
-              <m:r>
-                <m:t>o</m:t>
-              </m:r>
-            </m:e>
-            <m:sub>
-              <m:r>
-                <m:t>i</m:t>
-              </m:r>
-            </m:sub>
-          </m:sSub>
-          <m:r>
-            <m:rPr>
-              <m:sty m:val="p"/>
-            </m:rPr>
-            <m:t>exp</m:t>
-          </m:r>
-          <m:d>
-            <m:dPr>
-              <m:begChr m:val="("/>
-              <m:endChr m:val=")"/>
-              <m:sepChr m:val=""/>
-              <m:grow/>
-            </m:dPr>
-            <m:e>
-              <m:r>
-                <m:rPr>
-                  <m:sty m:val="p"/>
-                </m:rPr>
-                <m:t>−</m:t>
-              </m:r>
-              <m:f>
-                <m:fPr>
-                  <m:type m:val="bar"/>
-                </m:fPr>
-                <m:num>
-                  <m:r>
-                    <m:t>1</m:t>
-                  </m:r>
-                </m:num>
-                <m:den>
-                  <m:r>
-                    <m:t>2</m:t>
-                  </m:r>
-                </m:den>
-              </m:f>
-              <m:sSub>
-                <m:e>
-                  <m:r>
-                    <m:t>q</m:t>
-                  </m:r>
-                </m:e>
-                <m:sub>
-                  <m:r>
-                    <m:t>i</m:t>
-                  </m:r>
-                </m:sub>
-              </m:sSub>
-              <m:d>
-                <m:dPr>
-                  <m:begChr m:val="("/>
-                  <m:endChr m:val=")"/>
-                  <m:sepChr m:val=""/>
-                  <m:grow/>
-                </m:dPr>
-                <m:e>
-                  <m:r>
-                    <m:t>p</m:t>
-                  </m:r>
-                </m:e>
-              </m:d>
-            </m:e>
-          </m:d>
-          <m:r>
-            <m:rPr>
-              <m:sty m:val="p"/>
-            </m:rPr>
-            <m:t>,</m:t>
-          </m:r>
-        </m:oMath>
-      </m:oMathPara>
-    </w:p>
-    <w:p>
-      <w:pPr>
-        <w:pStyle w:val="FirstParagraph"/>
-      </w:pPr>
-      <w:r>
-        <w:t xml:space="preserve">where</w:t>
-      </w:r>
-      <w:r>
-        <w:t xml:space="preserve"> </w:t>
-      </w:r>
-      <m:oMath>
-        <m:sSub>
-          <m:e>
-            <m:r>
-              <m:t>o</m:t>
-            </m:r>
-          </m:e>
-          <m:sub>
-            <m:r>
-              <m:t>i</m:t>
-            </m:r>
-          </m:sub>
-        </m:sSub>
-      </m:oMath>
-      <w:r>
-        <w:t xml:space="preserve"> </w:t>
-      </w:r>
-      <w:r>
-        <w:t xml:space="preserve">is peak opacity and</w:t>
-      </w:r>
-      <w:r>
-        <w:t xml:space="preserve"> </w:t>
-      </w:r>
-      <m:oMath>
-        <m:sSub>
-          <m:e>
-            <m:r>
-              <m:t>q</m:t>
-            </m:r>
-          </m:e>
-          <m:sub>
-            <m:r>
-              <m:t>i</m:t>
-            </m:r>
-          </m:sub>
-        </m:sSub>
-        <m:d>
-          <m:dPr>
-            <m:begChr m:val="("/>
-            <m:endChr m:val=")"/>
-            <m:sepChr m:val=""/>
-            <m:grow/>
-          </m:dPr>
-          <m:e>
-            <m:r>
-              <m:t>p</m:t>
-            </m:r>
-          </m:e>
-        </m:d>
-      </m:oMath>
-      <w:r>
-        <w:t xml:space="preserve"> </w:t>
-      </w:r>
-      <w:r>
-        <w:t xml:space="preserve">is squared Mahalanobis distance in projected Gaussian space. For edited set</w:t>
-      </w:r>
-      <w:r>
-        <w:t xml:space="preserve"> </w:t>
-      </w:r>
-      <m:oMath>
-        <m:r>
-          <m:t>E</m:t>
-        </m:r>
-      </m:oMath>
-      <w:r>
-        <w:t xml:space="preserve">, define aggregate opacity mass</w:t>
+        <w:t xml:space="preserve">We define the revision criticality of a candidate cone as the worst normalized certified residual</w:t>
       </w:r>
     </w:p>
     <w:p>
@@ -3090,926 +2936,7 @@
         </m:oMathParaPr>
         <m:oMath>
           <m:r>
-            <m:t>A</m:t>
-          </m:r>
-          <m:d>
-            <m:dPr>
-              <m:begChr m:val="("/>
-              <m:endChr m:val=")"/>
-              <m:sepChr m:val=""/>
-              <m:grow/>
-            </m:dPr>
-            <m:e>
-              <m:r>
-                <m:t>E</m:t>
-              </m:r>
-            </m:e>
-          </m:d>
-          <m:r>
-            <m:rPr>
-              <m:sty m:val="p"/>
-            </m:rPr>
-            <m:t>=</m:t>
-          </m:r>
-          <m:r>
-            <m:t>1</m:t>
-          </m:r>
-          <m:r>
-            <m:rPr>
-              <m:sty m:val="p"/>
-            </m:rPr>
-            <m:t>−</m:t>
-          </m:r>
-          <m:nary>
-            <m:naryPr>
-              <m:chr m:val="∏"/>
-              <m:limLoc m:val="undOvr"/>
-              <m:subHide m:val="off"/>
-              <m:supHide m:val="on"/>
-            </m:naryPr>
-            <m:sub>
-              <m:r>
-                <m:t>i</m:t>
-              </m:r>
-              <m:r>
-                <m:rPr>
-                  <m:sty m:val="p"/>
-                </m:rPr>
-                <m:t>∈</m:t>
-              </m:r>
-              <m:r>
-                <m:t>E</m:t>
-              </m:r>
-            </m:sub>
-            <m:sup>
-              <m:r>
-                <m:t>​</m:t>
-              </m:r>
-            </m:sup>
-            <m:e>
-              <m:d>
-                <m:dPr>
-                  <m:begChr m:val="("/>
-                  <m:endChr m:val=")"/>
-                  <m:sepChr m:val=""/>
-                  <m:grow/>
-                </m:dPr>
-                <m:e>
-                  <m:r>
-                    <m:t>1</m:t>
-                  </m:r>
-                  <m:r>
-                    <m:rPr>
-                      <m:sty m:val="p"/>
-                    </m:rPr>
-                    <m:t>−</m:t>
-                  </m:r>
-                  <m:sSub>
-                    <m:e>
-                      <m:r>
-                        <m:t>α</m:t>
-                      </m:r>
-                    </m:e>
-                    <m:sub>
-                      <m:r>
-                        <m:t>i</m:t>
-                      </m:r>
-                    </m:sub>
-                  </m:sSub>
-                </m:e>
-              </m:d>
-            </m:e>
-          </m:nary>
-          <m:r>
-            <m:rPr>
-              <m:sty m:val="p"/>
-            </m:rPr>
-            <m:t>.</m:t>
-          </m:r>
-        </m:oMath>
-      </m:oMathPara>
-    </w:p>
-    <w:p>
-      <w:pPr>
-        <w:pStyle w:val="FirstParagraph"/>
-      </w:pPr>
-      <w:r>
-        <w:t xml:space="preserve">If the relevant color interval has width</w:t>
-      </w:r>
-      <w:r>
-        <w:t xml:space="preserve"> </w:t>
-      </w:r>
-      <m:oMath>
-        <m:sSub>
-          <m:e>
-            <m:r>
-              <m:t>C</m:t>
-            </m:r>
-          </m:e>
-          <m:sub>
-            <m:r>
-              <m:rPr>
-                <m:sty m:val="p"/>
-              </m:rPr>
-              <m:t>c</m:t>
-            </m:r>
-            <m:r>
-              <m:rPr>
-                <m:sty m:val="p"/>
-              </m:rPr>
-              <m:t>o</m:t>
-            </m:r>
-            <m:r>
-              <m:rPr>
-                <m:sty m:val="p"/>
-              </m:rPr>
-              <m:t>l</m:t>
-            </m:r>
-            <m:r>
-              <m:rPr>
-                <m:sty m:val="p"/>
-              </m:rPr>
-              <m:t>o</m:t>
-            </m:r>
-            <m:r>
-              <m:rPr>
-                <m:sty m:val="p"/>
-              </m:rPr>
-              <m:t>r</m:t>
-            </m:r>
-          </m:sub>
-        </m:sSub>
-      </m:oMath>
-      <w:r>
-        <w:t xml:space="preserve">, adding or removing the edited set changes a pixel by at most</w:t>
-      </w:r>
-      <w:r>
-        <w:t xml:space="preserve"> </w:t>
-      </w:r>
-      <m:oMath>
-        <m:sSub>
-          <m:e>
-            <m:r>
-              <m:t>C</m:t>
-            </m:r>
-          </m:e>
-          <m:sub>
-            <m:r>
-              <m:rPr>
-                <m:sty m:val="p"/>
-              </m:rPr>
-              <m:t>c</m:t>
-            </m:r>
-            <m:r>
-              <m:rPr>
-                <m:sty m:val="p"/>
-              </m:rPr>
-              <m:t>o</m:t>
-            </m:r>
-            <m:r>
-              <m:rPr>
-                <m:sty m:val="p"/>
-              </m:rPr>
-              <m:t>l</m:t>
-            </m:r>
-            <m:r>
-              <m:rPr>
-                <m:sty m:val="p"/>
-              </m:rPr>
-              <m:t>o</m:t>
-            </m:r>
-            <m:r>
-              <m:rPr>
-                <m:sty m:val="p"/>
-              </m:rPr>
-              <m:t>r</m:t>
-            </m:r>
-          </m:sub>
-        </m:sSub>
-        <m:r>
-          <m:t>A</m:t>
-        </m:r>
-        <m:d>
-          <m:dPr>
-            <m:begChr m:val="("/>
-            <m:endChr m:val=")"/>
-            <m:sepChr m:val=""/>
-            <m:grow/>
-          </m:dPr>
-          <m:e>
-            <m:r>
-              <m:t>E</m:t>
-            </m:r>
-          </m:e>
-        </m:d>
-      </m:oMath>
-      <w:r>
-        <w:t xml:space="preserve">. Comparing before and after edited sets</w:t>
-      </w:r>
-      <w:r>
-        <w:t xml:space="preserve"> </w:t>
-      </w:r>
-      <m:oMath>
-        <m:sSub>
-          <m:e>
-            <m:r>
-              <m:t>E</m:t>
-            </m:r>
-          </m:e>
-          <m:sub>
-            <m:r>
-              <m:t>0</m:t>
-            </m:r>
-          </m:sub>
-        </m:sSub>
-        <m:r>
-          <m:rPr>
-            <m:sty m:val="p"/>
-          </m:rPr>
-          <m:t>,</m:t>
-        </m:r>
-        <m:sSub>
-          <m:e>
-            <m:r>
-              <m:t>E</m:t>
-            </m:r>
-          </m:e>
-          <m:sub>
-            <m:r>
-              <m:t>1</m:t>
-            </m:r>
-          </m:sub>
-        </m:sSub>
-      </m:oMath>
-      <w:r>
-        <w:t xml:space="preserve"> </w:t>
-      </w:r>
-      <w:r>
-        <w:t xml:space="preserve">gives</w:t>
-      </w:r>
-    </w:p>
-    <w:p>
-      <w:pPr>
-        <w:pStyle w:val="BodyText"/>
-      </w:pPr>
-      <m:oMathPara>
-        <m:oMathParaPr>
-          <m:jc m:val="center"/>
-        </m:oMathParaPr>
-        <m:oMath>
-          <m:sSub>
-            <m:e>
-              <m:d>
-                <m:dPr>
-                  <m:begChr m:val="∥"/>
-                  <m:endChr m:val="∥"/>
-                  <m:sepChr m:val=""/>
-                  <m:grow/>
-                </m:dPr>
-                <m:e>
-                  <m:r>
-                    <m:t>R</m:t>
-                  </m:r>
-                  <m:d>
-                    <m:dPr>
-                      <m:begChr m:val="("/>
-                      <m:endChr m:val=")"/>
-                      <m:sepChr m:val=""/>
-                      <m:grow/>
-                    </m:dPr>
-                    <m:e>
-                      <m:r>
-                        <m:t>U</m:t>
-                      </m:r>
-                      <m:r>
-                        <m:rPr>
-                          <m:sty m:val="p"/>
-                        </m:rPr>
-                        <m:t>∪</m:t>
-                      </m:r>
-                      <m:sSub>
-                        <m:e>
-                          <m:r>
-                            <m:t>E</m:t>
-                          </m:r>
-                        </m:e>
-                        <m:sub>
-                          <m:r>
-                            <m:t>0</m:t>
-                          </m:r>
-                        </m:sub>
-                      </m:sSub>
-                    </m:e>
-                  </m:d>
-                  <m:r>
-                    <m:rPr>
-                      <m:sty m:val="p"/>
-                    </m:rPr>
-                    <m:t>−</m:t>
-                  </m:r>
-                  <m:r>
-                    <m:t>R</m:t>
-                  </m:r>
-                  <m:d>
-                    <m:dPr>
-                      <m:begChr m:val="("/>
-                      <m:endChr m:val=")"/>
-                      <m:sepChr m:val=""/>
-                      <m:grow/>
-                    </m:dPr>
-                    <m:e>
-                      <m:r>
-                        <m:t>U</m:t>
-                      </m:r>
-                      <m:r>
-                        <m:rPr>
-                          <m:sty m:val="p"/>
-                        </m:rPr>
-                        <m:t>∪</m:t>
-                      </m:r>
-                      <m:sSub>
-                        <m:e>
-                          <m:r>
-                            <m:t>E</m:t>
-                          </m:r>
-                        </m:e>
-                        <m:sub>
-                          <m:r>
-                            <m:t>1</m:t>
-                          </m:r>
-                        </m:sub>
-                      </m:sSub>
-                    </m:e>
-                  </m:d>
-                </m:e>
-              </m:d>
-            </m:e>
-            <m:sub>
-              <m:r>
-                <m:rPr>
-                  <m:sty m:val="p"/>
-                </m:rPr>
-                <m:t>∞</m:t>
-              </m:r>
-            </m:sub>
-          </m:sSub>
-          <m:r>
-            <m:rPr>
-              <m:sty m:val="p"/>
-            </m:rPr>
-            <m:t>≤</m:t>
-          </m:r>
-          <m:sSub>
-            <m:e>
-              <m:r>
-                <m:t>C</m:t>
-              </m:r>
-            </m:e>
-            <m:sub>
-              <m:r>
-                <m:rPr>
-                  <m:sty m:val="p"/>
-                </m:rPr>
-                <m:t>c</m:t>
-              </m:r>
-              <m:r>
-                <m:rPr>
-                  <m:sty m:val="p"/>
-                </m:rPr>
-                <m:t>o</m:t>
-              </m:r>
-              <m:r>
-                <m:rPr>
-                  <m:sty m:val="p"/>
-                </m:rPr>
-                <m:t>l</m:t>
-              </m:r>
-              <m:r>
-                <m:rPr>
-                  <m:sty m:val="p"/>
-                </m:rPr>
-                <m:t>o</m:t>
-              </m:r>
-              <m:r>
-                <m:rPr>
-                  <m:sty m:val="p"/>
-                </m:rPr>
-                <m:t>r</m:t>
-              </m:r>
-            </m:sub>
-          </m:sSub>
-          <m:r>
-            <m:rPr>
-              <m:sty m:val="p"/>
-            </m:rPr>
-            <m:t>min</m:t>
-          </m:r>
-          <m:d>
-            <m:dPr>
-              <m:begChr m:val="("/>
-              <m:endChr m:val=")"/>
-              <m:sepChr m:val=""/>
-              <m:grow/>
-            </m:dPr>
-            <m:e>
-              <m:r>
-                <m:t>1</m:t>
-              </m:r>
-              <m:r>
-                <m:rPr>
-                  <m:sty m:val="p"/>
-                </m:rPr>
-                <m:t>,</m:t>
-              </m:r>
-              <m:r>
-                <m:t>A</m:t>
-              </m:r>
-              <m:d>
-                <m:dPr>
-                  <m:begChr m:val="("/>
-                  <m:endChr m:val=")"/>
-                  <m:sepChr m:val=""/>
-                  <m:grow/>
-                </m:dPr>
-                <m:e>
-                  <m:sSub>
-                    <m:e>
-                      <m:r>
-                        <m:t>E</m:t>
-                      </m:r>
-                    </m:e>
-                    <m:sub>
-                      <m:r>
-                        <m:t>0</m:t>
-                      </m:r>
-                    </m:sub>
-                  </m:sSub>
-                </m:e>
-              </m:d>
-              <m:r>
-                <m:rPr>
-                  <m:sty m:val="p"/>
-                </m:rPr>
-                <m:t>+</m:t>
-              </m:r>
-              <m:r>
-                <m:t>A</m:t>
-              </m:r>
-              <m:d>
-                <m:dPr>
-                  <m:begChr m:val="("/>
-                  <m:endChr m:val=")"/>
-                  <m:sepChr m:val=""/>
-                  <m:grow/>
-                </m:dPr>
-                <m:e>
-                  <m:sSub>
-                    <m:e>
-                      <m:r>
-                        <m:t>E</m:t>
-                      </m:r>
-                    </m:e>
-                    <m:sub>
-                      <m:r>
-                        <m:t>1</m:t>
-                      </m:r>
-                    </m:sub>
-                  </m:sSub>
-                </m:e>
-              </m:d>
-            </m:e>
-          </m:d>
-          <m:r>
-            <m:rPr>
-              <m:sty m:val="p"/>
-            </m:rPr>
-            <m:t>.</m:t>
-          </m:r>
-        </m:oMath>
-      </m:oMathPara>
-    </w:p>
-    <w:p>
-      <w:pPr>
-        <w:pStyle w:val="FirstParagraph"/>
-      </w:pPr>
-      <w:r>
-        <w:t xml:space="preserve">The protected-image certificate is the maximum of Eq. </w:t>
-      </w:r>
-      <w:hyperlink w:anchor="eq:gaussianbound">
-        <w:r>
-          <w:rPr>
-            <w:rStyle w:val="Hyperlink"/>
-          </w:rPr>
-          <w:t xml:space="preserve">[eq:gaussianbound]</w:t>
-        </w:r>
-      </w:hyperlink>
-      <w:r>
-        <w:t xml:space="preserve"> </w:t>
-      </w:r>
-      <w:r>
-        <w:t xml:space="preserve">over the declared pixel support. The bound is conservative by construction over the modeled edit and rendering assumptions; it is not a learned predictor of expected error.</w:t>
-      </w:r>
-    </w:p>
-    <w:bookmarkEnd w:id="35"/>
-    <w:bookmarkStart w:id="36" w:name="stable-temporal-history"/>
-    <w:p>
-      <w:pPr>
-        <w:pStyle w:val="Heading2"/>
-      </w:pPr>
-      <w:r>
-        <w:t xml:space="preserve">Stable temporal history</w:t>
-      </w:r>
-    </w:p>
-    <w:p>
-      <w:pPr>
-        <w:pStyle w:val="FirstParagraph"/>
-      </w:pPr>
-      <w:r>
-        <w:t xml:space="preserve">For stable temporal validation, let</w:t>
-      </w:r>
-      <w:r>
-        <w:t xml:space="preserve"> </w:t>
-      </w:r>
-      <m:oMath>
-        <m:sSub>
-          <m:e>
-            <m:r>
-              <m:t>E</m:t>
-            </m:r>
-          </m:e>
-          <m:sub>
-            <m:r>
-              <m:t>c</m:t>
-            </m:r>
-          </m:sub>
-        </m:sSub>
-      </m:oMath>
-      <w:r>
-        <w:t xml:space="preserve"> </w:t>
-      </w:r>
-      <w:r>
-        <w:t xml:space="preserve">denote current-frame error,</w:t>
-      </w:r>
-      <w:r>
-        <w:t xml:space="preserve"> </w:t>
-      </w:r>
-      <m:oMath>
-        <m:sSub>
-          <m:e>
-            <m:r>
-              <m:t>E</m:t>
-            </m:r>
-          </m:e>
-          <m:sub>
-            <m:r>
-              <m:t>h</m:t>
-            </m:r>
-          </m:sub>
-        </m:sSub>
-      </m:oMath>
-      <w:r>
-        <w:t xml:space="preserve"> </w:t>
-      </w:r>
-      <w:r>
-        <w:t xml:space="preserve">retained-history error,</w:t>
-      </w:r>
-      <w:r>
-        <w:t xml:space="preserve"> </w:t>
-      </w:r>
-      <m:oMath>
-        <m:sSub>
-          <m:e>
-            <m:r>
-              <m:t>E</m:t>
-            </m:r>
-          </m:e>
-          <m:sub>
-            <m:r>
-              <m:t>n</m:t>
-            </m:r>
-          </m:sub>
-        </m:sSub>
-      </m:oMath>
-      <w:r>
-        <w:t xml:space="preserve"> </w:t>
-      </w:r>
-      <w:r>
-        <w:t xml:space="preserve">neighborhood or clamping error, and</w:t>
-      </w:r>
-      <w:r>
-        <w:t xml:space="preserve"> </w:t>
-      </w:r>
-      <m:oMath>
-        <m:r>
-          <m:t>w</m:t>
-        </m:r>
-        <m:r>
-          <m:rPr>
-            <m:sty m:val="p"/>
-          </m:rPr>
-          <m:t>∈</m:t>
-        </m:r>
-        <m:d>
-          <m:dPr>
-            <m:begChr m:val="["/>
-            <m:endChr m:val="]"/>
-            <m:sepChr m:val=""/>
-            <m:grow/>
-          </m:dPr>
-          <m:e>
-            <m:r>
-              <m:t>0</m:t>
-            </m:r>
-            <m:r>
-              <m:rPr>
-                <m:sty m:val="p"/>
-              </m:rPr>
-              <m:t>,</m:t>
-            </m:r>
-            <m:r>
-              <m:t>1</m:t>
-            </m:r>
-          </m:e>
-        </m:d>
-      </m:oMath>
-      <w:r>
-        <w:t xml:space="preserve"> </w:t>
-      </w:r>
-      <w:r>
-        <w:t xml:space="preserve">the history weight. With</w:t>
-      </w:r>
-      <w:r>
-        <w:t xml:space="preserve"> </w:t>
-      </w:r>
-      <m:oMath>
-        <m:sSub>
-          <m:e>
-            <m:r>
-              <m:t>E</m:t>
-            </m:r>
-          </m:e>
-          <m:sub>
-            <m:r>
-              <m:t>r</m:t>
-            </m:r>
-          </m:sub>
-        </m:sSub>
-        <m:r>
-          <m:rPr>
-            <m:sty m:val="p"/>
-          </m:rPr>
-          <m:t>=</m:t>
-        </m:r>
-        <m:r>
-          <m:rPr>
-            <m:sty m:val="p"/>
-          </m:rPr>
-          <m:t>max</m:t>
-        </m:r>
-        <m:d>
-          <m:dPr>
-            <m:begChr m:val="("/>
-            <m:endChr m:val=")"/>
-            <m:sepChr m:val=""/>
-            <m:grow/>
-          </m:dPr>
-          <m:e>
-            <m:sSub>
-              <m:e>
-                <m:r>
-                  <m:t>E</m:t>
-                </m:r>
-              </m:e>
-              <m:sub>
-                <m:r>
-                  <m:t>h</m:t>
-                </m:r>
-              </m:sub>
-            </m:sSub>
-            <m:r>
-              <m:rPr>
-                <m:sty m:val="p"/>
-              </m:rPr>
-              <m:t>,</m:t>
-            </m:r>
-            <m:sSub>
-              <m:e>
-                <m:r>
-                  <m:t>E</m:t>
-                </m:r>
-              </m:e>
-              <m:sub>
-                <m:r>
-                  <m:t>n</m:t>
-                </m:r>
-              </m:sub>
-            </m:sSub>
-          </m:e>
-        </m:d>
-      </m:oMath>
-      <w:r>
-        <w:t xml:space="preserve">,</w:t>
-      </w:r>
-    </w:p>
-    <w:p>
-      <w:pPr>
-        <w:pStyle w:val="BodyText"/>
-      </w:pPr>
-      <m:oMathPara>
-        <m:oMathParaPr>
-          <m:jc m:val="center"/>
-        </m:oMathParaPr>
-        <m:oMath>
-          <m:sSub>
-            <m:e>
-              <m:r>
-                <m:t>E</m:t>
-              </m:r>
-            </m:e>
-            <m:sub>
-              <m:r>
-                <m:rPr>
-                  <m:sty m:val="p"/>
-                </m:rPr>
-                <m:t>r</m:t>
-              </m:r>
-              <m:r>
-                <m:rPr>
-                  <m:sty m:val="p"/>
-                </m:rPr>
-                <m:t>e</m:t>
-              </m:r>
-              <m:r>
-                <m:rPr>
-                  <m:sty m:val="p"/>
-                </m:rPr>
-                <m:t>s</m:t>
-              </m:r>
-              <m:r>
-                <m:rPr>
-                  <m:sty m:val="p"/>
-                </m:rPr>
-                <m:t>o</m:t>
-              </m:r>
-              <m:r>
-                <m:rPr>
-                  <m:sty m:val="p"/>
-                </m:rPr>
-                <m:t>l</m:t>
-              </m:r>
-              <m:r>
-                <m:rPr>
-                  <m:sty m:val="p"/>
-                </m:rPr>
-                <m:t>v</m:t>
-              </m:r>
-              <m:r>
-                <m:rPr>
-                  <m:sty m:val="p"/>
-                </m:rPr>
-                <m:t>e</m:t>
-              </m:r>
-              <m:r>
-                <m:rPr>
-                  <m:sty m:val="p"/>
-                </m:rPr>
-                <m:t>d</m:t>
-              </m:r>
-            </m:sub>
-          </m:sSub>
-          <m:r>
-            <m:rPr>
-              <m:sty m:val="p"/>
-            </m:rPr>
-            <m:t>=</m:t>
-          </m:r>
-          <m:d>
-            <m:dPr>
-              <m:begChr m:val="("/>
-              <m:endChr m:val=")"/>
-              <m:sepChr m:val=""/>
-              <m:grow/>
-            </m:dPr>
-            <m:e>
-              <m:r>
-                <m:t>1</m:t>
-              </m:r>
-              <m:r>
-                <m:rPr>
-                  <m:sty m:val="p"/>
-                </m:rPr>
-                <m:t>−</m:t>
-              </m:r>
-              <m:r>
-                <m:t>w</m:t>
-              </m:r>
-            </m:e>
-          </m:d>
-          <m:sSub>
-            <m:e>
-              <m:r>
-                <m:t>E</m:t>
-              </m:r>
-            </m:e>
-            <m:sub>
-              <m:r>
-                <m:t>c</m:t>
-              </m:r>
-            </m:sub>
-          </m:sSub>
-          <m:r>
-            <m:rPr>
-              <m:sty m:val="p"/>
-            </m:rPr>
-            <m:t>+</m:t>
-          </m:r>
-          <m:r>
-            <m:t>w</m:t>
-          </m:r>
-          <m:sSub>
-            <m:e>
-              <m:r>
-                <m:t>E</m:t>
-              </m:r>
-            </m:e>
-            <m:sub>
-              <m:r>
-                <m:t>r</m:t>
-              </m:r>
-            </m:sub>
-          </m:sSub>
-          <m:r>
-            <m:rPr>
-              <m:sty m:val="p"/>
-            </m:rPr>
-            <m:t>.</m:t>
-          </m:r>
-        </m:oMath>
-      </m:oMathPara>
-    </w:p>
-    <w:p>
-      <w:pPr>
-        <w:pStyle w:val="FirstParagraph"/>
-      </w:pPr>
-      <w:r>
-        <w:t xml:space="preserve">If validation, reprojection, or disocclusion may itself change, MAVEB promotes the relation to</w:t>
-      </w:r>
-      <w:r>
-        <w:t xml:space="preserve"> </w:t>
-      </w:r>
-      <w:r>
-        <w:rPr>
-          <w:smallCaps/>
-        </w:rPr>
-        <w:t xml:space="preserve">Hard</w:t>
-      </w:r>
-      <w:r>
-        <w:t xml:space="preserve"> </w:t>
-      </w:r>
-      <w:r>
-        <w:t xml:space="preserve">invalidation instead of applying Eq. </w:t>
-      </w:r>
-      <w:hyperlink w:anchor="eq:temporal">
-        <w:r>
-          <w:rPr>
-            <w:rStyle w:val="Hyperlink"/>
-          </w:rPr>
-          <w:t xml:space="preserve">[eq:temporal]</w:t>
-        </w:r>
-      </w:hyperlink>
-      <w:r>
-        <w:t xml:space="preserve">. Thus the temporal path demonstrates the central design rule: use a soft bound only while its preconditions are certifiable.</w:t>
-      </w:r>
-    </w:p>
-    <w:bookmarkEnd w:id="36"/>
-    <w:bookmarkStart w:id="37" w:name="X62e354406816ed1168c1ad132bd8541650ea272"/>
-    <w:p>
-      <w:pPr>
-        <w:pStyle w:val="Heading2"/>
-      </w:pPr>
-      <w:r>
-        <w:t xml:space="preserve">Greedy feasible-cone search and crossover</w:t>
-      </w:r>
-    </w:p>
-    <w:p>
-      <w:pPr>
-        <w:pStyle w:val="FirstParagraph"/>
-      </w:pPr>
-      <w:r>
-        <w:t xml:space="preserve">Define normalized violation</w:t>
-      </w:r>
-    </w:p>
-    <w:p>
-      <w:pPr>
-        <w:pStyle w:val="BodyText"/>
-      </w:pPr>
-      <m:oMathPara>
-        <m:oMathParaPr>
-          <m:jc m:val="center"/>
-        </m:oMathParaPr>
-        <m:oMath>
-          <m:r>
-            <m:t>ϕ</m:t>
+            <m:t>χ</m:t>
           </m:r>
           <m:d>
             <m:dPr>
@@ -4154,14 +3081,50 @@
         <w:pStyle w:val="FirstParagraph"/>
       </w:pPr>
       <w:r>
-        <w:t xml:space="preserve">A passing cone has</w:t>
+        <w:t xml:space="preserve">The threshold</w:t>
       </w:r>
       <w:r>
         <w:t xml:space="preserve"> </w:t>
       </w:r>
       <m:oMath>
         <m:r>
-          <m:t>ϕ</m:t>
+          <m:t>χ</m:t>
+        </m:r>
+        <m:d>
+          <m:dPr>
+            <m:begChr m:val="("/>
+            <m:endChr m:val=")"/>
+            <m:sepChr m:val=""/>
+            <m:grow/>
+          </m:dPr>
+          <m:e>
+            <m:r>
+              <m:t>C</m:t>
+            </m:r>
+          </m:e>
+        </m:d>
+        <m:r>
+          <m:rPr>
+            <m:sty m:val="p"/>
+          </m:rPr>
+          <m:t>=</m:t>
+        </m:r>
+        <m:r>
+          <m:t>1</m:t>
+        </m:r>
+      </m:oMath>
+      <w:r>
+        <w:t xml:space="preserve"> </w:t>
+      </w:r>
+      <w:r>
+        <w:t xml:space="preserve">is the certificate boundary:</w:t>
+      </w:r>
+      <w:r>
+        <w:t xml:space="preserve"> </w:t>
+      </w:r>
+      <m:oMath>
+        <m:r>
+          <m:t>χ</m:t>
         </m:r>
         <m:d>
           <m:dPr>
@@ -4187,7 +3150,1659 @@
         </m:r>
       </m:oMath>
       <w:r>
-        <w:t xml:space="preserve">. For a candidate expansion</w:t>
+        <w:t xml:space="preserve"> </w:t>
+      </w:r>
+      <w:r>
+        <w:t xml:space="preserve">is certificate-feasible, whereas</w:t>
+      </w:r>
+      <w:r>
+        <w:t xml:space="preserve"> </w:t>
+      </w:r>
+      <m:oMath>
+        <m:r>
+          <m:t>χ</m:t>
+        </m:r>
+        <m:d>
+          <m:dPr>
+            <m:begChr m:val="("/>
+            <m:endChr m:val=")"/>
+            <m:sepChr m:val=""/>
+            <m:grow/>
+          </m:dPr>
+          <m:e>
+            <m:r>
+              <m:t>C</m:t>
+            </m:r>
+          </m:e>
+        </m:d>
+        <m:r>
+          <m:rPr>
+            <m:sty m:val="p"/>
+          </m:rPr>
+          <m:t>&gt;</m:t>
+        </m:r>
+        <m:r>
+          <m:t>1</m:t>
+        </m:r>
+      </m:oMath>
+      <w:r>
+        <w:t xml:space="preserve"> </w:t>
+      </w:r>
+      <w:r>
+        <w:t xml:space="preserve">is supercritical for at least one protected output and requires cone expansion or</w:t>
+      </w:r>
+      <w:r>
+        <w:t xml:space="preserve"> </w:t>
+      </w:r>
+      <w:r>
+        <w:rPr>
+          <w:smallCaps/>
+        </w:rPr>
+        <w:t xml:space="preserve">Full</w:t>
+      </w:r>
+      <w:r>
+        <w:t xml:space="preserve">. The term</w:t>
+      </w:r>
+      <w:r>
+        <w:t xml:space="preserve"> </w:t>
+      </w:r>
+      <w:r>
+        <w:rPr>
+          <w:iCs/>
+          <w:i/>
+        </w:rPr>
+        <w:t xml:space="preserve">criticality-bounded</w:t>
+      </w:r>
+      <w:r>
+        <w:t xml:space="preserve"> </w:t>
+      </w:r>
+      <w:r>
+        <w:t xml:space="preserve">refers to this explicit normalized output-error boundary; it is not intended as a new physical critical-phenomena model.</w:t>
+      </w:r>
+    </w:p>
+    <w:bookmarkEnd w:id="35"/>
+    <w:bookmarkStart w:id="39" w:name="gaussian-display-space-bound"/>
+    <w:p>
+      <w:pPr>
+        <w:pStyle w:val="Heading2"/>
+      </w:pPr>
+      <w:r>
+        <w:t xml:space="preserve">Gaussian display-space bound</w:t>
+      </w:r>
+    </w:p>
+    <w:p>
+      <w:pPr>
+        <w:pStyle w:val="FirstParagraph"/>
+      </w:pPr>
+      <w:r>
+        <w:t xml:space="preserve">For a projected Gaussian</w:t>
+      </w:r>
+      <w:r>
+        <w:t xml:space="preserve"> </w:t>
+      </w:r>
+      <m:oMath>
+        <m:r>
+          <m:t>i</m:t>
+        </m:r>
+      </m:oMath>
+      <w:r>
+        <w:t xml:space="preserve"> </w:t>
+      </w:r>
+      <w:r>
+        <w:t xml:space="preserve">at pixel</w:t>
+      </w:r>
+      <w:r>
+        <w:t xml:space="preserve"> </w:t>
+      </w:r>
+      <m:oMath>
+        <m:r>
+          <m:t>p</m:t>
+        </m:r>
+      </m:oMath>
+      <w:r>
+        <w:t xml:space="preserve">, MAVEB uses an effective alpha model consistent with the renderer,</w:t>
+      </w:r>
+    </w:p>
+    <w:p>
+      <w:pPr>
+        <w:pStyle w:val="BodyText"/>
+      </w:pPr>
+      <m:oMathPara>
+        <m:oMathParaPr>
+          <m:jc m:val="center"/>
+        </m:oMathParaPr>
+        <m:oMath>
+          <m:sSub>
+            <m:e>
+              <m:r>
+                <m:t>α</m:t>
+              </m:r>
+            </m:e>
+            <m:sub>
+              <m:r>
+                <m:t>i</m:t>
+              </m:r>
+            </m:sub>
+          </m:sSub>
+          <m:d>
+            <m:dPr>
+              <m:begChr m:val="("/>
+              <m:endChr m:val=")"/>
+              <m:sepChr m:val=""/>
+              <m:grow/>
+            </m:dPr>
+            <m:e>
+              <m:r>
+                <m:t>p</m:t>
+              </m:r>
+            </m:e>
+          </m:d>
+          <m:r>
+            <m:rPr>
+              <m:sty m:val="p"/>
+            </m:rPr>
+            <m:t>=</m:t>
+          </m:r>
+          <m:sSub>
+            <m:e>
+              <m:r>
+                <m:t>o</m:t>
+              </m:r>
+            </m:e>
+            <m:sub>
+              <m:r>
+                <m:t>i</m:t>
+              </m:r>
+            </m:sub>
+          </m:sSub>
+          <m:r>
+            <m:rPr>
+              <m:sty m:val="p"/>
+            </m:rPr>
+            <m:t>exp</m:t>
+          </m:r>
+          <m:d>
+            <m:dPr>
+              <m:begChr m:val="("/>
+              <m:endChr m:val=")"/>
+              <m:sepChr m:val=""/>
+              <m:grow/>
+            </m:dPr>
+            <m:e>
+              <m:r>
+                <m:rPr>
+                  <m:sty m:val="p"/>
+                </m:rPr>
+                <m:t>−</m:t>
+              </m:r>
+              <m:f>
+                <m:fPr>
+                  <m:type m:val="bar"/>
+                </m:fPr>
+                <m:num>
+                  <m:r>
+                    <m:t>1</m:t>
+                  </m:r>
+                </m:num>
+                <m:den>
+                  <m:r>
+                    <m:t>2</m:t>
+                  </m:r>
+                </m:den>
+              </m:f>
+              <m:sSub>
+                <m:e>
+                  <m:r>
+                    <m:t>q</m:t>
+                  </m:r>
+                </m:e>
+                <m:sub>
+                  <m:r>
+                    <m:t>i</m:t>
+                  </m:r>
+                </m:sub>
+              </m:sSub>
+              <m:d>
+                <m:dPr>
+                  <m:begChr m:val="("/>
+                  <m:endChr m:val=")"/>
+                  <m:sepChr m:val=""/>
+                  <m:grow/>
+                </m:dPr>
+                <m:e>
+                  <m:r>
+                    <m:t>p</m:t>
+                  </m:r>
+                </m:e>
+              </m:d>
+            </m:e>
+          </m:d>
+          <m:r>
+            <m:rPr>
+              <m:sty m:val="p"/>
+            </m:rPr>
+            <m:t>,</m:t>
+          </m:r>
+        </m:oMath>
+      </m:oMathPara>
+    </w:p>
+    <w:p>
+      <w:pPr>
+        <w:pStyle w:val="FirstParagraph"/>
+      </w:pPr>
+      <w:r>
+        <w:t xml:space="preserve">where</w:t>
+      </w:r>
+      <w:r>
+        <w:t xml:space="preserve"> </w:t>
+      </w:r>
+      <m:oMath>
+        <m:sSub>
+          <m:e>
+            <m:r>
+              <m:t>o</m:t>
+            </m:r>
+          </m:e>
+          <m:sub>
+            <m:r>
+              <m:t>i</m:t>
+            </m:r>
+          </m:sub>
+        </m:sSub>
+      </m:oMath>
+      <w:r>
+        <w:t xml:space="preserve"> </w:t>
+      </w:r>
+      <w:r>
+        <w:t xml:space="preserve">is peak opacity and</w:t>
+      </w:r>
+      <w:r>
+        <w:t xml:space="preserve"> </w:t>
+      </w:r>
+      <m:oMath>
+        <m:sSub>
+          <m:e>
+            <m:r>
+              <m:t>q</m:t>
+            </m:r>
+          </m:e>
+          <m:sub>
+            <m:r>
+              <m:t>i</m:t>
+            </m:r>
+          </m:sub>
+        </m:sSub>
+        <m:d>
+          <m:dPr>
+            <m:begChr m:val="("/>
+            <m:endChr m:val=")"/>
+            <m:sepChr m:val=""/>
+            <m:grow/>
+          </m:dPr>
+          <m:e>
+            <m:r>
+              <m:t>p</m:t>
+            </m:r>
+          </m:e>
+        </m:d>
+      </m:oMath>
+      <w:r>
+        <w:t xml:space="preserve"> </w:t>
+      </w:r>
+      <w:r>
+        <w:t xml:space="preserve">is squared Mahalanobis distance in projected Gaussian space. For edited set</w:t>
+      </w:r>
+      <w:r>
+        <w:t xml:space="preserve"> </w:t>
+      </w:r>
+      <m:oMath>
+        <m:r>
+          <m:t>E</m:t>
+        </m:r>
+      </m:oMath>
+      <w:r>
+        <w:t xml:space="preserve">, define aggregate opacity mass</w:t>
+      </w:r>
+    </w:p>
+    <w:p>
+      <w:pPr>
+        <w:pStyle w:val="BodyText"/>
+      </w:pPr>
+      <m:oMathPara>
+        <m:oMathParaPr>
+          <m:jc m:val="center"/>
+        </m:oMathParaPr>
+        <m:oMath>
+          <m:sSub>
+            <m:e>
+              <m:r>
+                <m:t>A</m:t>
+              </m:r>
+            </m:e>
+            <m:sub>
+              <m:r>
+                <m:t>p</m:t>
+              </m:r>
+            </m:sub>
+          </m:sSub>
+          <m:d>
+            <m:dPr>
+              <m:begChr m:val="("/>
+              <m:endChr m:val=")"/>
+              <m:sepChr m:val=""/>
+              <m:grow/>
+            </m:dPr>
+            <m:e>
+              <m:r>
+                <m:t>E</m:t>
+              </m:r>
+            </m:e>
+          </m:d>
+          <m:r>
+            <m:rPr>
+              <m:sty m:val="p"/>
+            </m:rPr>
+            <m:t>=</m:t>
+          </m:r>
+          <m:r>
+            <m:t>1</m:t>
+          </m:r>
+          <m:r>
+            <m:rPr>
+              <m:sty m:val="p"/>
+            </m:rPr>
+            <m:t>−</m:t>
+          </m:r>
+          <m:nary>
+            <m:naryPr>
+              <m:chr m:val="∏"/>
+              <m:limLoc m:val="undOvr"/>
+              <m:subHide m:val="off"/>
+              <m:supHide m:val="on"/>
+            </m:naryPr>
+            <m:sub>
+              <m:r>
+                <m:t>i</m:t>
+              </m:r>
+              <m:r>
+                <m:rPr>
+                  <m:sty m:val="p"/>
+                </m:rPr>
+                <m:t>∈</m:t>
+              </m:r>
+              <m:r>
+                <m:t>E</m:t>
+              </m:r>
+            </m:sub>
+            <m:sup>
+              <m:r>
+                <m:t>​</m:t>
+              </m:r>
+            </m:sup>
+            <m:e>
+              <m:d>
+                <m:dPr>
+                  <m:begChr m:val="("/>
+                  <m:endChr m:val=")"/>
+                  <m:sepChr m:val=""/>
+                  <m:grow/>
+                </m:dPr>
+                <m:e>
+                  <m:r>
+                    <m:t>1</m:t>
+                  </m:r>
+                  <m:r>
+                    <m:rPr>
+                      <m:sty m:val="p"/>
+                    </m:rPr>
+                    <m:t>−</m:t>
+                  </m:r>
+                  <m:sSub>
+                    <m:e>
+                      <m:r>
+                        <m:t>α</m:t>
+                      </m:r>
+                    </m:e>
+                    <m:sub>
+                      <m:r>
+                        <m:t>i</m:t>
+                      </m:r>
+                    </m:sub>
+                  </m:sSub>
+                  <m:d>
+                    <m:dPr>
+                      <m:begChr m:val="("/>
+                      <m:endChr m:val=")"/>
+                      <m:sepChr m:val=""/>
+                      <m:grow/>
+                    </m:dPr>
+                    <m:e>
+                      <m:r>
+                        <m:t>p</m:t>
+                      </m:r>
+                    </m:e>
+                  </m:d>
+                </m:e>
+              </m:d>
+            </m:e>
+          </m:nary>
+          <m:r>
+            <m:rPr>
+              <m:sty m:val="p"/>
+            </m:rPr>
+            <m:t>.</m:t>
+          </m:r>
+        </m:oMath>
+      </m:oMathPara>
+    </w:p>
+    <w:bookmarkStart w:id="36" w:name="X27b1c7a63965ebf9e8f63b6320214353009769c"/>
+    <w:p>
+      <w:pPr>
+        <w:pStyle w:val="Heading4"/>
+      </w:pPr>
+      <w:r>
+        <w:t xml:space="preserve">Proposition 1 (Gaussian finite-edit display bound).</w:t>
+      </w:r>
+    </w:p>
+    <w:p>
+      <w:pPr>
+        <w:pStyle w:val="FirstParagraph"/>
+      </w:pPr>
+      <w:r>
+        <w:t xml:space="preserve">Let</w:t>
+      </w:r>
+      <w:r>
+        <w:t xml:space="preserve"> </w:t>
+      </w:r>
+      <m:oMath>
+        <m:r>
+          <m:t>U</m:t>
+        </m:r>
+      </m:oMath>
+      <w:r>
+        <w:t xml:space="preserve"> </w:t>
+      </w:r>
+      <w:r>
+        <w:t xml:space="preserve">denote the unchanged Gaussian state and</w:t>
+      </w:r>
+      <w:r>
+        <w:t xml:space="preserve"> </w:t>
+      </w:r>
+      <m:oMath>
+        <m:sSub>
+          <m:e>
+            <m:r>
+              <m:t>E</m:t>
+            </m:r>
+          </m:e>
+          <m:sub>
+            <m:r>
+              <m:t>0</m:t>
+            </m:r>
+          </m:sub>
+        </m:sSub>
+        <m:r>
+          <m:rPr>
+            <m:sty m:val="p"/>
+          </m:rPr>
+          <m:t>,</m:t>
+        </m:r>
+        <m:sSub>
+          <m:e>
+            <m:r>
+              <m:t>E</m:t>
+            </m:r>
+          </m:e>
+          <m:sub>
+            <m:r>
+              <m:t>1</m:t>
+            </m:r>
+          </m:sub>
+        </m:sSub>
+      </m:oMath>
+      <w:r>
+        <w:t xml:space="preserve"> </w:t>
+      </w:r>
+      <w:r>
+        <w:t xml:space="preserve">the complete before/after edited sets at a protected pixel</w:t>
+      </w:r>
+      <w:r>
+        <w:t xml:space="preserve"> </w:t>
+      </w:r>
+      <m:oMath>
+        <m:r>
+          <m:t>p</m:t>
+        </m:r>
+      </m:oMath>
+      <w:r>
+        <w:t xml:space="preserve">. Under the assumptions below,</w:t>
+      </w:r>
+    </w:p>
+    <w:p>
+      <w:pPr>
+        <w:pStyle w:val="BodyText"/>
+      </w:pPr>
+      <m:oMathPara>
+        <m:oMathParaPr>
+          <m:jc m:val="center"/>
+        </m:oMathParaPr>
+        <m:oMath>
+          <m:sSub>
+            <m:e>
+              <m:d>
+                <m:dPr>
+                  <m:begChr m:val="∥"/>
+                  <m:endChr m:val="∥"/>
+                  <m:sepChr m:val=""/>
+                  <m:grow/>
+                </m:dPr>
+                <m:e>
+                  <m:sSub>
+                    <m:e>
+                      <m:r>
+                        <m:t>R</m:t>
+                      </m:r>
+                    </m:e>
+                    <m:sub>
+                      <m:r>
+                        <m:t>p</m:t>
+                      </m:r>
+                    </m:sub>
+                  </m:sSub>
+                  <m:d>
+                    <m:dPr>
+                      <m:begChr m:val="("/>
+                      <m:endChr m:val=")"/>
+                      <m:sepChr m:val=""/>
+                      <m:grow/>
+                    </m:dPr>
+                    <m:e>
+                      <m:r>
+                        <m:t>U</m:t>
+                      </m:r>
+                      <m:r>
+                        <m:rPr>
+                          <m:sty m:val="p"/>
+                        </m:rPr>
+                        <m:t>∪</m:t>
+                      </m:r>
+                      <m:sSub>
+                        <m:e>
+                          <m:r>
+                            <m:t>E</m:t>
+                          </m:r>
+                        </m:e>
+                        <m:sub>
+                          <m:r>
+                            <m:t>0</m:t>
+                          </m:r>
+                        </m:sub>
+                      </m:sSub>
+                    </m:e>
+                  </m:d>
+                  <m:r>
+                    <m:rPr>
+                      <m:sty m:val="p"/>
+                    </m:rPr>
+                    <m:t>−</m:t>
+                  </m:r>
+                  <m:sSub>
+                    <m:e>
+                      <m:r>
+                        <m:t>R</m:t>
+                      </m:r>
+                    </m:e>
+                    <m:sub>
+                      <m:r>
+                        <m:t>p</m:t>
+                      </m:r>
+                    </m:sub>
+                  </m:sSub>
+                  <m:d>
+                    <m:dPr>
+                      <m:begChr m:val="("/>
+                      <m:endChr m:val=")"/>
+                      <m:sepChr m:val=""/>
+                      <m:grow/>
+                    </m:dPr>
+                    <m:e>
+                      <m:r>
+                        <m:t>U</m:t>
+                      </m:r>
+                      <m:r>
+                        <m:rPr>
+                          <m:sty m:val="p"/>
+                        </m:rPr>
+                        <m:t>∪</m:t>
+                      </m:r>
+                      <m:sSub>
+                        <m:e>
+                          <m:r>
+                            <m:t>E</m:t>
+                          </m:r>
+                        </m:e>
+                        <m:sub>
+                          <m:r>
+                            <m:t>1</m:t>
+                          </m:r>
+                        </m:sub>
+                      </m:sSub>
+                    </m:e>
+                  </m:d>
+                </m:e>
+              </m:d>
+            </m:e>
+            <m:sub>
+              <m:r>
+                <m:rPr>
+                  <m:sty m:val="p"/>
+                </m:rPr>
+                <m:t>∞</m:t>
+              </m:r>
+            </m:sub>
+          </m:sSub>
+          <m:r>
+            <m:rPr>
+              <m:sty m:val="p"/>
+            </m:rPr>
+            <m:t>≤</m:t>
+          </m:r>
+          <m:sSub>
+            <m:e>
+              <m:r>
+                <m:t>C</m:t>
+              </m:r>
+            </m:e>
+            <m:sub>
+              <m:r>
+                <m:rPr>
+                  <m:sty m:val="p"/>
+                </m:rPr>
+                <m:t>c</m:t>
+              </m:r>
+              <m:r>
+                <m:rPr>
+                  <m:sty m:val="p"/>
+                </m:rPr>
+                <m:t>o</m:t>
+              </m:r>
+              <m:r>
+                <m:rPr>
+                  <m:sty m:val="p"/>
+                </m:rPr>
+                <m:t>l</m:t>
+              </m:r>
+              <m:r>
+                <m:rPr>
+                  <m:sty m:val="p"/>
+                </m:rPr>
+                <m:t>o</m:t>
+              </m:r>
+              <m:r>
+                <m:rPr>
+                  <m:sty m:val="p"/>
+                </m:rPr>
+                <m:t>r</m:t>
+              </m:r>
+            </m:sub>
+          </m:sSub>
+          <m:r>
+            <m:rPr>
+              <m:sty m:val="p"/>
+            </m:rPr>
+            <m:t>min</m:t>
+          </m:r>
+          <m:d>
+            <m:dPr>
+              <m:begChr m:val="("/>
+              <m:endChr m:val=")"/>
+              <m:sepChr m:val=""/>
+              <m:grow/>
+            </m:dPr>
+            <m:e>
+              <m:r>
+                <m:t>1</m:t>
+              </m:r>
+              <m:r>
+                <m:rPr>
+                  <m:sty m:val="p"/>
+                </m:rPr>
+                <m:t>,</m:t>
+              </m:r>
+              <m:sSub>
+                <m:e>
+                  <m:r>
+                    <m:t>A</m:t>
+                  </m:r>
+                </m:e>
+                <m:sub>
+                  <m:r>
+                    <m:t>p</m:t>
+                  </m:r>
+                </m:sub>
+              </m:sSub>
+              <m:d>
+                <m:dPr>
+                  <m:begChr m:val="("/>
+                  <m:endChr m:val=")"/>
+                  <m:sepChr m:val=""/>
+                  <m:grow/>
+                </m:dPr>
+                <m:e>
+                  <m:sSub>
+                    <m:e>
+                      <m:r>
+                        <m:t>E</m:t>
+                      </m:r>
+                    </m:e>
+                    <m:sub>
+                      <m:r>
+                        <m:t>0</m:t>
+                      </m:r>
+                    </m:sub>
+                  </m:sSub>
+                </m:e>
+              </m:d>
+              <m:r>
+                <m:rPr>
+                  <m:sty m:val="p"/>
+                </m:rPr>
+                <m:t>+</m:t>
+              </m:r>
+              <m:sSub>
+                <m:e>
+                  <m:r>
+                    <m:t>A</m:t>
+                  </m:r>
+                </m:e>
+                <m:sub>
+                  <m:r>
+                    <m:t>p</m:t>
+                  </m:r>
+                </m:sub>
+              </m:sSub>
+              <m:d>
+                <m:dPr>
+                  <m:begChr m:val="("/>
+                  <m:endChr m:val=")"/>
+                  <m:sepChr m:val=""/>
+                  <m:grow/>
+                </m:dPr>
+                <m:e>
+                  <m:sSub>
+                    <m:e>
+                      <m:r>
+                        <m:t>E</m:t>
+                      </m:r>
+                    </m:e>
+                    <m:sub>
+                      <m:r>
+                        <m:t>1</m:t>
+                      </m:r>
+                    </m:sub>
+                  </m:sSub>
+                </m:e>
+              </m:d>
+            </m:e>
+          </m:d>
+          <m:r>
+            <m:rPr>
+              <m:sty m:val="p"/>
+            </m:rPr>
+            <m:t>.</m:t>
+          </m:r>
+        </m:oMath>
+      </m:oMathPara>
+    </w:p>
+    <w:bookmarkEnd w:id="36"/>
+    <w:bookmarkStart w:id="37" w:name="assumptions."/>
+    <w:p>
+      <w:pPr>
+        <w:pStyle w:val="Heading4"/>
+      </w:pPr>
+      <w:r>
+        <w:t xml:space="preserve">Assumptions.</w:t>
+      </w:r>
+    </w:p>
+    <w:p>
+      <w:pPr>
+        <w:pStyle w:val="FirstParagraph"/>
+      </w:pPr>
+      <w:r>
+        <w:t xml:space="preserve">The bound requires: (i) front-to-back alpha compositing with effective post-clamp/post-cutoff alpha in</w:t>
+      </w:r>
+      <w:r>
+        <w:t xml:space="preserve"> </w:t>
+      </w:r>
+      <m:oMath>
+        <m:d>
+          <m:dPr>
+            <m:begChr m:val="["/>
+            <m:endChr m:val="]"/>
+            <m:sepChr m:val=""/>
+            <m:grow/>
+          </m:dPr>
+          <m:e>
+            <m:r>
+              <m:t>0</m:t>
+            </m:r>
+            <m:r>
+              <m:rPr>
+                <m:sty m:val="p"/>
+              </m:rPr>
+              <m:t>,</m:t>
+            </m:r>
+            <m:r>
+              <m:t>1</m:t>
+            </m:r>
+          </m:e>
+        </m:d>
+      </m:oMath>
+      <w:r>
+        <w:t xml:space="preserve">; (ii) each protected color channel lies in an interval of width</w:t>
+      </w:r>
+      <w:r>
+        <w:t xml:space="preserve"> </w:t>
+      </w:r>
+      <m:oMath>
+        <m:sSub>
+          <m:e>
+            <m:r>
+              <m:t>C</m:t>
+            </m:r>
+          </m:e>
+          <m:sub>
+            <m:r>
+              <m:rPr>
+                <m:sty m:val="p"/>
+              </m:rPr>
+              <m:t>c</m:t>
+            </m:r>
+            <m:r>
+              <m:rPr>
+                <m:sty m:val="p"/>
+              </m:rPr>
+              <m:t>o</m:t>
+            </m:r>
+            <m:r>
+              <m:rPr>
+                <m:sty m:val="p"/>
+              </m:rPr>
+              <m:t>l</m:t>
+            </m:r>
+            <m:r>
+              <m:rPr>
+                <m:sty m:val="p"/>
+              </m:rPr>
+              <m:t>o</m:t>
+            </m:r>
+            <m:r>
+              <m:rPr>
+                <m:sty m:val="p"/>
+              </m:rPr>
+              <m:t>r</m:t>
+            </m:r>
+          </m:sub>
+        </m:sSub>
+      </m:oMath>
+      <w:r>
+        <w:t xml:space="preserve">, including the bounded spherical-harmonic evaluation used by the renderer; (iii)</w:t>
+      </w:r>
+      <w:r>
+        <w:t xml:space="preserve"> </w:t>
+      </w:r>
+      <m:oMath>
+        <m:sSub>
+          <m:e>
+            <m:r>
+              <m:t>E</m:t>
+            </m:r>
+          </m:e>
+          <m:sub>
+            <m:r>
+              <m:t>0</m:t>
+            </m:r>
+          </m:sub>
+        </m:sSub>
+        <m:r>
+          <m:rPr>
+            <m:sty m:val="p"/>
+          </m:rPr>
+          <m:t>,</m:t>
+        </m:r>
+        <m:sSub>
+          <m:e>
+            <m:r>
+              <m:t>E</m:t>
+            </m:r>
+          </m:e>
+          <m:sub>
+            <m:r>
+              <m:t>1</m:t>
+            </m:r>
+          </m:sub>
+        </m:sSub>
+      </m:oMath>
+      <w:r>
+        <w:t xml:space="preserve"> </w:t>
+      </w:r>
+      <w:r>
+        <w:t xml:space="preserve">contain every Gaussian whose projected opacity, color, insertion/deletion state, or depth relation to unchanged support can change because of the edit; and (iv) renderer behavior not represented by these bounded quantities is treated as unsupported and therefore promoted to an exact dependency or</w:t>
+      </w:r>
+      <w:r>
+        <w:t xml:space="preserve"> </w:t>
+      </w:r>
+      <w:r>
+        <w:rPr>
+          <w:smallCaps/>
+        </w:rPr>
+        <w:t xml:space="preserve">Full</w:t>
+      </w:r>
+      <w:r>
+        <w:t xml:space="preserve"> </w:t>
+      </w:r>
+      <w:r>
+        <w:t xml:space="preserve">fallback.</w:t>
+      </w:r>
+    </w:p>
+    <w:bookmarkEnd w:id="37"/>
+    <w:bookmarkStart w:id="38" w:name="proof-sketch."/>
+    <w:p>
+      <w:pPr>
+        <w:pStyle w:val="Heading4"/>
+      </w:pPr>
+      <w:r>
+        <w:t xml:space="preserve">Proof sketch.</w:t>
+      </w:r>
+    </w:p>
+    <w:p>
+      <w:pPr>
+        <w:pStyle w:val="FirstParagraph"/>
+      </w:pPr>
+      <w:r>
+        <w:t xml:space="preserve">For one edited set, front-to-back compositing changes the final channel value by at most the channel range multiplied by the total opacity mass through which edited support can replace, attenuate, or reveal unchanged radiance. This gives</w:t>
+      </w:r>
+      <w:r>
+        <w:t xml:space="preserve"> </w:t>
+      </w:r>
+      <m:oMath>
+        <m:sSub>
+          <m:e>
+            <m:r>
+              <m:t>C</m:t>
+            </m:r>
+          </m:e>
+          <m:sub>
+            <m:r>
+              <m:rPr>
+                <m:sty m:val="p"/>
+              </m:rPr>
+              <m:t>c</m:t>
+            </m:r>
+            <m:r>
+              <m:rPr>
+                <m:sty m:val="p"/>
+              </m:rPr>
+              <m:t>o</m:t>
+            </m:r>
+            <m:r>
+              <m:rPr>
+                <m:sty m:val="p"/>
+              </m:rPr>
+              <m:t>l</m:t>
+            </m:r>
+            <m:r>
+              <m:rPr>
+                <m:sty m:val="p"/>
+              </m:rPr>
+              <m:t>o</m:t>
+            </m:r>
+            <m:r>
+              <m:rPr>
+                <m:sty m:val="p"/>
+              </m:rPr>
+              <m:t>r</m:t>
+            </m:r>
+          </m:sub>
+        </m:sSub>
+        <m:sSub>
+          <m:e>
+            <m:r>
+              <m:t>A</m:t>
+            </m:r>
+          </m:e>
+          <m:sub>
+            <m:r>
+              <m:t>p</m:t>
+            </m:r>
+          </m:sub>
+        </m:sSub>
+        <m:d>
+          <m:dPr>
+            <m:begChr m:val="("/>
+            <m:endChr m:val=")"/>
+            <m:sepChr m:val=""/>
+            <m:grow/>
+          </m:dPr>
+          <m:e>
+            <m:r>
+              <m:t>E</m:t>
+            </m:r>
+          </m:e>
+        </m:d>
+      </m:oMath>
+      <w:r>
+        <w:t xml:space="preserve">. Insertion and deletion are the cases in which one edited set is empty. For a general before/after edit, apply the triangle inequality through the common unchanged state</w:t>
+      </w:r>
+      <w:r>
+        <w:t xml:space="preserve"> </w:t>
+      </w:r>
+      <m:oMath>
+        <m:r>
+          <m:t>U</m:t>
+        </m:r>
+      </m:oMath>
+      <w:r>
+        <w:t xml:space="preserve"> </w:t>
+      </w:r>
+      <w:r>
+        <w:t xml:space="preserve">to obtain</w:t>
+      </w:r>
+      <w:r>
+        <w:t xml:space="preserve"> </w:t>
+      </w:r>
+      <m:oMath>
+        <m:sSub>
+          <m:e>
+            <m:r>
+              <m:t>C</m:t>
+            </m:r>
+          </m:e>
+          <m:sub>
+            <m:r>
+              <m:rPr>
+                <m:sty m:val="p"/>
+              </m:rPr>
+              <m:t>c</m:t>
+            </m:r>
+            <m:r>
+              <m:rPr>
+                <m:sty m:val="p"/>
+              </m:rPr>
+              <m:t>o</m:t>
+            </m:r>
+            <m:r>
+              <m:rPr>
+                <m:sty m:val="p"/>
+              </m:rPr>
+              <m:t>l</m:t>
+            </m:r>
+            <m:r>
+              <m:rPr>
+                <m:sty m:val="p"/>
+              </m:rPr>
+              <m:t>o</m:t>
+            </m:r>
+            <m:r>
+              <m:rPr>
+                <m:sty m:val="p"/>
+              </m:rPr>
+              <m:t>r</m:t>
+            </m:r>
+          </m:sub>
+        </m:sSub>
+        <m:d>
+          <m:dPr>
+            <m:begChr m:val="("/>
+            <m:endChr m:val=")"/>
+            <m:sepChr m:val=""/>
+            <m:grow/>
+          </m:dPr>
+          <m:e>
+            <m:sSub>
+              <m:e>
+                <m:r>
+                  <m:t>A</m:t>
+                </m:r>
+              </m:e>
+              <m:sub>
+                <m:r>
+                  <m:t>p</m:t>
+                </m:r>
+              </m:sub>
+            </m:sSub>
+            <m:d>
+              <m:dPr>
+                <m:begChr m:val="("/>
+                <m:endChr m:val=")"/>
+                <m:sepChr m:val=""/>
+                <m:grow/>
+              </m:dPr>
+              <m:e>
+                <m:sSub>
+                  <m:e>
+                    <m:r>
+                      <m:t>E</m:t>
+                    </m:r>
+                  </m:e>
+                  <m:sub>
+                    <m:r>
+                      <m:t>0</m:t>
+                    </m:r>
+                  </m:sub>
+                </m:sSub>
+              </m:e>
+            </m:d>
+            <m:r>
+              <m:rPr>
+                <m:sty m:val="p"/>
+              </m:rPr>
+              <m:t>+</m:t>
+            </m:r>
+            <m:sSub>
+              <m:e>
+                <m:r>
+                  <m:t>A</m:t>
+                </m:r>
+              </m:e>
+              <m:sub>
+                <m:r>
+                  <m:t>p</m:t>
+                </m:r>
+              </m:sub>
+            </m:sSub>
+            <m:d>
+              <m:dPr>
+                <m:begChr m:val="("/>
+                <m:endChr m:val=")"/>
+                <m:sepChr m:val=""/>
+                <m:grow/>
+              </m:dPr>
+              <m:e>
+                <m:sSub>
+                  <m:e>
+                    <m:r>
+                      <m:t>E</m:t>
+                    </m:r>
+                  </m:e>
+                  <m:sub>
+                    <m:r>
+                      <m:t>1</m:t>
+                    </m:r>
+                  </m:sub>
+                </m:sSub>
+              </m:e>
+            </m:d>
+          </m:e>
+        </m:d>
+      </m:oMath>
+      <w:r>
+        <w:t xml:space="preserve">, then clamp by the maximum possible channel-range change</w:t>
+      </w:r>
+      <w:r>
+        <w:t xml:space="preserve"> </w:t>
+      </w:r>
+      <m:oMath>
+        <m:sSub>
+          <m:e>
+            <m:r>
+              <m:t>C</m:t>
+            </m:r>
+          </m:e>
+          <m:sub>
+            <m:r>
+              <m:rPr>
+                <m:sty m:val="p"/>
+              </m:rPr>
+              <m:t>c</m:t>
+            </m:r>
+            <m:r>
+              <m:rPr>
+                <m:sty m:val="p"/>
+              </m:rPr>
+              <m:t>o</m:t>
+            </m:r>
+            <m:r>
+              <m:rPr>
+                <m:sty m:val="p"/>
+              </m:rPr>
+              <m:t>l</m:t>
+            </m:r>
+            <m:r>
+              <m:rPr>
+                <m:sty m:val="p"/>
+              </m:rPr>
+              <m:t>o</m:t>
+            </m:r>
+            <m:r>
+              <m:rPr>
+                <m:sty m:val="p"/>
+              </m:rPr>
+              <m:t>r</m:t>
+            </m:r>
+          </m:sub>
+        </m:sSub>
+      </m:oMath>
+      <w:r>
+        <w:t xml:space="preserve">. The protected-image certificate is the maximum of Eq. </w:t>
+      </w:r>
+      <w:hyperlink w:anchor="eq:gaussianbound">
+        <w:r>
+          <w:rPr>
+            <w:rStyle w:val="Hyperlink"/>
+          </w:rPr>
+          <w:t xml:space="preserve">[eq:gaussianbound]</w:t>
+        </w:r>
+      </w:hyperlink>
+      <w:r>
+        <w:t xml:space="preserve"> </w:t>
+      </w:r>
+      <w:r>
+        <w:t xml:space="preserve">over the declared pixel support. A fuller algebraic derivation is included with the manuscript supplement.</w:t>
+      </w:r>
+    </w:p>
+    <w:bookmarkEnd w:id="38"/>
+    <w:bookmarkEnd w:id="39"/>
+    <w:bookmarkStart w:id="40" w:name="stable-temporal-history"/>
+    <w:p>
+      <w:pPr>
+        <w:pStyle w:val="Heading2"/>
+      </w:pPr>
+      <w:r>
+        <w:t xml:space="preserve">Stable temporal history</w:t>
+      </w:r>
+    </w:p>
+    <w:p>
+      <w:pPr>
+        <w:pStyle w:val="FirstParagraph"/>
+      </w:pPr>
+      <w:r>
+        <w:t xml:space="preserve">For stable temporal validation, let</w:t>
+      </w:r>
+      <w:r>
+        <w:t xml:space="preserve"> </w:t>
+      </w:r>
+      <m:oMath>
+        <m:sSub>
+          <m:e>
+            <m:r>
+              <m:t>E</m:t>
+            </m:r>
+          </m:e>
+          <m:sub>
+            <m:r>
+              <m:t>c</m:t>
+            </m:r>
+          </m:sub>
+        </m:sSub>
+      </m:oMath>
+      <w:r>
+        <w:t xml:space="preserve"> </w:t>
+      </w:r>
+      <w:r>
+        <w:t xml:space="preserve">denote current-frame error,</w:t>
+      </w:r>
+      <w:r>
+        <w:t xml:space="preserve"> </w:t>
+      </w:r>
+      <m:oMath>
+        <m:sSub>
+          <m:e>
+            <m:r>
+              <m:t>E</m:t>
+            </m:r>
+          </m:e>
+          <m:sub>
+            <m:r>
+              <m:t>h</m:t>
+            </m:r>
+          </m:sub>
+        </m:sSub>
+      </m:oMath>
+      <w:r>
+        <w:t xml:space="preserve"> </w:t>
+      </w:r>
+      <w:r>
+        <w:t xml:space="preserve">retained-history error,</w:t>
+      </w:r>
+      <w:r>
+        <w:t xml:space="preserve"> </w:t>
+      </w:r>
+      <m:oMath>
+        <m:sSub>
+          <m:e>
+            <m:r>
+              <m:t>E</m:t>
+            </m:r>
+          </m:e>
+          <m:sub>
+            <m:r>
+              <m:t>n</m:t>
+            </m:r>
+          </m:sub>
+        </m:sSub>
+      </m:oMath>
+      <w:r>
+        <w:t xml:space="preserve"> </w:t>
+      </w:r>
+      <w:r>
+        <w:t xml:space="preserve">neighborhood or clamping error, and</w:t>
+      </w:r>
+      <w:r>
+        <w:t xml:space="preserve"> </w:t>
+      </w:r>
+      <m:oMath>
+        <m:r>
+          <m:t>w</m:t>
+        </m:r>
+        <m:r>
+          <m:rPr>
+            <m:sty m:val="p"/>
+          </m:rPr>
+          <m:t>∈</m:t>
+        </m:r>
+        <m:d>
+          <m:dPr>
+            <m:begChr m:val="["/>
+            <m:endChr m:val="]"/>
+            <m:sepChr m:val=""/>
+            <m:grow/>
+          </m:dPr>
+          <m:e>
+            <m:r>
+              <m:t>0</m:t>
+            </m:r>
+            <m:r>
+              <m:rPr>
+                <m:sty m:val="p"/>
+              </m:rPr>
+              <m:t>,</m:t>
+            </m:r>
+            <m:r>
+              <m:t>1</m:t>
+            </m:r>
+          </m:e>
+        </m:d>
+      </m:oMath>
+      <w:r>
+        <w:t xml:space="preserve"> </w:t>
+      </w:r>
+      <w:r>
+        <w:t xml:space="preserve">the history weight. With</w:t>
+      </w:r>
+      <w:r>
+        <w:t xml:space="preserve"> </w:t>
+      </w:r>
+      <m:oMath>
+        <m:sSub>
+          <m:e>
+            <m:r>
+              <m:t>E</m:t>
+            </m:r>
+          </m:e>
+          <m:sub>
+            <m:r>
+              <m:t>r</m:t>
+            </m:r>
+          </m:sub>
+        </m:sSub>
+        <m:r>
+          <m:rPr>
+            <m:sty m:val="p"/>
+          </m:rPr>
+          <m:t>=</m:t>
+        </m:r>
+        <m:r>
+          <m:rPr>
+            <m:sty m:val="p"/>
+          </m:rPr>
+          <m:t>max</m:t>
+        </m:r>
+        <m:d>
+          <m:dPr>
+            <m:begChr m:val="("/>
+            <m:endChr m:val=")"/>
+            <m:sepChr m:val=""/>
+            <m:grow/>
+          </m:dPr>
+          <m:e>
+            <m:sSub>
+              <m:e>
+                <m:r>
+                  <m:t>E</m:t>
+                </m:r>
+              </m:e>
+              <m:sub>
+                <m:r>
+                  <m:t>h</m:t>
+                </m:r>
+              </m:sub>
+            </m:sSub>
+            <m:r>
+              <m:rPr>
+                <m:sty m:val="p"/>
+              </m:rPr>
+              <m:t>,</m:t>
+            </m:r>
+            <m:sSub>
+              <m:e>
+                <m:r>
+                  <m:t>E</m:t>
+                </m:r>
+              </m:e>
+              <m:sub>
+                <m:r>
+                  <m:t>n</m:t>
+                </m:r>
+              </m:sub>
+            </m:sSub>
+          </m:e>
+        </m:d>
+      </m:oMath>
+      <w:r>
+        <w:t xml:space="preserve">,</w:t>
+      </w:r>
+    </w:p>
+    <w:p>
+      <w:pPr>
+        <w:pStyle w:val="BodyText"/>
+      </w:pPr>
+      <m:oMathPara>
+        <m:oMathParaPr>
+          <m:jc m:val="center"/>
+        </m:oMathParaPr>
+        <m:oMath>
+          <m:sSub>
+            <m:e>
+              <m:r>
+                <m:t>E</m:t>
+              </m:r>
+            </m:e>
+            <m:sub>
+              <m:r>
+                <m:rPr>
+                  <m:sty m:val="p"/>
+                </m:rPr>
+                <m:t>r</m:t>
+              </m:r>
+              <m:r>
+                <m:rPr>
+                  <m:sty m:val="p"/>
+                </m:rPr>
+                <m:t>e</m:t>
+              </m:r>
+              <m:r>
+                <m:rPr>
+                  <m:sty m:val="p"/>
+                </m:rPr>
+                <m:t>s</m:t>
+              </m:r>
+              <m:r>
+                <m:rPr>
+                  <m:sty m:val="p"/>
+                </m:rPr>
+                <m:t>o</m:t>
+              </m:r>
+              <m:r>
+                <m:rPr>
+                  <m:sty m:val="p"/>
+                </m:rPr>
+                <m:t>l</m:t>
+              </m:r>
+              <m:r>
+                <m:rPr>
+                  <m:sty m:val="p"/>
+                </m:rPr>
+                <m:t>v</m:t>
+              </m:r>
+              <m:r>
+                <m:rPr>
+                  <m:sty m:val="p"/>
+                </m:rPr>
+                <m:t>e</m:t>
+              </m:r>
+              <m:r>
+                <m:rPr>
+                  <m:sty m:val="p"/>
+                </m:rPr>
+                <m:t>d</m:t>
+              </m:r>
+            </m:sub>
+          </m:sSub>
+          <m:r>
+            <m:rPr>
+              <m:sty m:val="p"/>
+            </m:rPr>
+            <m:t>=</m:t>
+          </m:r>
+          <m:d>
+            <m:dPr>
+              <m:begChr m:val="("/>
+              <m:endChr m:val=")"/>
+              <m:sepChr m:val=""/>
+              <m:grow/>
+            </m:dPr>
+            <m:e>
+              <m:r>
+                <m:t>1</m:t>
+              </m:r>
+              <m:r>
+                <m:rPr>
+                  <m:sty m:val="p"/>
+                </m:rPr>
+                <m:t>−</m:t>
+              </m:r>
+              <m:r>
+                <m:t>w</m:t>
+              </m:r>
+            </m:e>
+          </m:d>
+          <m:sSub>
+            <m:e>
+              <m:r>
+                <m:t>E</m:t>
+              </m:r>
+            </m:e>
+            <m:sub>
+              <m:r>
+                <m:t>c</m:t>
+              </m:r>
+            </m:sub>
+          </m:sSub>
+          <m:r>
+            <m:rPr>
+              <m:sty m:val="p"/>
+            </m:rPr>
+            <m:t>+</m:t>
+          </m:r>
+          <m:r>
+            <m:t>w</m:t>
+          </m:r>
+          <m:sSub>
+            <m:e>
+              <m:r>
+                <m:t>E</m:t>
+              </m:r>
+            </m:e>
+            <m:sub>
+              <m:r>
+                <m:t>r</m:t>
+              </m:r>
+            </m:sub>
+          </m:sSub>
+          <m:r>
+            <m:rPr>
+              <m:sty m:val="p"/>
+            </m:rPr>
+            <m:t>.</m:t>
+          </m:r>
+        </m:oMath>
+      </m:oMathPara>
+    </w:p>
+    <w:p>
+      <w:pPr>
+        <w:pStyle w:val="FirstParagraph"/>
+      </w:pPr>
+      <w:r>
+        <w:t xml:space="preserve">If validation, reprojection, or disocclusion may itself change, MAVEB promotes the relation to</w:t>
+      </w:r>
+      <w:r>
+        <w:t xml:space="preserve"> </w:t>
+      </w:r>
+      <w:r>
+        <w:rPr>
+          <w:smallCaps/>
+        </w:rPr>
+        <w:t xml:space="preserve">Hard</w:t>
+      </w:r>
+      <w:r>
+        <w:t xml:space="preserve"> </w:t>
+      </w:r>
+      <w:r>
+        <w:t xml:space="preserve">invalidation instead of applying Eq. </w:t>
+      </w:r>
+      <w:hyperlink w:anchor="eq:temporal">
+        <w:r>
+          <w:rPr>
+            <w:rStyle w:val="Hyperlink"/>
+          </w:rPr>
+          <w:t xml:space="preserve">[eq:temporal]</w:t>
+        </w:r>
+      </w:hyperlink>
+      <w:r>
+        <w:t xml:space="preserve">. Thus the temporal path demonstrates the central design rule: use a soft bound only while its preconditions are certifiable.</w:t>
+      </w:r>
+    </w:p>
+    <w:bookmarkEnd w:id="40"/>
+    <w:bookmarkStart w:id="41" w:name="X62e354406816ed1168c1ad132bd8541650ea272"/>
+    <w:p>
+      <w:pPr>
+        <w:pStyle w:val="Heading2"/>
+      </w:pPr>
+      <w:r>
+        <w:t xml:space="preserve">Greedy feasible-cone search and crossover</w:t>
+      </w:r>
+    </w:p>
+    <w:p>
+      <w:pPr>
+        <w:pStyle w:val="FirstParagraph"/>
+      </w:pPr>
+      <w:r>
+        <w:t xml:space="preserve">The v1 search uses the revision criticality in Eq. </w:t>
+      </w:r>
+      <w:hyperlink w:anchor="eq:criticality">
+        <w:r>
+          <w:rPr>
+            <w:rStyle w:val="Hyperlink"/>
+          </w:rPr>
+          <w:t xml:space="preserve">[eq:criticality]</w:t>
+        </w:r>
+      </w:hyperlink>
+      <w:r>
+        <w:t xml:space="preserve"> </w:t>
+      </w:r>
+      <w:r>
+        <w:t xml:space="preserve">directly. For a candidate expansion</w:t>
       </w:r>
       <w:r>
         <w:t xml:space="preserve"> </w:t>
@@ -4213,7 +4828,7 @@
         </m:r>
       </m:oMath>
       <w:r>
-        <w:t xml:space="preserve">, the v1 search scores</w:t>
+        <w:t xml:space="preserve">, it scores</w:t>
       </w:r>
     </w:p>
     <w:p>
@@ -4307,7 +4922,7 @@
             </m:fPr>
             <m:num>
               <m:r>
-                <m:t>ϕ</m:t>
+                <m:t>χ</m:t>
               </m:r>
               <m:d>
                 <m:dPr>
@@ -4329,7 +4944,7 @@
                 <m:t>−</m:t>
               </m:r>
               <m:r>
-                <m:t>ϕ</m:t>
+                <m:t>χ</m:t>
               </m:r>
               <m:d>
                 <m:dPr>
@@ -4427,9 +5042,9 @@
         <w:t xml:space="preserve">, or when no useful local candidate remains. The algorithm claims a certified feasible cone, not the global minimum-work cone.</w:t>
       </w:r>
     </w:p>
-    <w:bookmarkEnd w:id="37"/>
-    <w:bookmarkEnd w:id="38"/>
-    <w:bookmarkStart w:id="43" w:name="system-implementation"/>
+    <w:bookmarkEnd w:id="41"/>
+    <w:bookmarkEnd w:id="42"/>
+    <w:bookmarkStart w:id="47" w:name="system-implementation"/>
     <w:p>
       <w:pPr>
         <w:pStyle w:val="Heading1"/>
@@ -4458,7 +5073,7 @@
         <w:t xml:space="preserve">, typed nodes and edges, sparse analytic propagation over supported DAG exteriors, exact predecessor consistency, a greedy feasible-cone search, and deterministic certificate serialization. Native and reference-planner decisions are compared in the campaign.</w:t>
       </w:r>
     </w:p>
-    <w:bookmarkStart w:id="39" w:name="revision-transactions."/>
+    <w:bookmarkStart w:id="43" w:name="revision-transactions."/>
     <w:p>
       <w:pPr>
         <w:pStyle w:val="Heading4"/>
@@ -4475,8 +5090,8 @@
         <w:t xml:space="preserve">The production path records persistent Gaussian entity translations, immutable before/after Gaussian revision sidecars, exact camera binding, a production Gaussian image certificate, and planner-selected temporal repair or retention. The headless path loads a persistent world, applies indexed Gaussian transactions, writes a new durable revision and sidecars, evaluates the Gaussian certificate, executes the output-cone planner, and emits canonical evidence JSON. A revision that cannot satisfy consistency checks fails closed rather than publishing partial state.</w:t>
       </w:r>
     </w:p>
-    <w:bookmarkEnd w:id="39"/>
-    <w:bookmarkStart w:id="40" w:name="cross-derived-state-accounting."/>
+    <w:bookmarkEnd w:id="43"/>
+    <w:bookmarkStart w:id="44" w:name="cross-derived-state-accounting."/>
     <w:p>
       <w:pPr>
         <w:pStyle w:val="Heading4"/>
@@ -4508,8 +5123,8 @@
         <w:t xml:space="preserve">is the counter source of truth for observation, TSDF, mesh, texture-page, material, Gaussian, GPU-publication, and temporal domains. Ledger/mesher disagreement is treated as an error. Native counts remain in their own units; conversion to the public scalar work model occurs only through a frozen versioned calibration. This design avoids hiding a full-world stage behind a local metric from a single subsystem.</w:t>
       </w:r>
     </w:p>
-    <w:bookmarkEnd w:id="40"/>
-    <w:bookmarkStart w:id="41" w:name="independent-oracle."/>
+    <w:bookmarkEnd w:id="44"/>
+    <w:bookmarkStart w:id="45" w:name="independent-oracle."/>
     <w:p>
       <w:pPr>
         <w:pStyle w:val="Heading4"/>
@@ -4537,8 +5152,8 @@
         <w:t xml:space="preserve">; production/offline certificate disagreement or a measured error above the emitted certificate is a correctness failure. Evidence bundles are hashed, and the canonical campaign records workflow IDs, artifact hashes, source hashes, and planner parity.</w:t>
       </w:r>
     </w:p>
-    <w:bookmarkEnd w:id="41"/>
-    <w:bookmarkStart w:id="42" w:name="representation-scope."/>
+    <w:bookmarkEnd w:id="45"/>
+    <w:bookmarkStart w:id="46" w:name="representation-scope."/>
     <w:p>
       <w:pPr>
         <w:pStyle w:val="Heading4"/>
@@ -4555,9 +5170,9 @@
         <w:t xml:space="preserve">The public campaign uses real COLMAP/SfM inputs from four public scenes and seeds isotropic Gaussians from the reconstructed points. These fields are not described as trained photorealistic 3DGS, and public coordinates are normalized rather than metric-scale. A secondary validation path uses a pinned external trained GraphDECO-style PLY while preserving spherical-harmonic coefficients, opacity, anisotropic scale, and rotation. Persistent ownership in this path is deterministic spatial ownership, not semantic segmentation.</w:t>
       </w:r>
     </w:p>
-    <w:bookmarkEnd w:id="42"/>
-    <w:bookmarkEnd w:id="43"/>
-    <w:bookmarkStart w:id="47" w:name="evaluation"/>
+    <w:bookmarkEnd w:id="46"/>
+    <w:bookmarkEnd w:id="47"/>
+    <w:bookmarkStart w:id="52" w:name="evaluation"/>
     <w:p>
       <w:pPr>
         <w:pStyle w:val="Heading1"/>
@@ -4566,7 +5181,7 @@
         <w:t xml:space="preserve">Evaluation</w:t>
       </w:r>
     </w:p>
-    <w:bookmarkStart w:id="44" w:name="questions-and-protocol"/>
+    <w:bookmarkStart w:id="49" w:name="questions-and-protocol"/>
     <w:p>
       <w:pPr>
         <w:pStyle w:val="Heading2"/>
@@ -4638,14 +5253,13 @@
         <w:t xml:space="preserve">For every selected repair, the campaign records the source edit, selected cone, local/full decision, certificate, independent full-reference residual, native work, calibrated work, and provenance. Fallback cases are retained as results rather than excluded from summary statistics.</w:t>
       </w:r>
     </w:p>
-    <w:bookmarkEnd w:id="44"/>
-    <w:bookmarkStart w:id="45" w:name="baselines-and-ablations"/>
-    <w:p>
-      <w:pPr>
-        <w:pStyle w:val="Heading2"/>
-      </w:pPr>
-      <w:r>
-        <w:t xml:space="preserve">Baselines and ablations</w:t>
+    <w:bookmarkStart w:id="48" w:name="runtime-scope."/>
+    <w:p>
+      <w:pPr>
+        <w:pStyle w:val="Heading4"/>
+      </w:pPr>
+      <w:r>
+        <w:t xml:space="preserve">Runtime scope.</w:t>
       </w:r>
     </w:p>
     <w:p>
@@ -4653,10 +5267,19 @@
         <w:pStyle w:val="FirstParagraph"/>
       </w:pPr>
       <w:r>
-        <w:t xml:space="preserve">The implemented method-level suite contains</w:t>
-      </w:r>
-      <w:r>
-        <w:t xml:space="preserve"> </w:t>
+        <w:t xml:space="preserve">The current campaign does not contain paired end-to-end</w:t>
+      </w:r>
+      <w:r>
+        <w:t xml:space="preserve"> </w:t>
+      </w:r>
+      <w:r>
+        <w:rPr>
+          <w:smallCaps/>
+        </w:rPr>
+        <w:t xml:space="preserve">Local</w:t>
+      </w:r>
+      <w:r>
+        <w:t xml:space="preserve">-versus-</w:t>
       </w:r>
       <w:r>
         <w:rPr>
@@ -4665,6 +5288,40 @@
         <w:t xml:space="preserve">Full</w:t>
       </w:r>
       <w:r>
+        <w:t xml:space="preserve"> </w:t>
+      </w:r>
+      <w:r>
+        <w:t xml:space="preserve">wall-clock trials under identical execution conditions. Accordingly, no speedup claim is made anywhere in the paper. The public headline is a frozen heterogeneous millisecond-calibrated work ratio, while the baseline suite below reports its own native work-ratio metric. These quantities are intentionally labeled separately.</w:t>
+      </w:r>
+    </w:p>
+    <w:bookmarkEnd w:id="48"/>
+    <w:bookmarkEnd w:id="49"/>
+    <w:bookmarkStart w:id="50" w:name="baselines-and-ablations"/>
+    <w:p>
+      <w:pPr>
+        <w:pStyle w:val="Heading2"/>
+      </w:pPr>
+      <w:r>
+        <w:t xml:space="preserve">Baselines and ablations</w:t>
+      </w:r>
+    </w:p>
+    <w:p>
+      <w:pPr>
+        <w:pStyle w:val="FirstParagraph"/>
+      </w:pPr>
+      <w:r>
+        <w:t xml:space="preserve">The implemented method-level suite contains</w:t>
+      </w:r>
+      <w:r>
+        <w:t xml:space="preserve"> </w:t>
+      </w:r>
+      <w:r>
+        <w:rPr>
+          <w:smallCaps/>
+        </w:rPr>
+        <w:t xml:space="preserve">Full</w:t>
+      </w:r>
+      <w:r>
         <w:t xml:space="preserve">, exact-only repair, fixed radius policies, a changed-fraction policy, a held-out empirical scheduler, and CBRC. The empirical signal is permitted to order work but is not certificate-eligible. Structural and analytic ablations remove or replace individual components, while a separately labeled deterministic mechanism-isolation suite constructs stress cases for exact closure, analytic Gaussian influence, temporal influence, quantity-of-interest specialization, hard/soft separation, graph-structured propagation, and fallback behavior.</w:t>
       </w:r>
     </w:p>
@@ -4676,8 +5333,8 @@
         <w:t xml:space="preserve">The real campaign is not retuned to force every ablation to separate. Several structural ablations are neutral on the frozen matrix; those results are reported as neutral. The synthetic mechanism suite demonstrates that a mechanism can be falsified under a constructed stress case, not that the same mechanism determines effect size on every real revision.</w:t>
       </w:r>
     </w:p>
-    <w:bookmarkEnd w:id="45"/>
-    <w:bookmarkStart w:id="46" w:name="metrics"/>
+    <w:bookmarkEnd w:id="50"/>
+    <w:bookmarkStart w:id="51" w:name="metrics"/>
     <w:p>
       <w:pPr>
         <w:pStyle w:val="Heading2"/>
@@ -4805,9 +5462,9 @@
         <w:t xml:space="preserve">is reported only when the independent residual is non-zero; it is undefined for numerically zero residual rather than divided by an arbitrary floor.</w:t>
       </w:r>
     </w:p>
-    <w:bookmarkEnd w:id="46"/>
-    <w:bookmarkEnd w:id="47"/>
-    <w:bookmarkStart w:id="57" w:name="sec:results"/>
+    <w:bookmarkEnd w:id="51"/>
+    <w:bookmarkEnd w:id="52"/>
+    <w:bookmarkStart w:id="63" w:name="sec:results"/>
     <w:p>
       <w:pPr>
         <w:pStyle w:val="Heading1"/>
@@ -4816,7 +5473,7 @@
         <w:t xml:space="preserve">Results</w:t>
       </w:r>
     </w:p>
-    <w:bookmarkStart w:id="52" w:name="public-rgbsfm-campaign"/>
+    <w:bookmarkStart w:id="53" w:name="public-rgbsfm-campaign"/>
     <w:p>
       <w:pPr>
         <w:pStyle w:val="Heading2"/>
@@ -5110,6 +5767,609 @@
         <w:t xml:space="preserve">speedup: the public scalar is constructed from frozen per-domain microbenchmarks, while campaign phase wall times are recorded separately. A paired local-versus-full end-to-end timing experiment would be required for a speedup claim.</w:t>
       </w:r>
     </w:p>
+    <w:bookmarkEnd w:id="53"/>
+    <w:bookmarkStart w:id="58" w:name="method-comparison"/>
+    <w:p>
+      <w:pPr>
+        <w:pStyle w:val="Heading2"/>
+      </w:pPr>
+      <w:r>
+        <w:t xml:space="preserve">Method comparison</w:t>
+      </w:r>
+    </w:p>
+    <w:p>
+      <w:pPr>
+        <w:pStyle w:val="FirstParagraph"/>
+      </w:pPr>
+      <w:r>
+        <w:t xml:space="preserve">Table </w:t>
+      </w:r>
+      <w:hyperlink w:anchor="tab:baselines">
+        <w:r>
+          <w:rPr>
+            <w:rStyle w:val="Hyperlink"/>
+          </w:rPr>
+          <w:t xml:space="preserve">[tab:baselines]</w:t>
+        </w:r>
+      </w:hyperlink>
+      <w:r>
+        <w:t xml:space="preserve"> </w:t>
+      </w:r>
+      <w:r>
+        <w:t xml:space="preserve">reports the frozen method-level baseline suite on the same 60 cases. The suite re-certifies every selected cone with the conservative certificate, so</w:t>
+      </w:r>
+      <w:r>
+        <w:t xml:space="preserve"> </w:t>
+      </w:r>
+      <w:r>
+        <w:rPr>
+          <w:iCs/>
+          <w:i/>
+        </w:rPr>
+        <w:t xml:space="preserve">certificate pass</w:t>
+      </w:r>
+      <w:r>
+        <w:t xml:space="preserve"> </w:t>
+      </w:r>
+      <w:r>
+        <w:t xml:space="preserve">is not an independent measured-error metric. In particular, exact-only, radius, and changed-fraction policies often choose very little work but fail the certificate on most cases. The empirical-order baseline uses empirical influence only to order expansion and is still re-certified analytically; the separately held-out changed-fraction heuristic is discussed below.</w:t>
+      </w:r>
+    </w:p>
+    <w:tbl>
+      <w:tblPr>
+        <w:tblStyle w:val="Table"/>
+        <w:tblW w:type="auto" w:w="0"/>
+        <w:tblLook w:firstRow="1" w:lastRow="0" w:firstColumn="0" w:lastColumn="0" w:noHBand="0" w:noVBand="0" w:val="0020"/>
+        <w:jc w:val="start"/>
+      </w:tblPr>
+      <w:tblGrid>
+        <w:gridCol w:w="1320"/>
+        <w:gridCol w:w="1320"/>
+        <w:gridCol w:w="1320"/>
+        <w:gridCol w:w="1320"/>
+        <w:gridCol w:w="1320"/>
+        <w:gridCol w:w="1320"/>
+      </w:tblGrid>
+      <w:tr>
+        <w:trPr>
+          <w:tblHeader w:val="true"/>
+        </w:trPr>
+        <w:tc>
+          <w:tcPr/>
+          <w:p>
+            <w:pPr>
+              <w:pStyle w:val="Compact"/>
+              <w:jc w:val="left"/>
+            </w:pPr>
+            <w:r>
+              <w:t xml:space="preserve">Method</w:t>
+            </w:r>
+          </w:p>
+        </w:tc>
+        <w:tc>
+          <w:tcPr/>
+          <w:p>
+            <w:pPr>
+              <w:pStyle w:val="Compact"/>
+              <w:jc w:val="right"/>
+            </w:pPr>
+            <w:r>
+              <w:t xml:space="preserve">Cert. pass</w:t>
+            </w:r>
+          </w:p>
+        </w:tc>
+        <w:tc>
+          <w:tcPr/>
+          <w:p>
+            <w:pPr>
+              <w:pStyle w:val="Compact"/>
+              <w:jc w:val="right"/>
+            </w:pPr>
+            <w:r>
+              <w:t xml:space="preserve">Uncertified</w:t>
+            </w:r>
+          </w:p>
+        </w:tc>
+        <w:tc>
+          <w:tcPr/>
+          <w:p>
+            <w:pPr>
+              <w:pStyle w:val="Compact"/>
+              <w:jc w:val="right"/>
+            </w:pPr>
+            <w:r>
+              <w:rPr>
+                <w:smallCaps/>
+              </w:rPr>
+              <w:t xml:space="preserve">Full</w:t>
+            </w:r>
+            <w:r>
+              <w:t xml:space="preserve"> </w:t>
+            </w:r>
+            <w:r>
+              <w:t xml:space="preserve">rate</w:t>
+            </w:r>
+          </w:p>
+        </w:tc>
+        <w:tc>
+          <w:tcPr/>
+          <w:p>
+            <w:pPr>
+              <w:pStyle w:val="Compact"/>
+              <w:jc w:val="right"/>
+            </w:pPr>
+            <w:r>
+              <w:t xml:space="preserve">Median native work/</w:t>
+            </w:r>
+            <w:r>
+              <w:rPr>
+                <w:smallCaps/>
+              </w:rPr>
+              <w:t xml:space="preserve">Full</w:t>
+            </w:r>
+          </w:p>
+        </w:tc>
+        <w:tc>
+          <w:tcPr/>
+          <w:p>
+            <w:pPr>
+              <w:pStyle w:val="Compact"/>
+              <w:jc w:val="left"/>
+            </w:pPr>
+            <w:r>
+              <w:t xml:space="preserve">Decision rule</w:t>
+            </w:r>
+          </w:p>
+        </w:tc>
+      </w:tr>
+      <w:tr>
+        <w:tc>
+          <w:tcPr/>
+          <w:p>
+            <w:pPr>
+              <w:pStyle w:val="Compact"/>
+              <w:jc w:val="left"/>
+            </w:pPr>
+            <w:r>
+              <w:rPr>
+                <w:smallCaps/>
+              </w:rPr>
+              <w:t xml:space="preserve">Full</w:t>
+            </w:r>
+          </w:p>
+        </w:tc>
+        <w:tc>
+          <w:tcPr/>
+          <w:p>
+            <w:pPr>
+              <w:pStyle w:val="Compact"/>
+              <w:jc w:val="right"/>
+            </w:pPr>
+            <w:r>
+              <w:t xml:space="preserve">100.0%</w:t>
+            </w:r>
+          </w:p>
+        </w:tc>
+        <w:tc>
+          <w:tcPr/>
+          <w:p>
+            <w:pPr>
+              <w:pStyle w:val="Compact"/>
+              <w:jc w:val="right"/>
+            </w:pPr>
+            <w:r>
+              <w:t xml:space="preserve">0.0%</w:t>
+            </w:r>
+          </w:p>
+        </w:tc>
+        <w:tc>
+          <w:tcPr/>
+          <w:p>
+            <w:pPr>
+              <w:pStyle w:val="Compact"/>
+              <w:jc w:val="right"/>
+            </w:pPr>
+            <w:r>
+              <w:t xml:space="preserve">100.0%</w:t>
+            </w:r>
+          </w:p>
+        </w:tc>
+        <w:tc>
+          <w:tcPr/>
+          <w:p>
+            <w:pPr>
+              <w:pStyle w:val="Compact"/>
+              <w:jc w:val="right"/>
+            </w:pPr>
+            <w:r>
+              <w:t xml:space="preserve">1.00000</w:t>
+            </w:r>
+          </w:p>
+        </w:tc>
+        <w:tc>
+          <w:tcPr/>
+          <w:p>
+            <w:pPr>
+              <w:pStyle w:val="Compact"/>
+              <w:jc w:val="left"/>
+            </w:pPr>
+            <w:r>
+              <w:t xml:space="preserve">full reference</w:t>
+            </w:r>
+          </w:p>
+        </w:tc>
+      </w:tr>
+      <w:tr>
+        <w:tc>
+          <w:tcPr/>
+          <w:p>
+            <w:pPr>
+              <w:pStyle w:val="Compact"/>
+              <w:jc w:val="left"/>
+            </w:pPr>
+            <w:r>
+              <w:t xml:space="preserve">Exact only</w:t>
+            </w:r>
+          </w:p>
+        </w:tc>
+        <w:tc>
+          <w:tcPr/>
+          <w:p>
+            <w:pPr>
+              <w:pStyle w:val="Compact"/>
+              <w:jc w:val="right"/>
+            </w:pPr>
+            <w:r>
+              <w:t xml:space="preserve">26.7%</w:t>
+            </w:r>
+          </w:p>
+        </w:tc>
+        <w:tc>
+          <w:tcPr/>
+          <w:p>
+            <w:pPr>
+              <w:pStyle w:val="Compact"/>
+              <w:jc w:val="right"/>
+            </w:pPr>
+            <w:r>
+              <w:t xml:space="preserve">73.3%</w:t>
+            </w:r>
+          </w:p>
+        </w:tc>
+        <w:tc>
+          <w:tcPr/>
+          <w:p>
+            <w:pPr>
+              <w:pStyle w:val="Compact"/>
+              <w:jc w:val="right"/>
+            </w:pPr>
+            <w:r>
+              <w:t xml:space="preserve">0.0%</w:t>
+            </w:r>
+          </w:p>
+        </w:tc>
+        <w:tc>
+          <w:tcPr/>
+          <w:p>
+            <w:pPr>
+              <w:pStyle w:val="Compact"/>
+              <w:jc w:val="right"/>
+            </w:pPr>
+            <w:r>
+              <w:t xml:space="preserve">0.00000</w:t>
+            </w:r>
+          </w:p>
+        </w:tc>
+        <w:tc>
+          <w:tcPr/>
+          <w:p>
+            <w:pPr>
+              <w:pStyle w:val="Compact"/>
+              <w:jc w:val="left"/>
+            </w:pPr>
+            <w:r>
+              <w:t xml:space="preserve">exact closure only</w:t>
+            </w:r>
+          </w:p>
+        </w:tc>
+      </w:tr>
+      <w:tr>
+        <w:tc>
+          <w:tcPr/>
+          <w:p>
+            <w:pPr>
+              <w:pStyle w:val="Compact"/>
+              <w:jc w:val="left"/>
+            </w:pPr>
+            <w:r>
+              <w:t xml:space="preserve">Radius 0–3</w:t>
+            </w:r>
+          </w:p>
+        </w:tc>
+        <w:tc>
+          <w:tcPr/>
+          <w:p>
+            <w:pPr>
+              <w:pStyle w:val="Compact"/>
+              <w:jc w:val="right"/>
+            </w:pPr>
+            <w:r>
+              <w:t xml:space="preserve">26.7%</w:t>
+            </w:r>
+          </w:p>
+        </w:tc>
+        <w:tc>
+          <w:tcPr/>
+          <w:p>
+            <w:pPr>
+              <w:pStyle w:val="Compact"/>
+              <w:jc w:val="right"/>
+            </w:pPr>
+            <w:r>
+              <w:t xml:space="preserve">73.3%</w:t>
+            </w:r>
+          </w:p>
+        </w:tc>
+        <w:tc>
+          <w:tcPr/>
+          <w:p>
+            <w:pPr>
+              <w:pStyle w:val="Compact"/>
+              <w:jc w:val="right"/>
+            </w:pPr>
+            <w:r>
+              <w:t xml:space="preserve">0.0%</w:t>
+            </w:r>
+          </w:p>
+        </w:tc>
+        <w:tc>
+          <w:tcPr/>
+          <w:p>
+            <w:pPr>
+              <w:pStyle w:val="Compact"/>
+              <w:jc w:val="right"/>
+            </w:pPr>
+            <w:r>
+              <w:t xml:space="preserve">0.00000</w:t>
+            </w:r>
+          </w:p>
+        </w:tc>
+        <w:tc>
+          <w:tcPr/>
+          <w:p>
+            <w:pPr>
+              <w:pStyle w:val="Compact"/>
+              <w:jc w:val="left"/>
+            </w:pPr>
+            <w:r>
+              <w:t xml:space="preserve">fixed graph radius</w:t>
+            </w:r>
+          </w:p>
+        </w:tc>
+      </w:tr>
+      <w:tr>
+        <w:tc>
+          <w:tcPr/>
+          <w:p>
+            <w:pPr>
+              <w:pStyle w:val="Compact"/>
+              <w:jc w:val="left"/>
+            </w:pPr>
+            <w:r>
+              <w:t xml:space="preserve">Changed fraction</w:t>
+            </w:r>
+          </w:p>
+        </w:tc>
+        <w:tc>
+          <w:tcPr/>
+          <w:p>
+            <w:pPr>
+              <w:pStyle w:val="Compact"/>
+              <w:jc w:val="right"/>
+            </w:pPr>
+            <w:r>
+              <w:t xml:space="preserve">40.0%</w:t>
+            </w:r>
+          </w:p>
+        </w:tc>
+        <w:tc>
+          <w:tcPr/>
+          <w:p>
+            <w:pPr>
+              <w:pStyle w:val="Compact"/>
+              <w:jc w:val="right"/>
+            </w:pPr>
+            <w:r>
+              <w:t xml:space="preserve">60.0%</w:t>
+            </w:r>
+          </w:p>
+        </w:tc>
+        <w:tc>
+          <w:tcPr/>
+          <w:p>
+            <w:pPr>
+              <w:pStyle w:val="Compact"/>
+              <w:jc w:val="right"/>
+            </w:pPr>
+            <w:r>
+              <w:t xml:space="preserve">0.0%</w:t>
+            </w:r>
+          </w:p>
+        </w:tc>
+        <w:tc>
+          <w:tcPr/>
+          <w:p>
+            <w:pPr>
+              <w:pStyle w:val="Compact"/>
+              <w:jc w:val="right"/>
+            </w:pPr>
+            <w:r>
+              <w:t xml:space="preserve">0.00000</w:t>
+            </w:r>
+          </w:p>
+        </w:tc>
+        <w:tc>
+          <w:tcPr/>
+          <w:p>
+            <w:pPr>
+              <w:pStyle w:val="Compact"/>
+              <w:jc w:val="left"/>
+            </w:pPr>
+            <w:r>
+              <w:t xml:space="preserve">threshold policy</w:t>
+            </w:r>
+          </w:p>
+        </w:tc>
+      </w:tr>
+      <w:tr>
+        <w:tc>
+          <w:tcPr/>
+          <w:p>
+            <w:pPr>
+              <w:pStyle w:val="Compact"/>
+              <w:jc w:val="left"/>
+            </w:pPr>
+            <w:r>
+              <w:t xml:space="preserve">Empirical order + certifier</w:t>
+            </w:r>
+          </w:p>
+        </w:tc>
+        <w:tc>
+          <w:tcPr/>
+          <w:p>
+            <w:pPr>
+              <w:pStyle w:val="Compact"/>
+              <w:jc w:val="right"/>
+            </w:pPr>
+            <w:r>
+              <w:t xml:space="preserve">100.0%</w:t>
+            </w:r>
+          </w:p>
+        </w:tc>
+        <w:tc>
+          <w:tcPr/>
+          <w:p>
+            <w:pPr>
+              <w:pStyle w:val="Compact"/>
+              <w:jc w:val="right"/>
+            </w:pPr>
+            <w:r>
+              <w:t xml:space="preserve">0.0%</w:t>
+            </w:r>
+          </w:p>
+        </w:tc>
+        <w:tc>
+          <w:tcPr/>
+          <w:p>
+            <w:pPr>
+              <w:pStyle w:val="Compact"/>
+              <w:jc w:val="right"/>
+            </w:pPr>
+            <w:r>
+              <w:t xml:space="preserve">0.0%</w:t>
+            </w:r>
+          </w:p>
+        </w:tc>
+        <w:tc>
+          <w:tcPr/>
+          <w:p>
+            <w:pPr>
+              <w:pStyle w:val="Compact"/>
+              <w:jc w:val="right"/>
+            </w:pPr>
+            <w:r>
+              <w:t xml:space="preserve">0.04736</w:t>
+            </w:r>
+          </w:p>
+        </w:tc>
+        <w:tc>
+          <w:tcPr/>
+          <w:p>
+            <w:pPr>
+              <w:pStyle w:val="Compact"/>
+              <w:jc w:val="left"/>
+            </w:pPr>
+            <w:r>
+              <w:t xml:space="preserve">empirical ordering, analytic recertification</w:t>
+            </w:r>
+          </w:p>
+        </w:tc>
+      </w:tr>
+      <w:tr>
+        <w:tc>
+          <w:tcPr/>
+          <w:p>
+            <w:pPr>
+              <w:pStyle w:val="Compact"/>
+              <w:jc w:val="left"/>
+            </w:pPr>
+            <w:r>
+              <w:t xml:space="preserve">CBRC</w:t>
+            </w:r>
+          </w:p>
+        </w:tc>
+        <w:tc>
+          <w:tcPr/>
+          <w:p>
+            <w:pPr>
+              <w:pStyle w:val="Compact"/>
+              <w:jc w:val="right"/>
+            </w:pPr>
+            <w:r>
+              <w:t xml:space="preserve">100.0%</w:t>
+            </w:r>
+          </w:p>
+        </w:tc>
+        <w:tc>
+          <w:tcPr/>
+          <w:p>
+            <w:pPr>
+              <w:pStyle w:val="Compact"/>
+              <w:jc w:val="right"/>
+            </w:pPr>
+            <w:r>
+              <w:t xml:space="preserve">0.0%</w:t>
+            </w:r>
+          </w:p>
+        </w:tc>
+        <w:tc>
+          <w:tcPr/>
+          <w:p>
+            <w:pPr>
+              <w:pStyle w:val="Compact"/>
+              <w:jc w:val="right"/>
+            </w:pPr>
+            <w:r>
+              <w:t xml:space="preserve">26.7%</w:t>
+            </w:r>
+          </w:p>
+        </w:tc>
+        <w:tc>
+          <w:tcPr/>
+          <w:p>
+            <w:pPr>
+              <w:pStyle w:val="Compact"/>
+              <w:jc w:val="right"/>
+            </w:pPr>
+            <w:r>
+              <w:t xml:space="preserve">0.04736</w:t>
+            </w:r>
+          </w:p>
+        </w:tc>
+        <w:tc>
+          <w:tcPr/>
+          <w:p>
+            <w:pPr>
+              <w:pStyle w:val="Compact"/>
+              <w:jc w:val="left"/>
+            </w:pPr>
+            <w:r>
+              <w:t xml:space="preserve">certificate + work crossover + fallback</w:t>
+            </w:r>
+          </w:p>
+        </w:tc>
+      </w:tr>
+    </w:tbl>
     <w:p>
       <w:pPr>
         <w:pStyle w:val="BodyText"/>
@@ -5119,18 +6379,18 @@
           <wp:inline>
             <wp:extent cx="5227320" cy="3136392"/>
             <wp:effectExtent b="0" l="0" r="0" t="0"/>
-            <wp:docPr descr="image" title="" id="49" name="Picture"/>
+            <wp:docPr descr="image" title="" id="55" name="Picture"/>
             <a:graphic>
               <a:graphicData uri="http://schemas.openxmlformats.org/drawingml/2006/picture">
                 <pic:pic>
                   <pic:nvPicPr>
-                    <pic:cNvPr descr="../research/results/visualizations/public/F0_hero.png" id="50" name="Picture"/>
+                    <pic:cNvPr descr="../research/results/visualizations/public/F0_hero.png" id="56" name="Picture"/>
                     <pic:cNvPicPr>
                       <a:picLocks noChangeArrowheads="1" noChangeAspect="1"/>
                     </pic:cNvPicPr>
                   </pic:nvPicPr>
                   <pic:blipFill>
-                    <a:blip r:embed="rId48"/>
+                    <a:blip r:embed="rId54"/>
                     <a:stretch>
                       <a:fillRect/>
                     </a:stretch>
@@ -5157,7 +6417,7 @@
         </w:drawing>
       </w:r>
     </w:p>
-    <w:bookmarkStart w:id="51" w:name="tab:summary"/>
+    <w:bookmarkStart w:id="57" w:name="tab:summary"/>
     <w:p>
       <w:pPr>
         <w:pStyle w:val="TableCaption"/>
@@ -5574,9 +6834,9 @@
         </w:tc>
       </w:tr>
     </w:tbl>
-    <w:bookmarkEnd w:id="51"/>
-    <w:bookmarkEnd w:id="52"/>
-    <w:bookmarkStart w:id="54" w:name="trained-3dgs-representation-check"/>
+    <w:bookmarkEnd w:id="57"/>
+    <w:bookmarkEnd w:id="58"/>
+    <w:bookmarkStart w:id="60" w:name="trained-3dgs-representation-check"/>
     <w:p>
       <w:pPr>
         <w:pStyle w:val="Heading2"/>
@@ -5653,7 +6913,7 @@
         <w:t xml:space="preserve">. Thus the selected update can be highly local while discovery remains essentially global. We treat this as the principal systems limitation of the frozen end-to-end implementation.</w:t>
       </w:r>
     </w:p>
-    <w:bookmarkStart w:id="53" w:name="tab:trained"/>
+    <w:bookmarkStart w:id="59" w:name="tab:trained"/>
     <w:p>
       <w:pPr>
         <w:pStyle w:val="TableCaption"/>
@@ -5815,9 +7075,9 @@
         </w:tc>
       </w:tr>
     </w:tbl>
-    <w:bookmarkEnd w:id="53"/>
-    <w:bookmarkEnd w:id="54"/>
-    <w:bookmarkStart w:id="55" w:name="sparse-candidate-discovery"/>
+    <w:bookmarkEnd w:id="59"/>
+    <w:bookmarkEnd w:id="60"/>
+    <w:bookmarkStart w:id="61" w:name="sparse-candidate-discovery"/>
     <w:p>
       <w:pPr>
         <w:pStyle w:val="Heading2"/>
@@ -5912,8 +7172,8 @@
         <w:br/>
       </w:r>
     </w:p>
-    <w:bookmarkEnd w:id="55"/>
-    <w:bookmarkStart w:id="56" w:name="empirical-scheduling-and-ablations"/>
+    <w:bookmarkEnd w:id="61"/>
+    <w:bookmarkStart w:id="62" w:name="empirical-scheduling-and-ablations"/>
     <w:p>
       <w:pPr>
         <w:pStyle w:val="Heading2"/>
@@ -5935,12 +7195,244 @@
         <w:pStyle w:val="BodyText"/>
       </w:pPr>
       <w:r>
-        <w:t xml:space="preserve">Several real-matrix structural ablations are also non-discriminative. We do not reinterpret those neutral outcomes as support for component necessity. The deterministic mechanism-isolation suite is used only to show that each v1 mechanism has a constructed falsifying stress case. In particular, disabling fallback or substituting an overly global bound produces the expected failure or rebuild behavior in stress cases, while the real campaign remains the source for observed effect size.</w:t>
-      </w:r>
-    </w:p>
-    <w:bookmarkEnd w:id="56"/>
-    <w:bookmarkEnd w:id="57"/>
-    <w:bookmarkStart w:id="68" w:name="discussion"/>
+        <w:t xml:space="preserve">Table </w:t>
+      </w:r>
+      <w:hyperlink w:anchor="tab:ablations">
+        <w:r>
+          <w:rPr>
+            <w:rStyle w:val="Hyperlink"/>
+          </w:rPr>
+          <w:t xml:space="preserve">[tab:ablations]</w:t>
+        </w:r>
+      </w:hyperlink>
+      <w:r>
+        <w:t xml:space="preserve"> </w:t>
+      </w:r>
+      <w:r>
+        <w:t xml:space="preserve">makes the real-matrix ablation behavior explicit. Five structural/analytic ablations are neutral on these 60 cases. The global-norm-tail replacement remains certificate-safe but collapses to</w:t>
+      </w:r>
+      <w:r>
+        <w:t xml:space="preserve"> </w:t>
+      </w:r>
+      <w:r>
+        <w:rPr>
+          <w:smallCaps/>
+        </w:rPr>
+        <w:t xml:space="preserve">Full</w:t>
+      </w:r>
+      <w:r>
+        <w:t xml:space="preserve"> </w:t>
+      </w:r>
+      <w:r>
+        <w:t xml:space="preserve">on every case. Removing fallback has the opposite failure mode: it never selects</w:t>
+      </w:r>
+      <w:r>
+        <w:t xml:space="preserve"> </w:t>
+      </w:r>
+      <w:r>
+        <w:rPr>
+          <w:smallCaps/>
+        </w:rPr>
+        <w:t xml:space="preserve">Full</w:t>
+      </w:r>
+      <w:r>
+        <w:t xml:space="preserve"> </w:t>
+      </w:r>
+      <w:r>
+        <w:t xml:space="preserve">and only 26.7% of cases pass the certificate. The separately labeled mechanism-isolation suite contains seven deterministic synthetic stress cases, one for each v1 mechanism, and all seven separate in the expected safety/work direction. Those stress cases establish falsifiability of the mechanisms, not real-world effect size.</w:t>
+      </w:r>
+    </w:p>
+    <w:p>
+      <w:pPr>
+        <w:pStyle w:val="BodyText"/>
+      </w:pPr>
+      <w:r>
+        <w:t xml:space="preserve">lrrrY</w:t>
+      </w:r>
+      <w:r>
+        <w:t xml:space="preserve"> </w:t>
+      </w:r>
+      <w:r>
+        <w:t xml:space="preserve">Ablation &amp; Pass &amp;</w:t>
+      </w:r>
+      <w:r>
+        <w:t xml:space="preserve"> </w:t>
+      </w:r>
+      <w:r>
+        <w:rPr>
+          <w:smallCaps/>
+        </w:rPr>
+        <w:t xml:space="preserve">Full</w:t>
+      </w:r>
+      <w:r>
+        <w:t xml:space="preserve"> </w:t>
+      </w:r>
+      <w:r>
+        <w:t xml:space="preserve">rate &amp; Median native work/</w:t>
+      </w:r>
+      <w:r>
+        <w:rPr>
+          <w:smallCaps/>
+        </w:rPr>
+        <w:t xml:space="preserve">Full</w:t>
+      </w:r>
+      <w:r>
+        <w:t xml:space="preserve"> </w:t>
+      </w:r>
+      <w:r>
+        <w:t xml:space="preserve">&amp; Reading</w:t>
+      </w:r>
+      <w:r>
+        <w:br/>
+      </w:r>
+      <w:r>
+        <w:t xml:space="preserve">Remove predecessor closure &amp; 100.0% &amp; 26.7% &amp; 0.04736 &amp; neutral on real matrix; synthetic case exposes omitted required exact work</w:t>
+      </w:r>
+      <w:r>
+        <w:br/>
+      </w:r>
+      <w:r>
+        <w:t xml:space="preserve">Gaussian analytic</w:t>
+      </w:r>
+      <w:r>
+        <w:t xml:space="preserve"> </w:t>
+      </w:r>
+      <m:oMath>
+        <m:r>
+          <m:rPr>
+            <m:sty m:val="p"/>
+          </m:rPr>
+          <m:t>→</m:t>
+        </m:r>
+      </m:oMath>
+      <w:r>
+        <w:t xml:space="preserve"> </w:t>
+      </w:r>
+      <w:r>
+        <w:rPr>
+          <w:smallCaps/>
+        </w:rPr>
+        <w:t xml:space="preserve">Hard</w:t>
+      </w:r>
+      <w:r>
+        <w:t xml:space="preserve"> </w:t>
+      </w:r>
+      <w:r>
+        <w:t xml:space="preserve">&amp; 100.0% &amp; 26.7% &amp; 0.04736 &amp; neutral on real matrix; synthetic case increases required work or forces</w:t>
+      </w:r>
+      <w:r>
+        <w:t xml:space="preserve"> </w:t>
+      </w:r>
+      <w:r>
+        <w:rPr>
+          <w:smallCaps/>
+        </w:rPr>
+        <w:t xml:space="preserve">Full</w:t>
+      </w:r>
+      <w:r>
+        <w:br/>
+      </w:r>
+      <w:r>
+        <w:t xml:space="preserve">Temporal analytic</w:t>
+      </w:r>
+      <w:r>
+        <w:t xml:space="preserve"> </w:t>
+      </w:r>
+      <m:oMath>
+        <m:r>
+          <m:rPr>
+            <m:sty m:val="p"/>
+          </m:rPr>
+          <m:t>→</m:t>
+        </m:r>
+      </m:oMath>
+      <w:r>
+        <w:t xml:space="preserve"> </w:t>
+      </w:r>
+      <w:r>
+        <w:rPr>
+          <w:smallCaps/>
+        </w:rPr>
+        <w:t xml:space="preserve">Hard</w:t>
+      </w:r>
+      <w:r>
+        <w:t xml:space="preserve"> </w:t>
+      </w:r>
+      <w:r>
+        <w:t xml:space="preserve">&amp; 100.0% &amp; 26.7% &amp; 0.04736 &amp; neutral on real matrix; synthetic case increases required work or forces</w:t>
+      </w:r>
+      <w:r>
+        <w:t xml:space="preserve"> </w:t>
+      </w:r>
+      <w:r>
+        <w:rPr>
+          <w:smallCaps/>
+        </w:rPr>
+        <w:t xml:space="preserve">Full</w:t>
+      </w:r>
+      <w:r>
+        <w:br/>
+      </w:r>
+      <w:r>
+        <w:t xml:space="preserve">Remove QoI specialization &amp; 100.0% &amp; 26.7% &amp; 0.04736 &amp; neutral on real matrix; synthetic case requires extra irrelevant work</w:t>
+      </w:r>
+      <w:r>
+        <w:br/>
+      </w:r>
+      <w:r>
+        <w:t xml:space="preserve">Collapse</w:t>
+      </w:r>
+      <w:r>
+        <w:t xml:space="preserve"> </w:t>
+      </w:r>
+      <w:r>
+        <w:rPr>
+          <w:smallCaps/>
+        </w:rPr>
+        <w:t xml:space="preserve">Hard</w:t>
+      </w:r>
+      <w:r>
+        <w:t xml:space="preserve">/</w:t>
+      </w:r>
+      <w:r>
+        <w:rPr>
+          <w:smallCaps/>
+        </w:rPr>
+        <w:t xml:space="preserve">Analytic</w:t>
+      </w:r>
+      <w:r>
+        <w:t xml:space="preserve"> </w:t>
+      </w:r>
+      <w:r>
+        <w:t xml:space="preserve">separation &amp; 100.0% &amp; 26.7% &amp; 0.04736 &amp; neutral on real matrix; synthetic case becomes more conservative</w:t>
+      </w:r>
+      <w:r>
+        <w:br/>
+      </w:r>
+      <w:r>
+        <w:t xml:space="preserve">Global-norm exterior tail &amp; 100.0% &amp; 100.0% &amp; 1.00000 &amp; safe but destroys locality on all 60 real cases</w:t>
+      </w:r>
+      <w:r>
+        <w:br/>
+      </w:r>
+      <w:r>
+        <w:t xml:space="preserve">Remove certified fallback &amp; 26.7% &amp; 0.0% &amp; 0.00000 &amp; 44/60 real cases fail certification; synthetic case leaves an unsafe candidate</w:t>
+      </w:r>
+      <w:r>
+        <w:br/>
+      </w:r>
+    </w:p>
+    <w:p>
+      <w:pPr>
+        <w:pStyle w:val="BodyText"/>
+      </w:pPr>
+      <w:r>
+        <w:t xml:space="preserve">The selected public residual is numerically zero in every frozen case at the reported precision, despite 56/60 source edits exceeding tolerance before repair. The real matrix therefore demonstrates selection/fallback correctness but does not estimate certificate tightness under non-zero accepted residual. We use the threshold-crossing mechanism-isolation cases only to show that the analytic machinery can change decisions when stressed; we do not present them as a substitute for real non-zero-residual evidence.</w:t>
+      </w:r>
+    </w:p>
+    <w:bookmarkEnd w:id="62"/>
+    <w:bookmarkEnd w:id="63"/>
+    <w:bookmarkStart w:id="74" w:name="discussion"/>
     <w:p>
       <w:pPr>
         <w:pStyle w:val="Heading1"/>
@@ -5949,7 +7441,7 @@
         <w:t xml:space="preserve">Discussion</w:t>
       </w:r>
     </w:p>
-    <w:bookmarkStart w:id="58" w:name="what-the-evidence-establishes"/>
+    <w:bookmarkStart w:id="64" w:name="what-the-evidence-establishes"/>
     <w:p>
       <w:pPr>
         <w:pStyle w:val="Heading2"/>
@@ -6045,8 +7537,8 @@
         <w:t xml:space="preserve">frequently; that is a cost of the safety contract, not a correctness failure.</w:t>
       </w:r>
     </w:p>
-    <w:bookmarkEnd w:id="58"/>
-    <w:bookmarkStart w:id="66" w:name="limitations"/>
+    <w:bookmarkEnd w:id="64"/>
+    <w:bookmarkStart w:id="72" w:name="limitations"/>
     <w:p>
       <w:pPr>
         <w:pStyle w:val="Heading2"/>
@@ -6055,7 +7547,7 @@
         <w:t xml:space="preserve">Limitations</w:t>
       </w:r>
     </w:p>
-    <w:bookmarkStart w:id="59" w:name="Xcf4b20d05c24d38c4491abb41d60bcddc821aa6"/>
+    <w:bookmarkStart w:id="65" w:name="Xcf4b20d05c24d38c4491abb41d60bcddc821aa6"/>
     <w:p>
       <w:pPr>
         <w:pStyle w:val="Heading4"/>
@@ -6102,8 +7594,8 @@
         <w:t xml:space="preserve">edge must be a finite-change upper bound over the declared revision domain. A representation, shader, temporal rule, or ownership change can invalidate previously calibrated metadata. Certificates therefore require versioned bound provenance and regression tests.</w:t>
       </w:r>
     </w:p>
-    <w:bookmarkEnd w:id="59"/>
-    <w:bookmarkStart w:id="60" w:name="Xa3dde70f84380da52be1ceb2ef858411be22e0e"/>
+    <w:bookmarkEnd w:id="65"/>
+    <w:bookmarkStart w:id="66" w:name="Xa3dde70f84380da52be1ceb2ef858411be22e0e"/>
     <w:p>
       <w:pPr>
         <w:pStyle w:val="Heading4"/>
@@ -6120,8 +7612,8 @@
         <w:t xml:space="preserve">The most direct implementation limitation is the near-full Gaussian inspection ratio. Sparse discovery shows that exact selection can be achieved with far fewer inspections, but integration into the complete measured pipeline remains future engineering. This limitation prevents interpreting the current local update ratios as end-to-end complexity reduction across all phases.</w:t>
       </w:r>
     </w:p>
-    <w:bookmarkEnd w:id="60"/>
-    <w:bookmarkStart w:id="61" w:name="no-wall-clock-speedup-claim."/>
+    <w:bookmarkEnd w:id="66"/>
+    <w:bookmarkStart w:id="67" w:name="no-wall-clock-speedup-claim."/>
     <w:p>
       <w:pPr>
         <w:pStyle w:val="Heading4"/>
@@ -6166,8 +7658,8 @@
         <w:t xml:space="preserve">trained figure is native temporal/output work reduction. Neither is a paired local-versus-full runtime speedup. A future evaluation should perform matched end-to-end timing under identical execution conditions after sparse discovery is integrated.</w:t>
       </w:r>
     </w:p>
-    <w:bookmarkEnd w:id="61"/>
-    <w:bookmarkStart w:id="62" w:name="greedy-search-is-not-globally-optimal."/>
+    <w:bookmarkEnd w:id="67"/>
+    <w:bookmarkStart w:id="68" w:name="greedy-search-is-not-globally-optimal."/>
     <w:p>
       <w:pPr>
         <w:pStyle w:val="Heading4"/>
@@ -6198,8 +7690,8 @@
         <w:t xml:space="preserve">constructs a certified feasible cone but does not prove that no cheaper safe cone exists. Global combinatorial minimum-work optimization is outside the v1 claim.</w:t>
       </w:r>
     </w:p>
-    <w:bookmarkEnd w:id="62"/>
-    <w:bookmarkStart w:id="63" w:name="analytic-cycles-fail-closed."/>
+    <w:bookmarkEnd w:id="68"/>
+    <w:bookmarkStart w:id="69" w:name="analytic-cycles-fail-closed."/>
     <w:p>
       <w:pPr>
         <w:pStyle w:val="Heading4"/>
@@ -6228,8 +7720,8 @@
         <w:t xml:space="preserve">. General cyclic certification is future work.</w:t>
       </w:r>
     </w:p>
-    <w:bookmarkEnd w:id="63"/>
-    <w:bookmarkStart w:id="64" w:name="representation-and-dataset-scope."/>
+    <w:bookmarkEnd w:id="69"/>
+    <w:bookmarkStart w:id="70" w:name="representation-and-dataset-scope."/>
     <w:p>
       <w:pPr>
         <w:pStyle w:val="Heading4"/>
@@ -6246,8 +7738,8 @@
         <w:t xml:space="preserve">The primary public campaign uses normalized RGB/SfM reconstructions seeded into Gaussian fields rather than trained photorealistic 3DGS, and it is not a metric-scale reconstruction benchmark. The trained-3DGS experiment is a secondary representation check with only five revisions. Broader trained-scene evaluation would strengthen generality.</w:t>
       </w:r>
     </w:p>
-    <w:bookmarkEnd w:id="64"/>
-    <w:bookmarkStart w:id="65" w:name="ablation-identifiability."/>
+    <w:bookmarkEnd w:id="70"/>
+    <w:bookmarkStart w:id="71" w:name="ablation-identifiability."/>
     <w:p>
       <w:pPr>
         <w:pStyle w:val="Heading4"/>
@@ -6264,9 +7756,9 @@
         <w:t xml:space="preserve">Not every mechanism separates on the frozen real matrix. The paper therefore distinguishes real-workload evidence from synthetic mechanism isolation and does not claim that each mechanism contributes measurable benefit in every scene.</w:t>
       </w:r>
     </w:p>
-    <w:bookmarkEnd w:id="65"/>
-    <w:bookmarkEnd w:id="66"/>
-    <w:bookmarkStart w:id="67" w:name="implications"/>
+    <w:bookmarkEnd w:id="71"/>
+    <w:bookmarkEnd w:id="72"/>
+    <w:bookmarkStart w:id="73" w:name="implications"/>
     <w:p>
       <w:pPr>
         <w:pStyle w:val="Heading2"/>
@@ -6291,9 +7783,9 @@
         <w:t xml:space="preserve">The framework also makes failure scientifically useful. A certificate violation is not averaged into a quality metric; it is retained as a regression target with the revision manifest, graph version, chosen cone, emitted bound, full-reference output, and first violated invariant. This treatment aligns performance evaluation with the correctness burden created by selective recomputation.</w:t>
       </w:r>
     </w:p>
-    <w:bookmarkEnd w:id="67"/>
-    <w:bookmarkEnd w:id="68"/>
-    <w:bookmarkStart w:id="69" w:name="reproducibility-and-artifact-scope"/>
+    <w:bookmarkEnd w:id="73"/>
+    <w:bookmarkEnd w:id="74"/>
+    <w:bookmarkStart w:id="75" w:name="reproducibility-and-artifact-scope"/>
     <w:p>
       <w:pPr>
         <w:pStyle w:val="Heading1"/>
@@ -6318,8 +7810,8 @@
         <w:t xml:space="preserve">Scene-bearing figures retain the applicable upstream dataset or model terms. Original software is licensed under Apache-2.0, original research communication is scoped under CC BY 4.0, and third-party rights are recorded separately. For double-blind review, the identifiable public repository and author metadata should be replaced by an anonymized frozen supplement consistent with the target venue’s policy.</w:t>
       </w:r>
     </w:p>
-    <w:bookmarkEnd w:id="69"/>
-    <w:bookmarkStart w:id="101" w:name="conclusion"/>
+    <w:bookmarkEnd w:id="75"/>
+    <w:bookmarkStart w:id="115" w:name="conclusion"/>
     <w:p>
       <w:pPr>
         <w:pStyle w:val="Heading1"/>
@@ -6333,11 +7825,57 @@
         <w:pStyle w:val="FirstParagraph"/>
       </w:pPr>
       <w:r>
-        <w:t xml:space="preserve">We presented Criticality-Bounded Revision Cones, a fail-closed method for selective recomputation in persistent captured worlds. CBRC separates exact dependencies from conservative finite-change influence, binds the unrepaired exterior to explicit output tolerances, compares regional work against a full baseline, and independently replays every selected result against a full-after oracle. The frozen public and trained-representation campaigns show that local repair and full fallback can coexist under one auditable contract, while also exposing a near-global discovery bottleneck and the absence of a current wall-clock speedup claim. The central principle is simple: a persistent world should repair locally only when it can justify what it leaves untouched; otherwise it should rebuild.</w:t>
-      </w:r>
-    </w:p>
-    <w:bookmarkStart w:id="100" w:name="refs"/>
-    <w:bookmarkStart w:id="70" w:name="ref-ackermann2025clsplats"/>
+        <w:t xml:space="preserve">We presented Criticality-Bounded Revision Cones, where criticality is the worst normalized certificate-to-tolerance ratio for the protected outputs, as a fail-closed method for selective recomputation in persistent captured worlds. CBRC separates exact dependencies from conservative finite-change influence, binds the unrepaired exterior to explicit output tolerances, compares regional work against a full baseline, and independently replays every selected result against a full-after oracle. The frozen public and trained-representation campaigns show that local repair and full fallback can coexist under one auditable contract, while also exposing a near-global discovery bottleneck and the absence of a current wall-clock speedup claim. The central principle is simple: a persistent world should repair locally only when it can justify what it leaves untouched; otherwise it should rebuild.</w:t>
+      </w:r>
+    </w:p>
+    <w:bookmarkStart w:id="114" w:name="refs"/>
+    <w:bookmarkStart w:id="77" w:name="ref-acar2013selfadjusting"/>
+    <w:p>
+      <w:pPr>
+        <w:pStyle w:val="Bibliography"/>
+      </w:pPr>
+      <w:r>
+        <w:t xml:space="preserve">Acar, Umut A., Matthias Blume, and Jacob Donham. 2013.</w:t>
+      </w:r>
+      <w:r>
+        <w:t xml:space="preserve"> </w:t>
+      </w:r>
+      <w:r>
+        <w:t xml:space="preserve">“A Consistent Semantics of Self-Adjusting Computation.”</w:t>
+      </w:r>
+      <w:r>
+        <w:t xml:space="preserve"> </w:t>
+      </w:r>
+      <w:r>
+        <w:rPr>
+          <w:iCs/>
+          <w:i/>
+        </w:rPr>
+        <w:t xml:space="preserve">Journal of Functional Programming</w:t>
+      </w:r>
+      <w:r>
+        <w:t xml:space="preserve"> </w:t>
+      </w:r>
+      <w:r>
+        <w:t xml:space="preserve">23 (3): 249–92.</w:t>
+      </w:r>
+      <w:r>
+        <w:t xml:space="preserve"> </w:t>
+      </w:r>
+      <w:hyperlink r:id="rId76">
+        <w:r>
+          <w:rPr>
+            <w:rStyle w:val="Hyperlink"/>
+          </w:rPr>
+          <w:t xml:space="preserve">https://doi.org/10.1017/S0956796813000099</w:t>
+        </w:r>
+      </w:hyperlink>
+      <w:r>
+        <w:t xml:space="preserve">.</w:t>
+      </w:r>
+    </w:p>
+    <w:bookmarkEnd w:id="77"/>
+    <w:bookmarkStart w:id="78" w:name="ref-ackermann2025clsplats"/>
     <w:p>
       <w:pPr>
         <w:pStyle w:val="Bibliography"/>
@@ -6371,8 +7909,57 @@
         <w:t xml:space="preserve">, 7808–17.</w:t>
       </w:r>
     </w:p>
-    <w:bookmarkEnd w:id="70"/>
-    <w:bookmarkStart w:id="72" w:name="ref-chen2024gaussianeditor"/>
+    <w:bookmarkEnd w:id="78"/>
+    <w:bookmarkStart w:id="80" w:name="ref-bala1999raysegment"/>
+    <w:p>
+      <w:pPr>
+        <w:pStyle w:val="Bibliography"/>
+      </w:pPr>
+      <w:r>
+        <w:t xml:space="preserve">Bala, Kavita, Julie Dorsey, and Seth Teller. 1999.</w:t>
+      </w:r>
+      <w:r>
+        <w:t xml:space="preserve"> </w:t>
+      </w:r>
+      <w:r>
+        <w:t xml:space="preserve">“Interactive Ray-Traced Scene Editing Using Ray Segment Trees.”</w:t>
+      </w:r>
+      <w:r>
+        <w:t xml:space="preserve"> </w:t>
+      </w:r>
+      <w:r>
+        <w:t xml:space="preserve">In</w:t>
+      </w:r>
+      <w:r>
+        <w:t xml:space="preserve"> </w:t>
+      </w:r>
+      <w:r>
+        <w:rPr>
+          <w:iCs/>
+          <w:i/>
+        </w:rPr>
+        <w:t xml:space="preserve">Eurographics Workshop on Rendering</w:t>
+      </w:r>
+      <w:r>
+        <w:t xml:space="preserve">, 31–44.</w:t>
+      </w:r>
+      <w:r>
+        <w:t xml:space="preserve"> </w:t>
+      </w:r>
+      <w:hyperlink r:id="rId79">
+        <w:r>
+          <w:rPr>
+            <w:rStyle w:val="Hyperlink"/>
+          </w:rPr>
+          <w:t xml:space="preserve">https://doi.org/10.2312/EGWR/EGWR99/031-044</w:t>
+        </w:r>
+      </w:hyperlink>
+      <w:r>
+        <w:t xml:space="preserve">.</w:t>
+      </w:r>
+    </w:p>
+    <w:bookmarkEnd w:id="80"/>
+    <w:bookmarkStart w:id="82" w:name="ref-chen2024gaussianeditor"/>
     <w:p>
       <w:pPr>
         <w:pStyle w:val="Bibliography"/>
@@ -6408,7 +7995,7 @@
       <w:r>
         <w:t xml:space="preserve"> </w:t>
       </w:r>
-      <w:hyperlink r:id="rId71">
+      <w:hyperlink r:id="rId81">
         <w:r>
           <w:rPr>
             <w:rStyle w:val="Hyperlink"/>
@@ -6420,8 +8007,8 @@
         <w:t xml:space="preserve">.</w:t>
       </w:r>
     </w:p>
-    <w:bookmarkEnd w:id="72"/>
-    <w:bookmarkStart w:id="73" w:name="ref-curless1996volumetric"/>
+    <w:bookmarkEnd w:id="82"/>
+    <w:bookmarkStart w:id="83" w:name="ref-curless1996volumetric"/>
     <w:p>
       <w:pPr>
         <w:pStyle w:val="Bibliography"/>
@@ -6455,8 +8042,8 @@
         <w:t xml:space="preserve">, 303–12.</w:t>
       </w:r>
     </w:p>
-    <w:bookmarkEnd w:id="73"/>
-    <w:bookmarkStart w:id="74" w:name="ref-dai2017bundlefusion"/>
+    <w:bookmarkEnd w:id="83"/>
+    <w:bookmarkStart w:id="84" w:name="ref-dai2017bundlefusion"/>
     <w:p>
       <w:pPr>
         <w:pStyle w:val="Bibliography"/>
@@ -6487,8 +8074,8 @@
         <w:t xml:space="preserve">36 (4): 76:1–18.</w:t>
       </w:r>
     </w:p>
-    <w:bookmarkEnd w:id="74"/>
-    <w:bookmarkStart w:id="75" w:name="ref-ellensohn2026eligsir"/>
+    <w:bookmarkEnd w:id="84"/>
+    <w:bookmarkStart w:id="85" w:name="ref-ellensohn2026eligsir"/>
     <w:p>
       <w:pPr>
         <w:pStyle w:val="Bibliography"/>
@@ -6516,8 +8103,8 @@
         <w:t xml:space="preserve">.</w:t>
       </w:r>
     </w:p>
-    <w:bookmarkEnd w:id="75"/>
-    <w:bookmarkStart w:id="76" w:name="ref-galappaththige2026pixels"/>
+    <w:bookmarkEnd w:id="85"/>
+    <w:bookmarkStart w:id="86" w:name="ref-galappaththige2026pixels"/>
     <w:p>
       <w:pPr>
         <w:pStyle w:val="Bibliography"/>
@@ -6545,8 +8132,8 @@
         <w:t xml:space="preserve">.</w:t>
       </w:r>
     </w:p>
-    <w:bookmarkEnd w:id="76"/>
-    <w:bookmarkStart w:id="78" w:name="ref-huang2024scgs"/>
+    <w:bookmarkEnd w:id="86"/>
+    <w:bookmarkStart w:id="88" w:name="ref-huang2024scgs"/>
     <w:p>
       <w:pPr>
         <w:pStyle w:val="Bibliography"/>
@@ -6582,7 +8169,7 @@
       <w:r>
         <w:t xml:space="preserve"> </w:t>
       </w:r>
-      <w:hyperlink r:id="rId77">
+      <w:hyperlink r:id="rId87">
         <w:r>
           <w:rPr>
             <w:rStyle w:val="Hyperlink"/>
@@ -6594,8 +8181,8 @@
         <w:t xml:space="preserve">.</w:t>
       </w:r>
     </w:p>
-    <w:bookmarkEnd w:id="78"/>
-    <w:bookmarkStart w:id="79" w:name="ref-keetha2024splatam"/>
+    <w:bookmarkEnd w:id="88"/>
+    <w:bookmarkStart w:id="89" w:name="ref-keetha2024splatam"/>
     <w:p>
       <w:pPr>
         <w:pStyle w:val="Bibliography"/>
@@ -6629,8 +8216,8 @@
         <w:t xml:space="preserve">, 21357–66.</w:t>
       </w:r>
     </w:p>
-    <w:bookmarkEnd w:id="79"/>
-    <w:bookmarkStart w:id="81" w:name="ref-kerbl2023gaussians"/>
+    <w:bookmarkEnd w:id="89"/>
+    <w:bookmarkStart w:id="91" w:name="ref-kerbl2023gaussians"/>
     <w:p>
       <w:pPr>
         <w:pStyle w:val="Bibliography"/>
@@ -6663,7 +8250,7 @@
       <w:r>
         <w:t xml:space="preserve"> </w:t>
       </w:r>
-      <w:hyperlink r:id="rId80">
+      <w:hyperlink r:id="rId90">
         <w:r>
           <w:rPr>
             <w:rStyle w:val="Hyperlink"/>
@@ -6675,8 +8262,8 @@
         <w:t xml:space="preserve">.</w:t>
       </w:r>
     </w:p>
-    <w:bookmarkEnd w:id="81"/>
-    <w:bookmarkStart w:id="83" w:name="ref-luiten2024dynamic3dgaussians"/>
+    <w:bookmarkEnd w:id="91"/>
+    <w:bookmarkStart w:id="93" w:name="ref-luiten2024dynamic3dgaussians"/>
     <w:p>
       <w:pPr>
         <w:pStyle w:val="Bibliography"/>
@@ -6712,7 +8299,7 @@
       <w:r>
         <w:t xml:space="preserve"> </w:t>
       </w:r>
-      <w:hyperlink r:id="rId82">
+      <w:hyperlink r:id="rId92">
         <w:r>
           <w:rPr>
             <w:rStyle w:val="Hyperlink"/>
@@ -6724,8 +8311,8 @@
         <w:t xml:space="preserve">.</w:t>
       </w:r>
     </w:p>
-    <w:bookmarkEnd w:id="83"/>
-    <w:bookmarkStart w:id="85" w:name="ref-matsuki2024monogs"/>
+    <w:bookmarkEnd w:id="93"/>
+    <w:bookmarkStart w:id="95" w:name="ref-matsuki2024monogs"/>
     <w:p>
       <w:pPr>
         <w:pStyle w:val="Bibliography"/>
@@ -6761,7 +8348,7 @@
       <w:r>
         <w:t xml:space="preserve"> </w:t>
       </w:r>
-      <w:hyperlink r:id="rId84">
+      <w:hyperlink r:id="rId94">
         <w:r>
           <w:rPr>
             <w:rStyle w:val="Hyperlink"/>
@@ -6773,8 +8360,8 @@
         <w:t xml:space="preserve">.</w:t>
       </w:r>
     </w:p>
-    <w:bookmarkEnd w:id="85"/>
-    <w:bookmarkStart w:id="86" w:name="ref-mildenhall2020nerf"/>
+    <w:bookmarkEnd w:id="95"/>
+    <w:bookmarkStart w:id="96" w:name="ref-mildenhall2020nerf"/>
     <w:p>
       <w:pPr>
         <w:pStyle w:val="Bibliography"/>
@@ -6808,8 +8395,8 @@
         <w:t xml:space="preserve">, 405–21.</w:t>
       </w:r>
     </w:p>
-    <w:bookmarkEnd w:id="86"/>
-    <w:bookmarkStart w:id="87" w:name="ref-newcombe2011kinectfusion"/>
+    <w:bookmarkEnd w:id="96"/>
+    <w:bookmarkStart w:id="97" w:name="ref-newcombe2011kinectfusion"/>
     <w:p>
       <w:pPr>
         <w:pStyle w:val="Bibliography"/>
@@ -6843,8 +8430,54 @@
         <w:t xml:space="preserve">, 127–36.</w:t>
       </w:r>
     </w:p>
-    <w:bookmarkEnd w:id="87"/>
-    <w:bookmarkStart w:id="89" w:name="ref-pfister2000surfels"/>
+    <w:bookmarkEnd w:id="97"/>
+    <w:bookmarkStart w:id="99" w:name="ref-oden2001goal"/>
+    <w:p>
+      <w:pPr>
+        <w:pStyle w:val="Bibliography"/>
+      </w:pPr>
+      <w:r>
+        <w:t xml:space="preserve">Oden, J. Tinsley, and Serge Prudhomme. 2001.</w:t>
+      </w:r>
+      <w:r>
+        <w:t xml:space="preserve"> </w:t>
+      </w:r>
+      <w:r>
+        <w:t xml:space="preserve">“Goal-Oriented Error Estimation and Adaptivity for the Finite Element Method.”</w:t>
+      </w:r>
+      <w:r>
+        <w:t xml:space="preserve"> </w:t>
+      </w:r>
+      <w:r>
+        <w:rPr>
+          <w:iCs/>
+          <w:i/>
+        </w:rPr>
+        <w:t xml:space="preserve">Computers &amp; Mathematics with Applications</w:t>
+      </w:r>
+      <w:r>
+        <w:t xml:space="preserve"> </w:t>
+      </w:r>
+      <w:r>
+        <w:t xml:space="preserve">41 (5–6): 735–56.</w:t>
+      </w:r>
+      <w:r>
+        <w:t xml:space="preserve"> </w:t>
+      </w:r>
+      <w:hyperlink r:id="rId98">
+        <w:r>
+          <w:rPr>
+            <w:rStyle w:val="Hyperlink"/>
+          </w:rPr>
+          <w:t xml:space="preserve">https://doi.org/10.1016/S0898-1221(00)00317-5</w:t>
+        </w:r>
+      </w:hyperlink>
+      <w:r>
+        <w:t xml:space="preserve">.</w:t>
+      </w:r>
+    </w:p>
+    <w:bookmarkEnd w:id="99"/>
+    <w:bookmarkStart w:id="101" w:name="ref-pfister2000surfels"/>
     <w:p>
       <w:pPr>
         <w:pStyle w:val="Bibliography"/>
@@ -6880,7 +8513,7 @@
       <w:r>
         <w:t xml:space="preserve"> </w:t>
       </w:r>
-      <w:hyperlink r:id="rId88">
+      <w:hyperlink r:id="rId100">
         <w:r>
           <w:rPr>
             <w:rStyle w:val="Hyperlink"/>
@@ -6892,8 +8525,8 @@
         <w:t xml:space="preserve">.</w:t>
       </w:r>
     </w:p>
-    <w:bookmarkEnd w:id="89"/>
-    <w:bookmarkStart w:id="91" w:name="ref-sucar2021imap"/>
+    <w:bookmarkEnd w:id="101"/>
+    <w:bookmarkStart w:id="103" w:name="ref-sucar2021imap"/>
     <w:p>
       <w:pPr>
         <w:pStyle w:val="Bibliography"/>
@@ -6929,7 +8562,7 @@
       <w:r>
         <w:t xml:space="preserve"> </w:t>
       </w:r>
-      <w:hyperlink r:id="rId90">
+      <w:hyperlink r:id="rId102">
         <w:r>
           <w:rPr>
             <w:rStyle w:val="Hyperlink"/>
@@ -6941,8 +8574,8 @@
         <w:t xml:space="preserve">.</w:t>
       </w:r>
     </w:p>
-    <w:bookmarkEnd w:id="91"/>
-    <w:bookmarkStart w:id="92" w:name="ref-whelan2015elasticfusion"/>
+    <w:bookmarkEnd w:id="103"/>
+    <w:bookmarkStart w:id="104" w:name="ref-whelan2015elasticfusion"/>
     <w:p>
       <w:pPr>
         <w:pStyle w:val="Bibliography"/>
@@ -6976,8 +8609,57 @@
         <w:t xml:space="preserve">.</w:t>
       </w:r>
     </w:p>
-    <w:bookmarkEnd w:id="92"/>
-    <w:bookmarkStart w:id="94" w:name="ref-wu2024fourDGS"/>
+    <w:bookmarkEnd w:id="104"/>
+    <w:bookmarkStart w:id="106" w:name="ref-woerister2013lazy"/>
+    <w:p>
+      <w:pPr>
+        <w:pStyle w:val="Bibliography"/>
+      </w:pPr>
+      <w:r>
+        <w:t xml:space="preserve">Wörister, Michael, Harald Steinlechner, Stefan Maierhofer, and Robert F. Tobler. 2013.</w:t>
+      </w:r>
+      <w:r>
+        <w:t xml:space="preserve"> </w:t>
+      </w:r>
+      <w:r>
+        <w:t xml:space="preserve">“Lazy Incremental Computation for Efficient Scene Graph Rendering.”</w:t>
+      </w:r>
+      <w:r>
+        <w:t xml:space="preserve"> </w:t>
+      </w:r>
+      <w:r>
+        <w:t xml:space="preserve">In</w:t>
+      </w:r>
+      <w:r>
+        <w:t xml:space="preserve"> </w:t>
+      </w:r>
+      <w:r>
+        <w:rPr>
+          <w:iCs/>
+          <w:i/>
+        </w:rPr>
+        <w:t xml:space="preserve">Eurographics/ACM SIGGRAPH Symposium on High Performance Graphics</w:t>
+      </w:r>
+      <w:r>
+        <w:t xml:space="preserve">, 53–62.</w:t>
+      </w:r>
+      <w:r>
+        <w:t xml:space="preserve"> </w:t>
+      </w:r>
+      <w:hyperlink r:id="rId105">
+        <w:r>
+          <w:rPr>
+            <w:rStyle w:val="Hyperlink"/>
+          </w:rPr>
+          <w:t xml:space="preserve">https://doi.org/10.1145/2492045.2492051</w:t>
+        </w:r>
+      </w:hyperlink>
+      <w:r>
+        <w:t xml:space="preserve">.</w:t>
+      </w:r>
+    </w:p>
+    <w:bookmarkEnd w:id="106"/>
+    <w:bookmarkStart w:id="108" w:name="ref-wu2024fourDGS"/>
     <w:p>
       <w:pPr>
         <w:pStyle w:val="Bibliography"/>
@@ -7013,7 +8695,7 @@
       <w:r>
         <w:t xml:space="preserve"> </w:t>
       </w:r>
-      <w:hyperlink r:id="rId93">
+      <w:hyperlink r:id="rId107">
         <w:r>
           <w:rPr>
             <w:rStyle w:val="Hyperlink"/>
@@ -7025,8 +8707,8 @@
         <w:t xml:space="preserve">.</w:t>
       </w:r>
     </w:p>
-    <w:bookmarkEnd w:id="94"/>
-    <w:bookmarkStart w:id="95" w:name="ref-wu2026cif"/>
+    <w:bookmarkEnd w:id="108"/>
+    <w:bookmarkStart w:id="109" w:name="ref-wu2026cif"/>
     <w:p>
       <w:pPr>
         <w:pStyle w:val="Bibliography"/>
@@ -7060,8 +8742,8 @@
         <w:t xml:space="preserve">, 3783–93.</w:t>
       </w:r>
     </w:p>
-    <w:bookmarkEnd w:id="95"/>
-    <w:bookmarkStart w:id="96" w:name="ref-yugay2026game"/>
+    <w:bookmarkEnd w:id="109"/>
+    <w:bookmarkStart w:id="110" w:name="ref-yugay2026game"/>
     <w:p>
       <w:pPr>
         <w:pStyle w:val="Bibliography"/>
@@ -7095,8 +8777,8 @@
         <w:t xml:space="preserve">, 18903–12.</w:t>
       </w:r>
     </w:p>
-    <w:bookmarkEnd w:id="96"/>
-    <w:bookmarkStart w:id="98" w:name="ref-zeng2025gaussianupdate"/>
+    <w:bookmarkEnd w:id="110"/>
+    <w:bookmarkStart w:id="112" w:name="ref-zeng2025gaussianupdate"/>
     <w:p>
       <w:pPr>
         <w:pStyle w:val="Bibliography"/>
@@ -7132,7 +8814,7 @@
       <w:r>
         <w:t xml:space="preserve"> </w:t>
       </w:r>
-      <w:hyperlink r:id="rId97">
+      <w:hyperlink r:id="rId111">
         <w:r>
           <w:rPr>
             <w:rStyle w:val="Hyperlink"/>
@@ -7144,8 +8826,8 @@
         <w:t xml:space="preserve">.</w:t>
       </w:r>
     </w:p>
-    <w:bookmarkEnd w:id="98"/>
-    <w:bookmarkStart w:id="99" w:name="ref-zhu2022niceslam"/>
+    <w:bookmarkEnd w:id="112"/>
+    <w:bookmarkStart w:id="113" w:name="ref-zhu2022niceslam"/>
     <w:p>
       <w:pPr>
         <w:pStyle w:val="Bibliography"/>
@@ -7179,9 +8861,9 @@
         <w:t xml:space="preserve">, 12786–96.</w:t>
       </w:r>
     </w:p>
-    <w:bookmarkEnd w:id="99"/>
-    <w:bookmarkEnd w:id="100"/>
-    <w:bookmarkEnd w:id="101"/>
+    <w:bookmarkEnd w:id="113"/>
+    <w:bookmarkEnd w:id="114"/>
+    <w:bookmarkEnd w:id="115"/>
     <w:sectPr/>
   </w:body>
 </w:document>

</xml_diff>

<commit_message>
Revise MAVEB manuscript from peer review
* Strengthen manuscript framing and related work

* Formalize criticality and Gaussian display bound

* Add quantitative baseline and ablation evidence

* Simplify explanatory Gaussian revision poster

* Add incremental computation and error-control references

* Add Gaussian bound supplementary derivation

* Add manuscript review response ledger

* Document manuscript review revision

* Build reviewed manuscript revision

* Build final MAVEB manuscript artifacts

* Fix bibliography EOF formatting

* Build final MAVEB manuscript artifacts

* Finalize reviewed MAVEB manuscript

---------

Co-authored-by: github-actions[bot] <41898282+github-actions[bot]@users.noreply.github.com>
</commit_message>
<xml_diff>
--- a/researchpaper/MAVEB_manuscript.docx
+++ b/researchpaper/MAVEB_manuscript.docx
@@ -188,7 +188,7 @@
         <w:t xml:space="preserve"> </w:t>
       </w:r>
       <w:r>
-        <w:t xml:space="preserve">(CBRC). CBRCrepresents a revision over a typed dependency graph with three edge semantics:</w:t>
+        <w:t xml:space="preserve">(CBRC). CBRC represents a revision over a typed dependency graph with three edge semantics:</w:t>
       </w:r>
       <w:r>
         <w:t xml:space="preserve"> </w:t>
@@ -258,7 +258,20 @@
         <w:t xml:space="preserve"> </w:t>
       </w:r>
       <w:r>
-        <w:t xml:space="preserve">is certified against one or more quantities of interest. A local result is accepted only if (1) exact predecessors are closed, (2) the conservative exterior bound lies inside the declared tolerance, and (3) calibrated regional work is lower than the independently measured full baseline. Unsupported coupling, unstable analytic structure, or an unfavorable work crossover returns</w:t>
+        <w:t xml:space="preserve">is certified against one or more quantities of interest. We call the worst normalized certificate-to-tolerance ratio the</w:t>
+      </w:r>
+      <w:r>
+        <w:t xml:space="preserve"> </w:t>
+      </w:r>
+      <w:r>
+        <w:rPr>
+          <w:iCs/>
+          <w:i/>
+        </w:rPr>
+        <w:t xml:space="preserve">revision criticality</w:t>
+      </w:r>
+      <w:r>
+        <w:t xml:space="preserve">; the boundary value is one. A local result is accepted only if (1) exact predecessors are closed, (2) revision criticality is at or below one for every protected output, and (3) calibrated regional work is lower than the independently measured full baseline. Unsupported coupling, supercritical residual influence, unstable analytic structure, or an unfavorable work crossover returns</w:t>
       </w:r>
       <w:r>
         <w:t xml:space="preserve"> </w:t>
@@ -595,7 +608,7 @@
         <w:pStyle w:val="BodyText"/>
       </w:pPr>
       <w:r>
-        <w:t xml:space="preserve">Our evaluation freezes both protocol and claim boundaries before interpreting the final campaign. Across 60 public RGB/SfM revisions, CBRCselects 44 certified-local repairs and 16 automatic full rebuilds. No certificate violation is observed, native and Python planner decisions agree on all cases, and 56 of 60 source edits exceed the protected RGB tolerance before repair, which rules out the trivial explanation that the campaign contains only visually irrelevant edits. A frozen isolated millisecond cost model reports a median selected heterogeneous work ratio of 0.36953 of</w:t>
+        <w:t xml:space="preserve">Our evaluation freezes both protocol and claim boundaries before interpreting the final campaign. Across 60 public RGB/SfM revisions, CBRC selects 44 certified-local repairs and 16 automatic full rebuilds. No certificate violation is observed, native and Python planner decisions agree on all cases, and 56 of 60 source edits exceed the protected RGB tolerance before repair, which rules out the trivial explanation that the campaign contains only visually irrelevant edits. A frozen isolated millisecond cost model reports a median selected heterogeneous work ratio of 0.36953 of</w:t>
       </w:r>
       <w:r>
         <w:t xml:space="preserve"> </w:t>
@@ -952,13 +965,13 @@
       </w:r>
     </w:p>
     <w:bookmarkEnd w:id="24"/>
-    <w:bookmarkStart w:id="25" w:name="X9a513f5c9e67cec8b12985e80e162e71f8bf261"/>
+    <w:bookmarkStart w:id="25" w:name="Xe058922cb2ad9f50eb5d0cc67129a8e54cd7c86"/>
     <w:p>
       <w:pPr>
         <w:pStyle w:val="Heading4"/>
       </w:pPr>
       <w:r>
-        <w:t xml:space="preserve">Incremental computation and error control.</w:t>
+        <w:t xml:space="preserve">Incremental rendering, change propagation, and goal-oriented error control.</w:t>
       </w:r>
     </w:p>
     <w:p>
@@ -966,7 +979,66 @@
         <w:pStyle w:val="FirstParagraph"/>
       </w:pPr>
       <w:r>
-        <w:t xml:space="preserve">The mathematical tools underlying CBRC are classical: graph closure, non-negative influence propagation, Neumann-series resolvents, norm bounds, and greedy search are not introduced by this work. The contribution lies in the captured-world specialization and the systems contract that keeps exact and approximate dependencies separate, binds the residual to an explicit output, compares regional work to an independent full baseline, and falsifies each selected repair against full replay. We therefore treat the mathematics as supporting machinery rather than as standalone novelty.</w:t>
+        <w:t xml:space="preserve">Graphics systems have long exploited dependency structure to avoid global recomputation. Bala et al. track dependencies between edited world regions and bounded-error radiance interpolants using ray segment trees</w:t>
+      </w:r>
+      <w:r>
+        <w:t xml:space="preserve"> </w:t>
+      </w:r>
+      <w:r>
+        <w:t xml:space="preserve">(Bala, Dorsey, and Teller 1999)</w:t>
+      </w:r>
+      <w:r>
+        <w:t xml:space="preserve">. Wörister et al. synthesize a dependency graph from scene-graph changes to rendering caches and update those caches incrementally</w:t>
+      </w:r>
+      <w:r>
+        <w:t xml:space="preserve"> </w:t>
+      </w:r>
+      <w:r>
+        <w:t xml:space="preserve">(Wörister et al. 2013)</w:t>
+      </w:r>
+      <w:r>
+        <w:t xml:space="preserve">. Outside graphics, self-adjusting computation formalizes correct change propagation under mutation and reuse</w:t>
+      </w:r>
+      <w:r>
+        <w:t xml:space="preserve"> </w:t>
+      </w:r>
+      <w:r>
+        <w:t xml:space="preserve">(Acar, Blume, and Donham 2013)</w:t>
+      </w:r>
+      <w:r>
+        <w:t xml:space="preserve">, while goal-oriented error estimation allocates numerical work to control error in selected quantities of interest rather than a global state norm</w:t>
+      </w:r>
+      <w:r>
+        <w:t xml:space="preserve"> </w:t>
+      </w:r>
+      <w:r>
+        <w:t xml:space="preserve">(Oden and Prudhomme 2001)</w:t>
+      </w:r>
+      <w:r>
+        <w:t xml:space="preserve">. These traditions overlap with individual ingredients of CBRC and are therefore important novelty boundaries.</w:t>
+      </w:r>
+    </w:p>
+    <w:p>
+      <w:pPr>
+        <w:pStyle w:val="BodyText"/>
+      </w:pPr>
+      <w:r>
+        <w:t xml:space="preserve">The mathematical tools underlying CBRC remain classical: graph closure, non-negative influence propagation, Neumann-series resolvents, norm bounds, and greedy search are not introduced by this work. The claimed contribution is the captured-world systems contract that combines cross-derived exact dependencies, conservative finite-change bounds, rendered-output quantities of interest, heterogeneous work crossover, fail-closed</w:t>
+      </w:r>
+      <w:r>
+        <w:t xml:space="preserve"> </w:t>
+      </w:r>
+      <w:r>
+        <w:rPr>
+          <w:smallCaps/>
+        </w:rPr>
+        <w:t xml:space="preserve">Full</w:t>
+      </w:r>
+      <w:r>
+        <w:t xml:space="preserve"> </w:t>
+      </w:r>
+      <w:r>
+        <w:t xml:space="preserve">fallback, and independent full-reference falsification in one revision decision. We therefore treat the mathematics as supporting machinery rather than as standalone novelty.</w:t>
       </w:r>
     </w:p>
     <w:bookmarkEnd w:id="25"/>
@@ -1852,7 +1924,7 @@
     </w:p>
     <w:bookmarkEnd w:id="30"/>
     <w:bookmarkEnd w:id="31"/>
-    <w:bookmarkStart w:id="38" w:name="criticality-bounded-revision-cones"/>
+    <w:bookmarkStart w:id="42" w:name="criticality-bounded-revision-cones"/>
     <w:p>
       <w:pPr>
         <w:pStyle w:val="Heading1"/>
@@ -2837,13 +2909,13 @@
       </w:r>
     </w:p>
     <w:bookmarkEnd w:id="34"/>
-    <w:bookmarkStart w:id="35" w:name="gaussian-display-space-bound"/>
+    <w:bookmarkStart w:id="35" w:name="revision-criticality"/>
     <w:p>
       <w:pPr>
         <w:pStyle w:val="Heading2"/>
       </w:pPr>
       <w:r>
-        <w:t xml:space="preserve">Gaussian display-space bound</w:t>
+        <w:t xml:space="preserve">Revision criticality</w:t>
       </w:r>
     </w:p>
     <w:p>
@@ -2851,233 +2923,7 @@
         <w:pStyle w:val="FirstParagraph"/>
       </w:pPr>
       <w:r>
-        <w:t xml:space="preserve">For a projected Gaussian</w:t>
-      </w:r>
-      <w:r>
-        <w:t xml:space="preserve"> </w:t>
-      </w:r>
-      <m:oMath>
-        <m:r>
-          <m:t>i</m:t>
-        </m:r>
-      </m:oMath>
-      <w:r>
-        <w:t xml:space="preserve"> </w:t>
-      </w:r>
-      <w:r>
-        <w:t xml:space="preserve">at pixel</w:t>
-      </w:r>
-      <w:r>
-        <w:t xml:space="preserve"> </w:t>
-      </w:r>
-      <m:oMath>
-        <m:r>
-          <m:t>p</m:t>
-        </m:r>
-      </m:oMath>
-      <w:r>
-        <w:t xml:space="preserve">, MAVEB uses an effective alpha model consistent with the renderer,</w:t>
-      </w:r>
-    </w:p>
-    <w:p>
-      <w:pPr>
-        <w:pStyle w:val="BodyText"/>
-      </w:pPr>
-      <m:oMathPara>
-        <m:oMathParaPr>
-          <m:jc m:val="center"/>
-        </m:oMathParaPr>
-        <m:oMath>
-          <m:sSub>
-            <m:e>
-              <m:r>
-                <m:t>α</m:t>
-              </m:r>
-            </m:e>
-            <m:sub>
-              <m:r>
-                <m:t>i</m:t>
-              </m:r>
-            </m:sub>
-          </m:sSub>
-          <m:d>
-            <m:dPr>
-              <m:begChr m:val="("/>
-              <m:endChr m:val=")"/>
-              <m:sepChr m:val=""/>
-              <m:grow/>
-            </m:dPr>
-            <m:e>
-              <m:r>
-                <m:t>p</m:t>
-              </m:r>
-            </m:e>
-          </m:d>
-          <m:r>
-            <m:rPr>
-              <m:sty m:val="p"/>
-            </m:rPr>
-            <m:t>=</m:t>
-          </m:r>
-          <m:sSub>
-            <m:e>
-              <m:r>
-                <m:t>o</m:t>
-              </m:r>
-            </m:e>
-            <m:sub>
-              <m:r>
-                <m:t>i</m:t>
-              </m:r>
-            </m:sub>
-          </m:sSub>
-          <m:r>
-            <m:rPr>
-              <m:sty m:val="p"/>
-            </m:rPr>
-            <m:t>exp</m:t>
-          </m:r>
-          <m:d>
-            <m:dPr>
-              <m:begChr m:val="("/>
-              <m:endChr m:val=")"/>
-              <m:sepChr m:val=""/>
-              <m:grow/>
-            </m:dPr>
-            <m:e>
-              <m:r>
-                <m:rPr>
-                  <m:sty m:val="p"/>
-                </m:rPr>
-                <m:t>−</m:t>
-              </m:r>
-              <m:f>
-                <m:fPr>
-                  <m:type m:val="bar"/>
-                </m:fPr>
-                <m:num>
-                  <m:r>
-                    <m:t>1</m:t>
-                  </m:r>
-                </m:num>
-                <m:den>
-                  <m:r>
-                    <m:t>2</m:t>
-                  </m:r>
-                </m:den>
-              </m:f>
-              <m:sSub>
-                <m:e>
-                  <m:r>
-                    <m:t>q</m:t>
-                  </m:r>
-                </m:e>
-                <m:sub>
-                  <m:r>
-                    <m:t>i</m:t>
-                  </m:r>
-                </m:sub>
-              </m:sSub>
-              <m:d>
-                <m:dPr>
-                  <m:begChr m:val="("/>
-                  <m:endChr m:val=")"/>
-                  <m:sepChr m:val=""/>
-                  <m:grow/>
-                </m:dPr>
-                <m:e>
-                  <m:r>
-                    <m:t>p</m:t>
-                  </m:r>
-                </m:e>
-              </m:d>
-            </m:e>
-          </m:d>
-          <m:r>
-            <m:rPr>
-              <m:sty m:val="p"/>
-            </m:rPr>
-            <m:t>,</m:t>
-          </m:r>
-        </m:oMath>
-      </m:oMathPara>
-    </w:p>
-    <w:p>
-      <w:pPr>
-        <w:pStyle w:val="FirstParagraph"/>
-      </w:pPr>
-      <w:r>
-        <w:t xml:space="preserve">where</w:t>
-      </w:r>
-      <w:r>
-        <w:t xml:space="preserve"> </w:t>
-      </w:r>
-      <m:oMath>
-        <m:sSub>
-          <m:e>
-            <m:r>
-              <m:t>o</m:t>
-            </m:r>
-          </m:e>
-          <m:sub>
-            <m:r>
-              <m:t>i</m:t>
-            </m:r>
-          </m:sub>
-        </m:sSub>
-      </m:oMath>
-      <w:r>
-        <w:t xml:space="preserve"> </w:t>
-      </w:r>
-      <w:r>
-        <w:t xml:space="preserve">is peak opacity and</w:t>
-      </w:r>
-      <w:r>
-        <w:t xml:space="preserve"> </w:t>
-      </w:r>
-      <m:oMath>
-        <m:sSub>
-          <m:e>
-            <m:r>
-              <m:t>q</m:t>
-            </m:r>
-          </m:e>
-          <m:sub>
-            <m:r>
-              <m:t>i</m:t>
-            </m:r>
-          </m:sub>
-        </m:sSub>
-        <m:d>
-          <m:dPr>
-            <m:begChr m:val="("/>
-            <m:endChr m:val=")"/>
-            <m:sepChr m:val=""/>
-            <m:grow/>
-          </m:dPr>
-          <m:e>
-            <m:r>
-              <m:t>p</m:t>
-            </m:r>
-          </m:e>
-        </m:d>
-      </m:oMath>
-      <w:r>
-        <w:t xml:space="preserve"> </w:t>
-      </w:r>
-      <w:r>
-        <w:t xml:space="preserve">is squared Mahalanobis distance in projected Gaussian space. For edited set</w:t>
-      </w:r>
-      <w:r>
-        <w:t xml:space="preserve"> </w:t>
-      </w:r>
-      <m:oMath>
-        <m:r>
-          <m:t>E</m:t>
-        </m:r>
-      </m:oMath>
-      <w:r>
-        <w:t xml:space="preserve">, define aggregate opacity mass</w:t>
+        <w:t xml:space="preserve">We define the revision criticality of a candidate cone as the worst normalized certified residual</w:t>
       </w:r>
     </w:p>
     <w:p>
@@ -3090,926 +2936,7 @@
         </m:oMathParaPr>
         <m:oMath>
           <m:r>
-            <m:t>A</m:t>
-          </m:r>
-          <m:d>
-            <m:dPr>
-              <m:begChr m:val="("/>
-              <m:endChr m:val=")"/>
-              <m:sepChr m:val=""/>
-              <m:grow/>
-            </m:dPr>
-            <m:e>
-              <m:r>
-                <m:t>E</m:t>
-              </m:r>
-            </m:e>
-          </m:d>
-          <m:r>
-            <m:rPr>
-              <m:sty m:val="p"/>
-            </m:rPr>
-            <m:t>=</m:t>
-          </m:r>
-          <m:r>
-            <m:t>1</m:t>
-          </m:r>
-          <m:r>
-            <m:rPr>
-              <m:sty m:val="p"/>
-            </m:rPr>
-            <m:t>−</m:t>
-          </m:r>
-          <m:nary>
-            <m:naryPr>
-              <m:chr m:val="∏"/>
-              <m:limLoc m:val="undOvr"/>
-              <m:subHide m:val="off"/>
-              <m:supHide m:val="on"/>
-            </m:naryPr>
-            <m:sub>
-              <m:r>
-                <m:t>i</m:t>
-              </m:r>
-              <m:r>
-                <m:rPr>
-                  <m:sty m:val="p"/>
-                </m:rPr>
-                <m:t>∈</m:t>
-              </m:r>
-              <m:r>
-                <m:t>E</m:t>
-              </m:r>
-            </m:sub>
-            <m:sup>
-              <m:r>
-                <m:t>​</m:t>
-              </m:r>
-            </m:sup>
-            <m:e>
-              <m:d>
-                <m:dPr>
-                  <m:begChr m:val="("/>
-                  <m:endChr m:val=")"/>
-                  <m:sepChr m:val=""/>
-                  <m:grow/>
-                </m:dPr>
-                <m:e>
-                  <m:r>
-                    <m:t>1</m:t>
-                  </m:r>
-                  <m:r>
-                    <m:rPr>
-                      <m:sty m:val="p"/>
-                    </m:rPr>
-                    <m:t>−</m:t>
-                  </m:r>
-                  <m:sSub>
-                    <m:e>
-                      <m:r>
-                        <m:t>α</m:t>
-                      </m:r>
-                    </m:e>
-                    <m:sub>
-                      <m:r>
-                        <m:t>i</m:t>
-                      </m:r>
-                    </m:sub>
-                  </m:sSub>
-                </m:e>
-              </m:d>
-            </m:e>
-          </m:nary>
-          <m:r>
-            <m:rPr>
-              <m:sty m:val="p"/>
-            </m:rPr>
-            <m:t>.</m:t>
-          </m:r>
-        </m:oMath>
-      </m:oMathPara>
-    </w:p>
-    <w:p>
-      <w:pPr>
-        <w:pStyle w:val="FirstParagraph"/>
-      </w:pPr>
-      <w:r>
-        <w:t xml:space="preserve">If the relevant color interval has width</w:t>
-      </w:r>
-      <w:r>
-        <w:t xml:space="preserve"> </w:t>
-      </w:r>
-      <m:oMath>
-        <m:sSub>
-          <m:e>
-            <m:r>
-              <m:t>C</m:t>
-            </m:r>
-          </m:e>
-          <m:sub>
-            <m:r>
-              <m:rPr>
-                <m:sty m:val="p"/>
-              </m:rPr>
-              <m:t>c</m:t>
-            </m:r>
-            <m:r>
-              <m:rPr>
-                <m:sty m:val="p"/>
-              </m:rPr>
-              <m:t>o</m:t>
-            </m:r>
-            <m:r>
-              <m:rPr>
-                <m:sty m:val="p"/>
-              </m:rPr>
-              <m:t>l</m:t>
-            </m:r>
-            <m:r>
-              <m:rPr>
-                <m:sty m:val="p"/>
-              </m:rPr>
-              <m:t>o</m:t>
-            </m:r>
-            <m:r>
-              <m:rPr>
-                <m:sty m:val="p"/>
-              </m:rPr>
-              <m:t>r</m:t>
-            </m:r>
-          </m:sub>
-        </m:sSub>
-      </m:oMath>
-      <w:r>
-        <w:t xml:space="preserve">, adding or removing the edited set changes a pixel by at most</w:t>
-      </w:r>
-      <w:r>
-        <w:t xml:space="preserve"> </w:t>
-      </w:r>
-      <m:oMath>
-        <m:sSub>
-          <m:e>
-            <m:r>
-              <m:t>C</m:t>
-            </m:r>
-          </m:e>
-          <m:sub>
-            <m:r>
-              <m:rPr>
-                <m:sty m:val="p"/>
-              </m:rPr>
-              <m:t>c</m:t>
-            </m:r>
-            <m:r>
-              <m:rPr>
-                <m:sty m:val="p"/>
-              </m:rPr>
-              <m:t>o</m:t>
-            </m:r>
-            <m:r>
-              <m:rPr>
-                <m:sty m:val="p"/>
-              </m:rPr>
-              <m:t>l</m:t>
-            </m:r>
-            <m:r>
-              <m:rPr>
-                <m:sty m:val="p"/>
-              </m:rPr>
-              <m:t>o</m:t>
-            </m:r>
-            <m:r>
-              <m:rPr>
-                <m:sty m:val="p"/>
-              </m:rPr>
-              <m:t>r</m:t>
-            </m:r>
-          </m:sub>
-        </m:sSub>
-        <m:r>
-          <m:t>A</m:t>
-        </m:r>
-        <m:d>
-          <m:dPr>
-            <m:begChr m:val="("/>
-            <m:endChr m:val=")"/>
-            <m:sepChr m:val=""/>
-            <m:grow/>
-          </m:dPr>
-          <m:e>
-            <m:r>
-              <m:t>E</m:t>
-            </m:r>
-          </m:e>
-        </m:d>
-      </m:oMath>
-      <w:r>
-        <w:t xml:space="preserve">. Comparing before and after edited sets</w:t>
-      </w:r>
-      <w:r>
-        <w:t xml:space="preserve"> </w:t>
-      </w:r>
-      <m:oMath>
-        <m:sSub>
-          <m:e>
-            <m:r>
-              <m:t>E</m:t>
-            </m:r>
-          </m:e>
-          <m:sub>
-            <m:r>
-              <m:t>0</m:t>
-            </m:r>
-          </m:sub>
-        </m:sSub>
-        <m:r>
-          <m:rPr>
-            <m:sty m:val="p"/>
-          </m:rPr>
-          <m:t>,</m:t>
-        </m:r>
-        <m:sSub>
-          <m:e>
-            <m:r>
-              <m:t>E</m:t>
-            </m:r>
-          </m:e>
-          <m:sub>
-            <m:r>
-              <m:t>1</m:t>
-            </m:r>
-          </m:sub>
-        </m:sSub>
-      </m:oMath>
-      <w:r>
-        <w:t xml:space="preserve"> </w:t>
-      </w:r>
-      <w:r>
-        <w:t xml:space="preserve">gives</w:t>
-      </w:r>
-    </w:p>
-    <w:p>
-      <w:pPr>
-        <w:pStyle w:val="BodyText"/>
-      </w:pPr>
-      <m:oMathPara>
-        <m:oMathParaPr>
-          <m:jc m:val="center"/>
-        </m:oMathParaPr>
-        <m:oMath>
-          <m:sSub>
-            <m:e>
-              <m:d>
-                <m:dPr>
-                  <m:begChr m:val="∥"/>
-                  <m:endChr m:val="∥"/>
-                  <m:sepChr m:val=""/>
-                  <m:grow/>
-                </m:dPr>
-                <m:e>
-                  <m:r>
-                    <m:t>R</m:t>
-                  </m:r>
-                  <m:d>
-                    <m:dPr>
-                      <m:begChr m:val="("/>
-                      <m:endChr m:val=")"/>
-                      <m:sepChr m:val=""/>
-                      <m:grow/>
-                    </m:dPr>
-                    <m:e>
-                      <m:r>
-                        <m:t>U</m:t>
-                      </m:r>
-                      <m:r>
-                        <m:rPr>
-                          <m:sty m:val="p"/>
-                        </m:rPr>
-                        <m:t>∪</m:t>
-                      </m:r>
-                      <m:sSub>
-                        <m:e>
-                          <m:r>
-                            <m:t>E</m:t>
-                          </m:r>
-                        </m:e>
-                        <m:sub>
-                          <m:r>
-                            <m:t>0</m:t>
-                          </m:r>
-                        </m:sub>
-                      </m:sSub>
-                    </m:e>
-                  </m:d>
-                  <m:r>
-                    <m:rPr>
-                      <m:sty m:val="p"/>
-                    </m:rPr>
-                    <m:t>−</m:t>
-                  </m:r>
-                  <m:r>
-                    <m:t>R</m:t>
-                  </m:r>
-                  <m:d>
-                    <m:dPr>
-                      <m:begChr m:val="("/>
-                      <m:endChr m:val=")"/>
-                      <m:sepChr m:val=""/>
-                      <m:grow/>
-                    </m:dPr>
-                    <m:e>
-                      <m:r>
-                        <m:t>U</m:t>
-                      </m:r>
-                      <m:r>
-                        <m:rPr>
-                          <m:sty m:val="p"/>
-                        </m:rPr>
-                        <m:t>∪</m:t>
-                      </m:r>
-                      <m:sSub>
-                        <m:e>
-                          <m:r>
-                            <m:t>E</m:t>
-                          </m:r>
-                        </m:e>
-                        <m:sub>
-                          <m:r>
-                            <m:t>1</m:t>
-                          </m:r>
-                        </m:sub>
-                      </m:sSub>
-                    </m:e>
-                  </m:d>
-                </m:e>
-              </m:d>
-            </m:e>
-            <m:sub>
-              <m:r>
-                <m:rPr>
-                  <m:sty m:val="p"/>
-                </m:rPr>
-                <m:t>∞</m:t>
-              </m:r>
-            </m:sub>
-          </m:sSub>
-          <m:r>
-            <m:rPr>
-              <m:sty m:val="p"/>
-            </m:rPr>
-            <m:t>≤</m:t>
-          </m:r>
-          <m:sSub>
-            <m:e>
-              <m:r>
-                <m:t>C</m:t>
-              </m:r>
-            </m:e>
-            <m:sub>
-              <m:r>
-                <m:rPr>
-                  <m:sty m:val="p"/>
-                </m:rPr>
-                <m:t>c</m:t>
-              </m:r>
-              <m:r>
-                <m:rPr>
-                  <m:sty m:val="p"/>
-                </m:rPr>
-                <m:t>o</m:t>
-              </m:r>
-              <m:r>
-                <m:rPr>
-                  <m:sty m:val="p"/>
-                </m:rPr>
-                <m:t>l</m:t>
-              </m:r>
-              <m:r>
-                <m:rPr>
-                  <m:sty m:val="p"/>
-                </m:rPr>
-                <m:t>o</m:t>
-              </m:r>
-              <m:r>
-                <m:rPr>
-                  <m:sty m:val="p"/>
-                </m:rPr>
-                <m:t>r</m:t>
-              </m:r>
-            </m:sub>
-          </m:sSub>
-          <m:r>
-            <m:rPr>
-              <m:sty m:val="p"/>
-            </m:rPr>
-            <m:t>min</m:t>
-          </m:r>
-          <m:d>
-            <m:dPr>
-              <m:begChr m:val="("/>
-              <m:endChr m:val=")"/>
-              <m:sepChr m:val=""/>
-              <m:grow/>
-            </m:dPr>
-            <m:e>
-              <m:r>
-                <m:t>1</m:t>
-              </m:r>
-              <m:r>
-                <m:rPr>
-                  <m:sty m:val="p"/>
-                </m:rPr>
-                <m:t>,</m:t>
-              </m:r>
-              <m:r>
-                <m:t>A</m:t>
-              </m:r>
-              <m:d>
-                <m:dPr>
-                  <m:begChr m:val="("/>
-                  <m:endChr m:val=")"/>
-                  <m:sepChr m:val=""/>
-                  <m:grow/>
-                </m:dPr>
-                <m:e>
-                  <m:sSub>
-                    <m:e>
-                      <m:r>
-                        <m:t>E</m:t>
-                      </m:r>
-                    </m:e>
-                    <m:sub>
-                      <m:r>
-                        <m:t>0</m:t>
-                      </m:r>
-                    </m:sub>
-                  </m:sSub>
-                </m:e>
-              </m:d>
-              <m:r>
-                <m:rPr>
-                  <m:sty m:val="p"/>
-                </m:rPr>
-                <m:t>+</m:t>
-              </m:r>
-              <m:r>
-                <m:t>A</m:t>
-              </m:r>
-              <m:d>
-                <m:dPr>
-                  <m:begChr m:val="("/>
-                  <m:endChr m:val=")"/>
-                  <m:sepChr m:val=""/>
-                  <m:grow/>
-                </m:dPr>
-                <m:e>
-                  <m:sSub>
-                    <m:e>
-                      <m:r>
-                        <m:t>E</m:t>
-                      </m:r>
-                    </m:e>
-                    <m:sub>
-                      <m:r>
-                        <m:t>1</m:t>
-                      </m:r>
-                    </m:sub>
-                  </m:sSub>
-                </m:e>
-              </m:d>
-            </m:e>
-          </m:d>
-          <m:r>
-            <m:rPr>
-              <m:sty m:val="p"/>
-            </m:rPr>
-            <m:t>.</m:t>
-          </m:r>
-        </m:oMath>
-      </m:oMathPara>
-    </w:p>
-    <w:p>
-      <w:pPr>
-        <w:pStyle w:val="FirstParagraph"/>
-      </w:pPr>
-      <w:r>
-        <w:t xml:space="preserve">The protected-image certificate is the maximum of Eq. </w:t>
-      </w:r>
-      <w:hyperlink w:anchor="eq:gaussianbound">
-        <w:r>
-          <w:rPr>
-            <w:rStyle w:val="Hyperlink"/>
-          </w:rPr>
-          <w:t xml:space="preserve">[eq:gaussianbound]</w:t>
-        </w:r>
-      </w:hyperlink>
-      <w:r>
-        <w:t xml:space="preserve"> </w:t>
-      </w:r>
-      <w:r>
-        <w:t xml:space="preserve">over the declared pixel support. The bound is conservative by construction over the modeled edit and rendering assumptions; it is not a learned predictor of expected error.</w:t>
-      </w:r>
-    </w:p>
-    <w:bookmarkEnd w:id="35"/>
-    <w:bookmarkStart w:id="36" w:name="stable-temporal-history"/>
-    <w:p>
-      <w:pPr>
-        <w:pStyle w:val="Heading2"/>
-      </w:pPr>
-      <w:r>
-        <w:t xml:space="preserve">Stable temporal history</w:t>
-      </w:r>
-    </w:p>
-    <w:p>
-      <w:pPr>
-        <w:pStyle w:val="FirstParagraph"/>
-      </w:pPr>
-      <w:r>
-        <w:t xml:space="preserve">For stable temporal validation, let</w:t>
-      </w:r>
-      <w:r>
-        <w:t xml:space="preserve"> </w:t>
-      </w:r>
-      <m:oMath>
-        <m:sSub>
-          <m:e>
-            <m:r>
-              <m:t>E</m:t>
-            </m:r>
-          </m:e>
-          <m:sub>
-            <m:r>
-              <m:t>c</m:t>
-            </m:r>
-          </m:sub>
-        </m:sSub>
-      </m:oMath>
-      <w:r>
-        <w:t xml:space="preserve"> </w:t>
-      </w:r>
-      <w:r>
-        <w:t xml:space="preserve">denote current-frame error,</w:t>
-      </w:r>
-      <w:r>
-        <w:t xml:space="preserve"> </w:t>
-      </w:r>
-      <m:oMath>
-        <m:sSub>
-          <m:e>
-            <m:r>
-              <m:t>E</m:t>
-            </m:r>
-          </m:e>
-          <m:sub>
-            <m:r>
-              <m:t>h</m:t>
-            </m:r>
-          </m:sub>
-        </m:sSub>
-      </m:oMath>
-      <w:r>
-        <w:t xml:space="preserve"> </w:t>
-      </w:r>
-      <w:r>
-        <w:t xml:space="preserve">retained-history error,</w:t>
-      </w:r>
-      <w:r>
-        <w:t xml:space="preserve"> </w:t>
-      </w:r>
-      <m:oMath>
-        <m:sSub>
-          <m:e>
-            <m:r>
-              <m:t>E</m:t>
-            </m:r>
-          </m:e>
-          <m:sub>
-            <m:r>
-              <m:t>n</m:t>
-            </m:r>
-          </m:sub>
-        </m:sSub>
-      </m:oMath>
-      <w:r>
-        <w:t xml:space="preserve"> </w:t>
-      </w:r>
-      <w:r>
-        <w:t xml:space="preserve">neighborhood or clamping error, and</w:t>
-      </w:r>
-      <w:r>
-        <w:t xml:space="preserve"> </w:t>
-      </w:r>
-      <m:oMath>
-        <m:r>
-          <m:t>w</m:t>
-        </m:r>
-        <m:r>
-          <m:rPr>
-            <m:sty m:val="p"/>
-          </m:rPr>
-          <m:t>∈</m:t>
-        </m:r>
-        <m:d>
-          <m:dPr>
-            <m:begChr m:val="["/>
-            <m:endChr m:val="]"/>
-            <m:sepChr m:val=""/>
-            <m:grow/>
-          </m:dPr>
-          <m:e>
-            <m:r>
-              <m:t>0</m:t>
-            </m:r>
-            <m:r>
-              <m:rPr>
-                <m:sty m:val="p"/>
-              </m:rPr>
-              <m:t>,</m:t>
-            </m:r>
-            <m:r>
-              <m:t>1</m:t>
-            </m:r>
-          </m:e>
-        </m:d>
-      </m:oMath>
-      <w:r>
-        <w:t xml:space="preserve"> </w:t>
-      </w:r>
-      <w:r>
-        <w:t xml:space="preserve">the history weight. With</w:t>
-      </w:r>
-      <w:r>
-        <w:t xml:space="preserve"> </w:t>
-      </w:r>
-      <m:oMath>
-        <m:sSub>
-          <m:e>
-            <m:r>
-              <m:t>E</m:t>
-            </m:r>
-          </m:e>
-          <m:sub>
-            <m:r>
-              <m:t>r</m:t>
-            </m:r>
-          </m:sub>
-        </m:sSub>
-        <m:r>
-          <m:rPr>
-            <m:sty m:val="p"/>
-          </m:rPr>
-          <m:t>=</m:t>
-        </m:r>
-        <m:r>
-          <m:rPr>
-            <m:sty m:val="p"/>
-          </m:rPr>
-          <m:t>max</m:t>
-        </m:r>
-        <m:d>
-          <m:dPr>
-            <m:begChr m:val="("/>
-            <m:endChr m:val=")"/>
-            <m:sepChr m:val=""/>
-            <m:grow/>
-          </m:dPr>
-          <m:e>
-            <m:sSub>
-              <m:e>
-                <m:r>
-                  <m:t>E</m:t>
-                </m:r>
-              </m:e>
-              <m:sub>
-                <m:r>
-                  <m:t>h</m:t>
-                </m:r>
-              </m:sub>
-            </m:sSub>
-            <m:r>
-              <m:rPr>
-                <m:sty m:val="p"/>
-              </m:rPr>
-              <m:t>,</m:t>
-            </m:r>
-            <m:sSub>
-              <m:e>
-                <m:r>
-                  <m:t>E</m:t>
-                </m:r>
-              </m:e>
-              <m:sub>
-                <m:r>
-                  <m:t>n</m:t>
-                </m:r>
-              </m:sub>
-            </m:sSub>
-          </m:e>
-        </m:d>
-      </m:oMath>
-      <w:r>
-        <w:t xml:space="preserve">,</w:t>
-      </w:r>
-    </w:p>
-    <w:p>
-      <w:pPr>
-        <w:pStyle w:val="BodyText"/>
-      </w:pPr>
-      <m:oMathPara>
-        <m:oMathParaPr>
-          <m:jc m:val="center"/>
-        </m:oMathParaPr>
-        <m:oMath>
-          <m:sSub>
-            <m:e>
-              <m:r>
-                <m:t>E</m:t>
-              </m:r>
-            </m:e>
-            <m:sub>
-              <m:r>
-                <m:rPr>
-                  <m:sty m:val="p"/>
-                </m:rPr>
-                <m:t>r</m:t>
-              </m:r>
-              <m:r>
-                <m:rPr>
-                  <m:sty m:val="p"/>
-                </m:rPr>
-                <m:t>e</m:t>
-              </m:r>
-              <m:r>
-                <m:rPr>
-                  <m:sty m:val="p"/>
-                </m:rPr>
-                <m:t>s</m:t>
-              </m:r>
-              <m:r>
-                <m:rPr>
-                  <m:sty m:val="p"/>
-                </m:rPr>
-                <m:t>o</m:t>
-              </m:r>
-              <m:r>
-                <m:rPr>
-                  <m:sty m:val="p"/>
-                </m:rPr>
-                <m:t>l</m:t>
-              </m:r>
-              <m:r>
-                <m:rPr>
-                  <m:sty m:val="p"/>
-                </m:rPr>
-                <m:t>v</m:t>
-              </m:r>
-              <m:r>
-                <m:rPr>
-                  <m:sty m:val="p"/>
-                </m:rPr>
-                <m:t>e</m:t>
-              </m:r>
-              <m:r>
-                <m:rPr>
-                  <m:sty m:val="p"/>
-                </m:rPr>
-                <m:t>d</m:t>
-              </m:r>
-            </m:sub>
-          </m:sSub>
-          <m:r>
-            <m:rPr>
-              <m:sty m:val="p"/>
-            </m:rPr>
-            <m:t>=</m:t>
-          </m:r>
-          <m:d>
-            <m:dPr>
-              <m:begChr m:val="("/>
-              <m:endChr m:val=")"/>
-              <m:sepChr m:val=""/>
-              <m:grow/>
-            </m:dPr>
-            <m:e>
-              <m:r>
-                <m:t>1</m:t>
-              </m:r>
-              <m:r>
-                <m:rPr>
-                  <m:sty m:val="p"/>
-                </m:rPr>
-                <m:t>−</m:t>
-              </m:r>
-              <m:r>
-                <m:t>w</m:t>
-              </m:r>
-            </m:e>
-          </m:d>
-          <m:sSub>
-            <m:e>
-              <m:r>
-                <m:t>E</m:t>
-              </m:r>
-            </m:e>
-            <m:sub>
-              <m:r>
-                <m:t>c</m:t>
-              </m:r>
-            </m:sub>
-          </m:sSub>
-          <m:r>
-            <m:rPr>
-              <m:sty m:val="p"/>
-            </m:rPr>
-            <m:t>+</m:t>
-          </m:r>
-          <m:r>
-            <m:t>w</m:t>
-          </m:r>
-          <m:sSub>
-            <m:e>
-              <m:r>
-                <m:t>E</m:t>
-              </m:r>
-            </m:e>
-            <m:sub>
-              <m:r>
-                <m:t>r</m:t>
-              </m:r>
-            </m:sub>
-          </m:sSub>
-          <m:r>
-            <m:rPr>
-              <m:sty m:val="p"/>
-            </m:rPr>
-            <m:t>.</m:t>
-          </m:r>
-        </m:oMath>
-      </m:oMathPara>
-    </w:p>
-    <w:p>
-      <w:pPr>
-        <w:pStyle w:val="FirstParagraph"/>
-      </w:pPr>
-      <w:r>
-        <w:t xml:space="preserve">If validation, reprojection, or disocclusion may itself change, MAVEB promotes the relation to</w:t>
-      </w:r>
-      <w:r>
-        <w:t xml:space="preserve"> </w:t>
-      </w:r>
-      <w:r>
-        <w:rPr>
-          <w:smallCaps/>
-        </w:rPr>
-        <w:t xml:space="preserve">Hard</w:t>
-      </w:r>
-      <w:r>
-        <w:t xml:space="preserve"> </w:t>
-      </w:r>
-      <w:r>
-        <w:t xml:space="preserve">invalidation instead of applying Eq. </w:t>
-      </w:r>
-      <w:hyperlink w:anchor="eq:temporal">
-        <w:r>
-          <w:rPr>
-            <w:rStyle w:val="Hyperlink"/>
-          </w:rPr>
-          <w:t xml:space="preserve">[eq:temporal]</w:t>
-        </w:r>
-      </w:hyperlink>
-      <w:r>
-        <w:t xml:space="preserve">. Thus the temporal path demonstrates the central design rule: use a soft bound only while its preconditions are certifiable.</w:t>
-      </w:r>
-    </w:p>
-    <w:bookmarkEnd w:id="36"/>
-    <w:bookmarkStart w:id="37" w:name="X62e354406816ed1168c1ad132bd8541650ea272"/>
-    <w:p>
-      <w:pPr>
-        <w:pStyle w:val="Heading2"/>
-      </w:pPr>
-      <w:r>
-        <w:t xml:space="preserve">Greedy feasible-cone search and crossover</w:t>
-      </w:r>
-    </w:p>
-    <w:p>
-      <w:pPr>
-        <w:pStyle w:val="FirstParagraph"/>
-      </w:pPr>
-      <w:r>
-        <w:t xml:space="preserve">Define normalized violation</w:t>
-      </w:r>
-    </w:p>
-    <w:p>
-      <w:pPr>
-        <w:pStyle w:val="BodyText"/>
-      </w:pPr>
-      <m:oMathPara>
-        <m:oMathParaPr>
-          <m:jc m:val="center"/>
-        </m:oMathParaPr>
-        <m:oMath>
-          <m:r>
-            <m:t>ϕ</m:t>
+            <m:t>χ</m:t>
           </m:r>
           <m:d>
             <m:dPr>
@@ -4154,14 +3081,50 @@
         <w:pStyle w:val="FirstParagraph"/>
       </w:pPr>
       <w:r>
-        <w:t xml:space="preserve">A passing cone has</w:t>
+        <w:t xml:space="preserve">The threshold</w:t>
       </w:r>
       <w:r>
         <w:t xml:space="preserve"> </w:t>
       </w:r>
       <m:oMath>
         <m:r>
-          <m:t>ϕ</m:t>
+          <m:t>χ</m:t>
+        </m:r>
+        <m:d>
+          <m:dPr>
+            <m:begChr m:val="("/>
+            <m:endChr m:val=")"/>
+            <m:sepChr m:val=""/>
+            <m:grow/>
+          </m:dPr>
+          <m:e>
+            <m:r>
+              <m:t>C</m:t>
+            </m:r>
+          </m:e>
+        </m:d>
+        <m:r>
+          <m:rPr>
+            <m:sty m:val="p"/>
+          </m:rPr>
+          <m:t>=</m:t>
+        </m:r>
+        <m:r>
+          <m:t>1</m:t>
+        </m:r>
+      </m:oMath>
+      <w:r>
+        <w:t xml:space="preserve"> </w:t>
+      </w:r>
+      <w:r>
+        <w:t xml:space="preserve">is the certificate boundary:</w:t>
+      </w:r>
+      <w:r>
+        <w:t xml:space="preserve"> </w:t>
+      </w:r>
+      <m:oMath>
+        <m:r>
+          <m:t>χ</m:t>
         </m:r>
         <m:d>
           <m:dPr>
@@ -4187,7 +3150,1659 @@
         </m:r>
       </m:oMath>
       <w:r>
-        <w:t xml:space="preserve">. For a candidate expansion</w:t>
+        <w:t xml:space="preserve"> </w:t>
+      </w:r>
+      <w:r>
+        <w:t xml:space="preserve">is certificate-feasible, whereas</w:t>
+      </w:r>
+      <w:r>
+        <w:t xml:space="preserve"> </w:t>
+      </w:r>
+      <m:oMath>
+        <m:r>
+          <m:t>χ</m:t>
+        </m:r>
+        <m:d>
+          <m:dPr>
+            <m:begChr m:val="("/>
+            <m:endChr m:val=")"/>
+            <m:sepChr m:val=""/>
+            <m:grow/>
+          </m:dPr>
+          <m:e>
+            <m:r>
+              <m:t>C</m:t>
+            </m:r>
+          </m:e>
+        </m:d>
+        <m:r>
+          <m:rPr>
+            <m:sty m:val="p"/>
+          </m:rPr>
+          <m:t>&gt;</m:t>
+        </m:r>
+        <m:r>
+          <m:t>1</m:t>
+        </m:r>
+      </m:oMath>
+      <w:r>
+        <w:t xml:space="preserve"> </w:t>
+      </w:r>
+      <w:r>
+        <w:t xml:space="preserve">is supercritical for at least one protected output and requires cone expansion or</w:t>
+      </w:r>
+      <w:r>
+        <w:t xml:space="preserve"> </w:t>
+      </w:r>
+      <w:r>
+        <w:rPr>
+          <w:smallCaps/>
+        </w:rPr>
+        <w:t xml:space="preserve">Full</w:t>
+      </w:r>
+      <w:r>
+        <w:t xml:space="preserve">. The term</w:t>
+      </w:r>
+      <w:r>
+        <w:t xml:space="preserve"> </w:t>
+      </w:r>
+      <w:r>
+        <w:rPr>
+          <w:iCs/>
+          <w:i/>
+        </w:rPr>
+        <w:t xml:space="preserve">criticality-bounded</w:t>
+      </w:r>
+      <w:r>
+        <w:t xml:space="preserve"> </w:t>
+      </w:r>
+      <w:r>
+        <w:t xml:space="preserve">refers to this explicit normalized output-error boundary; it is not intended as a new physical critical-phenomena model.</w:t>
+      </w:r>
+    </w:p>
+    <w:bookmarkEnd w:id="35"/>
+    <w:bookmarkStart w:id="39" w:name="gaussian-display-space-bound"/>
+    <w:p>
+      <w:pPr>
+        <w:pStyle w:val="Heading2"/>
+      </w:pPr>
+      <w:r>
+        <w:t xml:space="preserve">Gaussian display-space bound</w:t>
+      </w:r>
+    </w:p>
+    <w:p>
+      <w:pPr>
+        <w:pStyle w:val="FirstParagraph"/>
+      </w:pPr>
+      <w:r>
+        <w:t xml:space="preserve">For a projected Gaussian</w:t>
+      </w:r>
+      <w:r>
+        <w:t xml:space="preserve"> </w:t>
+      </w:r>
+      <m:oMath>
+        <m:r>
+          <m:t>i</m:t>
+        </m:r>
+      </m:oMath>
+      <w:r>
+        <w:t xml:space="preserve"> </w:t>
+      </w:r>
+      <w:r>
+        <w:t xml:space="preserve">at pixel</w:t>
+      </w:r>
+      <w:r>
+        <w:t xml:space="preserve"> </w:t>
+      </w:r>
+      <m:oMath>
+        <m:r>
+          <m:t>p</m:t>
+        </m:r>
+      </m:oMath>
+      <w:r>
+        <w:t xml:space="preserve">, MAVEB uses an effective alpha model consistent with the renderer,</w:t>
+      </w:r>
+    </w:p>
+    <w:p>
+      <w:pPr>
+        <w:pStyle w:val="BodyText"/>
+      </w:pPr>
+      <m:oMathPara>
+        <m:oMathParaPr>
+          <m:jc m:val="center"/>
+        </m:oMathParaPr>
+        <m:oMath>
+          <m:sSub>
+            <m:e>
+              <m:r>
+                <m:t>α</m:t>
+              </m:r>
+            </m:e>
+            <m:sub>
+              <m:r>
+                <m:t>i</m:t>
+              </m:r>
+            </m:sub>
+          </m:sSub>
+          <m:d>
+            <m:dPr>
+              <m:begChr m:val="("/>
+              <m:endChr m:val=")"/>
+              <m:sepChr m:val=""/>
+              <m:grow/>
+            </m:dPr>
+            <m:e>
+              <m:r>
+                <m:t>p</m:t>
+              </m:r>
+            </m:e>
+          </m:d>
+          <m:r>
+            <m:rPr>
+              <m:sty m:val="p"/>
+            </m:rPr>
+            <m:t>=</m:t>
+          </m:r>
+          <m:sSub>
+            <m:e>
+              <m:r>
+                <m:t>o</m:t>
+              </m:r>
+            </m:e>
+            <m:sub>
+              <m:r>
+                <m:t>i</m:t>
+              </m:r>
+            </m:sub>
+          </m:sSub>
+          <m:r>
+            <m:rPr>
+              <m:sty m:val="p"/>
+            </m:rPr>
+            <m:t>exp</m:t>
+          </m:r>
+          <m:d>
+            <m:dPr>
+              <m:begChr m:val="("/>
+              <m:endChr m:val=")"/>
+              <m:sepChr m:val=""/>
+              <m:grow/>
+            </m:dPr>
+            <m:e>
+              <m:r>
+                <m:rPr>
+                  <m:sty m:val="p"/>
+                </m:rPr>
+                <m:t>−</m:t>
+              </m:r>
+              <m:f>
+                <m:fPr>
+                  <m:type m:val="bar"/>
+                </m:fPr>
+                <m:num>
+                  <m:r>
+                    <m:t>1</m:t>
+                  </m:r>
+                </m:num>
+                <m:den>
+                  <m:r>
+                    <m:t>2</m:t>
+                  </m:r>
+                </m:den>
+              </m:f>
+              <m:sSub>
+                <m:e>
+                  <m:r>
+                    <m:t>q</m:t>
+                  </m:r>
+                </m:e>
+                <m:sub>
+                  <m:r>
+                    <m:t>i</m:t>
+                  </m:r>
+                </m:sub>
+              </m:sSub>
+              <m:d>
+                <m:dPr>
+                  <m:begChr m:val="("/>
+                  <m:endChr m:val=")"/>
+                  <m:sepChr m:val=""/>
+                  <m:grow/>
+                </m:dPr>
+                <m:e>
+                  <m:r>
+                    <m:t>p</m:t>
+                  </m:r>
+                </m:e>
+              </m:d>
+            </m:e>
+          </m:d>
+          <m:r>
+            <m:rPr>
+              <m:sty m:val="p"/>
+            </m:rPr>
+            <m:t>,</m:t>
+          </m:r>
+        </m:oMath>
+      </m:oMathPara>
+    </w:p>
+    <w:p>
+      <w:pPr>
+        <w:pStyle w:val="FirstParagraph"/>
+      </w:pPr>
+      <w:r>
+        <w:t xml:space="preserve">where</w:t>
+      </w:r>
+      <w:r>
+        <w:t xml:space="preserve"> </w:t>
+      </w:r>
+      <m:oMath>
+        <m:sSub>
+          <m:e>
+            <m:r>
+              <m:t>o</m:t>
+            </m:r>
+          </m:e>
+          <m:sub>
+            <m:r>
+              <m:t>i</m:t>
+            </m:r>
+          </m:sub>
+        </m:sSub>
+      </m:oMath>
+      <w:r>
+        <w:t xml:space="preserve"> </w:t>
+      </w:r>
+      <w:r>
+        <w:t xml:space="preserve">is peak opacity and</w:t>
+      </w:r>
+      <w:r>
+        <w:t xml:space="preserve"> </w:t>
+      </w:r>
+      <m:oMath>
+        <m:sSub>
+          <m:e>
+            <m:r>
+              <m:t>q</m:t>
+            </m:r>
+          </m:e>
+          <m:sub>
+            <m:r>
+              <m:t>i</m:t>
+            </m:r>
+          </m:sub>
+        </m:sSub>
+        <m:d>
+          <m:dPr>
+            <m:begChr m:val="("/>
+            <m:endChr m:val=")"/>
+            <m:sepChr m:val=""/>
+            <m:grow/>
+          </m:dPr>
+          <m:e>
+            <m:r>
+              <m:t>p</m:t>
+            </m:r>
+          </m:e>
+        </m:d>
+      </m:oMath>
+      <w:r>
+        <w:t xml:space="preserve"> </w:t>
+      </w:r>
+      <w:r>
+        <w:t xml:space="preserve">is squared Mahalanobis distance in projected Gaussian space. For edited set</w:t>
+      </w:r>
+      <w:r>
+        <w:t xml:space="preserve"> </w:t>
+      </w:r>
+      <m:oMath>
+        <m:r>
+          <m:t>E</m:t>
+        </m:r>
+      </m:oMath>
+      <w:r>
+        <w:t xml:space="preserve">, define aggregate opacity mass</w:t>
+      </w:r>
+    </w:p>
+    <w:p>
+      <w:pPr>
+        <w:pStyle w:val="BodyText"/>
+      </w:pPr>
+      <m:oMathPara>
+        <m:oMathParaPr>
+          <m:jc m:val="center"/>
+        </m:oMathParaPr>
+        <m:oMath>
+          <m:sSub>
+            <m:e>
+              <m:r>
+                <m:t>A</m:t>
+              </m:r>
+            </m:e>
+            <m:sub>
+              <m:r>
+                <m:t>p</m:t>
+              </m:r>
+            </m:sub>
+          </m:sSub>
+          <m:d>
+            <m:dPr>
+              <m:begChr m:val="("/>
+              <m:endChr m:val=")"/>
+              <m:sepChr m:val=""/>
+              <m:grow/>
+            </m:dPr>
+            <m:e>
+              <m:r>
+                <m:t>E</m:t>
+              </m:r>
+            </m:e>
+          </m:d>
+          <m:r>
+            <m:rPr>
+              <m:sty m:val="p"/>
+            </m:rPr>
+            <m:t>=</m:t>
+          </m:r>
+          <m:r>
+            <m:t>1</m:t>
+          </m:r>
+          <m:r>
+            <m:rPr>
+              <m:sty m:val="p"/>
+            </m:rPr>
+            <m:t>−</m:t>
+          </m:r>
+          <m:nary>
+            <m:naryPr>
+              <m:chr m:val="∏"/>
+              <m:limLoc m:val="undOvr"/>
+              <m:subHide m:val="off"/>
+              <m:supHide m:val="on"/>
+            </m:naryPr>
+            <m:sub>
+              <m:r>
+                <m:t>i</m:t>
+              </m:r>
+              <m:r>
+                <m:rPr>
+                  <m:sty m:val="p"/>
+                </m:rPr>
+                <m:t>∈</m:t>
+              </m:r>
+              <m:r>
+                <m:t>E</m:t>
+              </m:r>
+            </m:sub>
+            <m:sup>
+              <m:r>
+                <m:t>​</m:t>
+              </m:r>
+            </m:sup>
+            <m:e>
+              <m:d>
+                <m:dPr>
+                  <m:begChr m:val="("/>
+                  <m:endChr m:val=")"/>
+                  <m:sepChr m:val=""/>
+                  <m:grow/>
+                </m:dPr>
+                <m:e>
+                  <m:r>
+                    <m:t>1</m:t>
+                  </m:r>
+                  <m:r>
+                    <m:rPr>
+                      <m:sty m:val="p"/>
+                    </m:rPr>
+                    <m:t>−</m:t>
+                  </m:r>
+                  <m:sSub>
+                    <m:e>
+                      <m:r>
+                        <m:t>α</m:t>
+                      </m:r>
+                    </m:e>
+                    <m:sub>
+                      <m:r>
+                        <m:t>i</m:t>
+                      </m:r>
+                    </m:sub>
+                  </m:sSub>
+                  <m:d>
+                    <m:dPr>
+                      <m:begChr m:val="("/>
+                      <m:endChr m:val=")"/>
+                      <m:sepChr m:val=""/>
+                      <m:grow/>
+                    </m:dPr>
+                    <m:e>
+                      <m:r>
+                        <m:t>p</m:t>
+                      </m:r>
+                    </m:e>
+                  </m:d>
+                </m:e>
+              </m:d>
+            </m:e>
+          </m:nary>
+          <m:r>
+            <m:rPr>
+              <m:sty m:val="p"/>
+            </m:rPr>
+            <m:t>.</m:t>
+          </m:r>
+        </m:oMath>
+      </m:oMathPara>
+    </w:p>
+    <w:bookmarkStart w:id="36" w:name="X27b1c7a63965ebf9e8f63b6320214353009769c"/>
+    <w:p>
+      <w:pPr>
+        <w:pStyle w:val="Heading4"/>
+      </w:pPr>
+      <w:r>
+        <w:t xml:space="preserve">Proposition 1 (Gaussian finite-edit display bound).</w:t>
+      </w:r>
+    </w:p>
+    <w:p>
+      <w:pPr>
+        <w:pStyle w:val="FirstParagraph"/>
+      </w:pPr>
+      <w:r>
+        <w:t xml:space="preserve">Let</w:t>
+      </w:r>
+      <w:r>
+        <w:t xml:space="preserve"> </w:t>
+      </w:r>
+      <m:oMath>
+        <m:r>
+          <m:t>U</m:t>
+        </m:r>
+      </m:oMath>
+      <w:r>
+        <w:t xml:space="preserve"> </w:t>
+      </w:r>
+      <w:r>
+        <w:t xml:space="preserve">denote the unchanged Gaussian state and</w:t>
+      </w:r>
+      <w:r>
+        <w:t xml:space="preserve"> </w:t>
+      </w:r>
+      <m:oMath>
+        <m:sSub>
+          <m:e>
+            <m:r>
+              <m:t>E</m:t>
+            </m:r>
+          </m:e>
+          <m:sub>
+            <m:r>
+              <m:t>0</m:t>
+            </m:r>
+          </m:sub>
+        </m:sSub>
+        <m:r>
+          <m:rPr>
+            <m:sty m:val="p"/>
+          </m:rPr>
+          <m:t>,</m:t>
+        </m:r>
+        <m:sSub>
+          <m:e>
+            <m:r>
+              <m:t>E</m:t>
+            </m:r>
+          </m:e>
+          <m:sub>
+            <m:r>
+              <m:t>1</m:t>
+            </m:r>
+          </m:sub>
+        </m:sSub>
+      </m:oMath>
+      <w:r>
+        <w:t xml:space="preserve"> </w:t>
+      </w:r>
+      <w:r>
+        <w:t xml:space="preserve">the complete before/after edited sets at a protected pixel</w:t>
+      </w:r>
+      <w:r>
+        <w:t xml:space="preserve"> </w:t>
+      </w:r>
+      <m:oMath>
+        <m:r>
+          <m:t>p</m:t>
+        </m:r>
+      </m:oMath>
+      <w:r>
+        <w:t xml:space="preserve">. Under the assumptions below,</w:t>
+      </w:r>
+    </w:p>
+    <w:p>
+      <w:pPr>
+        <w:pStyle w:val="BodyText"/>
+      </w:pPr>
+      <m:oMathPara>
+        <m:oMathParaPr>
+          <m:jc m:val="center"/>
+        </m:oMathParaPr>
+        <m:oMath>
+          <m:sSub>
+            <m:e>
+              <m:d>
+                <m:dPr>
+                  <m:begChr m:val="∥"/>
+                  <m:endChr m:val="∥"/>
+                  <m:sepChr m:val=""/>
+                  <m:grow/>
+                </m:dPr>
+                <m:e>
+                  <m:sSub>
+                    <m:e>
+                      <m:r>
+                        <m:t>R</m:t>
+                      </m:r>
+                    </m:e>
+                    <m:sub>
+                      <m:r>
+                        <m:t>p</m:t>
+                      </m:r>
+                    </m:sub>
+                  </m:sSub>
+                  <m:d>
+                    <m:dPr>
+                      <m:begChr m:val="("/>
+                      <m:endChr m:val=")"/>
+                      <m:sepChr m:val=""/>
+                      <m:grow/>
+                    </m:dPr>
+                    <m:e>
+                      <m:r>
+                        <m:t>U</m:t>
+                      </m:r>
+                      <m:r>
+                        <m:rPr>
+                          <m:sty m:val="p"/>
+                        </m:rPr>
+                        <m:t>∪</m:t>
+                      </m:r>
+                      <m:sSub>
+                        <m:e>
+                          <m:r>
+                            <m:t>E</m:t>
+                          </m:r>
+                        </m:e>
+                        <m:sub>
+                          <m:r>
+                            <m:t>0</m:t>
+                          </m:r>
+                        </m:sub>
+                      </m:sSub>
+                    </m:e>
+                  </m:d>
+                  <m:r>
+                    <m:rPr>
+                      <m:sty m:val="p"/>
+                    </m:rPr>
+                    <m:t>−</m:t>
+                  </m:r>
+                  <m:sSub>
+                    <m:e>
+                      <m:r>
+                        <m:t>R</m:t>
+                      </m:r>
+                    </m:e>
+                    <m:sub>
+                      <m:r>
+                        <m:t>p</m:t>
+                      </m:r>
+                    </m:sub>
+                  </m:sSub>
+                  <m:d>
+                    <m:dPr>
+                      <m:begChr m:val="("/>
+                      <m:endChr m:val=")"/>
+                      <m:sepChr m:val=""/>
+                      <m:grow/>
+                    </m:dPr>
+                    <m:e>
+                      <m:r>
+                        <m:t>U</m:t>
+                      </m:r>
+                      <m:r>
+                        <m:rPr>
+                          <m:sty m:val="p"/>
+                        </m:rPr>
+                        <m:t>∪</m:t>
+                      </m:r>
+                      <m:sSub>
+                        <m:e>
+                          <m:r>
+                            <m:t>E</m:t>
+                          </m:r>
+                        </m:e>
+                        <m:sub>
+                          <m:r>
+                            <m:t>1</m:t>
+                          </m:r>
+                        </m:sub>
+                      </m:sSub>
+                    </m:e>
+                  </m:d>
+                </m:e>
+              </m:d>
+            </m:e>
+            <m:sub>
+              <m:r>
+                <m:rPr>
+                  <m:sty m:val="p"/>
+                </m:rPr>
+                <m:t>∞</m:t>
+              </m:r>
+            </m:sub>
+          </m:sSub>
+          <m:r>
+            <m:rPr>
+              <m:sty m:val="p"/>
+            </m:rPr>
+            <m:t>≤</m:t>
+          </m:r>
+          <m:sSub>
+            <m:e>
+              <m:r>
+                <m:t>C</m:t>
+              </m:r>
+            </m:e>
+            <m:sub>
+              <m:r>
+                <m:rPr>
+                  <m:sty m:val="p"/>
+                </m:rPr>
+                <m:t>c</m:t>
+              </m:r>
+              <m:r>
+                <m:rPr>
+                  <m:sty m:val="p"/>
+                </m:rPr>
+                <m:t>o</m:t>
+              </m:r>
+              <m:r>
+                <m:rPr>
+                  <m:sty m:val="p"/>
+                </m:rPr>
+                <m:t>l</m:t>
+              </m:r>
+              <m:r>
+                <m:rPr>
+                  <m:sty m:val="p"/>
+                </m:rPr>
+                <m:t>o</m:t>
+              </m:r>
+              <m:r>
+                <m:rPr>
+                  <m:sty m:val="p"/>
+                </m:rPr>
+                <m:t>r</m:t>
+              </m:r>
+            </m:sub>
+          </m:sSub>
+          <m:r>
+            <m:rPr>
+              <m:sty m:val="p"/>
+            </m:rPr>
+            <m:t>min</m:t>
+          </m:r>
+          <m:d>
+            <m:dPr>
+              <m:begChr m:val="("/>
+              <m:endChr m:val=")"/>
+              <m:sepChr m:val=""/>
+              <m:grow/>
+            </m:dPr>
+            <m:e>
+              <m:r>
+                <m:t>1</m:t>
+              </m:r>
+              <m:r>
+                <m:rPr>
+                  <m:sty m:val="p"/>
+                </m:rPr>
+                <m:t>,</m:t>
+              </m:r>
+              <m:sSub>
+                <m:e>
+                  <m:r>
+                    <m:t>A</m:t>
+                  </m:r>
+                </m:e>
+                <m:sub>
+                  <m:r>
+                    <m:t>p</m:t>
+                  </m:r>
+                </m:sub>
+              </m:sSub>
+              <m:d>
+                <m:dPr>
+                  <m:begChr m:val="("/>
+                  <m:endChr m:val=")"/>
+                  <m:sepChr m:val=""/>
+                  <m:grow/>
+                </m:dPr>
+                <m:e>
+                  <m:sSub>
+                    <m:e>
+                      <m:r>
+                        <m:t>E</m:t>
+                      </m:r>
+                    </m:e>
+                    <m:sub>
+                      <m:r>
+                        <m:t>0</m:t>
+                      </m:r>
+                    </m:sub>
+                  </m:sSub>
+                </m:e>
+              </m:d>
+              <m:r>
+                <m:rPr>
+                  <m:sty m:val="p"/>
+                </m:rPr>
+                <m:t>+</m:t>
+              </m:r>
+              <m:sSub>
+                <m:e>
+                  <m:r>
+                    <m:t>A</m:t>
+                  </m:r>
+                </m:e>
+                <m:sub>
+                  <m:r>
+                    <m:t>p</m:t>
+                  </m:r>
+                </m:sub>
+              </m:sSub>
+              <m:d>
+                <m:dPr>
+                  <m:begChr m:val="("/>
+                  <m:endChr m:val=")"/>
+                  <m:sepChr m:val=""/>
+                  <m:grow/>
+                </m:dPr>
+                <m:e>
+                  <m:sSub>
+                    <m:e>
+                      <m:r>
+                        <m:t>E</m:t>
+                      </m:r>
+                    </m:e>
+                    <m:sub>
+                      <m:r>
+                        <m:t>1</m:t>
+                      </m:r>
+                    </m:sub>
+                  </m:sSub>
+                </m:e>
+              </m:d>
+            </m:e>
+          </m:d>
+          <m:r>
+            <m:rPr>
+              <m:sty m:val="p"/>
+            </m:rPr>
+            <m:t>.</m:t>
+          </m:r>
+        </m:oMath>
+      </m:oMathPara>
+    </w:p>
+    <w:bookmarkEnd w:id="36"/>
+    <w:bookmarkStart w:id="37" w:name="assumptions."/>
+    <w:p>
+      <w:pPr>
+        <w:pStyle w:val="Heading4"/>
+      </w:pPr>
+      <w:r>
+        <w:t xml:space="preserve">Assumptions.</w:t>
+      </w:r>
+    </w:p>
+    <w:p>
+      <w:pPr>
+        <w:pStyle w:val="FirstParagraph"/>
+      </w:pPr>
+      <w:r>
+        <w:t xml:space="preserve">The bound requires: (i) front-to-back alpha compositing with effective post-clamp/post-cutoff alpha in</w:t>
+      </w:r>
+      <w:r>
+        <w:t xml:space="preserve"> </w:t>
+      </w:r>
+      <m:oMath>
+        <m:d>
+          <m:dPr>
+            <m:begChr m:val="["/>
+            <m:endChr m:val="]"/>
+            <m:sepChr m:val=""/>
+            <m:grow/>
+          </m:dPr>
+          <m:e>
+            <m:r>
+              <m:t>0</m:t>
+            </m:r>
+            <m:r>
+              <m:rPr>
+                <m:sty m:val="p"/>
+              </m:rPr>
+              <m:t>,</m:t>
+            </m:r>
+            <m:r>
+              <m:t>1</m:t>
+            </m:r>
+          </m:e>
+        </m:d>
+      </m:oMath>
+      <w:r>
+        <w:t xml:space="preserve">; (ii) each protected color channel lies in an interval of width</w:t>
+      </w:r>
+      <w:r>
+        <w:t xml:space="preserve"> </w:t>
+      </w:r>
+      <m:oMath>
+        <m:sSub>
+          <m:e>
+            <m:r>
+              <m:t>C</m:t>
+            </m:r>
+          </m:e>
+          <m:sub>
+            <m:r>
+              <m:rPr>
+                <m:sty m:val="p"/>
+              </m:rPr>
+              <m:t>c</m:t>
+            </m:r>
+            <m:r>
+              <m:rPr>
+                <m:sty m:val="p"/>
+              </m:rPr>
+              <m:t>o</m:t>
+            </m:r>
+            <m:r>
+              <m:rPr>
+                <m:sty m:val="p"/>
+              </m:rPr>
+              <m:t>l</m:t>
+            </m:r>
+            <m:r>
+              <m:rPr>
+                <m:sty m:val="p"/>
+              </m:rPr>
+              <m:t>o</m:t>
+            </m:r>
+            <m:r>
+              <m:rPr>
+                <m:sty m:val="p"/>
+              </m:rPr>
+              <m:t>r</m:t>
+            </m:r>
+          </m:sub>
+        </m:sSub>
+      </m:oMath>
+      <w:r>
+        <w:t xml:space="preserve">, including the bounded spherical-harmonic evaluation used by the renderer; (iii)</w:t>
+      </w:r>
+      <w:r>
+        <w:t xml:space="preserve"> </w:t>
+      </w:r>
+      <m:oMath>
+        <m:sSub>
+          <m:e>
+            <m:r>
+              <m:t>E</m:t>
+            </m:r>
+          </m:e>
+          <m:sub>
+            <m:r>
+              <m:t>0</m:t>
+            </m:r>
+          </m:sub>
+        </m:sSub>
+        <m:r>
+          <m:rPr>
+            <m:sty m:val="p"/>
+          </m:rPr>
+          <m:t>,</m:t>
+        </m:r>
+        <m:sSub>
+          <m:e>
+            <m:r>
+              <m:t>E</m:t>
+            </m:r>
+          </m:e>
+          <m:sub>
+            <m:r>
+              <m:t>1</m:t>
+            </m:r>
+          </m:sub>
+        </m:sSub>
+      </m:oMath>
+      <w:r>
+        <w:t xml:space="preserve"> </w:t>
+      </w:r>
+      <w:r>
+        <w:t xml:space="preserve">contain every Gaussian whose projected opacity, color, insertion/deletion state, or depth relation to unchanged support can change because of the edit; and (iv) renderer behavior not represented by these bounded quantities is treated as unsupported and therefore promoted to an exact dependency or</w:t>
+      </w:r>
+      <w:r>
+        <w:t xml:space="preserve"> </w:t>
+      </w:r>
+      <w:r>
+        <w:rPr>
+          <w:smallCaps/>
+        </w:rPr>
+        <w:t xml:space="preserve">Full</w:t>
+      </w:r>
+      <w:r>
+        <w:t xml:space="preserve"> </w:t>
+      </w:r>
+      <w:r>
+        <w:t xml:space="preserve">fallback.</w:t>
+      </w:r>
+    </w:p>
+    <w:bookmarkEnd w:id="37"/>
+    <w:bookmarkStart w:id="38" w:name="proof-sketch."/>
+    <w:p>
+      <w:pPr>
+        <w:pStyle w:val="Heading4"/>
+      </w:pPr>
+      <w:r>
+        <w:t xml:space="preserve">Proof sketch.</w:t>
+      </w:r>
+    </w:p>
+    <w:p>
+      <w:pPr>
+        <w:pStyle w:val="FirstParagraph"/>
+      </w:pPr>
+      <w:r>
+        <w:t xml:space="preserve">For one edited set, front-to-back compositing changes the final channel value by at most the channel range multiplied by the total opacity mass through which edited support can replace, attenuate, or reveal unchanged radiance. This gives</w:t>
+      </w:r>
+      <w:r>
+        <w:t xml:space="preserve"> </w:t>
+      </w:r>
+      <m:oMath>
+        <m:sSub>
+          <m:e>
+            <m:r>
+              <m:t>C</m:t>
+            </m:r>
+          </m:e>
+          <m:sub>
+            <m:r>
+              <m:rPr>
+                <m:sty m:val="p"/>
+              </m:rPr>
+              <m:t>c</m:t>
+            </m:r>
+            <m:r>
+              <m:rPr>
+                <m:sty m:val="p"/>
+              </m:rPr>
+              <m:t>o</m:t>
+            </m:r>
+            <m:r>
+              <m:rPr>
+                <m:sty m:val="p"/>
+              </m:rPr>
+              <m:t>l</m:t>
+            </m:r>
+            <m:r>
+              <m:rPr>
+                <m:sty m:val="p"/>
+              </m:rPr>
+              <m:t>o</m:t>
+            </m:r>
+            <m:r>
+              <m:rPr>
+                <m:sty m:val="p"/>
+              </m:rPr>
+              <m:t>r</m:t>
+            </m:r>
+          </m:sub>
+        </m:sSub>
+        <m:sSub>
+          <m:e>
+            <m:r>
+              <m:t>A</m:t>
+            </m:r>
+          </m:e>
+          <m:sub>
+            <m:r>
+              <m:t>p</m:t>
+            </m:r>
+          </m:sub>
+        </m:sSub>
+        <m:d>
+          <m:dPr>
+            <m:begChr m:val="("/>
+            <m:endChr m:val=")"/>
+            <m:sepChr m:val=""/>
+            <m:grow/>
+          </m:dPr>
+          <m:e>
+            <m:r>
+              <m:t>E</m:t>
+            </m:r>
+          </m:e>
+        </m:d>
+      </m:oMath>
+      <w:r>
+        <w:t xml:space="preserve">. Insertion and deletion are the cases in which one edited set is empty. For a general before/after edit, apply the triangle inequality through the common unchanged state</w:t>
+      </w:r>
+      <w:r>
+        <w:t xml:space="preserve"> </w:t>
+      </w:r>
+      <m:oMath>
+        <m:r>
+          <m:t>U</m:t>
+        </m:r>
+      </m:oMath>
+      <w:r>
+        <w:t xml:space="preserve"> </w:t>
+      </w:r>
+      <w:r>
+        <w:t xml:space="preserve">to obtain</w:t>
+      </w:r>
+      <w:r>
+        <w:t xml:space="preserve"> </w:t>
+      </w:r>
+      <m:oMath>
+        <m:sSub>
+          <m:e>
+            <m:r>
+              <m:t>C</m:t>
+            </m:r>
+          </m:e>
+          <m:sub>
+            <m:r>
+              <m:rPr>
+                <m:sty m:val="p"/>
+              </m:rPr>
+              <m:t>c</m:t>
+            </m:r>
+            <m:r>
+              <m:rPr>
+                <m:sty m:val="p"/>
+              </m:rPr>
+              <m:t>o</m:t>
+            </m:r>
+            <m:r>
+              <m:rPr>
+                <m:sty m:val="p"/>
+              </m:rPr>
+              <m:t>l</m:t>
+            </m:r>
+            <m:r>
+              <m:rPr>
+                <m:sty m:val="p"/>
+              </m:rPr>
+              <m:t>o</m:t>
+            </m:r>
+            <m:r>
+              <m:rPr>
+                <m:sty m:val="p"/>
+              </m:rPr>
+              <m:t>r</m:t>
+            </m:r>
+          </m:sub>
+        </m:sSub>
+        <m:d>
+          <m:dPr>
+            <m:begChr m:val="("/>
+            <m:endChr m:val=")"/>
+            <m:sepChr m:val=""/>
+            <m:grow/>
+          </m:dPr>
+          <m:e>
+            <m:sSub>
+              <m:e>
+                <m:r>
+                  <m:t>A</m:t>
+                </m:r>
+              </m:e>
+              <m:sub>
+                <m:r>
+                  <m:t>p</m:t>
+                </m:r>
+              </m:sub>
+            </m:sSub>
+            <m:d>
+              <m:dPr>
+                <m:begChr m:val="("/>
+                <m:endChr m:val=")"/>
+                <m:sepChr m:val=""/>
+                <m:grow/>
+              </m:dPr>
+              <m:e>
+                <m:sSub>
+                  <m:e>
+                    <m:r>
+                      <m:t>E</m:t>
+                    </m:r>
+                  </m:e>
+                  <m:sub>
+                    <m:r>
+                      <m:t>0</m:t>
+                    </m:r>
+                  </m:sub>
+                </m:sSub>
+              </m:e>
+            </m:d>
+            <m:r>
+              <m:rPr>
+                <m:sty m:val="p"/>
+              </m:rPr>
+              <m:t>+</m:t>
+            </m:r>
+            <m:sSub>
+              <m:e>
+                <m:r>
+                  <m:t>A</m:t>
+                </m:r>
+              </m:e>
+              <m:sub>
+                <m:r>
+                  <m:t>p</m:t>
+                </m:r>
+              </m:sub>
+            </m:sSub>
+            <m:d>
+              <m:dPr>
+                <m:begChr m:val="("/>
+                <m:endChr m:val=")"/>
+                <m:sepChr m:val=""/>
+                <m:grow/>
+              </m:dPr>
+              <m:e>
+                <m:sSub>
+                  <m:e>
+                    <m:r>
+                      <m:t>E</m:t>
+                    </m:r>
+                  </m:e>
+                  <m:sub>
+                    <m:r>
+                      <m:t>1</m:t>
+                    </m:r>
+                  </m:sub>
+                </m:sSub>
+              </m:e>
+            </m:d>
+          </m:e>
+        </m:d>
+      </m:oMath>
+      <w:r>
+        <w:t xml:space="preserve">, then clamp by the maximum possible channel-range change</w:t>
+      </w:r>
+      <w:r>
+        <w:t xml:space="preserve"> </w:t>
+      </w:r>
+      <m:oMath>
+        <m:sSub>
+          <m:e>
+            <m:r>
+              <m:t>C</m:t>
+            </m:r>
+          </m:e>
+          <m:sub>
+            <m:r>
+              <m:rPr>
+                <m:sty m:val="p"/>
+              </m:rPr>
+              <m:t>c</m:t>
+            </m:r>
+            <m:r>
+              <m:rPr>
+                <m:sty m:val="p"/>
+              </m:rPr>
+              <m:t>o</m:t>
+            </m:r>
+            <m:r>
+              <m:rPr>
+                <m:sty m:val="p"/>
+              </m:rPr>
+              <m:t>l</m:t>
+            </m:r>
+            <m:r>
+              <m:rPr>
+                <m:sty m:val="p"/>
+              </m:rPr>
+              <m:t>o</m:t>
+            </m:r>
+            <m:r>
+              <m:rPr>
+                <m:sty m:val="p"/>
+              </m:rPr>
+              <m:t>r</m:t>
+            </m:r>
+          </m:sub>
+        </m:sSub>
+      </m:oMath>
+      <w:r>
+        <w:t xml:space="preserve">. The protected-image certificate is the maximum of Eq. </w:t>
+      </w:r>
+      <w:hyperlink w:anchor="eq:gaussianbound">
+        <w:r>
+          <w:rPr>
+            <w:rStyle w:val="Hyperlink"/>
+          </w:rPr>
+          <w:t xml:space="preserve">[eq:gaussianbound]</w:t>
+        </w:r>
+      </w:hyperlink>
+      <w:r>
+        <w:t xml:space="preserve"> </w:t>
+      </w:r>
+      <w:r>
+        <w:t xml:space="preserve">over the declared pixel support. A fuller algebraic derivation is included with the manuscript supplement.</w:t>
+      </w:r>
+    </w:p>
+    <w:bookmarkEnd w:id="38"/>
+    <w:bookmarkEnd w:id="39"/>
+    <w:bookmarkStart w:id="40" w:name="stable-temporal-history"/>
+    <w:p>
+      <w:pPr>
+        <w:pStyle w:val="Heading2"/>
+      </w:pPr>
+      <w:r>
+        <w:t xml:space="preserve">Stable temporal history</w:t>
+      </w:r>
+    </w:p>
+    <w:p>
+      <w:pPr>
+        <w:pStyle w:val="FirstParagraph"/>
+      </w:pPr>
+      <w:r>
+        <w:t xml:space="preserve">For stable temporal validation, let</w:t>
+      </w:r>
+      <w:r>
+        <w:t xml:space="preserve"> </w:t>
+      </w:r>
+      <m:oMath>
+        <m:sSub>
+          <m:e>
+            <m:r>
+              <m:t>E</m:t>
+            </m:r>
+          </m:e>
+          <m:sub>
+            <m:r>
+              <m:t>c</m:t>
+            </m:r>
+          </m:sub>
+        </m:sSub>
+      </m:oMath>
+      <w:r>
+        <w:t xml:space="preserve"> </w:t>
+      </w:r>
+      <w:r>
+        <w:t xml:space="preserve">denote current-frame error,</w:t>
+      </w:r>
+      <w:r>
+        <w:t xml:space="preserve"> </w:t>
+      </w:r>
+      <m:oMath>
+        <m:sSub>
+          <m:e>
+            <m:r>
+              <m:t>E</m:t>
+            </m:r>
+          </m:e>
+          <m:sub>
+            <m:r>
+              <m:t>h</m:t>
+            </m:r>
+          </m:sub>
+        </m:sSub>
+      </m:oMath>
+      <w:r>
+        <w:t xml:space="preserve"> </w:t>
+      </w:r>
+      <w:r>
+        <w:t xml:space="preserve">retained-history error,</w:t>
+      </w:r>
+      <w:r>
+        <w:t xml:space="preserve"> </w:t>
+      </w:r>
+      <m:oMath>
+        <m:sSub>
+          <m:e>
+            <m:r>
+              <m:t>E</m:t>
+            </m:r>
+          </m:e>
+          <m:sub>
+            <m:r>
+              <m:t>n</m:t>
+            </m:r>
+          </m:sub>
+        </m:sSub>
+      </m:oMath>
+      <w:r>
+        <w:t xml:space="preserve"> </w:t>
+      </w:r>
+      <w:r>
+        <w:t xml:space="preserve">neighborhood or clamping error, and</w:t>
+      </w:r>
+      <w:r>
+        <w:t xml:space="preserve"> </w:t>
+      </w:r>
+      <m:oMath>
+        <m:r>
+          <m:t>w</m:t>
+        </m:r>
+        <m:r>
+          <m:rPr>
+            <m:sty m:val="p"/>
+          </m:rPr>
+          <m:t>∈</m:t>
+        </m:r>
+        <m:d>
+          <m:dPr>
+            <m:begChr m:val="["/>
+            <m:endChr m:val="]"/>
+            <m:sepChr m:val=""/>
+            <m:grow/>
+          </m:dPr>
+          <m:e>
+            <m:r>
+              <m:t>0</m:t>
+            </m:r>
+            <m:r>
+              <m:rPr>
+                <m:sty m:val="p"/>
+              </m:rPr>
+              <m:t>,</m:t>
+            </m:r>
+            <m:r>
+              <m:t>1</m:t>
+            </m:r>
+          </m:e>
+        </m:d>
+      </m:oMath>
+      <w:r>
+        <w:t xml:space="preserve"> </w:t>
+      </w:r>
+      <w:r>
+        <w:t xml:space="preserve">the history weight. With</w:t>
+      </w:r>
+      <w:r>
+        <w:t xml:space="preserve"> </w:t>
+      </w:r>
+      <m:oMath>
+        <m:sSub>
+          <m:e>
+            <m:r>
+              <m:t>E</m:t>
+            </m:r>
+          </m:e>
+          <m:sub>
+            <m:r>
+              <m:t>r</m:t>
+            </m:r>
+          </m:sub>
+        </m:sSub>
+        <m:r>
+          <m:rPr>
+            <m:sty m:val="p"/>
+          </m:rPr>
+          <m:t>=</m:t>
+        </m:r>
+        <m:r>
+          <m:rPr>
+            <m:sty m:val="p"/>
+          </m:rPr>
+          <m:t>max</m:t>
+        </m:r>
+        <m:d>
+          <m:dPr>
+            <m:begChr m:val="("/>
+            <m:endChr m:val=")"/>
+            <m:sepChr m:val=""/>
+            <m:grow/>
+          </m:dPr>
+          <m:e>
+            <m:sSub>
+              <m:e>
+                <m:r>
+                  <m:t>E</m:t>
+                </m:r>
+              </m:e>
+              <m:sub>
+                <m:r>
+                  <m:t>h</m:t>
+                </m:r>
+              </m:sub>
+            </m:sSub>
+            <m:r>
+              <m:rPr>
+                <m:sty m:val="p"/>
+              </m:rPr>
+              <m:t>,</m:t>
+            </m:r>
+            <m:sSub>
+              <m:e>
+                <m:r>
+                  <m:t>E</m:t>
+                </m:r>
+              </m:e>
+              <m:sub>
+                <m:r>
+                  <m:t>n</m:t>
+                </m:r>
+              </m:sub>
+            </m:sSub>
+          </m:e>
+        </m:d>
+      </m:oMath>
+      <w:r>
+        <w:t xml:space="preserve">,</w:t>
+      </w:r>
+    </w:p>
+    <w:p>
+      <w:pPr>
+        <w:pStyle w:val="BodyText"/>
+      </w:pPr>
+      <m:oMathPara>
+        <m:oMathParaPr>
+          <m:jc m:val="center"/>
+        </m:oMathParaPr>
+        <m:oMath>
+          <m:sSub>
+            <m:e>
+              <m:r>
+                <m:t>E</m:t>
+              </m:r>
+            </m:e>
+            <m:sub>
+              <m:r>
+                <m:rPr>
+                  <m:sty m:val="p"/>
+                </m:rPr>
+                <m:t>r</m:t>
+              </m:r>
+              <m:r>
+                <m:rPr>
+                  <m:sty m:val="p"/>
+                </m:rPr>
+                <m:t>e</m:t>
+              </m:r>
+              <m:r>
+                <m:rPr>
+                  <m:sty m:val="p"/>
+                </m:rPr>
+                <m:t>s</m:t>
+              </m:r>
+              <m:r>
+                <m:rPr>
+                  <m:sty m:val="p"/>
+                </m:rPr>
+                <m:t>o</m:t>
+              </m:r>
+              <m:r>
+                <m:rPr>
+                  <m:sty m:val="p"/>
+                </m:rPr>
+                <m:t>l</m:t>
+              </m:r>
+              <m:r>
+                <m:rPr>
+                  <m:sty m:val="p"/>
+                </m:rPr>
+                <m:t>v</m:t>
+              </m:r>
+              <m:r>
+                <m:rPr>
+                  <m:sty m:val="p"/>
+                </m:rPr>
+                <m:t>e</m:t>
+              </m:r>
+              <m:r>
+                <m:rPr>
+                  <m:sty m:val="p"/>
+                </m:rPr>
+                <m:t>d</m:t>
+              </m:r>
+            </m:sub>
+          </m:sSub>
+          <m:r>
+            <m:rPr>
+              <m:sty m:val="p"/>
+            </m:rPr>
+            <m:t>=</m:t>
+          </m:r>
+          <m:d>
+            <m:dPr>
+              <m:begChr m:val="("/>
+              <m:endChr m:val=")"/>
+              <m:sepChr m:val=""/>
+              <m:grow/>
+            </m:dPr>
+            <m:e>
+              <m:r>
+                <m:t>1</m:t>
+              </m:r>
+              <m:r>
+                <m:rPr>
+                  <m:sty m:val="p"/>
+                </m:rPr>
+                <m:t>−</m:t>
+              </m:r>
+              <m:r>
+                <m:t>w</m:t>
+              </m:r>
+            </m:e>
+          </m:d>
+          <m:sSub>
+            <m:e>
+              <m:r>
+                <m:t>E</m:t>
+              </m:r>
+            </m:e>
+            <m:sub>
+              <m:r>
+                <m:t>c</m:t>
+              </m:r>
+            </m:sub>
+          </m:sSub>
+          <m:r>
+            <m:rPr>
+              <m:sty m:val="p"/>
+            </m:rPr>
+            <m:t>+</m:t>
+          </m:r>
+          <m:r>
+            <m:t>w</m:t>
+          </m:r>
+          <m:sSub>
+            <m:e>
+              <m:r>
+                <m:t>E</m:t>
+              </m:r>
+            </m:e>
+            <m:sub>
+              <m:r>
+                <m:t>r</m:t>
+              </m:r>
+            </m:sub>
+          </m:sSub>
+          <m:r>
+            <m:rPr>
+              <m:sty m:val="p"/>
+            </m:rPr>
+            <m:t>.</m:t>
+          </m:r>
+        </m:oMath>
+      </m:oMathPara>
+    </w:p>
+    <w:p>
+      <w:pPr>
+        <w:pStyle w:val="FirstParagraph"/>
+      </w:pPr>
+      <w:r>
+        <w:t xml:space="preserve">If validation, reprojection, or disocclusion may itself change, MAVEB promotes the relation to</w:t>
+      </w:r>
+      <w:r>
+        <w:t xml:space="preserve"> </w:t>
+      </w:r>
+      <w:r>
+        <w:rPr>
+          <w:smallCaps/>
+        </w:rPr>
+        <w:t xml:space="preserve">Hard</w:t>
+      </w:r>
+      <w:r>
+        <w:t xml:space="preserve"> </w:t>
+      </w:r>
+      <w:r>
+        <w:t xml:space="preserve">invalidation instead of applying Eq. </w:t>
+      </w:r>
+      <w:hyperlink w:anchor="eq:temporal">
+        <w:r>
+          <w:rPr>
+            <w:rStyle w:val="Hyperlink"/>
+          </w:rPr>
+          <w:t xml:space="preserve">[eq:temporal]</w:t>
+        </w:r>
+      </w:hyperlink>
+      <w:r>
+        <w:t xml:space="preserve">. Thus the temporal path demonstrates the central design rule: use a soft bound only while its preconditions are certifiable.</w:t>
+      </w:r>
+    </w:p>
+    <w:bookmarkEnd w:id="40"/>
+    <w:bookmarkStart w:id="41" w:name="X62e354406816ed1168c1ad132bd8541650ea272"/>
+    <w:p>
+      <w:pPr>
+        <w:pStyle w:val="Heading2"/>
+      </w:pPr>
+      <w:r>
+        <w:t xml:space="preserve">Greedy feasible-cone search and crossover</w:t>
+      </w:r>
+    </w:p>
+    <w:p>
+      <w:pPr>
+        <w:pStyle w:val="FirstParagraph"/>
+      </w:pPr>
+      <w:r>
+        <w:t xml:space="preserve">The v1 search uses the revision criticality in Eq. </w:t>
+      </w:r>
+      <w:hyperlink w:anchor="eq:criticality">
+        <w:r>
+          <w:rPr>
+            <w:rStyle w:val="Hyperlink"/>
+          </w:rPr>
+          <w:t xml:space="preserve">[eq:criticality]</w:t>
+        </w:r>
+      </w:hyperlink>
+      <w:r>
+        <w:t xml:space="preserve"> </w:t>
+      </w:r>
+      <w:r>
+        <w:t xml:space="preserve">directly. For a candidate expansion</w:t>
       </w:r>
       <w:r>
         <w:t xml:space="preserve"> </w:t>
@@ -4213,7 +4828,7 @@
         </m:r>
       </m:oMath>
       <w:r>
-        <w:t xml:space="preserve">, the v1 search scores</w:t>
+        <w:t xml:space="preserve">, it scores</w:t>
       </w:r>
     </w:p>
     <w:p>
@@ -4307,7 +4922,7 @@
             </m:fPr>
             <m:num>
               <m:r>
-                <m:t>ϕ</m:t>
+                <m:t>χ</m:t>
               </m:r>
               <m:d>
                 <m:dPr>
@@ -4329,7 +4944,7 @@
                 <m:t>−</m:t>
               </m:r>
               <m:r>
-                <m:t>ϕ</m:t>
+                <m:t>χ</m:t>
               </m:r>
               <m:d>
                 <m:dPr>
@@ -4427,9 +5042,9 @@
         <w:t xml:space="preserve">, or when no useful local candidate remains. The algorithm claims a certified feasible cone, not the global minimum-work cone.</w:t>
       </w:r>
     </w:p>
-    <w:bookmarkEnd w:id="37"/>
-    <w:bookmarkEnd w:id="38"/>
-    <w:bookmarkStart w:id="43" w:name="system-implementation"/>
+    <w:bookmarkEnd w:id="41"/>
+    <w:bookmarkEnd w:id="42"/>
+    <w:bookmarkStart w:id="47" w:name="system-implementation"/>
     <w:p>
       <w:pPr>
         <w:pStyle w:val="Heading1"/>
@@ -4458,7 +5073,7 @@
         <w:t xml:space="preserve">, typed nodes and edges, sparse analytic propagation over supported DAG exteriors, exact predecessor consistency, a greedy feasible-cone search, and deterministic certificate serialization. Native and reference-planner decisions are compared in the campaign.</w:t>
       </w:r>
     </w:p>
-    <w:bookmarkStart w:id="39" w:name="revision-transactions."/>
+    <w:bookmarkStart w:id="43" w:name="revision-transactions."/>
     <w:p>
       <w:pPr>
         <w:pStyle w:val="Heading4"/>
@@ -4475,8 +5090,8 @@
         <w:t xml:space="preserve">The production path records persistent Gaussian entity translations, immutable before/after Gaussian revision sidecars, exact camera binding, a production Gaussian image certificate, and planner-selected temporal repair or retention. The headless path loads a persistent world, applies indexed Gaussian transactions, writes a new durable revision and sidecars, evaluates the Gaussian certificate, executes the output-cone planner, and emits canonical evidence JSON. A revision that cannot satisfy consistency checks fails closed rather than publishing partial state.</w:t>
       </w:r>
     </w:p>
-    <w:bookmarkEnd w:id="39"/>
-    <w:bookmarkStart w:id="40" w:name="cross-derived-state-accounting."/>
+    <w:bookmarkEnd w:id="43"/>
+    <w:bookmarkStart w:id="44" w:name="cross-derived-state-accounting."/>
     <w:p>
       <w:pPr>
         <w:pStyle w:val="Heading4"/>
@@ -4508,8 +5123,8 @@
         <w:t xml:space="preserve">is the counter source of truth for observation, TSDF, mesh, texture-page, material, Gaussian, GPU-publication, and temporal domains. Ledger/mesher disagreement is treated as an error. Native counts remain in their own units; conversion to the public scalar work model occurs only through a frozen versioned calibration. This design avoids hiding a full-world stage behind a local metric from a single subsystem.</w:t>
       </w:r>
     </w:p>
-    <w:bookmarkEnd w:id="40"/>
-    <w:bookmarkStart w:id="41" w:name="independent-oracle."/>
+    <w:bookmarkEnd w:id="44"/>
+    <w:bookmarkStart w:id="45" w:name="independent-oracle."/>
     <w:p>
       <w:pPr>
         <w:pStyle w:val="Heading4"/>
@@ -4537,8 +5152,8 @@
         <w:t xml:space="preserve">; production/offline certificate disagreement or a measured error above the emitted certificate is a correctness failure. Evidence bundles are hashed, and the canonical campaign records workflow IDs, artifact hashes, source hashes, and planner parity.</w:t>
       </w:r>
     </w:p>
-    <w:bookmarkEnd w:id="41"/>
-    <w:bookmarkStart w:id="42" w:name="representation-scope."/>
+    <w:bookmarkEnd w:id="45"/>
+    <w:bookmarkStart w:id="46" w:name="representation-scope."/>
     <w:p>
       <w:pPr>
         <w:pStyle w:val="Heading4"/>
@@ -4555,9 +5170,9 @@
         <w:t xml:space="preserve">The public campaign uses real COLMAP/SfM inputs from four public scenes and seeds isotropic Gaussians from the reconstructed points. These fields are not described as trained photorealistic 3DGS, and public coordinates are normalized rather than metric-scale. A secondary validation path uses a pinned external trained GraphDECO-style PLY while preserving spherical-harmonic coefficients, opacity, anisotropic scale, and rotation. Persistent ownership in this path is deterministic spatial ownership, not semantic segmentation.</w:t>
       </w:r>
     </w:p>
-    <w:bookmarkEnd w:id="42"/>
-    <w:bookmarkEnd w:id="43"/>
-    <w:bookmarkStart w:id="47" w:name="evaluation"/>
+    <w:bookmarkEnd w:id="46"/>
+    <w:bookmarkEnd w:id="47"/>
+    <w:bookmarkStart w:id="52" w:name="evaluation"/>
     <w:p>
       <w:pPr>
         <w:pStyle w:val="Heading1"/>
@@ -4566,7 +5181,7 @@
         <w:t xml:space="preserve">Evaluation</w:t>
       </w:r>
     </w:p>
-    <w:bookmarkStart w:id="44" w:name="questions-and-protocol"/>
+    <w:bookmarkStart w:id="49" w:name="questions-and-protocol"/>
     <w:p>
       <w:pPr>
         <w:pStyle w:val="Heading2"/>
@@ -4638,14 +5253,13 @@
         <w:t xml:space="preserve">For every selected repair, the campaign records the source edit, selected cone, local/full decision, certificate, independent full-reference residual, native work, calibrated work, and provenance. Fallback cases are retained as results rather than excluded from summary statistics.</w:t>
       </w:r>
     </w:p>
-    <w:bookmarkEnd w:id="44"/>
-    <w:bookmarkStart w:id="45" w:name="baselines-and-ablations"/>
-    <w:p>
-      <w:pPr>
-        <w:pStyle w:val="Heading2"/>
-      </w:pPr>
-      <w:r>
-        <w:t xml:space="preserve">Baselines and ablations</w:t>
+    <w:bookmarkStart w:id="48" w:name="runtime-scope."/>
+    <w:p>
+      <w:pPr>
+        <w:pStyle w:val="Heading4"/>
+      </w:pPr>
+      <w:r>
+        <w:t xml:space="preserve">Runtime scope.</w:t>
       </w:r>
     </w:p>
     <w:p>
@@ -4653,10 +5267,19 @@
         <w:pStyle w:val="FirstParagraph"/>
       </w:pPr>
       <w:r>
-        <w:t xml:space="preserve">The implemented method-level suite contains</w:t>
-      </w:r>
-      <w:r>
-        <w:t xml:space="preserve"> </w:t>
+        <w:t xml:space="preserve">The current campaign does not contain paired end-to-end</w:t>
+      </w:r>
+      <w:r>
+        <w:t xml:space="preserve"> </w:t>
+      </w:r>
+      <w:r>
+        <w:rPr>
+          <w:smallCaps/>
+        </w:rPr>
+        <w:t xml:space="preserve">Local</w:t>
+      </w:r>
+      <w:r>
+        <w:t xml:space="preserve">-versus-</w:t>
       </w:r>
       <w:r>
         <w:rPr>
@@ -4665,6 +5288,40 @@
         <w:t xml:space="preserve">Full</w:t>
       </w:r>
       <w:r>
+        <w:t xml:space="preserve"> </w:t>
+      </w:r>
+      <w:r>
+        <w:t xml:space="preserve">wall-clock trials under identical execution conditions. Accordingly, no speedup claim is made anywhere in the paper. The public headline is a frozen heterogeneous millisecond-calibrated work ratio, while the baseline suite below reports its own native work-ratio metric. These quantities are intentionally labeled separately.</w:t>
+      </w:r>
+    </w:p>
+    <w:bookmarkEnd w:id="48"/>
+    <w:bookmarkEnd w:id="49"/>
+    <w:bookmarkStart w:id="50" w:name="baselines-and-ablations"/>
+    <w:p>
+      <w:pPr>
+        <w:pStyle w:val="Heading2"/>
+      </w:pPr>
+      <w:r>
+        <w:t xml:space="preserve">Baselines and ablations</w:t>
+      </w:r>
+    </w:p>
+    <w:p>
+      <w:pPr>
+        <w:pStyle w:val="FirstParagraph"/>
+      </w:pPr>
+      <w:r>
+        <w:t xml:space="preserve">The implemented method-level suite contains</w:t>
+      </w:r>
+      <w:r>
+        <w:t xml:space="preserve"> </w:t>
+      </w:r>
+      <w:r>
+        <w:rPr>
+          <w:smallCaps/>
+        </w:rPr>
+        <w:t xml:space="preserve">Full</w:t>
+      </w:r>
+      <w:r>
         <w:t xml:space="preserve">, exact-only repair, fixed radius policies, a changed-fraction policy, a held-out empirical scheduler, and CBRC. The empirical signal is permitted to order work but is not certificate-eligible. Structural and analytic ablations remove or replace individual components, while a separately labeled deterministic mechanism-isolation suite constructs stress cases for exact closure, analytic Gaussian influence, temporal influence, quantity-of-interest specialization, hard/soft separation, graph-structured propagation, and fallback behavior.</w:t>
       </w:r>
     </w:p>
@@ -4676,8 +5333,8 @@
         <w:t xml:space="preserve">The real campaign is not retuned to force every ablation to separate. Several structural ablations are neutral on the frozen matrix; those results are reported as neutral. The synthetic mechanism suite demonstrates that a mechanism can be falsified under a constructed stress case, not that the same mechanism determines effect size on every real revision.</w:t>
       </w:r>
     </w:p>
-    <w:bookmarkEnd w:id="45"/>
-    <w:bookmarkStart w:id="46" w:name="metrics"/>
+    <w:bookmarkEnd w:id="50"/>
+    <w:bookmarkStart w:id="51" w:name="metrics"/>
     <w:p>
       <w:pPr>
         <w:pStyle w:val="Heading2"/>
@@ -4805,9 +5462,9 @@
         <w:t xml:space="preserve">is reported only when the independent residual is non-zero; it is undefined for numerically zero residual rather than divided by an arbitrary floor.</w:t>
       </w:r>
     </w:p>
-    <w:bookmarkEnd w:id="46"/>
-    <w:bookmarkEnd w:id="47"/>
-    <w:bookmarkStart w:id="57" w:name="sec:results"/>
+    <w:bookmarkEnd w:id="51"/>
+    <w:bookmarkEnd w:id="52"/>
+    <w:bookmarkStart w:id="63" w:name="sec:results"/>
     <w:p>
       <w:pPr>
         <w:pStyle w:val="Heading1"/>
@@ -4816,7 +5473,7 @@
         <w:t xml:space="preserve">Results</w:t>
       </w:r>
     </w:p>
-    <w:bookmarkStart w:id="52" w:name="public-rgbsfm-campaign"/>
+    <w:bookmarkStart w:id="53" w:name="public-rgbsfm-campaign"/>
     <w:p>
       <w:pPr>
         <w:pStyle w:val="Heading2"/>
@@ -5110,6 +5767,609 @@
         <w:t xml:space="preserve">speedup: the public scalar is constructed from frozen per-domain microbenchmarks, while campaign phase wall times are recorded separately. A paired local-versus-full end-to-end timing experiment would be required for a speedup claim.</w:t>
       </w:r>
     </w:p>
+    <w:bookmarkEnd w:id="53"/>
+    <w:bookmarkStart w:id="58" w:name="method-comparison"/>
+    <w:p>
+      <w:pPr>
+        <w:pStyle w:val="Heading2"/>
+      </w:pPr>
+      <w:r>
+        <w:t xml:space="preserve">Method comparison</w:t>
+      </w:r>
+    </w:p>
+    <w:p>
+      <w:pPr>
+        <w:pStyle w:val="FirstParagraph"/>
+      </w:pPr>
+      <w:r>
+        <w:t xml:space="preserve">Table </w:t>
+      </w:r>
+      <w:hyperlink w:anchor="tab:baselines">
+        <w:r>
+          <w:rPr>
+            <w:rStyle w:val="Hyperlink"/>
+          </w:rPr>
+          <w:t xml:space="preserve">[tab:baselines]</w:t>
+        </w:r>
+      </w:hyperlink>
+      <w:r>
+        <w:t xml:space="preserve"> </w:t>
+      </w:r>
+      <w:r>
+        <w:t xml:space="preserve">reports the frozen method-level baseline suite on the same 60 cases. The suite re-certifies every selected cone with the conservative certificate, so</w:t>
+      </w:r>
+      <w:r>
+        <w:t xml:space="preserve"> </w:t>
+      </w:r>
+      <w:r>
+        <w:rPr>
+          <w:iCs/>
+          <w:i/>
+        </w:rPr>
+        <w:t xml:space="preserve">certificate pass</w:t>
+      </w:r>
+      <w:r>
+        <w:t xml:space="preserve"> </w:t>
+      </w:r>
+      <w:r>
+        <w:t xml:space="preserve">is not an independent measured-error metric. In particular, exact-only, radius, and changed-fraction policies often choose very little work but fail the certificate on most cases. The empirical-order baseline uses empirical influence only to order expansion and is still re-certified analytically; the separately held-out changed-fraction heuristic is discussed below.</w:t>
+      </w:r>
+    </w:p>
+    <w:tbl>
+      <w:tblPr>
+        <w:tblStyle w:val="Table"/>
+        <w:tblW w:type="auto" w:w="0"/>
+        <w:tblLook w:firstRow="1" w:lastRow="0" w:firstColumn="0" w:lastColumn="0" w:noHBand="0" w:noVBand="0" w:val="0020"/>
+        <w:jc w:val="start"/>
+      </w:tblPr>
+      <w:tblGrid>
+        <w:gridCol w:w="1320"/>
+        <w:gridCol w:w="1320"/>
+        <w:gridCol w:w="1320"/>
+        <w:gridCol w:w="1320"/>
+        <w:gridCol w:w="1320"/>
+        <w:gridCol w:w="1320"/>
+      </w:tblGrid>
+      <w:tr>
+        <w:trPr>
+          <w:tblHeader w:val="true"/>
+        </w:trPr>
+        <w:tc>
+          <w:tcPr/>
+          <w:p>
+            <w:pPr>
+              <w:pStyle w:val="Compact"/>
+              <w:jc w:val="left"/>
+            </w:pPr>
+            <w:r>
+              <w:t xml:space="preserve">Method</w:t>
+            </w:r>
+          </w:p>
+        </w:tc>
+        <w:tc>
+          <w:tcPr/>
+          <w:p>
+            <w:pPr>
+              <w:pStyle w:val="Compact"/>
+              <w:jc w:val="right"/>
+            </w:pPr>
+            <w:r>
+              <w:t xml:space="preserve">Cert. pass</w:t>
+            </w:r>
+          </w:p>
+        </w:tc>
+        <w:tc>
+          <w:tcPr/>
+          <w:p>
+            <w:pPr>
+              <w:pStyle w:val="Compact"/>
+              <w:jc w:val="right"/>
+            </w:pPr>
+            <w:r>
+              <w:t xml:space="preserve">Uncertified</w:t>
+            </w:r>
+          </w:p>
+        </w:tc>
+        <w:tc>
+          <w:tcPr/>
+          <w:p>
+            <w:pPr>
+              <w:pStyle w:val="Compact"/>
+              <w:jc w:val="right"/>
+            </w:pPr>
+            <w:r>
+              <w:rPr>
+                <w:smallCaps/>
+              </w:rPr>
+              <w:t xml:space="preserve">Full</w:t>
+            </w:r>
+            <w:r>
+              <w:t xml:space="preserve"> </w:t>
+            </w:r>
+            <w:r>
+              <w:t xml:space="preserve">rate</w:t>
+            </w:r>
+          </w:p>
+        </w:tc>
+        <w:tc>
+          <w:tcPr/>
+          <w:p>
+            <w:pPr>
+              <w:pStyle w:val="Compact"/>
+              <w:jc w:val="right"/>
+            </w:pPr>
+            <w:r>
+              <w:t xml:space="preserve">Median native work/</w:t>
+            </w:r>
+            <w:r>
+              <w:rPr>
+                <w:smallCaps/>
+              </w:rPr>
+              <w:t xml:space="preserve">Full</w:t>
+            </w:r>
+          </w:p>
+        </w:tc>
+        <w:tc>
+          <w:tcPr/>
+          <w:p>
+            <w:pPr>
+              <w:pStyle w:val="Compact"/>
+              <w:jc w:val="left"/>
+            </w:pPr>
+            <w:r>
+              <w:t xml:space="preserve">Decision rule</w:t>
+            </w:r>
+          </w:p>
+        </w:tc>
+      </w:tr>
+      <w:tr>
+        <w:tc>
+          <w:tcPr/>
+          <w:p>
+            <w:pPr>
+              <w:pStyle w:val="Compact"/>
+              <w:jc w:val="left"/>
+            </w:pPr>
+            <w:r>
+              <w:rPr>
+                <w:smallCaps/>
+              </w:rPr>
+              <w:t xml:space="preserve">Full</w:t>
+            </w:r>
+          </w:p>
+        </w:tc>
+        <w:tc>
+          <w:tcPr/>
+          <w:p>
+            <w:pPr>
+              <w:pStyle w:val="Compact"/>
+              <w:jc w:val="right"/>
+            </w:pPr>
+            <w:r>
+              <w:t xml:space="preserve">100.0%</w:t>
+            </w:r>
+          </w:p>
+        </w:tc>
+        <w:tc>
+          <w:tcPr/>
+          <w:p>
+            <w:pPr>
+              <w:pStyle w:val="Compact"/>
+              <w:jc w:val="right"/>
+            </w:pPr>
+            <w:r>
+              <w:t xml:space="preserve">0.0%</w:t>
+            </w:r>
+          </w:p>
+        </w:tc>
+        <w:tc>
+          <w:tcPr/>
+          <w:p>
+            <w:pPr>
+              <w:pStyle w:val="Compact"/>
+              <w:jc w:val="right"/>
+            </w:pPr>
+            <w:r>
+              <w:t xml:space="preserve">100.0%</w:t>
+            </w:r>
+          </w:p>
+        </w:tc>
+        <w:tc>
+          <w:tcPr/>
+          <w:p>
+            <w:pPr>
+              <w:pStyle w:val="Compact"/>
+              <w:jc w:val="right"/>
+            </w:pPr>
+            <w:r>
+              <w:t xml:space="preserve">1.00000</w:t>
+            </w:r>
+          </w:p>
+        </w:tc>
+        <w:tc>
+          <w:tcPr/>
+          <w:p>
+            <w:pPr>
+              <w:pStyle w:val="Compact"/>
+              <w:jc w:val="left"/>
+            </w:pPr>
+            <w:r>
+              <w:t xml:space="preserve">full reference</w:t>
+            </w:r>
+          </w:p>
+        </w:tc>
+      </w:tr>
+      <w:tr>
+        <w:tc>
+          <w:tcPr/>
+          <w:p>
+            <w:pPr>
+              <w:pStyle w:val="Compact"/>
+              <w:jc w:val="left"/>
+            </w:pPr>
+            <w:r>
+              <w:t xml:space="preserve">Exact only</w:t>
+            </w:r>
+          </w:p>
+        </w:tc>
+        <w:tc>
+          <w:tcPr/>
+          <w:p>
+            <w:pPr>
+              <w:pStyle w:val="Compact"/>
+              <w:jc w:val="right"/>
+            </w:pPr>
+            <w:r>
+              <w:t xml:space="preserve">26.7%</w:t>
+            </w:r>
+          </w:p>
+        </w:tc>
+        <w:tc>
+          <w:tcPr/>
+          <w:p>
+            <w:pPr>
+              <w:pStyle w:val="Compact"/>
+              <w:jc w:val="right"/>
+            </w:pPr>
+            <w:r>
+              <w:t xml:space="preserve">73.3%</w:t>
+            </w:r>
+          </w:p>
+        </w:tc>
+        <w:tc>
+          <w:tcPr/>
+          <w:p>
+            <w:pPr>
+              <w:pStyle w:val="Compact"/>
+              <w:jc w:val="right"/>
+            </w:pPr>
+            <w:r>
+              <w:t xml:space="preserve">0.0%</w:t>
+            </w:r>
+          </w:p>
+        </w:tc>
+        <w:tc>
+          <w:tcPr/>
+          <w:p>
+            <w:pPr>
+              <w:pStyle w:val="Compact"/>
+              <w:jc w:val="right"/>
+            </w:pPr>
+            <w:r>
+              <w:t xml:space="preserve">0.00000</w:t>
+            </w:r>
+          </w:p>
+        </w:tc>
+        <w:tc>
+          <w:tcPr/>
+          <w:p>
+            <w:pPr>
+              <w:pStyle w:val="Compact"/>
+              <w:jc w:val="left"/>
+            </w:pPr>
+            <w:r>
+              <w:t xml:space="preserve">exact closure only</w:t>
+            </w:r>
+          </w:p>
+        </w:tc>
+      </w:tr>
+      <w:tr>
+        <w:tc>
+          <w:tcPr/>
+          <w:p>
+            <w:pPr>
+              <w:pStyle w:val="Compact"/>
+              <w:jc w:val="left"/>
+            </w:pPr>
+            <w:r>
+              <w:t xml:space="preserve">Radius 0–3</w:t>
+            </w:r>
+          </w:p>
+        </w:tc>
+        <w:tc>
+          <w:tcPr/>
+          <w:p>
+            <w:pPr>
+              <w:pStyle w:val="Compact"/>
+              <w:jc w:val="right"/>
+            </w:pPr>
+            <w:r>
+              <w:t xml:space="preserve">26.7%</w:t>
+            </w:r>
+          </w:p>
+        </w:tc>
+        <w:tc>
+          <w:tcPr/>
+          <w:p>
+            <w:pPr>
+              <w:pStyle w:val="Compact"/>
+              <w:jc w:val="right"/>
+            </w:pPr>
+            <w:r>
+              <w:t xml:space="preserve">73.3%</w:t>
+            </w:r>
+          </w:p>
+        </w:tc>
+        <w:tc>
+          <w:tcPr/>
+          <w:p>
+            <w:pPr>
+              <w:pStyle w:val="Compact"/>
+              <w:jc w:val="right"/>
+            </w:pPr>
+            <w:r>
+              <w:t xml:space="preserve">0.0%</w:t>
+            </w:r>
+          </w:p>
+        </w:tc>
+        <w:tc>
+          <w:tcPr/>
+          <w:p>
+            <w:pPr>
+              <w:pStyle w:val="Compact"/>
+              <w:jc w:val="right"/>
+            </w:pPr>
+            <w:r>
+              <w:t xml:space="preserve">0.00000</w:t>
+            </w:r>
+          </w:p>
+        </w:tc>
+        <w:tc>
+          <w:tcPr/>
+          <w:p>
+            <w:pPr>
+              <w:pStyle w:val="Compact"/>
+              <w:jc w:val="left"/>
+            </w:pPr>
+            <w:r>
+              <w:t xml:space="preserve">fixed graph radius</w:t>
+            </w:r>
+          </w:p>
+        </w:tc>
+      </w:tr>
+      <w:tr>
+        <w:tc>
+          <w:tcPr/>
+          <w:p>
+            <w:pPr>
+              <w:pStyle w:val="Compact"/>
+              <w:jc w:val="left"/>
+            </w:pPr>
+            <w:r>
+              <w:t xml:space="preserve">Changed fraction</w:t>
+            </w:r>
+          </w:p>
+        </w:tc>
+        <w:tc>
+          <w:tcPr/>
+          <w:p>
+            <w:pPr>
+              <w:pStyle w:val="Compact"/>
+              <w:jc w:val="right"/>
+            </w:pPr>
+            <w:r>
+              <w:t xml:space="preserve">40.0%</w:t>
+            </w:r>
+          </w:p>
+        </w:tc>
+        <w:tc>
+          <w:tcPr/>
+          <w:p>
+            <w:pPr>
+              <w:pStyle w:val="Compact"/>
+              <w:jc w:val="right"/>
+            </w:pPr>
+            <w:r>
+              <w:t xml:space="preserve">60.0%</w:t>
+            </w:r>
+          </w:p>
+        </w:tc>
+        <w:tc>
+          <w:tcPr/>
+          <w:p>
+            <w:pPr>
+              <w:pStyle w:val="Compact"/>
+              <w:jc w:val="right"/>
+            </w:pPr>
+            <w:r>
+              <w:t xml:space="preserve">0.0%</w:t>
+            </w:r>
+          </w:p>
+        </w:tc>
+        <w:tc>
+          <w:tcPr/>
+          <w:p>
+            <w:pPr>
+              <w:pStyle w:val="Compact"/>
+              <w:jc w:val="right"/>
+            </w:pPr>
+            <w:r>
+              <w:t xml:space="preserve">0.00000</w:t>
+            </w:r>
+          </w:p>
+        </w:tc>
+        <w:tc>
+          <w:tcPr/>
+          <w:p>
+            <w:pPr>
+              <w:pStyle w:val="Compact"/>
+              <w:jc w:val="left"/>
+            </w:pPr>
+            <w:r>
+              <w:t xml:space="preserve">threshold policy</w:t>
+            </w:r>
+          </w:p>
+        </w:tc>
+      </w:tr>
+      <w:tr>
+        <w:tc>
+          <w:tcPr/>
+          <w:p>
+            <w:pPr>
+              <w:pStyle w:val="Compact"/>
+              <w:jc w:val="left"/>
+            </w:pPr>
+            <w:r>
+              <w:t xml:space="preserve">Empirical order + certifier</w:t>
+            </w:r>
+          </w:p>
+        </w:tc>
+        <w:tc>
+          <w:tcPr/>
+          <w:p>
+            <w:pPr>
+              <w:pStyle w:val="Compact"/>
+              <w:jc w:val="right"/>
+            </w:pPr>
+            <w:r>
+              <w:t xml:space="preserve">100.0%</w:t>
+            </w:r>
+          </w:p>
+        </w:tc>
+        <w:tc>
+          <w:tcPr/>
+          <w:p>
+            <w:pPr>
+              <w:pStyle w:val="Compact"/>
+              <w:jc w:val="right"/>
+            </w:pPr>
+            <w:r>
+              <w:t xml:space="preserve">0.0%</w:t>
+            </w:r>
+          </w:p>
+        </w:tc>
+        <w:tc>
+          <w:tcPr/>
+          <w:p>
+            <w:pPr>
+              <w:pStyle w:val="Compact"/>
+              <w:jc w:val="right"/>
+            </w:pPr>
+            <w:r>
+              <w:t xml:space="preserve">0.0%</w:t>
+            </w:r>
+          </w:p>
+        </w:tc>
+        <w:tc>
+          <w:tcPr/>
+          <w:p>
+            <w:pPr>
+              <w:pStyle w:val="Compact"/>
+              <w:jc w:val="right"/>
+            </w:pPr>
+            <w:r>
+              <w:t xml:space="preserve">0.04736</w:t>
+            </w:r>
+          </w:p>
+        </w:tc>
+        <w:tc>
+          <w:tcPr/>
+          <w:p>
+            <w:pPr>
+              <w:pStyle w:val="Compact"/>
+              <w:jc w:val="left"/>
+            </w:pPr>
+            <w:r>
+              <w:t xml:space="preserve">empirical ordering, analytic recertification</w:t>
+            </w:r>
+          </w:p>
+        </w:tc>
+      </w:tr>
+      <w:tr>
+        <w:tc>
+          <w:tcPr/>
+          <w:p>
+            <w:pPr>
+              <w:pStyle w:val="Compact"/>
+              <w:jc w:val="left"/>
+            </w:pPr>
+            <w:r>
+              <w:t xml:space="preserve">CBRC</w:t>
+            </w:r>
+          </w:p>
+        </w:tc>
+        <w:tc>
+          <w:tcPr/>
+          <w:p>
+            <w:pPr>
+              <w:pStyle w:val="Compact"/>
+              <w:jc w:val="right"/>
+            </w:pPr>
+            <w:r>
+              <w:t xml:space="preserve">100.0%</w:t>
+            </w:r>
+          </w:p>
+        </w:tc>
+        <w:tc>
+          <w:tcPr/>
+          <w:p>
+            <w:pPr>
+              <w:pStyle w:val="Compact"/>
+              <w:jc w:val="right"/>
+            </w:pPr>
+            <w:r>
+              <w:t xml:space="preserve">0.0%</w:t>
+            </w:r>
+          </w:p>
+        </w:tc>
+        <w:tc>
+          <w:tcPr/>
+          <w:p>
+            <w:pPr>
+              <w:pStyle w:val="Compact"/>
+              <w:jc w:val="right"/>
+            </w:pPr>
+            <w:r>
+              <w:t xml:space="preserve">26.7%</w:t>
+            </w:r>
+          </w:p>
+        </w:tc>
+        <w:tc>
+          <w:tcPr/>
+          <w:p>
+            <w:pPr>
+              <w:pStyle w:val="Compact"/>
+              <w:jc w:val="right"/>
+            </w:pPr>
+            <w:r>
+              <w:t xml:space="preserve">0.04736</w:t>
+            </w:r>
+          </w:p>
+        </w:tc>
+        <w:tc>
+          <w:tcPr/>
+          <w:p>
+            <w:pPr>
+              <w:pStyle w:val="Compact"/>
+              <w:jc w:val="left"/>
+            </w:pPr>
+            <w:r>
+              <w:t xml:space="preserve">certificate + work crossover + fallback</w:t>
+            </w:r>
+          </w:p>
+        </w:tc>
+      </w:tr>
+    </w:tbl>
     <w:p>
       <w:pPr>
         <w:pStyle w:val="BodyText"/>
@@ -5119,18 +6379,18 @@
           <wp:inline>
             <wp:extent cx="5227320" cy="3136392"/>
             <wp:effectExtent b="0" l="0" r="0" t="0"/>
-            <wp:docPr descr="image" title="" id="49" name="Picture"/>
+            <wp:docPr descr="image" title="" id="55" name="Picture"/>
             <a:graphic>
               <a:graphicData uri="http://schemas.openxmlformats.org/drawingml/2006/picture">
                 <pic:pic>
                   <pic:nvPicPr>
-                    <pic:cNvPr descr="../research/results/visualizations/public/F0_hero.png" id="50" name="Picture"/>
+                    <pic:cNvPr descr="../research/results/visualizations/public/F0_hero.png" id="56" name="Picture"/>
                     <pic:cNvPicPr>
                       <a:picLocks noChangeArrowheads="1" noChangeAspect="1"/>
                     </pic:cNvPicPr>
                   </pic:nvPicPr>
                   <pic:blipFill>
-                    <a:blip r:embed="rId48"/>
+                    <a:blip r:embed="rId54"/>
                     <a:stretch>
                       <a:fillRect/>
                     </a:stretch>
@@ -5157,7 +6417,7 @@
         </w:drawing>
       </w:r>
     </w:p>
-    <w:bookmarkStart w:id="51" w:name="tab:summary"/>
+    <w:bookmarkStart w:id="57" w:name="tab:summary"/>
     <w:p>
       <w:pPr>
         <w:pStyle w:val="TableCaption"/>
@@ -5574,9 +6834,9 @@
         </w:tc>
       </w:tr>
     </w:tbl>
-    <w:bookmarkEnd w:id="51"/>
-    <w:bookmarkEnd w:id="52"/>
-    <w:bookmarkStart w:id="54" w:name="trained-3dgs-representation-check"/>
+    <w:bookmarkEnd w:id="57"/>
+    <w:bookmarkEnd w:id="58"/>
+    <w:bookmarkStart w:id="60" w:name="trained-3dgs-representation-check"/>
     <w:p>
       <w:pPr>
         <w:pStyle w:val="Heading2"/>
@@ -5653,7 +6913,7 @@
         <w:t xml:space="preserve">. Thus the selected update can be highly local while discovery remains essentially global. We treat this as the principal systems limitation of the frozen end-to-end implementation.</w:t>
       </w:r>
     </w:p>
-    <w:bookmarkStart w:id="53" w:name="tab:trained"/>
+    <w:bookmarkStart w:id="59" w:name="tab:trained"/>
     <w:p>
       <w:pPr>
         <w:pStyle w:val="TableCaption"/>
@@ -5815,9 +7075,9 @@
         </w:tc>
       </w:tr>
     </w:tbl>
-    <w:bookmarkEnd w:id="53"/>
-    <w:bookmarkEnd w:id="54"/>
-    <w:bookmarkStart w:id="55" w:name="sparse-candidate-discovery"/>
+    <w:bookmarkEnd w:id="59"/>
+    <w:bookmarkEnd w:id="60"/>
+    <w:bookmarkStart w:id="61" w:name="sparse-candidate-discovery"/>
     <w:p>
       <w:pPr>
         <w:pStyle w:val="Heading2"/>
@@ -5912,8 +7172,8 @@
         <w:br/>
       </w:r>
     </w:p>
-    <w:bookmarkEnd w:id="55"/>
-    <w:bookmarkStart w:id="56" w:name="empirical-scheduling-and-ablations"/>
+    <w:bookmarkEnd w:id="61"/>
+    <w:bookmarkStart w:id="62" w:name="empirical-scheduling-and-ablations"/>
     <w:p>
       <w:pPr>
         <w:pStyle w:val="Heading2"/>
@@ -5935,12 +7195,244 @@
         <w:pStyle w:val="BodyText"/>
       </w:pPr>
       <w:r>
-        <w:t xml:space="preserve">Several real-matrix structural ablations are also non-discriminative. We do not reinterpret those neutral outcomes as support for component necessity. The deterministic mechanism-isolation suite is used only to show that each v1 mechanism has a constructed falsifying stress case. In particular, disabling fallback or substituting an overly global bound produces the expected failure or rebuild behavior in stress cases, while the real campaign remains the source for observed effect size.</w:t>
-      </w:r>
-    </w:p>
-    <w:bookmarkEnd w:id="56"/>
-    <w:bookmarkEnd w:id="57"/>
-    <w:bookmarkStart w:id="68" w:name="discussion"/>
+        <w:t xml:space="preserve">Table </w:t>
+      </w:r>
+      <w:hyperlink w:anchor="tab:ablations">
+        <w:r>
+          <w:rPr>
+            <w:rStyle w:val="Hyperlink"/>
+          </w:rPr>
+          <w:t xml:space="preserve">[tab:ablations]</w:t>
+        </w:r>
+      </w:hyperlink>
+      <w:r>
+        <w:t xml:space="preserve"> </w:t>
+      </w:r>
+      <w:r>
+        <w:t xml:space="preserve">makes the real-matrix ablation behavior explicit. Five structural/analytic ablations are neutral on these 60 cases. The global-norm-tail replacement remains certificate-safe but collapses to</w:t>
+      </w:r>
+      <w:r>
+        <w:t xml:space="preserve"> </w:t>
+      </w:r>
+      <w:r>
+        <w:rPr>
+          <w:smallCaps/>
+        </w:rPr>
+        <w:t xml:space="preserve">Full</w:t>
+      </w:r>
+      <w:r>
+        <w:t xml:space="preserve"> </w:t>
+      </w:r>
+      <w:r>
+        <w:t xml:space="preserve">on every case. Removing fallback has the opposite failure mode: it never selects</w:t>
+      </w:r>
+      <w:r>
+        <w:t xml:space="preserve"> </w:t>
+      </w:r>
+      <w:r>
+        <w:rPr>
+          <w:smallCaps/>
+        </w:rPr>
+        <w:t xml:space="preserve">Full</w:t>
+      </w:r>
+      <w:r>
+        <w:t xml:space="preserve"> </w:t>
+      </w:r>
+      <w:r>
+        <w:t xml:space="preserve">and only 26.7% of cases pass the certificate. The separately labeled mechanism-isolation suite contains seven deterministic synthetic stress cases, one for each v1 mechanism, and all seven separate in the expected safety/work direction. Those stress cases establish falsifiability of the mechanisms, not real-world effect size.</w:t>
+      </w:r>
+    </w:p>
+    <w:p>
+      <w:pPr>
+        <w:pStyle w:val="BodyText"/>
+      </w:pPr>
+      <w:r>
+        <w:t xml:space="preserve">lrrrY</w:t>
+      </w:r>
+      <w:r>
+        <w:t xml:space="preserve"> </w:t>
+      </w:r>
+      <w:r>
+        <w:t xml:space="preserve">Ablation &amp; Pass &amp;</w:t>
+      </w:r>
+      <w:r>
+        <w:t xml:space="preserve"> </w:t>
+      </w:r>
+      <w:r>
+        <w:rPr>
+          <w:smallCaps/>
+        </w:rPr>
+        <w:t xml:space="preserve">Full</w:t>
+      </w:r>
+      <w:r>
+        <w:t xml:space="preserve"> </w:t>
+      </w:r>
+      <w:r>
+        <w:t xml:space="preserve">rate &amp; Median native work/</w:t>
+      </w:r>
+      <w:r>
+        <w:rPr>
+          <w:smallCaps/>
+        </w:rPr>
+        <w:t xml:space="preserve">Full</w:t>
+      </w:r>
+      <w:r>
+        <w:t xml:space="preserve"> </w:t>
+      </w:r>
+      <w:r>
+        <w:t xml:space="preserve">&amp; Reading</w:t>
+      </w:r>
+      <w:r>
+        <w:br/>
+      </w:r>
+      <w:r>
+        <w:t xml:space="preserve">Remove predecessor closure &amp; 100.0% &amp; 26.7% &amp; 0.04736 &amp; neutral on real matrix; synthetic case exposes omitted required exact work</w:t>
+      </w:r>
+      <w:r>
+        <w:br/>
+      </w:r>
+      <w:r>
+        <w:t xml:space="preserve">Gaussian analytic</w:t>
+      </w:r>
+      <w:r>
+        <w:t xml:space="preserve"> </w:t>
+      </w:r>
+      <m:oMath>
+        <m:r>
+          <m:rPr>
+            <m:sty m:val="p"/>
+          </m:rPr>
+          <m:t>→</m:t>
+        </m:r>
+      </m:oMath>
+      <w:r>
+        <w:t xml:space="preserve"> </w:t>
+      </w:r>
+      <w:r>
+        <w:rPr>
+          <w:smallCaps/>
+        </w:rPr>
+        <w:t xml:space="preserve">Hard</w:t>
+      </w:r>
+      <w:r>
+        <w:t xml:space="preserve"> </w:t>
+      </w:r>
+      <w:r>
+        <w:t xml:space="preserve">&amp; 100.0% &amp; 26.7% &amp; 0.04736 &amp; neutral on real matrix; synthetic case increases required work or forces</w:t>
+      </w:r>
+      <w:r>
+        <w:t xml:space="preserve"> </w:t>
+      </w:r>
+      <w:r>
+        <w:rPr>
+          <w:smallCaps/>
+        </w:rPr>
+        <w:t xml:space="preserve">Full</w:t>
+      </w:r>
+      <w:r>
+        <w:br/>
+      </w:r>
+      <w:r>
+        <w:t xml:space="preserve">Temporal analytic</w:t>
+      </w:r>
+      <w:r>
+        <w:t xml:space="preserve"> </w:t>
+      </w:r>
+      <m:oMath>
+        <m:r>
+          <m:rPr>
+            <m:sty m:val="p"/>
+          </m:rPr>
+          <m:t>→</m:t>
+        </m:r>
+      </m:oMath>
+      <w:r>
+        <w:t xml:space="preserve"> </w:t>
+      </w:r>
+      <w:r>
+        <w:rPr>
+          <w:smallCaps/>
+        </w:rPr>
+        <w:t xml:space="preserve">Hard</w:t>
+      </w:r>
+      <w:r>
+        <w:t xml:space="preserve"> </w:t>
+      </w:r>
+      <w:r>
+        <w:t xml:space="preserve">&amp; 100.0% &amp; 26.7% &amp; 0.04736 &amp; neutral on real matrix; synthetic case increases required work or forces</w:t>
+      </w:r>
+      <w:r>
+        <w:t xml:space="preserve"> </w:t>
+      </w:r>
+      <w:r>
+        <w:rPr>
+          <w:smallCaps/>
+        </w:rPr>
+        <w:t xml:space="preserve">Full</w:t>
+      </w:r>
+      <w:r>
+        <w:br/>
+      </w:r>
+      <w:r>
+        <w:t xml:space="preserve">Remove QoI specialization &amp; 100.0% &amp; 26.7% &amp; 0.04736 &amp; neutral on real matrix; synthetic case requires extra irrelevant work</w:t>
+      </w:r>
+      <w:r>
+        <w:br/>
+      </w:r>
+      <w:r>
+        <w:t xml:space="preserve">Collapse</w:t>
+      </w:r>
+      <w:r>
+        <w:t xml:space="preserve"> </w:t>
+      </w:r>
+      <w:r>
+        <w:rPr>
+          <w:smallCaps/>
+        </w:rPr>
+        <w:t xml:space="preserve">Hard</w:t>
+      </w:r>
+      <w:r>
+        <w:t xml:space="preserve">/</w:t>
+      </w:r>
+      <w:r>
+        <w:rPr>
+          <w:smallCaps/>
+        </w:rPr>
+        <w:t xml:space="preserve">Analytic</w:t>
+      </w:r>
+      <w:r>
+        <w:t xml:space="preserve"> </w:t>
+      </w:r>
+      <w:r>
+        <w:t xml:space="preserve">separation &amp; 100.0% &amp; 26.7% &amp; 0.04736 &amp; neutral on real matrix; synthetic case becomes more conservative</w:t>
+      </w:r>
+      <w:r>
+        <w:br/>
+      </w:r>
+      <w:r>
+        <w:t xml:space="preserve">Global-norm exterior tail &amp; 100.0% &amp; 100.0% &amp; 1.00000 &amp; safe but destroys locality on all 60 real cases</w:t>
+      </w:r>
+      <w:r>
+        <w:br/>
+      </w:r>
+      <w:r>
+        <w:t xml:space="preserve">Remove certified fallback &amp; 26.7% &amp; 0.0% &amp; 0.00000 &amp; 44/60 real cases fail certification; synthetic case leaves an unsafe candidate</w:t>
+      </w:r>
+      <w:r>
+        <w:br/>
+      </w:r>
+    </w:p>
+    <w:p>
+      <w:pPr>
+        <w:pStyle w:val="BodyText"/>
+      </w:pPr>
+      <w:r>
+        <w:t xml:space="preserve">The selected public residual is numerically zero in every frozen case at the reported precision, despite 56/60 source edits exceeding tolerance before repair. The real matrix therefore demonstrates selection/fallback correctness but does not estimate certificate tightness under non-zero accepted residual. We use the threshold-crossing mechanism-isolation cases only to show that the analytic machinery can change decisions when stressed; we do not present them as a substitute for real non-zero-residual evidence.</w:t>
+      </w:r>
+    </w:p>
+    <w:bookmarkEnd w:id="62"/>
+    <w:bookmarkEnd w:id="63"/>
+    <w:bookmarkStart w:id="74" w:name="discussion"/>
     <w:p>
       <w:pPr>
         <w:pStyle w:val="Heading1"/>
@@ -5949,7 +7441,7 @@
         <w:t xml:space="preserve">Discussion</w:t>
       </w:r>
     </w:p>
-    <w:bookmarkStart w:id="58" w:name="what-the-evidence-establishes"/>
+    <w:bookmarkStart w:id="64" w:name="what-the-evidence-establishes"/>
     <w:p>
       <w:pPr>
         <w:pStyle w:val="Heading2"/>
@@ -6045,8 +7537,8 @@
         <w:t xml:space="preserve">frequently; that is a cost of the safety contract, not a correctness failure.</w:t>
       </w:r>
     </w:p>
-    <w:bookmarkEnd w:id="58"/>
-    <w:bookmarkStart w:id="66" w:name="limitations"/>
+    <w:bookmarkEnd w:id="64"/>
+    <w:bookmarkStart w:id="72" w:name="limitations"/>
     <w:p>
       <w:pPr>
         <w:pStyle w:val="Heading2"/>
@@ -6055,7 +7547,7 @@
         <w:t xml:space="preserve">Limitations</w:t>
       </w:r>
     </w:p>
-    <w:bookmarkStart w:id="59" w:name="Xcf4b20d05c24d38c4491abb41d60bcddc821aa6"/>
+    <w:bookmarkStart w:id="65" w:name="Xcf4b20d05c24d38c4491abb41d60bcddc821aa6"/>
     <w:p>
       <w:pPr>
         <w:pStyle w:val="Heading4"/>
@@ -6102,8 +7594,8 @@
         <w:t xml:space="preserve">edge must be a finite-change upper bound over the declared revision domain. A representation, shader, temporal rule, or ownership change can invalidate previously calibrated metadata. Certificates therefore require versioned bound provenance and regression tests.</w:t>
       </w:r>
     </w:p>
-    <w:bookmarkEnd w:id="59"/>
-    <w:bookmarkStart w:id="60" w:name="Xa3dde70f84380da52be1ceb2ef858411be22e0e"/>
+    <w:bookmarkEnd w:id="65"/>
+    <w:bookmarkStart w:id="66" w:name="Xa3dde70f84380da52be1ceb2ef858411be22e0e"/>
     <w:p>
       <w:pPr>
         <w:pStyle w:val="Heading4"/>
@@ -6120,8 +7612,8 @@
         <w:t xml:space="preserve">The most direct implementation limitation is the near-full Gaussian inspection ratio. Sparse discovery shows that exact selection can be achieved with far fewer inspections, but integration into the complete measured pipeline remains future engineering. This limitation prevents interpreting the current local update ratios as end-to-end complexity reduction across all phases.</w:t>
       </w:r>
     </w:p>
-    <w:bookmarkEnd w:id="60"/>
-    <w:bookmarkStart w:id="61" w:name="no-wall-clock-speedup-claim."/>
+    <w:bookmarkEnd w:id="66"/>
+    <w:bookmarkStart w:id="67" w:name="no-wall-clock-speedup-claim."/>
     <w:p>
       <w:pPr>
         <w:pStyle w:val="Heading4"/>
@@ -6166,8 +7658,8 @@
         <w:t xml:space="preserve">trained figure is native temporal/output work reduction. Neither is a paired local-versus-full runtime speedup. A future evaluation should perform matched end-to-end timing under identical execution conditions after sparse discovery is integrated.</w:t>
       </w:r>
     </w:p>
-    <w:bookmarkEnd w:id="61"/>
-    <w:bookmarkStart w:id="62" w:name="greedy-search-is-not-globally-optimal."/>
+    <w:bookmarkEnd w:id="67"/>
+    <w:bookmarkStart w:id="68" w:name="greedy-search-is-not-globally-optimal."/>
     <w:p>
       <w:pPr>
         <w:pStyle w:val="Heading4"/>
@@ -6198,8 +7690,8 @@
         <w:t xml:space="preserve">constructs a certified feasible cone but does not prove that no cheaper safe cone exists. Global combinatorial minimum-work optimization is outside the v1 claim.</w:t>
       </w:r>
     </w:p>
-    <w:bookmarkEnd w:id="62"/>
-    <w:bookmarkStart w:id="63" w:name="analytic-cycles-fail-closed."/>
+    <w:bookmarkEnd w:id="68"/>
+    <w:bookmarkStart w:id="69" w:name="analytic-cycles-fail-closed."/>
     <w:p>
       <w:pPr>
         <w:pStyle w:val="Heading4"/>
@@ -6228,8 +7720,8 @@
         <w:t xml:space="preserve">. General cyclic certification is future work.</w:t>
       </w:r>
     </w:p>
-    <w:bookmarkEnd w:id="63"/>
-    <w:bookmarkStart w:id="64" w:name="representation-and-dataset-scope."/>
+    <w:bookmarkEnd w:id="69"/>
+    <w:bookmarkStart w:id="70" w:name="representation-and-dataset-scope."/>
     <w:p>
       <w:pPr>
         <w:pStyle w:val="Heading4"/>
@@ -6246,8 +7738,8 @@
         <w:t xml:space="preserve">The primary public campaign uses normalized RGB/SfM reconstructions seeded into Gaussian fields rather than trained photorealistic 3DGS, and it is not a metric-scale reconstruction benchmark. The trained-3DGS experiment is a secondary representation check with only five revisions. Broader trained-scene evaluation would strengthen generality.</w:t>
       </w:r>
     </w:p>
-    <w:bookmarkEnd w:id="64"/>
-    <w:bookmarkStart w:id="65" w:name="ablation-identifiability."/>
+    <w:bookmarkEnd w:id="70"/>
+    <w:bookmarkStart w:id="71" w:name="ablation-identifiability."/>
     <w:p>
       <w:pPr>
         <w:pStyle w:val="Heading4"/>
@@ -6264,9 +7756,9 @@
         <w:t xml:space="preserve">Not every mechanism separates on the frozen real matrix. The paper therefore distinguishes real-workload evidence from synthetic mechanism isolation and does not claim that each mechanism contributes measurable benefit in every scene.</w:t>
       </w:r>
     </w:p>
-    <w:bookmarkEnd w:id="65"/>
-    <w:bookmarkEnd w:id="66"/>
-    <w:bookmarkStart w:id="67" w:name="implications"/>
+    <w:bookmarkEnd w:id="71"/>
+    <w:bookmarkEnd w:id="72"/>
+    <w:bookmarkStart w:id="73" w:name="implications"/>
     <w:p>
       <w:pPr>
         <w:pStyle w:val="Heading2"/>
@@ -6291,9 +7783,9 @@
         <w:t xml:space="preserve">The framework also makes failure scientifically useful. A certificate violation is not averaged into a quality metric; it is retained as a regression target with the revision manifest, graph version, chosen cone, emitted bound, full-reference output, and first violated invariant. This treatment aligns performance evaluation with the correctness burden created by selective recomputation.</w:t>
       </w:r>
     </w:p>
-    <w:bookmarkEnd w:id="67"/>
-    <w:bookmarkEnd w:id="68"/>
-    <w:bookmarkStart w:id="69" w:name="reproducibility-and-artifact-scope"/>
+    <w:bookmarkEnd w:id="73"/>
+    <w:bookmarkEnd w:id="74"/>
+    <w:bookmarkStart w:id="75" w:name="reproducibility-and-artifact-scope"/>
     <w:p>
       <w:pPr>
         <w:pStyle w:val="Heading1"/>
@@ -6318,8 +7810,8 @@
         <w:t xml:space="preserve">Scene-bearing figures retain the applicable upstream dataset or model terms. Original software is licensed under Apache-2.0, original research communication is scoped under CC BY 4.0, and third-party rights are recorded separately. For double-blind review, the identifiable public repository and author metadata should be replaced by an anonymized frozen supplement consistent with the target venue’s policy.</w:t>
       </w:r>
     </w:p>
-    <w:bookmarkEnd w:id="69"/>
-    <w:bookmarkStart w:id="101" w:name="conclusion"/>
+    <w:bookmarkEnd w:id="75"/>
+    <w:bookmarkStart w:id="115" w:name="conclusion"/>
     <w:p>
       <w:pPr>
         <w:pStyle w:val="Heading1"/>
@@ -6333,11 +7825,57 @@
         <w:pStyle w:val="FirstParagraph"/>
       </w:pPr>
       <w:r>
-        <w:t xml:space="preserve">We presented Criticality-Bounded Revision Cones, a fail-closed method for selective recomputation in persistent captured worlds. CBRC separates exact dependencies from conservative finite-change influence, binds the unrepaired exterior to explicit output tolerances, compares regional work against a full baseline, and independently replays every selected result against a full-after oracle. The frozen public and trained-representation campaigns show that local repair and full fallback can coexist under one auditable contract, while also exposing a near-global discovery bottleneck and the absence of a current wall-clock speedup claim. The central principle is simple: a persistent world should repair locally only when it can justify what it leaves untouched; otherwise it should rebuild.</w:t>
-      </w:r>
-    </w:p>
-    <w:bookmarkStart w:id="100" w:name="refs"/>
-    <w:bookmarkStart w:id="70" w:name="ref-ackermann2025clsplats"/>
+        <w:t xml:space="preserve">We presented Criticality-Bounded Revision Cones, where criticality is the worst normalized certificate-to-tolerance ratio for the protected outputs, as a fail-closed method for selective recomputation in persistent captured worlds. CBRC separates exact dependencies from conservative finite-change influence, binds the unrepaired exterior to explicit output tolerances, compares regional work against a full baseline, and independently replays every selected result against a full-after oracle. The frozen public and trained-representation campaigns show that local repair and full fallback can coexist under one auditable contract, while also exposing a near-global discovery bottleneck and the absence of a current wall-clock speedup claim. The central principle is simple: a persistent world should repair locally only when it can justify what it leaves untouched; otherwise it should rebuild.</w:t>
+      </w:r>
+    </w:p>
+    <w:bookmarkStart w:id="114" w:name="refs"/>
+    <w:bookmarkStart w:id="77" w:name="ref-acar2013selfadjusting"/>
+    <w:p>
+      <w:pPr>
+        <w:pStyle w:val="Bibliography"/>
+      </w:pPr>
+      <w:r>
+        <w:t xml:space="preserve">Acar, Umut A., Matthias Blume, and Jacob Donham. 2013.</w:t>
+      </w:r>
+      <w:r>
+        <w:t xml:space="preserve"> </w:t>
+      </w:r>
+      <w:r>
+        <w:t xml:space="preserve">“A Consistent Semantics of Self-Adjusting Computation.”</w:t>
+      </w:r>
+      <w:r>
+        <w:t xml:space="preserve"> </w:t>
+      </w:r>
+      <w:r>
+        <w:rPr>
+          <w:iCs/>
+          <w:i/>
+        </w:rPr>
+        <w:t xml:space="preserve">Journal of Functional Programming</w:t>
+      </w:r>
+      <w:r>
+        <w:t xml:space="preserve"> </w:t>
+      </w:r>
+      <w:r>
+        <w:t xml:space="preserve">23 (3): 249–92.</w:t>
+      </w:r>
+      <w:r>
+        <w:t xml:space="preserve"> </w:t>
+      </w:r>
+      <w:hyperlink r:id="rId76">
+        <w:r>
+          <w:rPr>
+            <w:rStyle w:val="Hyperlink"/>
+          </w:rPr>
+          <w:t xml:space="preserve">https://doi.org/10.1017/S0956796813000099</w:t>
+        </w:r>
+      </w:hyperlink>
+      <w:r>
+        <w:t xml:space="preserve">.</w:t>
+      </w:r>
+    </w:p>
+    <w:bookmarkEnd w:id="77"/>
+    <w:bookmarkStart w:id="78" w:name="ref-ackermann2025clsplats"/>
     <w:p>
       <w:pPr>
         <w:pStyle w:val="Bibliography"/>
@@ -6371,8 +7909,57 @@
         <w:t xml:space="preserve">, 7808–17.</w:t>
       </w:r>
     </w:p>
-    <w:bookmarkEnd w:id="70"/>
-    <w:bookmarkStart w:id="72" w:name="ref-chen2024gaussianeditor"/>
+    <w:bookmarkEnd w:id="78"/>
+    <w:bookmarkStart w:id="80" w:name="ref-bala1999raysegment"/>
+    <w:p>
+      <w:pPr>
+        <w:pStyle w:val="Bibliography"/>
+      </w:pPr>
+      <w:r>
+        <w:t xml:space="preserve">Bala, Kavita, Julie Dorsey, and Seth Teller. 1999.</w:t>
+      </w:r>
+      <w:r>
+        <w:t xml:space="preserve"> </w:t>
+      </w:r>
+      <w:r>
+        <w:t xml:space="preserve">“Interactive Ray-Traced Scene Editing Using Ray Segment Trees.”</w:t>
+      </w:r>
+      <w:r>
+        <w:t xml:space="preserve"> </w:t>
+      </w:r>
+      <w:r>
+        <w:t xml:space="preserve">In</w:t>
+      </w:r>
+      <w:r>
+        <w:t xml:space="preserve"> </w:t>
+      </w:r>
+      <w:r>
+        <w:rPr>
+          <w:iCs/>
+          <w:i/>
+        </w:rPr>
+        <w:t xml:space="preserve">Eurographics Workshop on Rendering</w:t>
+      </w:r>
+      <w:r>
+        <w:t xml:space="preserve">, 31–44.</w:t>
+      </w:r>
+      <w:r>
+        <w:t xml:space="preserve"> </w:t>
+      </w:r>
+      <w:hyperlink r:id="rId79">
+        <w:r>
+          <w:rPr>
+            <w:rStyle w:val="Hyperlink"/>
+          </w:rPr>
+          <w:t xml:space="preserve">https://doi.org/10.2312/EGWR/EGWR99/031-044</w:t>
+        </w:r>
+      </w:hyperlink>
+      <w:r>
+        <w:t xml:space="preserve">.</w:t>
+      </w:r>
+    </w:p>
+    <w:bookmarkEnd w:id="80"/>
+    <w:bookmarkStart w:id="82" w:name="ref-chen2024gaussianeditor"/>
     <w:p>
       <w:pPr>
         <w:pStyle w:val="Bibliography"/>
@@ -6408,7 +7995,7 @@
       <w:r>
         <w:t xml:space="preserve"> </w:t>
       </w:r>
-      <w:hyperlink r:id="rId71">
+      <w:hyperlink r:id="rId81">
         <w:r>
           <w:rPr>
             <w:rStyle w:val="Hyperlink"/>
@@ -6420,8 +8007,8 @@
         <w:t xml:space="preserve">.</w:t>
       </w:r>
     </w:p>
-    <w:bookmarkEnd w:id="72"/>
-    <w:bookmarkStart w:id="73" w:name="ref-curless1996volumetric"/>
+    <w:bookmarkEnd w:id="82"/>
+    <w:bookmarkStart w:id="83" w:name="ref-curless1996volumetric"/>
     <w:p>
       <w:pPr>
         <w:pStyle w:val="Bibliography"/>
@@ -6455,8 +8042,8 @@
         <w:t xml:space="preserve">, 303–12.</w:t>
       </w:r>
     </w:p>
-    <w:bookmarkEnd w:id="73"/>
-    <w:bookmarkStart w:id="74" w:name="ref-dai2017bundlefusion"/>
+    <w:bookmarkEnd w:id="83"/>
+    <w:bookmarkStart w:id="84" w:name="ref-dai2017bundlefusion"/>
     <w:p>
       <w:pPr>
         <w:pStyle w:val="Bibliography"/>
@@ -6487,8 +8074,8 @@
         <w:t xml:space="preserve">36 (4): 76:1–18.</w:t>
       </w:r>
     </w:p>
-    <w:bookmarkEnd w:id="74"/>
-    <w:bookmarkStart w:id="75" w:name="ref-ellensohn2026eligsir"/>
+    <w:bookmarkEnd w:id="84"/>
+    <w:bookmarkStart w:id="85" w:name="ref-ellensohn2026eligsir"/>
     <w:p>
       <w:pPr>
         <w:pStyle w:val="Bibliography"/>
@@ -6516,8 +8103,8 @@
         <w:t xml:space="preserve">.</w:t>
       </w:r>
     </w:p>
-    <w:bookmarkEnd w:id="75"/>
-    <w:bookmarkStart w:id="76" w:name="ref-galappaththige2026pixels"/>
+    <w:bookmarkEnd w:id="85"/>
+    <w:bookmarkStart w:id="86" w:name="ref-galappaththige2026pixels"/>
     <w:p>
       <w:pPr>
         <w:pStyle w:val="Bibliography"/>
@@ -6545,8 +8132,8 @@
         <w:t xml:space="preserve">.</w:t>
       </w:r>
     </w:p>
-    <w:bookmarkEnd w:id="76"/>
-    <w:bookmarkStart w:id="78" w:name="ref-huang2024scgs"/>
+    <w:bookmarkEnd w:id="86"/>
+    <w:bookmarkStart w:id="88" w:name="ref-huang2024scgs"/>
     <w:p>
       <w:pPr>
         <w:pStyle w:val="Bibliography"/>
@@ -6582,7 +8169,7 @@
       <w:r>
         <w:t xml:space="preserve"> </w:t>
       </w:r>
-      <w:hyperlink r:id="rId77">
+      <w:hyperlink r:id="rId87">
         <w:r>
           <w:rPr>
             <w:rStyle w:val="Hyperlink"/>
@@ -6594,8 +8181,8 @@
         <w:t xml:space="preserve">.</w:t>
       </w:r>
     </w:p>
-    <w:bookmarkEnd w:id="78"/>
-    <w:bookmarkStart w:id="79" w:name="ref-keetha2024splatam"/>
+    <w:bookmarkEnd w:id="88"/>
+    <w:bookmarkStart w:id="89" w:name="ref-keetha2024splatam"/>
     <w:p>
       <w:pPr>
         <w:pStyle w:val="Bibliography"/>
@@ -6629,8 +8216,8 @@
         <w:t xml:space="preserve">, 21357–66.</w:t>
       </w:r>
     </w:p>
-    <w:bookmarkEnd w:id="79"/>
-    <w:bookmarkStart w:id="81" w:name="ref-kerbl2023gaussians"/>
+    <w:bookmarkEnd w:id="89"/>
+    <w:bookmarkStart w:id="91" w:name="ref-kerbl2023gaussians"/>
     <w:p>
       <w:pPr>
         <w:pStyle w:val="Bibliography"/>
@@ -6663,7 +8250,7 @@
       <w:r>
         <w:t xml:space="preserve"> </w:t>
       </w:r>
-      <w:hyperlink r:id="rId80">
+      <w:hyperlink r:id="rId90">
         <w:r>
           <w:rPr>
             <w:rStyle w:val="Hyperlink"/>
@@ -6675,8 +8262,8 @@
         <w:t xml:space="preserve">.</w:t>
       </w:r>
     </w:p>
-    <w:bookmarkEnd w:id="81"/>
-    <w:bookmarkStart w:id="83" w:name="ref-luiten2024dynamic3dgaussians"/>
+    <w:bookmarkEnd w:id="91"/>
+    <w:bookmarkStart w:id="93" w:name="ref-luiten2024dynamic3dgaussians"/>
     <w:p>
       <w:pPr>
         <w:pStyle w:val="Bibliography"/>
@@ -6712,7 +8299,7 @@
       <w:r>
         <w:t xml:space="preserve"> </w:t>
       </w:r>
-      <w:hyperlink r:id="rId82">
+      <w:hyperlink r:id="rId92">
         <w:r>
           <w:rPr>
             <w:rStyle w:val="Hyperlink"/>
@@ -6724,8 +8311,8 @@
         <w:t xml:space="preserve">.</w:t>
       </w:r>
     </w:p>
-    <w:bookmarkEnd w:id="83"/>
-    <w:bookmarkStart w:id="85" w:name="ref-matsuki2024monogs"/>
+    <w:bookmarkEnd w:id="93"/>
+    <w:bookmarkStart w:id="95" w:name="ref-matsuki2024monogs"/>
     <w:p>
       <w:pPr>
         <w:pStyle w:val="Bibliography"/>
@@ -6761,7 +8348,7 @@
       <w:r>
         <w:t xml:space="preserve"> </w:t>
       </w:r>
-      <w:hyperlink r:id="rId84">
+      <w:hyperlink r:id="rId94">
         <w:r>
           <w:rPr>
             <w:rStyle w:val="Hyperlink"/>
@@ -6773,8 +8360,8 @@
         <w:t xml:space="preserve">.</w:t>
       </w:r>
     </w:p>
-    <w:bookmarkEnd w:id="85"/>
-    <w:bookmarkStart w:id="86" w:name="ref-mildenhall2020nerf"/>
+    <w:bookmarkEnd w:id="95"/>
+    <w:bookmarkStart w:id="96" w:name="ref-mildenhall2020nerf"/>
     <w:p>
       <w:pPr>
         <w:pStyle w:val="Bibliography"/>
@@ -6808,8 +8395,8 @@
         <w:t xml:space="preserve">, 405–21.</w:t>
       </w:r>
     </w:p>
-    <w:bookmarkEnd w:id="86"/>
-    <w:bookmarkStart w:id="87" w:name="ref-newcombe2011kinectfusion"/>
+    <w:bookmarkEnd w:id="96"/>
+    <w:bookmarkStart w:id="97" w:name="ref-newcombe2011kinectfusion"/>
     <w:p>
       <w:pPr>
         <w:pStyle w:val="Bibliography"/>
@@ -6843,8 +8430,54 @@
         <w:t xml:space="preserve">, 127–36.</w:t>
       </w:r>
     </w:p>
-    <w:bookmarkEnd w:id="87"/>
-    <w:bookmarkStart w:id="89" w:name="ref-pfister2000surfels"/>
+    <w:bookmarkEnd w:id="97"/>
+    <w:bookmarkStart w:id="99" w:name="ref-oden2001goal"/>
+    <w:p>
+      <w:pPr>
+        <w:pStyle w:val="Bibliography"/>
+      </w:pPr>
+      <w:r>
+        <w:t xml:space="preserve">Oden, J. Tinsley, and Serge Prudhomme. 2001.</w:t>
+      </w:r>
+      <w:r>
+        <w:t xml:space="preserve"> </w:t>
+      </w:r>
+      <w:r>
+        <w:t xml:space="preserve">“Goal-Oriented Error Estimation and Adaptivity for the Finite Element Method.”</w:t>
+      </w:r>
+      <w:r>
+        <w:t xml:space="preserve"> </w:t>
+      </w:r>
+      <w:r>
+        <w:rPr>
+          <w:iCs/>
+          <w:i/>
+        </w:rPr>
+        <w:t xml:space="preserve">Computers &amp; Mathematics with Applications</w:t>
+      </w:r>
+      <w:r>
+        <w:t xml:space="preserve"> </w:t>
+      </w:r>
+      <w:r>
+        <w:t xml:space="preserve">41 (5–6): 735–56.</w:t>
+      </w:r>
+      <w:r>
+        <w:t xml:space="preserve"> </w:t>
+      </w:r>
+      <w:hyperlink r:id="rId98">
+        <w:r>
+          <w:rPr>
+            <w:rStyle w:val="Hyperlink"/>
+          </w:rPr>
+          <w:t xml:space="preserve">https://doi.org/10.1016/S0898-1221(00)00317-5</w:t>
+        </w:r>
+      </w:hyperlink>
+      <w:r>
+        <w:t xml:space="preserve">.</w:t>
+      </w:r>
+    </w:p>
+    <w:bookmarkEnd w:id="99"/>
+    <w:bookmarkStart w:id="101" w:name="ref-pfister2000surfels"/>
     <w:p>
       <w:pPr>
         <w:pStyle w:val="Bibliography"/>
@@ -6880,7 +8513,7 @@
       <w:r>
         <w:t xml:space="preserve"> </w:t>
       </w:r>
-      <w:hyperlink r:id="rId88">
+      <w:hyperlink r:id="rId100">
         <w:r>
           <w:rPr>
             <w:rStyle w:val="Hyperlink"/>
@@ -6892,8 +8525,8 @@
         <w:t xml:space="preserve">.</w:t>
       </w:r>
     </w:p>
-    <w:bookmarkEnd w:id="89"/>
-    <w:bookmarkStart w:id="91" w:name="ref-sucar2021imap"/>
+    <w:bookmarkEnd w:id="101"/>
+    <w:bookmarkStart w:id="103" w:name="ref-sucar2021imap"/>
     <w:p>
       <w:pPr>
         <w:pStyle w:val="Bibliography"/>
@@ -6929,7 +8562,7 @@
       <w:r>
         <w:t xml:space="preserve"> </w:t>
       </w:r>
-      <w:hyperlink r:id="rId90">
+      <w:hyperlink r:id="rId102">
         <w:r>
           <w:rPr>
             <w:rStyle w:val="Hyperlink"/>
@@ -6941,8 +8574,8 @@
         <w:t xml:space="preserve">.</w:t>
       </w:r>
     </w:p>
-    <w:bookmarkEnd w:id="91"/>
-    <w:bookmarkStart w:id="92" w:name="ref-whelan2015elasticfusion"/>
+    <w:bookmarkEnd w:id="103"/>
+    <w:bookmarkStart w:id="104" w:name="ref-whelan2015elasticfusion"/>
     <w:p>
       <w:pPr>
         <w:pStyle w:val="Bibliography"/>
@@ -6976,8 +8609,57 @@
         <w:t xml:space="preserve">.</w:t>
       </w:r>
     </w:p>
-    <w:bookmarkEnd w:id="92"/>
-    <w:bookmarkStart w:id="94" w:name="ref-wu2024fourDGS"/>
+    <w:bookmarkEnd w:id="104"/>
+    <w:bookmarkStart w:id="106" w:name="ref-woerister2013lazy"/>
+    <w:p>
+      <w:pPr>
+        <w:pStyle w:val="Bibliography"/>
+      </w:pPr>
+      <w:r>
+        <w:t xml:space="preserve">Wörister, Michael, Harald Steinlechner, Stefan Maierhofer, and Robert F. Tobler. 2013.</w:t>
+      </w:r>
+      <w:r>
+        <w:t xml:space="preserve"> </w:t>
+      </w:r>
+      <w:r>
+        <w:t xml:space="preserve">“Lazy Incremental Computation for Efficient Scene Graph Rendering.”</w:t>
+      </w:r>
+      <w:r>
+        <w:t xml:space="preserve"> </w:t>
+      </w:r>
+      <w:r>
+        <w:t xml:space="preserve">In</w:t>
+      </w:r>
+      <w:r>
+        <w:t xml:space="preserve"> </w:t>
+      </w:r>
+      <w:r>
+        <w:rPr>
+          <w:iCs/>
+          <w:i/>
+        </w:rPr>
+        <w:t xml:space="preserve">Eurographics/ACM SIGGRAPH Symposium on High Performance Graphics</w:t>
+      </w:r>
+      <w:r>
+        <w:t xml:space="preserve">, 53–62.</w:t>
+      </w:r>
+      <w:r>
+        <w:t xml:space="preserve"> </w:t>
+      </w:r>
+      <w:hyperlink r:id="rId105">
+        <w:r>
+          <w:rPr>
+            <w:rStyle w:val="Hyperlink"/>
+          </w:rPr>
+          <w:t xml:space="preserve">https://doi.org/10.1145/2492045.2492051</w:t>
+        </w:r>
+      </w:hyperlink>
+      <w:r>
+        <w:t xml:space="preserve">.</w:t>
+      </w:r>
+    </w:p>
+    <w:bookmarkEnd w:id="106"/>
+    <w:bookmarkStart w:id="108" w:name="ref-wu2024fourDGS"/>
     <w:p>
       <w:pPr>
         <w:pStyle w:val="Bibliography"/>
@@ -7013,7 +8695,7 @@
       <w:r>
         <w:t xml:space="preserve"> </w:t>
       </w:r>
-      <w:hyperlink r:id="rId93">
+      <w:hyperlink r:id="rId107">
         <w:r>
           <w:rPr>
             <w:rStyle w:val="Hyperlink"/>
@@ -7025,8 +8707,8 @@
         <w:t xml:space="preserve">.</w:t>
       </w:r>
     </w:p>
-    <w:bookmarkEnd w:id="94"/>
-    <w:bookmarkStart w:id="95" w:name="ref-wu2026cif"/>
+    <w:bookmarkEnd w:id="108"/>
+    <w:bookmarkStart w:id="109" w:name="ref-wu2026cif"/>
     <w:p>
       <w:pPr>
         <w:pStyle w:val="Bibliography"/>
@@ -7060,8 +8742,8 @@
         <w:t xml:space="preserve">, 3783–93.</w:t>
       </w:r>
     </w:p>
-    <w:bookmarkEnd w:id="95"/>
-    <w:bookmarkStart w:id="96" w:name="ref-yugay2026game"/>
+    <w:bookmarkEnd w:id="109"/>
+    <w:bookmarkStart w:id="110" w:name="ref-yugay2026game"/>
     <w:p>
       <w:pPr>
         <w:pStyle w:val="Bibliography"/>
@@ -7095,8 +8777,8 @@
         <w:t xml:space="preserve">, 18903–12.</w:t>
       </w:r>
     </w:p>
-    <w:bookmarkEnd w:id="96"/>
-    <w:bookmarkStart w:id="98" w:name="ref-zeng2025gaussianupdate"/>
+    <w:bookmarkEnd w:id="110"/>
+    <w:bookmarkStart w:id="112" w:name="ref-zeng2025gaussianupdate"/>
     <w:p>
       <w:pPr>
         <w:pStyle w:val="Bibliography"/>
@@ -7132,7 +8814,7 @@
       <w:r>
         <w:t xml:space="preserve"> </w:t>
       </w:r>
-      <w:hyperlink r:id="rId97">
+      <w:hyperlink r:id="rId111">
         <w:r>
           <w:rPr>
             <w:rStyle w:val="Hyperlink"/>
@@ -7144,8 +8826,8 @@
         <w:t xml:space="preserve">.</w:t>
       </w:r>
     </w:p>
-    <w:bookmarkEnd w:id="98"/>
-    <w:bookmarkStart w:id="99" w:name="ref-zhu2022niceslam"/>
+    <w:bookmarkEnd w:id="112"/>
+    <w:bookmarkStart w:id="113" w:name="ref-zhu2022niceslam"/>
     <w:p>
       <w:pPr>
         <w:pStyle w:val="Bibliography"/>
@@ -7179,9 +8861,9 @@
         <w:t xml:space="preserve">, 12786–96.</w:t>
       </w:r>
     </w:p>
-    <w:bookmarkEnd w:id="99"/>
-    <w:bookmarkEnd w:id="100"/>
-    <w:bookmarkEnd w:id="101"/>
+    <w:bookmarkEnd w:id="113"/>
+    <w:bookmarkEnd w:id="114"/>
+    <w:bookmarkEnd w:id="115"/>
     <w:sectPr/>
   </w:body>
 </w:document>

</xml_diff>

<commit_message>
Rebuild final manuscripts with ACM AI disclosure
</commit_message>
<xml_diff>
--- a/researchpaper/MAVEB_manuscript.docx
+++ b/researchpaper/MAVEB_manuscript.docx
@@ -100,7 +100,7 @@
         <w:pStyle w:val="FirstParagraph"/>
       </w:pPr>
       <w:r>
-        <w:t xml:space="preserve">Persistent captured-world systems maintain more than a geometric model: they accumulate observations, reconstruction state, explicit surface and appearance representations, GPU-published records, and temporal rendering history. When the physical world changes locally, the corresponding computational revision need not be local, and a spatially restricted update can leave stale dependent state outside the edited region. Rebuilding all state avoids this risk but discards locality when most of the world cannot affect the output of interest.</w:t>
+        <w:t xml:space="preserve">Persistent captured-world systems rarely contain geometry alone. Over time they collect observations, reconstruction state, explicit surface and appearance data, GPU-published records, and temporal rendering history. A physical change can be small in space and still reach much farther through this computational state. Restricting the update too aggressively risks leaving stale dependencies behind; rebuilding everything avoids that problem, but also throws away locality even when most of the world has no bearing on the output we care about.</w:t>
       </w:r>
     </w:p>
     <w:p>
@@ -124,7 +124,7 @@
         <w:t xml:space="preserve"> </w:t>
       </w:r>
       <w:r>
-        <w:t xml:space="preserve">(CBRC), implemented in MAVEB, a fail-closed revision framework that selects regional recomputation only when the unrepaired exterior can be conservatively bounded for an explicit quantity of interest. CBRC combines exact predecessor closure for structural dependencies, conservative finite-change bounds for certifiable soft dependencies, a quantity-of-interest error contract, a frozen heterogeneous work model, and an automatic</w:t>
+        <w:t xml:space="preserve">(CBRC), implemented in MAVEB. The framework is fail-closed: regional recomputation is allowed only when the unrepaired exterior can be bounded for a stated quantity of interest. CBRC combines exact predecessor closure, conservative finite-change bounds where they are available, an explicit output-error contract, and a frozen work model; otherwise it returns</w:t>
       </w:r>
       <w:r>
         <w:t xml:space="preserve"> </w:t>
@@ -136,10 +136,7 @@
         <w:t xml:space="preserve">Full</w:t>
       </w:r>
       <w:r>
-        <w:t xml:space="preserve"> </w:t>
-      </w:r>
-      <w:r>
-        <w:t xml:space="preserve">fallback. Every selected result is replayed against an independent full-after reference; the experimental contract is measured full-reference error</w:t>
+        <w:t xml:space="preserve">. The selected result is replayed against an independent full-after reference, so we check measured error</w:t>
       </w:r>
       <w:r>
         <w:t xml:space="preserve"> </w:t>
@@ -173,7 +170,7 @@
         <w:t xml:space="preserve"> </w:t>
       </w:r>
       <w:r>
-        <w:t xml:space="preserve">declared tolerance.</w:t>
+        <w:t xml:space="preserve">declared tolerance rather than trusting the planner alone.</w:t>
       </w:r>
     </w:p>
     <w:p>
@@ -181,7 +178,7 @@
         <w:pStyle w:val="BodyText"/>
       </w:pPr>
       <w:r>
-        <w:t xml:space="preserve">In a frozen public campaign of 60 revisions across four RGB/SfM scenes, CBRC selected 44 certified-local repairs and 16 automatic full rebuilds, with zero observed certificate violations and native/reference-planner parity on all 60 cases. Fifty-six of the 60 source edits exceeded the protected RGB tolerance before repair. The frozen calibrated work model reports a median selected work ratio of 0.36953 of</w:t>
+        <w:t xml:space="preserve">On the frozen public campaign of 60 revisions over four RGB/SfM scenes, CBRC chose 44 certified-local repairs and 16 full rebuilds. We observed no certificate violation, and the native and reference planners agreed in every case. Fifty-six source edits were already above the protected RGB tolerance before repair. The calibrated work model gives a median selected ratio of 0.36953 of</w:t>
       </w:r>
       <w:r>
         <w:t xml:space="preserve"> </w:t>
@@ -193,10 +190,7 @@
         <w:t xml:space="preserve">Full</w:t>
       </w:r>
       <w:r>
-        <w:t xml:space="preserve"> </w:t>
-      </w:r>
-      <w:r>
-        <w:t xml:space="preserve">(2.706</w:t>
+        <w:t xml:space="preserve">, or 2.706</w:t>
       </w:r>
       <m:oMath>
         <m:r>
@@ -210,7 +204,7 @@
         <w:t xml:space="preserve"> </w:t>
       </w:r>
       <w:r>
-        <w:t xml:space="preserve">lower calibrated work). A separate five-case validation on a pinned trained 3D Gaussian Splatting representation records four certified-local repairs, one fallback, and zero observed violations. We also identify a remaining systems bottleneck: the frozen end-to-end paths still inspect nearly the full Gaussian set, while a separate exact sparse-discovery study reduces median inspection to 1% without changing candidate selection. These results support certified selective recomputation within the stated assumptions; they do not establish universal safety, global optimality, or end-to-end wall-clock speedup.</w:t>
+        <w:t xml:space="preserve">lower calibrated work. A separate five-case check on a pinned trained 3DGS representation produced four local repairs, one fallback, and no observed violation. The frozen end-to-end path still inspects almost the full Gaussian set, although exact sparse discovery reduces median inspection to 1% in isolation. These results support selective recomputation under the stated assumptions; they do not establish universal safety, global optimality, or wall-clock speedup.</w:t>
       </w:r>
     </w:p>
     <w:bookmarkEnd w:id="20"/>
@@ -237,7 +231,7 @@
         <w:pStyle w:val="FirstParagraph"/>
       </w:pPr>
       <w:r>
-        <w:t xml:space="preserve">Persistent 3D systems are increasingly expected to outlive the capture session that created them. A reconstructed room is revisited after furniture moves; an augmented-reality map persists while objects appear and disappear; a digital twin is refreshed after a local physical intervention. In such systems, the computational state is heterogeneous. Observations feed volumetric or point-based geometry; geometry determines surface or Gaussian support; materials and textures depend on ownership and visibility; GPU records mirror persistent entities; temporal filters reuse prior screen-space state. A physical edit that is local in Euclidean space can therefore have a non-local computational footprint.</w:t>
+        <w:t xml:space="preserve">Many 3D systems now live well beyond the capture session that created them. A reconstructed room may be revisited after furniture has moved; an AR map continues to exist while objects appear and disappear; a digital twin is updated after a small physical intervention. The stored state in these systems is not one uniform representation. Observations feed geometry, geometry determines surface or Gaussian support, materials and textures follow ownership and visibility, GPU records mirror persistent entities, and temporal filters reuse earlier screen-space state. For that reason, an edit that looks local in Euclidean space may not be local at all once it propagates through the system.</w:t>
       </w:r>
     </w:p>
     <w:p>
@@ -245,7 +239,7 @@
         <w:pStyle w:val="BodyText"/>
       </w:pPr>
       <w:r>
-        <w:t xml:space="preserve">The classical response is to rebuild globally. Volumetric fusion and dense reconstruction systems already provide a clear full-reference notion of recomputation</w:t>
+        <w:t xml:space="preserve">The safest response is still a global rebuild. Classical volumetric fusion and dense reconstruction give a natural full-reference notion of recomputation</w:t>
       </w:r>
       <w:r>
         <w:t xml:space="preserve"> </w:t>
@@ -254,7 +248,7 @@
         <w:t xml:space="preserve">(Curless and Levoy 1996; Newcombe et al. 2011; Dai et al. 2017)</w:t>
       </w:r>
       <w:r>
-        <w:t xml:space="preserve">. Full rebuilding is easy to reason about, but it wastes work when a revision affects only a small dependency closure. Modern explicit scene representations make the waste more visible: Gaussian maps and neural or hybrid reconstructions contain large amounts of state that can often remain unchanged</w:t>
+        <w:t xml:space="preserve">. That choice is straightforward to reason about, but it becomes wasteful when only a small dependency closure is actually affected. Explicit scene representations make this mismatch particularly visible: large parts of a Gaussian map, or of a neural/hybrid reconstruction, may have no reason to change after a local revision</w:t>
       </w:r>
       <w:r>
         <w:t xml:space="preserve"> </w:t>
@@ -263,7 +257,7 @@
         <w:t xml:space="preserve">(Kerbl et al. 2023; Keetha et al. 2024; Matsuki et al. 2024)</w:t>
       </w:r>
       <w:r>
-        <w:t xml:space="preserve">. Continual Gaussian systems consequently restrict optimization to changed regions or manage stale observations over time</w:t>
+        <w:t xml:space="preserve">. Continual Gaussian systems already exploit this fact by focusing optimization on changed regions or by managing stale observations over time</w:t>
       </w:r>
       <w:r>
         <w:t xml:space="preserve"> </w:t>
@@ -272,7 +266,7 @@
         <w:t xml:space="preserve">(Ackermann et al. 2025; Zeng et al. 2025; Yugay et al. 2026)</w:t>
       </w:r>
       <w:r>
-        <w:t xml:space="preserve">. These methods establish that local updating is useful, but they answer a different question from the one studied here. They decide</w:t>
+        <w:t xml:space="preserve">. Our concern is slightly different. Those systems mainly decide</w:t>
       </w:r>
       <w:r>
         <w:t xml:space="preserve"> </w:t>
@@ -285,7 +279,7 @@
         <w:t xml:space="preserve">where to update</w:t>
       </w:r>
       <w:r>
-        <w:t xml:space="preserve">; they do not generally certify the error permitted to remain outside the chosen region across a heterogeneous captured-world stack.</w:t>
+        <w:t xml:space="preserve">; here we ask how much error may safely remain outside the region that was chosen, across several kinds of derived state at once.</w:t>
       </w:r>
     </w:p>
     <w:p>
@@ -293,7 +287,7 @@
         <w:pStyle w:val="BodyText"/>
       </w:pPr>
       <w:r>
-        <w:t xml:space="preserve">This paper asks a narrower systems question:</w:t>
+        <w:t xml:space="preserve">The question is deliberately narrow:</w:t>
       </w:r>
       <w:r>
         <w:t xml:space="preserve"> </w:t>
@@ -303,13 +297,13 @@
           <w:iCs/>
           <w:i/>
         </w:rPr>
-        <w:t xml:space="preserve">when may a persistent captured world repair less than the whole world while retaining an explicit output-error contract?</w:t>
-      </w:r>
-      <w:r>
-        <w:t xml:space="preserve"> </w:t>
-      </w:r>
-      <w:r>
-        <w:t xml:space="preserve">The difficulty is not merely reachability. Some dependencies are exact and should never be approximated, such as ownership, record identity, publication, and unstable temporal invalidation. Others have implementation-backed finite influence, such as the display-space contribution of edited Gaussian support or stable temporal blending. A useful revision system must separate these cases, reason about the residual influence outside a proposed repair region, and choose a full rebuild when the residual cannot be bounded tightly enough.</w:t>
+        <w:t xml:space="preserve">when is it defensible to repair less than the whole captured world while keeping an explicit output-error contract?</w:t>
+      </w:r>
+      <w:r>
+        <w:t xml:space="preserve"> </w:t>
+      </w:r>
+      <w:r>
+        <w:t xml:space="preserve">Reachability alone is not enough. Ownership, record identity, publication, and unstable temporal invalidation are structural relations that should not be approximated. Other relations, such as edited Gaussian support or stable temporal blending, have finite influence that can be bounded. The revision policy must distinguish the two and fall back to a full rebuild when the remainder outside a proposed repair region cannot be bounded tightly enough.</w:t>
       </w:r>
     </w:p>
     <w:p>
@@ -317,7 +311,7 @@
         <w:pStyle w:val="BodyText"/>
       </w:pPr>
       <w:r>
-        <w:t xml:space="preserve">We introduce</w:t>
+        <w:t xml:space="preserve">Our answer is</w:t>
       </w:r>
       <w:r>
         <w:t xml:space="preserve"> </w:t>
@@ -333,7 +327,7 @@
         <w:t xml:space="preserve"> </w:t>
       </w:r>
       <w:r>
-        <w:t xml:space="preserve">(CBRC). CBRC represents a revision over a typed dependency graph with three edge semantics:</w:t>
+        <w:t xml:space="preserve">(CBRC). A revision is represented on a typed dependency graph with three edge meanings.</w:t>
       </w:r>
       <w:r>
         <w:t xml:space="preserve"> </w:t>
@@ -348,7 +342,7 @@
         <w:t xml:space="preserve"> </w:t>
       </w:r>
       <w:r>
-        <w:t xml:space="preserve">edges encode exact structural requirements,</w:t>
+        <w:t xml:space="preserve">edges carry exact structural requirements;</w:t>
       </w:r>
       <w:r>
         <w:t xml:space="preserve"> </w:t>
@@ -363,7 +357,7 @@
         <w:t xml:space="preserve"> </w:t>
       </w:r>
       <w:r>
-        <w:t xml:space="preserve">edges carry conservative finite-change upper bounds, and</w:t>
+        <w:t xml:space="preserve">edges carry conservative finite-change bounds; and</w:t>
       </w:r>
       <w:r>
         <w:t xml:space="preserve"> </w:t>
@@ -378,7 +372,7 @@
         <w:t xml:space="preserve"> </w:t>
       </w:r>
       <w:r>
-        <w:t xml:space="preserve">edges may guide scheduling but are never used as a safety certificate. For a proposed repair cone</w:t>
+        <w:t xml:space="preserve">edges may help decide what to try first, but they never become part of the safety certificate. For a proposed cone</w:t>
       </w:r>
       <w:r>
         <w:t xml:space="preserve"> </w:t>
@@ -389,7 +383,7 @@
         </m:r>
       </m:oMath>
       <w:r>
-        <w:t xml:space="preserve">, the remaining exterior</w:t>
+        <w:t xml:space="preserve">, we certify the unrepaired exterior</w:t>
       </w:r>
       <w:r>
         <w:t xml:space="preserve"> </w:t>
@@ -403,7 +397,7 @@
         <w:t xml:space="preserve"> </w:t>
       </w:r>
       <w:r>
-        <w:t xml:space="preserve">is certified against one or more quantities of interest. We call the worst normalized certificate-to-tolerance ratio the</w:t>
+        <w:t xml:space="preserve">against the declared quantities of interest. The worst normalized certificate-to-tolerance ratio is the</w:t>
       </w:r>
       <w:r>
         <w:t xml:space="preserve"> </w:t>
@@ -416,7 +410,7 @@
         <w:t xml:space="preserve">revision criticality</w:t>
       </w:r>
       <w:r>
-        <w:t xml:space="preserve">; the boundary value is one. A local result is accepted only if (1) exact predecessors are closed, (2) revision criticality is at or below one for every protected output, and (3) calibrated regional work is lower than the independently measured full baseline. Unsupported coupling, supercritical residual influence, unstable analytic structure, or an unfavorable work crossover returns</w:t>
+        <w:t xml:space="preserve">, with one as the decision boundary. We accept a local result only when exact predecessors are closed, every protected output is at or below that boundary, and the calibrated regional work is below the independently measured full baseline. If the coupling is unsupported, the residual is supercritical, the analytic assumptions are unstable, or locality simply costs too much, the planner returns</w:t>
       </w:r>
       <w:r>
         <w:t xml:space="preserve"> </w:t>
@@ -436,7 +430,7 @@
         <w:pStyle w:val="BodyText"/>
       </w:pPr>
       <w:r>
-        <w:t xml:space="preserve">MAVEB implements the method as a C++23 persistent-world stack. It is paired with a dense Python reference certifier and an independent full-after Gaussian oracle. Figure 1 shows the decision path, and Figure 2 illustrates Gaussian support selection and the two possible outcomes. The implementation records immutable before/after revision sidecars, deterministic certificate JSON, per-domain work, and oracle replay. A certificate is not accepted because the planner predicts that the repair is safe; the selected result is independently replayed against</w:t>
+        <w:t xml:space="preserve">MAVEB implements this design as a C++23 persistent-world stack, alongside a dense Python reference certifier and an independent full-after Gaussian oracle. Figure 1 summarizes the decision path, while Figure 2 shows the support-selection idea visually. The implementation records immutable before/after revision sidecars, deterministic certificate JSON, per-domain work, and oracle replay. We do not treat the planner’s own prediction as evidence that a repair is safe. Instead, the chosen result is replayed independently against</w:t>
       </w:r>
       <w:r>
         <w:t xml:space="preserve"> </w:t>
@@ -451,7 +445,7 @@
         <w:t xml:space="preserve"> </w:t>
       </w:r>
       <w:r>
-        <w:t xml:space="preserve">and evaluated under the contract</w:t>
+        <w:t xml:space="preserve">and checked under the contract</w:t>
       </w:r>
     </w:p>
     <w:tbl>
@@ -778,7 +772,7 @@
         <w:pStyle w:val="BodyText"/>
       </w:pPr>
       <w:r>
-        <w:t xml:space="preserve">Our evaluation freezes both protocol and claim boundaries before interpreting the final campaign. Across 60 public RGB/SfM revisions, CBRC selects 44 certified-local repairs and 16 automatic full rebuilds. No certificate violation is observed, native and Python planner decisions agree on all cases, and 56 of 60 source edits exceed the protected RGB tolerance before repair, which rules out the trivial explanation that the campaign contains only visually irrelevant edits. A frozen isolated millisecond cost model reports a median selected heterogeneous work ratio of 0.36953 of</w:t>
+        <w:t xml:space="preserve">We froze the protocol and claim boundaries before interpreting the final campaign. Among 60 public RGB/SfM revisions, CBRC makes 44 certified-local selections and 16 full rebuilds, with no observed certificate violation and complete native/Python planner agreement. Fifty-six source edits were above RGB tolerance before repair. The frozen calibration gives a median work ratio of 0.36953 of</w:t>
       </w:r>
       <w:r>
         <w:t xml:space="preserve"> </w:t>
@@ -790,7 +784,7 @@
         <w:t xml:space="preserve">Full</w:t>
       </w:r>
       <w:r>
-        <w:t xml:space="preserve">, equivalent to 2.706</w:t>
+        <w:t xml:space="preserve">, or 2.706</w:t>
       </w:r>
       <m:oMath>
         <m:r>
@@ -804,7 +798,7 @@
         <w:t xml:space="preserve"> </w:t>
       </w:r>
       <w:r>
-        <w:t xml:space="preserve">lower calibrated work. This is a work result, not a paired wall-clock speedup. A second validation on a pinned trained 3D Gaussian Splatting representation records four local selections, one fallback, and zero observed violations. It also exposes the main remaining bottleneck: Gaussian discovery remains nearly global in the frozen end-to-end path.</w:t>
+        <w:t xml:space="preserve">lower calibrated work; this is not a paired wall-clock speedup. On the pinned trained 3DGS representation, four of five revisions stay local and one falls back, again without an observed violation. Candidate discovery, however, is still almost global in the frozen path.</w:t>
       </w:r>
     </w:p>
     <w:p>
@@ -823,7 +817,7 @@
         </w:numPr>
       </w:pPr>
       <w:r>
-        <w:t xml:space="preserve">a fail-closed revision formulation for heterogeneous persistent captured worlds that combines exact dependency closure with conservative finite-change propagation;</w:t>
+        <w:t xml:space="preserve">a fail-closed formulation for revising heterogeneous persistent captured worlds, combining exact dependency closure with conservative finite-change propagation;</w:t>
       </w:r>
     </w:p>
     <w:p>
@@ -834,7 +828,7 @@
         </w:numPr>
       </w:pPr>
       <w:r>
-        <w:t xml:space="preserve">quantity-of-interest certification for local repair, including implementation-backed Gaussian display-space and stable temporal bounds, with unsupported dependencies retained as exact;</w:t>
+        <w:t xml:space="preserve">output-specific certification for local repair, including implementation-backed Gaussian display-space and stable temporal bounds, while unsupported dependencies stay exact;</w:t>
       </w:r>
     </w:p>
     <w:p>
@@ -845,7 +839,7 @@
         </w:numPr>
       </w:pPr>
       <w:r>
-        <w:t xml:space="preserve">a native work-aware revision planner with automatic</w:t>
+        <w:t xml:space="preserve">a native work-aware planner with automatic</w:t>
       </w:r>
       <w:r>
         <w:t xml:space="preserve"> </w:t>
@@ -860,7 +854,7 @@
         <w:t xml:space="preserve"> </w:t>
       </w:r>
       <w:r>
-        <w:t xml:space="preserve">fallback, deterministic evidence emission, a dense reference implementation, and independent full-after falsification; and</w:t>
+        <w:t xml:space="preserve">fallback, deterministic evidence emission, a dense reference implementation, and an independent full-after falsification path; and</w:t>
       </w:r>
     </w:p>
     <w:p>
@@ -871,7 +865,7 @@
         </w:numPr>
       </w:pPr>
       <w:r>
-        <w:t xml:space="preserve">frozen public and trained-representation evidence that reports local/full crossover, calibrated work, sparse-discovery behavior, negative or neutral ablations, and measured limitations without converting work reduction into speedup claims.</w:t>
+        <w:t xml:space="preserve">frozen evidence on public and trained representations that reports the local/full crossover, calibrated work, sparse-discovery behavior, neutral or negative ablations, and the limitations we actually observed, without relabeling work reduction as speedup.</w:t>
       </w:r>
     </w:p>
     <w:p>
@@ -889,7 +883,7 @@
               <a:graphicData uri="http://schemas.openxmlformats.org/drawingml/2006/picture">
                 <pic:pic>
                   <pic:nvPicPr>
-                    <pic:cNvPr descr="/home/runner/work/_temp/maveb-manuscript-build/system_flow_export.png" id="23" name="Picture"/>
+                    <pic:cNvPr descr="/home/runner/work/_temp/maveb-final-build/system_flow_export.png" id="23" name="Picture"/>
                     <pic:cNvPicPr>
                       <a:picLocks noChangeArrowheads="1" noChangeAspect="1"/>
                     </pic:cNvPicPr>
@@ -1142,7 +1136,7 @@
         <w:pStyle w:val="FirstParagraph"/>
       </w:pPr>
       <w:r>
-        <w:t xml:space="preserve">Volumetric integration established a durable representation for combining range observations</w:t>
+        <w:t xml:space="preserve">Volumetric integration gave reconstruction systems a durable way to accumulate range observations</w:t>
       </w:r>
       <w:r>
         <w:t xml:space="preserve"> </w:t>
@@ -1151,7 +1145,7 @@
         <w:t xml:space="preserve">(Curless and Levoy 1996)</w:t>
       </w:r>
       <w:r>
-        <w:t xml:space="preserve">, while surfels provided an explicit point-oriented alternative</w:t>
+        <w:t xml:space="preserve">, and surfels offered an explicit point-oriented alternative</w:t>
       </w:r>
       <w:r>
         <w:t xml:space="preserve"> </w:t>
@@ -1160,7 +1154,7 @@
         <w:t xml:space="preserve">(Pfister et al. 2000)</w:t>
       </w:r>
       <w:r>
-        <w:t xml:space="preserve">. KinectFusion demonstrated real-time dense fusion and tracking</w:t>
+        <w:t xml:space="preserve">. KinectFusion later showed real-time dense fusion and tracking</w:t>
       </w:r>
       <w:r>
         <w:t xml:space="preserve"> </w:t>
@@ -1178,7 +1172,7 @@
         <w:t xml:space="preserve">(Whelan et al. 2015)</w:t>
       </w:r>
       <w:r>
-        <w:t xml:space="preserve">; and BundleFusion performed globally consistent online surface reintegration</w:t>
+        <w:t xml:space="preserve">; and BundleFusion reintegrated surfaces online while maintaining global consistency</w:t>
       </w:r>
       <w:r>
         <w:t xml:space="preserve"> </w:t>
@@ -1187,7 +1181,7 @@
         <w:t xml:space="preserve">(Dai et al. 2017)</w:t>
       </w:r>
       <w:r>
-        <w:t xml:space="preserve">. These systems make map state persistent and revisable, but their update logic is tied to representation-specific reconstruction or consistency mechanisms. CBRC instead treats a physical revision as a cross-derived-state decision problem: which state must be recomputed, what residual influence may remain outside that state, and when should incremental execution be abandoned.</w:t>
+        <w:t xml:space="preserve">. All of these systems make map state persistent enough that revision becomes meaningful, although their update rules are closely tied to the reconstruction or consistency mechanism itself. CBRC looks at the revision one level above that: which derived state really has to be recomputed, what may remain outside it, and at what point should the incremental attempt be abandoned.</w:t>
       </w:r>
     </w:p>
     <w:bookmarkEnd w:id="28"/>
@@ -1214,7 +1208,7 @@
         <w:t xml:space="preserve">(Mildenhall et al. 2020)</w:t>
       </w:r>
       <w:r>
-        <w:t xml:space="preserve">. iMAP and NICE-SLAM brought learned implicit representations into online mapping and SLAM</w:t>
+        <w:t xml:space="preserve">, while iMAP and NICE-SLAM brought learned implicit representations into online mapping and SLAM</w:t>
       </w:r>
       <w:r>
         <w:t xml:space="preserve"> </w:t>
@@ -1223,7 +1217,7 @@
         <w:t xml:space="preserve">(Sucar et al. 2021; Zhu et al. 2022)</w:t>
       </w:r>
       <w:r>
-        <w:t xml:space="preserve">. 3D Gaussian Splatting (3DGS) subsequently provided an explicit anisotropic representation with real-time rendering</w:t>
+        <w:t xml:space="preserve">. 3D Gaussian Splatting (3DGS) moved back toward an explicit anisotropic representation while retaining real-time rendering</w:t>
       </w:r>
       <w:r>
         <w:t xml:space="preserve"> </w:t>
@@ -1232,7 +1226,7 @@
         <w:t xml:space="preserve">(Kerbl et al. 2023)</w:t>
       </w:r>
       <w:r>
-        <w:t xml:space="preserve">; SplaTAM and Gaussian Splatting SLAM adapted Gaussian representations to online RGB-D and monocular mapping</w:t>
+        <w:t xml:space="preserve">; SplaTAM and Gaussian Splatting SLAM then adapted Gaussian state to online RGB-D and monocular mapping</w:t>
       </w:r>
       <w:r>
         <w:t xml:space="preserve"> </w:t>
@@ -1241,7 +1235,7 @@
         <w:t xml:space="preserve">(Keetha et al. 2024; Matsuki et al. 2024)</w:t>
       </w:r>
       <w:r>
-        <w:t xml:space="preserve">. Dynamic 3D Gaussians and 4D-GS model time-varying scene state</w:t>
+        <w:t xml:space="preserve">. Dynamic 3D Gaussians and 4D-GS extend the representation over time</w:t>
       </w:r>
       <w:r>
         <w:t xml:space="preserve"> </w:t>
@@ -1250,7 +1244,7 @@
         <w:t xml:space="preserve">(Luiten et al. 2024; G. Wu et al. 2024)</w:t>
       </w:r>
       <w:r>
-        <w:t xml:space="preserve">. These works motivate explicit revision reasoning because the representation exposes persistent primitives and spatial support, but the CBRC formulation is not specific to Gaussian state.</w:t>
+        <w:t xml:space="preserve">. These representations make revision especially tangible because individual persistent primitives and their support are exposed. Still, the CBRC formulation itself does not depend on Gaussian state.</w:t>
       </w:r>
     </w:p>
     <w:bookmarkEnd w:id="29"/>
@@ -1268,7 +1262,7 @@
         <w:pStyle w:val="FirstParagraph"/>
       </w:pPr>
       <w:r>
-        <w:t xml:space="preserve">CL-Splats segments changed and static scene components to focus local Gaussian optimization and preserve prior scene states</w:t>
+        <w:t xml:space="preserve">CL-Splats separates changed and static scene components so that Gaussian optimization can stay focused while older scene states are preserved</w:t>
       </w:r>
       <w:r>
         <w:t xml:space="preserve"> </w:t>
@@ -1277,7 +1271,7 @@
         <w:t xml:space="preserve">(Ackermann et al. 2025)</w:t>
       </w:r>
       <w:r>
-        <w:t xml:space="preserve">. GaussianUpdate performs continual radiance-field updates with change-specific strategies and visibility-aware replay</w:t>
+        <w:t xml:space="preserve">. GaussianUpdate uses change-specific update strategies and visibility-aware replay for continual radiance fields</w:t>
       </w:r>
       <w:r>
         <w:t xml:space="preserve"> </w:t>
@@ -1286,7 +1280,7 @@
         <w:t xml:space="preserve">(Zeng et al. 2025)</w:t>
       </w:r>
       <w:r>
-        <w:t xml:space="preserve">. GaME targets long-term evolving RGB-D scenes and manages stale observations while adapting the Gaussian map</w:t>
+        <w:t xml:space="preserve">. GaME addresses long-term evolving RGB-D scenes by adapting the Gaussian map while managing stale observations</w:t>
       </w:r>
       <w:r>
         <w:t xml:space="preserve"> </w:t>
@@ -1295,7 +1289,7 @@
         <w:t xml:space="preserve">(Yugay et al. 2026)</w:t>
       </w:r>
       <w:r>
-        <w:t xml:space="preserve">. EliGSiR addresses continual Gaussian mapping under a bounded compute budget through adaptive view scheduling, supervision fidelity, and geometry growth</w:t>
+        <w:t xml:space="preserve">, and EliGSiR studies continual Gaussian mapping under a bounded compute budget through adaptive view scheduling, supervision fidelity, and geometry growth</w:t>
       </w:r>
       <w:r>
         <w:t xml:space="preserve"> </w:t>
@@ -1304,7 +1298,7 @@
         <w:t xml:space="preserve">(Ellensohn, Rueckert, and Rauch 2026)</w:t>
       </w:r>
       <w:r>
-        <w:t xml:space="preserve">. These methods occupy the generic claim that changing Gaussian scenes should be updated locally or selectively. Our claim is different: CBRC couples cross-representation exact dependencies and conservative output bounds, accepts locality only under Eq. 1, and automatically returns</w:t>
+        <w:t xml:space="preserve">. We therefore do not claim the broad idea that changing Gaussian scenes should be updated locally. The distinction in CBRC is the contract: cross-representation exact dependencies and conservative output bounds are checked together, locality is admitted only under Eq. 1, and</w:t>
       </w:r>
       <w:r>
         <w:t xml:space="preserve"> </w:t>
@@ -1319,7 +1313,7 @@
         <w:t xml:space="preserve"> </w:t>
       </w:r>
       <w:r>
-        <w:t xml:space="preserve">when the certificate or work comparison fails.</w:t>
+        <w:t xml:space="preserve">remains an explicit outcome when either certification or the work comparison fails.</w:t>
       </w:r>
     </w:p>
     <w:bookmarkEnd w:id="30"/>
@@ -1337,7 +1331,7 @@
         <w:pStyle w:val="FirstParagraph"/>
       </w:pPr>
       <w:r>
-        <w:t xml:space="preserve">GaussianEditor and SC-GS show that Gaussian representations support precise or controllable local editing</w:t>
+        <w:t xml:space="preserve">GaussianEditor and SC-GS demonstrate precise, controllable local editing of Gaussian representations</w:t>
       </w:r>
       <w:r>
         <w:t xml:space="preserve"> </w:t>
@@ -1346,7 +1340,7 @@
         <w:t xml:space="preserve">(Chen et al. 2024; Huang et al. 2024)</w:t>
       </w:r>
       <w:r>
-        <w:t xml:space="preserve">. Recent primitive-space change detection argues that Gaussian attributes can directly reveal structural and appearance change</w:t>
+        <w:t xml:space="preserve">. Primitive-space change detection further suggests that Gaussian attributes themselves can reveal structural and appearance changes</w:t>
       </w:r>
       <w:r>
         <w:t xml:space="preserve"> </w:t>
@@ -1355,7 +1349,7 @@
         <w:t xml:space="preserve">(Galappaththige et al. 2026)</w:t>
       </w:r>
       <w:r>
-        <w:t xml:space="preserve">. Consistent Instance Field models persistent probabilistic identity in dynamic Gaussian scenes</w:t>
+        <w:t xml:space="preserve">, while Consistent Instance Field studies persistent probabilistic identity in dynamic Gaussian scenes</w:t>
       </w:r>
       <w:r>
         <w:t xml:space="preserve"> </w:t>
@@ -1364,7 +1358,7 @@
         <w:t xml:space="preserve">(J. Wu et al. 2026)</w:t>
       </w:r>
       <w:r>
-        <w:t xml:space="preserve">. These works are important collision classes: local editing, primitive change detection, and persistent identity are not claimed as novel here. CBRC begins after a revision has been specified or detected and asks whether the consequences outside a candidate repair cone can be bounded for a declared output.</w:t>
+        <w:t xml:space="preserve">. These are close enough to our setting that the boundary needs to be explicit: we are not claiming local editing, primitive-level change detection, or persistent identity as new. CBRC starts after a revision has been specified or detected and asks what can safely remain unrepaired for a particular output.</w:t>
       </w:r>
     </w:p>
     <w:bookmarkEnd w:id="31"/>
@@ -1382,7 +1376,7 @@
         <w:pStyle w:val="FirstParagraph"/>
       </w:pPr>
       <w:r>
-        <w:t xml:space="preserve">Graphics systems have long exploited dependency structure to avoid global recomputation. Bala et al. track dependencies between edited world regions and bounded-error radiance interpolants using ray segment trees</w:t>
+        <w:t xml:space="preserve">Dependency-aware recomputation is not new to graphics. Bala et al. connect edited world regions to bounded-error radiance interpolants with ray segment trees</w:t>
       </w:r>
       <w:r>
         <w:t xml:space="preserve"> </w:t>
@@ -1391,7 +1385,7 @@
         <w:t xml:space="preserve">(Bala, Dorsey, and Teller 1999)</w:t>
       </w:r>
       <w:r>
-        <w:t xml:space="preserve">. Wörister et al. synthesize a dependency graph from scene-graph changes to rendering caches and update those caches incrementally</w:t>
+        <w:t xml:space="preserve">, and Wörister et al. derive a dependency graph from scene-graph changes to rendering caches so those caches can be updated incrementally</w:t>
       </w:r>
       <w:r>
         <w:t xml:space="preserve"> </w:t>
@@ -1400,7 +1394,7 @@
         <w:t xml:space="preserve">(Wörister et al. 2013)</w:t>
       </w:r>
       <w:r>
-        <w:t xml:space="preserve">. Outside graphics, self-adjusting computation formalizes correct change propagation under mutation and reuse</w:t>
+        <w:t xml:space="preserve">. Beyond graphics, self-adjusting computation formalizes correct change propagation under mutation and reuse</w:t>
       </w:r>
       <w:r>
         <w:t xml:space="preserve"> </w:t>
@@ -1409,7 +1403,7 @@
         <w:t xml:space="preserve">(Acar, Blume, and Donham 2013)</w:t>
       </w:r>
       <w:r>
-        <w:t xml:space="preserve">, while goal-oriented error estimation allocates numerical work to control error in selected quantities of interest rather than a global state norm</w:t>
+        <w:t xml:space="preserve">; goal-oriented error estimation directs numerical work toward selected quantities of interest rather than a global state norm</w:t>
       </w:r>
       <w:r>
         <w:t xml:space="preserve"> </w:t>
@@ -1418,7 +1412,7 @@
         <w:t xml:space="preserve">(Oden and Prudhomme 2001)</w:t>
       </w:r>
       <w:r>
-        <w:t xml:space="preserve">. These traditions overlap with individual ingredients of CBRC and are therefore important novelty boundaries.</w:t>
+        <w:t xml:space="preserve">. Several ingredients of CBRC clearly live in these traditions, so we treat them as novelty boundaries rather than background to be glossed over.</w:t>
       </w:r>
     </w:p>
     <w:p>
@@ -1426,7 +1420,7 @@
         <w:pStyle w:val="BodyText"/>
       </w:pPr>
       <w:r>
-        <w:t xml:space="preserve">The mathematical tools underlying CBRC remain classical: graph closure, non-negative influence propagation, Neumann-series resolvents, norm bounds, and greedy search are not introduced by this work. The claimed contribution is the captured-world systems contract that combines cross-derived exact dependencies, conservative finite-change bounds, rendered-output quantities of interest, heterogeneous work crossover, fail-closed</w:t>
+        <w:t xml:space="preserve">The mathematics used by CBRC is mostly classical. Graph closure, non-negative influence propagation, Neumann-series resolvents, norm bounds, and greedy search are not contributions of this paper. What we claim instead is a systems contract for captured worlds that brings these pieces together around one revision decision: exact dependencies across derived state, conservative finite-change bounds, rendered-output quantities of interest, a heterogeneous work crossover, fail-closed</w:t>
       </w:r>
       <w:r>
         <w:t xml:space="preserve"> </w:t>
@@ -1441,7 +1435,7 @@
         <w:t xml:space="preserve"> </w:t>
       </w:r>
       <w:r>
-        <w:t xml:space="preserve">fallback, and independent full-reference falsification in one revision decision. We therefore treat the mathematics as supporting machinery rather than as standalone novelty.</w:t>
+        <w:t xml:space="preserve">fallback, and independent full-reference falsification. The mathematics is the machinery that makes that contract executable, not a standalone novelty claim.</w:t>
       </w:r>
     </w:p>
     <w:bookmarkEnd w:id="32"/>
@@ -1597,7 +1591,7 @@
         <w:pStyle w:val="FirstParagraph"/>
       </w:pPr>
       <w:r>
-        <w:t xml:space="preserve">A block may represent an observation region, TSDF block, mesh patch, texture page, material state, Gaussian subset, GPU publication range, temporal-history region, or another derived state unit. Blocks are therefore computational ownership units, not necessarily equal-sized spatial cells.</w:t>
+        <w:t xml:space="preserve">A block can represent an observation region, TSDF block, mesh patch, texture page, material state, Gaussian subset, GPU publication range, temporal-history region, or another unit of derived state. It is a unit of computational ownership, not necessarily a regular spatial cell.</w:t>
       </w:r>
     </w:p>
     <w:p>
@@ -1605,7 +1599,7 @@
         <w:pStyle w:val="BodyText"/>
       </w:pPr>
       <w:r>
-        <w:t xml:space="preserve">A physical revision induces a direct change envelope</w:t>
+        <w:t xml:space="preserve">A physical revision gives a direct change envelope</w:t>
       </w:r>
       <w:r>
         <w:t xml:space="preserve"> </w:t>
@@ -1649,7 +1643,7 @@
         </m:sSubSup>
       </m:oMath>
       <w:r>
-        <w:t xml:space="preserve">. The planner chooses a repair cone</w:t>
+        <w:t xml:space="preserve">. From there, the planner chooses a repair cone</w:t>
       </w:r>
       <w:r>
         <w:t xml:space="preserve"> </w:t>
@@ -1752,7 +1746,7 @@
         <w:pStyle w:val="FirstParagraph"/>
       </w:pPr>
       <w:r>
-        <w:t xml:space="preserve">unrepaired. The goal is not to minimize</w:t>
+        <w:t xml:space="preserve">untouched. Small cones are useful, but minimizing</w:t>
       </w:r>
       <w:r>
         <w:t xml:space="preserve"> </w:t>
@@ -1773,7 +1767,10 @@
         </m:d>
       </m:oMath>
       <w:r>
-        <w:t xml:space="preserve">. It is to find a certified feasible cone whose effect on the protected output remains inside tolerance and whose measured or calibrated work is lower than the equivalent full rebuild.</w:t>
+        <w:t xml:space="preserve"> </w:t>
+      </w:r>
+      <w:r>
+        <w:t xml:space="preserve">by itself is not the objective. The cone has to remain feasible under the output certificate, and its measured or calibrated work must still beat the corresponding full rebuild.</w:t>
       </w:r>
     </w:p>
     <w:bookmarkEnd w:id="34"/>
@@ -2085,22 +2082,7 @@
         <w:pStyle w:val="BodyText"/>
       </w:pPr>
       <w:r>
-        <w:t xml:space="preserve">This separation is intentionally conservative. For example, dependencies from observations to TSDF, from TSDF to mesh ownership, from meshes to texture-page identity, and from Gaussian records to GPU publication remain exact. These relations and unstable temporal validation are</w:t>
-      </w:r>
-      <w:r>
-        <w:t xml:space="preserve"> </w:t>
-      </w:r>
-      <w:r>
-        <w:rPr>
-          <w:smallCaps/>
-        </w:rPr>
-        <w:t xml:space="preserve">Hard</w:t>
-      </w:r>
-      <w:r>
-        <w:t xml:space="preserve"> </w:t>
-      </w:r>
-      <w:r>
-        <w:t xml:space="preserve">in the v1 implementation. Gaussian-to-image influence and stable temporal blending have implemented</w:t>
+        <w:t xml:space="preserve">We keep this separation conservative on purpose. Dependencies from observations to TSDF state, TSDF to mesh ownership, meshes to texture-page identity, and Gaussian records to GPU publication remain exact in v1. Unstable temporal validation is treated the same way. By contrast, Gaussian-to-image influence and stable temporal blending have implemented</w:t>
       </w:r>
       <w:r>
         <w:t xml:space="preserve"> </w:t>
@@ -2115,7 +2097,7 @@
         <w:t xml:space="preserve"> </w:t>
       </w:r>
       <w:r>
-        <w:t xml:space="preserve">bounds. Relations without a useful conservative theorem are not weakened merely to produce a smaller cone.</w:t>
+        <w:t xml:space="preserve">bounds. If we do not have a conservative argument for a relation, we do not soften it simply because doing so would produce a smaller cone.</w:t>
       </w:r>
     </w:p>
     <w:bookmarkEnd w:id="36"/>
@@ -2185,7 +2167,7 @@
         <w:t xml:space="preserve"> </w:t>
       </w:r>
       <w:r>
-        <w:t xml:space="preserve">be the declared tolerance. A local repair is admissible only if its certified residual satisfies</w:t>
+        <w:t xml:space="preserve">denote its declared tolerance. A local repair is admissible only when</w:t>
       </w:r>
       <w:r>
         <w:t xml:space="preserve"> </w:t>
@@ -2239,18 +2221,7 @@
         <w:t xml:space="preserve"> </w:t>
       </w:r>
       <w:r>
-        <w:t xml:space="preserve">for every protected</w:t>
-      </w:r>
-      <w:r>
-        <w:t xml:space="preserve"> </w:t>
-      </w:r>
-      <m:oMath>
-        <m:r>
-          <m:t>q</m:t>
-        </m:r>
-      </m:oMath>
-      <w:r>
-        <w:t xml:space="preserve">. The experiment then checks the stronger independent contract in Eq. 1.</w:t>
+        <w:t xml:space="preserve">for every protected output. That is the planner-side requirement. The experiment then asks the harder question by checking the independent full-reference contract in Eq. 1.</w:t>
       </w:r>
     </w:p>
     <w:p>
@@ -2258,7 +2229,7 @@
         <w:pStyle w:val="BodyText"/>
       </w:pPr>
       <w:r>
-        <w:t xml:space="preserve">The planner also requires regional work to be lower than</w:t>
+        <w:t xml:space="preserve">Locality also has to be worth doing. The planner therefore requires regional work to remain below</w:t>
       </w:r>
       <w:r>
         <w:t xml:space="preserve"> </w:t>
@@ -2270,7 +2241,7 @@
         <w:t xml:space="preserve">Full</w:t>
       </w:r>
       <w:r>
-        <w:t xml:space="preserve">. Native work counters are heterogeneous, so they are not added directly. If</w:t>
+        <w:t xml:space="preserve">. Because the native counters describe different kinds of work, adding them directly would be meaningless. If</w:t>
       </w:r>
       <w:r>
         <w:t xml:space="preserve"> </w:t>
@@ -2343,7 +2314,7 @@
         <w:t xml:space="preserve"> </w:t>
       </w:r>
       <w:r>
-        <w:t xml:space="preserve">is a frozen calibrated cost per native unit, the public campaign uses</w:t>
+        <w:t xml:space="preserve">is the frozen calibrated cost of one native unit, the public campaign uses</w:t>
       </w:r>
     </w:p>
     <w:tbl>
@@ -2487,7 +2458,7 @@
         <w:pStyle w:val="FirstParagraph"/>
       </w:pPr>
       <w:r>
-        <w:t xml:space="preserve">with an independently measured</w:t>
+        <w:t xml:space="preserve">with</w:t>
       </w:r>
       <w:r>
         <w:t xml:space="preserve"> </w:t>
@@ -2528,7 +2499,10 @@
         </m:sSub>
       </m:oMath>
       <w:r>
-        <w:t xml:space="preserve">. The calibration is frozen before the final campaign. This distinction matters: Eq. 4 is a work model, not an end-to-end runtime measurement.</w:t>
+        <w:t xml:space="preserve"> </w:t>
+      </w:r>
+      <w:r>
+        <w:t xml:space="preserve">measured independently. The calibration is frozen before the final campaign. We keep this distinction explicit throughout the paper: Eq. 4 models heterogeneous work; it is not an end-to-end timing measurement.</w:t>
       </w:r>
     </w:p>
     <w:bookmarkEnd w:id="37"/>
@@ -2785,7 +2759,7 @@
         <w:pStyle w:val="FirstParagraph"/>
       </w:pPr>
       <w:r>
-        <w:t xml:space="preserve">This rule handles structural dependencies before any approximate reasoning begins. A candidate violating Eq. 5 is invalid, even if a local numeric sensitivity estimate is small.</w:t>
+        <w:t xml:space="preserve">This condition is checked before any approximate reasoning. If Eq. 5 is violated, the candidate is invalid regardless of how small a local sensitivity estimate happens to be.</w:t>
       </w:r>
     </w:p>
     <w:bookmarkEnd w:id="39"/>
@@ -2827,7 +2801,7 @@
         <w:t xml:space="preserve"> </w:t>
       </w:r>
       <w:r>
-        <w:t xml:space="preserve">dependencies, define a componentwise non-negative influence matrix</w:t>
+        <w:t xml:space="preserve">dependencies we use a componentwise non-negative influence matrix</w:t>
       </w:r>
       <w:r>
         <w:t xml:space="preserve"> </w:t>
@@ -2880,7 +2854,7 @@
         </m:sSubSup>
       </m:oMath>
       <w:r>
-        <w:t xml:space="preserve">, where</w:t>
+        <w:t xml:space="preserve">. Each entry</w:t>
       </w:r>
       <w:r>
         <w:t xml:space="preserve"> </w:t>
@@ -2954,7 +2928,7 @@
         <w:t xml:space="preserve"> </w:t>
       </w:r>
       <w:r>
-        <w:t xml:space="preserve">denote known change bounds for repaired state. The exterior satisfies</w:t>
+        <w:t xml:space="preserve">collect known change bounds for the repaired state. The unrepaired exterior then satisfies</w:t>
       </w:r>
     </w:p>
     <w:tbl>
@@ -3563,7 +3537,7 @@
         <w:pStyle w:val="FirstParagraph"/>
       </w:pPr>
       <w:r>
-        <w:t xml:space="preserve">The native v1 planner uses sparse finite DAG propagation rather than general cyclic resolvent evaluation. Unsupported analytic cycles fail closed: the cone must expand until the unsupported exterior is removed, or the planner selects</w:t>
+        <w:t xml:space="preserve">The native v1 planner does not evaluate a general cyclic resolvent. It uses sparse finite propagation on supported DAG exteriors. If an analytic cycle falls outside that supported case, the planner fails closed: either the cone expands until the unsupported exterior disappears, or the result becomes</w:t>
       </w:r>
       <w:r>
         <w:t xml:space="preserve"> </w:t>
@@ -3575,7 +3549,7 @@
         <w:t xml:space="preserve">Full</w:t>
       </w:r>
       <w:r>
-        <w:t xml:space="preserve">. Equation 8 is therefore the reference formulation, not a claim that arbitrary cyclic systems are handled by the production planner.</w:t>
+        <w:t xml:space="preserve">. Equation 8 should therefore be read as the reference formulation, not as a claim that arbitrary cyclic systems are handled in production.</w:t>
       </w:r>
     </w:p>
     <w:bookmarkEnd w:id="40"/>
@@ -3793,7 +3767,7 @@
         <w:pStyle w:val="FirstParagraph"/>
       </w:pPr>
       <w:r>
-        <w:t xml:space="preserve">A candidate cone is certificate-feasible only if</w:t>
+        <w:t xml:space="preserve">A candidate is certificate-feasible only when</w:t>
       </w:r>
       <w:r>
         <w:t xml:space="preserve"> </w:t>
@@ -3847,7 +3821,7 @@
         <w:t xml:space="preserve"> </w:t>
       </w:r>
       <w:r>
-        <w:t xml:space="preserve">for all declared outputs. This allows two revisions with identical changed geometry to produce different decisions when their protected outputs differ. It also prevents an internal state norm from silently standing in for the user-visible error being claimed.</w:t>
+        <w:t xml:space="preserve">for every declared output. As a result, the same geometric change can lead to different revision decisions when the protected outputs differ. This is intentional: the certificate is tied to what the user actually asks us to preserve, rather than to an internal state norm that may or may not correlate with visible error.</w:t>
       </w:r>
     </w:p>
     <w:bookmarkEnd w:id="41"/>
@@ -3874,7 +3848,23 @@
         <w:pStyle w:val="FirstParagraph"/>
       </w:pPr>
       <w:r>
-        <w:t xml:space="preserve">We define the revision criticality of a candidate cone as the worst normalized certified residual</w:t>
+        <w:t xml:space="preserve">We use</w:t>
+      </w:r>
+      <w:r>
+        <w:t xml:space="preserve"> </w:t>
+      </w:r>
+      <w:r>
+        <w:rPr>
+          <w:iCs/>
+          <w:i/>
+        </w:rPr>
+        <w:t xml:space="preserve">revision criticality</w:t>
+      </w:r>
+      <w:r>
+        <w:t xml:space="preserve"> </w:t>
+      </w:r>
+      <w:r>
+        <w:t xml:space="preserve">for the worst normalized certified residual of a candidate cone</w:t>
       </w:r>
     </w:p>
     <w:tbl>
@@ -4302,7 +4292,7 @@
         <w:pStyle w:val="FirstParagraph"/>
       </w:pPr>
       <w:r>
-        <w:t xml:space="preserve">The threshold</w:t>
+        <w:t xml:space="preserve">The decision boundary is</w:t>
       </w:r>
       <w:r>
         <w:t xml:space="preserve"> </w:t>
@@ -4335,82 +4325,7 @@
         </m:r>
       </m:oMath>
       <w:r>
-        <w:t xml:space="preserve"> </w:t>
-      </w:r>
-      <w:r>
-        <w:t xml:space="preserve">is the certificate boundary:</w:t>
-      </w:r>
-      <w:r>
-        <w:t xml:space="preserve"> </w:t>
-      </w:r>
-      <m:oMath>
-        <m:r>
-          <m:t>χ</m:t>
-        </m:r>
-        <m:d>
-          <m:dPr>
-            <m:begChr m:val="("/>
-            <m:endChr m:val=")"/>
-            <m:sepChr m:val=""/>
-            <m:grow/>
-          </m:dPr>
-          <m:e>
-            <m:r>
-              <m:t>C</m:t>
-            </m:r>
-          </m:e>
-        </m:d>
-        <m:r>
-          <m:rPr>
-            <m:sty m:val="p"/>
-          </m:rPr>
-          <m:t>≤</m:t>
-        </m:r>
-        <m:r>
-          <m:t>1</m:t>
-        </m:r>
-      </m:oMath>
-      <w:r>
-        <w:t xml:space="preserve"> </w:t>
-      </w:r>
-      <w:r>
-        <w:t xml:space="preserve">is certificate-feasible, whereas</w:t>
-      </w:r>
-      <w:r>
-        <w:t xml:space="preserve"> </w:t>
-      </w:r>
-      <m:oMath>
-        <m:r>
-          <m:t>χ</m:t>
-        </m:r>
-        <m:d>
-          <m:dPr>
-            <m:begChr m:val="("/>
-            <m:endChr m:val=")"/>
-            <m:sepChr m:val=""/>
-            <m:grow/>
-          </m:dPr>
-          <m:e>
-            <m:r>
-              <m:t>C</m:t>
-            </m:r>
-          </m:e>
-        </m:d>
-        <m:r>
-          <m:rPr>
-            <m:sty m:val="p"/>
-          </m:rPr>
-          <m:t>&gt;</m:t>
-        </m:r>
-        <m:r>
-          <m:t>1</m:t>
-        </m:r>
-      </m:oMath>
-      <w:r>
-        <w:t xml:space="preserve"> </w:t>
-      </w:r>
-      <w:r>
-        <w:t xml:space="preserve">is supercritical for at least one protected output and requires cone expansion or</w:t>
+        <w:t xml:space="preserve">. Values at or below one are certificate-feasible; a value above one means that at least one protected output is supercritical and the cone must grow or fall back to</w:t>
       </w:r>
       <w:r>
         <w:t xml:space="preserve"> </w:t>
@@ -4422,7 +4337,7 @@
         <w:t xml:space="preserve">Full</w:t>
       </w:r>
       <w:r>
-        <w:t xml:space="preserve">. The term</w:t>
+        <w:t xml:space="preserve">. We use the phrase</w:t>
       </w:r>
       <w:r>
         <w:t xml:space="preserve"> </w:t>
@@ -4438,7 +4353,7 @@
         <w:t xml:space="preserve"> </w:t>
       </w:r>
       <w:r>
-        <w:t xml:space="preserve">refers to this explicit normalized output-error boundary; it is not intended as a new physical critical-phenomena model.</w:t>
+        <w:t xml:space="preserve">in this narrow sense of a normalized output-error boundary. It is not meant to suggest a new model of physical critical phenomena.</w:t>
       </w:r>
     </w:p>
     <w:bookmarkEnd w:id="42"/>
@@ -4719,7 +4634,7 @@
         <w:t xml:space="preserve"> </w:t>
       </w:r>
       <w:r>
-        <w:t xml:space="preserve">is squared Mahalanobis distance in projected Gaussian space. In the bound below,</w:t>
+        <w:t xml:space="preserve">is the squared Mahalanobis distance in projected Gaussian space. In the bound that follows,</w:t>
       </w:r>
       <w:r>
         <w:t xml:space="preserve"> </w:t>
@@ -4742,7 +4657,7 @@
         <w:t xml:space="preserve"> </w:t>
       </w:r>
       <w:r>
-        <w:t xml:space="preserve">denotes the effective value after the renderer’s clamp and cutoff rules, rather than the raw expression in Eq. 11. For edited set</w:t>
+        <w:t xml:space="preserve">means the effective value after the renderer’s clamp and cutoff rules, not simply the raw value from Eq. 11. For an edited set</w:t>
       </w:r>
       <w:r>
         <w:t xml:space="preserve"> </w:t>
@@ -4753,7 +4668,7 @@
         </m:r>
       </m:oMath>
       <w:r>
-        <w:t xml:space="preserve">, define aggregate opacity mass</w:t>
+        <w:t xml:space="preserve">, we define the aggregate opacity mass</w:t>
       </w:r>
     </w:p>
     <w:tbl>
@@ -5381,7 +5296,7 @@
         <w:pStyle w:val="FirstParagraph"/>
       </w:pPr>
       <w:r>
-        <w:t xml:space="preserve">The bound requires: (i) front-to-back alpha compositing with effective post-clamp/post-cutoff alpha in</w:t>
+        <w:t xml:space="preserve">The proposition rests on four conditions. First, compositing is front-to-back, with effective post-clamp/post-cutoff alpha in</w:t>
       </w:r>
       <w:r>
         <w:t xml:space="preserve"> </w:t>
@@ -5411,7 +5326,7 @@
         </m:d>
       </m:oMath>
       <w:r>
-        <w:t xml:space="preserve">; (ii) each protected color channel lies in an interval of width</w:t>
+        <w:t xml:space="preserve">. Second, each protected color channel, including the background and the renderer’s bounded spherical-harmonic evaluation, lies in an interval of width</w:t>
       </w:r>
       <w:r>
         <w:t xml:space="preserve"> </w:t>
@@ -5458,7 +5373,7 @@
         </m:sSub>
       </m:oMath>
       <w:r>
-        <w:t xml:space="preserve">, including the background and the bounded spherical-harmonic evaluation used by the renderer; (iii)</w:t>
+        <w:t xml:space="preserve">. Third,</w:t>
       </w:r>
       <w:r>
         <w:t xml:space="preserve"> </w:t>
@@ -5476,12 +5391,17 @@
             </m:r>
           </m:sub>
         </m:sSub>
-        <m:r>
-          <m:rPr>
-            <m:sty m:val="p"/>
-          </m:rPr>
-          <m:t>,</m:t>
-        </m:r>
+      </m:oMath>
+      <w:r>
+        <w:t xml:space="preserve"> </w:t>
+      </w:r>
+      <w:r>
+        <w:t xml:space="preserve">and</w:t>
+      </w:r>
+      <w:r>
+        <w:t xml:space="preserve"> </w:t>
+      </w:r>
+      <m:oMath>
         <m:sSub>
           <m:e>
             <m:r>
@@ -5499,7 +5419,7 @@
         <w:t xml:space="preserve"> </w:t>
       </w:r>
       <w:r>
-        <w:t xml:space="preserve">contain every Gaussian whose projected opacity, color, insertion/deletion state, or depth relation to unchanged support can change because of the edit; and (iv) renderer behavior not represented by these bounded quantities is treated as unsupported and therefore promoted to an exact dependency or</w:t>
+        <w:t xml:space="preserve">include every Gaussian whose projected opacity, color, insertion/deletion state, or depth relation to unchanged support can change because of the edit. Finally, renderer behavior that is not captured by these bounded quantities is treated as unsupported and is promoted to an exact dependency or a</w:t>
       </w:r>
       <w:r>
         <w:t xml:space="preserve"> </w:t>
@@ -5532,7 +5452,7 @@
         <w:pStyle w:val="FirstParagraph"/>
       </w:pPr>
       <w:r>
-        <w:t xml:space="preserve">For one edited set, front-to-back compositing changes the final channel value by at most the channel range multiplied by the total opacity mass through which edited support can replace, attenuate, or reveal unchanged radiance. This gives</w:t>
+        <w:t xml:space="preserve">For a single edited set, front-to-back compositing can alter a channel by no more than the channel range times the opacity mass through which edited support replaces, attenuates, or reveals unchanged radiance. This gives</w:t>
       </w:r>
       <w:r>
         <w:t xml:space="preserve"> </w:t>
@@ -5604,7 +5524,7 @@
         </m:d>
       </m:oMath>
       <w:r>
-        <w:t xml:space="preserve">. Insertion and deletion are the cases in which one edited set is empty. For a general before/after edit, apply the triangle inequality through the common unchanged state</w:t>
+        <w:t xml:space="preserve">. Insertion and deletion are the special cases in which one edited set is empty. For a general before/after edit, we pass through the common unchanged state</w:t>
       </w:r>
       <w:r>
         <w:t xml:space="preserve"> </w:t>
@@ -5618,7 +5538,7 @@
         <w:t xml:space="preserve"> </w:t>
       </w:r>
       <w:r>
-        <w:t xml:space="preserve">to obtain</w:t>
+        <w:t xml:space="preserve">and apply the triangle inequality, obtaining</w:t>
       </w:r>
       <w:r>
         <w:t xml:space="preserve"> </w:t>
@@ -5749,7 +5669,7 @@
         </m:d>
       </m:oMath>
       <w:r>
-        <w:t xml:space="preserve">, then clamp by the maximum possible channel-range change</w:t>
+        <w:t xml:space="preserve">. The result is then capped by the largest possible channel-range change,</w:t>
       </w:r>
       <w:r>
         <w:t xml:space="preserve"> </w:t>
@@ -5796,7 +5716,7 @@
         </m:sSub>
       </m:oMath>
       <w:r>
-        <w:t xml:space="preserve">. The protected-image certificate is the maximum of Eq. 13 over the declared pixel support. A fuller algebraic derivation is included with the manuscript supplement.</w:t>
+        <w:t xml:space="preserve">. The image-level certificate takes the maximum of Eq. 13 over the declared protected pixels. The supplement gives the algebra in more detail.</w:t>
       </w:r>
     </w:p>
     <w:bookmarkEnd w:id="45"/>
@@ -6190,7 +6110,7 @@
         <w:pStyle w:val="FirstParagraph"/>
       </w:pPr>
       <w:r>
-        <w:t xml:space="preserve">If validation, reprojection, or disocclusion may itself change, MAVEB promotes the relation to</w:t>
+        <w:t xml:space="preserve">If validation, reprojection, or disocclusion can itself change, MAVEB does not apply Eq. 14; it promotes the relation to</w:t>
       </w:r>
       <w:r>
         <w:t xml:space="preserve"> </w:t>
@@ -6205,7 +6125,7 @@
         <w:t xml:space="preserve"> </w:t>
       </w:r>
       <w:r>
-        <w:t xml:space="preserve">invalidation instead of applying Eq. 14. Thus the temporal path demonstrates the central design rule: use a soft bound only while its preconditions are certifiable.</w:t>
+        <w:t xml:space="preserve">invalidation. The temporal case is a useful example of the design rule we follow throughout: a soft bound is used only for as long as its own preconditions can be certified.</w:t>
       </w:r>
     </w:p>
     <w:bookmarkEnd w:id="47"/>
@@ -6232,7 +6152,7 @@
         <w:pStyle w:val="FirstParagraph"/>
       </w:pPr>
       <w:r>
-        <w:t xml:space="preserve">The v1 search orders candidates using the numerical score</w:t>
+        <w:t xml:space="preserve">The v1 search still needs a numerical ordering when a declared tolerance is zero. For stable exteriors it uses</w:t>
       </w:r>
       <w:r>
         <w:t xml:space="preserve"> </w:t>
@@ -6370,7 +6290,7 @@
         <w:t xml:space="preserve"> </w:t>
       </w:r>
       <w:r>
-        <w:t xml:space="preserve">for stable exteriors. This floored score guides search only; acceptance still requires the original inequalities</w:t>
+        <w:t xml:space="preserve">only as a search score. The floor does not relax acceptance, which still uses</w:t>
       </w:r>
       <w:r>
         <w:t xml:space="preserve"> </w:t>
@@ -6421,7 +6341,7 @@
         </m:sSub>
       </m:oMath>
       <w:r>
-        <w:t xml:space="preserve">, including when tolerance is zero. For a candidate expansion</w:t>
+        <w:t xml:space="preserve">. For an expansion</w:t>
       </w:r>
       <w:r>
         <w:t xml:space="preserve"> </w:t>
@@ -6450,7 +6370,7 @@
         <w:t xml:space="preserve"> </w:t>
       </w:r>
       <w:r>
-        <w:t xml:space="preserve">with positive added work, it scores</w:t>
+        <w:t xml:space="preserve">with positive added work, the utility is</w:t>
       </w:r>
     </w:p>
     <w:tbl>
@@ -6702,7 +6622,7 @@
         <w:pStyle w:val="FirstParagraph"/>
       </w:pPr>
       <w:r>
-        <w:t xml:space="preserve">Every candidate is first closed over exact predecessors and then re-certified. Search stops when a cone is both certificate-feasible and cheaper than</w:t>
+        <w:t xml:space="preserve">Each candidate is closed over its exact predecessors before it is certified again. The search ends when it finds a cone that is both certificate-feasible and cheaper than</w:t>
       </w:r>
       <w:r>
         <w:t xml:space="preserve"> </w:t>
@@ -6714,7 +6634,7 @@
         <w:t xml:space="preserve">Full</w:t>
       </w:r>
       <w:r>
-        <w:t xml:space="preserve">, or when no useful local candidate remains. The algorithm claims a certified feasible cone, not the global minimum-work cone.</w:t>
+        <w:t xml:space="preserve">, or when there is no useful local candidate left to try. This procedure gives us a certified feasible cone. We do not claim that it is the globally cheapest safe cone.</w:t>
       </w:r>
     </w:p>
     <w:bookmarkEnd w:id="48"/>
@@ -6742,7 +6662,7 @@
         <w:pStyle w:val="FirstParagraph"/>
       </w:pPr>
       <w:r>
-        <w:t xml:space="preserve">MAVEB separates the scientific reference path from the production-oriented execution path. The dense Python certifier implements the mathematical contract directly and is used for falsification and regression. The native C++23 path implements a sparse revision graph with typed nodes and edges, sparse analytic propagation over supported DAG exteriors, exact predecessor consistency, a greedy feasible-cone search, and deterministic certificate serialization. Native and reference-planner decisions are compared in the campaign.</w:t>
+        <w:t xml:space="preserve">MAVEB keeps the scientific reference path separate from the production-oriented execution path. The dense Python certifier follows the mathematical contract directly and serves as a falsification and regression reference. The native C++23 implementation uses a sparse typed revision graph, sparse analytic propagation over supported DAG exteriors, exact predecessor checks, greedy feasible-cone search, and deterministic certificate serialization. The campaign compares the native planner’s final decisions against the reference planner rather than assuming the two implementations are equivalent.</w:t>
       </w:r>
     </w:p>
     <w:bookmarkStart w:id="50" w:name="revision-transactions."/>
@@ -6759,7 +6679,7 @@
         <w:pStyle w:val="FirstParagraph"/>
       </w:pPr>
       <w:r>
-        <w:t xml:space="preserve">The production path records persistent Gaussian entity translations, immutable before/after Gaussian revision sidecars, exact camera binding, a production Gaussian image certificate, and planner-selected temporal repair or retention. The headless path loads a persistent world, applies indexed Gaussian transactions, writes a new durable revision and sidecars, evaluates the Gaussian certificate, executes the output-cone planner, and emits canonical evidence JSON. A revision that cannot satisfy consistency checks fails closed rather than publishing partial state.</w:t>
+        <w:t xml:space="preserve">The production path records persistent Gaussian entity translations, immutable before/after sidecars, exact camera binding, a production image certificate, and the planner’s temporal repair or retention decision. In headless operation, the system loads a persistent world, applies indexed Gaussian transactions, writes the new durable revision and sidecars, evaluates the Gaussian certificate, runs the output-cone planner, and emits canonical evidence JSON. If the consistency checks do not pass, the revision fails closed instead of publishing a partly updated world.</w:t>
       </w:r>
     </w:p>
     <w:bookmarkEnd w:id="50"/>
@@ -6792,7 +6712,7 @@
         <w:t xml:space="preserve"> </w:t>
       </w:r>
       <w:r>
-        <w:t xml:space="preserve">is the counter source of truth for observation, TSDF, mesh, texture-page, material, Gaussian, GPU-publication, and temporal domains. Ledger/mesher disagreement is treated as an error. Native counts remain in their own units; conversion to the public scalar work model occurs only through a frozen versioned calibration. This design avoids hiding a full-world stage behind a local metric from a single subsystem.</w:t>
+        <w:t xml:space="preserve">is the counter source of truth across observation, TSDF, mesh, texture-page, material, Gaussian, GPU-publication, and temporal domains. Ledger/mesher disagreement is an error. Native counts stay in their own units until the frozen, versioned calibration converts them for the public work model. This prevents a local-looking metric in one subsystem from hiding a full-world stage elsewhere.</w:t>
       </w:r>
     </w:p>
     <w:bookmarkEnd w:id="51"/>
@@ -6810,7 +6730,7 @@
         <w:pStyle w:val="FirstParagraph"/>
       </w:pPr>
       <w:r>
-        <w:t xml:space="preserve">The Gaussian oracle is separate from the selected revision planner. It renders or evaluates the equivalent full-after state and reports per-pixel actual error alongside the emitted bound. The strict evaluator enforces Eq. 1; production/offline certificate disagreement or a measured error above the emitted certificate is a correctness failure. Evidence bundles are hashed, and the canonical campaign records workflow IDs, artifact hashes, source hashes, and planner parity.</w:t>
+        <w:t xml:space="preserve">The Gaussian oracle is deliberately independent of the planner that selected the revision. It evaluates the equivalent full-after state and reports per-pixel measured error next to the emitted bound. The strict evaluator then enforces Eq. 1. If the production and offline certificates disagree, or if measured error exceeds the emitted certificate, we count that as a correctness failure. Evidence bundles are hashed, and the canonical campaign records workflow IDs, artifact hashes, source hashes, and native/reference planner parity.</w:t>
       </w:r>
     </w:p>
     <w:bookmarkEnd w:id="52"/>
@@ -6828,7 +6748,7 @@
         <w:pStyle w:val="FirstParagraph"/>
       </w:pPr>
       <w:r>
-        <w:t xml:space="preserve">The public campaign uses four real scenes reconstructed with COLMAP/SfM and seeds isotropic Gaussians from the reconstructed points. These fields are not described as trained photorealistic 3DGS, and public coordinates are normalized rather than metric-scale. A secondary validation path uses a pinned external trained GraphDECO-style PLY while preserving spherical-harmonic coefficients, opacity, anisotropic scale, and rotation. Persistent ownership in this path is deterministic spatial ownership, not semantic segmentation.</w:t>
+        <w:t xml:space="preserve">The public campaign uses four real scenes reconstructed with COLMAP/SfM, from which we seed isotropic Gaussians at the reconstructed points. We do not describe these fields as trained photorealistic 3DGS, and the public coordinates are normalized rather than metric-scale. A second validation path uses a pinned external trained GraphDECO-style PLY and preserves its spherical-harmonic coefficients, opacity, anisotropic scale, and rotation. Ownership in this path is deterministic and spatial; it should not be read as semantic segmentation.</w:t>
       </w:r>
     </w:p>
     <w:bookmarkEnd w:id="53"/>
@@ -6874,7 +6794,7 @@
         <w:pStyle w:val="FirstParagraph"/>
       </w:pPr>
       <w:r>
-        <w:t xml:space="preserve">The evaluation asks seven questions: (RQ1) does the emitted certificate survive independent full replay; (RQ2) when does the method select</w:t>
+        <w:t xml:space="preserve">We structure the evaluation around seven questions. RQ1 asks whether the emitted certificate survives an independent full replay. RQ2 asks when the method chooses</w:t>
       </w:r>
       <w:r>
         <w:t xml:space="preserve"> </w:t>
@@ -6889,7 +6809,7 @@
         <w:t xml:space="preserve"> </w:t>
       </w:r>
       <w:r>
-        <w:t xml:space="preserve">versus</w:t>
+        <w:t xml:space="preserve">rather than</w:t>
       </w:r>
       <w:r>
         <w:t xml:space="preserve"> </w:t>
@@ -6901,7 +6821,7 @@
         <w:t xml:space="preserve">Full</w:t>
       </w:r>
       <w:r>
-        <w:t xml:space="preserve">; (RQ3) how much calibrated work is selected relative to</w:t>
+        <w:t xml:space="preserve">. RQ3 measures selected calibrated work relative to</w:t>
       </w:r>
       <w:r>
         <w:t xml:space="preserve"> </w:t>
@@ -6913,7 +6833,7 @@
         <w:t xml:space="preserve">Full</w:t>
       </w:r>
       <w:r>
-        <w:t xml:space="preserve">; (RQ4) which native work domains remain local; (RQ5) how do simple exact, radius, changed-fraction, and empirical policies compare under the same campaign; (RQ6) does the safety contract transfer to a trained 3DGS representation; and (RQ7) can exact sparse discovery address the observed full-scan Gaussian bottleneck.</w:t>
+        <w:t xml:space="preserve">, and RQ4 looks at which native work domains actually remain local. RQ5 compares exact, radius, changed-fraction, and empirical policies under the same campaign. RQ6 checks whether the safety contract carries over to a trained 3DGS representation. Finally, RQ7 asks whether exact sparse discovery can remove the full-scan Gaussian bottleneck seen in the frozen path.</w:t>
       </w:r>
     </w:p>
     <w:p>
@@ -6921,7 +6841,7 @@
         <w:pStyle w:val="BodyText"/>
       </w:pPr>
       <w:r>
-        <w:t xml:space="preserve">The final public v2.1 campaign freezes 60 revisions across Tanks &amp; Temples Train/Truck and Deep Blending Dr Johnson/Playroom inputs distributed in the pinned GraphDECO bundle. The source archive size and SHA-256 are fixed in the repository manifest. The work calibration is frozen before the final campaign. A prior execution in which a requested translation fell below the production effective-edit threshold is preserved as protocol history rather than retuned or removed; v2.1 enforces the production precondition and records requested and applied edit deltas.</w:t>
+        <w:t xml:space="preserve">The final public v2.1 campaign contains 60 frozen revisions over Tanks &amp; Temples Train/Truck and Deep Blending Dr Johnson/Playroom inputs from the pinned GraphDECO bundle. The repository manifest fixes the source archive size and SHA-256, and the work calibration is frozen before this campaign is run. We also keep an earlier execution in which a requested translation fell below the production effective-edit threshold. Rather than retuning or deleting that case, we preserve it as protocol history; v2.1 enforces the production precondition and records both requested and applied edit deltas.</w:t>
       </w:r>
     </w:p>
     <w:p>
@@ -6929,7 +6849,7 @@
         <w:pStyle w:val="BodyText"/>
       </w:pPr>
       <w:r>
-        <w:t xml:space="preserve">For every selected repair, the campaign records the source edit, selected cone, local/full decision, certificate, independent full-reference residual, native work, calibrated work, and provenance. Fallback cases are retained as results rather than excluded from summary statistics.</w:t>
+        <w:t xml:space="preserve">For each selected repair, the campaign stores the source edit, chosen cone, local/full decision, certificate, independent full-reference residual, native work, calibrated work, and provenance. Fallbacks stay in the dataset and in the summary statistics; they are part of the method’s behavior, not failed trials to be filtered out.</w:t>
       </w:r>
     </w:p>
     <w:bookmarkStart w:id="55" w:name="runtime-scope."/>
@@ -6946,7 +6866,7 @@
         <w:pStyle w:val="FirstParagraph"/>
       </w:pPr>
       <w:r>
-        <w:t xml:space="preserve">The current campaign does not contain paired end-to-end</w:t>
+        <w:t xml:space="preserve">The current campaign does not include paired end-to-end</w:t>
       </w:r>
       <w:r>
         <w:t xml:space="preserve"> </w:t>
@@ -6970,7 +6890,7 @@
         <w:t xml:space="preserve"> </w:t>
       </w:r>
       <w:r>
-        <w:t xml:space="preserve">wall-clock trials under identical execution conditions. Accordingly, no speedup claim is made anywhere in the paper. The public headline is a frozen heterogeneous millisecond-calibrated work ratio, while the baseline suite below reports its own native work-ratio metric. These quantities are intentionally labeled separately.</w:t>
+        <w:t xml:space="preserve">wall-clock trials under identical execution conditions. We therefore make no speedup claim. The public headline is a frozen heterogeneous work ratio calibrated from millisecond measurements, whereas the baseline suite reports a different native work-ratio metric. We label the two separately because collapsing them into one number would overstate what was actually measured.</w:t>
       </w:r>
     </w:p>
     <w:bookmarkEnd w:id="55"/>
@@ -6998,7 +6918,7 @@
         <w:pStyle w:val="FirstParagraph"/>
       </w:pPr>
       <w:r>
-        <w:t xml:space="preserve">The implemented method-level suite contains</w:t>
+        <w:t xml:space="preserve">The method-level suite includes</w:t>
       </w:r>
       <w:r>
         <w:t xml:space="preserve"> </w:t>
@@ -7010,7 +6930,7 @@
         <w:t xml:space="preserve">Full</w:t>
       </w:r>
       <w:r>
-        <w:t xml:space="preserve">, exact-only repair, fixed radius policies, a changed-fraction policy, a held-out empirical scheduler, and CBRC. The empirical signal is permitted to order work but is not certificate-eligible. Structural and analytic ablations remove or replace individual components, while a separately labeled deterministic mechanism-isolation suite constructs stress cases for exact closure, analytic Gaussian influence, temporal influence, quantity-of-interest specialization, hard/soft separation, graph-structured propagation, and fallback behavior.</w:t>
+        <w:t xml:space="preserve">, exact-only repair, fixed-radius policies, a changed-fraction policy, a held-out empirical scheduler, and CBRC. Empirical information may change the order in which candidates are explored, but it is not allowed into the certificate. Structural and analytic ablations remove or replace individual components. Separately, a deterministic mechanism-isolation suite creates stress cases for exact closure, analytic Gaussian influence, temporal influence, quantity-of-interest specialization, hard/soft separation, graph propagation, and fallback behavior.</w:t>
       </w:r>
     </w:p>
     <w:p>
@@ -7018,7 +6938,7 @@
         <w:pStyle w:val="BodyText"/>
       </w:pPr>
       <w:r>
-        <w:t xml:space="preserve">The real campaign is not retuned to force every ablation to separate. Several structural ablations are neutral on the frozen matrix; those results are reported as neutral. The synthetic mechanism suite demonstrates that a mechanism can be falsified under a constructed stress case, not that the same mechanism determines effect size on every real revision.</w:t>
+        <w:t xml:space="preserve">We do not retune the real campaign just to make every ablation look different. Several structural ablations are neutral on the frozen matrix, and we report them that way. The synthetic mechanism suite serves a different purpose: it shows that a mechanism can be made consequential in a controlled stress case, not that the same mechanism determines effect size for every real revision.</w:t>
       </w:r>
     </w:p>
     <w:bookmarkEnd w:id="57"/>
@@ -7045,7 +6965,7 @@
         <w:pStyle w:val="FirstParagraph"/>
       </w:pPr>
       <w:r>
-        <w:t xml:space="preserve">The primary correctness metric is violation count under Eq. 1. We also report local/fallback selection counts, native/reference planner parity, source-edit effect before repair, the median selected calibrated work ratio, and native-domain ratios. Effectivity</w:t>
+        <w:t xml:space="preserve">Our primary correctness metric is the number of violations of Eq. 1. We also report local/fallback counts, native/reference planner agreement, the source-edit effect before repair, the median selected calibrated work ratio, and native-domain ratios. Effectivity,</w:t>
       </w:r>
       <w:r>
         <w:t xml:space="preserve"> </w:t>
@@ -7142,10 +7062,7 @@
         </m:sSubSup>
       </m:oMath>
       <w:r>
-        <w:t xml:space="preserve"> </w:t>
-      </w:r>
-      <w:r>
-        <w:t xml:space="preserve">is reported only when the independent residual is non-zero; it is undefined for numerically zero residual rather than divided by an arbitrary floor.</w:t>
+        <w:t xml:space="preserve">, is only meaningful when the independent residual is non-zero. When the measured residual is numerically zero, we leave effectivity undefined rather than manufacture a finite value with an arbitrary denominator floor.</w:t>
       </w:r>
     </w:p>
     <w:bookmarkEnd w:id="58"/>
@@ -7191,7 +7108,7 @@
         <w:pStyle w:val="FirstParagraph"/>
       </w:pPr>
       <w:r>
-        <w:t xml:space="preserve">Across the 60 frozen public revisions, CBRC selected a certified local repair in 44 cases and automatically selected</w:t>
+        <w:t xml:space="preserve">Across the 60 frozen public revisions, CBRC chose a certified local repair 44 times and returned</w:t>
       </w:r>
       <w:r>
         <w:t xml:space="preserve"> </w:t>
@@ -7206,7 +7123,7 @@
         <w:t xml:space="preserve"> </w:t>
       </w:r>
       <w:r>
-        <w:t xml:space="preserve">in 16. Figure 3 shows representative local and fallback outcomes, while Table 3 summarizes the aggregate evidence. The campaign observed zero certificate violations, and native/reference planner decisions matched on all 60 cases. The maximum measured selected RGB residual was 0 at the reported</w:t>
+        <w:t xml:space="preserve">16 times. Figure 3 shows examples of both outcomes, and Table 3 collects the aggregate numbers. We observed no certificate violation, and the native and reference planners agreed on every decision. At the reported</w:t>
       </w:r>
       <w:r>
         <w:t xml:space="preserve"> </w:t>
@@ -7232,7 +7149,7 @@
         <w:t xml:space="preserve"> </w:t>
       </w:r>
       <w:r>
-        <w:t xml:space="preserve">precision; the maximum selected emitted bound was</w:t>
+        <w:t xml:space="preserve">precision, the largest measured RGB residual after the selected repair was 0; the largest emitted bound among selected cases was</w:t>
       </w:r>
       <w:r>
         <w:t xml:space="preserve"> </w:t>
@@ -7275,7 +7192,7 @@
         <w:pStyle w:val="BodyText"/>
       </w:pPr>
       <w:r>
-        <w:t xml:space="preserve">Zero selected residual does not imply that the revision matrix was visually trivial. Before repair, 56 of the 60 source edits exceeded the protected RGB tolerance. This source-effect check is important because otherwise a zero post-repair residual could be explained by edits that were already below the quantity-of-interest threshold.</w:t>
+        <w:t xml:space="preserve">A zero selected residual would be less informative if the edits were visually negligible to begin with, so we checked that separately. Before repair, 56 of the 60 source edits were already above the protected RGB tolerance. This rules out the simplest explanation that almost all edits were below the quantity-of-interest threshold anyway.</w:t>
       </w:r>
     </w:p>
     <w:p>
@@ -7451,7 +7368,7 @@
         <w:pStyle w:val="FirstParagraph"/>
       </w:pPr>
       <w:r>
-        <w:t xml:space="preserve">corresponding to 2.706</w:t>
+        <w:t xml:space="preserve">which corresponds to 2.706</w:t>
       </w:r>
       <m:oMath>
         <m:r>
@@ -7465,7 +7382,7 @@
         <w:t xml:space="preserve"> </w:t>
       </w:r>
       <w:r>
-        <w:t xml:space="preserve">lower calibrated work. We intentionally do not call this a 2.706</w:t>
+        <w:t xml:space="preserve">lower calibrated work. We avoid calling this a 2.706</w:t>
       </w:r>
       <m:oMath>
         <m:r>
@@ -7479,7 +7396,7 @@
         <w:t xml:space="preserve"> </w:t>
       </w:r>
       <w:r>
-        <w:t xml:space="preserve">speedup: the public scalar is constructed from frozen per-domain microbenchmarks, while campaign phase wall times are recorded separately. A paired local-versus-full end-to-end timing experiment would be required for a speedup claim.</w:t>
+        <w:t xml:space="preserve">speedup. The public scalar is assembled from frozen per-domain microbenchmarks, whereas campaign phase wall times are recorded separately. A speedup claim would require a paired local-versus-full end-to-end timing experiment under the same conditions.</w:t>
       </w:r>
     </w:p>
     <w:bookmarkEnd w:id="60"/>
@@ -7506,7 +7423,7 @@
         <w:pStyle w:val="FirstParagraph"/>
       </w:pPr>
       <w:r>
-        <w:t xml:space="preserve">Table 2 reports the frozen method-level baseline suite on the same 60 cases. The suite re-certifies every selected cone with the conservative certificate, so</w:t>
+        <w:t xml:space="preserve">Table 2 compares the method-level baselines on the same 60 frozen cases. Every selected cone is re-certified using the conservative certificate, so</w:t>
       </w:r>
       <w:r>
         <w:t xml:space="preserve"> </w:t>
@@ -7522,7 +7439,7 @@
         <w:t xml:space="preserve"> </w:t>
       </w:r>
       <w:r>
-        <w:t xml:space="preserve">is not an independent measured-error metric. In particular, exact-only, radius, and changed-fraction policies often choose very little work but fail the certificate on most cases. The empirical-order baseline uses empirical influence only to order expansion and is still re-certified analytically; the separately held-out changed-fraction heuristic is discussed below.</w:t>
+        <w:t xml:space="preserve">should not be confused with an independent measured-error metric. The exact-only, radius, and changed-fraction policies often select very little work, but most of those selections do not pass the certificate. The empirical-order baseline uses empirical influence only to decide expansion order; the final candidate is still certified analytically. We discuss the held-out changed-fraction heuristic separately below.</w:t>
       </w:r>
     </w:p>
     <w:bookmarkStart w:id="61" w:name="tab:baselines"/>
@@ -9048,7 +8965,7 @@
         <w:pStyle w:val="FirstParagraph"/>
       </w:pPr>
       <w:r>
-        <w:t xml:space="preserve">The secondary validation uses a pinned public trained 3DGS PLY with spherical-harmonic coefficients, opacity, anisotropic scale, and rotation preserved. Across five frozen revisions, CBRC selected four certified-local repairs and one full fallback with zero observed violations. The median selected native temporal/output work ratio was 0.03495 of</w:t>
+        <w:t xml:space="preserve">For the secondary check, we use a pinned public trained 3DGS PLY and preserve its spherical-harmonic coefficients, opacity, anisotropic scale, and rotation. Across the five frozen revisions, CBRC chose four certified-local repairs and one full fallback, with no observed violation. Under the native temporal/output work definition used for this experiment, the median selected ratio was 0.03495 of</w:t>
       </w:r>
       <w:r>
         <w:t xml:space="preserve"> </w:t>
@@ -9060,7 +8977,7 @@
         <w:t xml:space="preserve">Full</w:t>
       </w:r>
       <w:r>
-        <w:t xml:space="preserve">, or approximately 28.614</w:t>
+        <w:t xml:space="preserve">, or about 28.614</w:t>
       </w:r>
       <m:oMath>
         <m:r>
@@ -9074,7 +8991,7 @@
         <w:t xml:space="preserve"> </w:t>
       </w:r>
       <w:r>
-        <w:t xml:space="preserve">lower native work under that work definition.</w:t>
+        <w:t xml:space="preserve">lower native work.</w:t>
       </w:r>
     </w:p>
     <w:p>
@@ -9082,7 +8999,7 @@
         <w:pStyle w:val="BodyText"/>
       </w:pPr>
       <w:r>
-        <w:t xml:space="preserve">The domain decomposition in Table 4 is more informative than the scalar. Median Gaussian update and GPU publication ratios are approximately 0.0182, and temporal invalidation is approximately 0.03495, but Gaussian inspection remains 0.999997 of</w:t>
+        <w:t xml:space="preserve">The single scalar hides the most interesting part of this experiment, which is why we also report the domain decomposition in Table 4. Median Gaussian update and GPU publication ratios are about 0.0182, and temporal invalidation is about 0.03495. Gaussian inspection, however, remains 0.999997 of</w:t>
       </w:r>
       <w:r>
         <w:t xml:space="preserve"> </w:t>
@@ -9094,7 +9011,7 @@
         <w:t xml:space="preserve">Full</w:t>
       </w:r>
       <w:r>
-        <w:t xml:space="preserve">. Thus the selected update can be highly local while discovery remains essentially global. We treat this as the principal systems limitation of the frozen end-to-end implementation.</w:t>
+        <w:t xml:space="preserve">. In other words, the update itself can be sharply local while finding the candidates is still almost global. We regard that as the main systems limitation of the frozen end-to-end implementation.</w:t>
       </w:r>
     </w:p>
     <w:bookmarkStart w:id="67" w:name="tab:trained"/>
@@ -9389,7 +9306,7 @@
         <w:pStyle w:val="FirstParagraph"/>
       </w:pPr>
       <w:r>
-        <w:t xml:space="preserve">A separate exact sparse-discovery sweep tests whether the near-full inspection requirement is intrinsic to candidate selection. Across the sweep, sparse discovery preserves exact candidate-selection agreement while reducing the median inspected fraction to 0.01 and the minimum to 0.001 through the tested scale of up to one million Gaussians (Table 5). This result demonstrates that the discovery bottleneck is removable in isolation, but it is not silently credited to the frozen end-to-end work ledger because that index was evaluated separately.</w:t>
+        <w:t xml:space="preserve">We ran a separate exact sparse-discovery sweep to check whether near-full inspection is actually inherent to candidate selection. It is not, at least in this isolated study. Candidate selection remains exactly unchanged while the median inspected fraction falls to 0.01 and the minimum to 0.001, up to the tested scale of one million Gaussians (Table 5). We keep this result separate from the frozen end-to-end ledger because the index was evaluated on its own; crediting those savings to the main pipeline would mix two different experiments.</w:t>
       </w:r>
     </w:p>
     <w:bookmarkStart w:id="69" w:name="tab:sparse"/>
@@ -9667,7 +9584,7 @@
         <w:pStyle w:val="FirstParagraph"/>
       </w:pPr>
       <w:r>
-        <w:t xml:space="preserve">The held-out changed-fraction scheduler produced no observed unsafe false-local decision on the frozen matrix. This is not evidence that empirical sensitivity is a general safety mechanism: the candidate full-reference residual is zero across these cases, so the matrix does not strongly separate empirical scheduling from certification. CBRC therefore keeps empirical edges outside the certificate by construction.</w:t>
+        <w:t xml:space="preserve">The held-out changed-fraction scheduler did not produce an observed unsafe false-local decision on the frozen matrix. That sounds encouraging, but the result is weak evidence for empirical safety because the candidate full-reference residual is zero across these cases. The matrix therefore does not strongly distinguish empirical scheduling from certification. For this reason, CBRC keeps empirical edges outside the certificate by design.</w:t>
       </w:r>
     </w:p>
     <w:p>
@@ -9675,7 +9592,7 @@
         <w:pStyle w:val="BodyText"/>
       </w:pPr>
       <w:r>
-        <w:t xml:space="preserve">Table 6 makes the real-matrix ablation behavior explicit. Five structural/analytic ablations are neutral on these 60 cases. The global-norm-tail replacement remains certificate-safe but collapses to</w:t>
+        <w:t xml:space="preserve">Table 6 is less tidy than a synthetic story would be. Five structural or analytic ablations are neutral on these 60 real cases. A global-norm tail remains certificate-safe but sends every case to</w:t>
       </w:r>
       <w:r>
         <w:t xml:space="preserve"> </w:t>
@@ -9687,10 +9604,7 @@
         <w:t xml:space="preserve">Full</w:t>
       </w:r>
       <w:r>
-        <w:t xml:space="preserve"> </w:t>
-      </w:r>
-      <w:r>
-        <w:t xml:space="preserve">on every case. Removing fallback has the opposite failure mode: it never selects</w:t>
+        <w:t xml:space="preserve">. Removing fallback fails the other way: it never chooses</w:t>
       </w:r>
       <w:r>
         <w:t xml:space="preserve"> </w:t>
@@ -9702,10 +9616,7 @@
         <w:t xml:space="preserve">Full</w:t>
       </w:r>
       <w:r>
-        <w:t xml:space="preserve"> </w:t>
-      </w:r>
-      <w:r>
-        <w:t xml:space="preserve">and only 26.7% of cases pass the certificate. The separately labeled mechanism-isolation suite contains seven deterministic synthetic stress cases, one for each v1 mechanism, and all seven separate in the expected safety/work direction. Those stress cases establish falsifiability of the mechanisms, not real-world effect size.</w:t>
+        <w:t xml:space="preserve">, and only 26.7% of cases pass the certificate. In the separate mechanism-isolation suite, all seven deterministic stress cases move in the expected safety/work direction. Those cases show falsifiability, not real-world effect size.</w:t>
       </w:r>
     </w:p>
     <w:bookmarkStart w:id="71" w:name="tab:ablations"/>
@@ -10656,7 +10567,7 @@
         <w:pStyle w:val="BodyText"/>
       </w:pPr>
       <w:r>
-        <w:t xml:space="preserve">The selected public residual is numerically zero in every frozen case at the reported precision, despite 56/60 source edits exceeding tolerance before repair. The real matrix therefore demonstrates selection/fallback correctness but does not estimate certificate tightness under non-zero accepted residual. We use the threshold-crossing mechanism-isolation cases only to show that the analytic machinery can change decisions when stressed; we do not present them as a substitute for real non-zero-residual evidence.</w:t>
+        <w:t xml:space="preserve">At the reported precision, every selected public residual is numerically zero, even though 56 of the 60 source edits were above tolerance before repair. This lets the real matrix test selection and fallback behavior, but it does not tell us how tight the certificate is when a non-zero residual is still acceptable. The threshold-crossing mechanism-isolation cases are useful here only in a limited sense: they show that the analytic machinery can change a decision when it is stressed. We do not use them as a stand-in for real non-zero-residual evidence.</w:t>
       </w:r>
     </w:p>
     <w:bookmarkEnd w:id="72"/>
@@ -10702,7 +10613,7 @@
         <w:pStyle w:val="FirstParagraph"/>
       </w:pPr>
       <w:r>
-        <w:t xml:space="preserve">Within the frozen revision domain and stated bound assumptions, the experiment supports three concrete statements. First, the emitted certificate survived independent full-reference replay in every evaluated case. Second, the planner did not force locality: more than one quarter of public revisions crossed to</w:t>
+        <w:t xml:space="preserve">Within the frozen revision domain and under the stated bound assumptions, three conclusions are supported by the experiment. The emitted certificate survived independent full-reference replay in every evaluated case. The planner also did not force a local answer: more than a quarter of the public revisions crossed to</w:t>
       </w:r>
       <w:r>
         <w:t xml:space="preserve"> </w:t>
@@ -10714,7 +10625,7 @@
         <w:t xml:space="preserve">Full</w:t>
       </w:r>
       <w:r>
-        <w:t xml:space="preserve">. Third, when a local result was selected, the frozen calibrated model often assigned substantially less work than a full rebuild. These statements are stronger than showing that a changed-region heuristic happens to work on average, but weaker than a formal proof of universal production safety.</w:t>
+        <w:t xml:space="preserve">. Finally, when a local result was selected, the frozen calibrated model usually assigned much less work than a full rebuild. This is stronger evidence than showing that a changed-region heuristic works on average, but it is still far short of a proof of universal production safety.</w:t>
       </w:r>
     </w:p>
     <w:p>
@@ -10722,7 +10633,7 @@
         <w:pStyle w:val="BodyText"/>
       </w:pPr>
       <w:r>
-        <w:t xml:space="preserve">The most important distinction is between</w:t>
+        <w:t xml:space="preserve">For us, the central distinction is between</w:t>
       </w:r>
       <w:r>
         <w:t xml:space="preserve"> </w:t>
@@ -10751,7 +10662,7 @@
         <w:t xml:space="preserve">prediction</w:t>
       </w:r>
       <w:r>
-        <w:t xml:space="preserve">. An empirical scheduler may correctly guess that a local update is safe on all available cases, yet it remains unable to justify an unobserved case unless its prediction is converted into a conservative bound with a valid remainder. CBRC therefore uses empirical information only for scheduling. Conversely, an</w:t>
+        <w:t xml:space="preserve">. An empirical scheduler can guess every available case correctly and still have no defensible answer for the next unseen case. To become part of the safety argument, that prediction would need a conservative bound with a valid remainder. CBRC therefore lets empirical information influence scheduling, but not certification. The converse can also happen: an</w:t>
       </w:r>
       <w:r>
         <w:t xml:space="preserve"> </w:t>
@@ -10766,7 +10677,7 @@
         <w:t xml:space="preserve"> </w:t>
       </w:r>
       <w:r>
-        <w:t xml:space="preserve">edge may be conservative enough to force</w:t>
+        <w:t xml:space="preserve">edge may be so conservative that it pushes the system to</w:t>
       </w:r>
       <w:r>
         <w:t xml:space="preserve"> </w:t>
@@ -10781,7 +10692,7 @@
         <w:t xml:space="preserve"> </w:t>
       </w:r>
       <w:r>
-        <w:t xml:space="preserve">frequently; that is a cost of the safety contract, not a correctness failure.</w:t>
+        <w:t xml:space="preserve">more often than we would like. That is an efficiency cost of the contract, not a correctness failure.</w:t>
       </w:r>
     </w:p>
     <w:bookmarkEnd w:id="74"/>
@@ -10817,7 +10728,7 @@
         <w:pStyle w:val="FirstParagraph"/>
       </w:pPr>
       <w:r>
-        <w:t xml:space="preserve">Every exact dependency needed to reproduce repaired state must be represented by</w:t>
+        <w:t xml:space="preserve">The certificate is only as trustworthy as its edge assumptions. Exact dependencies needed to reproduce repaired state must appear in</w:t>
       </w:r>
       <w:r>
         <w:t xml:space="preserve"> </w:t>
@@ -10832,7 +10743,7 @@
         <w:t xml:space="preserve"> </w:t>
       </w:r>
       <w:r>
-        <w:t xml:space="preserve">closure, and every</w:t>
+        <w:t xml:space="preserve">closure, and each</w:t>
       </w:r>
       <w:r>
         <w:t xml:space="preserve"> </w:t>
@@ -10847,7 +10758,7 @@
         <w:t xml:space="preserve"> </w:t>
       </w:r>
       <w:r>
-        <w:t xml:space="preserve">edge must be a finite-change upper bound over the declared revision domain. A representation, shader, temporal rule, or ownership change can invalidate previously calibrated metadata. Certificates therefore require versioned bound provenance and regression tests.</w:t>
+        <w:t xml:space="preserve">edge must remain a valid finite-change upper bound over the declared revision domain. Representation, shader, temporal-rule, or ownership changes can invalidate earlier calibration, so bound provenance must be versioned and regression-tested.</w:t>
       </w:r>
     </w:p>
     <w:bookmarkEnd w:id="75"/>
@@ -10865,7 +10776,7 @@
         <w:pStyle w:val="FirstParagraph"/>
       </w:pPr>
       <w:r>
-        <w:t xml:space="preserve">The most direct implementation limitation is the near-full Gaussian inspection ratio. Sparse discovery shows that exact selection can be achieved with far fewer inspections, but integration into the complete measured pipeline remains future engineering. This limitation prevents interpreting the current local update ratios as end-to-end complexity reduction across all phases.</w:t>
+        <w:t xml:space="preserve">The clearest implementation limitation is still Gaussian inspection. In the frozen path it is almost a full scan. The sparse-discovery experiment shows that exact selection can be recovered with far fewer inspections, but that index has not yet been integrated into the complete measured pipeline. Until it is, the low update ratios should not be read as end-to-end complexity reduction across every phase of the system.</w:t>
       </w:r>
     </w:p>
     <w:bookmarkEnd w:id="76"/>
@@ -10883,7 +10794,7 @@
         <w:pStyle w:val="FirstParagraph"/>
       </w:pPr>
       <w:r>
-        <w:t xml:space="preserve">The 2.706</w:t>
+        <w:t xml:space="preserve">The public 2.706</w:t>
       </w:r>
       <m:oMath>
         <m:r>
@@ -10897,7 +10808,7 @@
         <w:t xml:space="preserve"> </w:t>
       </w:r>
       <w:r>
-        <w:t xml:space="preserve">public figure is calibrated heterogeneous work reduction, and the 28.614</w:t>
+        <w:t xml:space="preserve">figure is a reduction in calibrated heterogeneous work. The trained 28.614</w:t>
       </w:r>
       <m:oMath>
         <m:r>
@@ -10911,7 +10822,7 @@
         <w:t xml:space="preserve"> </w:t>
       </w:r>
       <w:r>
-        <w:t xml:space="preserve">trained figure is native temporal/output work reduction. Neither is a paired local-versus-full runtime speedup. A future evaluation should perform matched end-to-end timing under identical execution conditions after sparse discovery is integrated.</w:t>
+        <w:t xml:space="preserve">figure is a reduction in native temporal/output work. Neither number is a paired local-versus-full runtime speedup. The missing experiment is straightforward in principle: after sparse discovery is integrated, run matched end-to-end timings under identical conditions and report those timings directly.</w:t>
       </w:r>
     </w:p>
     <w:bookmarkEnd w:id="77"/>
@@ -10929,7 +10840,7 @@
         <w:pStyle w:val="FirstParagraph"/>
       </w:pPr>
       <w:r>
-        <w:t xml:space="preserve">Equation 15 constructs a certified feasible cone but does not prove that no cheaper safe cone exists. Global combinatorial minimum-work optimization is outside the v1 claim.</w:t>
+        <w:t xml:space="preserve">Equation 15 gives us a certified feasible cone, not a proof that the cone is the cheapest safe one. Finding the global minimum-work solution is a combinatorial optimization problem and is outside the v1 claim.</w:t>
       </w:r>
     </w:p>
     <w:bookmarkEnd w:id="78"/>
@@ -10947,7 +10858,7 @@
         <w:pStyle w:val="FirstParagraph"/>
       </w:pPr>
       <w:r>
-        <w:t xml:space="preserve">The reference formulation admits the classical resolvent when its assumptions hold, but the native v1 path certifies finite analytic DAG exteriors. Unsupported cycles trigger cone expansion or</w:t>
+        <w:t xml:space="preserve">The reference formulation allows the classical resolvent when its assumptions are satisfied. The native v1 implementation is narrower and certifies finite analytic DAG exteriors. Unsupported cycles therefore cause the cone to expand or fall back to</w:t>
       </w:r>
       <w:r>
         <w:t xml:space="preserve"> </w:t>
@@ -10959,7 +10870,7 @@
         <w:t xml:space="preserve">Full</w:t>
       </w:r>
       <w:r>
-        <w:t xml:space="preserve">. General cyclic certification is future work.</w:t>
+        <w:t xml:space="preserve">. General cyclic certification remains future work.</w:t>
       </w:r>
     </w:p>
     <w:bookmarkEnd w:id="79"/>
@@ -10977,7 +10888,7 @@
         <w:pStyle w:val="FirstParagraph"/>
       </w:pPr>
       <w:r>
-        <w:t xml:space="preserve">The primary public campaign uses normalized RGB/SfM reconstructions seeded into Gaussian fields rather than trained photorealistic 3DGS, and it is not a metric-scale reconstruction benchmark. The trained-3DGS experiment is a secondary representation check with only five revisions. Broader trained-scene evaluation would strengthen generality.</w:t>
+        <w:t xml:space="preserve">The primary public campaign is built from normalized RGB/SfM reconstructions seeded into Gaussian fields, not from trained photorealistic 3DGS, and it is not a metric-scale reconstruction benchmark. The trained-3DGS experiment helps, but it is only a five-revision representation check. A broader evaluation over trained scenes is the obvious next step if we want stronger evidence of generality.</w:t>
       </w:r>
     </w:p>
     <w:bookmarkEnd w:id="80"/>
@@ -10995,7 +10906,7 @@
         <w:pStyle w:val="FirstParagraph"/>
       </w:pPr>
       <w:r>
-        <w:t xml:space="preserve">Not every mechanism separates on the frozen real matrix. The paper therefore distinguishes real-workload evidence from synthetic mechanism isolation and does not claim that each mechanism contributes measurable benefit in every scene.</w:t>
+        <w:t xml:space="preserve">Not every mechanism separates on the frozen real matrix. Rather than forcing a cleaner story, we keep the real-workload results distinct from the synthetic mechanism-isolation results. The paper therefore does not claim that every mechanism produces a measurable benefit in every scene.</w:t>
       </w:r>
     </w:p>
     <w:bookmarkEnd w:id="81"/>
@@ -11023,7 +10934,7 @@
         <w:pStyle w:val="FirstParagraph"/>
       </w:pPr>
       <w:r>
-        <w:t xml:space="preserve">The larger implication is a change in default behavior for persistent captured worlds. A system need not choose between always rebuilding and trusting a local heuristic. If dependencies can be split into exact and conservatively bounded relations, locality can itself become a runtime decision with a falsifiable output contract. This principle extends beyond Gaussian rendering: caches, temporal histories, spatial acceleration structures, compressed representations, and publication buffers can participate so long as their exact or bounded dependency semantics are explicit.</w:t>
+        <w:t xml:space="preserve">The broader point is not that persistent captured worlds should always update locally. Locality can instead become a runtime decision. If dependencies can be separated into exact relations and conservatively bounded ones, a local update can carry a falsifiable output contract rather than relying on a heuristic alone. The same principle can extend beyond Gaussian rendering to caches, temporal histories, spatial acceleration structures, compressed representations, and publication buffers when their dependency semantics are explicit.</w:t>
       </w:r>
     </w:p>
     <w:p>
@@ -11031,7 +10942,7 @@
         <w:pStyle w:val="BodyText"/>
       </w:pPr>
       <w:r>
-        <w:t xml:space="preserve">The framework also makes failure scientifically useful. A certificate violation is not averaged into a quality metric; it is retained as a regression target with the revision manifest, graph version, chosen cone, emitted bound, full-reference output, and first violated invariant. This treatment aligns performance evaluation with the correctness burden created by selective recomputation.</w:t>
+        <w:t xml:space="preserve">Failure is also more useful when it is kept intact. A certificate violation is not folded into an average quality score; we retain it as a regression target together with the revision manifest, graph version, chosen cone, emitted bound, full-reference output, and the first violated invariant. That may be less convenient than a single aggregate metric, but it matches the correctness burden introduced by selective recomputation.</w:t>
       </w:r>
     </w:p>
     <w:bookmarkEnd w:id="83"/>
@@ -11059,7 +10970,7 @@
         <w:pStyle w:val="FirstParagraph"/>
       </w:pPr>
       <w:r>
-        <w:t xml:space="preserve">The canonical evidence freeze records workflow run IDs, artifact IDs, Git SHAs, archive hashes, campaign-row hashes, calibration hashes, and the pinned trained-PLY hash. The public source archive is pinned by byte size and SHA-256; the trained PLY is fetched by explicit repository, revision, path, byte size, and SHA-256 and is not redistributed by MAVEB. The project repository includes the dense reference implementation, native planner and oracle, public and trained campaign drivers, baseline and ablation suites, sparse-discovery sweep, deterministic paper-artifact generators, and regression tests.</w:t>
+        <w:t xml:space="preserve">The canonical evidence freeze records workflow run IDs, artifact IDs, Git SHAs, archive hashes, campaign-row hashes, calibration hashes, and the hash of the pinned trained PLY. The public source archive is fixed by byte size and SHA-256. The trained PLY is fetched from an explicit repository revision and path, with its byte size and SHA-256 checked, and MAVEB does not redistribute it. The repository also contains the dense reference implementation, native planner and oracle, public and trained campaign drivers, baseline and ablation suites, the sparse-discovery sweep, deterministic paper-artifact generators, and regression tests.</w:t>
       </w:r>
     </w:p>
     <w:p>
@@ -11067,11 +10978,11 @@
         <w:pStyle w:val="BodyText"/>
       </w:pPr>
       <w:r>
-        <w:t xml:space="preserve">Scene figures retain applicable upstream terms. Original software is licensed under Apache-2.0; original research communication is scoped under CC BY 4.0; third-party rights are recorded separately. For double-blind review, the public repository and author metadata should be replaced by an anonymized frozen supplement consistent with venue policy.</w:t>
+        <w:t xml:space="preserve">Scene figures retain the relevant upstream terms. Original software is licensed under Apache-2.0, original research communication is scoped under CC BY 4.0, and third-party rights are recorded separately. For double-blind review, the identifiable repository and author metadata should be replaced with an anonymized frozen supplement that follows the target venue’s policy.</w:t>
       </w:r>
     </w:p>
     <w:bookmarkEnd w:id="85"/>
-    <w:bookmarkStart w:id="125" w:name="conclusion"/>
+    <w:bookmarkStart w:id="86" w:name="conclusion"/>
     <w:p>
       <w:pPr>
         <w:pStyle w:val="Heading1"/>
@@ -11094,11 +11005,38 @@
         <w:pStyle w:val="FirstParagraph"/>
       </w:pPr>
       <w:r>
-        <w:t xml:space="preserve">We presented Criticality-Bounded Revision Cones, where criticality is the worst normalized certificate-to-tolerance ratio for the protected outputs, as a fail-closed method for selective recomputation in persistent captured worlds. CBRC separates exact dependencies from conservative finite-change influence, binds the unrepaired exterior to explicit output tolerances, compares regional work against a full baseline, and independently replays every selected result against a full-after oracle. The frozen public and trained-representation campaigns show that local repair and full fallback can coexist under one auditable contract, while also exposing a near-global discovery bottleneck and the absence of a current wall-clock speedup claim. The central principle is simple: a persistent world should repair locally only when it can justify what it leaves untouched; otherwise it should rebuild.</w:t>
-      </w:r>
-    </w:p>
-    <w:bookmarkStart w:id="124" w:name="refs"/>
-    <w:bookmarkStart w:id="87" w:name="ref-acar2013selfadjusting"/>
+        <w:t xml:space="preserve">We introduced Criticality-Bounded Revision Cones as a fail-closed rule for selective recomputation in persistent captured worlds. Criticality is the worst normalized certificate-to-tolerance ratio over the protected outputs. CBRC separates exact dependencies from bounded finite-change influence, ties the unrepaired exterior to explicit tolerances, compares regional work with a full baseline, and independently replays the selected result against a full-after oracle. The frozen public and trained-representation experiments show that local repair and full fallback can coexist under one auditable contract. They also expose the remaining gaps: discovery is still close to global in the frozen path, and there is no paired wall-clock speedup result yet. Repair locally when the system can justify what it leaves alone; rebuild when it cannot.</w:t>
+      </w:r>
+    </w:p>
+    <w:bookmarkEnd w:id="86"/>
+    <w:bookmarkStart w:id="127" w:name="acknowledgments"/>
+    <w:p>
+      <w:pPr>
+        <w:pStyle w:val="Heading1"/>
+      </w:pPr>
+      <w:r>
+        <w:t xml:space="preserve">Acknowledgments</w:t>
+      </w:r>
+    </w:p>
+    <w:bookmarkStart w:id="126" w:name="generative-ai-use-disclosure."/>
+    <w:p>
+      <w:pPr>
+        <w:pStyle w:val="Heading4"/>
+      </w:pPr>
+      <w:r>
+        <w:t xml:space="preserve">Generative AI use disclosure.</w:t>
+      </w:r>
+    </w:p>
+    <w:p>
+      <w:pPr>
+        <w:pStyle w:val="FirstParagraph"/>
+      </w:pPr>
+      <w:r>
+        <w:t xml:space="preserve">OpenAI ChatGPT was used as an assistive tool during portions of this project for literature-search support, software and scripting development, debugging, experimental and benchmark planning, visualization/manuscript-artifact scripting, and drafting, restructuring, and language editing of the manuscript and supplement. The reported measurements and frozen evidence were produced by the project software and experimental artifacts rather than generated by the language model. The author retains full responsibility for the code, citations, analysis, claims, conclusions, and final text; no generative AI system is listed as an author.</w:t>
+      </w:r>
+    </w:p>
+    <w:bookmarkStart w:id="125" w:name="refs"/>
+    <w:bookmarkStart w:id="88" w:name="ref-acar2013selfadjusting"/>
     <w:p>
       <w:pPr>
         <w:pStyle w:val="Bibliography"/>
@@ -11131,7 +11069,7 @@
       <w:r>
         <w:t xml:space="preserve"> </w:t>
       </w:r>
-      <w:hyperlink r:id="rId86">
+      <w:hyperlink r:id="rId87">
         <w:r>
           <w:rPr>
             <w:rStyle w:val="Hyperlink"/>
@@ -11143,8 +11081,8 @@
         <w:t xml:space="preserve">.</w:t>
       </w:r>
     </w:p>
-    <w:bookmarkEnd w:id="87"/>
-    <w:bookmarkStart w:id="88" w:name="ref-ackermann2025clsplats"/>
+    <w:bookmarkEnd w:id="88"/>
+    <w:bookmarkStart w:id="89" w:name="ref-ackermann2025clsplats"/>
     <w:p>
       <w:pPr>
         <w:pStyle w:val="Bibliography"/>
@@ -11178,8 +11116,8 @@
         <w:t xml:space="preserve">, 7808–17.</w:t>
       </w:r>
     </w:p>
-    <w:bookmarkEnd w:id="88"/>
-    <w:bookmarkStart w:id="90" w:name="ref-bala1999raysegment"/>
+    <w:bookmarkEnd w:id="89"/>
+    <w:bookmarkStart w:id="91" w:name="ref-bala1999raysegment"/>
     <w:p>
       <w:pPr>
         <w:pStyle w:val="Bibliography"/>
@@ -11215,7 +11153,7 @@
       <w:r>
         <w:t xml:space="preserve"> </w:t>
       </w:r>
-      <w:hyperlink r:id="rId89">
+      <w:hyperlink r:id="rId90">
         <w:r>
           <w:rPr>
             <w:rStyle w:val="Hyperlink"/>
@@ -11227,8 +11165,8 @@
         <w:t xml:space="preserve">.</w:t>
       </w:r>
     </w:p>
-    <w:bookmarkEnd w:id="90"/>
-    <w:bookmarkStart w:id="92" w:name="ref-chen2024gaussianeditor"/>
+    <w:bookmarkEnd w:id="91"/>
+    <w:bookmarkStart w:id="93" w:name="ref-chen2024gaussianeditor"/>
     <w:p>
       <w:pPr>
         <w:pStyle w:val="Bibliography"/>
@@ -11264,7 +11202,7 @@
       <w:r>
         <w:t xml:space="preserve"> </w:t>
       </w:r>
-      <w:hyperlink r:id="rId91">
+      <w:hyperlink r:id="rId92">
         <w:r>
           <w:rPr>
             <w:rStyle w:val="Hyperlink"/>
@@ -11276,8 +11214,8 @@
         <w:t xml:space="preserve">.</w:t>
       </w:r>
     </w:p>
-    <w:bookmarkEnd w:id="92"/>
-    <w:bookmarkStart w:id="93" w:name="ref-curless1996volumetric"/>
+    <w:bookmarkEnd w:id="93"/>
+    <w:bookmarkStart w:id="94" w:name="ref-curless1996volumetric"/>
     <w:p>
       <w:pPr>
         <w:pStyle w:val="Bibliography"/>
@@ -11311,8 +11249,8 @@
         <w:t xml:space="preserve">, 303–12.</w:t>
       </w:r>
     </w:p>
-    <w:bookmarkEnd w:id="93"/>
-    <w:bookmarkStart w:id="94" w:name="ref-dai2017bundlefusion"/>
+    <w:bookmarkEnd w:id="94"/>
+    <w:bookmarkStart w:id="95" w:name="ref-dai2017bundlefusion"/>
     <w:p>
       <w:pPr>
         <w:pStyle w:val="Bibliography"/>
@@ -11343,8 +11281,8 @@
         <w:t xml:space="preserve">36 (4): 76:1–18.</w:t>
       </w:r>
     </w:p>
-    <w:bookmarkEnd w:id="94"/>
-    <w:bookmarkStart w:id="95" w:name="ref-ellensohn2026eligsir"/>
+    <w:bookmarkEnd w:id="95"/>
+    <w:bookmarkStart w:id="96" w:name="ref-ellensohn2026eligsir"/>
     <w:p>
       <w:pPr>
         <w:pStyle w:val="Bibliography"/>
@@ -11372,8 +11310,8 @@
         <w:t xml:space="preserve">.</w:t>
       </w:r>
     </w:p>
-    <w:bookmarkEnd w:id="95"/>
-    <w:bookmarkStart w:id="96" w:name="ref-galappaththige2026pixels"/>
+    <w:bookmarkEnd w:id="96"/>
+    <w:bookmarkStart w:id="97" w:name="ref-galappaththige2026pixels"/>
     <w:p>
       <w:pPr>
         <w:pStyle w:val="Bibliography"/>
@@ -11401,8 +11339,8 @@
         <w:t xml:space="preserve">.</w:t>
       </w:r>
     </w:p>
-    <w:bookmarkEnd w:id="96"/>
-    <w:bookmarkStart w:id="98" w:name="ref-huang2024scgs"/>
+    <w:bookmarkEnd w:id="97"/>
+    <w:bookmarkStart w:id="99" w:name="ref-huang2024scgs"/>
     <w:p>
       <w:pPr>
         <w:pStyle w:val="Bibliography"/>
@@ -11438,7 +11376,7 @@
       <w:r>
         <w:t xml:space="preserve"> </w:t>
       </w:r>
-      <w:hyperlink r:id="rId97">
+      <w:hyperlink r:id="rId98">
         <w:r>
           <w:rPr>
             <w:rStyle w:val="Hyperlink"/>
@@ -11450,8 +11388,8 @@
         <w:t xml:space="preserve">.</w:t>
       </w:r>
     </w:p>
-    <w:bookmarkEnd w:id="98"/>
-    <w:bookmarkStart w:id="99" w:name="ref-keetha2024splatam"/>
+    <w:bookmarkEnd w:id="99"/>
+    <w:bookmarkStart w:id="100" w:name="ref-keetha2024splatam"/>
     <w:p>
       <w:pPr>
         <w:pStyle w:val="Bibliography"/>
@@ -11485,8 +11423,8 @@
         <w:t xml:space="preserve">, 21357–66.</w:t>
       </w:r>
     </w:p>
-    <w:bookmarkEnd w:id="99"/>
-    <w:bookmarkStart w:id="101" w:name="ref-kerbl2023gaussians"/>
+    <w:bookmarkEnd w:id="100"/>
+    <w:bookmarkStart w:id="102" w:name="ref-kerbl2023gaussians"/>
     <w:p>
       <w:pPr>
         <w:pStyle w:val="Bibliography"/>
@@ -11519,7 +11457,7 @@
       <w:r>
         <w:t xml:space="preserve"> </w:t>
       </w:r>
-      <w:hyperlink r:id="rId100">
+      <w:hyperlink r:id="rId101">
         <w:r>
           <w:rPr>
             <w:rStyle w:val="Hyperlink"/>
@@ -11531,8 +11469,8 @@
         <w:t xml:space="preserve">.</w:t>
       </w:r>
     </w:p>
-    <w:bookmarkEnd w:id="101"/>
-    <w:bookmarkStart w:id="103" w:name="ref-luiten2024dynamic3dgaussians"/>
+    <w:bookmarkEnd w:id="102"/>
+    <w:bookmarkStart w:id="104" w:name="ref-luiten2024dynamic3dgaussians"/>
     <w:p>
       <w:pPr>
         <w:pStyle w:val="Bibliography"/>
@@ -11568,7 +11506,7 @@
       <w:r>
         <w:t xml:space="preserve"> </w:t>
       </w:r>
-      <w:hyperlink r:id="rId102">
+      <w:hyperlink r:id="rId103">
         <w:r>
           <w:rPr>
             <w:rStyle w:val="Hyperlink"/>
@@ -11580,8 +11518,8 @@
         <w:t xml:space="preserve">.</w:t>
       </w:r>
     </w:p>
-    <w:bookmarkEnd w:id="103"/>
-    <w:bookmarkStart w:id="105" w:name="ref-matsuki2024monogs"/>
+    <w:bookmarkEnd w:id="104"/>
+    <w:bookmarkStart w:id="106" w:name="ref-matsuki2024monogs"/>
     <w:p>
       <w:pPr>
         <w:pStyle w:val="Bibliography"/>
@@ -11617,7 +11555,7 @@
       <w:r>
         <w:t xml:space="preserve"> </w:t>
       </w:r>
-      <w:hyperlink r:id="rId104">
+      <w:hyperlink r:id="rId105">
         <w:r>
           <w:rPr>
             <w:rStyle w:val="Hyperlink"/>
@@ -11629,8 +11567,8 @@
         <w:t xml:space="preserve">.</w:t>
       </w:r>
     </w:p>
-    <w:bookmarkEnd w:id="105"/>
-    <w:bookmarkStart w:id="106" w:name="ref-mildenhall2020nerf"/>
+    <w:bookmarkEnd w:id="106"/>
+    <w:bookmarkStart w:id="107" w:name="ref-mildenhall2020nerf"/>
     <w:p>
       <w:pPr>
         <w:pStyle w:val="Bibliography"/>
@@ -11664,8 +11602,8 @@
         <w:t xml:space="preserve">, 405–21.</w:t>
       </w:r>
     </w:p>
-    <w:bookmarkEnd w:id="106"/>
-    <w:bookmarkStart w:id="107" w:name="ref-newcombe2011kinectfusion"/>
+    <w:bookmarkEnd w:id="107"/>
+    <w:bookmarkStart w:id="108" w:name="ref-newcombe2011kinectfusion"/>
     <w:p>
       <w:pPr>
         <w:pStyle w:val="Bibliography"/>
@@ -11699,8 +11637,8 @@
         <w:t xml:space="preserve">, 127–36.</w:t>
       </w:r>
     </w:p>
-    <w:bookmarkEnd w:id="107"/>
-    <w:bookmarkStart w:id="109" w:name="ref-oden2001goal"/>
+    <w:bookmarkEnd w:id="108"/>
+    <w:bookmarkStart w:id="110" w:name="ref-oden2001goal"/>
     <w:p>
       <w:pPr>
         <w:pStyle w:val="Bibliography"/>
@@ -11733,7 +11671,7 @@
       <w:r>
         <w:t xml:space="preserve"> </w:t>
       </w:r>
-      <w:hyperlink r:id="rId108">
+      <w:hyperlink r:id="rId109">
         <w:r>
           <w:rPr>
             <w:rStyle w:val="Hyperlink"/>
@@ -11745,8 +11683,8 @@
         <w:t xml:space="preserve">.</w:t>
       </w:r>
     </w:p>
-    <w:bookmarkEnd w:id="109"/>
-    <w:bookmarkStart w:id="111" w:name="ref-pfister2000surfels"/>
+    <w:bookmarkEnd w:id="110"/>
+    <w:bookmarkStart w:id="112" w:name="ref-pfister2000surfels"/>
     <w:p>
       <w:pPr>
         <w:pStyle w:val="Bibliography"/>
@@ -11782,7 +11720,7 @@
       <w:r>
         <w:t xml:space="preserve"> </w:t>
       </w:r>
-      <w:hyperlink r:id="rId110">
+      <w:hyperlink r:id="rId111">
         <w:r>
           <w:rPr>
             <w:rStyle w:val="Hyperlink"/>
@@ -11794,8 +11732,8 @@
         <w:t xml:space="preserve">.</w:t>
       </w:r>
     </w:p>
-    <w:bookmarkEnd w:id="111"/>
-    <w:bookmarkStart w:id="113" w:name="ref-sucar2021imap"/>
+    <w:bookmarkEnd w:id="112"/>
+    <w:bookmarkStart w:id="114" w:name="ref-sucar2021imap"/>
     <w:p>
       <w:pPr>
         <w:pStyle w:val="Bibliography"/>
@@ -11831,7 +11769,7 @@
       <w:r>
         <w:t xml:space="preserve"> </w:t>
       </w:r>
-      <w:hyperlink r:id="rId112">
+      <w:hyperlink r:id="rId113">
         <w:r>
           <w:rPr>
             <w:rStyle w:val="Hyperlink"/>
@@ -11843,8 +11781,8 @@
         <w:t xml:space="preserve">.</w:t>
       </w:r>
     </w:p>
-    <w:bookmarkEnd w:id="113"/>
-    <w:bookmarkStart w:id="114" w:name="ref-whelan2015elasticfusion"/>
+    <w:bookmarkEnd w:id="114"/>
+    <w:bookmarkStart w:id="115" w:name="ref-whelan2015elasticfusion"/>
     <w:p>
       <w:pPr>
         <w:pStyle w:val="Bibliography"/>
@@ -11878,8 +11816,8 @@
         <w:t xml:space="preserve">.</w:t>
       </w:r>
     </w:p>
-    <w:bookmarkEnd w:id="114"/>
-    <w:bookmarkStart w:id="116" w:name="ref-woerister2013lazy"/>
+    <w:bookmarkEnd w:id="115"/>
+    <w:bookmarkStart w:id="117" w:name="ref-woerister2013lazy"/>
     <w:p>
       <w:pPr>
         <w:pStyle w:val="Bibliography"/>
@@ -11915,7 +11853,7 @@
       <w:r>
         <w:t xml:space="preserve"> </w:t>
       </w:r>
-      <w:hyperlink r:id="rId115">
+      <w:hyperlink r:id="rId116">
         <w:r>
           <w:rPr>
             <w:rStyle w:val="Hyperlink"/>
@@ -11927,8 +11865,8 @@
         <w:t xml:space="preserve">.</w:t>
       </w:r>
     </w:p>
-    <w:bookmarkEnd w:id="116"/>
-    <w:bookmarkStart w:id="118" w:name="ref-wu2024fourDGS"/>
+    <w:bookmarkEnd w:id="117"/>
+    <w:bookmarkStart w:id="119" w:name="ref-wu2024fourDGS"/>
     <w:p>
       <w:pPr>
         <w:pStyle w:val="Bibliography"/>
@@ -11964,7 +11902,7 @@
       <w:r>
         <w:t xml:space="preserve"> </w:t>
       </w:r>
-      <w:hyperlink r:id="rId117">
+      <w:hyperlink r:id="rId118">
         <w:r>
           <w:rPr>
             <w:rStyle w:val="Hyperlink"/>
@@ -11976,8 +11914,8 @@
         <w:t xml:space="preserve">.</w:t>
       </w:r>
     </w:p>
-    <w:bookmarkEnd w:id="118"/>
-    <w:bookmarkStart w:id="119" w:name="ref-wu2026cif"/>
+    <w:bookmarkEnd w:id="119"/>
+    <w:bookmarkStart w:id="120" w:name="ref-wu2026cif"/>
     <w:p>
       <w:pPr>
         <w:pStyle w:val="Bibliography"/>
@@ -12011,8 +11949,8 @@
         <w:t xml:space="preserve">, 3783–93.</w:t>
       </w:r>
     </w:p>
-    <w:bookmarkEnd w:id="119"/>
-    <w:bookmarkStart w:id="120" w:name="ref-yugay2026game"/>
+    <w:bookmarkEnd w:id="120"/>
+    <w:bookmarkStart w:id="121" w:name="ref-yugay2026game"/>
     <w:p>
       <w:pPr>
         <w:pStyle w:val="Bibliography"/>
@@ -12046,8 +11984,8 @@
         <w:t xml:space="preserve">, 18903–12.</w:t>
       </w:r>
     </w:p>
-    <w:bookmarkEnd w:id="120"/>
-    <w:bookmarkStart w:id="122" w:name="ref-zeng2025gaussianupdate"/>
+    <w:bookmarkEnd w:id="121"/>
+    <w:bookmarkStart w:id="123" w:name="ref-zeng2025gaussianupdate"/>
     <w:p>
       <w:pPr>
         <w:pStyle w:val="Bibliography"/>
@@ -12083,7 +12021,7 @@
       <w:r>
         <w:t xml:space="preserve"> </w:t>
       </w:r>
-      <w:hyperlink r:id="rId121">
+      <w:hyperlink r:id="rId122">
         <w:r>
           <w:rPr>
             <w:rStyle w:val="Hyperlink"/>
@@ -12095,8 +12033,8 @@
         <w:t xml:space="preserve">.</w:t>
       </w:r>
     </w:p>
-    <w:bookmarkEnd w:id="122"/>
-    <w:bookmarkStart w:id="123" w:name="ref-zhu2022niceslam"/>
+    <w:bookmarkEnd w:id="123"/>
+    <w:bookmarkStart w:id="124" w:name="ref-zhu2022niceslam"/>
     <w:p>
       <w:pPr>
         <w:pStyle w:val="Bibliography"/>
@@ -12130,9 +12068,10 @@
         <w:t xml:space="preserve">, 12786–96.</w:t>
       </w:r>
     </w:p>
-    <w:bookmarkEnd w:id="123"/>
     <w:bookmarkEnd w:id="124"/>
     <w:bookmarkEnd w:id="125"/>
+    <w:bookmarkEnd w:id="126"/>
+    <w:bookmarkEnd w:id="127"/>
     <w:sectPr>
       <w:pgSz w:w="12240" w:h="15840"/>
       <w:pgMar w:top="1008" w:bottom="1008" w:left="1008" w:right="1008"/>

</xml_diff>

<commit_message>
Rebuild final manuscripts after consistency audit
</commit_message>
<xml_diff>
--- a/researchpaper/MAVEB_manuscript.docx
+++ b/researchpaper/MAVEB_manuscript.docx
@@ -136,7 +136,7 @@
         <w:t xml:space="preserve">Full</w:t>
       </w:r>
       <w:r>
-        <w:t xml:space="preserve">. The selected result is replayed against an independent full-after reference, so we check measured error</w:t>
+        <w:t xml:space="preserve">. The residual left outside the selected repair support is checked against an independently rendered full-after reference, so we test measured residual</w:t>
       </w:r>
       <w:r>
         <w:t xml:space="preserve"> </w:t>
@@ -178,7 +178,7 @@
         <w:pStyle w:val="BodyText"/>
       </w:pPr>
       <w:r>
-        <w:t xml:space="preserve">On the frozen public campaign of 60 revisions over four RGB/SfM scenes, CBRC chose 44 certified-local repairs and 16 full rebuilds. We observed no certificate violation, and the native and reference planners agreed in every case. Fifty-six source edits were already above the protected RGB tolerance before repair. The calibrated work model gives a median selected ratio of 0.36953 of</w:t>
+        <w:t xml:space="preserve">On the frozen public campaign of 60 revisions over four RGB/SfM scenes, CBRC chose 44 certified-local repairs and 16 full rebuilds. We observed no certificate violation, and the native and reference output-cone planners agreed in every case. Fifty-six source edits were already above the protected RGB tolerance before repair. The calibrated work model gives a median selected ratio of 0.36953 of</w:t>
       </w:r>
       <w:r>
         <w:t xml:space="preserve"> </w:t>
@@ -430,7 +430,7 @@
         <w:pStyle w:val="BodyText"/>
       </w:pPr>
       <w:r>
-        <w:t xml:space="preserve">MAVEB implements this design as a C++23 persistent-world stack, alongside a dense Python reference certifier and an independent full-after Gaussian oracle. Figure 1 summarizes the decision path, while Figure 2 shows the support-selection idea visually. The implementation records immutable before/after revision sidecars, deterministic certificate JSON, per-domain work, and oracle replay. We do not treat the planner’s own prediction as evidence that a repair is safe. Instead, the chosen result is replayed independently against</w:t>
+        <w:t xml:space="preserve">MAVEB implements this design as a C++23 persistent-world stack, alongside a dense Python reference certifier and an independent full-after Gaussian oracle. Figure 1 summarizes the decision path, while Figure 2 shows the support-selection idea visually. The implementation records immutable before/after revision sidecars, deterministic certificate JSON, per-domain work, and oracle replay. We do not treat the planner’s own prediction as evidence that a repair is safe. Instead, the unrepaired exterior implied by the chosen support is compared with an independently rendered</w:t>
       </w:r>
       <w:r>
         <w:t xml:space="preserve"> </w:t>
@@ -442,10 +442,7 @@
         <w:t xml:space="preserve">Full</w:t>
       </w:r>
       <w:r>
-        <w:t xml:space="preserve"> </w:t>
-      </w:r>
-      <w:r>
-        <w:t xml:space="preserve">and checked under the contract</w:t>
+        <w:t xml:space="preserve">-after reference and checked under the contract</w:t>
       </w:r>
     </w:p>
     <w:tbl>
@@ -694,7 +691,7 @@
         <w:t xml:space="preserve"> </w:t>
       </w:r>
       <w:r>
-        <w:t xml:space="preserve">is the measured discrepancy from an independent full-after reference,</w:t>
+        <w:t xml:space="preserve">is the measured residual attributable to the unrepaired exterior under the selected support, evaluated against an independent full-after rendering;</w:t>
       </w:r>
       <w:r>
         <w:t xml:space="preserve"> </w:t>
@@ -772,7 +769,7 @@
         <w:pStyle w:val="BodyText"/>
       </w:pPr>
       <w:r>
-        <w:t xml:space="preserve">We froze the protocol and claim boundaries before interpreting the final campaign. Among 60 public RGB/SfM revisions, CBRC makes 44 certified-local selections and 16 full rebuilds, with no observed certificate violation and complete native/Python planner agreement. Fifty-six source edits were above RGB tolerance before repair. The frozen calibration gives a median work ratio of 0.36953 of</w:t>
+        <w:t xml:space="preserve">We froze the protocol and claim boundaries before interpreting the final campaign. Among 60 public RGB/SfM revisions, CBRC makes 44 certified-local selections and 16 full rebuilds, with no observed certificate violation and complete native/Python output-cone planner agreement. Fifty-six source edits were above RGB tolerance before repair. The frozen calibration gives a median work ratio of 0.36953 of</w:t>
       </w:r>
       <w:r>
         <w:t xml:space="preserve"> </w:t>
@@ -883,7 +880,7 @@
               <a:graphicData uri="http://schemas.openxmlformats.org/drawingml/2006/picture">
                 <pic:pic>
                   <pic:nvPicPr>
-                    <pic:cNvPr descr="/home/runner/work/_temp/maveb-final-build/system_flow_export.png" id="23" name="Picture"/>
+                    <pic:cNvPr descr="/home/runner/work/_temp/maveb-audited-final-build/system_flow_export.png" id="23" name="Picture"/>
                     <pic:cNvPicPr>
                       <a:picLocks noChangeArrowheads="1" noChangeAspect="1"/>
                     </pic:cNvPicPr>
@@ -967,7 +964,7 @@
         <w:t xml:space="preserve">Full</w:t>
       </w:r>
       <w:r>
-        <w:t xml:space="preserve">. The selected result is then replayed against an independent full-after oracle.</w:t>
+        <w:t xml:space="preserve">. The residual outside the selected repair support is then falsified against an independently rendered full-after reference.</w:t>
       </w:r>
     </w:p>
     <w:p>
@@ -2097,7 +2094,19 @@
         <w:t xml:space="preserve"> </w:t>
       </w:r>
       <w:r>
-        <w:t xml:space="preserve">bounds. If we do not have a conservative argument for a relation, we do not soften it simply because doing so would produce a smaller cone.</w:t>
+        <w:t xml:space="preserve">bounds. An</w:t>
+      </w:r>
+      <w:r>
+        <w:t xml:space="preserve"> </w:t>
+      </w:r>
+      <w:r>
+        <w:rPr>
+          <w:smallCaps/>
+        </w:rPr>
+        <w:t xml:space="preserve">Empirical</w:t>
+      </w:r>
+      <w:r>
+        <w:t xml:space="preserve">-only dependency without a conservative analytic bound is promoted to exact predecessor closure for certification; its measured gain may still be used for scheduling, but never as a soft safety bound. If we do not have a conservative argument for a relation, we do not soften it simply because doing so would produce a smaller cone.</w:t>
       </w:r>
     </w:p>
     <w:bookmarkEnd w:id="36"/>
@@ -6622,7 +6631,7 @@
         <w:pStyle w:val="FirstParagraph"/>
       </w:pPr>
       <w:r>
-        <w:t xml:space="preserve">Each candidate is closed over its exact predecessors before it is certified again. The search ends when it finds a cone that is both certificate-feasible and cheaper than</w:t>
+        <w:t xml:space="preserve">Each candidate is closed over its exact predecessors before it is certified again. The search continues until it finds a cone that is both certificate-feasible and cheaper than</w:t>
       </w:r>
       <w:r>
         <w:t xml:space="preserve"> </w:t>
@@ -6634,7 +6643,7 @@
         <w:t xml:space="preserve">Full</w:t>
       </w:r>
       <w:r>
-        <w:t xml:space="preserve">, or when there is no useful local candidate left to try. This procedure gives us a certified feasible cone. We do not claim that it is the globally cheapest safe cone.</w:t>
+        <w:t xml:space="preserve">; if no such cone is reached, the planner returns the full fallback. This procedure gives us a certified feasible cone. We do not claim that it is the globally cheapest safe cone.</w:t>
       </w:r>
     </w:p>
     <w:bookmarkEnd w:id="48"/>
@@ -6662,7 +6671,7 @@
         <w:pStyle w:val="FirstParagraph"/>
       </w:pPr>
       <w:r>
-        <w:t xml:space="preserve">MAVEB keeps the scientific reference path separate from the production-oriented execution path. The dense Python certifier follows the mathematical contract directly and serves as a falsification and regression reference. The native C++23 implementation uses a sparse typed revision graph, sparse analytic propagation over supported DAG exteriors, exact predecessor checks, greedy feasible-cone search, and deterministic certificate serialization. The campaign compares the native planner’s final decisions against the reference planner rather than assuming the two implementations are equivalent.</w:t>
+        <w:t xml:space="preserve">MAVEB keeps the scientific reference path separate from the production-oriented execution path. The dense Python certifier follows the mathematical contract directly and serves as a falsification and regression reference. The native C++23 implementation uses a sparse typed revision graph, sparse analytic propagation over supported DAG exteriors, exact predecessor checks, greedy feasible-cone search, and deterministic certificate serialization. For the frozen campaign, the bound production output-cone graph is evaluated by both the native planner and the Python reference planner; their final decisions are compared rather than assumed equivalent.</w:t>
       </w:r>
     </w:p>
     <w:bookmarkStart w:id="50" w:name="revision-transactions."/>
@@ -6712,7 +6721,7 @@
         <w:t xml:space="preserve"> </w:t>
       </w:r>
       <w:r>
-        <w:t xml:space="preserve">is the counter source of truth across observation, TSDF, mesh, texture-page, material, Gaussian, GPU-publication, and temporal domains. Ledger/mesher disagreement is an error. Native counts stay in their own units until the frozen, versioned calibration converts them for the public work model. This prevents a local-looking metric in one subsystem from hiding a full-world stage elsewhere.</w:t>
+        <w:t xml:space="preserve">tracks observation, TSDF, mesh, texture-page, material, Gaussian, GPU-publication, and temporal work; ledger/mesher disagreement is an error. Counts retain their native units until a versioned calibration is applied. The frozen public campaign calibrates only four measured domains: Gaussian inspection, Gaussian update, GPU publication bytes, and temporal invalidation pixels.</w:t>
       </w:r>
     </w:p>
     <w:bookmarkEnd w:id="51"/>
@@ -6730,7 +6739,7 @@
         <w:pStyle w:val="FirstParagraph"/>
       </w:pPr>
       <w:r>
-        <w:t xml:space="preserve">The Gaussian oracle is deliberately independent of the planner that selected the revision. It evaluates the equivalent full-after state and reports per-pixel measured error next to the emitted bound. The strict evaluator then enforces Eq. 1. If the production and offline certificates disagree, or if measured error exceeds the emitted certificate, we count that as a correctness failure. Evidence bundles are hashed, and the canonical campaign records workflow IDs, artifact hashes, source hashes, and native/reference planner parity.</w:t>
+        <w:t xml:space="preserve">The Gaussian oracle is independent of the planner. It renders before and full-after states, then forms a support replay from full-after values on the selected support and before-state values outside it. The per-pixel exterior residual is checked against Eq. 1; certificate disagreement or a residual above the emitted bound is a correctness failure. Evidence bundles record hashes, workflow IDs, and native/reference output-cone parity.</w:t>
       </w:r>
     </w:p>
     <w:bookmarkEnd w:id="52"/>
@@ -6748,7 +6757,16 @@
         <w:pStyle w:val="FirstParagraph"/>
       </w:pPr>
       <w:r>
-        <w:t xml:space="preserve">The public campaign uses four real scenes reconstructed with COLMAP/SfM, from which we seed isotropic Gaussians at the reconstructed points. We do not describe these fields as trained photorealistic 3DGS, and the public coordinates are normalized rather than metric-scale. A second validation path uses a pinned external trained GraphDECO-style PLY and preserves its spherical-harmonic coefficients, opacity, anisotropic scale, and rotation. Ownership in this path is deterministic and spatial; it should not be read as semantic segmentation.</w:t>
+        <w:t xml:space="preserve">The public campaign uses four real scenes reconstructed with COLMAP/SfM</w:t>
+      </w:r>
+      <w:r>
+        <w:t xml:space="preserve"> </w:t>
+      </w:r>
+      <w:r>
+        <w:t xml:space="preserve">(Sch"onberger and Frahm 2016)</w:t>
+      </w:r>
+      <w:r>
+        <w:t xml:space="preserve">, from which we seed isotropic Gaussians at the reconstructed points. We do not describe these fields as trained photorealistic 3DGS, and the public coordinates are normalized rather than metric-scale. A second validation path uses a pinned external trained GraphDECO-style PLY and preserves its spherical-harmonic coefficients, opacity, anisotropic scale, and rotation. Ownership in this path is deterministic and spatial; it should not be read as semantic segmentation.</w:t>
       </w:r>
     </w:p>
     <w:bookmarkEnd w:id="53"/>
@@ -6794,7 +6812,73 @@
         <w:pStyle w:val="FirstParagraph"/>
       </w:pPr>
       <w:r>
-        <w:t xml:space="preserve">We structure the evaluation around seven questions. RQ1 asks whether the emitted certificate survives an independent full replay. RQ2 asks when the method chooses</w:t>
+        <w:t xml:space="preserve">The evaluation asks seven questions: certificate validity (RQ1), local-versus-full crossover (RQ2), calibrated work (RQ3), measured-domain locality (RQ4), baseline behavior (RQ5), transfer to trained 3DGS (RQ6), and exact sparse discovery (RQ7).</w:t>
+      </w:r>
+    </w:p>
+    <w:p>
+      <w:pPr>
+        <w:pStyle w:val="BodyText"/>
+      </w:pPr>
+      <w:r>
+        <w:t xml:space="preserve">The final public v2.1 campaign contains 60 frozen revisions over Tanks &amp; Temples Train/Truck</w:t>
+      </w:r>
+      <w:r>
+        <w:t xml:space="preserve"> </w:t>
+      </w:r>
+      <w:r>
+        <w:t xml:space="preserve">(Knapitsch et al. 2017)</w:t>
+      </w:r>
+      <w:r>
+        <w:t xml:space="preserve"> </w:t>
+      </w:r>
+      <w:r>
+        <w:t xml:space="preserve">and Deep Blending Dr Johnson/Playroom</w:t>
+      </w:r>
+      <w:r>
+        <w:t xml:space="preserve"> </w:t>
+      </w:r>
+      <w:r>
+        <w:t xml:space="preserve">(Hedman et al. 2018)</w:t>
+      </w:r>
+      <w:r>
+        <w:t xml:space="preserve"> </w:t>
+      </w:r>
+      <w:r>
+        <w:t xml:space="preserve">inputs from the pinned GraphDECO bundle</w:t>
+      </w:r>
+      <w:r>
+        <w:t xml:space="preserve"> </w:t>
+      </w:r>
+      <w:r>
+        <w:t xml:space="preserve">(Kerbl et al. 2023)</w:t>
+      </w:r>
+      <w:r>
+        <w:t xml:space="preserve">. The repository manifest fixes the source archive size and SHA-256, and the work calibration is frozen before this campaign is run. We also keep an earlier execution in which a requested translation fell below the production effective-edit threshold. Rather than retuning or deleting that case, we preserve it as protocol history; v2.1 enforces the production precondition and records both requested and applied edit deltas.</w:t>
+      </w:r>
+    </w:p>
+    <w:p>
+      <w:pPr>
+        <w:pStyle w:val="BodyText"/>
+      </w:pPr>
+      <w:r>
+        <w:t xml:space="preserve">For each selected repair, the campaign stores the source edit, chosen cone, decision, certificate, support-replay full-reference residual, native and calibrated work, and provenance. Fallbacks stay in the dataset and in the summary statistics; they are part of the method’s behavior, not failed trials to be filtered out.</w:t>
+      </w:r>
+    </w:p>
+    <w:bookmarkStart w:id="55" w:name="runtime-scope."/>
+    <w:p>
+      <w:pPr>
+        <w:pStyle w:val="Heading4"/>
+      </w:pPr>
+      <w:r>
+        <w:t xml:space="preserve">Runtime scope.</w:t>
+      </w:r>
+    </w:p>
+    <w:p>
+      <w:pPr>
+        <w:pStyle w:val="FirstParagraph"/>
+      </w:pPr>
+      <w:r>
+        <w:t xml:space="preserve">The current campaign does not include paired end-to-end</w:t>
       </w:r>
       <w:r>
         <w:t xml:space="preserve"> </w:t>
@@ -6806,13 +6890,7 @@
         <w:t xml:space="preserve">Local</w:t>
       </w:r>
       <w:r>
-        <w:t xml:space="preserve"> </w:t>
-      </w:r>
-      <w:r>
-        <w:t xml:space="preserve">rather than</w:t>
-      </w:r>
-      <w:r>
-        <w:t xml:space="preserve"> </w:t>
+        <w:t xml:space="preserve">-versus-</w:t>
       </w:r>
       <w:r>
         <w:rPr>
@@ -6821,7 +6899,38 @@
         <w:t xml:space="preserve">Full</w:t>
       </w:r>
       <w:r>
-        <w:t xml:space="preserve">. RQ3 measures selected calibrated work relative to</w:t>
+        <w:t xml:space="preserve"> </w:t>
+      </w:r>
+      <w:r>
+        <w:t xml:space="preserve">wall-clock trials under identical execution conditions. We therefore make no speedup claim. The public headline is a frozen four-domain work ratio calibrated from isolated millisecond measurements, whereas the baseline suite reports a different native output-cone work-ratio metric. We label the two separately because collapsing them into one number would overstate what was actually measured.</w:t>
+      </w:r>
+    </w:p>
+    <w:bookmarkEnd w:id="55"/>
+    <w:bookmarkEnd w:id="56"/>
+    <w:bookmarkStart w:id="57" w:name="baselines-and-ablations"/>
+    <w:p>
+      <w:pPr>
+        <w:pStyle w:val="Heading2"/>
+      </w:pPr>
+      <w:r>
+        <w:rPr>
+          <w:rStyle w:val="SectionNumber"/>
+        </w:rPr>
+        <w:t xml:space="preserve">6.2</w:t>
+      </w:r>
+      <w:r>
+        <w:tab/>
+      </w:r>
+      <w:r>
+        <w:t xml:space="preserve">Baselines and ablations</w:t>
+      </w:r>
+    </w:p>
+    <w:p>
+      <w:pPr>
+        <w:pStyle w:val="FirstParagraph"/>
+      </w:pPr>
+      <w:r>
+        <w:t xml:space="preserve">The method-level suite includes</w:t>
       </w:r>
       <w:r>
         <w:t xml:space="preserve"> </w:t>
@@ -6833,104 +6942,7 @@
         <w:t xml:space="preserve">Full</w:t>
       </w:r>
       <w:r>
-        <w:t xml:space="preserve">, and RQ4 looks at which native work domains actually remain local. RQ5 compares exact, radius, changed-fraction, and empirical policies under the same campaign. RQ6 checks whether the safety contract carries over to a trained 3DGS representation. Finally, RQ7 asks whether exact sparse discovery can remove the full-scan Gaussian bottleneck seen in the frozen path.</w:t>
-      </w:r>
-    </w:p>
-    <w:p>
-      <w:pPr>
-        <w:pStyle w:val="BodyText"/>
-      </w:pPr>
-      <w:r>
-        <w:t xml:space="preserve">The final public v2.1 campaign contains 60 frozen revisions over Tanks &amp; Temples Train/Truck and Deep Blending Dr Johnson/Playroom inputs from the pinned GraphDECO bundle. The repository manifest fixes the source archive size and SHA-256, and the work calibration is frozen before this campaign is run. We also keep an earlier execution in which a requested translation fell below the production effective-edit threshold. Rather than retuning or deleting that case, we preserve it as protocol history; v2.1 enforces the production precondition and records both requested and applied edit deltas.</w:t>
-      </w:r>
-    </w:p>
-    <w:p>
-      <w:pPr>
-        <w:pStyle w:val="BodyText"/>
-      </w:pPr>
-      <w:r>
-        <w:t xml:space="preserve">For each selected repair, the campaign stores the source edit, chosen cone, local/full decision, certificate, independent full-reference residual, native work, calibrated work, and provenance. Fallbacks stay in the dataset and in the summary statistics; they are part of the method’s behavior, not failed trials to be filtered out.</w:t>
-      </w:r>
-    </w:p>
-    <w:bookmarkStart w:id="55" w:name="runtime-scope."/>
-    <w:p>
-      <w:pPr>
-        <w:pStyle w:val="Heading4"/>
-      </w:pPr>
-      <w:r>
-        <w:t xml:space="preserve">Runtime scope.</w:t>
-      </w:r>
-    </w:p>
-    <w:p>
-      <w:pPr>
-        <w:pStyle w:val="FirstParagraph"/>
-      </w:pPr>
-      <w:r>
-        <w:t xml:space="preserve">The current campaign does not include paired end-to-end</w:t>
-      </w:r>
-      <w:r>
-        <w:t xml:space="preserve"> </w:t>
-      </w:r>
-      <w:r>
-        <w:rPr>
-          <w:smallCaps/>
-        </w:rPr>
-        <w:t xml:space="preserve">Local</w:t>
-      </w:r>
-      <w:r>
-        <w:t xml:space="preserve">-versus-</w:t>
-      </w:r>
-      <w:r>
-        <w:rPr>
-          <w:smallCaps/>
-        </w:rPr>
-        <w:t xml:space="preserve">Full</w:t>
-      </w:r>
-      <w:r>
-        <w:t xml:space="preserve"> </w:t>
-      </w:r>
-      <w:r>
-        <w:t xml:space="preserve">wall-clock trials under identical execution conditions. We therefore make no speedup claim. The public headline is a frozen heterogeneous work ratio calibrated from millisecond measurements, whereas the baseline suite reports a different native work-ratio metric. We label the two separately because collapsing them into one number would overstate what was actually measured.</w:t>
-      </w:r>
-    </w:p>
-    <w:bookmarkEnd w:id="55"/>
-    <w:bookmarkEnd w:id="56"/>
-    <w:bookmarkStart w:id="57" w:name="baselines-and-ablations"/>
-    <w:p>
-      <w:pPr>
-        <w:pStyle w:val="Heading2"/>
-      </w:pPr>
-      <w:r>
-        <w:rPr>
-          <w:rStyle w:val="SectionNumber"/>
-        </w:rPr>
-        <w:t xml:space="preserve">6.2</w:t>
-      </w:r>
-      <w:r>
-        <w:tab/>
-      </w:r>
-      <w:r>
-        <w:t xml:space="preserve">Baselines and ablations</w:t>
-      </w:r>
-    </w:p>
-    <w:p>
-      <w:pPr>
-        <w:pStyle w:val="FirstParagraph"/>
-      </w:pPr>
-      <w:r>
-        <w:t xml:space="preserve">The method-level suite includes</w:t>
-      </w:r>
-      <w:r>
-        <w:t xml:space="preserve"> </w:t>
-      </w:r>
-      <w:r>
-        <w:rPr>
-          <w:smallCaps/>
-        </w:rPr>
-        <w:t xml:space="preserve">Full</w:t>
-      </w:r>
-      <w:r>
-        <w:t xml:space="preserve">, exact-only repair, fixed-radius policies, a changed-fraction policy, a held-out empirical scheduler, and CBRC. Empirical information may change the order in which candidates are explored, but it is not allowed into the certificate. Structural and analytic ablations remove or replace individual components. Separately, a deterministic mechanism-isolation suite creates stress cases for exact closure, analytic Gaussian influence, temporal influence, quantity-of-interest specialization, hard/soft separation, graph propagation, and fallback behavior.</w:t>
+        <w:t xml:space="preserve">, exact-only repair, fixed-radius policies, a changed-fraction policy, a held-out empirical scheduler, and CBRC. Empirical magnitudes may change the order in which candidates are explored, but they are never used as soft certificate evidence; an empirical-only dependency without an analytic bound fails closed through exact predecessor closure. Structural and analytic ablations remove or replace individual components. Separately, a deterministic mechanism-isolation suite creates stress cases for exact closure, analytic Gaussian influence, temporal influence, quantity-of-interest specialization, hard/soft separation, graph propagation, and fallback behavior.</w:t>
       </w:r>
     </w:p>
     <w:p>
@@ -6965,7 +6977,7 @@
         <w:pStyle w:val="FirstParagraph"/>
       </w:pPr>
       <w:r>
-        <w:t xml:space="preserve">Our primary correctness metric is the number of violations of Eq. 1. We also report local/fallback counts, native/reference planner agreement, the source-edit effect before repair, the median selected calibrated work ratio, and native-domain ratios. Effectivity,</w:t>
+        <w:t xml:space="preserve">Our primary correctness metric is the number of violations of Eq. 1. We also report local/fallback counts, native/reference output-cone planner agreement, source-edit effect, the median calibrated work ratio, and native-domain ratios. Effectivity,</w:t>
       </w:r>
       <w:r>
         <w:t xml:space="preserve"> </w:t>
@@ -7123,7 +7135,7 @@
         <w:t xml:space="preserve"> </w:t>
       </w:r>
       <w:r>
-        <w:t xml:space="preserve">16 times. Figure 3 shows examples of both outcomes, and Table 3 collects the aggregate numbers. We observed no certificate violation, and the native and reference planners agreed on every decision. At the reported</w:t>
+        <w:t xml:space="preserve">16 times. Figure 3 shows examples of both outcomes, and Table 3 collects the aggregate numbers. We observed no certificate violation, and the native and reference output-cone planners agreed on every decision. At the reported</w:t>
       </w:r>
       <w:r>
         <w:t xml:space="preserve"> </w:t>
@@ -7149,7 +7161,7 @@
         <w:t xml:space="preserve"> </w:t>
       </w:r>
       <w:r>
-        <w:t xml:space="preserve">precision, the largest measured RGB residual after the selected repair was 0; the largest emitted bound among selected cases was</w:t>
+        <w:t xml:space="preserve">precision, the largest support-replay residual outside the selected repair support was 0; the largest emitted bound among selected cases was</w:t>
       </w:r>
       <w:r>
         <w:t xml:space="preserve"> </w:t>
@@ -7192,7 +7204,7 @@
         <w:pStyle w:val="BodyText"/>
       </w:pPr>
       <w:r>
-        <w:t xml:space="preserve">A zero selected residual would be less informative if the edits were visually negligible to begin with, so we checked that separately. Before repair, 56 of the 60 source edits were already above the protected RGB tolerance. This rules out the simplest explanation that almost all edits were below the quantity-of-interest threshold anyway.</w:t>
+        <w:t xml:space="preserve">A zero support-replay residual would be less informative if the edits were visually negligible to begin with, so we checked that separately. Before repair, 56 of the 60 source edits were already above the protected RGB tolerance. This rules out the simplest explanation that almost all edits were below the quantity-of-interest threshold anyway.</w:t>
       </w:r>
     </w:p>
     <w:p>
@@ -7200,7 +7212,7 @@
         <w:pStyle w:val="BodyText"/>
       </w:pPr>
       <w:r>
-        <w:t xml:space="preserve">The frozen isolated millisecond cost model reports a median selected heterogeneous work ratio</w:t>
+        <w:t xml:space="preserve">The frozen isolated millisecond cost model reports a median selected four-domain work ratio</w:t>
       </w:r>
     </w:p>
     <w:tbl>
@@ -7439,7 +7451,7 @@
         <w:t xml:space="preserve"> </w:t>
       </w:r>
       <w:r>
-        <w:t xml:space="preserve">should not be confused with an independent measured-error metric. The exact-only, radius, and changed-fraction policies often select very little work, but most of those selections do not pass the certificate. The empirical-order baseline uses empirical influence only to decide expansion order; the final candidate is still certified analytically. We discuss the held-out changed-fraction heuristic separately below.</w:t>
+        <w:t xml:space="preserve">should not be confused with an independent measured-error metric. The exact-only, radius, and changed-fraction policies often select very little work, but most of those selections do not pass the certificate. The empirical-order baseline uses empirical magnitudes only to decide expansion order; the final candidate is still certified with analytic bounds plus exact closure for unsupported dependencies. We discuss the held-out changed-fraction heuristic separately below.</w:t>
       </w:r>
     </w:p>
     <w:bookmarkStart w:id="61" w:name="tab:baselines"/>
@@ -8374,7 +8386,7 @@
         <w:t xml:space="preserve">Figure 3. </w:t>
       </w:r>
       <w:r>
-        <w:t xml:space="preserve">Representative frozen revision outcomes. Top: a certified local case repairs only the selected support and matches the independent</w:t>
+        <w:t xml:space="preserve">Representative frozen revision outcomes. Top: a certified local case has zero measured support-replay residual against the independent</w:t>
       </w:r>
       <w:r>
         <w:t xml:space="preserve"> </w:t>
@@ -10567,7 +10579,7 @@
         <w:pStyle w:val="BodyText"/>
       </w:pPr>
       <w:r>
-        <w:t xml:space="preserve">At the reported precision, every selected public residual is numerically zero, even though 56 of the 60 source edits were above tolerance before repair. This lets the real matrix test selection and fallback behavior, but it does not tell us how tight the certificate is when a non-zero residual is still acceptable. The threshold-crossing mechanism-isolation cases are useful here only in a limited sense: they show that the analytic machinery can change a decision when it is stressed. We do not use them as a stand-in for real non-zero-residual evidence.</w:t>
+        <w:t xml:space="preserve">At the reported precision, every selected public support-replay residual is numerically zero, even though 56 of the 60 source edits were above tolerance before repair. This lets the real matrix test selection and fallback behavior, but it does not tell us how tight the certificate is when a non-zero residual is still acceptable. The threshold-crossing mechanism-isolation cases are useful here only in a limited sense: they show that the analytic machinery can change a decision when it is stressed. We do not use them as a stand-in for real non-zero-residual evidence.</w:t>
       </w:r>
     </w:p>
     <w:bookmarkEnd w:id="72"/>
@@ -10613,7 +10625,7 @@
         <w:pStyle w:val="FirstParagraph"/>
       </w:pPr>
       <w:r>
-        <w:t xml:space="preserve">Within the frozen revision domain and under the stated bound assumptions, three conclusions are supported by the experiment. The emitted certificate survived independent full-reference replay in every evaluated case. The planner also did not force a local answer: more than a quarter of the public revisions crossed to</w:t>
+        <w:t xml:space="preserve">Within the frozen revision domain and under the stated bound assumptions, three conclusions are supported by the experiment. The emitted certificate survived independent full-reference falsification of the unrepaired exterior in every evaluated case. The planner also did not force a local answer: more than a quarter of the public revisions crossed to</w:t>
       </w:r>
       <w:r>
         <w:t xml:space="preserve"> </w:t>
@@ -10662,7 +10674,7 @@
         <w:t xml:space="preserve">prediction</w:t>
       </w:r>
       <w:r>
-        <w:t xml:space="preserve">. An empirical scheduler can guess every available case correctly and still have no defensible answer for the next unseen case. To become part of the safety argument, that prediction would need a conservative bound with a valid remainder. CBRC therefore lets empirical information influence scheduling, but not certification. The converse can also happen: an</w:t>
+        <w:t xml:space="preserve">. An empirical scheduler can guess every available case correctly and still have no defensible answer for the next unseen case. To become part of the safety argument, that prediction would need a conservative bound with a valid remainder. CBRC therefore lets empirical magnitudes influence scheduling, but does not use them as soft certificate bounds; unsupported empirical-only dependencies are instead closed exactly. The converse can also happen: an</w:t>
       </w:r>
       <w:r>
         <w:t xml:space="preserve"> </w:t>
@@ -10808,7 +10820,7 @@
         <w:t xml:space="preserve"> </w:t>
       </w:r>
       <w:r>
-        <w:t xml:space="preserve">figure is a reduction in calibrated heterogeneous work. The trained 28.614</w:t>
+        <w:t xml:space="preserve">figure is a reduction in calibrated four-domain work. The trained 28.614</w:t>
       </w:r>
       <m:oMath>
         <m:r>
@@ -10888,7 +10900,7 @@
         <w:pStyle w:val="FirstParagraph"/>
       </w:pPr>
       <w:r>
-        <w:t xml:space="preserve">The primary public campaign is built from normalized RGB/SfM reconstructions seeded into Gaussian fields, not from trained photorealistic 3DGS, and it is not a metric-scale reconstruction benchmark. The trained-3DGS experiment helps, but it is only a five-revision representation check. A broader evaluation over trained scenes is the obvious next step if we want stronger evidence of generality.</w:t>
+        <w:t xml:space="preserve">The primary public campaign is built from normalized RGB/SfM reconstructions seeded into Gaussian fields, not from trained photorealistic 3DGS, and it is not a metric-scale reconstruction benchmark. Its frozen evidence exercises Gaussian inspection/update, GPU publication, and temporal output invalidation; the broader observation/TSDF/mesh/texture/material ledger and captured-world graph are implemented and regression-tested but are not measured by the 60-case headline campaign. The trained-3DGS experiment helps, but it is only a five-revision representation check over the same output-side scope. A broader full-stack evaluation over trained scenes and additional derived-state domains is needed for stronger evidence of generality.</w:t>
       </w:r>
     </w:p>
     <w:bookmarkEnd w:id="80"/>
@@ -11005,11 +11017,11 @@
         <w:pStyle w:val="FirstParagraph"/>
       </w:pPr>
       <w:r>
-        <w:t xml:space="preserve">We introduced Criticality-Bounded Revision Cones as a fail-closed rule for selective recomputation in persistent captured worlds. Criticality is the worst normalized certificate-to-tolerance ratio over the protected outputs. CBRC separates exact dependencies from bounded finite-change influence, ties the unrepaired exterior to explicit tolerances, compares regional work with a full baseline, and independently replays the selected result against a full-after oracle. The frozen public and trained-representation experiments show that local repair and full fallback can coexist under one auditable contract. They also expose the remaining gaps: discovery is still close to global in the frozen path, and there is no paired wall-clock speedup result yet. Repair locally when the system can justify what it leaves alone; rebuild when it cannot.</w:t>
+        <w:t xml:space="preserve">We introduced Criticality-Bounded Revision Cones as a fail-closed rule for selective recomputation in persistent captured worlds. Criticality is the worst normalized certificate-to-tolerance ratio over the protected outputs. CBRC separates exact dependencies from bounded finite-change influence, ties the unrepaired exterior to explicit tolerances, compares regional work with a full baseline, and independently falsifies the residual outside the selected repair support against a full-after oracle. The frozen public and trained-representation experiments show that local repair and full fallback can coexist under one auditable contract. They also expose the remaining gaps: discovery is still close to global in the frozen path, and there is no paired wall-clock speedup result yet. Repair locally when the system can justify what it leaves alone; rebuild when it cannot.</w:t>
       </w:r>
     </w:p>
     <w:bookmarkEnd w:id="86"/>
-    <w:bookmarkStart w:id="127" w:name="acknowledgments"/>
+    <w:bookmarkStart w:id="134" w:name="acknowledgments"/>
     <w:p>
       <w:pPr>
         <w:pStyle w:val="Heading1"/>
@@ -11018,7 +11030,7 @@
         <w:t xml:space="preserve">Acknowledgments</w:t>
       </w:r>
     </w:p>
-    <w:bookmarkStart w:id="126" w:name="generative-ai-use-disclosure."/>
+    <w:bookmarkStart w:id="133" w:name="generative-ai-use-disclosure."/>
     <w:p>
       <w:pPr>
         <w:pStyle w:val="Heading4"/>
@@ -11035,7 +11047,7 @@
         <w:t xml:space="preserve">OpenAI ChatGPT was used as an assistive tool during portions of this project for literature-search support, software and scripting development, debugging, experimental and benchmark planning, visualization/manuscript-artifact scripting, and drafting, restructuring, and language editing of the manuscript and supplement. The reported measurements and frozen evidence were produced by the project software and experimental artifacts rather than generated by the language model. The author retains full responsibility for the code, citations, analysis, claims, conclusions, and final text; no generative AI system is listed as an author.</w:t>
       </w:r>
     </w:p>
-    <w:bookmarkStart w:id="125" w:name="refs"/>
+    <w:bookmarkStart w:id="132" w:name="refs"/>
     <w:bookmarkStart w:id="88" w:name="ref-acar2013selfadjusting"/>
     <w:p>
       <w:pPr>
@@ -11250,7 +11262,7 @@
       </w:r>
     </w:p>
     <w:bookmarkEnd w:id="94"/>
-    <w:bookmarkStart w:id="95" w:name="ref-dai2017bundlefusion"/>
+    <w:bookmarkStart w:id="96" w:name="ref-dai2017bundlefusion"/>
     <w:p>
       <w:pPr>
         <w:pStyle w:val="Bibliography"/>
@@ -11278,11 +11290,25 @@
         <w:t xml:space="preserve"> </w:t>
       </w:r>
       <w:r>
-        <w:t xml:space="preserve">36 (4): 76:1–18.</w:t>
-      </w:r>
-    </w:p>
-    <w:bookmarkEnd w:id="95"/>
-    <w:bookmarkStart w:id="96" w:name="ref-ellensohn2026eligsir"/>
+        <w:t xml:space="preserve">36 (4): 24:1–18.</w:t>
+      </w:r>
+      <w:r>
+        <w:t xml:space="preserve"> </w:t>
+      </w:r>
+      <w:hyperlink r:id="rId95">
+        <w:r>
+          <w:rPr>
+            <w:rStyle w:val="Hyperlink"/>
+          </w:rPr>
+          <w:t xml:space="preserve">https://doi.org/10.1145/3072959.3054739</w:t>
+        </w:r>
+      </w:hyperlink>
+      <w:r>
+        <w:t xml:space="preserve">.</w:t>
+      </w:r>
+    </w:p>
+    <w:bookmarkEnd w:id="96"/>
+    <w:bookmarkStart w:id="97" w:name="ref-ellensohn2026eligsir"/>
     <w:p>
       <w:pPr>
         <w:pStyle w:val="Bibliography"/>
@@ -11310,8 +11336,8 @@
         <w:t xml:space="preserve">.</w:t>
       </w:r>
     </w:p>
-    <w:bookmarkEnd w:id="96"/>
-    <w:bookmarkStart w:id="97" w:name="ref-galappaththige2026pixels"/>
+    <w:bookmarkEnd w:id="97"/>
+    <w:bookmarkStart w:id="98" w:name="ref-galappaththige2026pixels"/>
     <w:p>
       <w:pPr>
         <w:pStyle w:val="Bibliography"/>
@@ -11339,8 +11365,54 @@
         <w:t xml:space="preserve">.</w:t>
       </w:r>
     </w:p>
-    <w:bookmarkEnd w:id="97"/>
-    <w:bookmarkStart w:id="99" w:name="ref-huang2024scgs"/>
+    <w:bookmarkEnd w:id="98"/>
+    <w:bookmarkStart w:id="100" w:name="ref-hedman2018deepblending"/>
+    <w:p>
+      <w:pPr>
+        <w:pStyle w:val="Bibliography"/>
+      </w:pPr>
+      <w:r>
+        <w:t xml:space="preserve">Hedman, Peter, Julien Philip, True Price, Jan-Michael Frahm, George Drettakis, and Gabriel J. Brostow. 2018.</w:t>
+      </w:r>
+      <w:r>
+        <w:t xml:space="preserve"> </w:t>
+      </w:r>
+      <w:r>
+        <w:t xml:space="preserve">“Deep Blending for Free-Viewpoint Image-Based Rendering.”</w:t>
+      </w:r>
+      <w:r>
+        <w:t xml:space="preserve"> </w:t>
+      </w:r>
+      <w:r>
+        <w:rPr>
+          <w:iCs/>
+          <w:i/>
+        </w:rPr>
+        <w:t xml:space="preserve">ACM Transactions on Graphics</w:t>
+      </w:r>
+      <w:r>
+        <w:t xml:space="preserve"> </w:t>
+      </w:r>
+      <w:r>
+        <w:t xml:space="preserve">37 (6): 257:1–15.</w:t>
+      </w:r>
+      <w:r>
+        <w:t xml:space="preserve"> </w:t>
+      </w:r>
+      <w:hyperlink r:id="rId99">
+        <w:r>
+          <w:rPr>
+            <w:rStyle w:val="Hyperlink"/>
+          </w:rPr>
+          <w:t xml:space="preserve">https://doi.org/10.1145/3272127.3275084</w:t>
+        </w:r>
+      </w:hyperlink>
+      <w:r>
+        <w:t xml:space="preserve">.</w:t>
+      </w:r>
+    </w:p>
+    <w:bookmarkEnd w:id="100"/>
+    <w:bookmarkStart w:id="102" w:name="ref-huang2024scgs"/>
     <w:p>
       <w:pPr>
         <w:pStyle w:val="Bibliography"/>
@@ -11376,7 +11448,7 @@
       <w:r>
         <w:t xml:space="preserve"> </w:t>
       </w:r>
-      <w:hyperlink r:id="rId98">
+      <w:hyperlink r:id="rId101">
         <w:r>
           <w:rPr>
             <w:rStyle w:val="Hyperlink"/>
@@ -11388,8 +11460,8 @@
         <w:t xml:space="preserve">.</w:t>
       </w:r>
     </w:p>
-    <w:bookmarkEnd w:id="99"/>
-    <w:bookmarkStart w:id="100" w:name="ref-keetha2024splatam"/>
+    <w:bookmarkEnd w:id="102"/>
+    <w:bookmarkStart w:id="103" w:name="ref-keetha2024splatam"/>
     <w:p>
       <w:pPr>
         <w:pStyle w:val="Bibliography"/>
@@ -11423,8 +11495,8 @@
         <w:t xml:space="preserve">, 21357–66.</w:t>
       </w:r>
     </w:p>
-    <w:bookmarkEnd w:id="100"/>
-    <w:bookmarkStart w:id="102" w:name="ref-kerbl2023gaussians"/>
+    <w:bookmarkEnd w:id="103"/>
+    <w:bookmarkStart w:id="105" w:name="ref-kerbl2023gaussians"/>
     <w:p>
       <w:pPr>
         <w:pStyle w:val="Bibliography"/>
@@ -11457,7 +11529,7 @@
       <w:r>
         <w:t xml:space="preserve"> </w:t>
       </w:r>
-      <w:hyperlink r:id="rId101">
+      <w:hyperlink r:id="rId104">
         <w:r>
           <w:rPr>
             <w:rStyle w:val="Hyperlink"/>
@@ -11469,8 +11541,54 @@
         <w:t xml:space="preserve">.</w:t>
       </w:r>
     </w:p>
-    <w:bookmarkEnd w:id="102"/>
-    <w:bookmarkStart w:id="104" w:name="ref-luiten2024dynamic3dgaussians"/>
+    <w:bookmarkEnd w:id="105"/>
+    <w:bookmarkStart w:id="107" w:name="ref-knapitsch2017tandt"/>
+    <w:p>
+      <w:pPr>
+        <w:pStyle w:val="Bibliography"/>
+      </w:pPr>
+      <w:r>
+        <w:t xml:space="preserve">Knapitsch, Arno, Jaesik Park, Qian-Yi Zhou, and Vladlen Koltun. 2017.</w:t>
+      </w:r>
+      <w:r>
+        <w:t xml:space="preserve"> </w:t>
+      </w:r>
+      <w:r>
+        <w:t xml:space="preserve">“Tanks and Temples: Benchmarking Large-Scale Scene Reconstruction.”</w:t>
+      </w:r>
+      <w:r>
+        <w:t xml:space="preserve"> </w:t>
+      </w:r>
+      <w:r>
+        <w:rPr>
+          <w:iCs/>
+          <w:i/>
+        </w:rPr>
+        <w:t xml:space="preserve">ACM Transactions on Graphics</w:t>
+      </w:r>
+      <w:r>
+        <w:t xml:space="preserve"> </w:t>
+      </w:r>
+      <w:r>
+        <w:t xml:space="preserve">36 (4).</w:t>
+      </w:r>
+      <w:r>
+        <w:t xml:space="preserve"> </w:t>
+      </w:r>
+      <w:hyperlink r:id="rId106">
+        <w:r>
+          <w:rPr>
+            <w:rStyle w:val="Hyperlink"/>
+          </w:rPr>
+          <w:t xml:space="preserve">https://doi.org/10.1145/3072959.3073599</w:t>
+        </w:r>
+      </w:hyperlink>
+      <w:r>
+        <w:t xml:space="preserve">.</w:t>
+      </w:r>
+    </w:p>
+    <w:bookmarkEnd w:id="107"/>
+    <w:bookmarkStart w:id="109" w:name="ref-luiten2024dynamic3dgaussians"/>
     <w:p>
       <w:pPr>
         <w:pStyle w:val="Bibliography"/>
@@ -11506,7 +11624,7 @@
       <w:r>
         <w:t xml:space="preserve"> </w:t>
       </w:r>
-      <w:hyperlink r:id="rId103">
+      <w:hyperlink r:id="rId108">
         <w:r>
           <w:rPr>
             <w:rStyle w:val="Hyperlink"/>
@@ -11518,8 +11636,8 @@
         <w:t xml:space="preserve">.</w:t>
       </w:r>
     </w:p>
-    <w:bookmarkEnd w:id="104"/>
-    <w:bookmarkStart w:id="106" w:name="ref-matsuki2024monogs"/>
+    <w:bookmarkEnd w:id="109"/>
+    <w:bookmarkStart w:id="111" w:name="ref-matsuki2024monogs"/>
     <w:p>
       <w:pPr>
         <w:pStyle w:val="Bibliography"/>
@@ -11555,7 +11673,7 @@
       <w:r>
         <w:t xml:space="preserve"> </w:t>
       </w:r>
-      <w:hyperlink r:id="rId105">
+      <w:hyperlink r:id="rId110">
         <w:r>
           <w:rPr>
             <w:rStyle w:val="Hyperlink"/>
@@ -11567,8 +11685,8 @@
         <w:t xml:space="preserve">.</w:t>
       </w:r>
     </w:p>
-    <w:bookmarkEnd w:id="106"/>
-    <w:bookmarkStart w:id="107" w:name="ref-mildenhall2020nerf"/>
+    <w:bookmarkEnd w:id="111"/>
+    <w:bookmarkStart w:id="112" w:name="ref-mildenhall2020nerf"/>
     <w:p>
       <w:pPr>
         <w:pStyle w:val="Bibliography"/>
@@ -11602,8 +11720,8 @@
         <w:t xml:space="preserve">, 405–21.</w:t>
       </w:r>
     </w:p>
-    <w:bookmarkEnd w:id="107"/>
-    <w:bookmarkStart w:id="108" w:name="ref-newcombe2011kinectfusion"/>
+    <w:bookmarkEnd w:id="112"/>
+    <w:bookmarkStart w:id="113" w:name="ref-newcombe2011kinectfusion"/>
     <w:p>
       <w:pPr>
         <w:pStyle w:val="Bibliography"/>
@@ -11637,8 +11755,8 @@
         <w:t xml:space="preserve">, 127–36.</w:t>
       </w:r>
     </w:p>
-    <w:bookmarkEnd w:id="108"/>
-    <w:bookmarkStart w:id="110" w:name="ref-oden2001goal"/>
+    <w:bookmarkEnd w:id="113"/>
+    <w:bookmarkStart w:id="115" w:name="ref-oden2001goal"/>
     <w:p>
       <w:pPr>
         <w:pStyle w:val="Bibliography"/>
@@ -11671,7 +11789,7 @@
       <w:r>
         <w:t xml:space="preserve"> </w:t>
       </w:r>
-      <w:hyperlink r:id="rId109">
+      <w:hyperlink r:id="rId114">
         <w:r>
           <w:rPr>
             <w:rStyle w:val="Hyperlink"/>
@@ -11683,8 +11801,8 @@
         <w:t xml:space="preserve">.</w:t>
       </w:r>
     </w:p>
-    <w:bookmarkEnd w:id="110"/>
-    <w:bookmarkStart w:id="112" w:name="ref-pfister2000surfels"/>
+    <w:bookmarkEnd w:id="115"/>
+    <w:bookmarkStart w:id="117" w:name="ref-pfister2000surfels"/>
     <w:p>
       <w:pPr>
         <w:pStyle w:val="Bibliography"/>
@@ -11720,7 +11838,7 @@
       <w:r>
         <w:t xml:space="preserve"> </w:t>
       </w:r>
-      <w:hyperlink r:id="rId111">
+      <w:hyperlink r:id="rId116">
         <w:r>
           <w:rPr>
             <w:rStyle w:val="Hyperlink"/>
@@ -11732,8 +11850,57 @@
         <w:t xml:space="preserve">.</w:t>
       </w:r>
     </w:p>
-    <w:bookmarkEnd w:id="112"/>
-    <w:bookmarkStart w:id="114" w:name="ref-sucar2021imap"/>
+    <w:bookmarkEnd w:id="117"/>
+    <w:bookmarkStart w:id="119" w:name="ref-schonberger2016sfm"/>
+    <w:p>
+      <w:pPr>
+        <w:pStyle w:val="Bibliography"/>
+      </w:pPr>
+      <w:r>
+        <w:t xml:space="preserve">Sch"onberger, Johannes L., and Jan-Michael Frahm. 2016.</w:t>
+      </w:r>
+      <w:r>
+        <w:t xml:space="preserve"> </w:t>
+      </w:r>
+      <w:r>
+        <w:t xml:space="preserve">“Structure-from-Motion Revisited.”</w:t>
+      </w:r>
+      <w:r>
+        <w:t xml:space="preserve"> </w:t>
+      </w:r>
+      <w:r>
+        <w:t xml:space="preserve">In</w:t>
+      </w:r>
+      <w:r>
+        <w:t xml:space="preserve"> </w:t>
+      </w:r>
+      <w:r>
+        <w:rPr>
+          <w:iCs/>
+          <w:i/>
+        </w:rPr>
+        <w:t xml:space="preserve">Proceedings of the IEEE Conference on Computer Vision and Pattern Recognition</w:t>
+      </w:r>
+      <w:r>
+        <w:t xml:space="preserve">, 4104–13.</w:t>
+      </w:r>
+      <w:r>
+        <w:t xml:space="preserve"> </w:t>
+      </w:r>
+      <w:hyperlink r:id="rId118">
+        <w:r>
+          <w:rPr>
+            <w:rStyle w:val="Hyperlink"/>
+          </w:rPr>
+          <w:t xml:space="preserve">https://doi.org/10.1109/CVPR.2016.445</w:t>
+        </w:r>
+      </w:hyperlink>
+      <w:r>
+        <w:t xml:space="preserve">.</w:t>
+      </w:r>
+    </w:p>
+    <w:bookmarkEnd w:id="119"/>
+    <w:bookmarkStart w:id="121" w:name="ref-sucar2021imap"/>
     <w:p>
       <w:pPr>
         <w:pStyle w:val="Bibliography"/>
@@ -11769,7 +11936,7 @@
       <w:r>
         <w:t xml:space="preserve"> </w:t>
       </w:r>
-      <w:hyperlink r:id="rId113">
+      <w:hyperlink r:id="rId120">
         <w:r>
           <w:rPr>
             <w:rStyle w:val="Hyperlink"/>
@@ -11781,8 +11948,8 @@
         <w:t xml:space="preserve">.</w:t>
       </w:r>
     </w:p>
-    <w:bookmarkEnd w:id="114"/>
-    <w:bookmarkStart w:id="115" w:name="ref-whelan2015elasticfusion"/>
+    <w:bookmarkEnd w:id="121"/>
+    <w:bookmarkStart w:id="122" w:name="ref-whelan2015elasticfusion"/>
     <w:p>
       <w:pPr>
         <w:pStyle w:val="Bibliography"/>
@@ -11816,8 +11983,8 @@
         <w:t xml:space="preserve">.</w:t>
       </w:r>
     </w:p>
-    <w:bookmarkEnd w:id="115"/>
-    <w:bookmarkStart w:id="117" w:name="ref-woerister2013lazy"/>
+    <w:bookmarkEnd w:id="122"/>
+    <w:bookmarkStart w:id="124" w:name="ref-woerister2013lazy"/>
     <w:p>
       <w:pPr>
         <w:pStyle w:val="Bibliography"/>
@@ -11853,7 +12020,7 @@
       <w:r>
         <w:t xml:space="preserve"> </w:t>
       </w:r>
-      <w:hyperlink r:id="rId116">
+      <w:hyperlink r:id="rId123">
         <w:r>
           <w:rPr>
             <w:rStyle w:val="Hyperlink"/>
@@ -11865,8 +12032,8 @@
         <w:t xml:space="preserve">.</w:t>
       </w:r>
     </w:p>
-    <w:bookmarkEnd w:id="117"/>
-    <w:bookmarkStart w:id="119" w:name="ref-wu2024fourDGS"/>
+    <w:bookmarkEnd w:id="124"/>
+    <w:bookmarkStart w:id="126" w:name="ref-wu2024fourDGS"/>
     <w:p>
       <w:pPr>
         <w:pStyle w:val="Bibliography"/>
@@ -11902,7 +12069,7 @@
       <w:r>
         <w:t xml:space="preserve"> </w:t>
       </w:r>
-      <w:hyperlink r:id="rId118">
+      <w:hyperlink r:id="rId125">
         <w:r>
           <w:rPr>
             <w:rStyle w:val="Hyperlink"/>
@@ -11914,8 +12081,8 @@
         <w:t xml:space="preserve">.</w:t>
       </w:r>
     </w:p>
-    <w:bookmarkEnd w:id="119"/>
-    <w:bookmarkStart w:id="120" w:name="ref-wu2026cif"/>
+    <w:bookmarkEnd w:id="126"/>
+    <w:bookmarkStart w:id="127" w:name="ref-wu2026cif"/>
     <w:p>
       <w:pPr>
         <w:pStyle w:val="Bibliography"/>
@@ -11949,8 +12116,8 @@
         <w:t xml:space="preserve">, 3783–93.</w:t>
       </w:r>
     </w:p>
-    <w:bookmarkEnd w:id="120"/>
-    <w:bookmarkStart w:id="121" w:name="ref-yugay2026game"/>
+    <w:bookmarkEnd w:id="127"/>
+    <w:bookmarkStart w:id="128" w:name="ref-yugay2026game"/>
     <w:p>
       <w:pPr>
         <w:pStyle w:val="Bibliography"/>
@@ -11984,8 +12151,8 @@
         <w:t xml:space="preserve">, 18903–12.</w:t>
       </w:r>
     </w:p>
-    <w:bookmarkEnd w:id="121"/>
-    <w:bookmarkStart w:id="123" w:name="ref-zeng2025gaussianupdate"/>
+    <w:bookmarkEnd w:id="128"/>
+    <w:bookmarkStart w:id="130" w:name="ref-zeng2025gaussianupdate"/>
     <w:p>
       <w:pPr>
         <w:pStyle w:val="Bibliography"/>
@@ -12021,7 +12188,7 @@
       <w:r>
         <w:t xml:space="preserve"> </w:t>
       </w:r>
-      <w:hyperlink r:id="rId122">
+      <w:hyperlink r:id="rId129">
         <w:r>
           <w:rPr>
             <w:rStyle w:val="Hyperlink"/>
@@ -12033,8 +12200,8 @@
         <w:t xml:space="preserve">.</w:t>
       </w:r>
     </w:p>
-    <w:bookmarkEnd w:id="123"/>
-    <w:bookmarkStart w:id="124" w:name="ref-zhu2022niceslam"/>
+    <w:bookmarkEnd w:id="130"/>
+    <w:bookmarkStart w:id="131" w:name="ref-zhu2022niceslam"/>
     <w:p>
       <w:pPr>
         <w:pStyle w:val="Bibliography"/>
@@ -12068,10 +12235,10 @@
         <w:t xml:space="preserve">, 12786–96.</w:t>
       </w:r>
     </w:p>
-    <w:bookmarkEnd w:id="124"/>
-    <w:bookmarkEnd w:id="125"/>
-    <w:bookmarkEnd w:id="126"/>
-    <w:bookmarkEnd w:id="127"/>
+    <w:bookmarkEnd w:id="131"/>
+    <w:bookmarkEnd w:id="132"/>
+    <w:bookmarkEnd w:id="133"/>
+    <w:bookmarkEnd w:id="134"/>
     <w:sectPr>
       <w:pgSz w:w="12240" w:h="15840"/>
       <w:pgMar w:top="1008" w:bottom="1008" w:left="1008" w:right="1008"/>

</xml_diff>

<commit_message>
paper: publish final MAVEB artifacts
</commit_message>
<xml_diff>
--- a/researchpaper/MAVEB_manuscript.docx
+++ b/researchpaper/MAVEB_manuscript.docx
@@ -136,7 +136,7 @@
         <w:t xml:space="preserve">Full</w:t>
       </w:r>
       <w:r>
-        <w:t xml:space="preserve">. The selected result is replayed against an independent full-after reference, so we check measured error</w:t>
+        <w:t xml:space="preserve">. The residual left outside the selected repair support is checked against an independently rendered full-after reference, so we test measured residual</w:t>
       </w:r>
       <w:r>
         <w:t xml:space="preserve"> </w:t>
@@ -178,7 +178,7 @@
         <w:pStyle w:val="BodyText"/>
       </w:pPr>
       <w:r>
-        <w:t xml:space="preserve">On the frozen public campaign of 60 revisions over four RGB/SfM scenes, CBRC chose 44 certified-local repairs and 16 full rebuilds. We observed no certificate violation, and the native and reference planners agreed in every case. Fifty-six source edits were already above the protected RGB tolerance before repair. The calibrated work model gives a median selected ratio of 0.36953 of</w:t>
+        <w:t xml:space="preserve">On the frozen public campaign of 60 revisions over four RGB/SfM scenes, CBRC chose 44 certified-local repairs and 16 full rebuilds. We observed no certificate violation, and the native and reference output-cone planners agreed in every case. Fifty-six source edits were already above the protected RGB tolerance before repair. The calibrated work model gives a median selected ratio of 0.36953 of</w:t>
       </w:r>
       <w:r>
         <w:t xml:space="preserve"> </w:t>
@@ -204,7 +204,7 @@
         <w:t xml:space="preserve"> </w:t>
       </w:r>
       <w:r>
-        <w:t xml:space="preserve">lower calibrated work. A separate five-case check on a pinned trained 3DGS representation produced four local repairs, one fallback, and no observed violation. The frozen end-to-end path still inspects almost the full Gaussian set, although exact sparse discovery reduces median inspection to 1% in isolation. These results support selective recomputation under the stated assumptions; they do not establish universal safety, global optimality, or wall-clock speedup.</w:t>
+        <w:t xml:space="preserve">lower calibrated four-domain work. A separate five-case check on a pinned trained 3DGS representation produced four local repairs, one fallback, and no observed violation. The frozen end-to-end path still inspects almost the full Gaussian set, although exact sparse discovery reduces median inspection to 1% in isolation. These results support selective recomputation under the stated assumptions; they do not establish universal safety, global optimality, or wall-clock speedup.</w:t>
       </w:r>
     </w:p>
     <w:bookmarkEnd w:id="20"/>
@@ -430,7 +430,7 @@
         <w:pStyle w:val="BodyText"/>
       </w:pPr>
       <w:r>
-        <w:t xml:space="preserve">MAVEB implements this design as a C++23 persistent-world stack, alongside a dense Python reference certifier and an independent full-after Gaussian oracle. Figure 1 summarizes the decision path, while Figure 2 shows the support-selection idea visually. The implementation records immutable before/after revision sidecars, deterministic certificate JSON, per-domain work, and oracle replay. We do not treat the planner’s own prediction as evidence that a repair is safe. Instead, the chosen result is replayed independently against</w:t>
+        <w:t xml:space="preserve">MAVEB implements this design as a C++23 persistent-world stack, alongside a dense Python reference certifier and an independent full-after Gaussian oracle. Figure 1 summarizes the decision path, while Figure 2 shows the support-selection idea visually. The implementation records immutable before/after revision sidecars, deterministic certificate JSON, per-domain work, and oracle replay. We do not treat the planner’s own prediction as evidence that a repair is safe. Instead, the unrepaired exterior implied by the chosen support is compared with an independently rendered</w:t>
       </w:r>
       <w:r>
         <w:t xml:space="preserve"> </w:t>
@@ -442,10 +442,7 @@
         <w:t xml:space="preserve">Full</w:t>
       </w:r>
       <w:r>
-        <w:t xml:space="preserve"> </w:t>
-      </w:r>
-      <w:r>
-        <w:t xml:space="preserve">and checked under the contract</w:t>
+        <w:t xml:space="preserve">-after reference and checked under the contract</w:t>
       </w:r>
     </w:p>
     <w:tbl>
@@ -694,7 +691,7 @@
         <w:t xml:space="preserve"> </w:t>
       </w:r>
       <w:r>
-        <w:t xml:space="preserve">is the measured discrepancy from an independent full-after reference,</w:t>
+        <w:t xml:space="preserve">is the measured residual attributable to the unrepaired exterior under the selected support, evaluated against an independent full-after rendering;</w:t>
       </w:r>
       <w:r>
         <w:t xml:space="preserve"> </w:t>
@@ -772,7 +769,7 @@
         <w:pStyle w:val="BodyText"/>
       </w:pPr>
       <w:r>
-        <w:t xml:space="preserve">We froze the protocol and claim boundaries before interpreting the final campaign. Among 60 public RGB/SfM revisions, CBRC makes 44 certified-local selections and 16 full rebuilds, with no observed certificate violation and complete native/Python planner agreement. Fifty-six source edits were above RGB tolerance before repair. The frozen calibration gives a median work ratio of 0.36953 of</w:t>
+        <w:t xml:space="preserve">We froze the protocol and claim boundaries before interpreting the final campaign. Among 60 public RGB/SfM revisions, CBRC makes 44 certified-local selections and 16 full rebuilds, with no observed certificate violation and complete native/Python output-cone planner agreement. Fifty-six source edits were above RGB tolerance before repair. The frozen calibration gives a median work ratio of 0.36953 of</w:t>
       </w:r>
       <w:r>
         <w:t xml:space="preserve"> </w:t>
@@ -883,7 +880,7 @@
               <a:graphicData uri="http://schemas.openxmlformats.org/drawingml/2006/picture">
                 <pic:pic>
                   <pic:nvPicPr>
-                    <pic:cNvPr descr="/home/runner/work/_temp/maveb-final-build/system_flow_export.png" id="23" name="Picture"/>
+                    <pic:cNvPr descr="/home/runner/work/_temp/maveb-final-artifact-build/system_flow_export.png" id="23" name="Picture"/>
                     <pic:cNvPicPr>
                       <a:picLocks noChangeArrowheads="1" noChangeAspect="1"/>
                     </pic:cNvPicPr>
@@ -967,7 +964,7 @@
         <w:t xml:space="preserve">Full</w:t>
       </w:r>
       <w:r>
-        <w:t xml:space="preserve">. The selected result is then replayed against an independent full-after oracle.</w:t>
+        <w:t xml:space="preserve">. The residual outside the selected repair support is then falsified against an independently rendered full-after reference.</w:t>
       </w:r>
     </w:p>
     <w:p>
@@ -2097,7 +2094,19 @@
         <w:t xml:space="preserve"> </w:t>
       </w:r>
       <w:r>
-        <w:t xml:space="preserve">bounds. If we do not have a conservative argument for a relation, we do not soften it simply because doing so would produce a smaller cone.</w:t>
+        <w:t xml:space="preserve">bounds. An</w:t>
+      </w:r>
+      <w:r>
+        <w:t xml:space="preserve"> </w:t>
+      </w:r>
+      <w:r>
+        <w:rPr>
+          <w:smallCaps/>
+        </w:rPr>
+        <w:t xml:space="preserve">Empirical</w:t>
+      </w:r>
+      <w:r>
+        <w:t xml:space="preserve">-only dependency without a conservative analytic bound is promoted to exact predecessor closure for certification; its measured gain may still be used for scheduling, but never as a soft safety bound. If we do not have a conservative argument for a relation, we do not soften it simply because doing so would produce a smaller cone.</w:t>
       </w:r>
     </w:p>
     <w:bookmarkEnd w:id="36"/>
@@ -6622,7 +6631,7 @@
         <w:pStyle w:val="FirstParagraph"/>
       </w:pPr>
       <w:r>
-        <w:t xml:space="preserve">Each candidate is closed over its exact predecessors before it is certified again. The search ends when it finds a cone that is both certificate-feasible and cheaper than</w:t>
+        <w:t xml:space="preserve">Each candidate is closed over its exact predecessors before it is certified again. The search continues until it finds a cone that is both certificate-feasible and cheaper than</w:t>
       </w:r>
       <w:r>
         <w:t xml:space="preserve"> </w:t>
@@ -6634,7 +6643,7 @@
         <w:t xml:space="preserve">Full</w:t>
       </w:r>
       <w:r>
-        <w:t xml:space="preserve">, or when there is no useful local candidate left to try. This procedure gives us a certified feasible cone. We do not claim that it is the globally cheapest safe cone.</w:t>
+        <w:t xml:space="preserve">; if no such cone is reached, the planner returns the full fallback. This procedure gives us a certified feasible cone. We do not claim that it is the globally cheapest safe cone.</w:t>
       </w:r>
     </w:p>
     <w:bookmarkEnd w:id="48"/>
@@ -6662,7 +6671,7 @@
         <w:pStyle w:val="FirstParagraph"/>
       </w:pPr>
       <w:r>
-        <w:t xml:space="preserve">MAVEB keeps the scientific reference path separate from the production-oriented execution path. The dense Python certifier follows the mathematical contract directly and serves as a falsification and regression reference. The native C++23 implementation uses a sparse typed revision graph, sparse analytic propagation over supported DAG exteriors, exact predecessor checks, greedy feasible-cone search, and deterministic certificate serialization. The campaign compares the native planner’s final decisions against the reference planner rather than assuming the two implementations are equivalent.</w:t>
+        <w:t xml:space="preserve">MAVEB keeps the scientific reference path separate from the production-oriented execution path. The dense Python certifier follows the mathematical contract directly and serves as a falsification and regression reference. The native C++23 implementation uses a sparse typed revision graph, sparse analytic propagation over supported DAG exteriors, exact predecessor checks, greedy feasible-cone search, and deterministic certificate serialization. For the frozen campaign, the bound production output-cone graph is evaluated by both the native planner and the Python reference planner; their final decisions are compared rather than assumed equivalent.</w:t>
       </w:r>
     </w:p>
     <w:bookmarkStart w:id="50" w:name="revision-transactions."/>
@@ -6712,7 +6721,7 @@
         <w:t xml:space="preserve"> </w:t>
       </w:r>
       <w:r>
-        <w:t xml:space="preserve">is the counter source of truth across observation, TSDF, mesh, texture-page, material, Gaussian, GPU-publication, and temporal domains. Ledger/mesher disagreement is an error. Native counts stay in their own units until the frozen, versioned calibration converts them for the public work model. This prevents a local-looking metric in one subsystem from hiding a full-world stage elsewhere.</w:t>
+        <w:t xml:space="preserve">tracks observation, TSDF, mesh, texture-page, material, Gaussian, GPU-publication, and temporal work; ledger/mesher disagreement is an error. Counts retain their native units until a versioned calibration is applied. The frozen public campaign calibrates only four measured domains: Gaussian inspection, Gaussian update, GPU publication bytes, and temporal invalidation pixels.</w:t>
       </w:r>
     </w:p>
     <w:bookmarkEnd w:id="51"/>
@@ -6730,7 +6739,7 @@
         <w:pStyle w:val="FirstParagraph"/>
       </w:pPr>
       <w:r>
-        <w:t xml:space="preserve">The Gaussian oracle is deliberately independent of the planner that selected the revision. It evaluates the equivalent full-after state and reports per-pixel measured error next to the emitted bound. The strict evaluator then enforces Eq. 1. If the production and offline certificates disagree, or if measured error exceeds the emitted certificate, we count that as a correctness failure. Evidence bundles are hashed, and the canonical campaign records workflow IDs, artifact hashes, source hashes, and native/reference planner parity.</w:t>
+        <w:t xml:space="preserve">The Gaussian oracle is independent of the planner. It renders before and full-after states, then forms a support replay from full-after values on the selected support and before-state values outside it. The per-pixel exterior residual is checked against Eq. 1; certificate disagreement or a residual above the emitted bound is a correctness failure. Evidence bundles record hashes, workflow IDs, and native/reference output-cone parity.</w:t>
       </w:r>
     </w:p>
     <w:bookmarkEnd w:id="52"/>
@@ -6748,7 +6757,16 @@
         <w:pStyle w:val="FirstParagraph"/>
       </w:pPr>
       <w:r>
-        <w:t xml:space="preserve">The public campaign uses four real scenes reconstructed with COLMAP/SfM, from which we seed isotropic Gaussians at the reconstructed points. We do not describe these fields as trained photorealistic 3DGS, and the public coordinates are normalized rather than metric-scale. A second validation path uses a pinned external trained GraphDECO-style PLY and preserves its spherical-harmonic coefficients, opacity, anisotropic scale, and rotation. Ownership in this path is deterministic and spatial; it should not be read as semantic segmentation.</w:t>
+        <w:t xml:space="preserve">The public campaign uses four real scenes reconstructed with COLMAP/SfM</w:t>
+      </w:r>
+      <w:r>
+        <w:t xml:space="preserve"> </w:t>
+      </w:r>
+      <w:r>
+        <w:t xml:space="preserve">(Sch"onberger and Frahm 2016)</w:t>
+      </w:r>
+      <w:r>
+        <w:t xml:space="preserve">, from which we seed isotropic Gaussians at the reconstructed points. We do not describe these fields as trained photorealistic 3DGS, and the public coordinates are normalized rather than metric-scale. A second validation path uses a pinned external trained GraphDECO-style PLY and preserves its spherical-harmonic coefficients, opacity, anisotropic scale, and rotation. Ownership in this path is deterministic and spatial; it should not be read as semantic segmentation.</w:t>
       </w:r>
     </w:p>
     <w:bookmarkEnd w:id="53"/>
@@ -6794,7 +6812,7 @@
         <w:pStyle w:val="FirstParagraph"/>
       </w:pPr>
       <w:r>
-        <w:t xml:space="preserve">We structure the evaluation around seven questions. RQ1 asks whether the emitted certificate survives an independent full replay. RQ2 asks when the method chooses</w:t>
+        <w:t xml:space="preserve">We structure the evaluation around eight questions. RQ1 asks whether the emitted certificate survives independent full-reference falsification of the unrepaired exterior. RQ2 asks when the method chooses</w:t>
       </w:r>
       <w:r>
         <w:t xml:space="preserve"> </w:t>
@@ -6833,7 +6851,19 @@
         <w:t xml:space="preserve">Full</w:t>
       </w:r>
       <w:r>
-        <w:t xml:space="preserve">, and RQ4 looks at which native work domains actually remain local. RQ5 compares exact, radius, changed-fraction, and empirical policies under the same campaign. RQ6 checks whether the safety contract carries over to a trained 3DGS representation. Finally, RQ7 asks whether exact sparse discovery can remove the full-scan Gaussian bottleneck seen in the frozen path.</w:t>
+        <w:t xml:space="preserve">, and RQ4 looks at which native work domains actually remain local. RQ5 compares exact, radius, changed-fraction, and empirical policies under the same campaign. RQ6 checks whether the safety contract carries over to a trained 3DGS representation. RQ7 asks whether exact sparse discovery can remove the full-scan Gaussian bottleneck seen in the frozen path. RQ8 asks whether the final selected render remains visually identical to the independent</w:t>
+      </w:r>
+      <w:r>
+        <w:t xml:space="preserve"> </w:t>
+      </w:r>
+      <w:r>
+        <w:rPr>
+          <w:smallCaps/>
+        </w:rPr>
+        <w:t xml:space="preserve">Full</w:t>
+      </w:r>
+      <w:r>
+        <w:t xml:space="preserve">-after oracle on the evaluated benchmark views, while separately checking that the edit itself is visible before repair.</w:t>
       </w:r>
     </w:p>
     <w:p>
@@ -6841,7 +6871,40 @@
         <w:pStyle w:val="BodyText"/>
       </w:pPr>
       <w:r>
-        <w:t xml:space="preserve">The final public v2.1 campaign contains 60 frozen revisions over Tanks &amp; Temples Train/Truck and Deep Blending Dr Johnson/Playroom inputs from the pinned GraphDECO bundle. The repository manifest fixes the source archive size and SHA-256, and the work calibration is frozen before this campaign is run. We also keep an earlier execution in which a requested translation fell below the production effective-edit threshold. Rather than retuning or deleting that case, we preserve it as protocol history; v2.1 enforces the production precondition and records both requested and applied edit deltas.</w:t>
+        <w:t xml:space="preserve">The final public v2.1 campaign contains 60 frozen revisions over Tanks &amp; Temples Train/Truck</w:t>
+      </w:r>
+      <w:r>
+        <w:t xml:space="preserve"> </w:t>
+      </w:r>
+      <w:r>
+        <w:t xml:space="preserve">(Knapitsch et al. 2017)</w:t>
+      </w:r>
+      <w:r>
+        <w:t xml:space="preserve"> </w:t>
+      </w:r>
+      <w:r>
+        <w:t xml:space="preserve">and Deep Blending Dr Johnson/Playroom</w:t>
+      </w:r>
+      <w:r>
+        <w:t xml:space="preserve"> </w:t>
+      </w:r>
+      <w:r>
+        <w:t xml:space="preserve">(Hedman et al. 2018)</w:t>
+      </w:r>
+      <w:r>
+        <w:t xml:space="preserve"> </w:t>
+      </w:r>
+      <w:r>
+        <w:t xml:space="preserve">inputs from the pinned GraphDECO bundle</w:t>
+      </w:r>
+      <w:r>
+        <w:t xml:space="preserve"> </w:t>
+      </w:r>
+      <w:r>
+        <w:t xml:space="preserve">(Kerbl et al. 2023)</w:t>
+      </w:r>
+      <w:r>
+        <w:t xml:space="preserve">. The repository manifest fixes the source archive size and SHA-256, and the work calibration is frozen before this campaign is run. We also keep an earlier execution in which a requested translation fell below the production effective-edit threshold. Rather than retuning or deleting that case, we preserve it as protocol history; v2.1 enforces the production precondition and records both requested and applied edit deltas.</w:t>
       </w:r>
     </w:p>
     <w:p>
@@ -6849,7 +6912,7 @@
         <w:pStyle w:val="BodyText"/>
       </w:pPr>
       <w:r>
-        <w:t xml:space="preserve">For each selected repair, the campaign stores the source edit, chosen cone, local/full decision, certificate, independent full-reference residual, native work, calibrated work, and provenance. Fallbacks stay in the dataset and in the summary statistics; they are part of the method’s behavior, not failed trials to be filtered out.</w:t>
+        <w:t xml:space="preserve">For each selected repair, the campaign stores the source edit, chosen cone, local/full decision, certificate, support-replay full-reference residual, native work, calibrated work, and provenance. Fallbacks stay in the dataset and in the summary statistics; they are part of the method’s behavior, not failed trials to be filtered out.</w:t>
       </w:r>
     </w:p>
     <w:bookmarkStart w:id="55" w:name="runtime-scope."/>
@@ -6890,7 +6953,7 @@
         <w:t xml:space="preserve"> </w:t>
       </w:r>
       <w:r>
-        <w:t xml:space="preserve">wall-clock trials under identical execution conditions. We therefore make no speedup claim. The public headline is a frozen heterogeneous work ratio calibrated from millisecond measurements, whereas the baseline suite reports a different native work-ratio metric. We label the two separately because collapsing them into one number would overstate what was actually measured.</w:t>
+        <w:t xml:space="preserve">wall-clock trials under identical execution conditions. We therefore make no speedup claim. The public headline is a frozen four-domain work ratio calibrated from isolated millisecond measurements, whereas the baseline suite reports a different native output-cone work-ratio metric. We label the two separately because collapsing them into one number would overstate what was actually measured.</w:t>
       </w:r>
     </w:p>
     <w:bookmarkEnd w:id="55"/>
@@ -6930,7 +6993,7 @@
         <w:t xml:space="preserve">Full</w:t>
       </w:r>
       <w:r>
-        <w:t xml:space="preserve">, exact-only repair, fixed-radius policies, a changed-fraction policy, a held-out empirical scheduler, and CBRC. Empirical information may change the order in which candidates are explored, but it is not allowed into the certificate. Structural and analytic ablations remove or replace individual components. Separately, a deterministic mechanism-isolation suite creates stress cases for exact closure, analytic Gaussian influence, temporal influence, quantity-of-interest specialization, hard/soft separation, graph propagation, and fallback behavior.</w:t>
+        <w:t xml:space="preserve">, exact-only repair, fixed-radius policies, a changed-fraction policy, a held-out empirical scheduler, and CBRC. Empirical magnitudes may change the order in which candidates are explored, but they are never used as soft certificate evidence; an empirical-only dependency without an analytic bound fails closed through exact predecessor closure. Structural and analytic ablations remove or replace individual components. Separately, a deterministic mechanism-isolation suite creates stress cases for exact closure, analytic Gaussian influence, temporal influence, quantity-of-interest specialization, hard/soft separation, graph propagation, and fallback behavior.</w:t>
       </w:r>
     </w:p>
     <w:p>
@@ -6965,7 +7028,46 @@
         <w:pStyle w:val="FirstParagraph"/>
       </w:pPr>
       <w:r>
-        <w:t xml:space="preserve">Our primary correctness metric is the number of violations of Eq. 1. We also report local/fallback counts, native/reference planner agreement, the source-edit effect before repair, the median selected calibrated work ratio, and native-domain ratios. Effectivity,</w:t>
+        <w:t xml:space="preserve">Our primary correctness metric is the number of violations of Eq. 1. We also report local/fallback counts, native/reference output-cone planner agreement, the source-edit effect before repair, the median selected calibrated work ratio, and native-domain ratios. To make visual quality explicit, a separate rendered-fidelity audit compares the final selected RGB raster with the independently rendered</w:t>
+      </w:r>
+      <w:r>
+        <w:t xml:space="preserve"> </w:t>
+      </w:r>
+      <w:r>
+        <w:rPr>
+          <w:smallCaps/>
+        </w:rPr>
+        <w:t xml:space="preserve">Full</w:t>
+      </w:r>
+      <w:r>
+        <w:t xml:space="preserve">-after raster at the same camera and reports byte-domain MAE, RMSE, maximum absolute channel difference, exact-pixel fraction, and PSNR. For</w:t>
+      </w:r>
+      <w:r>
+        <w:t xml:space="preserve"> </w:t>
+      </w:r>
+      <w:r>
+        <w:rPr>
+          <w:smallCaps/>
+        </w:rPr>
+        <w:t xml:space="preserve">Full</w:t>
+      </w:r>
+      <w:r>
+        <w:t xml:space="preserve"> </w:t>
+      </w:r>
+      <w:r>
+        <w:t xml:space="preserve">fallback cases, the final selected output is the full rebuild; the rejected local candidate is retained separately rather than being scored as the final output. We also compare the before-edit raster with</w:t>
+      </w:r>
+      <w:r>
+        <w:t xml:space="preserve"> </w:t>
+      </w:r>
+      <w:r>
+        <w:rPr>
+          <w:smallCaps/>
+        </w:rPr>
+        <w:t xml:space="preserve">Full</w:t>
+      </w:r>
+      <w:r>
+        <w:t xml:space="preserve">-after to confirm that a zero selected residual is not caused by an invisible edit. These are repair-fidelity metrics relative to the evaluated representation, not reconstruction-quality metrics against the original camera photographs. Effectivity,</w:t>
       </w:r>
       <w:r>
         <w:t xml:space="preserve"> </w:t>
@@ -7123,7 +7225,7 @@
         <w:t xml:space="preserve"> </w:t>
       </w:r>
       <w:r>
-        <w:t xml:space="preserve">16 times. Figure 3 shows examples of both outcomes, and Table 3 collects the aggregate numbers. We observed no certificate violation, and the native and reference planners agreed on every decision. At the reported</w:t>
+        <w:t xml:space="preserve">16 times. Figure 3 shows examples of both outcomes, and Table 3 collects the aggregate numbers. We observed no certificate violation, and the native and reference output-cone planners agreed on every decision. At the reported</w:t>
       </w:r>
       <w:r>
         <w:t xml:space="preserve"> </w:t>
@@ -7149,7 +7251,7 @@
         <w:t xml:space="preserve"> </w:t>
       </w:r>
       <w:r>
-        <w:t xml:space="preserve">precision, the largest measured RGB residual after the selected repair was 0; the largest emitted bound among selected cases was</w:t>
+        <w:t xml:space="preserve">precision, the largest support-replay residual outside the selected repair support was 0; the largest emitted bound among selected cases was</w:t>
       </w:r>
       <w:r>
         <w:t xml:space="preserve"> </w:t>
@@ -7192,7 +7294,85 @@
         <w:pStyle w:val="BodyText"/>
       </w:pPr>
       <w:r>
-        <w:t xml:space="preserve">A zero selected residual would be less informative if the edits were visually negligible to begin with, so we checked that separately. Before repair, 56 of the 60 source edits were already above the protected RGB tolerance. This rules out the simplest explanation that almost all edits were below the quantity-of-interest threshold anyway.</w:t>
+        <w:t xml:space="preserve">A zero support-replay residual would be less informative if the edits were visually negligible to begin with, so we checked that separately. Before repair, 56 of the 60 source edits were already above the protected RGB tolerance. In the independent raster audit, the final selected output is byte-identical to the</w:t>
+      </w:r>
+      <w:r>
+        <w:t xml:space="preserve"> </w:t>
+      </w:r>
+      <w:r>
+        <w:rPr>
+          <w:smallCaps/>
+        </w:rPr>
+        <w:t xml:space="preserve">Full</w:t>
+      </w:r>
+      <w:r>
+        <w:t xml:space="preserve">-after reference in all 60 cases; more importantly, all 44 cases that actually select</w:t>
+      </w:r>
+      <w:r>
+        <w:t xml:space="preserve"> </w:t>
+      </w:r>
+      <w:r>
+        <w:rPr>
+          <w:smallCaps/>
+        </w:rPr>
+        <w:t xml:space="preserve">Local</w:t>
+      </w:r>
+      <w:r>
+        <w:t xml:space="preserve"> </w:t>
+      </w:r>
+      <w:r>
+        <w:t xml:space="preserve">are also byte-identical to their</w:t>
+      </w:r>
+      <w:r>
+        <w:t xml:space="preserve"> </w:t>
+      </w:r>
+      <w:r>
+        <w:rPr>
+          <w:smallCaps/>
+        </w:rPr>
+        <w:t xml:space="preserve">Full</w:t>
+      </w:r>
+      <w:r>
+        <w:t xml:space="preserve">-after reference at 8-bit RGB precision. The before-to-</w:t>
+      </w:r>
+      <w:r>
+        <w:rPr>
+          <w:smallCaps/>
+        </w:rPr>
+        <w:t xml:space="preserve">Full</w:t>
+      </w:r>
+      <w:r>
+        <w:t xml:space="preserve"> </w:t>
+      </w:r>
+      <w:r>
+        <w:t xml:space="preserve">edit changes a median 1.74% of pixels across all 60 frozen views (range 0–7.88%), with at least one changed pixel in 57/60 views. Dataset medians are 1.89% for Deep Blending and 1.71% for Tanks &amp; Temples. The 16 fallback cases are not used to make a local-fidelity claim because their selected output is</w:t>
+      </w:r>
+      <w:r>
+        <w:t xml:space="preserve"> </w:t>
+      </w:r>
+      <w:r>
+        <w:rPr>
+          <w:smallCaps/>
+        </w:rPr>
+        <w:t xml:space="preserve">Full</w:t>
+      </w:r>
+      <w:r>
+        <w:t xml:space="preserve"> </w:t>
+      </w:r>
+      <w:r>
+        <w:t xml:space="preserve">by construction. Figure 3 reports the actual benchmark-view sequence—before, intended edit, certified support, final selected repair, independent</w:t>
+      </w:r>
+      <w:r>
+        <w:t xml:space="preserve"> </w:t>
+      </w:r>
+      <w:r>
+        <w:rPr>
+          <w:smallCaps/>
+        </w:rPr>
+        <w:t xml:space="preserve">Full</w:t>
+      </w:r>
+      <w:r>
+        <w:t xml:space="preserve">-after reference, and residual—rather than a schematic beauty render.</w:t>
       </w:r>
     </w:p>
     <w:p>
@@ -7200,7 +7380,7 @@
         <w:pStyle w:val="BodyText"/>
       </w:pPr>
       <w:r>
-        <w:t xml:space="preserve">The frozen isolated millisecond cost model reports a median selected heterogeneous work ratio</w:t>
+        <w:t xml:space="preserve">The frozen isolated millisecond cost model reports a median selected four-domain work ratio</w:t>
       </w:r>
     </w:p>
     <w:tbl>
@@ -7439,7 +7619,7 @@
         <w:t xml:space="preserve"> </w:t>
       </w:r>
       <w:r>
-        <w:t xml:space="preserve">should not be confused with an independent measured-error metric. The exact-only, radius, and changed-fraction policies often select very little work, but most of those selections do not pass the certificate. The empirical-order baseline uses empirical influence only to decide expansion order; the final candidate is still certified analytically. We discuss the held-out changed-fraction heuristic separately below.</w:t>
+        <w:t xml:space="preserve">should not be confused with an independent measured-error metric. The exact-only, radius, and changed-fraction policies often select very little work, but most of those selections do not pass the certificate. The empirical-order baseline uses empirical magnitudes only to decide expansion order; the final candidate is still certified with analytic bounds plus exact closure for unsupported dependencies. We discuss the held-out changed-fraction heuristic separately below.</w:t>
       </w:r>
     </w:p>
     <w:bookmarkStart w:id="61" w:name="tab:baselines"/>
@@ -7452,7 +7632,7 @@
         <w:t xml:space="preserve">Table 2. </w:t>
       </w:r>
       <w:r>
-        <w:t xml:space="preserve">Frozen public method comparison. The work column is the baseline suite’s native work-ratio metric and is distinct from the calibrated heterogeneous headline ratio of 0.36953.</w:t>
+        <w:t xml:space="preserve">Frozen public method comparison. The work column is the baseline suite’s native work-ratio metric and is distinct from the calibrated four-domain headline ratio of 0.36953.</w:t>
       </w:r>
       <w:r>
         <w:t xml:space="preserve"> </w:t>
@@ -7477,7 +7657,7 @@
         <w:tblLayout w:type="fixed"/>
         <w:tblLook w:firstRow="1" w:lastRow="0" w:firstColumn="0" w:lastColumn="0" w:noHBand="0" w:noVBand="0" w:val="0020"/>
         <w:jc w:val="start"/>
-        <w:tblCaption w:val="Frozen public method comparison. The work column is the baseline suite’s native work-ratio metric and is distinct from the calibrated heterogeneous headline ratio of 0.36953. Uncertified means the selected cone failed the conservative certificate, not that an independent oracle violation was observed. All four tested radius policies produced the same aggregate values on this matrix."/>
+        <w:tblCaption w:val="Frozen public method comparison. The work column is the baseline suite’s native work-ratio metric and is distinct from the calibrated four-domain headline ratio of 0.36953. Uncertified means the selected cone failed the conservative certificate, not that an independent oracle violation was observed. All four tested radius policies produced the same aggregate values on this matrix."/>
         <w:tblBorders>
           <w:top w:val="single" w:sz="4" w:color="B0B0B0"/>
           <w:bottom w:val="single" w:sz="4" w:color="B0B0B0"/>
@@ -8325,7 +8505,7 @@
       <w:r>
         <w:drawing>
           <wp:inline>
-            <wp:extent cx="5067300" cy="3040379"/>
+            <wp:extent cx="4907280" cy="2944368"/>
             <wp:effectExtent b="0" l="0" r="0" t="0"/>
             <wp:docPr descr="" title="" id="63" name="Picture"/>
             <a:graphic>
@@ -8346,7 +8526,7 @@
                   <pic:spPr bwMode="auto">
                     <a:xfrm>
                       <a:off x="0" y="0"/>
-                      <a:ext cx="5067300" cy="3040379"/>
+                      <a:ext cx="4907280" cy="2944368"/>
                     </a:xfrm>
                     <a:prstGeom prst="rect">
                       <a:avLst/>
@@ -8374,7 +8554,7 @@
         <w:t xml:space="preserve">Figure 3. </w:t>
       </w:r>
       <w:r>
-        <w:t xml:space="preserve">Representative frozen revision outcomes. Top: a certified local case repairs only the selected support and matches the independent</w:t>
+        <w:t xml:space="preserve">Representative frozen benchmark-view outcomes. Top: a certified local case repairs only the selected support and has zero measured support-replay residual against the independently rendered</w:t>
       </w:r>
       <w:r>
         <w:t xml:space="preserve"> </w:t>
@@ -8401,7 +8581,16 @@
         <w:t xml:space="preserve"> </w:t>
       </w:r>
       <w:r>
-        <w:t xml:space="preserve">fallback rather than forcing a local decision. The intended-edit and certified-support panels make the source effect and selected scope explicit; the residual panel is computed against the independent full-after oracle.</w:t>
+        <w:t xml:space="preserve">fallback rather than forcing a local decision. The before/edit/support/selected/</w:t>
+      </w:r>
+      <w:r>
+        <w:rPr>
+          <w:smallCaps/>
+        </w:rPr>
+        <w:t xml:space="preserve">Full</w:t>
+      </w:r>
+      <w:r>
+        <w:t xml:space="preserve">/residual sequence is generated from the frozen benchmark evidence rather than redrawn for presentation. The residual panel is computed against the independent full-after oracle.</w:t>
       </w:r>
     </w:p>
     <w:bookmarkStart w:id="65" w:name="tab:summary"/>
@@ -9012,6 +9201,68 @@
       </w:r>
       <w:r>
         <w:t xml:space="preserve">. In other words, the update itself can be sharply local while finding the candidates is still almost global. We regard that as the main systems limitation of the frozen end-to-end implementation.</w:t>
+      </w:r>
+    </w:p>
+    <w:p>
+      <w:pPr>
+        <w:pStyle w:val="BodyText"/>
+      </w:pPr>
+      <w:r>
+        <w:t xml:space="preserve">A direct raster audit provides a second check on the visual consequence of those decisions. All four trained-3DGS</w:t>
+      </w:r>
+      <w:r>
+        <w:t xml:space="preserve"> </w:t>
+      </w:r>
+      <w:r>
+        <w:rPr>
+          <w:smallCaps/>
+        </w:rPr>
+        <w:t xml:space="preserve">Local</w:t>
+      </w:r>
+      <w:r>
+        <w:t xml:space="preserve"> </w:t>
+      </w:r>
+      <w:r>
+        <w:t xml:space="preserve">selections match the independent</w:t>
+      </w:r>
+      <w:r>
+        <w:t xml:space="preserve"> </w:t>
+      </w:r>
+      <w:r>
+        <w:rPr>
+          <w:smallCaps/>
+        </w:rPr>
+        <w:t xml:space="preserve">Full</w:t>
+      </w:r>
+      <w:r>
+        <w:t xml:space="preserve">-after raster exactly at 8-bit RGB precision (maximum channel difference 0/255 and 100% exact pixels); the fifth case selects</w:t>
+      </w:r>
+      <w:r>
+        <w:t xml:space="preserve"> </w:t>
+      </w:r>
+      <w:r>
+        <w:rPr>
+          <w:smallCaps/>
+        </w:rPr>
+        <w:t xml:space="preserve">Full</w:t>
+      </w:r>
+      <w:r>
+        <w:t xml:space="preserve"> </w:t>
+      </w:r>
+      <w:r>
+        <w:t xml:space="preserve">by construction. The underlying edits are visible: the before-to-</w:t>
+      </w:r>
+      <w:r>
+        <w:rPr>
+          <w:smallCaps/>
+        </w:rPr>
+        <w:t xml:space="preserve">Full</w:t>
+      </w:r>
+      <w:r>
+        <w:t xml:space="preserve"> </w:t>
+      </w:r>
+      <w:r>
+        <w:t xml:space="preserve">comparison changes 1.60–2.66% of pixels across the five frozen views (median 2.23%), with maximum channel difference reaching 255/255. We report exact equality rather than an arbitrarily capped PSNR value; formally, PSNR is unbounded when the mean-squared error is zero.</w:t>
       </w:r>
     </w:p>
     <w:bookmarkStart w:id="67" w:name="tab:trained"/>
@@ -10567,12 +10818,12 @@
         <w:pStyle w:val="BodyText"/>
       </w:pPr>
       <w:r>
-        <w:t xml:space="preserve">At the reported precision, every selected public residual is numerically zero, even though 56 of the 60 source edits were above tolerance before repair. This lets the real matrix test selection and fallback behavior, but it does not tell us how tight the certificate is when a non-zero residual is still acceptable. The threshold-crossing mechanism-isolation cases are useful here only in a limited sense: they show that the analytic machinery can change a decision when it is stressed. We do not use them as a stand-in for real non-zero-residual evidence.</w:t>
+        <w:t xml:space="preserve">At the reported precision, every selected public support-replay residual is numerically zero, even though 56 of the 60 source edits were above tolerance before repair. This lets the real matrix test selection and fallback behavior, but it does not tell us how tight the certificate is when a non-zero residual is still acceptable. The threshold-crossing mechanism-isolation cases are useful here only in a limited sense: they show that the analytic machinery can change a decision when it is stressed. We do not use them as a stand-in for real non-zero-residual evidence.</w:t>
       </w:r>
     </w:p>
     <w:bookmarkEnd w:id="72"/>
     <w:bookmarkEnd w:id="73"/>
-    <w:bookmarkStart w:id="84" w:name="discussion"/>
+    <w:bookmarkStart w:id="85" w:name="discussion"/>
     <w:p>
       <w:pPr>
         <w:pStyle w:val="Heading1"/>
@@ -10613,7 +10864,7 @@
         <w:pStyle w:val="FirstParagraph"/>
       </w:pPr>
       <w:r>
-        <w:t xml:space="preserve">Within the frozen revision domain and under the stated bound assumptions, three conclusions are supported by the experiment. The emitted certificate survived independent full-reference replay in every evaluated case. The planner also did not force a local answer: more than a quarter of the public revisions crossed to</w:t>
+        <w:t xml:space="preserve">Within the frozen revision domain and under the stated bound assumptions, three conclusions are supported by the experiment. The emitted certificate survived independent full-reference falsification of the unrepaired exterior in every evaluated case. The planner also did not force a local answer: more than a quarter of the public revisions crossed to</w:t>
       </w:r>
       <w:r>
         <w:t xml:space="preserve"> </w:t>
@@ -10662,7 +10913,7 @@
         <w:t xml:space="preserve">prediction</w:t>
       </w:r>
       <w:r>
-        <w:t xml:space="preserve">. An empirical scheduler can guess every available case correctly and still have no defensible answer for the next unseen case. To become part of the safety argument, that prediction would need a conservative bound with a valid remainder. CBRC therefore lets empirical information influence scheduling, but not certification. The converse can also happen: an</w:t>
+        <w:t xml:space="preserve">. An empirical scheduler can guess every available case correctly and still have no defensible answer for the next unseen case. To become part of the safety argument, that prediction would need a conservative bound with a valid remainder. CBRC therefore lets empirical magnitudes influence scheduling, but does not use them as soft certificate bounds; unsupported empirical-only dependencies are instead closed exactly. The converse can also happen: an</w:t>
       </w:r>
       <w:r>
         <w:t xml:space="preserve"> </w:t>
@@ -10696,7 +10947,7 @@
       </w:r>
     </w:p>
     <w:bookmarkEnd w:id="74"/>
-    <w:bookmarkStart w:id="82" w:name="limitations"/>
+    <w:bookmarkStart w:id="83" w:name="limitations"/>
     <w:p>
       <w:pPr>
         <w:pStyle w:val="Heading2"/>
@@ -10808,7 +11059,7 @@
         <w:t xml:space="preserve"> </w:t>
       </w:r>
       <w:r>
-        <w:t xml:space="preserve">figure is a reduction in calibrated heterogeneous work. The trained 28.614</w:t>
+        <w:t xml:space="preserve">figure is a reduction in calibrated four-domain work. The trained 28.614</w:t>
       </w:r>
       <m:oMath>
         <m:r>
@@ -10826,13 +11077,13 @@
       </w:r>
     </w:p>
     <w:bookmarkEnd w:id="77"/>
-    <w:bookmarkStart w:id="78" w:name="greedy-search-is-not-globally-optimal."/>
+    <w:bookmarkStart w:id="78" w:name="X0699026322bda00e1076f32d8edd98c2c95bd11"/>
     <w:p>
       <w:pPr>
         <w:pStyle w:val="Heading4"/>
       </w:pPr>
       <w:r>
-        <w:t xml:space="preserve">Greedy search is not globally optimal.</w:t>
+        <w:t xml:space="preserve">Rendered fidelity is not reconstruction fidelity.</w:t>
       </w:r>
     </w:p>
     <w:p>
@@ -10840,25 +11091,7 @@
         <w:pStyle w:val="FirstParagraph"/>
       </w:pPr>
       <w:r>
-        <w:t xml:space="preserve">Equation 15 gives us a certified feasible cone, not a proof that the cone is the cheapest safe one. Finding the global minimum-work solution is a combinatorial optimization problem and is outside the v1 claim.</w:t>
-      </w:r>
-    </w:p>
-    <w:bookmarkEnd w:id="78"/>
-    <w:bookmarkStart w:id="79" w:name="analytic-cycles-fail-closed."/>
-    <w:p>
-      <w:pPr>
-        <w:pStyle w:val="Heading4"/>
-      </w:pPr>
-      <w:r>
-        <w:t xml:space="preserve">Analytic cycles fail closed.</w:t>
-      </w:r>
-    </w:p>
-    <w:p>
-      <w:pPr>
-        <w:pStyle w:val="FirstParagraph"/>
-      </w:pPr>
-      <w:r>
-        <w:t xml:space="preserve">The reference formulation allows the classical resolvent when its assumptions are satisfied. The native v1 implementation is narrower and certifies finite analytic DAG exteriors. Unsupported cycles therefore cause the cone to expand or fall back to</w:t>
+        <w:t xml:space="preserve">The new visual-quality audit compares a selected repair against the independent</w:t>
       </w:r>
       <w:r>
         <w:t xml:space="preserve"> </w:t>
@@ -10870,11 +11103,71 @@
         <w:t xml:space="preserve">Full</w:t>
       </w:r>
       <w:r>
+        <w:t xml:space="preserve">-after render of the same evaluated representation and camera. Exact selected-to-</w:t>
+      </w:r>
+      <w:r>
+        <w:rPr>
+          <w:smallCaps/>
+        </w:rPr>
+        <w:t xml:space="preserve">Full</w:t>
+      </w:r>
+      <w:r>
+        <w:t xml:space="preserve"> </w:t>
+      </w:r>
+      <w:r>
+        <w:t xml:space="preserve">equality therefore supports the claim that the local repair preserves the full-update result on those views; it does not establish that the underlying reconstruction is photorealistic or matches held-out source photographs. This distinction is especially important for the public RGB/SfM campaign, whose Gaussian fields are seeded from COLMAP points rather than trained photorealistic 3DGS. The trained-3DGS check narrows that representation gap but remains a five-revision secondary validation.</w:t>
+      </w:r>
+    </w:p>
+    <w:bookmarkEnd w:id="78"/>
+    <w:bookmarkStart w:id="79" w:name="greedy-search-is-not-globally-optimal."/>
+    <w:p>
+      <w:pPr>
+        <w:pStyle w:val="Heading4"/>
+      </w:pPr>
+      <w:r>
+        <w:t xml:space="preserve">Greedy search is not globally optimal.</w:t>
+      </w:r>
+    </w:p>
+    <w:p>
+      <w:pPr>
+        <w:pStyle w:val="FirstParagraph"/>
+      </w:pPr>
+      <w:r>
+        <w:t xml:space="preserve">Equation 15 gives us a certified feasible cone, not a proof that the cone is the cheapest safe one. Finding the global minimum-work solution is a combinatorial optimization problem and is outside the v1 claim.</w:t>
+      </w:r>
+    </w:p>
+    <w:bookmarkEnd w:id="79"/>
+    <w:bookmarkStart w:id="80" w:name="analytic-cycles-fail-closed."/>
+    <w:p>
+      <w:pPr>
+        <w:pStyle w:val="Heading4"/>
+      </w:pPr>
+      <w:r>
+        <w:t xml:space="preserve">Analytic cycles fail closed.</w:t>
+      </w:r>
+    </w:p>
+    <w:p>
+      <w:pPr>
+        <w:pStyle w:val="FirstParagraph"/>
+      </w:pPr>
+      <w:r>
+        <w:t xml:space="preserve">The reference formulation allows the classical resolvent when its assumptions are satisfied. The native v1 implementation is narrower and certifies finite analytic DAG exteriors. Unsupported cycles therefore cause the cone to expand or fall back to</w:t>
+      </w:r>
+      <w:r>
+        <w:t xml:space="preserve"> </w:t>
+      </w:r>
+      <w:r>
+        <w:rPr>
+          <w:smallCaps/>
+        </w:rPr>
+        <w:t xml:space="preserve">Full</w:t>
+      </w:r>
+      <w:r>
         <w:t xml:space="preserve">. General cyclic certification remains future work.</w:t>
       </w:r>
     </w:p>
-    <w:bookmarkEnd w:id="79"/>
-    <w:bookmarkStart w:id="80" w:name="representation-and-dataset-scope."/>
+    <w:bookmarkEnd w:id="80"/>
+    <w:bookmarkStart w:id="81" w:name="representation-and-dataset-scope."/>
     <w:p>
       <w:pPr>
         <w:pStyle w:val="Heading4"/>
@@ -10888,11 +11181,11 @@
         <w:pStyle w:val="FirstParagraph"/>
       </w:pPr>
       <w:r>
-        <w:t xml:space="preserve">The primary public campaign is built from normalized RGB/SfM reconstructions seeded into Gaussian fields, not from trained photorealistic 3DGS, and it is not a metric-scale reconstruction benchmark. The trained-3DGS experiment helps, but it is only a five-revision representation check. A broader evaluation over trained scenes is the obvious next step if we want stronger evidence of generality.</w:t>
-      </w:r>
-    </w:p>
-    <w:bookmarkEnd w:id="80"/>
-    <w:bookmarkStart w:id="81" w:name="ablation-identifiability."/>
+        <w:t xml:space="preserve">The primary public campaign is built from normalized RGB/SfM reconstructions seeded into Gaussian fields, not from trained photorealistic 3DGS, and it is not a metric-scale reconstruction benchmark. Its frozen evidence exercises Gaussian inspection/update, GPU publication, and temporal output invalidation; the broader observation/TSDF/mesh/texture/material ledger and captured-world graph are implemented and regression-tested but are not measured by the 60-case headline campaign. The trained-3DGS experiment helps, but it is only a five-revision representation check over the same output-side scope. A broader full-stack evaluation over trained scenes and additional derived-state domains is needed for stronger evidence of generality.</w:t>
+      </w:r>
+    </w:p>
+    <w:bookmarkEnd w:id="81"/>
+    <w:bookmarkStart w:id="82" w:name="ablation-identifiability."/>
     <w:p>
       <w:pPr>
         <w:pStyle w:val="Heading4"/>
@@ -10909,9 +11202,9 @@
         <w:t xml:space="preserve">Not every mechanism separates on the frozen real matrix. Rather than forcing a cleaner story, we keep the real-workload results distinct from the synthetic mechanism-isolation results. The paper therefore does not claim that every mechanism produces a measurable benefit in every scene.</w:t>
       </w:r>
     </w:p>
-    <w:bookmarkEnd w:id="81"/>
     <w:bookmarkEnd w:id="82"/>
-    <w:bookmarkStart w:id="83" w:name="implications"/>
+    <w:bookmarkEnd w:id="83"/>
+    <w:bookmarkStart w:id="84" w:name="implications"/>
     <w:p>
       <w:pPr>
         <w:pStyle w:val="Heading2"/>
@@ -10945,9 +11238,9 @@
         <w:t xml:space="preserve">Failure is also more useful when it is kept intact. A certificate violation is not folded into an average quality score; we retain it as a regression target together with the revision manifest, graph version, chosen cone, emitted bound, full-reference output, and the first violated invariant. That may be less convenient than a single aggregate metric, but it matches the correctness burden introduced by selective recomputation.</w:t>
       </w:r>
     </w:p>
-    <w:bookmarkEnd w:id="83"/>
     <w:bookmarkEnd w:id="84"/>
-    <w:bookmarkStart w:id="85" w:name="reproducibility-and-artifact-scope"/>
+    <w:bookmarkEnd w:id="85"/>
+    <w:bookmarkStart w:id="86" w:name="reproducibility-and-artifact-scope"/>
     <w:p>
       <w:pPr>
         <w:pStyle w:val="Heading1"/>
@@ -10981,8 +11274,8 @@
         <w:t xml:space="preserve">Scene figures retain the relevant upstream terms. Original software is licensed under Apache-2.0, original research communication is scoped under CC BY 4.0, and third-party rights are recorded separately. For double-blind review, the identifiable repository and author metadata should be replaced with an anonymized frozen supplement that follows the target venue’s policy.</w:t>
       </w:r>
     </w:p>
-    <w:bookmarkEnd w:id="85"/>
-    <w:bookmarkStart w:id="86" w:name="conclusion"/>
+    <w:bookmarkEnd w:id="86"/>
+    <w:bookmarkStart w:id="87" w:name="conclusion"/>
     <w:p>
       <w:pPr>
         <w:pStyle w:val="Heading1"/>
@@ -11005,11 +11298,11 @@
         <w:pStyle w:val="FirstParagraph"/>
       </w:pPr>
       <w:r>
-        <w:t xml:space="preserve">We introduced Criticality-Bounded Revision Cones as a fail-closed rule for selective recomputation in persistent captured worlds. Criticality is the worst normalized certificate-to-tolerance ratio over the protected outputs. CBRC separates exact dependencies from bounded finite-change influence, ties the unrepaired exterior to explicit tolerances, compares regional work with a full baseline, and independently replays the selected result against a full-after oracle. The frozen public and trained-representation experiments show that local repair and full fallback can coexist under one auditable contract. They also expose the remaining gaps: discovery is still close to global in the frozen path, and there is no paired wall-clock speedup result yet. Repair locally when the system can justify what it leaves alone; rebuild when it cannot.</w:t>
-      </w:r>
-    </w:p>
-    <w:bookmarkEnd w:id="86"/>
-    <w:bookmarkStart w:id="127" w:name="acknowledgments"/>
+        <w:t xml:space="preserve">We introduced Criticality-Bounded Revision Cones as a fail-closed rule for selective recomputation in persistent captured worlds. Criticality is the worst normalized certificate-to-tolerance ratio over the protected outputs. CBRC separates exact dependencies from bounded finite-change influence, ties the unrepaired exterior to explicit tolerances, compares regional work with a full baseline, and independently falsifies the residual outside the selected repair support against a full-after oracle. The frozen public and trained-representation experiments show that local repair and full fallback can coexist under one auditable contract. They also expose the remaining gaps: discovery is still close to global in the frozen path, and there is no paired wall-clock speedup result yet. Repair locally when the system can justify what it leaves alone; rebuild when it cannot.</w:t>
+      </w:r>
+    </w:p>
+    <w:bookmarkEnd w:id="87"/>
+    <w:bookmarkStart w:id="135" w:name="acknowledgments"/>
     <w:p>
       <w:pPr>
         <w:pStyle w:val="Heading1"/>
@@ -11018,7 +11311,7 @@
         <w:t xml:space="preserve">Acknowledgments</w:t>
       </w:r>
     </w:p>
-    <w:bookmarkStart w:id="126" w:name="generative-ai-use-disclosure."/>
+    <w:bookmarkStart w:id="134" w:name="generative-ai-use-disclosure."/>
     <w:p>
       <w:pPr>
         <w:pStyle w:val="Heading4"/>
@@ -11035,8 +11328,8 @@
         <w:t xml:space="preserve">OpenAI ChatGPT was used as an assistive tool during portions of this project for literature-search support, software and scripting development, debugging, experimental and benchmark planning, visualization/manuscript-artifact scripting, and drafting, restructuring, and language editing of the manuscript and supplement. The reported measurements and frozen evidence were produced by the project software and experimental artifacts rather than generated by the language model. The author retains full responsibility for the code, citations, analysis, claims, conclusions, and final text; no generative AI system is listed as an author.</w:t>
       </w:r>
     </w:p>
-    <w:bookmarkStart w:id="125" w:name="refs"/>
-    <w:bookmarkStart w:id="88" w:name="ref-acar2013selfadjusting"/>
+    <w:bookmarkStart w:id="133" w:name="refs"/>
+    <w:bookmarkStart w:id="89" w:name="ref-acar2013selfadjusting"/>
     <w:p>
       <w:pPr>
         <w:pStyle w:val="Bibliography"/>
@@ -11069,7 +11362,7 @@
       <w:r>
         <w:t xml:space="preserve"> </w:t>
       </w:r>
-      <w:hyperlink r:id="rId87">
+      <w:hyperlink r:id="rId88">
         <w:r>
           <w:rPr>
             <w:rStyle w:val="Hyperlink"/>
@@ -11081,8 +11374,8 @@
         <w:t xml:space="preserve">.</w:t>
       </w:r>
     </w:p>
-    <w:bookmarkEnd w:id="88"/>
-    <w:bookmarkStart w:id="89" w:name="ref-ackermann2025clsplats"/>
+    <w:bookmarkEnd w:id="89"/>
+    <w:bookmarkStart w:id="90" w:name="ref-ackermann2025clsplats"/>
     <w:p>
       <w:pPr>
         <w:pStyle w:val="Bibliography"/>
@@ -11116,8 +11409,8 @@
         <w:t xml:space="preserve">, 7808–17.</w:t>
       </w:r>
     </w:p>
-    <w:bookmarkEnd w:id="89"/>
-    <w:bookmarkStart w:id="91" w:name="ref-bala1999raysegment"/>
+    <w:bookmarkEnd w:id="90"/>
+    <w:bookmarkStart w:id="92" w:name="ref-bala1999raysegment"/>
     <w:p>
       <w:pPr>
         <w:pStyle w:val="Bibliography"/>
@@ -11153,7 +11446,7 @@
       <w:r>
         <w:t xml:space="preserve"> </w:t>
       </w:r>
-      <w:hyperlink r:id="rId90">
+      <w:hyperlink r:id="rId91">
         <w:r>
           <w:rPr>
             <w:rStyle w:val="Hyperlink"/>
@@ -11165,8 +11458,8 @@
         <w:t xml:space="preserve">.</w:t>
       </w:r>
     </w:p>
-    <w:bookmarkEnd w:id="91"/>
-    <w:bookmarkStart w:id="93" w:name="ref-chen2024gaussianeditor"/>
+    <w:bookmarkEnd w:id="92"/>
+    <w:bookmarkStart w:id="94" w:name="ref-chen2024gaussianeditor"/>
     <w:p>
       <w:pPr>
         <w:pStyle w:val="Bibliography"/>
@@ -11202,7 +11495,7 @@
       <w:r>
         <w:t xml:space="preserve"> </w:t>
       </w:r>
-      <w:hyperlink r:id="rId92">
+      <w:hyperlink r:id="rId93">
         <w:r>
           <w:rPr>
             <w:rStyle w:val="Hyperlink"/>
@@ -11214,8 +11507,8 @@
         <w:t xml:space="preserve">.</w:t>
       </w:r>
     </w:p>
-    <w:bookmarkEnd w:id="93"/>
-    <w:bookmarkStart w:id="94" w:name="ref-curless1996volumetric"/>
+    <w:bookmarkEnd w:id="94"/>
+    <w:bookmarkStart w:id="95" w:name="ref-curless1996volumetric"/>
     <w:p>
       <w:pPr>
         <w:pStyle w:val="Bibliography"/>
@@ -11249,8 +11542,8 @@
         <w:t xml:space="preserve">, 303–12.</w:t>
       </w:r>
     </w:p>
-    <w:bookmarkEnd w:id="94"/>
-    <w:bookmarkStart w:id="95" w:name="ref-dai2017bundlefusion"/>
+    <w:bookmarkEnd w:id="95"/>
+    <w:bookmarkStart w:id="97" w:name="ref-dai2017bundlefusion"/>
     <w:p>
       <w:pPr>
         <w:pStyle w:val="Bibliography"/>
@@ -11278,11 +11571,25 @@
         <w:t xml:space="preserve"> </w:t>
       </w:r>
       <w:r>
-        <w:t xml:space="preserve">36 (4): 76:1–18.</w:t>
-      </w:r>
-    </w:p>
-    <w:bookmarkEnd w:id="95"/>
-    <w:bookmarkStart w:id="96" w:name="ref-ellensohn2026eligsir"/>
+        <w:t xml:space="preserve">36 (4): 24:1–18.</w:t>
+      </w:r>
+      <w:r>
+        <w:t xml:space="preserve"> </w:t>
+      </w:r>
+      <w:hyperlink r:id="rId96">
+        <w:r>
+          <w:rPr>
+            <w:rStyle w:val="Hyperlink"/>
+          </w:rPr>
+          <w:t xml:space="preserve">https://doi.org/10.1145/3072959.3054739</w:t>
+        </w:r>
+      </w:hyperlink>
+      <w:r>
+        <w:t xml:space="preserve">.</w:t>
+      </w:r>
+    </w:p>
+    <w:bookmarkEnd w:id="97"/>
+    <w:bookmarkStart w:id="98" w:name="ref-ellensohn2026eligsir"/>
     <w:p>
       <w:pPr>
         <w:pStyle w:val="Bibliography"/>
@@ -11310,8 +11617,8 @@
         <w:t xml:space="preserve">.</w:t>
       </w:r>
     </w:p>
-    <w:bookmarkEnd w:id="96"/>
-    <w:bookmarkStart w:id="97" w:name="ref-galappaththige2026pixels"/>
+    <w:bookmarkEnd w:id="98"/>
+    <w:bookmarkStart w:id="99" w:name="ref-galappaththige2026pixels"/>
     <w:p>
       <w:pPr>
         <w:pStyle w:val="Bibliography"/>
@@ -11339,8 +11646,54 @@
         <w:t xml:space="preserve">.</w:t>
       </w:r>
     </w:p>
-    <w:bookmarkEnd w:id="97"/>
-    <w:bookmarkStart w:id="99" w:name="ref-huang2024scgs"/>
+    <w:bookmarkEnd w:id="99"/>
+    <w:bookmarkStart w:id="101" w:name="ref-hedman2018deepblending"/>
+    <w:p>
+      <w:pPr>
+        <w:pStyle w:val="Bibliography"/>
+      </w:pPr>
+      <w:r>
+        <w:t xml:space="preserve">Hedman, Peter, Julien Philip, True Price, Jan-Michael Frahm, George Drettakis, and Gabriel J. Brostow. 2018.</w:t>
+      </w:r>
+      <w:r>
+        <w:t xml:space="preserve"> </w:t>
+      </w:r>
+      <w:r>
+        <w:t xml:space="preserve">“Deep Blending for Free-Viewpoint Image-Based Rendering.”</w:t>
+      </w:r>
+      <w:r>
+        <w:t xml:space="preserve"> </w:t>
+      </w:r>
+      <w:r>
+        <w:rPr>
+          <w:iCs/>
+          <w:i/>
+        </w:rPr>
+        <w:t xml:space="preserve">ACM Transactions on Graphics</w:t>
+      </w:r>
+      <w:r>
+        <w:t xml:space="preserve"> </w:t>
+      </w:r>
+      <w:r>
+        <w:t xml:space="preserve">37 (6): 257:1–15.</w:t>
+      </w:r>
+      <w:r>
+        <w:t xml:space="preserve"> </w:t>
+      </w:r>
+      <w:hyperlink r:id="rId100">
+        <w:r>
+          <w:rPr>
+            <w:rStyle w:val="Hyperlink"/>
+          </w:rPr>
+          <w:t xml:space="preserve">https://doi.org/10.1145/3272127.3275084</w:t>
+        </w:r>
+      </w:hyperlink>
+      <w:r>
+        <w:t xml:space="preserve">.</w:t>
+      </w:r>
+    </w:p>
+    <w:bookmarkEnd w:id="101"/>
+    <w:bookmarkStart w:id="103" w:name="ref-huang2024scgs"/>
     <w:p>
       <w:pPr>
         <w:pStyle w:val="Bibliography"/>
@@ -11376,7 +11729,7 @@
       <w:r>
         <w:t xml:space="preserve"> </w:t>
       </w:r>
-      <w:hyperlink r:id="rId98">
+      <w:hyperlink r:id="rId102">
         <w:r>
           <w:rPr>
             <w:rStyle w:val="Hyperlink"/>
@@ -11388,8 +11741,8 @@
         <w:t xml:space="preserve">.</w:t>
       </w:r>
     </w:p>
-    <w:bookmarkEnd w:id="99"/>
-    <w:bookmarkStart w:id="100" w:name="ref-keetha2024splatam"/>
+    <w:bookmarkEnd w:id="103"/>
+    <w:bookmarkStart w:id="104" w:name="ref-keetha2024splatam"/>
     <w:p>
       <w:pPr>
         <w:pStyle w:val="Bibliography"/>
@@ -11423,8 +11776,8 @@
         <w:t xml:space="preserve">, 21357–66.</w:t>
       </w:r>
     </w:p>
-    <w:bookmarkEnd w:id="100"/>
-    <w:bookmarkStart w:id="102" w:name="ref-kerbl2023gaussians"/>
+    <w:bookmarkEnd w:id="104"/>
+    <w:bookmarkStart w:id="106" w:name="ref-kerbl2023gaussians"/>
     <w:p>
       <w:pPr>
         <w:pStyle w:val="Bibliography"/>
@@ -11457,7 +11810,7 @@
       <w:r>
         <w:t xml:space="preserve"> </w:t>
       </w:r>
-      <w:hyperlink r:id="rId101">
+      <w:hyperlink r:id="rId105">
         <w:r>
           <w:rPr>
             <w:rStyle w:val="Hyperlink"/>
@@ -11469,8 +11822,54 @@
         <w:t xml:space="preserve">.</w:t>
       </w:r>
     </w:p>
-    <w:bookmarkEnd w:id="102"/>
-    <w:bookmarkStart w:id="104" w:name="ref-luiten2024dynamic3dgaussians"/>
+    <w:bookmarkEnd w:id="106"/>
+    <w:bookmarkStart w:id="108" w:name="ref-knapitsch2017tandt"/>
+    <w:p>
+      <w:pPr>
+        <w:pStyle w:val="Bibliography"/>
+      </w:pPr>
+      <w:r>
+        <w:t xml:space="preserve">Knapitsch, Arno, Jaesik Park, Qian-Yi Zhou, and Vladlen Koltun. 2017.</w:t>
+      </w:r>
+      <w:r>
+        <w:t xml:space="preserve"> </w:t>
+      </w:r>
+      <w:r>
+        <w:t xml:space="preserve">“Tanks and Temples: Benchmarking Large-Scale Scene Reconstruction.”</w:t>
+      </w:r>
+      <w:r>
+        <w:t xml:space="preserve"> </w:t>
+      </w:r>
+      <w:r>
+        <w:rPr>
+          <w:iCs/>
+          <w:i/>
+        </w:rPr>
+        <w:t xml:space="preserve">ACM Transactions on Graphics</w:t>
+      </w:r>
+      <w:r>
+        <w:t xml:space="preserve"> </w:t>
+      </w:r>
+      <w:r>
+        <w:t xml:space="preserve">36 (4).</w:t>
+      </w:r>
+      <w:r>
+        <w:t xml:space="preserve"> </w:t>
+      </w:r>
+      <w:hyperlink r:id="rId107">
+        <w:r>
+          <w:rPr>
+            <w:rStyle w:val="Hyperlink"/>
+          </w:rPr>
+          <w:t xml:space="preserve">https://doi.org/10.1145/3072959.3073599</w:t>
+        </w:r>
+      </w:hyperlink>
+      <w:r>
+        <w:t xml:space="preserve">.</w:t>
+      </w:r>
+    </w:p>
+    <w:bookmarkEnd w:id="108"/>
+    <w:bookmarkStart w:id="110" w:name="ref-luiten2024dynamic3dgaussians"/>
     <w:p>
       <w:pPr>
         <w:pStyle w:val="Bibliography"/>
@@ -11506,7 +11905,7 @@
       <w:r>
         <w:t xml:space="preserve"> </w:t>
       </w:r>
-      <w:hyperlink r:id="rId103">
+      <w:hyperlink r:id="rId109">
         <w:r>
           <w:rPr>
             <w:rStyle w:val="Hyperlink"/>
@@ -11518,8 +11917,8 @@
         <w:t xml:space="preserve">.</w:t>
       </w:r>
     </w:p>
-    <w:bookmarkEnd w:id="104"/>
-    <w:bookmarkStart w:id="106" w:name="ref-matsuki2024monogs"/>
+    <w:bookmarkEnd w:id="110"/>
+    <w:bookmarkStart w:id="112" w:name="ref-matsuki2024monogs"/>
     <w:p>
       <w:pPr>
         <w:pStyle w:val="Bibliography"/>
@@ -11555,7 +11954,7 @@
       <w:r>
         <w:t xml:space="preserve"> </w:t>
       </w:r>
-      <w:hyperlink r:id="rId105">
+      <w:hyperlink r:id="rId111">
         <w:r>
           <w:rPr>
             <w:rStyle w:val="Hyperlink"/>
@@ -11567,8 +11966,8 @@
         <w:t xml:space="preserve">.</w:t>
       </w:r>
     </w:p>
-    <w:bookmarkEnd w:id="106"/>
-    <w:bookmarkStart w:id="107" w:name="ref-mildenhall2020nerf"/>
+    <w:bookmarkEnd w:id="112"/>
+    <w:bookmarkStart w:id="113" w:name="ref-mildenhall2020nerf"/>
     <w:p>
       <w:pPr>
         <w:pStyle w:val="Bibliography"/>
@@ -11602,8 +12001,8 @@
         <w:t xml:space="preserve">, 405–21.</w:t>
       </w:r>
     </w:p>
-    <w:bookmarkEnd w:id="107"/>
-    <w:bookmarkStart w:id="108" w:name="ref-newcombe2011kinectfusion"/>
+    <w:bookmarkEnd w:id="113"/>
+    <w:bookmarkStart w:id="114" w:name="ref-newcombe2011kinectfusion"/>
     <w:p>
       <w:pPr>
         <w:pStyle w:val="Bibliography"/>
@@ -11637,8 +12036,8 @@
         <w:t xml:space="preserve">, 127–36.</w:t>
       </w:r>
     </w:p>
-    <w:bookmarkEnd w:id="108"/>
-    <w:bookmarkStart w:id="110" w:name="ref-oden2001goal"/>
+    <w:bookmarkEnd w:id="114"/>
+    <w:bookmarkStart w:id="116" w:name="ref-oden2001goal"/>
     <w:p>
       <w:pPr>
         <w:pStyle w:val="Bibliography"/>
@@ -11671,7 +12070,7 @@
       <w:r>
         <w:t xml:space="preserve"> </w:t>
       </w:r>
-      <w:hyperlink r:id="rId109">
+      <w:hyperlink r:id="rId115">
         <w:r>
           <w:rPr>
             <w:rStyle w:val="Hyperlink"/>
@@ -11683,8 +12082,8 @@
         <w:t xml:space="preserve">.</w:t>
       </w:r>
     </w:p>
-    <w:bookmarkEnd w:id="110"/>
-    <w:bookmarkStart w:id="112" w:name="ref-pfister2000surfels"/>
+    <w:bookmarkEnd w:id="116"/>
+    <w:bookmarkStart w:id="118" w:name="ref-pfister2000surfels"/>
     <w:p>
       <w:pPr>
         <w:pStyle w:val="Bibliography"/>
@@ -11720,7 +12119,7 @@
       <w:r>
         <w:t xml:space="preserve"> </w:t>
       </w:r>
-      <w:hyperlink r:id="rId111">
+      <w:hyperlink r:id="rId117">
         <w:r>
           <w:rPr>
             <w:rStyle w:val="Hyperlink"/>
@@ -11732,8 +12131,57 @@
         <w:t xml:space="preserve">.</w:t>
       </w:r>
     </w:p>
-    <w:bookmarkEnd w:id="112"/>
-    <w:bookmarkStart w:id="114" w:name="ref-sucar2021imap"/>
+    <w:bookmarkEnd w:id="118"/>
+    <w:bookmarkStart w:id="120" w:name="ref-schonberger2016sfm"/>
+    <w:p>
+      <w:pPr>
+        <w:pStyle w:val="Bibliography"/>
+      </w:pPr>
+      <w:r>
+        <w:t xml:space="preserve">Sch"onberger, Johannes L., and Jan-Michael Frahm. 2016.</w:t>
+      </w:r>
+      <w:r>
+        <w:t xml:space="preserve"> </w:t>
+      </w:r>
+      <w:r>
+        <w:t xml:space="preserve">“Structure-from-Motion Revisited.”</w:t>
+      </w:r>
+      <w:r>
+        <w:t xml:space="preserve"> </w:t>
+      </w:r>
+      <w:r>
+        <w:t xml:space="preserve">In</w:t>
+      </w:r>
+      <w:r>
+        <w:t xml:space="preserve"> </w:t>
+      </w:r>
+      <w:r>
+        <w:rPr>
+          <w:iCs/>
+          <w:i/>
+        </w:rPr>
+        <w:t xml:space="preserve">Proceedings of the IEEE Conference on Computer Vision and Pattern Recognition</w:t>
+      </w:r>
+      <w:r>
+        <w:t xml:space="preserve">, 4104–13.</w:t>
+      </w:r>
+      <w:r>
+        <w:t xml:space="preserve"> </w:t>
+      </w:r>
+      <w:hyperlink r:id="rId119">
+        <w:r>
+          <w:rPr>
+            <w:rStyle w:val="Hyperlink"/>
+          </w:rPr>
+          <w:t xml:space="preserve">https://doi.org/10.1109/CVPR.2016.445</w:t>
+        </w:r>
+      </w:hyperlink>
+      <w:r>
+        <w:t xml:space="preserve">.</w:t>
+      </w:r>
+    </w:p>
+    <w:bookmarkEnd w:id="120"/>
+    <w:bookmarkStart w:id="122" w:name="ref-sucar2021imap"/>
     <w:p>
       <w:pPr>
         <w:pStyle w:val="Bibliography"/>
@@ -11769,7 +12217,7 @@
       <w:r>
         <w:t xml:space="preserve"> </w:t>
       </w:r>
-      <w:hyperlink r:id="rId113">
+      <w:hyperlink r:id="rId121">
         <w:r>
           <w:rPr>
             <w:rStyle w:val="Hyperlink"/>
@@ -11781,8 +12229,8 @@
         <w:t xml:space="preserve">.</w:t>
       </w:r>
     </w:p>
-    <w:bookmarkEnd w:id="114"/>
-    <w:bookmarkStart w:id="115" w:name="ref-whelan2015elasticfusion"/>
+    <w:bookmarkEnd w:id="122"/>
+    <w:bookmarkStart w:id="123" w:name="ref-whelan2015elasticfusion"/>
     <w:p>
       <w:pPr>
         <w:pStyle w:val="Bibliography"/>
@@ -11816,8 +12264,8 @@
         <w:t xml:space="preserve">.</w:t>
       </w:r>
     </w:p>
-    <w:bookmarkEnd w:id="115"/>
-    <w:bookmarkStart w:id="117" w:name="ref-woerister2013lazy"/>
+    <w:bookmarkEnd w:id="123"/>
+    <w:bookmarkStart w:id="125" w:name="ref-woerister2013lazy"/>
     <w:p>
       <w:pPr>
         <w:pStyle w:val="Bibliography"/>
@@ -11853,7 +12301,7 @@
       <w:r>
         <w:t xml:space="preserve"> </w:t>
       </w:r>
-      <w:hyperlink r:id="rId116">
+      <w:hyperlink r:id="rId124">
         <w:r>
           <w:rPr>
             <w:rStyle w:val="Hyperlink"/>
@@ -11865,8 +12313,8 @@
         <w:t xml:space="preserve">.</w:t>
       </w:r>
     </w:p>
-    <w:bookmarkEnd w:id="117"/>
-    <w:bookmarkStart w:id="119" w:name="ref-wu2024fourDGS"/>
+    <w:bookmarkEnd w:id="125"/>
+    <w:bookmarkStart w:id="127" w:name="ref-wu2024fourDGS"/>
     <w:p>
       <w:pPr>
         <w:pStyle w:val="Bibliography"/>
@@ -11902,7 +12350,7 @@
       <w:r>
         <w:t xml:space="preserve"> </w:t>
       </w:r>
-      <w:hyperlink r:id="rId118">
+      <w:hyperlink r:id="rId126">
         <w:r>
           <w:rPr>
             <w:rStyle w:val="Hyperlink"/>
@@ -11914,8 +12362,8 @@
         <w:t xml:space="preserve">.</w:t>
       </w:r>
     </w:p>
-    <w:bookmarkEnd w:id="119"/>
-    <w:bookmarkStart w:id="120" w:name="ref-wu2026cif"/>
+    <w:bookmarkEnd w:id="127"/>
+    <w:bookmarkStart w:id="128" w:name="ref-wu2026cif"/>
     <w:p>
       <w:pPr>
         <w:pStyle w:val="Bibliography"/>
@@ -11949,8 +12397,8 @@
         <w:t xml:space="preserve">, 3783–93.</w:t>
       </w:r>
     </w:p>
-    <w:bookmarkEnd w:id="120"/>
-    <w:bookmarkStart w:id="121" w:name="ref-yugay2026game"/>
+    <w:bookmarkEnd w:id="128"/>
+    <w:bookmarkStart w:id="129" w:name="ref-yugay2026game"/>
     <w:p>
       <w:pPr>
         <w:pStyle w:val="Bibliography"/>
@@ -11984,8 +12432,8 @@
         <w:t xml:space="preserve">, 18903–12.</w:t>
       </w:r>
     </w:p>
-    <w:bookmarkEnd w:id="121"/>
-    <w:bookmarkStart w:id="123" w:name="ref-zeng2025gaussianupdate"/>
+    <w:bookmarkEnd w:id="129"/>
+    <w:bookmarkStart w:id="131" w:name="ref-zeng2025gaussianupdate"/>
     <w:p>
       <w:pPr>
         <w:pStyle w:val="Bibliography"/>
@@ -12021,7 +12469,7 @@
       <w:r>
         <w:t xml:space="preserve"> </w:t>
       </w:r>
-      <w:hyperlink r:id="rId122">
+      <w:hyperlink r:id="rId130">
         <w:r>
           <w:rPr>
             <w:rStyle w:val="Hyperlink"/>
@@ -12033,8 +12481,8 @@
         <w:t xml:space="preserve">.</w:t>
       </w:r>
     </w:p>
-    <w:bookmarkEnd w:id="123"/>
-    <w:bookmarkStart w:id="124" w:name="ref-zhu2022niceslam"/>
+    <w:bookmarkEnd w:id="131"/>
+    <w:bookmarkStart w:id="132" w:name="ref-zhu2022niceslam"/>
     <w:p>
       <w:pPr>
         <w:pStyle w:val="Bibliography"/>
@@ -12068,10 +12516,10 @@
         <w:t xml:space="preserve">, 12786–96.</w:t>
       </w:r>
     </w:p>
-    <w:bookmarkEnd w:id="124"/>
-    <w:bookmarkEnd w:id="125"/>
-    <w:bookmarkEnd w:id="126"/>
-    <w:bookmarkEnd w:id="127"/>
+    <w:bookmarkEnd w:id="132"/>
+    <w:bookmarkEnd w:id="133"/>
+    <w:bookmarkEnd w:id="134"/>
+    <w:bookmarkEnd w:id="135"/>
     <w:sectPr>
       <w:pgSz w:w="12240" w:h="15840"/>
       <w:pgMar w:top="1008" w:bottom="1008" w:left="1008" w:right="1008"/>

</xml_diff>

<commit_message>
paper: publish final MAVEB manuscript artifacts
Publish the validated final PDF, DOCX, supplement, manuscript package, checksum manifest, and protected-branch-safe manuscript CI behavior.
</commit_message>
<xml_diff>
--- a/researchpaper/MAVEB_manuscript.docx
+++ b/researchpaper/MAVEB_manuscript.docx
@@ -136,7 +136,7 @@
         <w:t xml:space="preserve">Full</w:t>
       </w:r>
       <w:r>
-        <w:t xml:space="preserve">. The selected result is replayed against an independent full-after reference, so we check measured error</w:t>
+        <w:t xml:space="preserve">. The residual left outside the selected repair support is checked against an independently rendered full-after reference, so we test measured residual</w:t>
       </w:r>
       <w:r>
         <w:t xml:space="preserve"> </w:t>
@@ -178,7 +178,7 @@
         <w:pStyle w:val="BodyText"/>
       </w:pPr>
       <w:r>
-        <w:t xml:space="preserve">On the frozen public campaign of 60 revisions over four RGB/SfM scenes, CBRC chose 44 certified-local repairs and 16 full rebuilds. We observed no certificate violation, and the native and reference planners agreed in every case. Fifty-six source edits were already above the protected RGB tolerance before repair. The calibrated work model gives a median selected ratio of 0.36953 of</w:t>
+        <w:t xml:space="preserve">On the frozen public campaign of 60 revisions over four RGB/SfM scenes, CBRC chose 44 certified-local repairs and 16 full rebuilds. We observed no certificate violation, and the native and reference output-cone planners agreed in every case. Fifty-six source edits were already above the protected RGB tolerance before repair. The calibrated work model gives a median selected ratio of 0.36953 of</w:t>
       </w:r>
       <w:r>
         <w:t xml:space="preserve"> </w:t>
@@ -204,7 +204,7 @@
         <w:t xml:space="preserve"> </w:t>
       </w:r>
       <w:r>
-        <w:t xml:space="preserve">lower calibrated work. A separate five-case check on a pinned trained 3DGS representation produced four local repairs, one fallback, and no observed violation. The frozen end-to-end path still inspects almost the full Gaussian set, although exact sparse discovery reduces median inspection to 1% in isolation. These results support selective recomputation under the stated assumptions; they do not establish universal safety, global optimality, or wall-clock speedup.</w:t>
+        <w:t xml:space="preserve">lower calibrated four-domain work. A separate five-case check on a pinned trained 3DGS representation produced four local repairs, one fallback, and no observed violation. The frozen end-to-end path still inspects almost the full Gaussian set, although exact sparse discovery reduces median inspection to 1% in isolation. These results support selective recomputation under the stated assumptions; they do not establish universal safety, global optimality, or wall-clock speedup.</w:t>
       </w:r>
     </w:p>
     <w:bookmarkEnd w:id="20"/>
@@ -430,7 +430,7 @@
         <w:pStyle w:val="BodyText"/>
       </w:pPr>
       <w:r>
-        <w:t xml:space="preserve">MAVEB implements this design as a C++23 persistent-world stack, alongside a dense Python reference certifier and an independent full-after Gaussian oracle. Figure 1 summarizes the decision path, while Figure 2 shows the support-selection idea visually. The implementation records immutable before/after revision sidecars, deterministic certificate JSON, per-domain work, and oracle replay. We do not treat the planner’s own prediction as evidence that a repair is safe. Instead, the chosen result is replayed independently against</w:t>
+        <w:t xml:space="preserve">MAVEB implements this design as a C++23 persistent-world stack, alongside a dense Python reference certifier and an independent full-after Gaussian oracle. Figure 1 summarizes the decision path, while Figure 2 shows the support-selection idea visually. The implementation records immutable before/after revision sidecars, deterministic certificate JSON, per-domain work, and oracle replay. We do not treat the planner’s own prediction as evidence that a repair is safe. Instead, the unrepaired exterior implied by the chosen support is compared with an independently rendered</w:t>
       </w:r>
       <w:r>
         <w:t xml:space="preserve"> </w:t>
@@ -442,10 +442,7 @@
         <w:t xml:space="preserve">Full</w:t>
       </w:r>
       <w:r>
-        <w:t xml:space="preserve"> </w:t>
-      </w:r>
-      <w:r>
-        <w:t xml:space="preserve">and checked under the contract</w:t>
+        <w:t xml:space="preserve">-after reference and checked under the contract</w:t>
       </w:r>
     </w:p>
     <w:tbl>
@@ -694,7 +691,7 @@
         <w:t xml:space="preserve"> </w:t>
       </w:r>
       <w:r>
-        <w:t xml:space="preserve">is the measured discrepancy from an independent full-after reference,</w:t>
+        <w:t xml:space="preserve">is the measured residual attributable to the unrepaired exterior under the selected support, evaluated against an independent full-after rendering;</w:t>
       </w:r>
       <w:r>
         <w:t xml:space="preserve"> </w:t>
@@ -772,7 +769,7 @@
         <w:pStyle w:val="BodyText"/>
       </w:pPr>
       <w:r>
-        <w:t xml:space="preserve">We froze the protocol and claim boundaries before interpreting the final campaign. Among 60 public RGB/SfM revisions, CBRC makes 44 certified-local selections and 16 full rebuilds, with no observed certificate violation and complete native/Python planner agreement. Fifty-six source edits were above RGB tolerance before repair. The frozen calibration gives a median work ratio of 0.36953 of</w:t>
+        <w:t xml:space="preserve">We froze the protocol and claim boundaries before interpreting the final campaign. Among 60 public RGB/SfM revisions, CBRC makes 44 certified-local selections and 16 full rebuilds, with no observed certificate violation and complete native/Python output-cone planner agreement. Fifty-six source edits were above RGB tolerance before repair. The frozen calibration gives a median work ratio of 0.36953 of</w:t>
       </w:r>
       <w:r>
         <w:t xml:space="preserve"> </w:t>
@@ -883,7 +880,7 @@
               <a:graphicData uri="http://schemas.openxmlformats.org/drawingml/2006/picture">
                 <pic:pic>
                   <pic:nvPicPr>
-                    <pic:cNvPr descr="/home/runner/work/_temp/maveb-final-build/system_flow_export.png" id="23" name="Picture"/>
+                    <pic:cNvPr descr="/home/runner/work/_temp/maveb-final-artifact-build/system_flow_export.png" id="23" name="Picture"/>
                     <pic:cNvPicPr>
                       <a:picLocks noChangeArrowheads="1" noChangeAspect="1"/>
                     </pic:cNvPicPr>
@@ -967,7 +964,7 @@
         <w:t xml:space="preserve">Full</w:t>
       </w:r>
       <w:r>
-        <w:t xml:space="preserve">. The selected result is then replayed against an independent full-after oracle.</w:t>
+        <w:t xml:space="preserve">. The residual outside the selected repair support is then falsified against an independently rendered full-after reference.</w:t>
       </w:r>
     </w:p>
     <w:p>
@@ -2097,7 +2094,19 @@
         <w:t xml:space="preserve"> </w:t>
       </w:r>
       <w:r>
-        <w:t xml:space="preserve">bounds. If we do not have a conservative argument for a relation, we do not soften it simply because doing so would produce a smaller cone.</w:t>
+        <w:t xml:space="preserve">bounds. An</w:t>
+      </w:r>
+      <w:r>
+        <w:t xml:space="preserve"> </w:t>
+      </w:r>
+      <w:r>
+        <w:rPr>
+          <w:smallCaps/>
+        </w:rPr>
+        <w:t xml:space="preserve">Empirical</w:t>
+      </w:r>
+      <w:r>
+        <w:t xml:space="preserve">-only dependency without a conservative analytic bound is promoted to exact predecessor closure for certification; its measured gain may still be used for scheduling, but never as a soft safety bound. If we do not have a conservative argument for a relation, we do not soften it simply because doing so would produce a smaller cone.</w:t>
       </w:r>
     </w:p>
     <w:bookmarkEnd w:id="36"/>
@@ -6622,7 +6631,7 @@
         <w:pStyle w:val="FirstParagraph"/>
       </w:pPr>
       <w:r>
-        <w:t xml:space="preserve">Each candidate is closed over its exact predecessors before it is certified again. The search ends when it finds a cone that is both certificate-feasible and cheaper than</w:t>
+        <w:t xml:space="preserve">Each candidate is closed over its exact predecessors before it is certified again. The search continues until it finds a cone that is both certificate-feasible and cheaper than</w:t>
       </w:r>
       <w:r>
         <w:t xml:space="preserve"> </w:t>
@@ -6634,7 +6643,7 @@
         <w:t xml:space="preserve">Full</w:t>
       </w:r>
       <w:r>
-        <w:t xml:space="preserve">, or when there is no useful local candidate left to try. This procedure gives us a certified feasible cone. We do not claim that it is the globally cheapest safe cone.</w:t>
+        <w:t xml:space="preserve">; if no such cone is reached, the planner returns the full fallback. This procedure gives us a certified feasible cone. We do not claim that it is the globally cheapest safe cone.</w:t>
       </w:r>
     </w:p>
     <w:bookmarkEnd w:id="48"/>
@@ -6662,7 +6671,7 @@
         <w:pStyle w:val="FirstParagraph"/>
       </w:pPr>
       <w:r>
-        <w:t xml:space="preserve">MAVEB keeps the scientific reference path separate from the production-oriented execution path. The dense Python certifier follows the mathematical contract directly and serves as a falsification and regression reference. The native C++23 implementation uses a sparse typed revision graph, sparse analytic propagation over supported DAG exteriors, exact predecessor checks, greedy feasible-cone search, and deterministic certificate serialization. The campaign compares the native planner’s final decisions against the reference planner rather than assuming the two implementations are equivalent.</w:t>
+        <w:t xml:space="preserve">MAVEB keeps the scientific reference path separate from the production-oriented execution path. The dense Python certifier follows the mathematical contract directly and serves as a falsification and regression reference. The native C++23 implementation uses a sparse typed revision graph, sparse analytic propagation over supported DAG exteriors, exact predecessor checks, greedy feasible-cone search, and deterministic certificate serialization. For the frozen campaign, the bound production output-cone graph is evaluated by both the native planner and the Python reference planner; their final decisions are compared rather than assumed equivalent.</w:t>
       </w:r>
     </w:p>
     <w:bookmarkStart w:id="50" w:name="revision-transactions."/>
@@ -6712,7 +6721,7 @@
         <w:t xml:space="preserve"> </w:t>
       </w:r>
       <w:r>
-        <w:t xml:space="preserve">is the counter source of truth across observation, TSDF, mesh, texture-page, material, Gaussian, GPU-publication, and temporal domains. Ledger/mesher disagreement is an error. Native counts stay in their own units until the frozen, versioned calibration converts them for the public work model. This prevents a local-looking metric in one subsystem from hiding a full-world stage elsewhere.</w:t>
+        <w:t xml:space="preserve">tracks observation, TSDF, mesh, texture-page, material, Gaussian, GPU-publication, and temporal work; ledger/mesher disagreement is an error. Counts retain their native units until a versioned calibration is applied. The frozen public campaign calibrates only four measured domains: Gaussian inspection, Gaussian update, GPU publication bytes, and temporal invalidation pixels.</w:t>
       </w:r>
     </w:p>
     <w:bookmarkEnd w:id="51"/>
@@ -6730,7 +6739,7 @@
         <w:pStyle w:val="FirstParagraph"/>
       </w:pPr>
       <w:r>
-        <w:t xml:space="preserve">The Gaussian oracle is deliberately independent of the planner that selected the revision. It evaluates the equivalent full-after state and reports per-pixel measured error next to the emitted bound. The strict evaluator then enforces Eq. 1. If the production and offline certificates disagree, or if measured error exceeds the emitted certificate, we count that as a correctness failure. Evidence bundles are hashed, and the canonical campaign records workflow IDs, artifact hashes, source hashes, and native/reference planner parity.</w:t>
+        <w:t xml:space="preserve">The Gaussian oracle is independent of the planner. It renders before and full-after states, then forms a support replay from full-after values on the selected support and before-state values outside it. The per-pixel exterior residual is checked against Eq. 1; certificate disagreement or a residual above the emitted bound is a correctness failure. Evidence bundles record hashes, workflow IDs, and native/reference output-cone parity.</w:t>
       </w:r>
     </w:p>
     <w:bookmarkEnd w:id="52"/>
@@ -6748,7 +6757,16 @@
         <w:pStyle w:val="FirstParagraph"/>
       </w:pPr>
       <w:r>
-        <w:t xml:space="preserve">The public campaign uses four real scenes reconstructed with COLMAP/SfM, from which we seed isotropic Gaussians at the reconstructed points. We do not describe these fields as trained photorealistic 3DGS, and the public coordinates are normalized rather than metric-scale. A second validation path uses a pinned external trained GraphDECO-style PLY and preserves its spherical-harmonic coefficients, opacity, anisotropic scale, and rotation. Ownership in this path is deterministic and spatial; it should not be read as semantic segmentation.</w:t>
+        <w:t xml:space="preserve">The public campaign uses four real scenes reconstructed with COLMAP/SfM</w:t>
+      </w:r>
+      <w:r>
+        <w:t xml:space="preserve"> </w:t>
+      </w:r>
+      <w:r>
+        <w:t xml:space="preserve">(Sch"onberger and Frahm 2016)</w:t>
+      </w:r>
+      <w:r>
+        <w:t xml:space="preserve">, from which we seed isotropic Gaussians at the reconstructed points. We do not describe these fields as trained photorealistic 3DGS, and the public coordinates are normalized rather than metric-scale. A second validation path uses a pinned external trained GraphDECO-style PLY and preserves its spherical-harmonic coefficients, opacity, anisotropic scale, and rotation. Ownership in this path is deterministic and spatial; it should not be read as semantic segmentation.</w:t>
       </w:r>
     </w:p>
     <w:bookmarkEnd w:id="53"/>
@@ -6794,7 +6812,7 @@
         <w:pStyle w:val="FirstParagraph"/>
       </w:pPr>
       <w:r>
-        <w:t xml:space="preserve">We structure the evaluation around seven questions. RQ1 asks whether the emitted certificate survives an independent full replay. RQ2 asks when the method chooses</w:t>
+        <w:t xml:space="preserve">We structure the evaluation around eight questions. RQ1 asks whether the emitted certificate survives independent full-reference falsification of the unrepaired exterior. RQ2 asks when the method chooses</w:t>
       </w:r>
       <w:r>
         <w:t xml:space="preserve"> </w:t>
@@ -6833,7 +6851,19 @@
         <w:t xml:space="preserve">Full</w:t>
       </w:r>
       <w:r>
-        <w:t xml:space="preserve">, and RQ4 looks at which native work domains actually remain local. RQ5 compares exact, radius, changed-fraction, and empirical policies under the same campaign. RQ6 checks whether the safety contract carries over to a trained 3DGS representation. Finally, RQ7 asks whether exact sparse discovery can remove the full-scan Gaussian bottleneck seen in the frozen path.</w:t>
+        <w:t xml:space="preserve">, and RQ4 looks at which native work domains actually remain local. RQ5 compares exact, radius, changed-fraction, and empirical policies under the same campaign. RQ6 checks whether the safety contract carries over to a trained 3DGS representation. RQ7 asks whether exact sparse discovery can remove the full-scan Gaussian bottleneck seen in the frozen path. RQ8 asks whether the final selected render remains visually identical to the independent</w:t>
+      </w:r>
+      <w:r>
+        <w:t xml:space="preserve"> </w:t>
+      </w:r>
+      <w:r>
+        <w:rPr>
+          <w:smallCaps/>
+        </w:rPr>
+        <w:t xml:space="preserve">Full</w:t>
+      </w:r>
+      <w:r>
+        <w:t xml:space="preserve">-after oracle on the evaluated benchmark views, while separately checking that the edit itself is visible before repair.</w:t>
       </w:r>
     </w:p>
     <w:p>
@@ -6841,7 +6871,40 @@
         <w:pStyle w:val="BodyText"/>
       </w:pPr>
       <w:r>
-        <w:t xml:space="preserve">The final public v2.1 campaign contains 60 frozen revisions over Tanks &amp; Temples Train/Truck and Deep Blending Dr Johnson/Playroom inputs from the pinned GraphDECO bundle. The repository manifest fixes the source archive size and SHA-256, and the work calibration is frozen before this campaign is run. We also keep an earlier execution in which a requested translation fell below the production effective-edit threshold. Rather than retuning or deleting that case, we preserve it as protocol history; v2.1 enforces the production precondition and records both requested and applied edit deltas.</w:t>
+        <w:t xml:space="preserve">The final public v2.1 campaign contains 60 frozen revisions over Tanks &amp; Temples Train/Truck</w:t>
+      </w:r>
+      <w:r>
+        <w:t xml:space="preserve"> </w:t>
+      </w:r>
+      <w:r>
+        <w:t xml:space="preserve">(Knapitsch et al. 2017)</w:t>
+      </w:r>
+      <w:r>
+        <w:t xml:space="preserve"> </w:t>
+      </w:r>
+      <w:r>
+        <w:t xml:space="preserve">and Deep Blending Dr Johnson/Playroom</w:t>
+      </w:r>
+      <w:r>
+        <w:t xml:space="preserve"> </w:t>
+      </w:r>
+      <w:r>
+        <w:t xml:space="preserve">(Hedman et al. 2018)</w:t>
+      </w:r>
+      <w:r>
+        <w:t xml:space="preserve"> </w:t>
+      </w:r>
+      <w:r>
+        <w:t xml:space="preserve">inputs from the pinned GraphDECO bundle</w:t>
+      </w:r>
+      <w:r>
+        <w:t xml:space="preserve"> </w:t>
+      </w:r>
+      <w:r>
+        <w:t xml:space="preserve">(Kerbl et al. 2023)</w:t>
+      </w:r>
+      <w:r>
+        <w:t xml:space="preserve">. The repository manifest fixes the source archive size and SHA-256, and the work calibration is frozen before this campaign is run. We also keep an earlier execution in which a requested translation fell below the production effective-edit threshold. Rather than retuning or deleting that case, we preserve it as protocol history; v2.1 enforces the production precondition and records both requested and applied edit deltas.</w:t>
       </w:r>
     </w:p>
     <w:p>
@@ -6849,7 +6912,7 @@
         <w:pStyle w:val="BodyText"/>
       </w:pPr>
       <w:r>
-        <w:t xml:space="preserve">For each selected repair, the campaign stores the source edit, chosen cone, local/full decision, certificate, independent full-reference residual, native work, calibrated work, and provenance. Fallbacks stay in the dataset and in the summary statistics; they are part of the method’s behavior, not failed trials to be filtered out.</w:t>
+        <w:t xml:space="preserve">For each selected repair, the campaign stores the source edit, chosen cone, local/full decision, certificate, support-replay full-reference residual, native work, calibrated work, and provenance. Fallbacks stay in the dataset and in the summary statistics; they are part of the method’s behavior, not failed trials to be filtered out.</w:t>
       </w:r>
     </w:p>
     <w:bookmarkStart w:id="55" w:name="runtime-scope."/>
@@ -6890,7 +6953,7 @@
         <w:t xml:space="preserve"> </w:t>
       </w:r>
       <w:r>
-        <w:t xml:space="preserve">wall-clock trials under identical execution conditions. We therefore make no speedup claim. The public headline is a frozen heterogeneous work ratio calibrated from millisecond measurements, whereas the baseline suite reports a different native work-ratio metric. We label the two separately because collapsing them into one number would overstate what was actually measured.</w:t>
+        <w:t xml:space="preserve">wall-clock trials under identical execution conditions. We therefore make no speedup claim. The public headline is a frozen four-domain work ratio calibrated from isolated millisecond measurements, whereas the baseline suite reports a different native output-cone work-ratio metric. We label the two separately because collapsing them into one number would overstate what was actually measured.</w:t>
       </w:r>
     </w:p>
     <w:bookmarkEnd w:id="55"/>
@@ -6930,7 +6993,7 @@
         <w:t xml:space="preserve">Full</w:t>
       </w:r>
       <w:r>
-        <w:t xml:space="preserve">, exact-only repair, fixed-radius policies, a changed-fraction policy, a held-out empirical scheduler, and CBRC. Empirical information may change the order in which candidates are explored, but it is not allowed into the certificate. Structural and analytic ablations remove or replace individual components. Separately, a deterministic mechanism-isolation suite creates stress cases for exact closure, analytic Gaussian influence, temporal influence, quantity-of-interest specialization, hard/soft separation, graph propagation, and fallback behavior.</w:t>
+        <w:t xml:space="preserve">, exact-only repair, fixed-radius policies, a changed-fraction policy, a held-out empirical scheduler, and CBRC. Empirical magnitudes may change the order in which candidates are explored, but they are never used as soft certificate evidence; an empirical-only dependency without an analytic bound fails closed through exact predecessor closure. Structural and analytic ablations remove or replace individual components. Separately, a deterministic mechanism-isolation suite creates stress cases for exact closure, analytic Gaussian influence, temporal influence, quantity-of-interest specialization, hard/soft separation, graph propagation, and fallback behavior.</w:t>
       </w:r>
     </w:p>
     <w:p>
@@ -6965,7 +7028,46 @@
         <w:pStyle w:val="FirstParagraph"/>
       </w:pPr>
       <w:r>
-        <w:t xml:space="preserve">Our primary correctness metric is the number of violations of Eq. 1. We also report local/fallback counts, native/reference planner agreement, the source-edit effect before repair, the median selected calibrated work ratio, and native-domain ratios. Effectivity,</w:t>
+        <w:t xml:space="preserve">Our primary correctness metric is the number of violations of Eq. 1. We also report local/fallback counts, native/reference output-cone planner agreement, the source-edit effect before repair, the median selected calibrated work ratio, and native-domain ratios. To make visual quality explicit, a separate rendered-fidelity audit compares the final selected RGB raster with the independently rendered</w:t>
+      </w:r>
+      <w:r>
+        <w:t xml:space="preserve"> </w:t>
+      </w:r>
+      <w:r>
+        <w:rPr>
+          <w:smallCaps/>
+        </w:rPr>
+        <w:t xml:space="preserve">Full</w:t>
+      </w:r>
+      <w:r>
+        <w:t xml:space="preserve">-after raster at the same camera and reports byte-domain MAE, RMSE, maximum absolute channel difference, exact-pixel fraction, and PSNR. For</w:t>
+      </w:r>
+      <w:r>
+        <w:t xml:space="preserve"> </w:t>
+      </w:r>
+      <w:r>
+        <w:rPr>
+          <w:smallCaps/>
+        </w:rPr>
+        <w:t xml:space="preserve">Full</w:t>
+      </w:r>
+      <w:r>
+        <w:t xml:space="preserve"> </w:t>
+      </w:r>
+      <w:r>
+        <w:t xml:space="preserve">fallback cases, the final selected output is the full rebuild; the rejected local candidate is retained separately rather than being scored as the final output. We also compare the before-edit raster with</w:t>
+      </w:r>
+      <w:r>
+        <w:t xml:space="preserve"> </w:t>
+      </w:r>
+      <w:r>
+        <w:rPr>
+          <w:smallCaps/>
+        </w:rPr>
+        <w:t xml:space="preserve">Full</w:t>
+      </w:r>
+      <w:r>
+        <w:t xml:space="preserve">-after to confirm that a zero selected residual is not caused by an invisible edit. These are repair-fidelity metrics relative to the evaluated representation, not reconstruction-quality metrics against the original camera photographs. Effectivity,</w:t>
       </w:r>
       <w:r>
         <w:t xml:space="preserve"> </w:t>
@@ -7123,7 +7225,7 @@
         <w:t xml:space="preserve"> </w:t>
       </w:r>
       <w:r>
-        <w:t xml:space="preserve">16 times. Figure 3 shows examples of both outcomes, and Table 3 collects the aggregate numbers. We observed no certificate violation, and the native and reference planners agreed on every decision. At the reported</w:t>
+        <w:t xml:space="preserve">16 times. Figure 3 shows examples of both outcomes, and Table 3 collects the aggregate numbers. We observed no certificate violation, and the native and reference output-cone planners agreed on every decision. At the reported</w:t>
       </w:r>
       <w:r>
         <w:t xml:space="preserve"> </w:t>
@@ -7149,7 +7251,7 @@
         <w:t xml:space="preserve"> </w:t>
       </w:r>
       <w:r>
-        <w:t xml:space="preserve">precision, the largest measured RGB residual after the selected repair was 0; the largest emitted bound among selected cases was</w:t>
+        <w:t xml:space="preserve">precision, the largest support-replay residual outside the selected repair support was 0; the largest emitted bound among selected cases was</w:t>
       </w:r>
       <w:r>
         <w:t xml:space="preserve"> </w:t>
@@ -7192,7 +7294,85 @@
         <w:pStyle w:val="BodyText"/>
       </w:pPr>
       <w:r>
-        <w:t xml:space="preserve">A zero selected residual would be less informative if the edits were visually negligible to begin with, so we checked that separately. Before repair, 56 of the 60 source edits were already above the protected RGB tolerance. This rules out the simplest explanation that almost all edits were below the quantity-of-interest threshold anyway.</w:t>
+        <w:t xml:space="preserve">A zero support-replay residual would be less informative if the edits were visually negligible to begin with, so we checked that separately. Before repair, 56 of the 60 source edits were already above the protected RGB tolerance. In the independent raster audit, the final selected output is byte-identical to the</w:t>
+      </w:r>
+      <w:r>
+        <w:t xml:space="preserve"> </w:t>
+      </w:r>
+      <w:r>
+        <w:rPr>
+          <w:smallCaps/>
+        </w:rPr>
+        <w:t xml:space="preserve">Full</w:t>
+      </w:r>
+      <w:r>
+        <w:t xml:space="preserve">-after reference in all 60 cases; more importantly, all 44 cases that actually select</w:t>
+      </w:r>
+      <w:r>
+        <w:t xml:space="preserve"> </w:t>
+      </w:r>
+      <w:r>
+        <w:rPr>
+          <w:smallCaps/>
+        </w:rPr>
+        <w:t xml:space="preserve">Local</w:t>
+      </w:r>
+      <w:r>
+        <w:t xml:space="preserve"> </w:t>
+      </w:r>
+      <w:r>
+        <w:t xml:space="preserve">are also byte-identical to their</w:t>
+      </w:r>
+      <w:r>
+        <w:t xml:space="preserve"> </w:t>
+      </w:r>
+      <w:r>
+        <w:rPr>
+          <w:smallCaps/>
+        </w:rPr>
+        <w:t xml:space="preserve">Full</w:t>
+      </w:r>
+      <w:r>
+        <w:t xml:space="preserve">-after reference at 8-bit RGB precision. The before-to-</w:t>
+      </w:r>
+      <w:r>
+        <w:rPr>
+          <w:smallCaps/>
+        </w:rPr>
+        <w:t xml:space="preserve">Full</w:t>
+      </w:r>
+      <w:r>
+        <w:t xml:space="preserve"> </w:t>
+      </w:r>
+      <w:r>
+        <w:t xml:space="preserve">edit changes a median 1.74% of pixels across all 60 frozen views (range 0–7.88%), with at least one changed pixel in 57/60 views. Dataset medians are 1.89% for Deep Blending and 1.71% for Tanks &amp; Temples. The 16 fallback cases are not used to make a local-fidelity claim because their selected output is</w:t>
+      </w:r>
+      <w:r>
+        <w:t xml:space="preserve"> </w:t>
+      </w:r>
+      <w:r>
+        <w:rPr>
+          <w:smallCaps/>
+        </w:rPr>
+        <w:t xml:space="preserve">Full</w:t>
+      </w:r>
+      <w:r>
+        <w:t xml:space="preserve"> </w:t>
+      </w:r>
+      <w:r>
+        <w:t xml:space="preserve">by construction. Figure 3 reports the actual benchmark-view sequence—before, intended edit, certified support, final selected repair, independent</w:t>
+      </w:r>
+      <w:r>
+        <w:t xml:space="preserve"> </w:t>
+      </w:r>
+      <w:r>
+        <w:rPr>
+          <w:smallCaps/>
+        </w:rPr>
+        <w:t xml:space="preserve">Full</w:t>
+      </w:r>
+      <w:r>
+        <w:t xml:space="preserve">-after reference, and residual—rather than a schematic beauty render.</w:t>
       </w:r>
     </w:p>
     <w:p>
@@ -7200,7 +7380,7 @@
         <w:pStyle w:val="BodyText"/>
       </w:pPr>
       <w:r>
-        <w:t xml:space="preserve">The frozen isolated millisecond cost model reports a median selected heterogeneous work ratio</w:t>
+        <w:t xml:space="preserve">The frozen isolated millisecond cost model reports a median selected four-domain work ratio</w:t>
       </w:r>
     </w:p>
     <w:tbl>
@@ -7439,7 +7619,7 @@
         <w:t xml:space="preserve"> </w:t>
       </w:r>
       <w:r>
-        <w:t xml:space="preserve">should not be confused with an independent measured-error metric. The exact-only, radius, and changed-fraction policies often select very little work, but most of those selections do not pass the certificate. The empirical-order baseline uses empirical influence only to decide expansion order; the final candidate is still certified analytically. We discuss the held-out changed-fraction heuristic separately below.</w:t>
+        <w:t xml:space="preserve">should not be confused with an independent measured-error metric. The exact-only, radius, and changed-fraction policies often select very little work, but most of those selections do not pass the certificate. The empirical-order baseline uses empirical magnitudes only to decide expansion order; the final candidate is still certified with analytic bounds plus exact closure for unsupported dependencies. We discuss the held-out changed-fraction heuristic separately below.</w:t>
       </w:r>
     </w:p>
     <w:bookmarkStart w:id="61" w:name="tab:baselines"/>
@@ -7452,7 +7632,7 @@
         <w:t xml:space="preserve">Table 2. </w:t>
       </w:r>
       <w:r>
-        <w:t xml:space="preserve">Frozen public method comparison. The work column is the baseline suite’s native work-ratio metric and is distinct from the calibrated heterogeneous headline ratio of 0.36953.</w:t>
+        <w:t xml:space="preserve">Frozen public method comparison. The work column is the baseline suite’s native work-ratio metric and is distinct from the calibrated four-domain headline ratio of 0.36953.</w:t>
       </w:r>
       <w:r>
         <w:t xml:space="preserve"> </w:t>
@@ -7477,7 +7657,7 @@
         <w:tblLayout w:type="fixed"/>
         <w:tblLook w:firstRow="1" w:lastRow="0" w:firstColumn="0" w:lastColumn="0" w:noHBand="0" w:noVBand="0" w:val="0020"/>
         <w:jc w:val="start"/>
-        <w:tblCaption w:val="Frozen public method comparison. The work column is the baseline suite’s native work-ratio metric and is distinct from the calibrated heterogeneous headline ratio of 0.36953. Uncertified means the selected cone failed the conservative certificate, not that an independent oracle violation was observed. All four tested radius policies produced the same aggregate values on this matrix."/>
+        <w:tblCaption w:val="Frozen public method comparison. The work column is the baseline suite’s native work-ratio metric and is distinct from the calibrated four-domain headline ratio of 0.36953. Uncertified means the selected cone failed the conservative certificate, not that an independent oracle violation was observed. All four tested radius policies produced the same aggregate values on this matrix."/>
         <w:tblBorders>
           <w:top w:val="single" w:sz="4" w:color="B0B0B0"/>
           <w:bottom w:val="single" w:sz="4" w:color="B0B0B0"/>
@@ -8325,7 +8505,7 @@
       <w:r>
         <w:drawing>
           <wp:inline>
-            <wp:extent cx="5067300" cy="3040379"/>
+            <wp:extent cx="4907280" cy="2944368"/>
             <wp:effectExtent b="0" l="0" r="0" t="0"/>
             <wp:docPr descr="" title="" id="63" name="Picture"/>
             <a:graphic>
@@ -8346,7 +8526,7 @@
                   <pic:spPr bwMode="auto">
                     <a:xfrm>
                       <a:off x="0" y="0"/>
-                      <a:ext cx="5067300" cy="3040379"/>
+                      <a:ext cx="4907280" cy="2944368"/>
                     </a:xfrm>
                     <a:prstGeom prst="rect">
                       <a:avLst/>
@@ -8374,7 +8554,7 @@
         <w:t xml:space="preserve">Figure 3. </w:t>
       </w:r>
       <w:r>
-        <w:t xml:space="preserve">Representative frozen revision outcomes. Top: a certified local case repairs only the selected support and matches the independent</w:t>
+        <w:t xml:space="preserve">Representative frozen benchmark-view outcomes. Top: a certified local case repairs only the selected support and has zero measured support-replay residual against the independently rendered</w:t>
       </w:r>
       <w:r>
         <w:t xml:space="preserve"> </w:t>
@@ -8401,7 +8581,16 @@
         <w:t xml:space="preserve"> </w:t>
       </w:r>
       <w:r>
-        <w:t xml:space="preserve">fallback rather than forcing a local decision. The intended-edit and certified-support panels make the source effect and selected scope explicit; the residual panel is computed against the independent full-after oracle.</w:t>
+        <w:t xml:space="preserve">fallback rather than forcing a local decision. The before/edit/support/selected/</w:t>
+      </w:r>
+      <w:r>
+        <w:rPr>
+          <w:smallCaps/>
+        </w:rPr>
+        <w:t xml:space="preserve">Full</w:t>
+      </w:r>
+      <w:r>
+        <w:t xml:space="preserve">/residual sequence is generated from the frozen benchmark evidence rather than redrawn for presentation. The residual panel is computed against the independent full-after oracle.</w:t>
       </w:r>
     </w:p>
     <w:bookmarkStart w:id="65" w:name="tab:summary"/>
@@ -9012,6 +9201,68 @@
       </w:r>
       <w:r>
         <w:t xml:space="preserve">. In other words, the update itself can be sharply local while finding the candidates is still almost global. We regard that as the main systems limitation of the frozen end-to-end implementation.</w:t>
+      </w:r>
+    </w:p>
+    <w:p>
+      <w:pPr>
+        <w:pStyle w:val="BodyText"/>
+      </w:pPr>
+      <w:r>
+        <w:t xml:space="preserve">A direct raster audit provides a second check on the visual consequence of those decisions. All four trained-3DGS</w:t>
+      </w:r>
+      <w:r>
+        <w:t xml:space="preserve"> </w:t>
+      </w:r>
+      <w:r>
+        <w:rPr>
+          <w:smallCaps/>
+        </w:rPr>
+        <w:t xml:space="preserve">Local</w:t>
+      </w:r>
+      <w:r>
+        <w:t xml:space="preserve"> </w:t>
+      </w:r>
+      <w:r>
+        <w:t xml:space="preserve">selections match the independent</w:t>
+      </w:r>
+      <w:r>
+        <w:t xml:space="preserve"> </w:t>
+      </w:r>
+      <w:r>
+        <w:rPr>
+          <w:smallCaps/>
+        </w:rPr>
+        <w:t xml:space="preserve">Full</w:t>
+      </w:r>
+      <w:r>
+        <w:t xml:space="preserve">-after raster exactly at 8-bit RGB precision (maximum channel difference 0/255 and 100% exact pixels); the fifth case selects</w:t>
+      </w:r>
+      <w:r>
+        <w:t xml:space="preserve"> </w:t>
+      </w:r>
+      <w:r>
+        <w:rPr>
+          <w:smallCaps/>
+        </w:rPr>
+        <w:t xml:space="preserve">Full</w:t>
+      </w:r>
+      <w:r>
+        <w:t xml:space="preserve"> </w:t>
+      </w:r>
+      <w:r>
+        <w:t xml:space="preserve">by construction. The underlying edits are visible: the before-to-</w:t>
+      </w:r>
+      <w:r>
+        <w:rPr>
+          <w:smallCaps/>
+        </w:rPr>
+        <w:t xml:space="preserve">Full</w:t>
+      </w:r>
+      <w:r>
+        <w:t xml:space="preserve"> </w:t>
+      </w:r>
+      <w:r>
+        <w:t xml:space="preserve">comparison changes 1.60–2.66% of pixels across the five frozen views (median 2.23%), with maximum channel difference reaching 255/255. We report exact equality rather than an arbitrarily capped PSNR value; formally, PSNR is unbounded when the mean-squared error is zero.</w:t>
       </w:r>
     </w:p>
     <w:bookmarkStart w:id="67" w:name="tab:trained"/>
@@ -10567,12 +10818,12 @@
         <w:pStyle w:val="BodyText"/>
       </w:pPr>
       <w:r>
-        <w:t xml:space="preserve">At the reported precision, every selected public residual is numerically zero, even though 56 of the 60 source edits were above tolerance before repair. This lets the real matrix test selection and fallback behavior, but it does not tell us how tight the certificate is when a non-zero residual is still acceptable. The threshold-crossing mechanism-isolation cases are useful here only in a limited sense: they show that the analytic machinery can change a decision when it is stressed. We do not use them as a stand-in for real non-zero-residual evidence.</w:t>
+        <w:t xml:space="preserve">At the reported precision, every selected public support-replay residual is numerically zero, even though 56 of the 60 source edits were above tolerance before repair. This lets the real matrix test selection and fallback behavior, but it does not tell us how tight the certificate is when a non-zero residual is still acceptable. The threshold-crossing mechanism-isolation cases are useful here only in a limited sense: they show that the analytic machinery can change a decision when it is stressed. We do not use them as a stand-in for real non-zero-residual evidence.</w:t>
       </w:r>
     </w:p>
     <w:bookmarkEnd w:id="72"/>
     <w:bookmarkEnd w:id="73"/>
-    <w:bookmarkStart w:id="84" w:name="discussion"/>
+    <w:bookmarkStart w:id="85" w:name="discussion"/>
     <w:p>
       <w:pPr>
         <w:pStyle w:val="Heading1"/>
@@ -10613,7 +10864,7 @@
         <w:pStyle w:val="FirstParagraph"/>
       </w:pPr>
       <w:r>
-        <w:t xml:space="preserve">Within the frozen revision domain and under the stated bound assumptions, three conclusions are supported by the experiment. The emitted certificate survived independent full-reference replay in every evaluated case. The planner also did not force a local answer: more than a quarter of the public revisions crossed to</w:t>
+        <w:t xml:space="preserve">Within the frozen revision domain and under the stated bound assumptions, three conclusions are supported by the experiment. The emitted certificate survived independent full-reference falsification of the unrepaired exterior in every evaluated case. The planner also did not force a local answer: more than a quarter of the public revisions crossed to</w:t>
       </w:r>
       <w:r>
         <w:t xml:space="preserve"> </w:t>
@@ -10662,7 +10913,7 @@
         <w:t xml:space="preserve">prediction</w:t>
       </w:r>
       <w:r>
-        <w:t xml:space="preserve">. An empirical scheduler can guess every available case correctly and still have no defensible answer for the next unseen case. To become part of the safety argument, that prediction would need a conservative bound with a valid remainder. CBRC therefore lets empirical information influence scheduling, but not certification. The converse can also happen: an</w:t>
+        <w:t xml:space="preserve">. An empirical scheduler can guess every available case correctly and still have no defensible answer for the next unseen case. To become part of the safety argument, that prediction would need a conservative bound with a valid remainder. CBRC therefore lets empirical magnitudes influence scheduling, but does not use them as soft certificate bounds; unsupported empirical-only dependencies are instead closed exactly. The converse can also happen: an</w:t>
       </w:r>
       <w:r>
         <w:t xml:space="preserve"> </w:t>
@@ -10696,7 +10947,7 @@
       </w:r>
     </w:p>
     <w:bookmarkEnd w:id="74"/>
-    <w:bookmarkStart w:id="82" w:name="limitations"/>
+    <w:bookmarkStart w:id="83" w:name="limitations"/>
     <w:p>
       <w:pPr>
         <w:pStyle w:val="Heading2"/>
@@ -10808,7 +11059,7 @@
         <w:t xml:space="preserve"> </w:t>
       </w:r>
       <w:r>
-        <w:t xml:space="preserve">figure is a reduction in calibrated heterogeneous work. The trained 28.614</w:t>
+        <w:t xml:space="preserve">figure is a reduction in calibrated four-domain work. The trained 28.614</w:t>
       </w:r>
       <m:oMath>
         <m:r>
@@ -10826,13 +11077,13 @@
       </w:r>
     </w:p>
     <w:bookmarkEnd w:id="77"/>
-    <w:bookmarkStart w:id="78" w:name="greedy-search-is-not-globally-optimal."/>
+    <w:bookmarkStart w:id="78" w:name="X0699026322bda00e1076f32d8edd98c2c95bd11"/>
     <w:p>
       <w:pPr>
         <w:pStyle w:val="Heading4"/>
       </w:pPr>
       <w:r>
-        <w:t xml:space="preserve">Greedy search is not globally optimal.</w:t>
+        <w:t xml:space="preserve">Rendered fidelity is not reconstruction fidelity.</w:t>
       </w:r>
     </w:p>
     <w:p>
@@ -10840,25 +11091,7 @@
         <w:pStyle w:val="FirstParagraph"/>
       </w:pPr>
       <w:r>
-        <w:t xml:space="preserve">Equation 15 gives us a certified feasible cone, not a proof that the cone is the cheapest safe one. Finding the global minimum-work solution is a combinatorial optimization problem and is outside the v1 claim.</w:t>
-      </w:r>
-    </w:p>
-    <w:bookmarkEnd w:id="78"/>
-    <w:bookmarkStart w:id="79" w:name="analytic-cycles-fail-closed."/>
-    <w:p>
-      <w:pPr>
-        <w:pStyle w:val="Heading4"/>
-      </w:pPr>
-      <w:r>
-        <w:t xml:space="preserve">Analytic cycles fail closed.</w:t>
-      </w:r>
-    </w:p>
-    <w:p>
-      <w:pPr>
-        <w:pStyle w:val="FirstParagraph"/>
-      </w:pPr>
-      <w:r>
-        <w:t xml:space="preserve">The reference formulation allows the classical resolvent when its assumptions are satisfied. The native v1 implementation is narrower and certifies finite analytic DAG exteriors. Unsupported cycles therefore cause the cone to expand or fall back to</w:t>
+        <w:t xml:space="preserve">The new visual-quality audit compares a selected repair against the independent</w:t>
       </w:r>
       <w:r>
         <w:t xml:space="preserve"> </w:t>
@@ -10870,11 +11103,71 @@
         <w:t xml:space="preserve">Full</w:t>
       </w:r>
       <w:r>
+        <w:t xml:space="preserve">-after render of the same evaluated representation and camera. Exact selected-to-</w:t>
+      </w:r>
+      <w:r>
+        <w:rPr>
+          <w:smallCaps/>
+        </w:rPr>
+        <w:t xml:space="preserve">Full</w:t>
+      </w:r>
+      <w:r>
+        <w:t xml:space="preserve"> </w:t>
+      </w:r>
+      <w:r>
+        <w:t xml:space="preserve">equality therefore supports the claim that the local repair preserves the full-update result on those views; it does not establish that the underlying reconstruction is photorealistic or matches held-out source photographs. This distinction is especially important for the public RGB/SfM campaign, whose Gaussian fields are seeded from COLMAP points rather than trained photorealistic 3DGS. The trained-3DGS check narrows that representation gap but remains a five-revision secondary validation.</w:t>
+      </w:r>
+    </w:p>
+    <w:bookmarkEnd w:id="78"/>
+    <w:bookmarkStart w:id="79" w:name="greedy-search-is-not-globally-optimal."/>
+    <w:p>
+      <w:pPr>
+        <w:pStyle w:val="Heading4"/>
+      </w:pPr>
+      <w:r>
+        <w:t xml:space="preserve">Greedy search is not globally optimal.</w:t>
+      </w:r>
+    </w:p>
+    <w:p>
+      <w:pPr>
+        <w:pStyle w:val="FirstParagraph"/>
+      </w:pPr>
+      <w:r>
+        <w:t xml:space="preserve">Equation 15 gives us a certified feasible cone, not a proof that the cone is the cheapest safe one. Finding the global minimum-work solution is a combinatorial optimization problem and is outside the v1 claim.</w:t>
+      </w:r>
+    </w:p>
+    <w:bookmarkEnd w:id="79"/>
+    <w:bookmarkStart w:id="80" w:name="analytic-cycles-fail-closed."/>
+    <w:p>
+      <w:pPr>
+        <w:pStyle w:val="Heading4"/>
+      </w:pPr>
+      <w:r>
+        <w:t xml:space="preserve">Analytic cycles fail closed.</w:t>
+      </w:r>
+    </w:p>
+    <w:p>
+      <w:pPr>
+        <w:pStyle w:val="FirstParagraph"/>
+      </w:pPr>
+      <w:r>
+        <w:t xml:space="preserve">The reference formulation allows the classical resolvent when its assumptions are satisfied. The native v1 implementation is narrower and certifies finite analytic DAG exteriors. Unsupported cycles therefore cause the cone to expand or fall back to</w:t>
+      </w:r>
+      <w:r>
+        <w:t xml:space="preserve"> </w:t>
+      </w:r>
+      <w:r>
+        <w:rPr>
+          <w:smallCaps/>
+        </w:rPr>
+        <w:t xml:space="preserve">Full</w:t>
+      </w:r>
+      <w:r>
         <w:t xml:space="preserve">. General cyclic certification remains future work.</w:t>
       </w:r>
     </w:p>
-    <w:bookmarkEnd w:id="79"/>
-    <w:bookmarkStart w:id="80" w:name="representation-and-dataset-scope."/>
+    <w:bookmarkEnd w:id="80"/>
+    <w:bookmarkStart w:id="81" w:name="representation-and-dataset-scope."/>
     <w:p>
       <w:pPr>
         <w:pStyle w:val="Heading4"/>
@@ -10888,11 +11181,11 @@
         <w:pStyle w:val="FirstParagraph"/>
       </w:pPr>
       <w:r>
-        <w:t xml:space="preserve">The primary public campaign is built from normalized RGB/SfM reconstructions seeded into Gaussian fields, not from trained photorealistic 3DGS, and it is not a metric-scale reconstruction benchmark. The trained-3DGS experiment helps, but it is only a five-revision representation check. A broader evaluation over trained scenes is the obvious next step if we want stronger evidence of generality.</w:t>
-      </w:r>
-    </w:p>
-    <w:bookmarkEnd w:id="80"/>
-    <w:bookmarkStart w:id="81" w:name="ablation-identifiability."/>
+        <w:t xml:space="preserve">The primary public campaign is built from normalized RGB/SfM reconstructions seeded into Gaussian fields, not from trained photorealistic 3DGS, and it is not a metric-scale reconstruction benchmark. Its frozen evidence exercises Gaussian inspection/update, GPU publication, and temporal output invalidation; the broader observation/TSDF/mesh/texture/material ledger and captured-world graph are implemented and regression-tested but are not measured by the 60-case headline campaign. The trained-3DGS experiment helps, but it is only a five-revision representation check over the same output-side scope. A broader full-stack evaluation over trained scenes and additional derived-state domains is needed for stronger evidence of generality.</w:t>
+      </w:r>
+    </w:p>
+    <w:bookmarkEnd w:id="81"/>
+    <w:bookmarkStart w:id="82" w:name="ablation-identifiability."/>
     <w:p>
       <w:pPr>
         <w:pStyle w:val="Heading4"/>
@@ -10909,9 +11202,9 @@
         <w:t xml:space="preserve">Not every mechanism separates on the frozen real matrix. Rather than forcing a cleaner story, we keep the real-workload results distinct from the synthetic mechanism-isolation results. The paper therefore does not claim that every mechanism produces a measurable benefit in every scene.</w:t>
       </w:r>
     </w:p>
-    <w:bookmarkEnd w:id="81"/>
     <w:bookmarkEnd w:id="82"/>
-    <w:bookmarkStart w:id="83" w:name="implications"/>
+    <w:bookmarkEnd w:id="83"/>
+    <w:bookmarkStart w:id="84" w:name="implications"/>
     <w:p>
       <w:pPr>
         <w:pStyle w:val="Heading2"/>
@@ -10945,9 +11238,9 @@
         <w:t xml:space="preserve">Failure is also more useful when it is kept intact. A certificate violation is not folded into an average quality score; we retain it as a regression target together with the revision manifest, graph version, chosen cone, emitted bound, full-reference output, and the first violated invariant. That may be less convenient than a single aggregate metric, but it matches the correctness burden introduced by selective recomputation.</w:t>
       </w:r>
     </w:p>
-    <w:bookmarkEnd w:id="83"/>
     <w:bookmarkEnd w:id="84"/>
-    <w:bookmarkStart w:id="85" w:name="reproducibility-and-artifact-scope"/>
+    <w:bookmarkEnd w:id="85"/>
+    <w:bookmarkStart w:id="86" w:name="reproducibility-and-artifact-scope"/>
     <w:p>
       <w:pPr>
         <w:pStyle w:val="Heading1"/>
@@ -10981,8 +11274,8 @@
         <w:t xml:space="preserve">Scene figures retain the relevant upstream terms. Original software is licensed under Apache-2.0, original research communication is scoped under CC BY 4.0, and third-party rights are recorded separately. For double-blind review, the identifiable repository and author metadata should be replaced with an anonymized frozen supplement that follows the target venue’s policy.</w:t>
       </w:r>
     </w:p>
-    <w:bookmarkEnd w:id="85"/>
-    <w:bookmarkStart w:id="86" w:name="conclusion"/>
+    <w:bookmarkEnd w:id="86"/>
+    <w:bookmarkStart w:id="87" w:name="conclusion"/>
     <w:p>
       <w:pPr>
         <w:pStyle w:val="Heading1"/>
@@ -11005,11 +11298,11 @@
         <w:pStyle w:val="FirstParagraph"/>
       </w:pPr>
       <w:r>
-        <w:t xml:space="preserve">We introduced Criticality-Bounded Revision Cones as a fail-closed rule for selective recomputation in persistent captured worlds. Criticality is the worst normalized certificate-to-tolerance ratio over the protected outputs. CBRC separates exact dependencies from bounded finite-change influence, ties the unrepaired exterior to explicit tolerances, compares regional work with a full baseline, and independently replays the selected result against a full-after oracle. The frozen public and trained-representation experiments show that local repair and full fallback can coexist under one auditable contract. They also expose the remaining gaps: discovery is still close to global in the frozen path, and there is no paired wall-clock speedup result yet. Repair locally when the system can justify what it leaves alone; rebuild when it cannot.</w:t>
-      </w:r>
-    </w:p>
-    <w:bookmarkEnd w:id="86"/>
-    <w:bookmarkStart w:id="127" w:name="acknowledgments"/>
+        <w:t xml:space="preserve">We introduced Criticality-Bounded Revision Cones as a fail-closed rule for selective recomputation in persistent captured worlds. Criticality is the worst normalized certificate-to-tolerance ratio over the protected outputs. CBRC separates exact dependencies from bounded finite-change influence, ties the unrepaired exterior to explicit tolerances, compares regional work with a full baseline, and independently falsifies the residual outside the selected repair support against a full-after oracle. The frozen public and trained-representation experiments show that local repair and full fallback can coexist under one auditable contract. They also expose the remaining gaps: discovery is still close to global in the frozen path, and there is no paired wall-clock speedup result yet. Repair locally when the system can justify what it leaves alone; rebuild when it cannot.</w:t>
+      </w:r>
+    </w:p>
+    <w:bookmarkEnd w:id="87"/>
+    <w:bookmarkStart w:id="135" w:name="acknowledgments"/>
     <w:p>
       <w:pPr>
         <w:pStyle w:val="Heading1"/>
@@ -11018,7 +11311,7 @@
         <w:t xml:space="preserve">Acknowledgments</w:t>
       </w:r>
     </w:p>
-    <w:bookmarkStart w:id="126" w:name="generative-ai-use-disclosure."/>
+    <w:bookmarkStart w:id="134" w:name="generative-ai-use-disclosure."/>
     <w:p>
       <w:pPr>
         <w:pStyle w:val="Heading4"/>
@@ -11035,8 +11328,8 @@
         <w:t xml:space="preserve">OpenAI ChatGPT was used as an assistive tool during portions of this project for literature-search support, software and scripting development, debugging, experimental and benchmark planning, visualization/manuscript-artifact scripting, and drafting, restructuring, and language editing of the manuscript and supplement. The reported measurements and frozen evidence were produced by the project software and experimental artifacts rather than generated by the language model. The author retains full responsibility for the code, citations, analysis, claims, conclusions, and final text; no generative AI system is listed as an author.</w:t>
       </w:r>
     </w:p>
-    <w:bookmarkStart w:id="125" w:name="refs"/>
-    <w:bookmarkStart w:id="88" w:name="ref-acar2013selfadjusting"/>
+    <w:bookmarkStart w:id="133" w:name="refs"/>
+    <w:bookmarkStart w:id="89" w:name="ref-acar2013selfadjusting"/>
     <w:p>
       <w:pPr>
         <w:pStyle w:val="Bibliography"/>
@@ -11069,7 +11362,7 @@
       <w:r>
         <w:t xml:space="preserve"> </w:t>
       </w:r>
-      <w:hyperlink r:id="rId87">
+      <w:hyperlink r:id="rId88">
         <w:r>
           <w:rPr>
             <w:rStyle w:val="Hyperlink"/>
@@ -11081,8 +11374,8 @@
         <w:t xml:space="preserve">.</w:t>
       </w:r>
     </w:p>
-    <w:bookmarkEnd w:id="88"/>
-    <w:bookmarkStart w:id="89" w:name="ref-ackermann2025clsplats"/>
+    <w:bookmarkEnd w:id="89"/>
+    <w:bookmarkStart w:id="90" w:name="ref-ackermann2025clsplats"/>
     <w:p>
       <w:pPr>
         <w:pStyle w:val="Bibliography"/>
@@ -11116,8 +11409,8 @@
         <w:t xml:space="preserve">, 7808–17.</w:t>
       </w:r>
     </w:p>
-    <w:bookmarkEnd w:id="89"/>
-    <w:bookmarkStart w:id="91" w:name="ref-bala1999raysegment"/>
+    <w:bookmarkEnd w:id="90"/>
+    <w:bookmarkStart w:id="92" w:name="ref-bala1999raysegment"/>
     <w:p>
       <w:pPr>
         <w:pStyle w:val="Bibliography"/>
@@ -11153,7 +11446,7 @@
       <w:r>
         <w:t xml:space="preserve"> </w:t>
       </w:r>
-      <w:hyperlink r:id="rId90">
+      <w:hyperlink r:id="rId91">
         <w:r>
           <w:rPr>
             <w:rStyle w:val="Hyperlink"/>
@@ -11165,8 +11458,8 @@
         <w:t xml:space="preserve">.</w:t>
       </w:r>
     </w:p>
-    <w:bookmarkEnd w:id="91"/>
-    <w:bookmarkStart w:id="93" w:name="ref-chen2024gaussianeditor"/>
+    <w:bookmarkEnd w:id="92"/>
+    <w:bookmarkStart w:id="94" w:name="ref-chen2024gaussianeditor"/>
     <w:p>
       <w:pPr>
         <w:pStyle w:val="Bibliography"/>
@@ -11202,7 +11495,7 @@
       <w:r>
         <w:t xml:space="preserve"> </w:t>
       </w:r>
-      <w:hyperlink r:id="rId92">
+      <w:hyperlink r:id="rId93">
         <w:r>
           <w:rPr>
             <w:rStyle w:val="Hyperlink"/>
@@ -11214,8 +11507,8 @@
         <w:t xml:space="preserve">.</w:t>
       </w:r>
     </w:p>
-    <w:bookmarkEnd w:id="93"/>
-    <w:bookmarkStart w:id="94" w:name="ref-curless1996volumetric"/>
+    <w:bookmarkEnd w:id="94"/>
+    <w:bookmarkStart w:id="95" w:name="ref-curless1996volumetric"/>
     <w:p>
       <w:pPr>
         <w:pStyle w:val="Bibliography"/>
@@ -11249,8 +11542,8 @@
         <w:t xml:space="preserve">, 303–12.</w:t>
       </w:r>
     </w:p>
-    <w:bookmarkEnd w:id="94"/>
-    <w:bookmarkStart w:id="95" w:name="ref-dai2017bundlefusion"/>
+    <w:bookmarkEnd w:id="95"/>
+    <w:bookmarkStart w:id="97" w:name="ref-dai2017bundlefusion"/>
     <w:p>
       <w:pPr>
         <w:pStyle w:val="Bibliography"/>
@@ -11278,11 +11571,25 @@
         <w:t xml:space="preserve"> </w:t>
       </w:r>
       <w:r>
-        <w:t xml:space="preserve">36 (4): 76:1–18.</w:t>
-      </w:r>
-    </w:p>
-    <w:bookmarkEnd w:id="95"/>
-    <w:bookmarkStart w:id="96" w:name="ref-ellensohn2026eligsir"/>
+        <w:t xml:space="preserve">36 (4): 24:1–18.</w:t>
+      </w:r>
+      <w:r>
+        <w:t xml:space="preserve"> </w:t>
+      </w:r>
+      <w:hyperlink r:id="rId96">
+        <w:r>
+          <w:rPr>
+            <w:rStyle w:val="Hyperlink"/>
+          </w:rPr>
+          <w:t xml:space="preserve">https://doi.org/10.1145/3072959.3054739</w:t>
+        </w:r>
+      </w:hyperlink>
+      <w:r>
+        <w:t xml:space="preserve">.</w:t>
+      </w:r>
+    </w:p>
+    <w:bookmarkEnd w:id="97"/>
+    <w:bookmarkStart w:id="98" w:name="ref-ellensohn2026eligsir"/>
     <w:p>
       <w:pPr>
         <w:pStyle w:val="Bibliography"/>
@@ -11310,8 +11617,8 @@
         <w:t xml:space="preserve">.</w:t>
       </w:r>
     </w:p>
-    <w:bookmarkEnd w:id="96"/>
-    <w:bookmarkStart w:id="97" w:name="ref-galappaththige2026pixels"/>
+    <w:bookmarkEnd w:id="98"/>
+    <w:bookmarkStart w:id="99" w:name="ref-galappaththige2026pixels"/>
     <w:p>
       <w:pPr>
         <w:pStyle w:val="Bibliography"/>
@@ -11339,8 +11646,54 @@
         <w:t xml:space="preserve">.</w:t>
       </w:r>
     </w:p>
-    <w:bookmarkEnd w:id="97"/>
-    <w:bookmarkStart w:id="99" w:name="ref-huang2024scgs"/>
+    <w:bookmarkEnd w:id="99"/>
+    <w:bookmarkStart w:id="101" w:name="ref-hedman2018deepblending"/>
+    <w:p>
+      <w:pPr>
+        <w:pStyle w:val="Bibliography"/>
+      </w:pPr>
+      <w:r>
+        <w:t xml:space="preserve">Hedman, Peter, Julien Philip, True Price, Jan-Michael Frahm, George Drettakis, and Gabriel J. Brostow. 2018.</w:t>
+      </w:r>
+      <w:r>
+        <w:t xml:space="preserve"> </w:t>
+      </w:r>
+      <w:r>
+        <w:t xml:space="preserve">“Deep Blending for Free-Viewpoint Image-Based Rendering.”</w:t>
+      </w:r>
+      <w:r>
+        <w:t xml:space="preserve"> </w:t>
+      </w:r>
+      <w:r>
+        <w:rPr>
+          <w:iCs/>
+          <w:i/>
+        </w:rPr>
+        <w:t xml:space="preserve">ACM Transactions on Graphics</w:t>
+      </w:r>
+      <w:r>
+        <w:t xml:space="preserve"> </w:t>
+      </w:r>
+      <w:r>
+        <w:t xml:space="preserve">37 (6): 257:1–15.</w:t>
+      </w:r>
+      <w:r>
+        <w:t xml:space="preserve"> </w:t>
+      </w:r>
+      <w:hyperlink r:id="rId100">
+        <w:r>
+          <w:rPr>
+            <w:rStyle w:val="Hyperlink"/>
+          </w:rPr>
+          <w:t xml:space="preserve">https://doi.org/10.1145/3272127.3275084</w:t>
+        </w:r>
+      </w:hyperlink>
+      <w:r>
+        <w:t xml:space="preserve">.</w:t>
+      </w:r>
+    </w:p>
+    <w:bookmarkEnd w:id="101"/>
+    <w:bookmarkStart w:id="103" w:name="ref-huang2024scgs"/>
     <w:p>
       <w:pPr>
         <w:pStyle w:val="Bibliography"/>
@@ -11376,7 +11729,7 @@
       <w:r>
         <w:t xml:space="preserve"> </w:t>
       </w:r>
-      <w:hyperlink r:id="rId98">
+      <w:hyperlink r:id="rId102">
         <w:r>
           <w:rPr>
             <w:rStyle w:val="Hyperlink"/>
@@ -11388,8 +11741,8 @@
         <w:t xml:space="preserve">.</w:t>
       </w:r>
     </w:p>
-    <w:bookmarkEnd w:id="99"/>
-    <w:bookmarkStart w:id="100" w:name="ref-keetha2024splatam"/>
+    <w:bookmarkEnd w:id="103"/>
+    <w:bookmarkStart w:id="104" w:name="ref-keetha2024splatam"/>
     <w:p>
       <w:pPr>
         <w:pStyle w:val="Bibliography"/>
@@ -11423,8 +11776,8 @@
         <w:t xml:space="preserve">, 21357–66.</w:t>
       </w:r>
     </w:p>
-    <w:bookmarkEnd w:id="100"/>
-    <w:bookmarkStart w:id="102" w:name="ref-kerbl2023gaussians"/>
+    <w:bookmarkEnd w:id="104"/>
+    <w:bookmarkStart w:id="106" w:name="ref-kerbl2023gaussians"/>
     <w:p>
       <w:pPr>
         <w:pStyle w:val="Bibliography"/>
@@ -11457,7 +11810,7 @@
       <w:r>
         <w:t xml:space="preserve"> </w:t>
       </w:r>
-      <w:hyperlink r:id="rId101">
+      <w:hyperlink r:id="rId105">
         <w:r>
           <w:rPr>
             <w:rStyle w:val="Hyperlink"/>
@@ -11469,8 +11822,54 @@
         <w:t xml:space="preserve">.</w:t>
       </w:r>
     </w:p>
-    <w:bookmarkEnd w:id="102"/>
-    <w:bookmarkStart w:id="104" w:name="ref-luiten2024dynamic3dgaussians"/>
+    <w:bookmarkEnd w:id="106"/>
+    <w:bookmarkStart w:id="108" w:name="ref-knapitsch2017tandt"/>
+    <w:p>
+      <w:pPr>
+        <w:pStyle w:val="Bibliography"/>
+      </w:pPr>
+      <w:r>
+        <w:t xml:space="preserve">Knapitsch, Arno, Jaesik Park, Qian-Yi Zhou, and Vladlen Koltun. 2017.</w:t>
+      </w:r>
+      <w:r>
+        <w:t xml:space="preserve"> </w:t>
+      </w:r>
+      <w:r>
+        <w:t xml:space="preserve">“Tanks and Temples: Benchmarking Large-Scale Scene Reconstruction.”</w:t>
+      </w:r>
+      <w:r>
+        <w:t xml:space="preserve"> </w:t>
+      </w:r>
+      <w:r>
+        <w:rPr>
+          <w:iCs/>
+          <w:i/>
+        </w:rPr>
+        <w:t xml:space="preserve">ACM Transactions on Graphics</w:t>
+      </w:r>
+      <w:r>
+        <w:t xml:space="preserve"> </w:t>
+      </w:r>
+      <w:r>
+        <w:t xml:space="preserve">36 (4).</w:t>
+      </w:r>
+      <w:r>
+        <w:t xml:space="preserve"> </w:t>
+      </w:r>
+      <w:hyperlink r:id="rId107">
+        <w:r>
+          <w:rPr>
+            <w:rStyle w:val="Hyperlink"/>
+          </w:rPr>
+          <w:t xml:space="preserve">https://doi.org/10.1145/3072959.3073599</w:t>
+        </w:r>
+      </w:hyperlink>
+      <w:r>
+        <w:t xml:space="preserve">.</w:t>
+      </w:r>
+    </w:p>
+    <w:bookmarkEnd w:id="108"/>
+    <w:bookmarkStart w:id="110" w:name="ref-luiten2024dynamic3dgaussians"/>
     <w:p>
       <w:pPr>
         <w:pStyle w:val="Bibliography"/>
@@ -11506,7 +11905,7 @@
       <w:r>
         <w:t xml:space="preserve"> </w:t>
       </w:r>
-      <w:hyperlink r:id="rId103">
+      <w:hyperlink r:id="rId109">
         <w:r>
           <w:rPr>
             <w:rStyle w:val="Hyperlink"/>
@@ -11518,8 +11917,8 @@
         <w:t xml:space="preserve">.</w:t>
       </w:r>
     </w:p>
-    <w:bookmarkEnd w:id="104"/>
-    <w:bookmarkStart w:id="106" w:name="ref-matsuki2024monogs"/>
+    <w:bookmarkEnd w:id="110"/>
+    <w:bookmarkStart w:id="112" w:name="ref-matsuki2024monogs"/>
     <w:p>
       <w:pPr>
         <w:pStyle w:val="Bibliography"/>
@@ -11555,7 +11954,7 @@
       <w:r>
         <w:t xml:space="preserve"> </w:t>
       </w:r>
-      <w:hyperlink r:id="rId105">
+      <w:hyperlink r:id="rId111">
         <w:r>
           <w:rPr>
             <w:rStyle w:val="Hyperlink"/>
@@ -11567,8 +11966,8 @@
         <w:t xml:space="preserve">.</w:t>
       </w:r>
     </w:p>
-    <w:bookmarkEnd w:id="106"/>
-    <w:bookmarkStart w:id="107" w:name="ref-mildenhall2020nerf"/>
+    <w:bookmarkEnd w:id="112"/>
+    <w:bookmarkStart w:id="113" w:name="ref-mildenhall2020nerf"/>
     <w:p>
       <w:pPr>
         <w:pStyle w:val="Bibliography"/>
@@ -11602,8 +12001,8 @@
         <w:t xml:space="preserve">, 405–21.</w:t>
       </w:r>
     </w:p>
-    <w:bookmarkEnd w:id="107"/>
-    <w:bookmarkStart w:id="108" w:name="ref-newcombe2011kinectfusion"/>
+    <w:bookmarkEnd w:id="113"/>
+    <w:bookmarkStart w:id="114" w:name="ref-newcombe2011kinectfusion"/>
     <w:p>
       <w:pPr>
         <w:pStyle w:val="Bibliography"/>
@@ -11637,8 +12036,8 @@
         <w:t xml:space="preserve">, 127–36.</w:t>
       </w:r>
     </w:p>
-    <w:bookmarkEnd w:id="108"/>
-    <w:bookmarkStart w:id="110" w:name="ref-oden2001goal"/>
+    <w:bookmarkEnd w:id="114"/>
+    <w:bookmarkStart w:id="116" w:name="ref-oden2001goal"/>
     <w:p>
       <w:pPr>
         <w:pStyle w:val="Bibliography"/>
@@ -11671,7 +12070,7 @@
       <w:r>
         <w:t xml:space="preserve"> </w:t>
       </w:r>
-      <w:hyperlink r:id="rId109">
+      <w:hyperlink r:id="rId115">
         <w:r>
           <w:rPr>
             <w:rStyle w:val="Hyperlink"/>
@@ -11683,8 +12082,8 @@
         <w:t xml:space="preserve">.</w:t>
       </w:r>
     </w:p>
-    <w:bookmarkEnd w:id="110"/>
-    <w:bookmarkStart w:id="112" w:name="ref-pfister2000surfels"/>
+    <w:bookmarkEnd w:id="116"/>
+    <w:bookmarkStart w:id="118" w:name="ref-pfister2000surfels"/>
     <w:p>
       <w:pPr>
         <w:pStyle w:val="Bibliography"/>
@@ -11720,7 +12119,7 @@
       <w:r>
         <w:t xml:space="preserve"> </w:t>
       </w:r>
-      <w:hyperlink r:id="rId111">
+      <w:hyperlink r:id="rId117">
         <w:r>
           <w:rPr>
             <w:rStyle w:val="Hyperlink"/>
@@ -11732,8 +12131,57 @@
         <w:t xml:space="preserve">.</w:t>
       </w:r>
     </w:p>
-    <w:bookmarkEnd w:id="112"/>
-    <w:bookmarkStart w:id="114" w:name="ref-sucar2021imap"/>
+    <w:bookmarkEnd w:id="118"/>
+    <w:bookmarkStart w:id="120" w:name="ref-schonberger2016sfm"/>
+    <w:p>
+      <w:pPr>
+        <w:pStyle w:val="Bibliography"/>
+      </w:pPr>
+      <w:r>
+        <w:t xml:space="preserve">Sch"onberger, Johannes L., and Jan-Michael Frahm. 2016.</w:t>
+      </w:r>
+      <w:r>
+        <w:t xml:space="preserve"> </w:t>
+      </w:r>
+      <w:r>
+        <w:t xml:space="preserve">“Structure-from-Motion Revisited.”</w:t>
+      </w:r>
+      <w:r>
+        <w:t xml:space="preserve"> </w:t>
+      </w:r>
+      <w:r>
+        <w:t xml:space="preserve">In</w:t>
+      </w:r>
+      <w:r>
+        <w:t xml:space="preserve"> </w:t>
+      </w:r>
+      <w:r>
+        <w:rPr>
+          <w:iCs/>
+          <w:i/>
+        </w:rPr>
+        <w:t xml:space="preserve">Proceedings of the IEEE Conference on Computer Vision and Pattern Recognition</w:t>
+      </w:r>
+      <w:r>
+        <w:t xml:space="preserve">, 4104–13.</w:t>
+      </w:r>
+      <w:r>
+        <w:t xml:space="preserve"> </w:t>
+      </w:r>
+      <w:hyperlink r:id="rId119">
+        <w:r>
+          <w:rPr>
+            <w:rStyle w:val="Hyperlink"/>
+          </w:rPr>
+          <w:t xml:space="preserve">https://doi.org/10.1109/CVPR.2016.445</w:t>
+        </w:r>
+      </w:hyperlink>
+      <w:r>
+        <w:t xml:space="preserve">.</w:t>
+      </w:r>
+    </w:p>
+    <w:bookmarkEnd w:id="120"/>
+    <w:bookmarkStart w:id="122" w:name="ref-sucar2021imap"/>
     <w:p>
       <w:pPr>
         <w:pStyle w:val="Bibliography"/>
@@ -11769,7 +12217,7 @@
       <w:r>
         <w:t xml:space="preserve"> </w:t>
       </w:r>
-      <w:hyperlink r:id="rId113">
+      <w:hyperlink r:id="rId121">
         <w:r>
           <w:rPr>
             <w:rStyle w:val="Hyperlink"/>
@@ -11781,8 +12229,8 @@
         <w:t xml:space="preserve">.</w:t>
       </w:r>
     </w:p>
-    <w:bookmarkEnd w:id="114"/>
-    <w:bookmarkStart w:id="115" w:name="ref-whelan2015elasticfusion"/>
+    <w:bookmarkEnd w:id="122"/>
+    <w:bookmarkStart w:id="123" w:name="ref-whelan2015elasticfusion"/>
     <w:p>
       <w:pPr>
         <w:pStyle w:val="Bibliography"/>
@@ -11816,8 +12264,8 @@
         <w:t xml:space="preserve">.</w:t>
       </w:r>
     </w:p>
-    <w:bookmarkEnd w:id="115"/>
-    <w:bookmarkStart w:id="117" w:name="ref-woerister2013lazy"/>
+    <w:bookmarkEnd w:id="123"/>
+    <w:bookmarkStart w:id="125" w:name="ref-woerister2013lazy"/>
     <w:p>
       <w:pPr>
         <w:pStyle w:val="Bibliography"/>
@@ -11853,7 +12301,7 @@
       <w:r>
         <w:t xml:space="preserve"> </w:t>
       </w:r>
-      <w:hyperlink r:id="rId116">
+      <w:hyperlink r:id="rId124">
         <w:r>
           <w:rPr>
             <w:rStyle w:val="Hyperlink"/>
@@ -11865,8 +12313,8 @@
         <w:t xml:space="preserve">.</w:t>
       </w:r>
     </w:p>
-    <w:bookmarkEnd w:id="117"/>
-    <w:bookmarkStart w:id="119" w:name="ref-wu2024fourDGS"/>
+    <w:bookmarkEnd w:id="125"/>
+    <w:bookmarkStart w:id="127" w:name="ref-wu2024fourDGS"/>
     <w:p>
       <w:pPr>
         <w:pStyle w:val="Bibliography"/>
@@ -11902,7 +12350,7 @@
       <w:r>
         <w:t xml:space="preserve"> </w:t>
       </w:r>
-      <w:hyperlink r:id="rId118">
+      <w:hyperlink r:id="rId126">
         <w:r>
           <w:rPr>
             <w:rStyle w:val="Hyperlink"/>
@@ -11914,8 +12362,8 @@
         <w:t xml:space="preserve">.</w:t>
       </w:r>
     </w:p>
-    <w:bookmarkEnd w:id="119"/>
-    <w:bookmarkStart w:id="120" w:name="ref-wu2026cif"/>
+    <w:bookmarkEnd w:id="127"/>
+    <w:bookmarkStart w:id="128" w:name="ref-wu2026cif"/>
     <w:p>
       <w:pPr>
         <w:pStyle w:val="Bibliography"/>
@@ -11949,8 +12397,8 @@
         <w:t xml:space="preserve">, 3783–93.</w:t>
       </w:r>
     </w:p>
-    <w:bookmarkEnd w:id="120"/>
-    <w:bookmarkStart w:id="121" w:name="ref-yugay2026game"/>
+    <w:bookmarkEnd w:id="128"/>
+    <w:bookmarkStart w:id="129" w:name="ref-yugay2026game"/>
     <w:p>
       <w:pPr>
         <w:pStyle w:val="Bibliography"/>
@@ -11984,8 +12432,8 @@
         <w:t xml:space="preserve">, 18903–12.</w:t>
       </w:r>
     </w:p>
-    <w:bookmarkEnd w:id="121"/>
-    <w:bookmarkStart w:id="123" w:name="ref-zeng2025gaussianupdate"/>
+    <w:bookmarkEnd w:id="129"/>
+    <w:bookmarkStart w:id="131" w:name="ref-zeng2025gaussianupdate"/>
     <w:p>
       <w:pPr>
         <w:pStyle w:val="Bibliography"/>
@@ -12021,7 +12469,7 @@
       <w:r>
         <w:t xml:space="preserve"> </w:t>
       </w:r>
-      <w:hyperlink r:id="rId122">
+      <w:hyperlink r:id="rId130">
         <w:r>
           <w:rPr>
             <w:rStyle w:val="Hyperlink"/>
@@ -12033,8 +12481,8 @@
         <w:t xml:space="preserve">.</w:t>
       </w:r>
     </w:p>
-    <w:bookmarkEnd w:id="123"/>
-    <w:bookmarkStart w:id="124" w:name="ref-zhu2022niceslam"/>
+    <w:bookmarkEnd w:id="131"/>
+    <w:bookmarkStart w:id="132" w:name="ref-zhu2022niceslam"/>
     <w:p>
       <w:pPr>
         <w:pStyle w:val="Bibliography"/>
@@ -12068,10 +12516,10 @@
         <w:t xml:space="preserve">, 12786–96.</w:t>
       </w:r>
     </w:p>
-    <w:bookmarkEnd w:id="124"/>
-    <w:bookmarkEnd w:id="125"/>
-    <w:bookmarkEnd w:id="126"/>
-    <w:bookmarkEnd w:id="127"/>
+    <w:bookmarkEnd w:id="132"/>
+    <w:bookmarkEnd w:id="133"/>
+    <w:bookmarkEnd w:id="134"/>
+    <w:bookmarkEnd w:id="135"/>
     <w:sectPr>
       <w:pgSz w:w="12240" w:h="15840"/>
       <w:pgMar w:top="1008" w:bottom="1008" w:left="1008" w:right="1008"/>

</xml_diff>

<commit_message>
paper: regenerate synchronized manuscript artifacts
</commit_message>
<xml_diff>
--- a/researchpaper/MAVEB_manuscript.docx
+++ b/researchpaper/MAVEB_manuscript.docx
@@ -116,7 +116,7 @@
         <w:t xml:space="preserve"> </w:t>
       </w:r>
       <w:r>
-        <w:t xml:space="preserve">(CBRC), implemented in MAVEB, a fail-closed revision rule that combines exact structural closure, conservative finite-change bounds, output tolerances, work-aware selection, automatic</w:t>
+        <w:t xml:space="preserve">(CBRC), a fail-closed revision rule that combines exact structural closure, conservative finite-change bounds, output tolerances, work-aware selection, automatic</w:t>
       </w:r>
       <w:r>
         <w:t xml:space="preserve"> </w:t>
@@ -131,7 +131,7 @@
         <w:t xml:space="preserve"> </w:t>
       </w:r>
       <w:r>
-        <w:t xml:space="preserve">fallback, and independent full-after verification. A local repair is accepted only when the unrecomputed exterior stays within tolerance and the repair remains cheaper than rebuilding.</w:t>
+        <w:t xml:space="preserve">fallback, and independent full-after verification. We evaluate CBRC in MAVEB, our research prototype, which is built on AETHER, a C++23 persistent captured-world software stack for reconstruction state, Gaussian rendering, revision tracking, GPU publication, temporal state, and evidence capture. A local repair is accepted only when the unrecomputed exterior stays within tolerance and the repair remains cheaper than rebuilding.</w:t>
       </w:r>
     </w:p>
     <w:p>
@@ -365,7 +365,7 @@
         <w:pStyle w:val="BodyText"/>
       </w:pPr>
       <w:r>
-        <w:t xml:space="preserve">MAVEB implements this design as a C++23 persistent-world stack, alongside a dense Python reference certifier and an independent full-after Gaussian oracle. Figure 1 summarizes the decision path, while Figure 2 shows the support-selection idea visually. The implementation records immutable before/after revision sidecars, deterministic certificate JSON, per-domain work, and oracle replay. Planner output alone is insufficient evidence of safety. Instead, the unrepaired exterior implied by the chosen support is compared with an independently rendered</w:t>
+        <w:t xml:space="preserve">MAVEB is the research system used to evaluate CBRC; AETHER is the underlying C++23 persistent-world engine stack. AETHER owns reconstruction and Gaussian state, revision transactions, GPU publication, temporal state, and provenance/evidence capture, while a dense Python reference certifier and an independent full-after Gaussian oracle provide separate validation paths. Figure 1 summarizes the decision path, while Figure 2 shows the support-selection idea visually. The implementation records immutable before/after revision sidecars, deterministic certificate JSON, per-domain work, and oracle replay. Planner output alone is insufficient evidence of safety. Instead, the unrepaired exterior implied by the chosen support is compared with an independently rendered</w:t>
       </w:r>
       <w:r>
         <w:t xml:space="preserve"> </w:t>
@@ -7011,7 +7011,7 @@
         <w:pStyle w:val="FirstParagraph"/>
       </w:pPr>
       <w:r>
-        <w:t xml:space="preserve">MAVEB keeps the scientific reference path separate from the production-oriented execution path. The dense Python certifier follows the mathematical contract directly and serves as a falsification and regression reference. The native C++23 implementation uses a sparse typed revision graph, sparse analytic propagation over supported DAG exteriors, exact predecessor checks, greedy feasible-cone search, and deterministic certificate serialization. For the frozen campaign, the bound production output-cone graph is evaluated by both the native planner and the Python reference planner; their final decisions are compared rather than assumed equivalent.</w:t>
+        <w:t xml:space="preserve">Throughout this section, MAVEB names the experimental CBRC research system and AETHER names its underlying native persistent-world software stack. MAVEB keeps the scientific reference path separate from the production-oriented AETHER execution path. The dense Python certifier follows the mathematical contract directly and serves as a falsification and regression reference. The native C++23 AETHER implementation uses a sparse typed revision graph, sparse analytic propagation over supported DAG exteriors, exact predecessor checks, greedy feasible-cone search, and deterministic certificate serialization. For the frozen campaign, the bound production output-cone graph is evaluated by both the native planner and the Python reference planner; their final decisions are compared rather than assumed equivalent.</w:t>
       </w:r>
     </w:p>
     <w:bookmarkStart w:id="51" w:name="revision-transactions."/>
@@ -7127,7 +7127,34 @@
         <w:t xml:space="preserve"> </w:t>
       </w:r>
       <w:r>
-        <w:t xml:space="preserve">use dataset-native geometry seeded into deterministic Gaussian fields after the public capture assets are normalized into the benchmark coordinate convention. Thirteen GraphDECO scenes use pinned trained 3DGS representations and preserve spherical-harmonic coefficients, opacity, anisotropic scale, and rotation</w:t>
+        <w:t xml:space="preserve">use dataset-native geometry seeded into deterministic Gaussian fields after the public capture assets are normalized into the benchmark coordinate convention. Thirteen scenes use pinned pretrained GraphDECO 3DGS representations from the standard evaluation suite: nine Mip-NeRF 360 scenes</w:t>
+      </w:r>
+      <w:r>
+        <w:t xml:space="preserve"> </w:t>
+      </w:r>
+      <w:r>
+        <w:t xml:space="preserve">(Barron et al. 2022)</w:t>
+      </w:r>
+      <w:r>
+        <w:t xml:space="preserve">, Train and Truck from Tanks &amp; Temples</w:t>
+      </w:r>
+      <w:r>
+        <w:t xml:space="preserve"> </w:t>
+      </w:r>
+      <w:r>
+        <w:t xml:space="preserve">(Knapitsch et al. 2017)</w:t>
+      </w:r>
+      <w:r>
+        <w:t xml:space="preserve">, and Dr Johnson and Playroom from Deep Blending</w:t>
+      </w:r>
+      <w:r>
+        <w:t xml:space="preserve"> </w:t>
+      </w:r>
+      <w:r>
+        <w:t xml:space="preserve">(Hedman et al. 2018)</w:t>
+      </w:r>
+      <w:r>
+        <w:t xml:space="preserve">; the Gaussian representations preserve spherical-harmonic coefficients, opacity, anisotropic scale, and rotation</w:t>
       </w:r>
       <w:r>
         <w:t xml:space="preserve"> </w:t>
@@ -7274,13 +7301,13 @@
         <w:t xml:space="preserve">(Palazzolo et al. 2019)</w:t>
       </w:r>
       <w:r>
-        <w:t xml:space="preserve">, and 195 cases on 13 pinned trained GraphDECO 3DGS scenes</w:t>
-      </w:r>
-      <w:r>
-        <w:t xml:space="preserve"> </w:t>
-      </w:r>
-      <w:r>
-        <w:t xml:space="preserve">(Kerbl et al. 2023)</w:t>
+        <w:t xml:space="preserve">, and 195 cases on 13 pinned pretrained GraphDECO 3DGS scenes drawn from Mip-NeRF 360, Tanks &amp; Temples, and Deep Blending</w:t>
+      </w:r>
+      <w:r>
+        <w:t xml:space="preserve"> </w:t>
+      </w:r>
+      <w:r>
+        <w:t xml:space="preserve">(Kerbl et al. 2023; Barron et al. 2022; Knapitsch et al. 2017; Hedman et al. 2018)</w:t>
       </w:r>
       <w:r>
         <w:t xml:space="preserve">. Every scene contributes the same 15-case coupling template, while edit family rotates through translation, rotation, uniform scale, and opacity. The frozen protocol therefore separates outcome inspection from threshold or case construction.</w:t>
@@ -11395,7 +11422,7 @@
       </w:r>
     </w:p>
     <w:bookmarkEnd w:id="85"/>
-    <w:bookmarkStart w:id="130" w:name="acknowledgments"/>
+    <w:bookmarkStart w:id="137" w:name="acknowledgments"/>
     <w:p>
       <w:pPr>
         <w:pStyle w:val="Heading1"/>
@@ -11404,12 +11431,96 @@
         <w:t xml:space="preserve">Acknowledgments</w:t>
       </w:r>
     </w:p>
-    <w:bookmarkStart w:id="129" w:name="generative-ai-use-disclosure."/>
+    <w:bookmarkStart w:id="86" w:name="dataset-acknowledgments."/>
     <w:p>
       <w:pPr>
         <w:pStyle w:val="Heading4"/>
       </w:pPr>
       <w:r>
+        <w:t xml:space="preserve">Dataset acknowledgments.</w:t>
+      </w:r>
+    </w:p>
+    <w:p>
+      <w:pPr>
+        <w:pStyle w:val="FirstParagraph"/>
+      </w:pPr>
+      <w:r>
+        <w:t xml:space="preserve">We thank the authors and maintainers of 3RScan</w:t>
+      </w:r>
+      <w:r>
+        <w:t xml:space="preserve"> </w:t>
+      </w:r>
+      <w:r>
+        <w:t xml:space="preserve">(Wald et al. 2019)</w:t>
+      </w:r>
+      <w:r>
+        <w:t xml:space="preserve">, ARKitScenes</w:t>
+      </w:r>
+      <w:r>
+        <w:t xml:space="preserve"> </w:t>
+      </w:r>
+      <w:r>
+        <w:t xml:space="preserve">(Baruch et al. 2021)</w:t>
+      </w:r>
+      <w:r>
+        <w:t xml:space="preserve">, and the Bonn RGB-D Dynamic Dataset</w:t>
+      </w:r>
+      <w:r>
+        <w:t xml:space="preserve"> </w:t>
+      </w:r>
+      <w:r>
+        <w:t xml:space="preserve">(Palazzolo et al. 2019)</w:t>
+      </w:r>
+      <w:r>
+        <w:t xml:space="preserve"> </w:t>
+      </w:r>
+      <w:r>
+        <w:t xml:space="preserve">for making their data available for research. We also use pretrained 3DGS models released by GraphDECO</w:t>
+      </w:r>
+      <w:r>
+        <w:t xml:space="preserve"> </w:t>
+      </w:r>
+      <w:r>
+        <w:t xml:space="preserve">(Kerbl et al. 2023)</w:t>
+      </w:r>
+      <w:r>
+        <w:t xml:space="preserve">. Their source scenes come from Mip-NeRF 360</w:t>
+      </w:r>
+      <w:r>
+        <w:t xml:space="preserve"> </w:t>
+      </w:r>
+      <w:r>
+        <w:t xml:space="preserve">(Barron et al. 2022)</w:t>
+      </w:r>
+      <w:r>
+        <w:t xml:space="preserve">, Tanks &amp; Temples</w:t>
+      </w:r>
+      <w:r>
+        <w:t xml:space="preserve"> </w:t>
+      </w:r>
+      <w:r>
+        <w:t xml:space="preserve">(Knapitsch et al. 2017)</w:t>
+      </w:r>
+      <w:r>
+        <w:t xml:space="preserve">, and Deep Blending</w:t>
+      </w:r>
+      <w:r>
+        <w:t xml:space="preserve"> </w:t>
+      </w:r>
+      <w:r>
+        <w:t xml:space="preserve">(Hedman et al. 2018)</w:t>
+      </w:r>
+      <w:r>
+        <w:t xml:space="preserve">. These citations follow the dataset providers’ requested publication references; upstream assets remain under their original terms and are not redistributed with this repository.</w:t>
+      </w:r>
+    </w:p>
+    <w:bookmarkEnd w:id="86"/>
+    <w:bookmarkStart w:id="136" w:name="generative-ai-use-disclosure."/>
+    <w:p>
+      <w:pPr>
+        <w:pStyle w:val="Heading4"/>
+      </w:pPr>
+      <w:r>
         <w:t xml:space="preserve">Generative AI use disclosure.</w:t>
       </w:r>
     </w:p>
@@ -11421,8 +11532,8 @@
         <w:t xml:space="preserve">OpenAI ChatGPT was used for literature-search support, software and scripting assistance, debugging, experiment planning, visualization and manuscript tooling, and drafting or language editing. Reported measurements and frozen evidence came from project software and experimental artifacts. The author is responsible for the code, citations, analysis, claims, conclusions, and final text; no generative AI system is listed as an author.</w:t>
       </w:r>
     </w:p>
-    <w:bookmarkStart w:id="128" w:name="refs"/>
-    <w:bookmarkStart w:id="87" w:name="ref-acar2013selfadjusting"/>
+    <w:bookmarkStart w:id="135" w:name="refs"/>
+    <w:bookmarkStart w:id="88" w:name="ref-acar2013selfadjusting"/>
     <w:p>
       <w:pPr>
         <w:pStyle w:val="Bibliography"/>
@@ -11455,7 +11566,7 @@
       <w:r>
         <w:t xml:space="preserve"> </w:t>
       </w:r>
-      <w:hyperlink r:id="rId86">
+      <w:hyperlink r:id="rId87">
         <w:r>
           <w:rPr>
             <w:rStyle w:val="Hyperlink"/>
@@ -11467,8 +11578,8 @@
         <w:t xml:space="preserve">.</w:t>
       </w:r>
     </w:p>
-    <w:bookmarkEnd w:id="87"/>
-    <w:bookmarkStart w:id="88" w:name="ref-ackermann2025clsplats"/>
+    <w:bookmarkEnd w:id="88"/>
+    <w:bookmarkStart w:id="89" w:name="ref-ackermann2025clsplats"/>
     <w:p>
       <w:pPr>
         <w:pStyle w:val="Bibliography"/>
@@ -11502,8 +11613,8 @@
         <w:t xml:space="preserve">, 7808–17.</w:t>
       </w:r>
     </w:p>
-    <w:bookmarkEnd w:id="88"/>
-    <w:bookmarkStart w:id="90" w:name="ref-bala1999raysegment"/>
+    <w:bookmarkEnd w:id="89"/>
+    <w:bookmarkStart w:id="91" w:name="ref-bala1999raysegment"/>
     <w:p>
       <w:pPr>
         <w:pStyle w:val="Bibliography"/>
@@ -11539,7 +11650,7 @@
       <w:r>
         <w:t xml:space="preserve"> </w:t>
       </w:r>
-      <w:hyperlink r:id="rId89">
+      <w:hyperlink r:id="rId90">
         <w:r>
           <w:rPr>
             <w:rStyle w:val="Hyperlink"/>
@@ -11551,8 +11662,57 @@
         <w:t xml:space="preserve">.</w:t>
       </w:r>
     </w:p>
-    <w:bookmarkEnd w:id="90"/>
-    <w:bookmarkStart w:id="91" w:name="ref-baruch2021arkitscenes"/>
+    <w:bookmarkEnd w:id="91"/>
+    <w:bookmarkStart w:id="93" w:name="ref-barron2022mipnerf360"/>
+    <w:p>
+      <w:pPr>
+        <w:pStyle w:val="Bibliography"/>
+      </w:pPr>
+      <w:r>
+        <w:t xml:space="preserve">Barron, Jonathan T., Ben Mildenhall, Dor Verbin, Pratul P. Srinivasan, and Peter Hedman. 2022.</w:t>
+      </w:r>
+      <w:r>
+        <w:t xml:space="preserve"> </w:t>
+      </w:r>
+      <w:r>
+        <w:t xml:space="preserve">“Mip-NeRF 360: Unbounded Anti-Aliased Neural Radiance Fields.”</w:t>
+      </w:r>
+      <w:r>
+        <w:t xml:space="preserve"> </w:t>
+      </w:r>
+      <w:r>
+        <w:t xml:space="preserve">In</w:t>
+      </w:r>
+      <w:r>
+        <w:t xml:space="preserve"> </w:t>
+      </w:r>
+      <w:r>
+        <w:rPr>
+          <w:iCs/>
+          <w:i/>
+        </w:rPr>
+        <w:t xml:space="preserve">Proceedings of the IEEE/CVF Conference on Computer Vision and Pattern Recognition</w:t>
+      </w:r>
+      <w:r>
+        <w:t xml:space="preserve">, 5470–79.</w:t>
+      </w:r>
+      <w:r>
+        <w:t xml:space="preserve"> </w:t>
+      </w:r>
+      <w:hyperlink r:id="rId92">
+        <w:r>
+          <w:rPr>
+            <w:rStyle w:val="Hyperlink"/>
+          </w:rPr>
+          <w:t xml:space="preserve">https://doi.org/10.1109/CVPR52688.2022.00539</w:t>
+        </w:r>
+      </w:hyperlink>
+      <w:r>
+        <w:t xml:space="preserve">.</w:t>
+      </w:r>
+    </w:p>
+    <w:bookmarkEnd w:id="93"/>
+    <w:bookmarkStart w:id="94" w:name="ref-baruch2021arkitscenes"/>
     <w:p>
       <w:pPr>
         <w:pStyle w:val="Bibliography"/>
@@ -11604,8 +11764,8 @@
         <w:t xml:space="preserve">.</w:t>
       </w:r>
     </w:p>
-    <w:bookmarkEnd w:id="91"/>
-    <w:bookmarkStart w:id="93" w:name="ref-chen2024gaussianeditor"/>
+    <w:bookmarkEnd w:id="94"/>
+    <w:bookmarkStart w:id="96" w:name="ref-chen2024gaussianeditor"/>
     <w:p>
       <w:pPr>
         <w:pStyle w:val="Bibliography"/>
@@ -11641,7 +11801,7 @@
       <w:r>
         <w:t xml:space="preserve"> </w:t>
       </w:r>
-      <w:hyperlink r:id="rId92">
+      <w:hyperlink r:id="rId95">
         <w:r>
           <w:rPr>
             <w:rStyle w:val="Hyperlink"/>
@@ -11653,8 +11813,8 @@
         <w:t xml:space="preserve">.</w:t>
       </w:r>
     </w:p>
-    <w:bookmarkEnd w:id="93"/>
-    <w:bookmarkStart w:id="94" w:name="ref-curless1996volumetric"/>
+    <w:bookmarkEnd w:id="96"/>
+    <w:bookmarkStart w:id="97" w:name="ref-curless1996volumetric"/>
     <w:p>
       <w:pPr>
         <w:pStyle w:val="Bibliography"/>
@@ -11688,8 +11848,8 @@
         <w:t xml:space="preserve">, 303–12.</w:t>
       </w:r>
     </w:p>
-    <w:bookmarkEnd w:id="94"/>
-    <w:bookmarkStart w:id="96" w:name="ref-dai2017bundlefusion"/>
+    <w:bookmarkEnd w:id="97"/>
+    <w:bookmarkStart w:id="99" w:name="ref-dai2017bundlefusion"/>
     <w:p>
       <w:pPr>
         <w:pStyle w:val="Bibliography"/>
@@ -11722,7 +11882,7 @@
       <w:r>
         <w:t xml:space="preserve"> </w:t>
       </w:r>
-      <w:hyperlink r:id="rId95">
+      <w:hyperlink r:id="rId98">
         <w:r>
           <w:rPr>
             <w:rStyle w:val="Hyperlink"/>
@@ -11734,8 +11894,8 @@
         <w:t xml:space="preserve">.</w:t>
       </w:r>
     </w:p>
-    <w:bookmarkEnd w:id="96"/>
-    <w:bookmarkStart w:id="97" w:name="ref-ellensohn2026eligsir"/>
+    <w:bookmarkEnd w:id="99"/>
+    <w:bookmarkStart w:id="100" w:name="ref-ellensohn2026eligsir"/>
     <w:p>
       <w:pPr>
         <w:pStyle w:val="Bibliography"/>
@@ -11763,8 +11923,8 @@
         <w:t xml:space="preserve">.</w:t>
       </w:r>
     </w:p>
-    <w:bookmarkEnd w:id="97"/>
-    <w:bookmarkStart w:id="98" w:name="ref-galappaththige2026pixels"/>
+    <w:bookmarkEnd w:id="100"/>
+    <w:bookmarkStart w:id="101" w:name="ref-galappaththige2026pixels"/>
     <w:p>
       <w:pPr>
         <w:pStyle w:val="Bibliography"/>
@@ -11792,8 +11952,54 @@
         <w:t xml:space="preserve">.</w:t>
       </w:r>
     </w:p>
-    <w:bookmarkEnd w:id="98"/>
-    <w:bookmarkStart w:id="100" w:name="ref-huang2024scgs"/>
+    <w:bookmarkEnd w:id="101"/>
+    <w:bookmarkStart w:id="103" w:name="ref-hedman2018deepblending"/>
+    <w:p>
+      <w:pPr>
+        <w:pStyle w:val="Bibliography"/>
+      </w:pPr>
+      <w:r>
+        <w:t xml:space="preserve">Hedman, Peter, Julien Philip, True Price, Jan-Michael Frahm, George Drettakis, and Gabriel J. Brostow. 2018.</w:t>
+      </w:r>
+      <w:r>
+        <w:t xml:space="preserve"> </w:t>
+      </w:r>
+      <w:r>
+        <w:t xml:space="preserve">“Deep Blending for Free-Viewpoint Image-Based Rendering.”</w:t>
+      </w:r>
+      <w:r>
+        <w:t xml:space="preserve"> </w:t>
+      </w:r>
+      <w:r>
+        <w:rPr>
+          <w:iCs/>
+          <w:i/>
+        </w:rPr>
+        <w:t xml:space="preserve">ACM Transactions on Graphics</w:t>
+      </w:r>
+      <w:r>
+        <w:t xml:space="preserve"> </w:t>
+      </w:r>
+      <w:r>
+        <w:t xml:space="preserve">37 (6): 257:1–15.</w:t>
+      </w:r>
+      <w:r>
+        <w:t xml:space="preserve"> </w:t>
+      </w:r>
+      <w:hyperlink r:id="rId102">
+        <w:r>
+          <w:rPr>
+            <w:rStyle w:val="Hyperlink"/>
+          </w:rPr>
+          <w:t xml:space="preserve">https://doi.org/10.1145/3272127.3275084</w:t>
+        </w:r>
+      </w:hyperlink>
+      <w:r>
+        <w:t xml:space="preserve">.</w:t>
+      </w:r>
+    </w:p>
+    <w:bookmarkEnd w:id="103"/>
+    <w:bookmarkStart w:id="105" w:name="ref-huang2024scgs"/>
     <w:p>
       <w:pPr>
         <w:pStyle w:val="Bibliography"/>
@@ -11829,7 +12035,7 @@
       <w:r>
         <w:t xml:space="preserve"> </w:t>
       </w:r>
-      <w:hyperlink r:id="rId99">
+      <w:hyperlink r:id="rId104">
         <w:r>
           <w:rPr>
             <w:rStyle w:val="Hyperlink"/>
@@ -11841,8 +12047,8 @@
         <w:t xml:space="preserve">.</w:t>
       </w:r>
     </w:p>
-    <w:bookmarkEnd w:id="100"/>
-    <w:bookmarkStart w:id="101" w:name="ref-keetha2024splatam"/>
+    <w:bookmarkEnd w:id="105"/>
+    <w:bookmarkStart w:id="106" w:name="ref-keetha2024splatam"/>
     <w:p>
       <w:pPr>
         <w:pStyle w:val="Bibliography"/>
@@ -11876,8 +12082,8 @@
         <w:t xml:space="preserve">, 21357–66.</w:t>
       </w:r>
     </w:p>
-    <w:bookmarkEnd w:id="101"/>
-    <w:bookmarkStart w:id="103" w:name="ref-kerbl2023gaussians"/>
+    <w:bookmarkEnd w:id="106"/>
+    <w:bookmarkStart w:id="108" w:name="ref-kerbl2023gaussians"/>
     <w:p>
       <w:pPr>
         <w:pStyle w:val="Bibliography"/>
@@ -11910,7 +12116,7 @@
       <w:r>
         <w:t xml:space="preserve"> </w:t>
       </w:r>
-      <w:hyperlink r:id="rId102">
+      <w:hyperlink r:id="rId107">
         <w:r>
           <w:rPr>
             <w:rStyle w:val="Hyperlink"/>
@@ -11922,8 +12128,54 @@
         <w:t xml:space="preserve">.</w:t>
       </w:r>
     </w:p>
-    <w:bookmarkEnd w:id="103"/>
-    <w:bookmarkStart w:id="105" w:name="ref-luiten2024dynamic3dgaussians"/>
+    <w:bookmarkEnd w:id="108"/>
+    <w:bookmarkStart w:id="110" w:name="ref-knapitsch2017tandt"/>
+    <w:p>
+      <w:pPr>
+        <w:pStyle w:val="Bibliography"/>
+      </w:pPr>
+      <w:r>
+        <w:t xml:space="preserve">Knapitsch, Arno, Jaesik Park, Qian-Yi Zhou, and Vladlen Koltun. 2017.</w:t>
+      </w:r>
+      <w:r>
+        <w:t xml:space="preserve"> </w:t>
+      </w:r>
+      <w:r>
+        <w:t xml:space="preserve">“Tanks and Temples: Benchmarking Large-Scale Scene Reconstruction.”</w:t>
+      </w:r>
+      <w:r>
+        <w:t xml:space="preserve"> </w:t>
+      </w:r>
+      <w:r>
+        <w:rPr>
+          <w:iCs/>
+          <w:i/>
+        </w:rPr>
+        <w:t xml:space="preserve">ACM Transactions on Graphics</w:t>
+      </w:r>
+      <w:r>
+        <w:t xml:space="preserve"> </w:t>
+      </w:r>
+      <w:r>
+        <w:t xml:space="preserve">36 (4).</w:t>
+      </w:r>
+      <w:r>
+        <w:t xml:space="preserve"> </w:t>
+      </w:r>
+      <w:hyperlink r:id="rId109">
+        <w:r>
+          <w:rPr>
+            <w:rStyle w:val="Hyperlink"/>
+          </w:rPr>
+          <w:t xml:space="preserve">https://doi.org/10.1145/3072959.3073599</w:t>
+        </w:r>
+      </w:hyperlink>
+      <w:r>
+        <w:t xml:space="preserve">.</w:t>
+      </w:r>
+    </w:p>
+    <w:bookmarkEnd w:id="110"/>
+    <w:bookmarkStart w:id="112" w:name="ref-luiten2024dynamic3dgaussians"/>
     <w:p>
       <w:pPr>
         <w:pStyle w:val="Bibliography"/>
@@ -11959,7 +12211,7 @@
       <w:r>
         <w:t xml:space="preserve"> </w:t>
       </w:r>
-      <w:hyperlink r:id="rId104">
+      <w:hyperlink r:id="rId111">
         <w:r>
           <w:rPr>
             <w:rStyle w:val="Hyperlink"/>
@@ -11971,8 +12223,8 @@
         <w:t xml:space="preserve">.</w:t>
       </w:r>
     </w:p>
-    <w:bookmarkEnd w:id="105"/>
-    <w:bookmarkStart w:id="107" w:name="ref-matsuki2024monogs"/>
+    <w:bookmarkEnd w:id="112"/>
+    <w:bookmarkStart w:id="114" w:name="ref-matsuki2024monogs"/>
     <w:p>
       <w:pPr>
         <w:pStyle w:val="Bibliography"/>
@@ -12008,7 +12260,7 @@
       <w:r>
         <w:t xml:space="preserve"> </w:t>
       </w:r>
-      <w:hyperlink r:id="rId106">
+      <w:hyperlink r:id="rId113">
         <w:r>
           <w:rPr>
             <w:rStyle w:val="Hyperlink"/>
@@ -12020,8 +12272,8 @@
         <w:t xml:space="preserve">.</w:t>
       </w:r>
     </w:p>
-    <w:bookmarkEnd w:id="107"/>
-    <w:bookmarkStart w:id="108" w:name="ref-mildenhall2020nerf"/>
+    <w:bookmarkEnd w:id="114"/>
+    <w:bookmarkStart w:id="115" w:name="ref-mildenhall2020nerf"/>
     <w:p>
       <w:pPr>
         <w:pStyle w:val="Bibliography"/>
@@ -12055,8 +12307,8 @@
         <w:t xml:space="preserve">, 405–21.</w:t>
       </w:r>
     </w:p>
-    <w:bookmarkEnd w:id="108"/>
-    <w:bookmarkStart w:id="109" w:name="ref-newcombe2011kinectfusion"/>
+    <w:bookmarkEnd w:id="115"/>
+    <w:bookmarkStart w:id="116" w:name="ref-newcombe2011kinectfusion"/>
     <w:p>
       <w:pPr>
         <w:pStyle w:val="Bibliography"/>
@@ -12090,8 +12342,8 @@
         <w:t xml:space="preserve">, 127–36.</w:t>
       </w:r>
     </w:p>
-    <w:bookmarkEnd w:id="109"/>
-    <w:bookmarkStart w:id="111" w:name="ref-oden2001goal"/>
+    <w:bookmarkEnd w:id="116"/>
+    <w:bookmarkStart w:id="118" w:name="ref-oden2001goal"/>
     <w:p>
       <w:pPr>
         <w:pStyle w:val="Bibliography"/>
@@ -12124,7 +12376,7 @@
       <w:r>
         <w:t xml:space="preserve"> </w:t>
       </w:r>
-      <w:hyperlink r:id="rId110">
+      <w:hyperlink r:id="rId117">
         <w:r>
           <w:rPr>
             <w:rStyle w:val="Hyperlink"/>
@@ -12136,8 +12388,8 @@
         <w:t xml:space="preserve">.</w:t>
       </w:r>
     </w:p>
-    <w:bookmarkEnd w:id="111"/>
-    <w:bookmarkStart w:id="112" w:name="ref-palazzolo2019refusion"/>
+    <w:bookmarkEnd w:id="118"/>
+    <w:bookmarkStart w:id="119" w:name="ref-palazzolo2019refusion"/>
     <w:p>
       <w:pPr>
         <w:pStyle w:val="Bibliography"/>
@@ -12183,8 +12435,8 @@
         <w:t xml:space="preserve">.</w:t>
       </w:r>
     </w:p>
-    <w:bookmarkEnd w:id="112"/>
-    <w:bookmarkStart w:id="114" w:name="ref-pfister2000surfels"/>
+    <w:bookmarkEnd w:id="119"/>
+    <w:bookmarkStart w:id="121" w:name="ref-pfister2000surfels"/>
     <w:p>
       <w:pPr>
         <w:pStyle w:val="Bibliography"/>
@@ -12220,7 +12472,7 @@
       <w:r>
         <w:t xml:space="preserve"> </w:t>
       </w:r>
-      <w:hyperlink r:id="rId113">
+      <w:hyperlink r:id="rId120">
         <w:r>
           <w:rPr>
             <w:rStyle w:val="Hyperlink"/>
@@ -12232,8 +12484,8 @@
         <w:t xml:space="preserve">.</w:t>
       </w:r>
     </w:p>
-    <w:bookmarkEnd w:id="114"/>
-    <w:bookmarkStart w:id="116" w:name="ref-sucar2021imap"/>
+    <w:bookmarkEnd w:id="121"/>
+    <w:bookmarkStart w:id="123" w:name="ref-sucar2021imap"/>
     <w:p>
       <w:pPr>
         <w:pStyle w:val="Bibliography"/>
@@ -12269,7 +12521,7 @@
       <w:r>
         <w:t xml:space="preserve"> </w:t>
       </w:r>
-      <w:hyperlink r:id="rId115">
+      <w:hyperlink r:id="rId122">
         <w:r>
           <w:rPr>
             <w:rStyle w:val="Hyperlink"/>
@@ -12281,8 +12533,8 @@
         <w:t xml:space="preserve">.</w:t>
       </w:r>
     </w:p>
-    <w:bookmarkEnd w:id="116"/>
-    <w:bookmarkStart w:id="117" w:name="ref-wald2019rio"/>
+    <w:bookmarkEnd w:id="123"/>
+    <w:bookmarkStart w:id="124" w:name="ref-wald2019rio"/>
     <w:p>
       <w:pPr>
         <w:pStyle w:val="Bibliography"/>
@@ -12316,8 +12568,8 @@
         <w:t xml:space="preserve">, 7658–67.</w:t>
       </w:r>
     </w:p>
-    <w:bookmarkEnd w:id="117"/>
-    <w:bookmarkStart w:id="118" w:name="ref-whelan2015elasticfusion"/>
+    <w:bookmarkEnd w:id="124"/>
+    <w:bookmarkStart w:id="125" w:name="ref-whelan2015elasticfusion"/>
     <w:p>
       <w:pPr>
         <w:pStyle w:val="Bibliography"/>
@@ -12351,8 +12603,8 @@
         <w:t xml:space="preserve">.</w:t>
       </w:r>
     </w:p>
-    <w:bookmarkEnd w:id="118"/>
-    <w:bookmarkStart w:id="120" w:name="ref-woerister2013lazy"/>
+    <w:bookmarkEnd w:id="125"/>
+    <w:bookmarkStart w:id="127" w:name="ref-woerister2013lazy"/>
     <w:p>
       <w:pPr>
         <w:pStyle w:val="Bibliography"/>
@@ -12388,7 +12640,7 @@
       <w:r>
         <w:t xml:space="preserve"> </w:t>
       </w:r>
-      <w:hyperlink r:id="rId119">
+      <w:hyperlink r:id="rId126">
         <w:r>
           <w:rPr>
             <w:rStyle w:val="Hyperlink"/>
@@ -12400,8 +12652,8 @@
         <w:t xml:space="preserve">.</w:t>
       </w:r>
     </w:p>
-    <w:bookmarkEnd w:id="120"/>
-    <w:bookmarkStart w:id="122" w:name="ref-wu2024fourDGS"/>
+    <w:bookmarkEnd w:id="127"/>
+    <w:bookmarkStart w:id="129" w:name="ref-wu2024fourDGS"/>
     <w:p>
       <w:pPr>
         <w:pStyle w:val="Bibliography"/>
@@ -12437,7 +12689,7 @@
       <w:r>
         <w:t xml:space="preserve"> </w:t>
       </w:r>
-      <w:hyperlink r:id="rId121">
+      <w:hyperlink r:id="rId128">
         <w:r>
           <w:rPr>
             <w:rStyle w:val="Hyperlink"/>
@@ -12449,8 +12701,8 @@
         <w:t xml:space="preserve">.</w:t>
       </w:r>
     </w:p>
-    <w:bookmarkEnd w:id="122"/>
-    <w:bookmarkStart w:id="123" w:name="ref-wu2026cif"/>
+    <w:bookmarkEnd w:id="129"/>
+    <w:bookmarkStart w:id="130" w:name="ref-wu2026cif"/>
     <w:p>
       <w:pPr>
         <w:pStyle w:val="Bibliography"/>
@@ -12484,8 +12736,8 @@
         <w:t xml:space="preserve">, 3783–93.</w:t>
       </w:r>
     </w:p>
-    <w:bookmarkEnd w:id="123"/>
-    <w:bookmarkStart w:id="124" w:name="ref-yugay2026game"/>
+    <w:bookmarkEnd w:id="130"/>
+    <w:bookmarkStart w:id="131" w:name="ref-yugay2026game"/>
     <w:p>
       <w:pPr>
         <w:pStyle w:val="Bibliography"/>
@@ -12519,8 +12771,8 @@
         <w:t xml:space="preserve">, 18903–12.</w:t>
       </w:r>
     </w:p>
-    <w:bookmarkEnd w:id="124"/>
-    <w:bookmarkStart w:id="126" w:name="ref-zeng2025gaussianupdate"/>
+    <w:bookmarkEnd w:id="131"/>
+    <w:bookmarkStart w:id="133" w:name="ref-zeng2025gaussianupdate"/>
     <w:p>
       <w:pPr>
         <w:pStyle w:val="Bibliography"/>
@@ -12556,7 +12808,7 @@
       <w:r>
         <w:t xml:space="preserve"> </w:t>
       </w:r>
-      <w:hyperlink r:id="rId125">
+      <w:hyperlink r:id="rId132">
         <w:r>
           <w:rPr>
             <w:rStyle w:val="Hyperlink"/>
@@ -12568,8 +12820,8 @@
         <w:t xml:space="preserve">.</w:t>
       </w:r>
     </w:p>
-    <w:bookmarkEnd w:id="126"/>
-    <w:bookmarkStart w:id="127" w:name="ref-zhu2022niceslam"/>
+    <w:bookmarkEnd w:id="133"/>
+    <w:bookmarkStart w:id="134" w:name="ref-zhu2022niceslam"/>
     <w:p>
       <w:pPr>
         <w:pStyle w:val="Bibliography"/>
@@ -12603,10 +12855,10 @@
         <w:t xml:space="preserve">, 12786–96.</w:t>
       </w:r>
     </w:p>
-    <w:bookmarkEnd w:id="127"/>
-    <w:bookmarkEnd w:id="128"/>
-    <w:bookmarkEnd w:id="129"/>
-    <w:bookmarkEnd w:id="130"/>
+    <w:bookmarkEnd w:id="134"/>
+    <w:bookmarkEnd w:id="135"/>
+    <w:bookmarkEnd w:id="136"/>
+    <w:bookmarkEnd w:id="137"/>
     <w:sectPr>
       <w:pgSz w:w="12240" w:h="15840"/>
       <w:pgMar w:top="1008" w:bottom="1008" w:left="1008" w:right="1008"/>

</xml_diff>

<commit_message>
paper: define MAVEB/AETHER and credit source datasets (#121)
Clarify CBRC/MAVEB/AETHER terminology at first use and in implementation, explicitly identify the 13 pretrained GraphDECO scene lineage, add provider-requested dataset citations and acknowledgments, and regenerate the synchronized manuscript artifacts.
</commit_message>
<xml_diff>
--- a/researchpaper/MAVEB_manuscript.docx
+++ b/researchpaper/MAVEB_manuscript.docx
@@ -116,7 +116,7 @@
         <w:t xml:space="preserve"> </w:t>
       </w:r>
       <w:r>
-        <w:t xml:space="preserve">(CBRC), implemented in MAVEB, a fail-closed revision rule that combines exact structural closure, conservative finite-change bounds, output tolerances, work-aware selection, automatic</w:t>
+        <w:t xml:space="preserve">(CBRC), a fail-closed revision rule that combines exact structural closure, conservative finite-change bounds, output tolerances, work-aware selection, automatic</w:t>
       </w:r>
       <w:r>
         <w:t xml:space="preserve"> </w:t>
@@ -131,7 +131,7 @@
         <w:t xml:space="preserve"> </w:t>
       </w:r>
       <w:r>
-        <w:t xml:space="preserve">fallback, and independent full-after verification. A local repair is accepted only when the unrecomputed exterior stays within tolerance and the repair remains cheaper than rebuilding.</w:t>
+        <w:t xml:space="preserve">fallback, and independent full-after verification. We evaluate CBRC in MAVEB, a research prototype built on AETHER, a C++23 persistent-world stack for reconstruction, Gaussian rendering, revision tracking, GPU publication, temporal state, and evidence capture. A local repair is accepted only when the unrecomputed exterior stays within tolerance and the repair remains cheaper than rebuilding.</w:t>
       </w:r>
     </w:p>
     <w:p>
@@ -365,7 +365,7 @@
         <w:pStyle w:val="BodyText"/>
       </w:pPr>
       <w:r>
-        <w:t xml:space="preserve">MAVEB implements this design as a C++23 persistent-world stack, alongside a dense Python reference certifier and an independent full-after Gaussian oracle. Figure 1 summarizes the decision path, while Figure 2 shows the support-selection idea visually. The implementation records immutable before/after revision sidecars, deterministic certificate JSON, per-domain work, and oracle replay. Planner output alone is insufficient evidence of safety. Instead, the unrepaired exterior implied by the chosen support is compared with an independently rendered</w:t>
+        <w:t xml:space="preserve">MAVEB is the research system used to evaluate CBRC; AETHER is the underlying C++23 persistent-world engine stack. AETHER owns reconstruction and Gaussian state, revision transactions, GPU publication, temporal state, and provenance/evidence capture, while a dense Python reference certifier and an independent full-after Gaussian oracle provide separate validation paths. Figure 1 summarizes the decision path, while Figure 2 shows the support-selection idea visually. The implementation records immutable before/after revision sidecars, deterministic certificate JSON, per-domain work, and oracle replay. Planner output alone is insufficient evidence of safety. Instead, the unrepaired exterior implied by the chosen support is compared with an independently rendered</w:t>
       </w:r>
       <w:r>
         <w:t xml:space="preserve"> </w:t>
@@ -7011,7 +7011,7 @@
         <w:pStyle w:val="FirstParagraph"/>
       </w:pPr>
       <w:r>
-        <w:t xml:space="preserve">MAVEB keeps the scientific reference path separate from the production-oriented execution path. The dense Python certifier follows the mathematical contract directly and serves as a falsification and regression reference. The native C++23 implementation uses a sparse typed revision graph, sparse analytic propagation over supported DAG exteriors, exact predecessor checks, greedy feasible-cone search, and deterministic certificate serialization. For the frozen campaign, the bound production output-cone graph is evaluated by both the native planner and the Python reference planner; their final decisions are compared rather than assumed equivalent.</w:t>
+        <w:t xml:space="preserve">Throughout this section, MAVEB names the experimental CBRC research system and AETHER names its underlying native persistent-world software stack. MAVEB keeps the scientific reference path separate from the production-oriented AETHER execution path. The dense Python certifier follows the mathematical contract directly and serves as a falsification and regression reference. The native C++23 AETHER implementation uses a sparse typed revision graph, sparse analytic propagation over supported DAG exteriors, exact predecessor checks, greedy feasible-cone search, and deterministic certificate serialization. For the frozen campaign, the bound production output-cone graph is evaluated by both the native planner and the Python reference planner; their final decisions are compared rather than assumed equivalent.</w:t>
       </w:r>
     </w:p>
     <w:bookmarkStart w:id="51" w:name="revision-transactions."/>
@@ -7127,7 +7127,34 @@
         <w:t xml:space="preserve"> </w:t>
       </w:r>
       <w:r>
-        <w:t xml:space="preserve">use dataset-native geometry seeded into deterministic Gaussian fields after the public capture assets are normalized into the benchmark coordinate convention. Thirteen GraphDECO scenes use pinned trained 3DGS representations and preserve spherical-harmonic coefficients, opacity, anisotropic scale, and rotation</w:t>
+        <w:t xml:space="preserve">use dataset-native geometry seeded into deterministic Gaussian fields after the public capture assets are normalized into the benchmark coordinate convention. Thirteen scenes use pinned pretrained GraphDECO 3DGS representations from the standard evaluation suite: nine Mip-NeRF 360 scenes</w:t>
+      </w:r>
+      <w:r>
+        <w:t xml:space="preserve"> </w:t>
+      </w:r>
+      <w:r>
+        <w:t xml:space="preserve">(Barron et al. 2022)</w:t>
+      </w:r>
+      <w:r>
+        <w:t xml:space="preserve">, Train and Truck from Tanks &amp; Temples</w:t>
+      </w:r>
+      <w:r>
+        <w:t xml:space="preserve"> </w:t>
+      </w:r>
+      <w:r>
+        <w:t xml:space="preserve">(Knapitsch et al. 2017)</w:t>
+      </w:r>
+      <w:r>
+        <w:t xml:space="preserve">, and Dr Johnson and Playroom from Deep Blending</w:t>
+      </w:r>
+      <w:r>
+        <w:t xml:space="preserve"> </w:t>
+      </w:r>
+      <w:r>
+        <w:t xml:space="preserve">(Hedman et al. 2018)</w:t>
+      </w:r>
+      <w:r>
+        <w:t xml:space="preserve">; the Gaussian representations preserve spherical-harmonic coefficients, opacity, anisotropic scale, and rotation</w:t>
       </w:r>
       <w:r>
         <w:t xml:space="preserve"> </w:t>
@@ -7274,13 +7301,13 @@
         <w:t xml:space="preserve">(Palazzolo et al. 2019)</w:t>
       </w:r>
       <w:r>
-        <w:t xml:space="preserve">, and 195 cases on 13 pinned trained GraphDECO 3DGS scenes</w:t>
-      </w:r>
-      <w:r>
-        <w:t xml:space="preserve"> </w:t>
-      </w:r>
-      <w:r>
-        <w:t xml:space="preserve">(Kerbl et al. 2023)</w:t>
+        <w:t xml:space="preserve">, and 195 cases on 13 pinned pretrained GraphDECO 3DGS scenes drawn from Mip-NeRF 360, Tanks &amp; Temples, and Deep Blending</w:t>
+      </w:r>
+      <w:r>
+        <w:t xml:space="preserve"> </w:t>
+      </w:r>
+      <w:r>
+        <w:t xml:space="preserve">(Kerbl et al. 2023; Barron et al. 2022; Knapitsch et al. 2017; Hedman et al. 2018)</w:t>
       </w:r>
       <w:r>
         <w:t xml:space="preserve">. Every scene contributes the same 15-case coupling template, while edit family rotates through translation, rotation, uniform scale, and opacity. The frozen protocol therefore separates outcome inspection from threshold or case construction.</w:t>
@@ -11395,7 +11422,7 @@
       </w:r>
     </w:p>
     <w:bookmarkEnd w:id="85"/>
-    <w:bookmarkStart w:id="130" w:name="acknowledgments"/>
+    <w:bookmarkStart w:id="137" w:name="acknowledgments"/>
     <w:p>
       <w:pPr>
         <w:pStyle w:val="Heading1"/>
@@ -11404,12 +11431,96 @@
         <w:t xml:space="preserve">Acknowledgments</w:t>
       </w:r>
     </w:p>
-    <w:bookmarkStart w:id="129" w:name="generative-ai-use-disclosure."/>
+    <w:bookmarkStart w:id="86" w:name="dataset-acknowledgments."/>
     <w:p>
       <w:pPr>
         <w:pStyle w:val="Heading4"/>
       </w:pPr>
       <w:r>
+        <w:t xml:space="preserve">Dataset acknowledgments.</w:t>
+      </w:r>
+    </w:p>
+    <w:p>
+      <w:pPr>
+        <w:pStyle w:val="FirstParagraph"/>
+      </w:pPr>
+      <w:r>
+        <w:t xml:space="preserve">We thank the authors and maintainers of 3RScan</w:t>
+      </w:r>
+      <w:r>
+        <w:t xml:space="preserve"> </w:t>
+      </w:r>
+      <w:r>
+        <w:t xml:space="preserve">(Wald et al. 2019)</w:t>
+      </w:r>
+      <w:r>
+        <w:t xml:space="preserve">, ARKitScenes</w:t>
+      </w:r>
+      <w:r>
+        <w:t xml:space="preserve"> </w:t>
+      </w:r>
+      <w:r>
+        <w:t xml:space="preserve">(Baruch et al. 2021)</w:t>
+      </w:r>
+      <w:r>
+        <w:t xml:space="preserve">, and the Bonn RGB-D Dynamic Dataset</w:t>
+      </w:r>
+      <w:r>
+        <w:t xml:space="preserve"> </w:t>
+      </w:r>
+      <w:r>
+        <w:t xml:space="preserve">(Palazzolo et al. 2019)</w:t>
+      </w:r>
+      <w:r>
+        <w:t xml:space="preserve"> </w:t>
+      </w:r>
+      <w:r>
+        <w:t xml:space="preserve">for making their data available for research. We also use pretrained 3DGS models released by GraphDECO</w:t>
+      </w:r>
+      <w:r>
+        <w:t xml:space="preserve"> </w:t>
+      </w:r>
+      <w:r>
+        <w:t xml:space="preserve">(Kerbl et al. 2023)</w:t>
+      </w:r>
+      <w:r>
+        <w:t xml:space="preserve">. Their source scenes come from Mip-NeRF 360</w:t>
+      </w:r>
+      <w:r>
+        <w:t xml:space="preserve"> </w:t>
+      </w:r>
+      <w:r>
+        <w:t xml:space="preserve">(Barron et al. 2022)</w:t>
+      </w:r>
+      <w:r>
+        <w:t xml:space="preserve">, Tanks &amp; Temples</w:t>
+      </w:r>
+      <w:r>
+        <w:t xml:space="preserve"> </w:t>
+      </w:r>
+      <w:r>
+        <w:t xml:space="preserve">(Knapitsch et al. 2017)</w:t>
+      </w:r>
+      <w:r>
+        <w:t xml:space="preserve">, and Deep Blending</w:t>
+      </w:r>
+      <w:r>
+        <w:t xml:space="preserve"> </w:t>
+      </w:r>
+      <w:r>
+        <w:t xml:space="preserve">(Hedman et al. 2018)</w:t>
+      </w:r>
+      <w:r>
+        <w:t xml:space="preserve">. These citations follow the dataset providers’ requested publication references; upstream assets remain under their original terms and are not redistributed with this repository.</w:t>
+      </w:r>
+    </w:p>
+    <w:bookmarkEnd w:id="86"/>
+    <w:bookmarkStart w:id="136" w:name="generative-ai-use-disclosure."/>
+    <w:p>
+      <w:pPr>
+        <w:pStyle w:val="Heading4"/>
+      </w:pPr>
+      <w:r>
         <w:t xml:space="preserve">Generative AI use disclosure.</w:t>
       </w:r>
     </w:p>
@@ -11421,8 +11532,8 @@
         <w:t xml:space="preserve">OpenAI ChatGPT was used for literature-search support, software and scripting assistance, debugging, experiment planning, visualization and manuscript tooling, and drafting or language editing. Reported measurements and frozen evidence came from project software and experimental artifacts. The author is responsible for the code, citations, analysis, claims, conclusions, and final text; no generative AI system is listed as an author.</w:t>
       </w:r>
     </w:p>
-    <w:bookmarkStart w:id="128" w:name="refs"/>
-    <w:bookmarkStart w:id="87" w:name="ref-acar2013selfadjusting"/>
+    <w:bookmarkStart w:id="135" w:name="refs"/>
+    <w:bookmarkStart w:id="88" w:name="ref-acar2013selfadjusting"/>
     <w:p>
       <w:pPr>
         <w:pStyle w:val="Bibliography"/>
@@ -11455,7 +11566,7 @@
       <w:r>
         <w:t xml:space="preserve"> </w:t>
       </w:r>
-      <w:hyperlink r:id="rId86">
+      <w:hyperlink r:id="rId87">
         <w:r>
           <w:rPr>
             <w:rStyle w:val="Hyperlink"/>
@@ -11467,8 +11578,8 @@
         <w:t xml:space="preserve">.</w:t>
       </w:r>
     </w:p>
-    <w:bookmarkEnd w:id="87"/>
-    <w:bookmarkStart w:id="88" w:name="ref-ackermann2025clsplats"/>
+    <w:bookmarkEnd w:id="88"/>
+    <w:bookmarkStart w:id="89" w:name="ref-ackermann2025clsplats"/>
     <w:p>
       <w:pPr>
         <w:pStyle w:val="Bibliography"/>
@@ -11502,8 +11613,8 @@
         <w:t xml:space="preserve">, 7808–17.</w:t>
       </w:r>
     </w:p>
-    <w:bookmarkEnd w:id="88"/>
-    <w:bookmarkStart w:id="90" w:name="ref-bala1999raysegment"/>
+    <w:bookmarkEnd w:id="89"/>
+    <w:bookmarkStart w:id="91" w:name="ref-bala1999raysegment"/>
     <w:p>
       <w:pPr>
         <w:pStyle w:val="Bibliography"/>
@@ -11539,7 +11650,7 @@
       <w:r>
         <w:t xml:space="preserve"> </w:t>
       </w:r>
-      <w:hyperlink r:id="rId89">
+      <w:hyperlink r:id="rId90">
         <w:r>
           <w:rPr>
             <w:rStyle w:val="Hyperlink"/>
@@ -11551,8 +11662,57 @@
         <w:t xml:space="preserve">.</w:t>
       </w:r>
     </w:p>
-    <w:bookmarkEnd w:id="90"/>
-    <w:bookmarkStart w:id="91" w:name="ref-baruch2021arkitscenes"/>
+    <w:bookmarkEnd w:id="91"/>
+    <w:bookmarkStart w:id="93" w:name="ref-barron2022mipnerf360"/>
+    <w:p>
+      <w:pPr>
+        <w:pStyle w:val="Bibliography"/>
+      </w:pPr>
+      <w:r>
+        <w:t xml:space="preserve">Barron, Jonathan T., Ben Mildenhall, Dor Verbin, Pratul P. Srinivasan, and Peter Hedman. 2022.</w:t>
+      </w:r>
+      <w:r>
+        <w:t xml:space="preserve"> </w:t>
+      </w:r>
+      <w:r>
+        <w:t xml:space="preserve">“Mip-NeRF 360: Unbounded Anti-Aliased Neural Radiance Fields.”</w:t>
+      </w:r>
+      <w:r>
+        <w:t xml:space="preserve"> </w:t>
+      </w:r>
+      <w:r>
+        <w:t xml:space="preserve">In</w:t>
+      </w:r>
+      <w:r>
+        <w:t xml:space="preserve"> </w:t>
+      </w:r>
+      <w:r>
+        <w:rPr>
+          <w:iCs/>
+          <w:i/>
+        </w:rPr>
+        <w:t xml:space="preserve">Proceedings of the IEEE/CVF Conference on Computer Vision and Pattern Recognition</w:t>
+      </w:r>
+      <w:r>
+        <w:t xml:space="preserve">, 5470–79.</w:t>
+      </w:r>
+      <w:r>
+        <w:t xml:space="preserve"> </w:t>
+      </w:r>
+      <w:hyperlink r:id="rId92">
+        <w:r>
+          <w:rPr>
+            <w:rStyle w:val="Hyperlink"/>
+          </w:rPr>
+          <w:t xml:space="preserve">https://doi.org/10.1109/CVPR52688.2022.00539</w:t>
+        </w:r>
+      </w:hyperlink>
+      <w:r>
+        <w:t xml:space="preserve">.</w:t>
+      </w:r>
+    </w:p>
+    <w:bookmarkEnd w:id="93"/>
+    <w:bookmarkStart w:id="94" w:name="ref-baruch2021arkitscenes"/>
     <w:p>
       <w:pPr>
         <w:pStyle w:val="Bibliography"/>
@@ -11604,8 +11764,8 @@
         <w:t xml:space="preserve">.</w:t>
       </w:r>
     </w:p>
-    <w:bookmarkEnd w:id="91"/>
-    <w:bookmarkStart w:id="93" w:name="ref-chen2024gaussianeditor"/>
+    <w:bookmarkEnd w:id="94"/>
+    <w:bookmarkStart w:id="96" w:name="ref-chen2024gaussianeditor"/>
     <w:p>
       <w:pPr>
         <w:pStyle w:val="Bibliography"/>
@@ -11641,7 +11801,7 @@
       <w:r>
         <w:t xml:space="preserve"> </w:t>
       </w:r>
-      <w:hyperlink r:id="rId92">
+      <w:hyperlink r:id="rId95">
         <w:r>
           <w:rPr>
             <w:rStyle w:val="Hyperlink"/>
@@ -11653,8 +11813,8 @@
         <w:t xml:space="preserve">.</w:t>
       </w:r>
     </w:p>
-    <w:bookmarkEnd w:id="93"/>
-    <w:bookmarkStart w:id="94" w:name="ref-curless1996volumetric"/>
+    <w:bookmarkEnd w:id="96"/>
+    <w:bookmarkStart w:id="97" w:name="ref-curless1996volumetric"/>
     <w:p>
       <w:pPr>
         <w:pStyle w:val="Bibliography"/>
@@ -11688,8 +11848,8 @@
         <w:t xml:space="preserve">, 303–12.</w:t>
       </w:r>
     </w:p>
-    <w:bookmarkEnd w:id="94"/>
-    <w:bookmarkStart w:id="96" w:name="ref-dai2017bundlefusion"/>
+    <w:bookmarkEnd w:id="97"/>
+    <w:bookmarkStart w:id="99" w:name="ref-dai2017bundlefusion"/>
     <w:p>
       <w:pPr>
         <w:pStyle w:val="Bibliography"/>
@@ -11722,7 +11882,7 @@
       <w:r>
         <w:t xml:space="preserve"> </w:t>
       </w:r>
-      <w:hyperlink r:id="rId95">
+      <w:hyperlink r:id="rId98">
         <w:r>
           <w:rPr>
             <w:rStyle w:val="Hyperlink"/>
@@ -11734,8 +11894,8 @@
         <w:t xml:space="preserve">.</w:t>
       </w:r>
     </w:p>
-    <w:bookmarkEnd w:id="96"/>
-    <w:bookmarkStart w:id="97" w:name="ref-ellensohn2026eligsir"/>
+    <w:bookmarkEnd w:id="99"/>
+    <w:bookmarkStart w:id="100" w:name="ref-ellensohn2026eligsir"/>
     <w:p>
       <w:pPr>
         <w:pStyle w:val="Bibliography"/>
@@ -11763,8 +11923,8 @@
         <w:t xml:space="preserve">.</w:t>
       </w:r>
     </w:p>
-    <w:bookmarkEnd w:id="97"/>
-    <w:bookmarkStart w:id="98" w:name="ref-galappaththige2026pixels"/>
+    <w:bookmarkEnd w:id="100"/>
+    <w:bookmarkStart w:id="101" w:name="ref-galappaththige2026pixels"/>
     <w:p>
       <w:pPr>
         <w:pStyle w:val="Bibliography"/>
@@ -11792,8 +11952,54 @@
         <w:t xml:space="preserve">.</w:t>
       </w:r>
     </w:p>
-    <w:bookmarkEnd w:id="98"/>
-    <w:bookmarkStart w:id="100" w:name="ref-huang2024scgs"/>
+    <w:bookmarkEnd w:id="101"/>
+    <w:bookmarkStart w:id="103" w:name="ref-hedman2018deepblending"/>
+    <w:p>
+      <w:pPr>
+        <w:pStyle w:val="Bibliography"/>
+      </w:pPr>
+      <w:r>
+        <w:t xml:space="preserve">Hedman, Peter, Julien Philip, True Price, Jan-Michael Frahm, George Drettakis, and Gabriel J. Brostow. 2018.</w:t>
+      </w:r>
+      <w:r>
+        <w:t xml:space="preserve"> </w:t>
+      </w:r>
+      <w:r>
+        <w:t xml:space="preserve">“Deep Blending for Free-Viewpoint Image-Based Rendering.”</w:t>
+      </w:r>
+      <w:r>
+        <w:t xml:space="preserve"> </w:t>
+      </w:r>
+      <w:r>
+        <w:rPr>
+          <w:iCs/>
+          <w:i/>
+        </w:rPr>
+        <w:t xml:space="preserve">ACM Transactions on Graphics</w:t>
+      </w:r>
+      <w:r>
+        <w:t xml:space="preserve"> </w:t>
+      </w:r>
+      <w:r>
+        <w:t xml:space="preserve">37 (6): 257:1–15.</w:t>
+      </w:r>
+      <w:r>
+        <w:t xml:space="preserve"> </w:t>
+      </w:r>
+      <w:hyperlink r:id="rId102">
+        <w:r>
+          <w:rPr>
+            <w:rStyle w:val="Hyperlink"/>
+          </w:rPr>
+          <w:t xml:space="preserve">https://doi.org/10.1145/3272127.3275084</w:t>
+        </w:r>
+      </w:hyperlink>
+      <w:r>
+        <w:t xml:space="preserve">.</w:t>
+      </w:r>
+    </w:p>
+    <w:bookmarkEnd w:id="103"/>
+    <w:bookmarkStart w:id="105" w:name="ref-huang2024scgs"/>
     <w:p>
       <w:pPr>
         <w:pStyle w:val="Bibliography"/>
@@ -11829,7 +12035,7 @@
       <w:r>
         <w:t xml:space="preserve"> </w:t>
       </w:r>
-      <w:hyperlink r:id="rId99">
+      <w:hyperlink r:id="rId104">
         <w:r>
           <w:rPr>
             <w:rStyle w:val="Hyperlink"/>
@@ -11841,8 +12047,8 @@
         <w:t xml:space="preserve">.</w:t>
       </w:r>
     </w:p>
-    <w:bookmarkEnd w:id="100"/>
-    <w:bookmarkStart w:id="101" w:name="ref-keetha2024splatam"/>
+    <w:bookmarkEnd w:id="105"/>
+    <w:bookmarkStart w:id="106" w:name="ref-keetha2024splatam"/>
     <w:p>
       <w:pPr>
         <w:pStyle w:val="Bibliography"/>
@@ -11876,8 +12082,8 @@
         <w:t xml:space="preserve">, 21357–66.</w:t>
       </w:r>
     </w:p>
-    <w:bookmarkEnd w:id="101"/>
-    <w:bookmarkStart w:id="103" w:name="ref-kerbl2023gaussians"/>
+    <w:bookmarkEnd w:id="106"/>
+    <w:bookmarkStart w:id="108" w:name="ref-kerbl2023gaussians"/>
     <w:p>
       <w:pPr>
         <w:pStyle w:val="Bibliography"/>
@@ -11910,7 +12116,7 @@
       <w:r>
         <w:t xml:space="preserve"> </w:t>
       </w:r>
-      <w:hyperlink r:id="rId102">
+      <w:hyperlink r:id="rId107">
         <w:r>
           <w:rPr>
             <w:rStyle w:val="Hyperlink"/>
@@ -11922,8 +12128,54 @@
         <w:t xml:space="preserve">.</w:t>
       </w:r>
     </w:p>
-    <w:bookmarkEnd w:id="103"/>
-    <w:bookmarkStart w:id="105" w:name="ref-luiten2024dynamic3dgaussians"/>
+    <w:bookmarkEnd w:id="108"/>
+    <w:bookmarkStart w:id="110" w:name="ref-knapitsch2017tandt"/>
+    <w:p>
+      <w:pPr>
+        <w:pStyle w:val="Bibliography"/>
+      </w:pPr>
+      <w:r>
+        <w:t xml:space="preserve">Knapitsch, Arno, Jaesik Park, Qian-Yi Zhou, and Vladlen Koltun. 2017.</w:t>
+      </w:r>
+      <w:r>
+        <w:t xml:space="preserve"> </w:t>
+      </w:r>
+      <w:r>
+        <w:t xml:space="preserve">“Tanks and Temples: Benchmarking Large-Scale Scene Reconstruction.”</w:t>
+      </w:r>
+      <w:r>
+        <w:t xml:space="preserve"> </w:t>
+      </w:r>
+      <w:r>
+        <w:rPr>
+          <w:iCs/>
+          <w:i/>
+        </w:rPr>
+        <w:t xml:space="preserve">ACM Transactions on Graphics</w:t>
+      </w:r>
+      <w:r>
+        <w:t xml:space="preserve"> </w:t>
+      </w:r>
+      <w:r>
+        <w:t xml:space="preserve">36 (4).</w:t>
+      </w:r>
+      <w:r>
+        <w:t xml:space="preserve"> </w:t>
+      </w:r>
+      <w:hyperlink r:id="rId109">
+        <w:r>
+          <w:rPr>
+            <w:rStyle w:val="Hyperlink"/>
+          </w:rPr>
+          <w:t xml:space="preserve">https://doi.org/10.1145/3072959.3073599</w:t>
+        </w:r>
+      </w:hyperlink>
+      <w:r>
+        <w:t xml:space="preserve">.</w:t>
+      </w:r>
+    </w:p>
+    <w:bookmarkEnd w:id="110"/>
+    <w:bookmarkStart w:id="112" w:name="ref-luiten2024dynamic3dgaussians"/>
     <w:p>
       <w:pPr>
         <w:pStyle w:val="Bibliography"/>
@@ -11959,7 +12211,7 @@
       <w:r>
         <w:t xml:space="preserve"> </w:t>
       </w:r>
-      <w:hyperlink r:id="rId104">
+      <w:hyperlink r:id="rId111">
         <w:r>
           <w:rPr>
             <w:rStyle w:val="Hyperlink"/>
@@ -11971,8 +12223,8 @@
         <w:t xml:space="preserve">.</w:t>
       </w:r>
     </w:p>
-    <w:bookmarkEnd w:id="105"/>
-    <w:bookmarkStart w:id="107" w:name="ref-matsuki2024monogs"/>
+    <w:bookmarkEnd w:id="112"/>
+    <w:bookmarkStart w:id="114" w:name="ref-matsuki2024monogs"/>
     <w:p>
       <w:pPr>
         <w:pStyle w:val="Bibliography"/>
@@ -12008,7 +12260,7 @@
       <w:r>
         <w:t xml:space="preserve"> </w:t>
       </w:r>
-      <w:hyperlink r:id="rId106">
+      <w:hyperlink r:id="rId113">
         <w:r>
           <w:rPr>
             <w:rStyle w:val="Hyperlink"/>
@@ -12020,8 +12272,8 @@
         <w:t xml:space="preserve">.</w:t>
       </w:r>
     </w:p>
-    <w:bookmarkEnd w:id="107"/>
-    <w:bookmarkStart w:id="108" w:name="ref-mildenhall2020nerf"/>
+    <w:bookmarkEnd w:id="114"/>
+    <w:bookmarkStart w:id="115" w:name="ref-mildenhall2020nerf"/>
     <w:p>
       <w:pPr>
         <w:pStyle w:val="Bibliography"/>
@@ -12055,8 +12307,8 @@
         <w:t xml:space="preserve">, 405–21.</w:t>
       </w:r>
     </w:p>
-    <w:bookmarkEnd w:id="108"/>
-    <w:bookmarkStart w:id="109" w:name="ref-newcombe2011kinectfusion"/>
+    <w:bookmarkEnd w:id="115"/>
+    <w:bookmarkStart w:id="116" w:name="ref-newcombe2011kinectfusion"/>
     <w:p>
       <w:pPr>
         <w:pStyle w:val="Bibliography"/>
@@ -12090,8 +12342,8 @@
         <w:t xml:space="preserve">, 127–36.</w:t>
       </w:r>
     </w:p>
-    <w:bookmarkEnd w:id="109"/>
-    <w:bookmarkStart w:id="111" w:name="ref-oden2001goal"/>
+    <w:bookmarkEnd w:id="116"/>
+    <w:bookmarkStart w:id="118" w:name="ref-oden2001goal"/>
     <w:p>
       <w:pPr>
         <w:pStyle w:val="Bibliography"/>
@@ -12124,7 +12376,7 @@
       <w:r>
         <w:t xml:space="preserve"> </w:t>
       </w:r>
-      <w:hyperlink r:id="rId110">
+      <w:hyperlink r:id="rId117">
         <w:r>
           <w:rPr>
             <w:rStyle w:val="Hyperlink"/>
@@ -12136,8 +12388,8 @@
         <w:t xml:space="preserve">.</w:t>
       </w:r>
     </w:p>
-    <w:bookmarkEnd w:id="111"/>
-    <w:bookmarkStart w:id="112" w:name="ref-palazzolo2019refusion"/>
+    <w:bookmarkEnd w:id="118"/>
+    <w:bookmarkStart w:id="119" w:name="ref-palazzolo2019refusion"/>
     <w:p>
       <w:pPr>
         <w:pStyle w:val="Bibliography"/>
@@ -12183,8 +12435,8 @@
         <w:t xml:space="preserve">.</w:t>
       </w:r>
     </w:p>
-    <w:bookmarkEnd w:id="112"/>
-    <w:bookmarkStart w:id="114" w:name="ref-pfister2000surfels"/>
+    <w:bookmarkEnd w:id="119"/>
+    <w:bookmarkStart w:id="121" w:name="ref-pfister2000surfels"/>
     <w:p>
       <w:pPr>
         <w:pStyle w:val="Bibliography"/>
@@ -12220,7 +12472,7 @@
       <w:r>
         <w:t xml:space="preserve"> </w:t>
       </w:r>
-      <w:hyperlink r:id="rId113">
+      <w:hyperlink r:id="rId120">
         <w:r>
           <w:rPr>
             <w:rStyle w:val="Hyperlink"/>
@@ -12232,8 +12484,8 @@
         <w:t xml:space="preserve">.</w:t>
       </w:r>
     </w:p>
-    <w:bookmarkEnd w:id="114"/>
-    <w:bookmarkStart w:id="116" w:name="ref-sucar2021imap"/>
+    <w:bookmarkEnd w:id="121"/>
+    <w:bookmarkStart w:id="123" w:name="ref-sucar2021imap"/>
     <w:p>
       <w:pPr>
         <w:pStyle w:val="Bibliography"/>
@@ -12269,7 +12521,7 @@
       <w:r>
         <w:t xml:space="preserve"> </w:t>
       </w:r>
-      <w:hyperlink r:id="rId115">
+      <w:hyperlink r:id="rId122">
         <w:r>
           <w:rPr>
             <w:rStyle w:val="Hyperlink"/>
@@ -12281,8 +12533,8 @@
         <w:t xml:space="preserve">.</w:t>
       </w:r>
     </w:p>
-    <w:bookmarkEnd w:id="116"/>
-    <w:bookmarkStart w:id="117" w:name="ref-wald2019rio"/>
+    <w:bookmarkEnd w:id="123"/>
+    <w:bookmarkStart w:id="124" w:name="ref-wald2019rio"/>
     <w:p>
       <w:pPr>
         <w:pStyle w:val="Bibliography"/>
@@ -12316,8 +12568,8 @@
         <w:t xml:space="preserve">, 7658–67.</w:t>
       </w:r>
     </w:p>
-    <w:bookmarkEnd w:id="117"/>
-    <w:bookmarkStart w:id="118" w:name="ref-whelan2015elasticfusion"/>
+    <w:bookmarkEnd w:id="124"/>
+    <w:bookmarkStart w:id="125" w:name="ref-whelan2015elasticfusion"/>
     <w:p>
       <w:pPr>
         <w:pStyle w:val="Bibliography"/>
@@ -12351,8 +12603,8 @@
         <w:t xml:space="preserve">.</w:t>
       </w:r>
     </w:p>
-    <w:bookmarkEnd w:id="118"/>
-    <w:bookmarkStart w:id="120" w:name="ref-woerister2013lazy"/>
+    <w:bookmarkEnd w:id="125"/>
+    <w:bookmarkStart w:id="127" w:name="ref-woerister2013lazy"/>
     <w:p>
       <w:pPr>
         <w:pStyle w:val="Bibliography"/>
@@ -12388,7 +12640,7 @@
       <w:r>
         <w:t xml:space="preserve"> </w:t>
       </w:r>
-      <w:hyperlink r:id="rId119">
+      <w:hyperlink r:id="rId126">
         <w:r>
           <w:rPr>
             <w:rStyle w:val="Hyperlink"/>
@@ -12400,8 +12652,8 @@
         <w:t xml:space="preserve">.</w:t>
       </w:r>
     </w:p>
-    <w:bookmarkEnd w:id="120"/>
-    <w:bookmarkStart w:id="122" w:name="ref-wu2024fourDGS"/>
+    <w:bookmarkEnd w:id="127"/>
+    <w:bookmarkStart w:id="129" w:name="ref-wu2024fourDGS"/>
     <w:p>
       <w:pPr>
         <w:pStyle w:val="Bibliography"/>
@@ -12437,7 +12689,7 @@
       <w:r>
         <w:t xml:space="preserve"> </w:t>
       </w:r>
-      <w:hyperlink r:id="rId121">
+      <w:hyperlink r:id="rId128">
         <w:r>
           <w:rPr>
             <w:rStyle w:val="Hyperlink"/>
@@ -12449,8 +12701,8 @@
         <w:t xml:space="preserve">.</w:t>
       </w:r>
     </w:p>
-    <w:bookmarkEnd w:id="122"/>
-    <w:bookmarkStart w:id="123" w:name="ref-wu2026cif"/>
+    <w:bookmarkEnd w:id="129"/>
+    <w:bookmarkStart w:id="130" w:name="ref-wu2026cif"/>
     <w:p>
       <w:pPr>
         <w:pStyle w:val="Bibliography"/>
@@ -12484,8 +12736,8 @@
         <w:t xml:space="preserve">, 3783–93.</w:t>
       </w:r>
     </w:p>
-    <w:bookmarkEnd w:id="123"/>
-    <w:bookmarkStart w:id="124" w:name="ref-yugay2026game"/>
+    <w:bookmarkEnd w:id="130"/>
+    <w:bookmarkStart w:id="131" w:name="ref-yugay2026game"/>
     <w:p>
       <w:pPr>
         <w:pStyle w:val="Bibliography"/>
@@ -12519,8 +12771,8 @@
         <w:t xml:space="preserve">, 18903–12.</w:t>
       </w:r>
     </w:p>
-    <w:bookmarkEnd w:id="124"/>
-    <w:bookmarkStart w:id="126" w:name="ref-zeng2025gaussianupdate"/>
+    <w:bookmarkEnd w:id="131"/>
+    <w:bookmarkStart w:id="133" w:name="ref-zeng2025gaussianupdate"/>
     <w:p>
       <w:pPr>
         <w:pStyle w:val="Bibliography"/>
@@ -12556,7 +12808,7 @@
       <w:r>
         <w:t xml:space="preserve"> </w:t>
       </w:r>
-      <w:hyperlink r:id="rId125">
+      <w:hyperlink r:id="rId132">
         <w:r>
           <w:rPr>
             <w:rStyle w:val="Hyperlink"/>
@@ -12568,8 +12820,8 @@
         <w:t xml:space="preserve">.</w:t>
       </w:r>
     </w:p>
-    <w:bookmarkEnd w:id="126"/>
-    <w:bookmarkStart w:id="127" w:name="ref-zhu2022niceslam"/>
+    <w:bookmarkEnd w:id="133"/>
+    <w:bookmarkStart w:id="134" w:name="ref-zhu2022niceslam"/>
     <w:p>
       <w:pPr>
         <w:pStyle w:val="Bibliography"/>
@@ -12603,10 +12855,10 @@
         <w:t xml:space="preserve">, 12786–96.</w:t>
       </w:r>
     </w:p>
-    <w:bookmarkEnd w:id="127"/>
-    <w:bookmarkEnd w:id="128"/>
-    <w:bookmarkEnd w:id="129"/>
-    <w:bookmarkEnd w:id="130"/>
+    <w:bookmarkEnd w:id="134"/>
+    <w:bookmarkEnd w:id="135"/>
+    <w:bookmarkEnd w:id="136"/>
+    <w:bookmarkEnd w:id="137"/>
     <w:sectPr>
       <w:pgSz w:w="12240" w:h="15840"/>
       <w:pgMar w:top="1008" w:bottom="1008" w:left="1008" w:right="1008"/>

</xml_diff>

<commit_message>
paper: tighten prose and reduce metric repetition (#122)
Prose-only cleanup of the final MAVEB manuscript: reduce repetitive negation/contrast framing, keep dense metrics in Results, simplify repeated headline packets, preserve statistical guardrails, and include synchronized PDF/DOCX/package artifacts.
</commit_message>
<xml_diff>
--- a/researchpaper/MAVEB_manuscript.docx
+++ b/researchpaper/MAVEB_manuscript.docx
@@ -139,7 +139,7 @@
         <w:pStyle w:val="BodyText"/>
       </w:pPr>
       <w:r>
-        <w:t xml:space="preserve">The base evaluation contains 1,275 revisions over 85 scenes spanning 3RScan, ARKitScenes, Bonn RGB-D Dynamic, and trained GraphDECO 3DGS. It yields 935 local repairs, 340 full rebuilds, zero observed certificate violations, and median calibrated selected work of 0.474 of a rebuild. We then test measurable approximation separately. An immutable diagnostic shows that the original image certificate rejects every non-zero residual. An opacity-delta Lipschitz refinement restores certified non-zero locality in a four-scene mechanism study. A separate outcome-blind confirmation repeats the unchanged mechanism on 20 independently selected scenes and 3,840 pooled parameter cases. Non-zero opacity locality and tolerance crossover occur in all 20 scenes and all four dataset families, while the translation control remains at zero. The scene-level opacity-minus-translation difference is 0.477 with a dataset-stratified bootstrap 95% interval of [0.432, 0.517], with no observed certificate violation. The certificate remains conservative, leaving certificate tightening as an explicit limitation. The result is selective maintenance tied to an output-error contract and reproducible fallback rather than heuristic locality.</w:t>
+        <w:t xml:space="preserve">The base evaluation spans 1,275 revisions over 85 scenes across 3RScan, ARKitScenes, Bonn RGB-D Dynamic, and trained GraphDECO 3DGS. It exercises local repair and automatic full fallback with no observed certificate violation; median calibrated selected work is 0.474 of a rebuild. Because this campaign is exact at the audited raster, we test bounded non-zero residuals separately. A diagnostic exposes the original image certificate as too conservative. An opacity-delta Lipschitz refinement restores certified non-zero locality in a four-scene mechanism study, then an outcome-blind confirmation repeats the mechanism on 20 independently selected scenes across all four dataset families. Non-zero opacity locality and tolerance crossover appear in every confirmatory scene while translation remains at zero; the paired scene-level difference is 0.477 with a dataset-stratified bootstrap 95% interval of [0.432, 0.517]. Certificate tightness remains open. Together, the experiments show selective maintenance under an explicit output-error contract with reproducible fallback.</w:t>
       </w:r>
     </w:p>
     <w:bookmarkEnd w:id="20"/>
@@ -704,7 +704,22 @@
         <w:pStyle w:val="BodyText"/>
       </w:pPr>
       <w:r>
-        <w:t xml:space="preserve">Before examining aggregate outcomes, we fixed the evaluation protocol and claim boundaries. Across 1,275 revisions over 85 scenes, CBRC selects 935 local repairs and 340 rebuilds with zero observed certificate violations. The study covers 3RScan, ARKitScenes, Bonn dynamic RGB-D sequences, and 13 pinned trained 3DGS scenes, with translation, rotation, uniform-scale, and opacity edits. Median calibrated selected work is 0.47447 of</w:t>
+        <w:t xml:space="preserve">Before examining aggregate outcomes, we fixed the evaluation protocol and claim boundaries. The broad campaign spans four dataset families, seeded and trained Gaussian representations, and four edit types; it exercises both</w:t>
+      </w:r>
+      <w:r>
+        <w:t xml:space="preserve"> </w:t>
+      </w:r>
+      <w:r>
+        <w:rPr>
+          <w:smallCaps/>
+        </w:rPr>
+        <w:t xml:space="preserve">Local</w:t>
+      </w:r>
+      <w:r>
+        <w:t xml:space="preserve"> </w:t>
+      </w:r>
+      <w:r>
+        <w:t xml:space="preserve">and</w:t>
       </w:r>
       <w:r>
         <w:t xml:space="preserve"> </w:t>
@@ -719,19 +734,7 @@
         <w:t xml:space="preserve"> </w:t>
       </w:r>
       <w:r>
-        <w:t xml:space="preserve">(bootstrap 95% CI 0.46657–0.47885). Mild coupling usually preserves locality; stronger interactions increasingly trigger the fail-closed path. Every selected render matches the independent</w:t>
-      </w:r>
-      <w:r>
-        <w:t xml:space="preserve"> </w:t>
-      </w:r>
-      <w:r>
-        <w:rPr>
-          <w:smallCaps/>
-        </w:rPr>
-        <w:t xml:space="preserve">Full</w:t>
-      </w:r>
-      <w:r>
-        <w:t xml:space="preserve">-after reference on the evaluated views.</w:t>
+        <w:t xml:space="preserve">outcomes and validates every selected result against independent full-after replay. Detailed counts, confidence intervals, and work ratios appear in Section 7. The central behavior is that stronger coupling increasingly drives the fail-closed path while selected outputs remain consistent with the independent reference.</w:t>
       </w:r>
     </w:p>
     <w:p>
@@ -739,7 +742,7 @@
         <w:pStyle w:val="BodyText"/>
       </w:pPr>
       <w:r>
-        <w:t xml:space="preserve">That broad campaign deliberately uses exact selected-to-full agreement, so it cannot by itself show that a bounded non-zero residual can remain local. We study that question in a second, frozen line of experiments. The first diagnostic exposes a limitation in the original image certificate; a mechanism study changes only that certificate for opacity residuals and keeps translation as a control; a final confirmatory study repeats the unchanged mechanism on five independently ranked scenes from each of the same four dataset families. This staged design keeps diagnosis, mechanism change, and confirmation separate rather than tuning one campaign until it succeeds.</w:t>
+        <w:t xml:space="preserve">The broad campaign deliberately uses exact selected-to-full agreement, which leaves bounded non-zero residuals untested. A second frozen experiment line addresses that question: a diagnostic identifies the original certificate bottleneck, a mechanism study changes only the opacity residual certificate while retaining translation as a control, and a final confirmatory study repeats the unchanged mechanism on independently ranked scenes from the same four dataset families. This staging separates diagnosis, mechanism change, and confirmation and prevents the same campaign from serving as both tuning and evidence.</w:t>
       </w:r>
     </w:p>
     <w:p>
@@ -1014,7 +1017,7 @@
         <w:t xml:space="preserve"> </w:t>
       </w:r>
       <w:r>
-        <w:t xml:space="preserve">rebuild (B). Blue marks the intended edit, yellow the selected repair support. The supplied image is reproduced unchanged. Its 28.40% work ratio, 3.5</w:t>
+        <w:t xml:space="preserve">rebuild (B). Blue marks the intended edit, yellow the selected repair support. The supplied image is reproduced unchanged. Its embedded 28.40% work ratio, 3.5</w:t>
       </w:r>
       <m:oMath>
         <m:r>
@@ -1028,7 +1031,205 @@
         <w:t xml:space="preserve"> </w:t>
       </w:r>
       <w:r>
-        <w:t xml:space="preserve">work reduction, and other embedded micro-metrics are illustrative rather than aggregate campaign results. The paper-grade headline is a median work ratio of 0.47447 of</w:t>
+        <w:t xml:space="preserve">work reduction, and other micro-metrics are illustrative values from the graphic and are separate from the aggregate campaign estimates reported in Section 7. Correctness labels in the image apply under the declared bound assumptions and revision domain; the figure makes no wall-clock or universal-safety claim.</w:t>
+      </w:r>
+    </w:p>
+    <w:bookmarkEnd w:id="27"/>
+    <w:bookmarkStart w:id="33" w:name="related-work"/>
+    <w:p>
+      <w:pPr>
+        <w:pStyle w:val="Heading1"/>
+      </w:pPr>
+      <w:r>
+        <w:rPr>
+          <w:rStyle w:val="SectionNumber"/>
+        </w:rPr>
+        <w:t xml:space="preserve">2</w:t>
+      </w:r>
+      <w:r>
+        <w:tab/>
+      </w:r>
+      <w:r>
+        <w:t xml:space="preserve">Related Work</w:t>
+      </w:r>
+    </w:p>
+    <w:bookmarkStart w:id="28" w:name="X7ef29dd87079df7b5a17d2af2f85395d10b4d19"/>
+    <w:p>
+      <w:pPr>
+        <w:pStyle w:val="Heading4"/>
+      </w:pPr>
+      <w:r>
+        <w:t xml:space="preserve">Persistent reconstruction and map maintenance.</w:t>
+      </w:r>
+    </w:p>
+    <w:p>
+      <w:pPr>
+        <w:pStyle w:val="FirstParagraph"/>
+      </w:pPr>
+      <w:r>
+        <w:t xml:space="preserve">Volumetric integration gave reconstruction systems a durable way to accumulate range observations</w:t>
+      </w:r>
+      <w:r>
+        <w:t xml:space="preserve"> </w:t>
+      </w:r>
+      <w:r>
+        <w:t xml:space="preserve">(Curless and Levoy 1996)</w:t>
+      </w:r>
+      <w:r>
+        <w:t xml:space="preserve">, and surfels offered an explicit point-oriented alternative</w:t>
+      </w:r>
+      <w:r>
+        <w:t xml:space="preserve"> </w:t>
+      </w:r>
+      <w:r>
+        <w:t xml:space="preserve">(Pfister et al. 2000)</w:t>
+      </w:r>
+      <w:r>
+        <w:t xml:space="preserve">. KinectFusion later showed real-time dense fusion and tracking</w:t>
+      </w:r>
+      <w:r>
+        <w:t xml:space="preserve"> </w:t>
+      </w:r>
+      <w:r>
+        <w:t xml:space="preserve">(Newcombe et al. 2011)</w:t>
+      </w:r>
+      <w:r>
+        <w:t xml:space="preserve">; ElasticFusion maintained and corrected dense surfel maps without a conventional pose graph</w:t>
+      </w:r>
+      <w:r>
+        <w:t xml:space="preserve"> </w:t>
+      </w:r>
+      <w:r>
+        <w:t xml:space="preserve">(Whelan et al. 2015)</w:t>
+      </w:r>
+      <w:r>
+        <w:t xml:space="preserve">; and BundleFusion reintegrated surfaces online while maintaining global consistency</w:t>
+      </w:r>
+      <w:r>
+        <w:t xml:space="preserve"> </w:t>
+      </w:r>
+      <w:r>
+        <w:t xml:space="preserve">(Dai et al. 2017)</w:t>
+      </w:r>
+      <w:r>
+        <w:t xml:space="preserve">. All of these systems make map state persistent enough that revision becomes meaningful, although their update rules are closely tied to the reconstruction or consistency mechanism itself. CBRC looks at the revision one level above that: which derived state really has to be recomputed, what may remain outside it, and at what point should the incremental attempt be abandoned.</w:t>
+      </w:r>
+    </w:p>
+    <w:bookmarkEnd w:id="28"/>
+    <w:bookmarkStart w:id="29" w:name="neural-and-gaussian-mapping."/>
+    <w:p>
+      <w:pPr>
+        <w:pStyle w:val="Heading4"/>
+      </w:pPr>
+      <w:r>
+        <w:t xml:space="preserve">Neural and Gaussian mapping.</w:t>
+      </w:r>
+    </w:p>
+    <w:p>
+      <w:pPr>
+        <w:pStyle w:val="FirstParagraph"/>
+      </w:pPr>
+      <w:r>
+        <w:t xml:space="preserve">NeRF established continuous neural radiance fields for novel-view synthesis</w:t>
+      </w:r>
+      <w:r>
+        <w:t xml:space="preserve"> </w:t>
+      </w:r>
+      <w:r>
+        <w:t xml:space="preserve">(Mildenhall et al. 2020)</w:t>
+      </w:r>
+      <w:r>
+        <w:t xml:space="preserve">, while iMAP and NICE-SLAM brought learned implicit representations into online mapping and SLAM</w:t>
+      </w:r>
+      <w:r>
+        <w:t xml:space="preserve"> </w:t>
+      </w:r>
+      <w:r>
+        <w:t xml:space="preserve">(Sucar et al. 2021; Zhu et al. 2022)</w:t>
+      </w:r>
+      <w:r>
+        <w:t xml:space="preserve">. 3D Gaussian Splatting (3DGS) moved back toward an explicit anisotropic representation while retaining real-time rendering</w:t>
+      </w:r>
+      <w:r>
+        <w:t xml:space="preserve"> </w:t>
+      </w:r>
+      <w:r>
+        <w:t xml:space="preserve">(Kerbl et al. 2023)</w:t>
+      </w:r>
+      <w:r>
+        <w:t xml:space="preserve">; SplaTAM and Gaussian Splatting SLAM then adapted Gaussian state to online RGB-D and monocular mapping</w:t>
+      </w:r>
+      <w:r>
+        <w:t xml:space="preserve"> </w:t>
+      </w:r>
+      <w:r>
+        <w:t xml:space="preserve">(Keetha et al. 2024; Matsuki et al. 2024)</w:t>
+      </w:r>
+      <w:r>
+        <w:t xml:space="preserve">. Dynamic 3D Gaussians and 4D-GS extend the representation over time</w:t>
+      </w:r>
+      <w:r>
+        <w:t xml:space="preserve"> </w:t>
+      </w:r>
+      <w:r>
+        <w:t xml:space="preserve">(Luiten et al. 2024; G. Wu et al. 2024)</w:t>
+      </w:r>
+      <w:r>
+        <w:t xml:space="preserve">. These representations make revision especially tangible because individual persistent primitives and their support are exposed. Still, the CBRC formulation itself is representation-agnostic.</w:t>
+      </w:r>
+    </w:p>
+    <w:bookmarkEnd w:id="29"/>
+    <w:bookmarkStart w:id="30" w:name="continual-and-evolving-gaussian-scenes."/>
+    <w:p>
+      <w:pPr>
+        <w:pStyle w:val="Heading4"/>
+      </w:pPr>
+      <w:r>
+        <w:t xml:space="preserve">Continual and evolving Gaussian scenes.</w:t>
+      </w:r>
+    </w:p>
+    <w:p>
+      <w:pPr>
+        <w:pStyle w:val="FirstParagraph"/>
+      </w:pPr>
+      <w:r>
+        <w:t xml:space="preserve">CL-Splats separates changed and static scene components so that Gaussian optimization can stay focused while older scene states are preserved</w:t>
+      </w:r>
+      <w:r>
+        <w:t xml:space="preserve"> </w:t>
+      </w:r>
+      <w:r>
+        <w:t xml:space="preserve">(Ackermann et al. 2025)</w:t>
+      </w:r>
+      <w:r>
+        <w:t xml:space="preserve">. GaussianUpdate uses change-specific update strategies and visibility-aware replay for continual radiance fields</w:t>
+      </w:r>
+      <w:r>
+        <w:t xml:space="preserve"> </w:t>
+      </w:r>
+      <w:r>
+        <w:t xml:space="preserve">(Zeng et al. 2025)</w:t>
+      </w:r>
+      <w:r>
+        <w:t xml:space="preserve">. GaME addresses long-term evolving RGB-D scenes by adapting the Gaussian map while managing stale observations</w:t>
+      </w:r>
+      <w:r>
+        <w:t xml:space="preserve"> </w:t>
+      </w:r>
+      <w:r>
+        <w:t xml:space="preserve">(Yugay et al. 2026)</w:t>
+      </w:r>
+      <w:r>
+        <w:t xml:space="preserve">, and EliGSiR studies continual Gaussian mapping under a bounded compute budget through adaptive view scheduling, supervision fidelity, and geometry growth</w:t>
+      </w:r>
+      <w:r>
+        <w:t xml:space="preserve"> </w:t>
+      </w:r>
+      <w:r>
+        <w:t xml:space="preserve">(Ellensohn, Rueckert, and Rauch 2026)</w:t>
+      </w:r>
+      <w:r>
+        <w:t xml:space="preserve">. Local updating of changing Gaussian scenes is therefore established prior art. The distinction in CBRC is the contract it enforces: cross-representation exact dependencies and conservative output bounds are checked together, locality is admitted under Eq. 1, and</w:t>
       </w:r>
       <w:r>
         <w:t xml:space="preserve"> </w:t>
@@ -1043,35 +1244,17 @@
         <w:t xml:space="preserve"> </w:t>
       </w:r>
       <w:r>
-        <w:t xml:space="preserve">(52.55% lower calibrated work; Section 7). Statements of correctness in the image apply only under the bound assumptions and declared revision domain; neither these work factors nor the image establish wall-clock speedup or universal safety.</w:t>
-      </w:r>
-    </w:p>
-    <w:bookmarkEnd w:id="27"/>
-    <w:bookmarkStart w:id="33" w:name="related-work"/>
-    <w:p>
-      <w:pPr>
-        <w:pStyle w:val="Heading1"/>
-      </w:pPr>
-      <w:r>
-        <w:rPr>
-          <w:rStyle w:val="SectionNumber"/>
-        </w:rPr>
-        <w:t xml:space="preserve">2</w:t>
-      </w:r>
-      <w:r>
-        <w:tab/>
-      </w:r>
-      <w:r>
-        <w:t xml:space="preserve">Related Work</w:t>
-      </w:r>
-    </w:p>
-    <w:bookmarkStart w:id="28" w:name="X7ef29dd87079df7b5a17d2af2f85395d10b4d19"/>
+        <w:t xml:space="preserve">remains an explicit outcome when certification or the work comparison fails.</w:t>
+      </w:r>
+    </w:p>
+    <w:bookmarkEnd w:id="30"/>
+    <w:bookmarkStart w:id="31" w:name="editing-change-detection-and-identity."/>
     <w:p>
       <w:pPr>
         <w:pStyle w:val="Heading4"/>
       </w:pPr>
       <w:r>
-        <w:t xml:space="preserve">Persistent reconstruction and map maintenance.</w:t>
+        <w:t xml:space="preserve">Editing, change detection, and identity.</w:t>
       </w:r>
     </w:p>
     <w:p>
@@ -1079,62 +1262,44 @@
         <w:pStyle w:val="FirstParagraph"/>
       </w:pPr>
       <w:r>
-        <w:t xml:space="preserve">Volumetric integration gave reconstruction systems a durable way to accumulate range observations</w:t>
-      </w:r>
-      <w:r>
-        <w:t xml:space="preserve"> </w:t>
-      </w:r>
-      <w:r>
-        <w:t xml:space="preserve">(Curless and Levoy 1996)</w:t>
-      </w:r>
-      <w:r>
-        <w:t xml:space="preserve">, and surfels offered an explicit point-oriented alternative</w:t>
-      </w:r>
-      <w:r>
-        <w:t xml:space="preserve"> </w:t>
-      </w:r>
-      <w:r>
-        <w:t xml:space="preserve">(Pfister et al. 2000)</w:t>
-      </w:r>
-      <w:r>
-        <w:t xml:space="preserve">. KinectFusion later showed real-time dense fusion and tracking</w:t>
-      </w:r>
-      <w:r>
-        <w:t xml:space="preserve"> </w:t>
-      </w:r>
-      <w:r>
-        <w:t xml:space="preserve">(Newcombe et al. 2011)</w:t>
-      </w:r>
-      <w:r>
-        <w:t xml:space="preserve">; ElasticFusion maintained and corrected dense surfel maps without a conventional pose graph</w:t>
-      </w:r>
-      <w:r>
-        <w:t xml:space="preserve"> </w:t>
-      </w:r>
-      <w:r>
-        <w:t xml:space="preserve">(Whelan et al. 2015)</w:t>
-      </w:r>
-      <w:r>
-        <w:t xml:space="preserve">; and BundleFusion reintegrated surfaces online while maintaining global consistency</w:t>
-      </w:r>
-      <w:r>
-        <w:t xml:space="preserve"> </w:t>
-      </w:r>
-      <w:r>
-        <w:t xml:space="preserve">(Dai et al. 2017)</w:t>
-      </w:r>
-      <w:r>
-        <w:t xml:space="preserve">. All of these systems make map state persistent enough that revision becomes meaningful, although their update rules are closely tied to the reconstruction or consistency mechanism itself. CBRC looks at the revision one level above that: which derived state really has to be recomputed, what may remain outside it, and at what point should the incremental attempt be abandoned.</w:t>
-      </w:r>
-    </w:p>
-    <w:bookmarkEnd w:id="28"/>
-    <w:bookmarkStart w:id="29" w:name="neural-and-gaussian-mapping."/>
+        <w:t xml:space="preserve">GaussianEditor and SC-GS demonstrate precise, controllable local editing of Gaussian representations</w:t>
+      </w:r>
+      <w:r>
+        <w:t xml:space="preserve"> </w:t>
+      </w:r>
+      <w:r>
+        <w:t xml:space="preserve">(Chen et al. 2024; Huang et al. 2024)</w:t>
+      </w:r>
+      <w:r>
+        <w:t xml:space="preserve">. Primitive-space change detection further suggests that Gaussian attributes themselves can reveal structural and appearance changes</w:t>
+      </w:r>
+      <w:r>
+        <w:t xml:space="preserve"> </w:t>
+      </w:r>
+      <w:r>
+        <w:t xml:space="preserve">(Galappaththige et al. 2026)</w:t>
+      </w:r>
+      <w:r>
+        <w:t xml:space="preserve">, while Consistent Instance Field studies persistent probabilistic identity in dynamic Gaussian scenes</w:t>
+      </w:r>
+      <w:r>
+        <w:t xml:space="preserve"> </w:t>
+      </w:r>
+      <w:r>
+        <w:t xml:space="preserve">(J. Wu et al. 2026)</w:t>
+      </w:r>
+      <w:r>
+        <w:t xml:space="preserve">. These works set a clear boundary for our contribution. Local editing, primitive-level change detection, and persistent identity are upstream capabilities; CBRC begins after a revision has been specified or detected and asks which derived state may safely remain unrepaired for a protected output.</w:t>
+      </w:r>
+    </w:p>
+    <w:bookmarkEnd w:id="31"/>
+    <w:bookmarkStart w:id="32" w:name="Xe058922cb2ad9f50eb5d0cc67129a8e54cd7c86"/>
     <w:p>
       <w:pPr>
         <w:pStyle w:val="Heading4"/>
       </w:pPr>
       <w:r>
-        <w:t xml:space="preserve">Neural and Gaussian mapping.</w:t>
+        <w:t xml:space="preserve">Incremental rendering, change propagation, and goal-oriented error control.</w:t>
       </w:r>
     </w:p>
     <w:p>
@@ -1142,106 +1307,51 @@
         <w:pStyle w:val="FirstParagraph"/>
       </w:pPr>
       <w:r>
-        <w:t xml:space="preserve">NeRF established continuous neural radiance fields for novel-view synthesis</w:t>
-      </w:r>
-      <w:r>
-        <w:t xml:space="preserve"> </w:t>
-      </w:r>
-      <w:r>
-        <w:t xml:space="preserve">(Mildenhall et al. 2020)</w:t>
-      </w:r>
-      <w:r>
-        <w:t xml:space="preserve">, while iMAP and NICE-SLAM brought learned implicit representations into online mapping and SLAM</w:t>
-      </w:r>
-      <w:r>
-        <w:t xml:space="preserve"> </w:t>
-      </w:r>
-      <w:r>
-        <w:t xml:space="preserve">(Sucar et al. 2021; Zhu et al. 2022)</w:t>
-      </w:r>
-      <w:r>
-        <w:t xml:space="preserve">. 3D Gaussian Splatting (3DGS) moved back toward an explicit anisotropic representation while retaining real-time rendering</w:t>
-      </w:r>
-      <w:r>
-        <w:t xml:space="preserve"> </w:t>
-      </w:r>
-      <w:r>
-        <w:t xml:space="preserve">(Kerbl et al. 2023)</w:t>
-      </w:r>
-      <w:r>
-        <w:t xml:space="preserve">; SplaTAM and Gaussian Splatting SLAM then adapted Gaussian state to online RGB-D and monocular mapping</w:t>
-      </w:r>
-      <w:r>
-        <w:t xml:space="preserve"> </w:t>
-      </w:r>
-      <w:r>
-        <w:t xml:space="preserve">(Keetha et al. 2024; Matsuki et al. 2024)</w:t>
-      </w:r>
-      <w:r>
-        <w:t xml:space="preserve">. Dynamic 3D Gaussians and 4D-GS extend the representation over time</w:t>
-      </w:r>
-      <w:r>
-        <w:t xml:space="preserve"> </w:t>
-      </w:r>
-      <w:r>
-        <w:t xml:space="preserve">(Luiten et al. 2024; G. Wu et al. 2024)</w:t>
-      </w:r>
-      <w:r>
-        <w:t xml:space="preserve">. These representations make revision especially tangible because individual persistent primitives and their support are exposed. Still, the CBRC formulation itself is representation-agnostic.</w:t>
-      </w:r>
-    </w:p>
-    <w:bookmarkEnd w:id="29"/>
-    <w:bookmarkStart w:id="30" w:name="continual-and-evolving-gaussian-scenes."/>
-    <w:p>
-      <w:pPr>
-        <w:pStyle w:val="Heading4"/>
-      </w:pPr>
-      <w:r>
-        <w:t xml:space="preserve">Continual and evolving Gaussian scenes.</w:t>
-      </w:r>
-    </w:p>
-    <w:p>
-      <w:pPr>
-        <w:pStyle w:val="FirstParagraph"/>
-      </w:pPr>
-      <w:r>
-        <w:t xml:space="preserve">CL-Splats separates changed and static scene components so that Gaussian optimization can stay focused while older scene states are preserved</w:t>
-      </w:r>
-      <w:r>
-        <w:t xml:space="preserve"> </w:t>
-      </w:r>
-      <w:r>
-        <w:t xml:space="preserve">(Ackermann et al. 2025)</w:t>
-      </w:r>
-      <w:r>
-        <w:t xml:space="preserve">. GaussianUpdate uses change-specific update strategies and visibility-aware replay for continual radiance fields</w:t>
-      </w:r>
-      <w:r>
-        <w:t xml:space="preserve"> </w:t>
-      </w:r>
-      <w:r>
-        <w:t xml:space="preserve">(Zeng et al. 2025)</w:t>
-      </w:r>
-      <w:r>
-        <w:t xml:space="preserve">. GaME addresses long-term evolving RGB-D scenes by adapting the Gaussian map while managing stale observations</w:t>
-      </w:r>
-      <w:r>
-        <w:t xml:space="preserve"> </w:t>
-      </w:r>
-      <w:r>
-        <w:t xml:space="preserve">(Yugay et al. 2026)</w:t>
-      </w:r>
-      <w:r>
-        <w:t xml:space="preserve">, and EliGSiR studies continual Gaussian mapping under a bounded compute budget through adaptive view scheduling, supervision fidelity, and geometry growth</w:t>
-      </w:r>
-      <w:r>
-        <w:t xml:space="preserve"> </w:t>
-      </w:r>
-      <w:r>
-        <w:t xml:space="preserve">(Ellensohn, Rueckert, and Rauch 2026)</w:t>
-      </w:r>
-      <w:r>
-        <w:t xml:space="preserve">. We therefore do not claim the broad idea that changing Gaussian scenes should be updated locally. The distinction in CBRC is the contract: cross-representation exact dependencies and conservative output bounds are checked together, locality is admitted only under Eq. 1, and</w:t>
+        <w:t xml:space="preserve">Dependency-aware recomputation has a long history in graphics. Bala et al. connect edited world regions to bounded-error radiance interpolants with ray segment trees</w:t>
+      </w:r>
+      <w:r>
+        <w:t xml:space="preserve"> </w:t>
+      </w:r>
+      <w:r>
+        <w:t xml:space="preserve">(Bala, Dorsey, and Teller 1999)</w:t>
+      </w:r>
+      <w:r>
+        <w:t xml:space="preserve">, and Wörister et al. derive a dependency graph from scene-graph changes to rendering caches so those caches can be updated incrementally</w:t>
+      </w:r>
+      <w:r>
+        <w:t xml:space="preserve"> </w:t>
+      </w:r>
+      <w:r>
+        <w:t xml:space="preserve">(Wörister et al. 2013)</w:t>
+      </w:r>
+      <w:r>
+        <w:t xml:space="preserve">. Beyond graphics, self-adjusting computation formalizes correct change propagation under mutation and reuse</w:t>
+      </w:r>
+      <w:r>
+        <w:t xml:space="preserve"> </w:t>
+      </w:r>
+      <w:r>
+        <w:t xml:space="preserve">(Acar, Blume, and Donham 2013)</w:t>
+      </w:r>
+      <w:r>
+        <w:t xml:space="preserve">; goal-oriented error estimation directs numerical work toward selected quantities of interest instead of a global state norm</w:t>
+      </w:r>
+      <w:r>
+        <w:t xml:space="preserve"> </w:t>
+      </w:r>
+      <w:r>
+        <w:t xml:space="preserve">(Oden and Prudhomme 2001)</w:t>
+      </w:r>
+      <w:r>
+        <w:t xml:space="preserve">. Several ingredients of CBRC come from these traditions. Our novelty claim concerns how they are assembled and enforced for persistent captured-world revision.</w:t>
+      </w:r>
+    </w:p>
+    <w:p>
+      <w:pPr>
+        <w:pStyle w:val="BodyText"/>
+      </w:pPr>
+      <w:r>
+        <w:t xml:space="preserve">The mathematical components used by CBRC are classical: graph closure, non-negative influence propagation, Neumann-series resolvents, norm bounds, and greedy search. The claimed contribution is a systems contract for captured worlds that brings these components together around one revision decision: exact dependencies across derived state, conservative finite-change bounds, rendered-output quantities of interest, a heterogeneous work crossover, fail-closed</w:t>
       </w:r>
       <w:r>
         <w:t xml:space="preserve"> </w:t>
@@ -1256,129 +1366,7 @@
         <w:t xml:space="preserve"> </w:t>
       </w:r>
       <w:r>
-        <w:t xml:space="preserve">remains an explicit outcome when either certification or the work comparison fails.</w:t>
-      </w:r>
-    </w:p>
-    <w:bookmarkEnd w:id="30"/>
-    <w:bookmarkStart w:id="31" w:name="editing-change-detection-and-identity."/>
-    <w:p>
-      <w:pPr>
-        <w:pStyle w:val="Heading4"/>
-      </w:pPr>
-      <w:r>
-        <w:t xml:space="preserve">Editing, change detection, and identity.</w:t>
-      </w:r>
-    </w:p>
-    <w:p>
-      <w:pPr>
-        <w:pStyle w:val="FirstParagraph"/>
-      </w:pPr>
-      <w:r>
-        <w:t xml:space="preserve">GaussianEditor and SC-GS demonstrate precise, controllable local editing of Gaussian representations</w:t>
-      </w:r>
-      <w:r>
-        <w:t xml:space="preserve"> </w:t>
-      </w:r>
-      <w:r>
-        <w:t xml:space="preserve">(Chen et al. 2024; Huang et al. 2024)</w:t>
-      </w:r>
-      <w:r>
-        <w:t xml:space="preserve">. Primitive-space change detection further suggests that Gaussian attributes themselves can reveal structural and appearance changes</w:t>
-      </w:r>
-      <w:r>
-        <w:t xml:space="preserve"> </w:t>
-      </w:r>
-      <w:r>
-        <w:t xml:space="preserve">(Galappaththige et al. 2026)</w:t>
-      </w:r>
-      <w:r>
-        <w:t xml:space="preserve">, while Consistent Instance Field studies persistent probabilistic identity in dynamic Gaussian scenes</w:t>
-      </w:r>
-      <w:r>
-        <w:t xml:space="preserve"> </w:t>
-      </w:r>
-      <w:r>
-        <w:t xml:space="preserve">(J. Wu et al. 2026)</w:t>
-      </w:r>
-      <w:r>
-        <w:t xml:space="preserve">. These are close enough to our setting that the boundary needs to be explicit: we are not claiming local editing, primitive-level change detection, or persistent identity as new. CBRC starts after a revision has been specified or detected and asks what can safely remain unrepaired for a particular output.</w:t>
-      </w:r>
-    </w:p>
-    <w:bookmarkEnd w:id="31"/>
-    <w:bookmarkStart w:id="32" w:name="Xe058922cb2ad9f50eb5d0cc67129a8e54cd7c86"/>
-    <w:p>
-      <w:pPr>
-        <w:pStyle w:val="Heading4"/>
-      </w:pPr>
-      <w:r>
-        <w:t xml:space="preserve">Incremental rendering, change propagation, and goal-oriented error control.</w:t>
-      </w:r>
-    </w:p>
-    <w:p>
-      <w:pPr>
-        <w:pStyle w:val="FirstParagraph"/>
-      </w:pPr>
-      <w:r>
-        <w:t xml:space="preserve">Dependency-aware recomputation is not new to graphics. Bala et al. connect edited world regions to bounded-error radiance interpolants with ray segment trees</w:t>
-      </w:r>
-      <w:r>
-        <w:t xml:space="preserve"> </w:t>
-      </w:r>
-      <w:r>
-        <w:t xml:space="preserve">(Bala, Dorsey, and Teller 1999)</w:t>
-      </w:r>
-      <w:r>
-        <w:t xml:space="preserve">, and Wörister et al. derive a dependency graph from scene-graph changes to rendering caches so those caches can be updated incrementally</w:t>
-      </w:r>
-      <w:r>
-        <w:t xml:space="preserve"> </w:t>
-      </w:r>
-      <w:r>
-        <w:t xml:space="preserve">(Wörister et al. 2013)</w:t>
-      </w:r>
-      <w:r>
-        <w:t xml:space="preserve">. Beyond graphics, self-adjusting computation formalizes correct change propagation under mutation and reuse</w:t>
-      </w:r>
-      <w:r>
-        <w:t xml:space="preserve"> </w:t>
-      </w:r>
-      <w:r>
-        <w:t xml:space="preserve">(Acar, Blume, and Donham 2013)</w:t>
-      </w:r>
-      <w:r>
-        <w:t xml:space="preserve">; goal-oriented error estimation directs numerical work toward selected quantities of interest rather than a global state norm</w:t>
-      </w:r>
-      <w:r>
-        <w:t xml:space="preserve"> </w:t>
-      </w:r>
-      <w:r>
-        <w:t xml:space="preserve">(Oden and Prudhomme 2001)</w:t>
-      </w:r>
-      <w:r>
-        <w:t xml:space="preserve">. Several ingredients of CBRC clearly live in these traditions, so we treat them as novelty boundaries rather than background to be glossed over.</w:t>
-      </w:r>
-    </w:p>
-    <w:p>
-      <w:pPr>
-        <w:pStyle w:val="BodyText"/>
-      </w:pPr>
-      <w:r>
-        <w:t xml:space="preserve">The mathematics used by CBRC is mostly classical. Graph closure, non-negative influence propagation, Neumann-series resolvents, norm bounds, and greedy search are not contributions of this paper. What we claim instead is a systems contract for captured worlds that brings these pieces together around one revision decision: exact dependencies across derived state, conservative finite-change bounds, rendered-output quantities of interest, a heterogeneous work crossover, fail-closed</w:t>
-      </w:r>
-      <w:r>
-        <w:t xml:space="preserve"> </w:t>
-      </w:r>
-      <w:r>
-        <w:rPr>
-          <w:smallCaps/>
-        </w:rPr>
-        <w:t xml:space="preserve">Full</w:t>
-      </w:r>
-      <w:r>
-        <w:t xml:space="preserve"> </w:t>
-      </w:r>
-      <w:r>
-        <w:t xml:space="preserve">fallback, and independent full-reference falsification. The mathematics is the machinery that makes that contract executable, not a standalone novelty claim.</w:t>
+        <w:t xml:space="preserve">fallback, and independent full-reference falsification. These tools make the contract executable; the novelty claim concerns their captured-world integration and evidence path.</w:t>
       </w:r>
     </w:p>
     <w:bookmarkEnd w:id="32"/>
@@ -2025,7 +2013,7 @@
         <w:pStyle w:val="BodyText"/>
       </w:pPr>
       <w:r>
-        <w:t xml:space="preserve">We keep this separation conservative on purpose. Dependencies from observations to TSDF state, TSDF to mesh ownership, meshes to texture-page identity, and Gaussian records to GPU publication remain exact in v1. Unstable temporal validation is treated the same way. By contrast, Gaussian-to-image influence and stable temporal blending have implemented</w:t>
+        <w:t xml:space="preserve">We keep this separation conservative on purpose. Dependencies from observations to TSDF state, TSDF to mesh ownership, meshes to texture-page identity, and Gaussian records to GPU publication remain exact in v1. Unstable temporal validation is treated the same way. Gaussian-to-image influence and stable temporal blending have implemented</w:t>
       </w:r>
       <w:r>
         <w:t xml:space="preserve"> </w:t>
@@ -2052,7 +2040,7 @@
         <w:t xml:space="preserve">Empirical</w:t>
       </w:r>
       <w:r>
-        <w:t xml:space="preserve">-only dependency without a conservative analytic bound is promoted to exact predecessor closure for certification; its measured gain may still be used for scheduling, but never as a soft safety bound. If we do not have a conservative argument for a relation, we do not soften it simply because doing so would produce a smaller cone.</w:t>
+        <w:t xml:space="preserve">-only dependency without a conservative analytic bound is promoted to exact predecessor closure for certification; its measured gain may still guide scheduling, but never serves as a soft safety bound. Relations lacking a conservative argument stay exact even when a softer treatment would shrink the cone.</w:t>
       </w:r>
     </w:p>
     <w:bookmarkEnd w:id="36"/>
@@ -2457,7 +2445,7 @@
         <w:t xml:space="preserve"> </w:t>
       </w:r>
       <w:r>
-        <w:t xml:space="preserve">measured independently. The calibration is frozen before the final campaign. We keep this distinction explicit throughout the paper: Eq. 4 models heterogeneous work; it is not an end-to-end timing measurement.</w:t>
+        <w:t xml:space="preserve">measured independently. The calibration is frozen before the final campaign. Equation 4 models heterogeneous work. End-to-end timing is a separate measurement outside this metric.</w:t>
       </w:r>
     </w:p>
     <w:bookmarkEnd w:id="37"/>
@@ -3492,7 +3480,7 @@
         <w:pStyle w:val="FirstParagraph"/>
       </w:pPr>
       <w:r>
-        <w:t xml:space="preserve">The native v1 planner does not evaluate a general cyclic resolvent. It uses sparse finite propagation on supported DAG exteriors. If an analytic cycle falls outside that supported case, the planner fails closed: either the cone expands until the unsupported exterior disappears, or the result becomes</w:t>
+        <w:t xml:space="preserve">The native v1 planner uses sparse finite propagation on supported DAG exteriors. An analytic cycle outside that supported case triggers fail-closed behavior: the cone expands until the unsupported exterior disappears, or the result becomes</w:t>
       </w:r>
       <w:r>
         <w:t xml:space="preserve"> </w:t>
@@ -3504,7 +3492,7 @@
         <w:t xml:space="preserve">Full</w:t>
       </w:r>
       <w:r>
-        <w:t xml:space="preserve">. Equation 8 should therefore be read as the reference formulation, not as a claim that arbitrary cyclic systems are handled in production.</w:t>
+        <w:t xml:space="preserve">. Equation 8 is the reference formulation; production support is limited to the stated DAG case.</w:t>
       </w:r>
     </w:p>
     <w:bookmarkEnd w:id="40"/>
@@ -3776,7 +3764,7 @@
         <w:t xml:space="preserve"> </w:t>
       </w:r>
       <w:r>
-        <w:t xml:space="preserve">for every declared output. As a result, the same geometric change can lead to different revision decisions when the protected outputs differ. This is intentional: the certificate is tied to what the user actually asks us to preserve, rather than to an internal state norm that may or may not correlate with visible error.</w:t>
+        <w:t xml:space="preserve">for every declared output. As a result, the same geometric change can lead to different revision decisions when the protected outputs differ. This is intentional: the certificate is tied to the protected output, avoiding dependence on an internal state norm whose relation to visible error may vary.</w:t>
       </w:r>
     </w:p>
     <w:bookmarkEnd w:id="41"/>
@@ -6983,7 +6971,7 @@
         <w:t xml:space="preserve">Full</w:t>
       </w:r>
       <w:r>
-        <w:t xml:space="preserve">; if no such cone is reached, the planner returns the full fallback. This procedure gives us a certified feasible cone. We do not claim that it is the globally cheapest safe cone.</w:t>
+        <w:t xml:space="preserve">; if no such cone is reached, the planner returns the full fallback. This procedure returns a certified feasible cone; global minimum-work optimality is outside its guarantee.</w:t>
       </w:r>
     </w:p>
     <w:bookmarkEnd w:id="49"/>
@@ -7163,7 +7151,7 @@
         <w:t xml:space="preserve">(Kerbl et al. 2023)</w:t>
       </w:r>
       <w:r>
-        <w:t xml:space="preserve">. Ownership is deterministic and spatial in both paths; it represents revision bookkeeping rather than semantic segmentation. Selected-to-</w:t>
+        <w:t xml:space="preserve">. Ownership is deterministic and spatial in both paths and serves revision bookkeeping; semantic segmentation is outside its role. Selected-to-</w:t>
       </w:r>
       <w:r>
         <w:rPr>
@@ -7592,7 +7580,7 @@
         <w:pStyle w:val="BodyText"/>
       </w:pPr>
       <w:r>
-        <w:t xml:space="preserve">V6 is a confirmatory breadth run, not a new method. It repeats the v5 mechanism without changing thresholds, residual scales, edit magnitudes, locality profiles, or control family. Five deterministically ranked scenes are selected from each of 3RScan, ARKitScenes, Bonn RGB-D Dynamic, and trained GraphDECO 3DGS, giving 20 scenes and 3,840 pooled parameter cases. Confirmation gates are fixed before execution. Failed scenes or cases are not replaced after outcome inspection.</w:t>
+        <w:t xml:space="preserve">V6 is a confirmatory breadth run of the unchanged v5 mechanism. Thresholds, residual scales, edit magnitudes, locality profiles, and the control family remain fixed. Five deterministically ranked scenes are selected from each of 3RScan, ARKitScenes, Bonn RGB-D Dynamic, and trained GraphDECO 3DGS, giving 20 scenes and 3,840 pooled parameter cases. Confirmation gates are fixed before execution, and outcome inspection cannot trigger scene or case replacement.</w:t>
       </w:r>
     </w:p>
     <w:bookmarkEnd w:id="59"/>
@@ -8691,7 +8679,7 @@
         <w:pStyle w:val="FirstParagraph"/>
       </w:pPr>
       <w:r>
-        <w:t xml:space="preserve">The fail-closed envelope becomes visible when the campaign is grouped by coupling regime. All low and medium cases remain local. High coupling produces 170 local repairs and 85 fallbacks, while adversarial coupling produces 85 local repairs and 255 fallbacks. The pattern is therefore monotonic in this frozen matrix rather than an all-success story.</w:t>
+        <w:t xml:space="preserve">The fail-closed envelope becomes visible when the campaign is grouped by coupling regime. All low and medium cases remain local. High coupling produces 170 local repairs and 85 fallbacks, while adversarial coupling produces 85 local repairs and 255 fallbacks. The frozen matrix therefore shows a monotonic shift toward fallback as coupling strengthens.</w:t>
       </w:r>
     </w:p>
     <w:bookmarkStart w:id="64" w:name="tab:coupling"/>
@@ -10117,7 +10105,7 @@
         <w:t xml:space="preserve">Full</w:t>
       </w:r>
       <w:r>
-        <w:t xml:space="preserve">; 142 are certified non-zero local cases and 29 stress keys cross from full to local as epsilon changes. The 384 translation controls contain 96 exact local cases and 288 full fallbacks, with zero non-zero local cases and zero crossovers. The contrast identifies certificate sensitivity rather than a generic tendency of the stress matrix to produce locality.</w:t>
+        <w:t xml:space="preserve">; 142 are certified non-zero local cases and 29 stress keys cross from full to local as epsilon changes. The 384 translation controls contain 96 exact local cases and 288 full fallbacks, with zero non-zero local cases and zero crossovers. With translation held as the control, this separation attributes the restored locality to certificate sensitivity.</w:t>
       </w:r>
     </w:p>
     <w:p>
@@ -10582,7 +10570,7 @@
         <w:pStyle w:val="BodyText"/>
       </w:pPr>
       <w:r>
-        <w:t xml:space="preserve">The same-opacity legacy-envelope counterfactual provides a direct mechanism check in v6. Holding the physical opacity edit fixed, the delta-sensitive certificate rescues a mean 0.531 of cases per scene that the legacy envelope would reject (95% interval [0.512, 0.549]); all 20 scenes contain at least one such rescue. The median scene-level ratio of legacy residual bound to delta-sensitive bound is 122.3. This comparison does not claim that the new certificate is tight. The accepted cases remain far from the tolerance boundary: the largest scene maximum of measured residual divided by epsilon is 0.0812, the median of those scene maxima is 0.0195, and there are no near-boundary local cases. The median scene-level residual effectivity is approximately 1168, so conservatism remains a measured limitation rather than being hidden by the positive locality result.</w:t>
+        <w:t xml:space="preserve">The same-opacity legacy-envelope counterfactual provides a direct mechanism check in v6. Holding the physical opacity edit fixed, the delta-sensitive certificate rescues a mean 0.531 of cases per scene that the legacy envelope would reject (95% interval [0.512, 0.549]); all 20 scenes contain at least one such rescue. The median scene-level ratio of legacy residual bound to delta-sensitive bound is 122.3. This comparison addresses sensitivity; tightness remains a separate question. The accepted cases remain far from the tolerance boundary: the largest scene maximum of measured residual divided by epsilon is 0.0812, the median of those scene maxima is 0.0195, and there are no near-boundary local cases. The median scene-level residual effectivity is approximately 1168, so conservatism remains measured alongside the positive locality result.</w:t>
       </w:r>
     </w:p>
     <w:bookmarkStart w:id="70" w:name="tab:v6-scene"/>
@@ -10595,7 +10583,7 @@
         <w:t xml:space="preserve">Table 6. </w:t>
       </w:r>
       <w:r>
-        <w:t xml:space="preserve">Scene-level v6 confirmation. Intervals are dataset-stratified scene-bootstrap 95% intervals over 20 scenes; pooled case totals are not treated as independent samples.</w:t>
+        <w:t xml:space="preserve">Scene-level v6 confirmation. Intervals are dataset-stratified scene-bootstrap 95% intervals over 20 scenes; pooled case totals serve as descriptive evidence, with inference at scene level.</w:t>
       </w:r>
     </w:p>
     <w:tbl>
@@ -10604,7 +10592,7 @@
         <w:tblLayout w:type="fixed"/>
         <w:tblLook w:firstRow="1" w:lastRow="0" w:firstColumn="0" w:lastColumn="0" w:noHBand="0" w:noVBand="0" w:val="0020"/>
         <w:jc w:val="start"/>
-        <w:tblCaption w:val="Scene-level v6 confirmation. Intervals are dataset-stratified scene-bootstrap 95% intervals over 20 scenes; pooled case totals are not treated as independent samples."/>
+        <w:tblCaption w:val="Scene-level v6 confirmation. Intervals are dataset-stratified scene-bootstrap 95% intervals over 20 scenes; pooled case totals serve as descriptive evidence, with inference at scene level."/>
         <w:tblBorders>
           <w:top w:val="single" w:sz="4" w:color="B0B0B0"/>
           <w:bottom w:val="single" w:sz="4" w:color="B0B0B0"/>
@@ -11096,10 +11084,105 @@
         <w:pStyle w:val="FirstParagraph"/>
       </w:pPr>
       <w:r>
-        <w:t xml:space="preserve">The broad campaign establishes the normal operating envelope: the fail-closed rule survives independent replay without an observed certificate violation in 1,275 cases, produces both local repair and full fallback across four datasets and two representation classes, and reduces calibrated selected work to a median 0.474 of</w:t>
-      </w:r>
-      <w:r>
-        <w:t xml:space="preserve"> </w:t>
+        <w:t xml:space="preserve">The broad campaign establishes the normal operating envelope: independent replay exercises both local repair and full fallback across four datasets and two representation classes, with work reduction varying by dataset, edit family, and coupling strength. The residual-sensitive sequence answers a different question. V4 shows that a magnitude-insensitive image certificate can erase useful locality even when the repair itself is graded; V5 isolates a certificate change that restores non-zero opacity locality while leaving the translation control unchanged; and V6 tests the same mechanism on a wider frozen scene set. Taken together, the stages separate implementation fidelity, certificate sensitivity, and breadth instead of compressing them into one aggregate success metric.</w:t>
+      </w:r>
+    </w:p>
+    <w:p>
+      <w:pPr>
+        <w:pStyle w:val="BodyText"/>
+      </w:pPr>
+      <w:r>
+        <w:t xml:space="preserve">The result is best understood as a systems contract built from established dependency and error-estimation ideas. Dependency-aware recomputation, self-adjusting computation, norm bounds, and goal-oriented error estimation provide the underlying traditions. CBRC specializes them into a persistent captured-world rule that requires exact structural closure, conservative exterior accounting, output-specific tolerances, a frozen work crossover, explicit fallback, immutable evidence, and independent full-after falsification.</w:t>
+      </w:r>
+    </w:p>
+    <w:bookmarkEnd w:id="74"/>
+    <w:bookmarkStart w:id="81" w:name="limitations"/>
+    <w:p>
+      <w:pPr>
+        <w:pStyle w:val="Heading2"/>
+      </w:pPr>
+      <w:r>
+        <w:rPr>
+          <w:rStyle w:val="SectionNumber"/>
+        </w:rPr>
+        <w:t xml:space="preserve">8.2</w:t>
+      </w:r>
+      <w:r>
+        <w:tab/>
+      </w:r>
+      <w:r>
+        <w:t xml:space="preserve">Limitations</w:t>
+      </w:r>
+    </w:p>
+    <w:bookmarkStart w:id="75" w:name="X3dd20d9e9f03d02c05d7041b35ed7e30f0fc43a"/>
+    <w:p>
+      <w:pPr>
+        <w:pStyle w:val="Heading4"/>
+      </w:pPr>
+      <w:r>
+        <w:t xml:space="preserve">Correctness and certificate tightness remain separate.</w:t>
+      </w:r>
+    </w:p>
+    <w:p>
+      <w:pPr>
+        <w:pStyle w:val="FirstParagraph"/>
+      </w:pPr>
+      <w:r>
+        <w:t xml:space="preserve">The broad campaign is exact at the audited 8-bit raster, while v5 and v6 demonstrate certified non-zero residuals. That closes the earlier evidence gap while leaving certificate tightness unresolved. Accepted v6 cases remain comfortably inside the tolerance boundary and residual effectivity remains high (Table 6), showing substantial safety margin alongside substantial conservatism. The supported claim is repeatable residual-sensitive locality under the tested opacity-only assumptions; tighter display-space error estimation remains open.</w:t>
+      </w:r>
+    </w:p>
+    <w:bookmarkEnd w:id="75"/>
+    <w:bookmarkStart w:id="76" w:name="X5849c22a44d2c0856a55e902847917a7307dde0"/>
+    <w:p>
+      <w:pPr>
+        <w:pStyle w:val="Heading4"/>
+      </w:pPr>
+      <w:r>
+        <w:t xml:space="preserve">Calibrated work is distinct from runtime.</w:t>
+      </w:r>
+    </w:p>
+    <w:p>
+      <w:pPr>
+        <w:pStyle w:val="FirstParagraph"/>
+      </w:pPr>
+      <w:r>
+        <w:t xml:space="preserve">The headline work result is a frozen four-domain accounting ratio. It captures heterogeneous work under a versioned calibration while omitting allocator behavior, synchronization, cache locality, command submission, and pipeline overlap. Paired end-to-end timing therefore remains a separate matched-runtime study.</w:t>
+      </w:r>
+    </w:p>
+    <w:bookmarkEnd w:id="76"/>
+    <w:bookmarkStart w:id="77" w:name="X2365b001744f4c2f543c90fcb9e5db402bb7d25"/>
+    <w:p>
+      <w:pPr>
+        <w:pStyle w:val="Heading4"/>
+      </w:pPr>
+      <w:r>
+        <w:t xml:space="preserve">Representation coverage remains output-side.</w:t>
+      </w:r>
+    </w:p>
+    <w:p>
+      <w:pPr>
+        <w:pStyle w:val="FirstParagraph"/>
+      </w:pPr>
+      <w:r>
+        <w:t xml:space="preserve">The broad campaign is materially wider than the earlier four-scene experiment: it contains 72 dataset-native geometry worlds and 13 trained 3DGS scenes. Even so, the measured revision path concentrates on Gaussian inspection/update, GPU publication, and temporal output invalidation. The wider observation/TSDF/mesh/texture/material ledger is implemented and regression-tested; an equally broad paper-grade performance campaign for that ledger remains future work.</w:t>
+      </w:r>
+    </w:p>
+    <w:bookmarkEnd w:id="77"/>
+    <w:bookmarkStart w:id="78" w:name="Xa0683ce4ad7cba86b3be8bf2130203078c33852"/>
+    <w:p>
+      <w:pPr>
+        <w:pStyle w:val="Heading4"/>
+      </w:pPr>
+      <w:r>
+        <w:t xml:space="preserve">Dataset-normalized worlds measure revision fidelity.</w:t>
+      </w:r>
+    </w:p>
+    <w:p>
+      <w:pPr>
+        <w:pStyle w:val="FirstParagraph"/>
+      </w:pPr>
+      <w:r>
+        <w:t xml:space="preserve">For 3RScan, ARKitScenes, and Bonn, the benchmark evaluates deterministic seeded Gaussian representations derived from public captured-world assets. The trained GraphDECO subset evaluates pinned trained 3DGS. Selected-to-</w:t>
       </w:r>
       <w:r>
         <w:rPr>
@@ -11108,19 +11191,51 @@
         <w:t xml:space="preserve">Full</w:t>
       </w:r>
       <w:r>
-        <w:t xml:space="preserve">. The residual-sensitive sequence establishes a different point. V4 shows that a magnitude-insensitive image certificate can erase useful locality even when the repair itself is graded. V5 isolates a certificate change that restores non-zero locality for opacity while the translation control remains unchanged. V6 then repeats that mechanism across 20 scenes and passes the predeclared scene-level confirmation gates. The positive v6 result therefore depends on a specific, testable change in the certificate rather than on post-hoc scene or tolerance selection.</w:t>
-      </w:r>
-    </w:p>
-    <w:p>
-      <w:pPr>
-        <w:pStyle w:val="BodyText"/>
-      </w:pPr>
-      <w:r>
-        <w:t xml:space="preserve">The result is best understood as a systems contract rather than as a new dependency algorithm in isolation. Dependency-aware recomputation, self-adjusting computation, norm bounds, and goal-oriented error estimation provide important prior ideas. CBRC specializes them into a persistent captured-world rule that requires exact structural closure, conservative exterior accounting, output-specific tolerances, a frozen work crossover, explicit fallback, immutable evidence, and independent full-after falsification.</w:t>
-      </w:r>
-    </w:p>
-    <w:bookmarkEnd w:id="74"/>
-    <w:bookmarkStart w:id="81" w:name="limitations"/>
+        <w:t xml:space="preserve"> </w:t>
+      </w:r>
+      <w:r>
+        <w:t xml:space="preserve">equality therefore measures revision fidelity within each evaluated representation. Photorealistic reconstruction quality against held-out photographs lies outside this benchmark’s scope.</w:t>
+      </w:r>
+    </w:p>
+    <w:bookmarkEnd w:id="78"/>
+    <w:bookmarkStart w:id="79" w:name="X3685eeeb62b2a4a177916a1d22ac9c0ec887228"/>
+    <w:p>
+      <w:pPr>
+        <w:pStyle w:val="Heading4"/>
+      </w:pPr>
+      <w:r>
+        <w:t xml:space="preserve">Some mechanisms are weakly identifiable on the real matrix.</w:t>
+      </w:r>
+    </w:p>
+    <w:p>
+      <w:pPr>
+        <w:pStyle w:val="FirstParagraph"/>
+      </w:pPr>
+      <w:r>
+        <w:t xml:space="preserve">Several ablations tie the full method on aggregate work and certification. We keep those ties visible. The mechanism-isolation tests establish that those components can become consequential under controlled stress, while the paper-grade matrix shows limited influence from them on aggregate real-scene outcomes.</w:t>
+      </w:r>
+    </w:p>
+    <w:bookmarkEnd w:id="79"/>
+    <w:bookmarkStart w:id="80" w:name="X689c205daaaf6af64c9bf5871238fbb527c769c"/>
+    <w:p>
+      <w:pPr>
+        <w:pStyle w:val="Heading4"/>
+      </w:pPr>
+      <w:r>
+        <w:t xml:space="preserve">The planner is deliberately conservative.</w:t>
+      </w:r>
+    </w:p>
+    <w:p>
+      <w:pPr>
+        <w:pStyle w:val="FirstParagraph"/>
+      </w:pPr>
+      <w:r>
+        <w:t xml:space="preserve">Uniform-scale and adversarial cases trigger many full rebuilds. Those fallbacks are part of the intended behavior: when exterior influence, temporal stability, or work crossover cannot support a local result, the system prefers a full revision. The selected cones carry no global optimality guarantee.</w:t>
+      </w:r>
+    </w:p>
+    <w:bookmarkEnd w:id="80"/>
+    <w:bookmarkEnd w:id="81"/>
+    <w:bookmarkStart w:id="82" w:name="implications"/>
     <w:p>
       <w:pPr>
         <w:pStyle w:val="Heading2"/>
@@ -11129,22 +11244,13 @@
         <w:rPr>
           <w:rStyle w:val="SectionNumber"/>
         </w:rPr>
-        <w:t xml:space="preserve">8.2</w:t>
+        <w:t xml:space="preserve">8.3</w:t>
       </w:r>
       <w:r>
         <w:tab/>
       </w:r>
       <w:r>
-        <w:t xml:space="preserve">Limitations</w:t>
-      </w:r>
-    </w:p>
-    <w:bookmarkStart w:id="75" w:name="X3dd20d9e9f03d02c05d7041b35ed7e30f0fc43a"/>
-    <w:p>
-      <w:pPr>
-        <w:pStyle w:val="Heading4"/>
-      </w:pPr>
-      <w:r>
-        <w:t xml:space="preserve">Correctness and certificate tightness remain separate.</w:t>
+        <w:t xml:space="preserve">Implications</w:t>
       </w:r>
     </w:p>
     <w:p>
@@ -11152,40 +11258,7 @@
         <w:pStyle w:val="FirstParagraph"/>
       </w:pPr>
       <w:r>
-        <w:t xml:space="preserve">The broad campaign is exact at the audited 8-bit raster, while v5 and v6 demonstrate certified non-zero residuals. That closes the earlier evidence gap but does not make the certificate tight. In v6, no accepted case lies near the tolerance boundary; the maximum scene-level measured-residual-to-epsilon ratio is 0.0812, and the median scene-level residual effectivity is approximately 1168. These values show substantial safety margin and also substantial conservatism. We therefore claim repeatable residual-sensitive locality under the tested opacity-only assumptions, not a generally tight display-space error estimator.</w:t>
-      </w:r>
-    </w:p>
-    <w:bookmarkEnd w:id="75"/>
-    <w:bookmarkStart w:id="76" w:name="X5849c22a44d2c0856a55e902847917a7307dde0"/>
-    <w:p>
-      <w:pPr>
-        <w:pStyle w:val="Heading4"/>
-      </w:pPr>
-      <w:r>
-        <w:t xml:space="preserve">Calibrated work is distinct from runtime.</w:t>
-      </w:r>
-    </w:p>
-    <w:p>
-      <w:pPr>
-        <w:pStyle w:val="FirstParagraph"/>
-      </w:pPr>
-      <w:r>
-        <w:t xml:space="preserve">The 0.474 median headline is a frozen four-domain work ratio, not a paired end-to-end speedup. It captures heterogeneous work under a versioned calibration but omits effects such as allocator behavior, synchronization, cache locality, command submission, and pipeline overlap. A runtime claim requires matched</w:t>
-      </w:r>
-      <w:r>
-        <w:t xml:space="preserve"> </w:t>
-      </w:r>
-      <w:r>
-        <w:rPr>
-          <w:smallCaps/>
-        </w:rPr>
-        <w:t xml:space="preserve">Local</w:t>
-      </w:r>
-      <w:r>
-        <w:t xml:space="preserve"> </w:t>
-      </w:r>
-      <w:r>
-        <w:t xml:space="preserve">and</w:t>
+        <w:t xml:space="preserve">The main practical lesson is to treat locality as a contract instead of a geometric assumption. A small physical edit is a useful starting cue, but the publishable decision depends on the dependency closure, the protected output, the tolerated residual, and the cost of carrying the repair through derived state. This framing also makes failure informative. A</w:t>
       </w:r>
       <w:r>
         <w:t xml:space="preserve"> </w:t>
@@ -11200,17 +11273,35 @@
         <w:t xml:space="preserve"> </w:t>
       </w:r>
       <w:r>
-        <w:t xml:space="preserve">execution under the same conditions.</w:t>
-      </w:r>
-    </w:p>
-    <w:bookmarkEnd w:id="76"/>
-    <w:bookmarkStart w:id="77" w:name="X2365b001744f4c2f543c90fcb9e5db402bb7d25"/>
-    <w:p>
-      <w:pPr>
-        <w:pStyle w:val="Heading4"/>
-      </w:pPr>
-      <w:r>
-        <w:t xml:space="preserve">Representation coverage remains output-side.</w:t>
+        <w:t xml:space="preserve">result identifies a revision for which the current model cannot justify leaving enough of the world untouched.</w:t>
+      </w:r>
+    </w:p>
+    <w:p>
+      <w:pPr>
+        <w:pStyle w:val="BodyText"/>
+      </w:pPr>
+      <w:r>
+        <w:t xml:space="preserve">The residual-sensitive experiments make this distinction concrete. A local result can differ measurably from the full-after result and remain admissible when the measured residual stays below both the conservative bound and the declared tolerance. The v4 failure shows that permitting error is insufficient; the certificate must represent residual magnitude. V5 and v6 show that this behavior is repeatable for opacity-only residuals across the tested datasets. The open problem is how far the conservative bound can be tightened while preserving the fail-closed guarantee.</w:t>
+      </w:r>
+    </w:p>
+    <w:bookmarkEnd w:id="82"/>
+    <w:bookmarkEnd w:id="83"/>
+    <w:bookmarkStart w:id="84" w:name="reproducibility-and-artifact-scope"/>
+    <w:p>
+      <w:pPr>
+        <w:pStyle w:val="Heading1"/>
+      </w:pPr>
+      <w:r>
+        <w:rPr>
+          <w:rStyle w:val="SectionNumber"/>
+        </w:rPr>
+        <w:t xml:space="preserve">9</w:t>
+      </w:r>
+      <w:r>
+        <w:tab/>
+      </w:r>
+      <w:r>
+        <w:t xml:space="preserve">Reproducibility and Artifact Scope</w:t>
       </w:r>
     </w:p>
     <w:p>
@@ -11218,17 +11309,34 @@
         <w:pStyle w:val="FirstParagraph"/>
       </w:pPr>
       <w:r>
-        <w:t xml:space="preserve">The broad campaign is materially wider than the earlier four-scene experiment: it contains 72 dataset-native geometry worlds and 13 trained 3DGS scenes. Even so, the measured revision path concentrates on Gaussian inspection/update, GPU publication, and temporal output invalidation. The wider observation/TSDF/mesh/texture/material ledger is implemented and regression-tested but is not yet represented by an equally broad paper-grade performance campaign.</w:t>
-      </w:r>
-    </w:p>
-    <w:bookmarkEnd w:id="77"/>
-    <w:bookmarkStart w:id="78" w:name="Xd0820f5738b2607d8deb2fe70a6eaf581a254d3"/>
-    <w:p>
-      <w:pPr>
-        <w:pStyle w:val="Heading4"/>
-      </w:pPr>
-      <w:r>
-        <w:t xml:space="preserve">Dataset-normalized worlds are not a reconstruction benchmark.</w:t>
+        <w:t xml:space="preserve">The base completion manifest binds the 1,275 campaign rows, 85 prepared worlds, dataset import manifests, frozen case matrix, work calibration, visual audit, cross-dataset statistics, tool fingerprints, and evidence Git SHA. The residual-sensitive line keeps v4 and v5 immutable and freezes v6 independently at 20 scenes and 3,840 cases. Its retained evidence includes the frozen campaign and provenance, canonical rows and baselines, scene-level metrics, the generic and v6 audits, the manuscript claim packet, case-decision trace, and deterministic reviewer-figure index. Cases resume only under matching deterministic fingerprints; bulky per-case render material is reproducible and may be compacted after the canonical row, baseline, replay manifest, and completion marker are retained.</w:t>
+      </w:r>
+    </w:p>
+    <w:p>
+      <w:pPr>
+        <w:pStyle w:val="BodyText"/>
+      </w:pPr>
+      <w:r>
+        <w:t xml:space="preserve">Public datasets remain upstream assets, and the repository excludes their redistribution. The repository contains the dense reference certifier, native planner and Gaussian oracle, trained and seeded representation paths, baseline and ablation suites, deterministic statistics and visual-audit generators, residual-sensitive certificate tests, regression tests, and storage-safe campaign runners. For double-blind review, identifiable repository and author metadata should be replaced with an anonymized frozen supplement that follows the target venue’s policy.</w:t>
+      </w:r>
+    </w:p>
+    <w:bookmarkEnd w:id="84"/>
+    <w:bookmarkStart w:id="85" w:name="conclusion"/>
+    <w:p>
+      <w:pPr>
+        <w:pStyle w:val="Heading1"/>
+      </w:pPr>
+      <w:r>
+        <w:rPr>
+          <w:rStyle w:val="SectionNumber"/>
+        </w:rPr>
+        <w:t xml:space="preserve">10</w:t>
+      </w:r>
+      <w:r>
+        <w:tab/>
+      </w:r>
+      <w:r>
+        <w:t xml:space="preserve">Conclusion</w:t>
       </w:r>
     </w:p>
     <w:p>
@@ -11236,7 +11344,10 @@
         <w:pStyle w:val="FirstParagraph"/>
       </w:pPr>
       <w:r>
-        <w:t xml:space="preserve">For 3RScan, ARKitScenes, and Bonn, the benchmark evaluates deterministic seeded Gaussian representations derived from public captured-world assets. The trained GraphDECO subset evaluates pinned trained 3DGS. Selected-to-</w:t>
+        <w:t xml:space="preserve">Criticality-Bounded Revision Cones give persistent 3D systems a way to avoid unnecessary global rebuilds while treating spatial locality as a hypothesis that must earn certification. A repair proceeds only when structural dependencies are closed, the effect left outside the selected region stays within the declared output tolerance, and the work remains worthwhile; otherwise MAVEB rebuilds. In the broad campaign, median calibrated selected work is 0.474 of</w:t>
+      </w:r>
+      <w:r>
+        <w:t xml:space="preserve"> </w:t>
       </w:r>
       <w:r>
         <w:rPr>
@@ -11245,89 +11356,7 @@
         <w:t xml:space="preserve">Full</w:t>
       </w:r>
       <w:r>
-        <w:t xml:space="preserve"> </w:t>
-      </w:r>
-      <w:r>
-        <w:t xml:space="preserve">equality is therefore a revision-fidelity result within each evaluated representation, rather than a claim about photorealistic reconstruction quality against held-out photographs.</w:t>
-      </w:r>
-    </w:p>
-    <w:bookmarkEnd w:id="78"/>
-    <w:bookmarkStart w:id="79" w:name="X3685eeeb62b2a4a177916a1d22ac9c0ec887228"/>
-    <w:p>
-      <w:pPr>
-        <w:pStyle w:val="Heading4"/>
-      </w:pPr>
-      <w:r>
-        <w:t xml:space="preserve">Some mechanisms are weakly identifiable on the real matrix.</w:t>
-      </w:r>
-    </w:p>
-    <w:p>
-      <w:pPr>
-        <w:pStyle w:val="FirstParagraph"/>
-      </w:pPr>
-      <w:r>
-        <w:t xml:space="preserve">Several ablations tie the full method on aggregate work and certification. We keep those ties visible. The mechanism-isolation tests establish that those components can become consequential under controlled stress, while the paper-grade matrix shows that they do not dominate the measured real-scene outcomes.</w:t>
-      </w:r>
-    </w:p>
-    <w:bookmarkEnd w:id="79"/>
-    <w:bookmarkStart w:id="80" w:name="X689c205daaaf6af64c9bf5871238fbb527c769c"/>
-    <w:p>
-      <w:pPr>
-        <w:pStyle w:val="Heading4"/>
-      </w:pPr>
-      <w:r>
-        <w:t xml:space="preserve">The planner is deliberately conservative.</w:t>
-      </w:r>
-    </w:p>
-    <w:p>
-      <w:pPr>
-        <w:pStyle w:val="FirstParagraph"/>
-      </w:pPr>
-      <w:r>
-        <w:t xml:space="preserve">Uniform-scale and adversarial cases trigger many full rebuilds. Those fallbacks are part of the intended behavior: when exterior influence, temporal stability, or work crossover cannot support a local result, the system prefers a full revision. The paper does not infer global optimality from the selected cones.</w:t>
-      </w:r>
-    </w:p>
-    <w:bookmarkEnd w:id="80"/>
-    <w:bookmarkEnd w:id="81"/>
-    <w:bookmarkStart w:id="82" w:name="implications"/>
-    <w:p>
-      <w:pPr>
-        <w:pStyle w:val="Heading2"/>
-      </w:pPr>
-      <w:r>
-        <w:rPr>
-          <w:rStyle w:val="SectionNumber"/>
-        </w:rPr>
-        <w:t xml:space="preserve">8.3</w:t>
-      </w:r>
-      <w:r>
-        <w:tab/>
-      </w:r>
-      <w:r>
-        <w:t xml:space="preserve">Implications</w:t>
-      </w:r>
-    </w:p>
-    <w:p>
-      <w:pPr>
-        <w:pStyle w:val="FirstParagraph"/>
-      </w:pPr>
-      <w:r>
-        <w:t xml:space="preserve">The main practical lesson is that locality should be treated as a contract, not as a geometric assumption. A small physical edit is a useful starting cue, but the publishable decision depends on the dependency closure, the output quantity being protected, the tolerated residual, and the cost of carrying the repair through derived state. This framing also makes failure informative. A</w:t>
-      </w:r>
-      <w:r>
-        <w:t xml:space="preserve"> </w:t>
-      </w:r>
-      <w:r>
-        <w:rPr>
-          <w:smallCaps/>
-        </w:rPr>
-        <w:t xml:space="preserve">Full</w:t>
-      </w:r>
-      <w:r>
-        <w:t xml:space="preserve"> </w:t>
-      </w:r>
-      <w:r>
-        <w:t xml:space="preserve">result identifies a revision for which the current model cannot justify leaving enough of the world untouched.</w:t>
+        <w:t xml:space="preserve">, with both selective maintenance and fail-closed fallback exercised under independent replay. Stronger coupling progressively reduces the opportunity for reuse.</w:t>
       </w:r>
     </w:p>
     <w:p>
@@ -11335,90 +11364,7 @@
         <w:pStyle w:val="BodyText"/>
       </w:pPr>
       <w:r>
-        <w:t xml:space="preserve">The residual-sensitive experiments make this distinction concrete. A local result can differ measurably from the full-after result and still be admissible when the measured residual remains below both the conservative bound and the declared tolerance. The v4 failure is as informative as the later success: locality is not created merely by allowing error; the certificate must represent the magnitude of the residual. V5 and v6 show that this distinction is repeatable for opacity-only residuals across the tested datasets. The remaining problem is not whether non-zero locality can occur, but how much the conservative bound can be tightened without losing the fail-closed guarantee.</w:t>
-      </w:r>
-    </w:p>
-    <w:bookmarkEnd w:id="82"/>
-    <w:bookmarkEnd w:id="83"/>
-    <w:bookmarkStart w:id="84" w:name="reproducibility-and-artifact-scope"/>
-    <w:p>
-      <w:pPr>
-        <w:pStyle w:val="Heading1"/>
-      </w:pPr>
-      <w:r>
-        <w:rPr>
-          <w:rStyle w:val="SectionNumber"/>
-        </w:rPr>
-        <w:t xml:space="preserve">9</w:t>
-      </w:r>
-      <w:r>
-        <w:tab/>
-      </w:r>
-      <w:r>
-        <w:t xml:space="preserve">Reproducibility and Artifact Scope</w:t>
-      </w:r>
-    </w:p>
-    <w:p>
-      <w:pPr>
-        <w:pStyle w:val="FirstParagraph"/>
-      </w:pPr>
-      <w:r>
-        <w:t xml:space="preserve">The base completion manifest binds the 1,275 campaign rows, 85 prepared worlds, dataset import manifests, frozen case matrix, work calibration, visual audit, cross-dataset statistics, tool fingerprints, and evidence Git SHA. The residual-sensitive line keeps v4 and v5 immutable and freezes v6 independently at 20 scenes and 3,840 cases. Its retained evidence includes the frozen campaign and provenance, canonical rows and baselines, scene-level metrics, the generic and v6 audits, the manuscript claim packet, case-decision trace, and deterministic reviewer-figure index. Cases resume only under matching deterministic fingerprints; bulky per-case render material is reproducible and may be compacted after the canonical row, baseline, replay manifest, and completion marker are retained.</w:t>
-      </w:r>
-    </w:p>
-    <w:p>
-      <w:pPr>
-        <w:pStyle w:val="BodyText"/>
-      </w:pPr>
-      <w:r>
-        <w:t xml:space="preserve">Public datasets remain upstream assets rather than being redistributed with the repository. The repository contains the dense reference certifier, native planner and Gaussian oracle, trained and seeded representation paths, baseline and ablation suites, deterministic statistics and visual-audit generators, residual-sensitive certificate tests, regression tests, and storage-safe campaign runners. For double-blind review, identifiable repository and author metadata should be replaced with an anonymized frozen supplement that follows the target venue’s policy.</w:t>
-      </w:r>
-    </w:p>
-    <w:bookmarkEnd w:id="84"/>
-    <w:bookmarkStart w:id="85" w:name="conclusion"/>
-    <w:p>
-      <w:pPr>
-        <w:pStyle w:val="Heading1"/>
-      </w:pPr>
-      <w:r>
-        <w:rPr>
-          <w:rStyle w:val="SectionNumber"/>
-        </w:rPr>
-        <w:t xml:space="preserve">10</w:t>
-      </w:r>
-      <w:r>
-        <w:tab/>
-      </w:r>
-      <w:r>
-        <w:t xml:space="preserve">Conclusion</w:t>
-      </w:r>
-    </w:p>
-    <w:p>
-      <w:pPr>
-        <w:pStyle w:val="FirstParagraph"/>
-      </w:pPr>
-      <w:r>
-        <w:t xml:space="preserve">Criticality-Bounded Revision Cones give persistent 3D systems a way to avoid unnecessary global rebuilds without treating spatial locality as a safe assumption. A repair proceeds only when structural dependencies are closed, the effect left outside the selected region stays within the declared output tolerance, and the work remains worthwhile; otherwise MAVEB rebuilds. Across 1,275 revisions over 85 scenes, this policy produces both selective maintenance and deliberate fallback with zero observed certificate violations, while median calibrated work is 0.474 of</w:t>
-      </w:r>
-      <w:r>
-        <w:t xml:space="preserve"> </w:t>
-      </w:r>
-      <w:r>
-        <w:rPr>
-          <w:smallCaps/>
-        </w:rPr>
-        <w:t xml:space="preserve">Full</w:t>
-      </w:r>
-      <w:r>
-        <w:t xml:space="preserve">. Stronger coupling reduces the opportunity for reuse rather than forcing an unsafe local answer.</w:t>
-      </w:r>
-    </w:p>
-    <w:p>
-      <w:pPr>
-        <w:pStyle w:val="BodyText"/>
-      </w:pPr>
-      <w:r>
-        <w:t xml:space="preserve">The residual-sensitive sequence resolves the main limitation of that exact-output campaign. The immutable v4 diagnostic showed that the original image certificate rejected every non-zero residual. A delta-sensitive opacity certificate restored certified non-zero locality in v5, and v6 repeated the unchanged mechanism across 20 scenes: all 20 showed non-zero opacity locality and tolerance crossover, the scene-level opacity-minus-translation difference was 0.477 with 95% interval [0.432, 0.517], and every confirmatory validity gate passed without an observed certificate violation. The same evidence also shows what remains unfinished: the certificate is conservative and the accepted cases are far from the tolerance boundary. The practical claim is therefore bounded and testable. Recomputation can be reduced when the current dependency and error model can justify it, and expanded when it cannot.</w:t>
+        <w:t xml:space="preserve">The residual-sensitive sequence addresses the broad campaign’s exact-output limitation. V4 exposes the original certificate bottleneck, the opacity-delta refinement restores non-zero locality in v5, and the unchanged mechanism survives the 20-scene v6 confirmation. The paired opacity-minus-translation scene-level difference is 0.477 with 95% interval [0.432, 0.517]. Accepted residuals remain far from the tolerance boundary, making certificate tightness the main unresolved technical issue. The practical result is bounded and testable: recomputation shrinks when the dependency and error model can justify it and expands when that justification disappears.</w:t>
       </w:r>
     </w:p>
     <w:bookmarkEnd w:id="85"/>

</xml_diff>

<commit_message>
paper: reframe MAVEB around certified local recompute
Reframe the MAVEB manuscript in response to CGF pre-review feedback, clarify the computer-graphics systems contribution and terminology, retain the frozen evidence, and merge synchronized manuscript artifacts.
</commit_message>
<xml_diff>
--- a/researchpaper/MAVEB_manuscript.docx
+++ b/researchpaper/MAVEB_manuscript.docx
@@ -25,19 +25,19 @@
         <w:t xml:space="preserve"> </w:t>
       </w:r>
       <w:r>
-        <w:t xml:space="preserve">Criticality-Bounded</w:t>
-      </w:r>
-      <w:r>
-        <w:t xml:space="preserve"> </w:t>
-      </w:r>
-      <w:r>
-        <w:t xml:space="preserve">Revision</w:t>
-      </w:r>
-      <w:r>
-        <w:t xml:space="preserve"> </w:t>
-      </w:r>
-      <w:r>
-        <w:t xml:space="preserve">Cones</w:t>
+        <w:t xml:space="preserve">Certified</w:t>
+      </w:r>
+      <w:r>
+        <w:t xml:space="preserve"> </w:t>
+      </w:r>
+      <w:r>
+        <w:t xml:space="preserve">Local</w:t>
+      </w:r>
+      <w:r>
+        <w:t xml:space="preserve"> </w:t>
+      </w:r>
+      <w:r>
+        <w:t xml:space="preserve">Recompute</w:t>
       </w:r>
       <w:r>
         <w:t xml:space="preserve"> </w:t>
@@ -55,13 +55,13 @@
         <w:t xml:space="preserve"> </w:t>
       </w:r>
       <w:r>
-        <w:t xml:space="preserve">Captured</w:t>
-      </w:r>
-      <w:r>
-        <w:t xml:space="preserve"> </w:t>
-      </w:r>
-      <w:r>
-        <w:t xml:space="preserve">Worlds</w:t>
+        <w:t xml:space="preserve">3D</w:t>
+      </w:r>
+      <w:r>
+        <w:t xml:space="preserve"> </w:t>
+      </w:r>
+      <w:r>
+        <w:t xml:space="preserve">Reconstructions</w:t>
       </w:r>
     </w:p>
     <w:p>
@@ -100,7 +100,15 @@
         <w:pStyle w:val="FirstParagraph"/>
       </w:pPr>
       <w:r>
-        <w:t xml:space="preserve">Persistent captured worlds—AR maps, digital twins, and long-lived reconstructions—continue changing after capture. Their geometry, appearance, GPU state, and temporal history become interdependent, so a small physical edit can trigger broad recomputation. We present</w:t>
+        <w:t xml:space="preserve">Persistent 3D reconstructions often outlive their capture session: objects move, AR maps are revisited, or digital twins are edited. Rebuilding every derived representation after each change is safe but can waste work; updating only nearby geometry is cheaper but can leave stale ownership, GPU-publication, visibility, or temporal state that changes the rendered output.</w:t>
+      </w:r>
+    </w:p>
+    <w:p>
+      <w:pPr>
+        <w:pStyle w:val="BodyText"/>
+      </w:pPr>
+      <w:r>
+        <w:t xml:space="preserve">We present</w:t>
       </w:r>
       <w:r>
         <w:t xml:space="preserve"> </w:t>
@@ -116,7 +124,7 @@
         <w:t xml:space="preserve"> </w:t>
       </w:r>
       <w:r>
-        <w:t xml:space="preserve">(CBRC), a fail-closed revision rule that combines exact structural closure, conservative finite-change bounds, output tolerances, work-aware selection, automatic</w:t>
+        <w:t xml:space="preserve">(CBRC), an incremental recomputation algorithm for selective maintenance of persistent 3D state. A revision cone is the state recomputed after an edit. CBRC closes exact structural dependencies, bounds supported influence left outside the cone at protected outputs, and accepts a local update only when every output bound is within tolerance and its calibrated work is below a measured full-rebuild baseline. Unsupported, supercritical, or uneconomical cases automatically return</w:t>
       </w:r>
       <w:r>
         <w:t xml:space="preserve"> </w:t>
@@ -128,10 +136,7 @@
         <w:t xml:space="preserve">Full</w:t>
       </w:r>
       <w:r>
-        <w:t xml:space="preserve"> </w:t>
-      </w:r>
-      <w:r>
-        <w:t xml:space="preserve">fallback, and independent full-after verification. We evaluate CBRC in MAVEB, a research prototype built on AETHER, a C++23 persistent-world stack for reconstruction, Gaussian rendering, revision tracking, GPU publication, temporal state, and evidence capture. A local repair is accepted only when the unrecomputed exterior stays within tolerance and the repair remains cheaper than rebuilding.</w:t>
+        <w:t xml:space="preserve">.</w:t>
       </w:r>
     </w:p>
     <w:p>
@@ -139,7 +144,7 @@
         <w:pStyle w:val="BodyText"/>
       </w:pPr>
       <w:r>
-        <w:t xml:space="preserve">The base evaluation spans 1,275 revisions over 85 scenes across 3RScan, ARKitScenes, Bonn RGB-D Dynamic, and trained GraphDECO 3DGS. It exercises local repair and automatic full fallback with no observed certificate violation; median calibrated selected work is 0.474 of a rebuild. Because this campaign is exact at the audited raster, we test bounded non-zero residuals separately. A diagnostic exposes the original image certificate as too conservative. An opacity-delta Lipschitz refinement restores certified non-zero locality in a four-scene mechanism study, then an outcome-blind confirmation repeats the mechanism on 20 independently selected scenes across all four dataset families. Non-zero opacity locality and tolerance crossover appear in every confirmatory scene while translation remains at zero; the paired scene-level difference is 0.477 with a dataset-stratified bootstrap 95% interval of [0.432, 0.517]. Certificate tightness remains open. Together, the experiments show selective maintenance under an explicit output-error contract with reproducible fallback.</w:t>
+        <w:t xml:space="preserve">We implement the method in MAVEB on a C++23 reconstruction and Gaussian-rendering stack. Across 1,275 revisions over 85 scenes from 3RScan, ARKitScenes, Bonn RGB-D Dynamic, and trained GraphDECO 3DGS, CBRC selects 935 local repairs and 340 full fallbacks with no observed certificate violation under independent full-after replay; median calibrated selected work is 0.474 of a rebuild. A separate residual-sensitive study on 20 independently selected scenes shows certified non-zero opacity locality in every scene after an opacity-delta refinement, while an unchanged translation control remains at zero. The result is a graphics-systems rule for local recomputation under an explicit output-error contract, not a new reconstruction representation or renderer.</w:t>
       </w:r>
     </w:p>
     <w:bookmarkEnd w:id="20"/>
@@ -166,7 +171,37 @@
         <w:pStyle w:val="FirstParagraph"/>
       </w:pPr>
       <w:r>
-        <w:t xml:space="preserve">Many 3D systems now live well beyond the capture session that created them. A reconstructed room may be revisited after furniture has moved; an AR map continues to exist while objects appear and disappear; a digital twin is updated after a small physical intervention. The stored state in these systems contains heterogeneous representations. Observations feed geometry, geometry determines surface or Gaussian support, materials and textures follow ownership and visibility, GPU records mirror persistent entities, and temporal filters reuse earlier screen-space state. For that reason, an edit that looks local in Euclidean space can become nonlocal once it propagates through the system.</w:t>
+        <w:t xml:space="preserve">A captured 3D scene is often treated as a finished reconstruction, yet many deployed systems keep that scene alive. Consider a reconstructed room in which one chair is moved. Recomputing the entire representation, every GPU record, and every temporal buffer is safe but wasteful. Recomputing only the chair’s nearby geometry is cheaper, but it can be wrong if the edit also changes ownership, visibility, publication ranges, or retained history. The practical graphics problem is therefore not merely</w:t>
+      </w:r>
+      <w:r>
+        <w:t xml:space="preserve"> </w:t>
+      </w:r>
+      <w:r>
+        <w:t xml:space="preserve">“</w:t>
+      </w:r>
+      <w:r>
+        <w:t xml:space="preserve">where did the edit occur?</w:t>
+      </w:r>
+      <w:r>
+        <w:t xml:space="preserve">”</w:t>
+      </w:r>
+      <w:r>
+        <w:t xml:space="preserve"> </w:t>
+      </w:r>
+      <w:r>
+        <w:t xml:space="preserve">but</w:t>
+      </w:r>
+      <w:r>
+        <w:t xml:space="preserve"> </w:t>
+      </w:r>
+      <w:r>
+        <w:t xml:space="preserve">“</w:t>
+      </w:r>
+      <w:r>
+        <w:t xml:space="preserve">which derived state must change before the updated output can be trusted?</w:t>
+      </w:r>
+      <w:r>
+        <w:t xml:space="preserve">”</w:t>
       </w:r>
     </w:p>
     <w:p>
@@ -174,34 +209,7 @@
         <w:pStyle w:val="BodyText"/>
       </w:pPr>
       <w:r>
-        <w:t xml:space="preserve">The safest response is still a global rebuild. Classical volumetric fusion and dense reconstruction give a natural full-reference notion of recomputation</w:t>
-      </w:r>
-      <w:r>
-        <w:t xml:space="preserve"> </w:t>
-      </w:r>
-      <w:r>
-        <w:t xml:space="preserve">(Curless and Levoy 1996; Newcombe et al. 2011; Dai et al. 2017)</w:t>
-      </w:r>
-      <w:r>
-        <w:t xml:space="preserve">. That choice is straightforward to reason about, but it becomes wasteful when only a small dependency closure is actually affected. Explicit scene representations make this mismatch particularly visible: large parts of a Gaussian map, or of a neural/hybrid reconstruction, may have no reason to change after a local revision</w:t>
-      </w:r>
-      <w:r>
-        <w:t xml:space="preserve"> </w:t>
-      </w:r>
-      <w:r>
-        <w:t xml:space="preserve">(Kerbl et al. 2023; Keetha et al. 2024; Matsuki et al. 2024)</w:t>
-      </w:r>
-      <w:r>
-        <w:t xml:space="preserve">. Continual Gaussian systems already exploit this fact by focusing optimization on changed regions or by managing stale observations over time</w:t>
-      </w:r>
-      <w:r>
-        <w:t xml:space="preserve"> </w:t>
-      </w:r>
-      <w:r>
-        <w:t xml:space="preserve">(Ackermann et al. 2025; Zeng et al. 2025; Yugay et al. 2026)</w:t>
-      </w:r>
-      <w:r>
-        <w:t xml:space="preserve">. Our concern is slightly different. Those systems mainly decide</w:t>
+        <w:t xml:space="preserve">This paper separates two notions that are easy to conflate.</w:t>
       </w:r>
       <w:r>
         <w:t xml:space="preserve"> </w:t>
@@ -211,18 +219,13 @@
           <w:iCs/>
           <w:i/>
         </w:rPr>
-        <w:t xml:space="preserve">where to update</w:t>
-      </w:r>
-      <w:r>
-        <w:t xml:space="preserve">; here we ask how much error may safely remain outside the region that was chosen, across several kinds of derived state at once.</w:t>
-      </w:r>
-    </w:p>
-    <w:p>
-      <w:pPr>
-        <w:pStyle w:val="BodyText"/>
-      </w:pPr>
-      <w:r>
-        <w:t xml:space="preserve">The question is deliberately narrow:</w:t>
+        <w:t xml:space="preserve">Computational locality</w:t>
+      </w:r>
+      <w:r>
+        <w:t xml:space="preserve"> </w:t>
+      </w:r>
+      <w:r>
+        <w:t xml:space="preserve">means that only a subset of the persistent state is recomputed.</w:t>
       </w:r>
       <w:r>
         <w:t xml:space="preserve"> </w:t>
@@ -232,13 +235,48 @@
           <w:iCs/>
           <w:i/>
         </w:rPr>
-        <w:t xml:space="preserve">when is it defensible to repair less than the whole captured world while keeping an explicit output-error contract?</w:t>
-      </w:r>
-      <w:r>
-        <w:t xml:space="preserve"> </w:t>
-      </w:r>
-      <w:r>
-        <w:t xml:space="preserve">Reachability alone is insufficient. Ownership, record identity, publication, and unstable temporal invalidation are structural relations that require exact treatment. Other relations, such as edited Gaussian support or stable temporal blending, have finite influence that can be bounded. The revision policy must distinguish the two and fall back to a full rebuild when the remainder outside a proposed repair region cannot be bounded tightly enough.</w:t>
+        <w:t xml:space="preserve">Output locality</w:t>
+      </w:r>
+      <w:r>
+        <w:t xml:space="preserve"> </w:t>
+      </w:r>
+      <w:r>
+        <w:t xml:space="preserve">means that leaving the remaining state untouched changes a protected output—for example an RGB render—by no more than a declared tolerance. A method can have computational locality without output locality: it may update a small region quickly while leaving stale state that visibly changes the result. Our goal is to admit a local update only when both notions hold under the stated model.</w:t>
+      </w:r>
+    </w:p>
+    <w:p>
+      <w:pPr>
+        <w:pStyle w:val="BodyText"/>
+      </w:pPr>
+      <w:r>
+        <w:t xml:space="preserve">The safe reference is a full rebuild. Classical volumetric and dense reconstruction systems already provide a natural notion of recomputing the complete derived state</w:t>
+      </w:r>
+      <w:r>
+        <w:t xml:space="preserve"> </w:t>
+      </w:r>
+      <w:r>
+        <w:t xml:space="preserve">(Curless and Levoy 1996; Newcombe et al. 2011; Dai et al. 2017)</w:t>
+      </w:r>
+      <w:r>
+        <w:t xml:space="preserve">. Explicit Gaussian and hybrid representations make the potential waste especially visible because large numbers of persistent primitives can remain unchanged after a small edit</w:t>
+      </w:r>
+      <w:r>
+        <w:t xml:space="preserve"> </w:t>
+      </w:r>
+      <w:r>
+        <w:t xml:space="preserve">(Kerbl et al. 2023; Keetha et al. 2024; Matsuki et al. 2024)</w:t>
+      </w:r>
+      <w:r>
+        <w:t xml:space="preserve">. Continual Gaussian systems exploit changed regions to focus optimization</w:t>
+      </w:r>
+      <w:r>
+        <w:t xml:space="preserve"> </w:t>
+      </w:r>
+      <w:r>
+        <w:t xml:space="preserve">(Ackermann et al. 2025; Zeng et al. 2025; Yugay et al. 2026)</w:t>
+      </w:r>
+      <w:r>
+        <w:t xml:space="preserve">. We address a different decision: after the edit is known, when may the system deliberately leave some derived state unrecomputed while bounding its effect on the output?</w:t>
       </w:r>
     </w:p>
     <w:p>
@@ -262,52 +300,7 @@
         <w:t xml:space="preserve"> </w:t>
       </w:r>
       <w:r>
-        <w:t xml:space="preserve">(CBRC). A revision is represented on a typed dependency graph with three edge meanings.</w:t>
-      </w:r>
-      <w:r>
-        <w:t xml:space="preserve"> </w:t>
-      </w:r>
-      <w:r>
-        <w:rPr>
-          <w:smallCaps/>
-        </w:rPr>
-        <w:t xml:space="preserve">Hard</w:t>
-      </w:r>
-      <w:r>
-        <w:t xml:space="preserve"> </w:t>
-      </w:r>
-      <w:r>
-        <w:t xml:space="preserve">edges carry exact structural requirements;</w:t>
-      </w:r>
-      <w:r>
-        <w:t xml:space="preserve"> </w:t>
-      </w:r>
-      <w:r>
-        <w:rPr>
-          <w:smallCaps/>
-        </w:rPr>
-        <w:t xml:space="preserve">Analytic</w:t>
-      </w:r>
-      <w:r>
-        <w:t xml:space="preserve"> </w:t>
-      </w:r>
-      <w:r>
-        <w:t xml:space="preserve">edges carry conservative finite-change bounds; and</w:t>
-      </w:r>
-      <w:r>
-        <w:t xml:space="preserve"> </w:t>
-      </w:r>
-      <w:r>
-        <w:rPr>
-          <w:smallCaps/>
-        </w:rPr>
-        <w:t xml:space="preserve">Empirical</w:t>
-      </w:r>
-      <w:r>
-        <w:t xml:space="preserve"> </w:t>
-      </w:r>
-      <w:r>
-        <w:t xml:space="preserve">edges may help decide what to try first, but they never become part of the safety certificate. For a proposed cone</w:t>
+        <w:t xml:space="preserve">(CBRC). The name is more complicated than the operation. A revision cone</w:t>
       </w:r>
       <w:r>
         <w:t xml:space="preserve"> </w:t>
@@ -318,34 +311,54 @@
         </m:r>
       </m:oMath>
       <w:r>
-        <w:t xml:space="preserve">, we certify the unrepaired exterior</w:t>
-      </w:r>
-      <w:r>
-        <w:t xml:space="preserve"> </w:t>
-      </w:r>
-      <m:oMath>
-        <m:r>
-          <m:t>O</m:t>
-        </m:r>
-      </m:oMath>
-      <w:r>
-        <w:t xml:space="preserve"> </w:t>
-      </w:r>
-      <w:r>
-        <w:t xml:space="preserve">against the declared quantities of interest. The worst normalized certificate-to-tolerance ratio is the</w:t>
-      </w:r>
-      <w:r>
-        <w:t xml:space="preserve"> </w:t>
-      </w:r>
-      <w:r>
-        <w:rPr>
-          <w:iCs/>
-          <w:i/>
-        </w:rPr>
-        <w:t xml:space="preserve">revision criticality</w:t>
-      </w:r>
-      <w:r>
-        <w:t xml:space="preserve">, with one as the decision boundary. We accept a local result only when exact predecessors are closed, every protected output is at or below that boundary, and the calibrated regional work is below the independently measured full baseline. If the coupling is unsupported, the residual is supercritical, the analytic assumptions are unstable, or locality simply costs too much, the planner returns</w:t>
+        <w:t xml:space="preserve"> </w:t>
+      </w:r>
+      <w:r>
+        <w:t xml:space="preserve">is simply the set of state blocks that will be recomputed. Starting from the edited blocks, CBRC performs four steps:</w:t>
+      </w:r>
+    </w:p>
+    <w:p>
+      <w:pPr>
+        <w:numPr>
+          <w:ilvl w:val="0"/>
+          <w:numId w:val="1001"/>
+        </w:numPr>
+      </w:pPr>
+      <w:r>
+        <w:t xml:space="preserve">close all dependencies whose correctness is structural and therefore cannot be approximated;</w:t>
+      </w:r>
+    </w:p>
+    <w:p>
+      <w:pPr>
+        <w:numPr>
+          <w:ilvl w:val="0"/>
+          <w:numId w:val="1001"/>
+        </w:numPr>
+      </w:pPr>
+      <w:r>
+        <w:t xml:space="preserve">propagate conservative finite-change bounds through the supported approximate dependencies that remain outside the cone;</w:t>
+      </w:r>
+    </w:p>
+    <w:p>
+      <w:pPr>
+        <w:numPr>
+          <w:ilvl w:val="0"/>
+          <w:numId w:val="1001"/>
+        </w:numPr>
+      </w:pPr>
+      <w:r>
+        <w:t xml:space="preserve">map that unrecomputed influence to each protected output and compare it with the output tolerance; and</w:t>
+      </w:r>
+    </w:p>
+    <w:p>
+      <w:pPr>
+        <w:numPr>
+          <w:ilvl w:val="0"/>
+          <w:numId w:val="1001"/>
+        </w:numPr>
+      </w:pPr>
+      <w:r>
+        <w:t xml:space="preserve">accept the cone only if it is both output-feasible and cheaper than the measured</w:t>
       </w:r>
       <w:r>
         <w:t xml:space="preserve"> </w:t>
@@ -357,15 +370,10 @@
         <w:t xml:space="preserve">Full</w:t>
       </w:r>
       <w:r>
-        <w:t xml:space="preserve">.</w:t>
-      </w:r>
-    </w:p>
-    <w:p>
-      <w:pPr>
-        <w:pStyle w:val="BodyText"/>
-      </w:pPr>
-      <w:r>
-        <w:t xml:space="preserve">MAVEB is the research system used to evaluate CBRC; AETHER is the underlying C++23 persistent-world engine stack. AETHER owns reconstruction and Gaussian state, revision transactions, GPU publication, temporal state, and provenance/evidence capture, while a dense Python reference certifier and an independent full-after Gaussian oracle provide separate validation paths. Figure 1 summarizes the decision path, while Figure 2 shows the support-selection idea visually. The implementation records immutable before/after revision sidecars, deterministic certificate JSON, per-domain work, and oracle replay. Planner output alone is insufficient evidence of safety. Instead, the unrepaired exterior implied by the chosen support is compared with an independently rendered</w:t>
+        <w:t xml:space="preserve"> </w:t>
+      </w:r>
+      <w:r>
+        <w:t xml:space="preserve">baseline, otherwise enlarge it or return</w:t>
       </w:r>
       <w:r>
         <w:t xml:space="preserve"> </w:t>
@@ -377,7 +385,146 @@
         <w:t xml:space="preserve">Full</w:t>
       </w:r>
       <w:r>
-        <w:t xml:space="preserve">-after reference and checked under the contract</w:t>
+        <w:t xml:space="preserve">.</w:t>
+      </w:r>
+    </w:p>
+    <w:p>
+      <w:pPr>
+        <w:pStyle w:val="FirstParagraph"/>
+      </w:pPr>
+      <w:r>
+        <w:t xml:space="preserve">This makes fallback part of the algorithm rather than an exceptional failure mode.</w:t>
+      </w:r>
+    </w:p>
+    <w:p>
+      <w:pPr>
+        <w:pStyle w:val="BodyText"/>
+      </w:pPr>
+      <w:r>
+        <w:t xml:space="preserve">The dependency distinction is implementation-facing. A</w:t>
+      </w:r>
+      <w:r>
+        <w:t xml:space="preserve"> </w:t>
+      </w:r>
+      <w:r>
+        <w:rPr>
+          <w:smallCaps/>
+        </w:rPr>
+        <w:t xml:space="preserve">Hard</w:t>
+      </w:r>
+      <w:r>
+        <w:t xml:space="preserve"> </w:t>
+      </w:r>
+      <w:r>
+        <w:t xml:space="preserve">edge represents a relation such as ownership, identity, topology, publication, or unstable temporal invalidation that must remain exact. An</w:t>
+      </w:r>
+      <w:r>
+        <w:t xml:space="preserve"> </w:t>
+      </w:r>
+      <w:r>
+        <w:rPr>
+          <w:smallCaps/>
+        </w:rPr>
+        <w:t xml:space="preserve">Analytic</w:t>
+      </w:r>
+      <w:r>
+        <w:t xml:space="preserve"> </w:t>
+      </w:r>
+      <w:r>
+        <w:t xml:space="preserve">edge is used only where the implementation has a conservative finite-change bound. An</w:t>
+      </w:r>
+      <w:r>
+        <w:t xml:space="preserve"> </w:t>
+      </w:r>
+      <w:r>
+        <w:rPr>
+          <w:smallCaps/>
+        </w:rPr>
+        <w:t xml:space="preserve">Empirical</w:t>
+      </w:r>
+      <w:r>
+        <w:t xml:space="preserve"> </w:t>
+      </w:r>
+      <w:r>
+        <w:t xml:space="preserve">edge may influence search order, but it cannot certify correctness. Unsupported relations are not guessed; they are promoted to exact closure or force a full rebuild. The graph is constructed from persistent ownership and publication metadata already carried by the engine rather than learned from previous edit outcomes.</w:t>
+      </w:r>
+    </w:p>
+    <w:p>
+      <w:pPr>
+        <w:pStyle w:val="BodyText"/>
+      </w:pPr>
+      <w:r>
+        <w:t xml:space="preserve">For a protected output</w:t>
+      </w:r>
+      <w:r>
+        <w:t xml:space="preserve"> </w:t>
+      </w:r>
+      <m:oMath>
+        <m:r>
+          <m:t>q</m:t>
+        </m:r>
+      </m:oMath>
+      <w:r>
+        <w:t xml:space="preserve">,</w:t>
+      </w:r>
+      <w:r>
+        <w:t xml:space="preserve"> </w:t>
+      </w:r>
+      <m:oMath>
+        <m:sSub>
+          <m:e>
+            <m:r>
+              <m:t>ε</m:t>
+            </m:r>
+          </m:e>
+          <m:sub>
+            <m:r>
+              <m:t>q</m:t>
+            </m:r>
+          </m:sub>
+        </m:sSub>
+      </m:oMath>
+      <w:r>
+        <w:t xml:space="preserve"> </w:t>
+      </w:r>
+      <w:r>
+        <w:t xml:space="preserve">is the allowed difference from the corresponding full-after result. The planner emits a conservative bound</w:t>
+      </w:r>
+      <w:r>
+        <w:t xml:space="preserve"> </w:t>
+      </w:r>
+      <m:oMath>
+        <m:sSub>
+          <m:e>
+            <m:r>
+              <m:t>B</m:t>
+            </m:r>
+          </m:e>
+          <m:sub>
+            <m:r>
+              <m:t>q</m:t>
+            </m:r>
+          </m:sub>
+        </m:sSub>
+        <m:d>
+          <m:dPr>
+            <m:begChr m:val="("/>
+            <m:endChr m:val=")"/>
+            <m:sepChr m:val=""/>
+            <m:grow/>
+          </m:dPr>
+          <m:e>
+            <m:r>
+              <m:t>C</m:t>
+            </m:r>
+          </m:e>
+        </m:d>
+      </m:oMath>
+      <w:r>
+        <w:t xml:space="preserve"> </w:t>
+      </w:r>
+      <w:r>
+        <w:t xml:space="preserve">for the state left outside the proposed cone. The central contract is</w:t>
       </w:r>
     </w:p>
     <w:tbl>
@@ -626,24 +773,15 @@
         <w:t xml:space="preserve"> </w:t>
       </w:r>
       <w:r>
-        <w:t xml:space="preserve">is the measured residual attributable to the unrepaired exterior under the selected support, evaluated against an independent full-after rendering;</w:t>
+        <w:t xml:space="preserve">is measured independently during evaluation. The left inequality tests whether the certificate was conservative; the right inequality is the planner’s acceptance condition. Separately, the planner compares a calibrated regional-work estimate</w:t>
       </w:r>
       <w:r>
         <w:t xml:space="preserve"> </w:t>
       </w:r>
       <m:oMath>
-        <m:sSub>
-          <m:e>
-            <m:r>
-              <m:t>B</m:t>
-            </m:r>
-          </m:e>
-          <m:sub>
-            <m:r>
-              <m:t>q</m:t>
-            </m:r>
-          </m:sub>
-        </m:sSub>
+        <m:r>
+          <m:t>W</m:t>
+        </m:r>
         <m:d>
           <m:dPr>
             <m:begChr m:val="("/>
@@ -662,7 +800,7 @@
         <w:t xml:space="preserve"> </w:t>
       </w:r>
       <w:r>
-        <w:t xml:space="preserve">is the emitted conservative bound, and</w:t>
+        <w:t xml:space="preserve">with an independently measured</w:t>
       </w:r>
       <w:r>
         <w:t xml:space="preserve"> </w:t>
@@ -671,32 +809,39 @@
         <m:sSub>
           <m:e>
             <m:r>
-              <m:t>ε</m:t>
+              <m:t>W</m:t>
             </m:r>
           </m:e>
           <m:sub>
             <m:r>
-              <m:t>q</m:t>
+              <m:rPr>
+                <m:sty m:val="p"/>
+              </m:rPr>
+              <m:t>f</m:t>
+            </m:r>
+            <m:r>
+              <m:rPr>
+                <m:sty m:val="p"/>
+              </m:rPr>
+              <m:t>u</m:t>
+            </m:r>
+            <m:r>
+              <m:rPr>
+                <m:sty m:val="p"/>
+              </m:rPr>
+              <m:t>l</m:t>
+            </m:r>
+            <m:r>
+              <m:rPr>
+                <m:sty m:val="p"/>
+              </m:rPr>
+              <m:t>l</m:t>
             </m:r>
           </m:sub>
         </m:sSub>
       </m:oMath>
       <w:r>
-        <w:t xml:space="preserve"> </w:t>
-      </w:r>
-      <w:r>
-        <w:t xml:space="preserve">is the declared tolerance for quantity of interest</w:t>
-      </w:r>
-      <w:r>
-        <w:t xml:space="preserve"> </w:t>
-      </w:r>
-      <m:oMath>
-        <m:r>
-          <m:t>q</m:t>
-        </m:r>
-      </m:oMath>
-      <w:r>
-        <w:t xml:space="preserve">.</w:t>
+        <w:t xml:space="preserve">. The work model does not claim wall-clock speedup; it gives the planner a common scale for heterogeneous counters such as Gaussian updates, GPU publication bytes, and temporal invalidation pixels.</w:t>
       </w:r>
     </w:p>
     <w:p>
@@ -704,7 +849,15 @@
         <w:pStyle w:val="BodyText"/>
       </w:pPr>
       <w:r>
-        <w:t xml:space="preserve">Before examining aggregate outcomes, we fixed the evaluation protocol and claim boundaries. The broad campaign spans four dataset families, seeded and trained Gaussian representations, and four edit types; it exercises both</w:t>
+        <w:t xml:space="preserve">MAVEB is the research implementation of CBRC, and AETHER is the underlying C++23 persistent-3D stack. The system spans reconstruction state, Gaussian primitives, revision transactions, GPU publication, temporal history, and deterministic evidence capture. Exact graph dependencies come from explicit state ownership and back-references. The supported analytic paths include Gaussian display-space influence and stable temporal blending. A dense Python reference planner and an independent full-after Gaussian renderer check the native C++ decision path rather than trusting it by construction. Figure 1 shows the complete local-update decision, and Figure 2 illustrates how an edit expands into a selected recomputation region.</w:t>
+      </w:r>
+    </w:p>
+    <w:p>
+      <w:pPr>
+        <w:pStyle w:val="BodyText"/>
+      </w:pPr>
+      <w:r>
+        <w:t xml:space="preserve">We evaluate two questions separately. First, does the complete system choose useful local updates and fall back as coupling grows? The broad campaign contains 1,275 revisions over 85 scenes and selects 935</w:t>
       </w:r>
       <w:r>
         <w:t xml:space="preserve"> </w:t>
@@ -719,7 +872,7 @@
         <w:t xml:space="preserve"> </w:t>
       </w:r>
       <w:r>
-        <w:t xml:space="preserve">and</w:t>
+        <w:t xml:space="preserve">repairs and 340</w:t>
       </w:r>
       <w:r>
         <w:t xml:space="preserve"> </w:t>
@@ -734,7 +887,7 @@
         <w:t xml:space="preserve"> </w:t>
       </w:r>
       <w:r>
-        <w:t xml:space="preserve">outcomes and validates every selected result against independent full-after replay. Detailed counts, confidence intervals, and work ratios appear in Section 7. The central behavior is that stronger coupling increasingly drives the fail-closed path while selected outputs remain consistent with the independent reference.</w:t>
+        <w:t xml:space="preserve">fallbacks, with no observed certificate violation under independent replay and a median calibrated selected-work ratio of 0.474. Second, can the method certify deliberately non-zero residuals rather than only exact selected-to-full equality? A separate residual-sensitive sequence exposes a conservative certificate failure, changes only the opacity residual bound, and confirms the revised mechanism on 20 independently selected scenes while keeping translation as an unchanged control.</w:t>
       </w:r>
     </w:p>
     <w:p>
@@ -742,64 +895,25 @@
         <w:pStyle w:val="BodyText"/>
       </w:pPr>
       <w:r>
-        <w:t xml:space="preserve">The broad campaign deliberately uses exact selected-to-full agreement, which leaves bounded non-zero residuals untested. A second frozen experiment line addresses that question: a diagnostic identifies the original certificate bottleneck, a mechanism study changes only the opacity residual certificate while retaining translation as a control, and a final confirmatory study repeats the unchanged mechanism on independently ranked scenes from the same four dataset families. This staging separates diagnosis, mechanism change, and confirmation and prevents the same campaign from serving as both tuning and evidence.</w:t>
-      </w:r>
-    </w:p>
-    <w:p>
-      <w:pPr>
-        <w:pStyle w:val="BodyText"/>
-      </w:pPr>
-      <w:r>
-        <w:t xml:space="preserve">Operationally, this gives long-lived AR maps, digital twins, and reconstructed environments a middle path between two costly extremes: rebuilding everything after each change or trusting a nearby update without knowing what stale state remains. The system can stop propagation when the output effect is bounded, and it can abandon locality when that justification disappears.</w:t>
-      </w:r>
-    </w:p>
-    <w:p>
-      <w:pPr>
-        <w:pStyle w:val="BodyText"/>
-      </w:pPr>
-      <w:r>
-        <w:t xml:space="preserve">Our contribution is the systems rule that joins existing dependency and error-estimation ideas into one captured-world revision policy: exact structural closure, bounded exterior influence, output tolerances, work-aware selection, explicit fallback, immutable records, and independent falsification all participate in the same decision.</w:t>
-      </w:r>
-    </w:p>
-    <w:p>
-      <w:pPr>
-        <w:pStyle w:val="BodyText"/>
-      </w:pPr>
-      <w:r>
-        <w:t xml:space="preserve">The contributions are:</w:t>
-      </w:r>
-    </w:p>
-    <w:p>
-      <w:pPr>
-        <w:numPr>
-          <w:ilvl w:val="0"/>
-          <w:numId w:val="1001"/>
-        </w:numPr>
-      </w:pPr>
-      <w:r>
-        <w:t xml:space="preserve">a fail-closed formulation for revising heterogeneous persistent captured worlds, combining exact dependency closure with conservative finite-change propagation;</w:t>
-      </w:r>
-    </w:p>
-    <w:p>
-      <w:pPr>
-        <w:numPr>
-          <w:ilvl w:val="0"/>
-          <w:numId w:val="1001"/>
-        </w:numPr>
-      </w:pPr>
-      <w:r>
-        <w:t xml:space="preserve">output-specific certification for selective repair, including implementation-backed Gaussian display-space and stable temporal bounds, while unsupported dependencies stay exact;</w:t>
-      </w:r>
-    </w:p>
-    <w:p>
-      <w:pPr>
-        <w:numPr>
-          <w:ilvl w:val="0"/>
-          <w:numId w:val="1001"/>
-        </w:numPr>
-      </w:pPr>
-      <w:r>
-        <w:t xml:space="preserve">a native work-aware planner with automatic</w:t>
+        <w:t xml:space="preserve">The scope of the claim is intentionally narrower than universal</w:t>
+      </w:r>
+      <w:r>
+        <w:t xml:space="preserve"> </w:t>
+      </w:r>
+      <w:r>
+        <w:t xml:space="preserve">“</w:t>
+      </w:r>
+      <w:r>
+        <w:t xml:space="preserve">safe editing.</w:t>
+      </w:r>
+      <w:r>
+        <w:t xml:space="preserve">”</w:t>
+      </w:r>
+      <w:r>
+        <w:t xml:space="preserve"> </w:t>
+      </w:r>
+      <w:r>
+        <w:t xml:space="preserve">CBRC certifies a local recomputation only under the dependencies, renderer assumptions, quantities of interest, tolerances, and work calibration that are explicitly represented. If those assumptions are unsupported or too conservative, the method returns</w:t>
       </w:r>
       <w:r>
         <w:t xml:space="preserve"> </w:t>
@@ -811,21 +925,59 @@
         <w:t xml:space="preserve">Full</w:t>
       </w:r>
       <w:r>
-        <w:t xml:space="preserve"> </w:t>
-      </w:r>
-      <w:r>
-        <w:t xml:space="preserve">fallback, deterministic record generation, a dense reference implementation, and an independent full-after falsification path; and</w:t>
+        <w:t xml:space="preserve">. The paper therefore evaluates a graphics-systems algorithm for reducing recomputation, not a new reconstruction model, an edit detector, or a general proof of scene correctness.</w:t>
+      </w:r>
+    </w:p>
+    <w:p>
+      <w:pPr>
+        <w:pStyle w:val="BodyText"/>
+      </w:pPr>
+      <w:r>
+        <w:t xml:space="preserve">The technical contributions are:</w:t>
       </w:r>
     </w:p>
     <w:p>
       <w:pPr>
         <w:numPr>
           <w:ilvl w:val="0"/>
-          <w:numId w:val="1001"/>
+          <w:numId w:val="1002"/>
         </w:numPr>
       </w:pPr>
       <w:r>
-        <w:t xml:space="preserve">a staged evaluation that separates broad system behavior from residual-sensitive mechanism evidence: an immutable negative diagnostic, a controlled certificate change with an unchanged translation comparator, and a 20-scene confirmatory replication with scene-clustered statistics.</w:t>
+        <w:t xml:space="preserve">a cross-derived-state local-recompute formulation for persistent 3D reconstructions that distinguishes exact structural dependencies from conservatively bounded output influence;</w:t>
+      </w:r>
+    </w:p>
+    <w:p>
+      <w:pPr>
+        <w:numPr>
+          <w:ilvl w:val="0"/>
+          <w:numId w:val="1002"/>
+        </w:numPr>
+      </w:pPr>
+      <w:r>
+        <w:t xml:space="preserve">an executable acceptance rule that combines dependency closure, output-specific error bounds, a measured work crossover, and automatic full fallback in one revision algorithm;</w:t>
+      </w:r>
+    </w:p>
+    <w:p>
+      <w:pPr>
+        <w:numPr>
+          <w:ilvl w:val="0"/>
+          <w:numId w:val="1002"/>
+        </w:numPr>
+      </w:pPr>
+      <w:r>
+        <w:t xml:space="preserve">implementation-backed display-space bounds for Gaussian revisions, including an opacity-delta refinement that can certify bounded non-zero residuals under explicit assumptions; and</w:t>
+      </w:r>
+    </w:p>
+    <w:p>
+      <w:pPr>
+        <w:numPr>
+          <w:ilvl w:val="0"/>
+          <w:numId w:val="1002"/>
+        </w:numPr>
+      </w:pPr>
+      <w:r>
+        <w:t xml:space="preserve">an end-to-end implementation and evaluation across reconstruction, Gaussian, GPU-publication, and temporal state, with independent full-after replay, 85-scene broad testing, and a separate 20-scene residual-sensitive confirmation.</w:t>
       </w:r>
     </w:p>
     <w:p>
@@ -885,7 +1037,7 @@
         <w:t xml:space="preserve">Figure 1. </w:t>
       </w:r>
       <w:r>
-        <w:t xml:space="preserve">CBRC decision and falsification path. A physical revision enters a typed dependency graph. Exact</w:t>
+        <w:t xml:space="preserve">CBRC local-recompute decision and independent verification path. A physical edit enters a typed dependency graph. Exact</w:t>
       </w:r>
       <w:r>
         <w:t xml:space="preserve"> </w:t>
@@ -915,7 +1067,7 @@
         <w:t xml:space="preserve"> </w:t>
       </w:r>
       <w:r>
-        <w:t xml:space="preserve">influence is propagated to the unrepaired exterior, and quantity-of-interest bounds are checked against tolerance. A local repair is executed only when it is certified and cheaper than the full baseline; otherwise the system falls back to</w:t>
+        <w:t xml:space="preserve">influence is propagated through the state left unrecomputed, and output bounds are checked against tolerance. A local repair is executed only when it is certified and cheaper than the full baseline; otherwise the system falls back to</w:t>
       </w:r>
       <w:r>
         <w:t xml:space="preserve"> </w:t>
@@ -927,7 +1079,7 @@
         <w:t xml:space="preserve">Full</w:t>
       </w:r>
       <w:r>
-        <w:t xml:space="preserve">. The residual outside the selected repair support is then falsified against an independently rendered full-after reference.</w:t>
+        <w:t xml:space="preserve">. The selected output is then checked against an independently rendered full-after reference.</w:t>
       </w:r>
     </w:p>
     <w:p>
@@ -987,37 +1139,7 @@
         <w:t xml:space="preserve">Figure 2. </w:t>
       </w:r>
       <w:r>
-        <w:t xml:space="preserve">How a physical edit becomes a certified revision. An intended Gaussian edit induces a candidate influence region from which CBRC selects the support that must be repaired. Exact structural dependencies remain closed and the unrepaired exterior is accepted only when its quantity-of-interest bound satisfies the declared tolerance and regional work remains below the frozen</w:t>
-      </w:r>
-      <w:r>
-        <w:t xml:space="preserve"> </w:t>
-      </w:r>
-      <w:r>
-        <w:rPr>
-          <w:smallCaps/>
-        </w:rPr>
-        <w:t xml:space="preserve">Full</w:t>
-      </w:r>
-      <w:r>
-        <w:t xml:space="preserve"> </w:t>
-      </w:r>
-      <w:r>
-        <w:t xml:space="preserve">baseline. The system therefore either revises only the certified support (A) or fails closed to a</w:t>
-      </w:r>
-      <w:r>
-        <w:t xml:space="preserve"> </w:t>
-      </w:r>
-      <w:r>
-        <w:rPr>
-          <w:smallCaps/>
-        </w:rPr>
-        <w:t xml:space="preserve">Full</w:t>
-      </w:r>
-      <w:r>
-        <w:t xml:space="preserve"> </w:t>
-      </w:r>
-      <w:r>
-        <w:t xml:space="preserve">rebuild (B). Blue marks the intended edit, yellow the selected repair support. The supplied image is reproduced unchanged. Its embedded 28.40% work ratio, 3.5</w:t>
+        <w:t xml:space="preserve">From a physical edit to a selected recomputation region. The intended Gaussian change defines the initial affected state. CBRC expands that state until exact dependencies are closed and the influence left outside the region is within the declared output tolerance. The local result is used only when its estimated regional work is also below the full baseline; otherwise the algorithm selects a full rebuild. Blue marks the intended edit and yellow the state selected for recomputation. The supplied image is reproduced unchanged. Its embedded 28.40% work ratio, 3.5</w:t>
       </w:r>
       <m:oMath>
         <m:r>
@@ -1031,7 +1153,7 @@
         <w:t xml:space="preserve"> </w:t>
       </w:r>
       <w:r>
-        <w:t xml:space="preserve">work reduction, and other micro-metrics are illustrative values from the graphic and are separate from the aggregate campaign estimates reported in Section 7. Correctness labels in the image apply under the declared bound assumptions and revision domain; the figure makes no wall-clock or universal-safety claim.</w:t>
+        <w:t xml:space="preserve">work reduction, and other micro-metrics are illustrative values from the graphic and are separate from the aggregate campaign estimates reported in Section 7.</w:t>
       </w:r>
     </w:p>
     <w:bookmarkEnd w:id="27"/>
@@ -1293,13 +1415,13 @@
       </w:r>
     </w:p>
     <w:bookmarkEnd w:id="31"/>
-    <w:bookmarkStart w:id="32" w:name="Xe058922cb2ad9f50eb5d0cc67129a8e54cd7c86"/>
+    <w:bookmarkStart w:id="32" w:name="X521e27fe5d4cf7603a6ce9f6bcd113a60e3fcef"/>
     <w:p>
       <w:pPr>
         <w:pStyle w:val="Heading4"/>
       </w:pPr>
       <w:r>
-        <w:t xml:space="preserve">Incremental rendering, change propagation, and goal-oriented error control.</w:t>
+        <w:t xml:space="preserve">Incremental rendering, change propagation, and output-directed error control.</w:t>
       </w:r>
     </w:p>
     <w:p>
@@ -1334,7 +1456,7 @@
         <w:t xml:space="preserve">(Acar, Blume, and Donham 2013)</w:t>
       </w:r>
       <w:r>
-        <w:t xml:space="preserve">; goal-oriented error estimation directs numerical work toward selected quantities of interest instead of a global state norm</w:t>
+        <w:t xml:space="preserve">; goal-oriented error estimation directs numerical work toward selected outputs instead of a global state norm</w:t>
       </w:r>
       <w:r>
         <w:t xml:space="preserve"> </w:t>
@@ -1343,7 +1465,7 @@
         <w:t xml:space="preserve">(Oden and Prudhomme 2001)</w:t>
       </w:r>
       <w:r>
-        <w:t xml:space="preserve">. Several ingredients of CBRC come from these traditions. Our novelty claim concerns how they are assembled and enforced for persistent captured-world revision.</w:t>
+        <w:t xml:space="preserve">. These lines establish the ingredients that make local recomputation possible.</w:t>
       </w:r>
     </w:p>
     <w:p>
@@ -1351,7 +1473,7 @@
         <w:pStyle w:val="BodyText"/>
       </w:pPr>
       <w:r>
-        <w:t xml:space="preserve">The mathematical components used by CBRC are classical: graph closure, non-negative influence propagation, Neumann-series resolvents, norm bounds, and greedy search. The claimed contribution is a systems contract for captured worlds that brings these components together around one revision decision: exact dependencies across derived state, conservative finite-change bounds, rendered-output quantities of interest, a heterogeneous work crossover, fail-closed</w:t>
+        <w:t xml:space="preserve">The gap addressed here is the decision boundary inside a modern persistent 3D pipeline. Reconstruction state, explicit Gaussian primitives, GPU publication, and temporal history do not share one update unit or one error metric. CBRC turns those heterogeneous states into a single executable local-recompute decision: exact relations are closed, bounded relations contribute to an output-error certificate, heterogeneous work is compared with a full baseline, and unsupported or uneconomical cases return</w:t>
       </w:r>
       <w:r>
         <w:t xml:space="preserve"> </w:t>
@@ -1363,10 +1485,7 @@
         <w:t xml:space="preserve">Full</w:t>
       </w:r>
       <w:r>
-        <w:t xml:space="preserve"> </w:t>
-      </w:r>
-      <w:r>
-        <w:t xml:space="preserve">fallback, and independent full-reference falsification. These tools make the contract executable; the novelty claim concerns their captured-world integration and evidence path.</w:t>
+        <w:t xml:space="preserve">. The underlying graph and norm tools are standard; the technical contribution is their realization as a cross-derived-state graphics algorithm with an independent full-after check.</w:t>
       </w:r>
     </w:p>
     <w:bookmarkEnd w:id="32"/>
@@ -1389,7 +1508,7 @@
         <w:t xml:space="preserve">Problem Formulation</w:t>
       </w:r>
     </w:p>
-    <w:bookmarkStart w:id="34" w:name="persistent-captured-world-state"/>
+    <w:bookmarkStart w:id="34" w:name="persistent-3d-state-and-revision-cones"/>
     <w:p>
       <w:pPr>
         <w:pStyle w:val="Heading2"/>
@@ -1404,7 +1523,7 @@
         <w:tab/>
       </w:r>
       <w:r>
-        <w:t xml:space="preserve">Persistent captured-world state</w:t>
+        <w:t xml:space="preserve">Persistent 3D state and revision cones</w:t>
       </w:r>
     </w:p>
     <w:p>
@@ -1412,7 +1531,7 @@
         <w:pStyle w:val="FirstParagraph"/>
       </w:pPr>
       <w:r>
-        <w:t xml:space="preserve">Let the current system state be partitioned into blocks</w:t>
+        <w:t xml:space="preserve">Let the persistent system state be partitioned into blocks</w:t>
       </w:r>
     </w:p>
     <w:tbl>
@@ -1522,7 +1641,7 @@
         <w:pStyle w:val="FirstParagraph"/>
       </w:pPr>
       <w:r>
-        <w:t xml:space="preserve">A block can represent an observation region, TSDF block, mesh patch, texture page, material state, Gaussian subset, GPU publication range, temporal-history region, or another unit of derived state. It is a unit of computational ownership, not necessarily a regular spatial cell.</w:t>
+        <w:t xml:space="preserve">A block is a unit that can be recomputed or retained independently by the implementation: an observation region, TSDF block, mesh patch, texture page, material record, Gaussian subset, GPU publication range, temporal-history tile, or another derived-state unit. The partition is computational rather than purely spatial.</w:t>
       </w:r>
     </w:p>
     <w:p>
@@ -1530,7 +1649,7 @@
         <w:pStyle w:val="BodyText"/>
       </w:pPr>
       <w:r>
-        <w:t xml:space="preserve">A physical revision gives a direct change envelope</w:t>
+        <w:t xml:space="preserve">An edit provides a direct change envelope</w:t>
       </w:r>
       <w:r>
         <w:t xml:space="preserve"> </w:t>
@@ -1574,7 +1693,20 @@
         </m:sSubSup>
       </m:oMath>
       <w:r>
-        <w:t xml:space="preserve">. From there, the planner chooses a repair cone</w:t>
+        <w:t xml:space="preserve"> </w:t>
+      </w:r>
+      <w:r>
+        <w:t xml:space="preserve">for the blocks whose values are known to change. A</w:t>
+      </w:r>
+      <w:r>
+        <w:t xml:space="preserve"> </w:t>
+      </w:r>
+      <w:r>
+        <w:rPr>
+          <w:iCs/>
+          <w:i/>
+        </w:rPr>
+        <w:t xml:space="preserve">revision cone</w:t>
       </w:r>
       <w:r>
         <w:t xml:space="preserve"> </w:t>
@@ -1597,7 +1729,7 @@
         <w:t xml:space="preserve"> </w:t>
       </w:r>
       <w:r>
-        <w:t xml:space="preserve">and leaves the exterior</w:t>
+        <w:t xml:space="preserve">is the set of blocks selected for recomputation. The exterior</w:t>
       </w:r>
     </w:p>
     <w:tbl>
@@ -1677,35 +1809,33 @@
         <w:pStyle w:val="FirstParagraph"/>
       </w:pPr>
       <w:r>
-        <w:t xml:space="preserve">untouched. Small cones are useful, but minimizing</w:t>
+        <w:t xml:space="preserve">is intentionally retained from the previous state. Choosing a small</w:t>
       </w:r>
       <w:r>
         <w:t xml:space="preserve"> </w:t>
       </w:r>
       <m:oMath>
-        <m:d>
-          <m:dPr>
-            <m:begChr m:val="|"/>
-            <m:endChr m:val="|"/>
-            <m:sepChr m:val=""/>
-            <m:grow/>
-          </m:dPr>
-          <m:e>
-            <m:r>
-              <m:t>C</m:t>
-            </m:r>
-          </m:e>
-        </m:d>
+        <m:r>
+          <m:t>C</m:t>
+        </m:r>
       </m:oMath>
       <w:r>
         <w:t xml:space="preserve"> </w:t>
       </w:r>
       <w:r>
-        <w:t xml:space="preserve">by itself is not the objective. The cone has to remain feasible under the output certificate, and its measured or calibrated work must still beat the corresponding full rebuild.</w:t>
+        <w:t xml:space="preserve">gives computational locality; proving that the retained exterior changes the protected output by at most the allowed tolerance gives output locality. CBRC requires both.</w:t>
+      </w:r>
+    </w:p>
+    <w:p>
+      <w:pPr>
+        <w:pStyle w:val="BodyText"/>
+      </w:pPr>
+      <w:r>
+        <w:t xml:space="preserve">The planner does not need to execute the current revision globally in order to decide whether to try a local update. The initial change envelope comes from the requested edit and the current persistent metadata. Analytic bounds use the known before/after parameters of edited state and implementation-defined dependency bounds. Only the evaluation oracle performs an independent full-after replay, and it is used to test the planner rather than to make the planner’s decision.</w:t>
       </w:r>
     </w:p>
     <w:bookmarkEnd w:id="34"/>
-    <w:bookmarkStart w:id="36" w:name="typed-dependencies"/>
+    <w:bookmarkStart w:id="36" w:name="where-dependencies-come-from"/>
     <w:p>
       <w:pPr>
         <w:pStyle w:val="Heading2"/>
@@ -1720,7 +1850,7 @@
         <w:tab/>
       </w:r>
       <w:r>
-        <w:t xml:space="preserve">Typed dependencies</w:t>
+        <w:t xml:space="preserve">Where dependencies come from</w:t>
       </w:r>
     </w:p>
     <w:p>
@@ -1728,7 +1858,52 @@
         <w:pStyle w:val="FirstParagraph"/>
       </w:pPr>
       <w:r>
-        <w:t xml:space="preserve">Each dependency has one of three semantics (Table 1).</w:t>
+        <w:t xml:space="preserve">Each dependency has one of three semantics (Table 1). The categories are assigned by the implementation, not learned from historical success/failure labels. Exact ownership, identity, topology, publication, and invalidation relations become</w:t>
+      </w:r>
+      <w:r>
+        <w:t xml:space="preserve"> </w:t>
+      </w:r>
+      <w:r>
+        <w:rPr>
+          <w:smallCaps/>
+        </w:rPr>
+        <w:t xml:space="preserve">Hard</w:t>
+      </w:r>
+      <w:r>
+        <w:t xml:space="preserve"> </w:t>
+      </w:r>
+      <w:r>
+        <w:t xml:space="preserve">edges. A relation becomes</w:t>
+      </w:r>
+      <w:r>
+        <w:t xml:space="preserve"> </w:t>
+      </w:r>
+      <w:r>
+        <w:rPr>
+          <w:smallCaps/>
+        </w:rPr>
+        <w:t xml:space="preserve">Analytic</w:t>
+      </w:r>
+      <w:r>
+        <w:t xml:space="preserve"> </w:t>
+      </w:r>
+      <w:r>
+        <w:t xml:space="preserve">only when the implementation can produce a conservative finite-change upper bound for it. Measurements or learned signals may be stored as</w:t>
+      </w:r>
+      <w:r>
+        <w:t xml:space="preserve"> </w:t>
+      </w:r>
+      <w:r>
+        <w:rPr>
+          <w:smallCaps/>
+        </w:rPr>
+        <w:t xml:space="preserve">Empirical</w:t>
+      </w:r>
+      <w:r>
+        <w:t xml:space="preserve"> </w:t>
+      </w:r>
+      <w:r>
+        <w:t xml:space="preserve">edges to improve search order, but they cannot make a candidate certifiable.</w:t>
       </w:r>
     </w:p>
     <w:bookmarkStart w:id="35" w:name="tab:edges"/>
@@ -2067,7 +2242,7 @@
         <w:pStyle w:val="FirstParagraph"/>
       </w:pPr>
       <w:r>
-        <w:t xml:space="preserve">For each quantity of interest</w:t>
+        <w:t xml:space="preserve">A protected quantity of interest</w:t>
       </w:r>
       <w:r>
         <w:t xml:space="preserve"> </w:t>
@@ -2078,7 +2253,10 @@
         </m:r>
       </m:oMath>
       <w:r>
-        <w:t xml:space="preserve">, let</w:t>
+        <w:t xml:space="preserve"> </w:t>
+      </w:r>
+      <w:r>
+        <w:t xml:space="preserve">is an output whose deviation from a full rebuild matters to the application. In this paper the principal example is rendered RGB output on declared pixels. Let</w:t>
       </w:r>
       <w:r>
         <w:t xml:space="preserve"> </w:t>
@@ -2110,7 +2288,18 @@
         <w:t xml:space="preserve"> </w:t>
       </w:r>
       <w:r>
-        <w:t xml:space="preserve">denote its declared tolerance. A local repair is admissible only when</w:t>
+        <w:t xml:space="preserve">be the maximum allowed deviation. For a candidate cone</w:t>
+      </w:r>
+      <w:r>
+        <w:t xml:space="preserve"> </w:t>
+      </w:r>
+      <m:oMath>
+        <m:r>
+          <m:t>C</m:t>
+        </m:r>
+      </m:oMath>
+      <w:r>
+        <w:t xml:space="preserve">, the planner computes</w:t>
       </w:r>
       <w:r>
         <w:t xml:space="preserve"> </w:t>
@@ -2141,30 +2330,111 @@
             </m:r>
           </m:e>
         </m:d>
-        <m:r>
-          <m:rPr>
-            <m:sty m:val="p"/>
-          </m:rPr>
-          <m:t>≤</m:t>
-        </m:r>
-        <m:sSub>
-          <m:e>
-            <m:r>
-              <m:t>ε</m:t>
-            </m:r>
-          </m:e>
-          <m:sub>
-            <m:r>
-              <m:t>q</m:t>
-            </m:r>
-          </m:sub>
-        </m:sSub>
       </m:oMath>
       <w:r>
-        <w:t xml:space="preserve"> </w:t>
-      </w:r>
-      <w:r>
-        <w:t xml:space="preserve">for every protected output. That is the planner-side requirement. The experiment then asks the harder question by checking the independent full-reference contract in Eq. 1.</w:t>
+        <w:t xml:space="preserve">, a conservative bound on the effect of the state left unrecomputed. The candidate is output-feasible only when</w:t>
+      </w:r>
+    </w:p>
+    <w:tbl>
+      <w:tblPr>
+        <w:tblW w:type="auto" w:w="0"/>
+        <w:tblLayout w:type="fixed"/>
+        <w:tblLook w:firstColumn="1" w:firstRow="1" w:lastColumn="0" w:lastRow="0" w:noHBand="0" w:noVBand="1" w:val="04A0"/>
+        <w:tblBorders>
+          <w:top w:val="nil"/>
+          <w:left w:val="nil"/>
+          <w:bottom w:val="nil"/>
+          <w:right w:val="nil"/>
+          <w:insideH w:val="nil"/>
+          <w:insideV w:val="nil"/>
+        </w:tblBorders>
+      </w:tblPr>
+      <w:tblGrid>
+        <w:gridCol w:w="9144"/>
+        <w:gridCol w:w="648"/>
+      </w:tblGrid>
+      <w:tr>
+        <w:tc>
+          <w:tcPr>
+            <w:tcW w:type="dxa" w:w="5112"/>
+          </w:tcPr>
+          <w:p>
+            <w:pPr>
+              <w:jc w:val="center"/>
+            </w:pPr>
+            <m:oMathPara>
+              <m:oMathParaPr>
+                <m:jc m:val="center"/>
+              </m:oMathParaPr>
+              <m:oMath>
+                <m:sSub>
+                  <m:e>
+                    <m:r>
+                      <m:t>B</m:t>
+                    </m:r>
+                  </m:e>
+                  <m:sub>
+                    <m:r>
+                      <m:t>q</m:t>
+                    </m:r>
+                  </m:sub>
+                </m:sSub>
+                <m:d>
+                  <m:dPr>
+                    <m:begChr m:val="("/>
+                    <m:endChr m:val=")"/>
+                    <m:sepChr m:val=""/>
+                    <m:grow/>
+                  </m:dPr>
+                  <m:e>
+                    <m:r>
+                      <m:t>C</m:t>
+                    </m:r>
+                  </m:e>
+                </m:d>
+                <m:r>
+                  <m:rPr>
+                    <m:sty m:val="p"/>
+                  </m:rPr>
+                  <m:t>≤</m:t>
+                </m:r>
+                <m:sSub>
+                  <m:e>
+                    <m:r>
+                      <m:t>ε</m:t>
+                    </m:r>
+                  </m:e>
+                  <m:sub>
+                    <m:r>
+                      <m:t>q</m:t>
+                    </m:r>
+                  </m:sub>
+                </m:sSub>
+              </m:oMath>
+            </m:oMathPara>
+          </w:p>
+        </w:tc>
+        <w:tc>
+          <w:tcPr>
+            <w:tcW w:type="dxa" w:w="5112"/>
+          </w:tcPr>
+          <w:p>
+            <w:pPr>
+              <w:jc w:val="right"/>
+            </w:pPr>
+            <w:r>
+              <w:t>(4)</w:t>
+            </w:r>
+          </w:p>
+        </w:tc>
+      </w:tr>
+    </w:tbl>
+    <w:p>
+      <w:pPr>
+        <w:pStyle w:val="FirstParagraph"/>
+      </w:pPr>
+      <w:r>
+        <w:t xml:space="preserve">for every protected output. During evaluation, Eq. 1 additionally checks this certificate against an independently produced full-after reference.</w:t>
       </w:r>
     </w:p>
     <w:p>
@@ -2172,19 +2442,7 @@
         <w:pStyle w:val="BodyText"/>
       </w:pPr>
       <w:r>
-        <w:t xml:space="preserve">Locality also has to be worth doing. The planner therefore requires regional work to remain below</w:t>
-      </w:r>
-      <w:r>
-        <w:t xml:space="preserve"> </w:t>
-      </w:r>
-      <w:r>
-        <w:rPr>
-          <w:smallCaps/>
-        </w:rPr>
-        <w:t xml:space="preserve">Full</w:t>
-      </w:r>
-      <w:r>
-        <w:t xml:space="preserve">. Because the native counters describe different kinds of work, adding them directly would be meaningless. If</w:t>
+        <w:t xml:space="preserve">Local recomputation must also be cheaper than rebuilding. Native work counters have different units, so they are not added directly. If</w:t>
       </w:r>
       <w:r>
         <w:t xml:space="preserve"> </w:t>
@@ -2220,7 +2478,7 @@
         <w:t xml:space="preserve"> </w:t>
       </w:r>
       <w:r>
-        <w:t xml:space="preserve">is native work in domain</w:t>
+        <w:t xml:space="preserve">is the amount of native work in domain</w:t>
       </w:r>
       <w:r>
         <w:t xml:space="preserve"> </w:t>
@@ -2257,7 +2515,7 @@
         <w:t xml:space="preserve"> </w:t>
       </w:r>
       <w:r>
-        <w:t xml:space="preserve">is the frozen calibrated cost of one native unit, the public campaign uses</w:t>
+        <w:t xml:space="preserve">is a cost per native unit measured in a separate calibration run, the planner uses</w:t>
       </w:r>
     </w:p>
     <w:tbl>
@@ -2390,7 +2648,7 @@
               <w:jc w:val="right"/>
             </w:pPr>
             <w:r>
-              <w:t>(4)</w:t>
+              <w:t>(5)</w:t>
             </w:r>
           </w:p>
         </w:tc>
@@ -2401,7 +2659,7 @@
         <w:pStyle w:val="FirstParagraph"/>
       </w:pPr>
       <w:r>
-        <w:t xml:space="preserve">with</w:t>
+        <w:t xml:space="preserve">and compares it with an independently measured</w:t>
       </w:r>
       <w:r>
         <w:t xml:space="preserve"> </w:t>
@@ -2442,15 +2700,35 @@
         </m:sSub>
       </m:oMath>
       <w:r>
-        <w:t xml:space="preserve"> </w:t>
-      </w:r>
-      <w:r>
-        <w:t xml:space="preserve">measured independently. The calibration is frozen before the final campaign. Equation 4 models heterogeneous work. End-to-end timing is a separate measurement outside this metric.</w:t>
+        <w:t xml:space="preserve">. The coefficients</w:t>
+      </w:r>
+      <w:r>
+        <w:t xml:space="preserve"> </w:t>
+      </w:r>
+      <m:oMath>
+        <m:sSub>
+          <m:e>
+            <m:r>
+              <m:t>κ</m:t>
+            </m:r>
+          </m:e>
+          <m:sub>
+            <m:r>
+              <m:t>d</m:t>
+            </m:r>
+          </m:sub>
+        </m:sSub>
+      </m:oMath>
+      <w:r>
+        <w:t xml:space="preserve"> </w:t>
+      </w:r>
+      <w:r>
+        <w:t xml:space="preserve">are frozen before the reported campaign; they are not fitted after seeing whether an individual revision succeeds. This is a heterogeneous work proxy, not an end-to-end timing claim.</w:t>
       </w:r>
     </w:p>
     <w:bookmarkEnd w:id="37"/>
     <w:bookmarkEnd w:id="38"/>
-    <w:bookmarkStart w:id="50" w:name="criticality-bounded-revision-cones"/>
+    <w:bookmarkStart w:id="50" w:name="algorithm-certified-local-recompute"/>
     <w:p>
       <w:pPr>
         <w:pStyle w:val="Heading1"/>
@@ -2465,7 +2743,7 @@
         <w:tab/>
       </w:r>
       <w:r>
-        <w:t xml:space="preserve">Criticality-Bounded Revision Cones</w:t>
+        <w:t xml:space="preserve">Algorithm: Certified Local Recompute</w:t>
       </w:r>
     </w:p>
     <w:bookmarkStart w:id="39" w:name="exact-predecessor-closure"/>
@@ -2691,7 +2969,7 @@
               <w:jc w:val="right"/>
             </w:pPr>
             <w:r>
-              <w:t>(5)</w:t>
+              <w:t>(6)</w:t>
             </w:r>
           </w:p>
         </w:tc>
@@ -2702,7 +2980,7 @@
         <w:pStyle w:val="FirstParagraph"/>
       </w:pPr>
       <w:r>
-        <w:t xml:space="preserve">This condition is checked before any approximate reasoning. If Eq. 5 is violated, the candidate is invalid regardless of how small a local sensitivity estimate happens to be.</w:t>
+        <w:t xml:space="preserve">This condition is checked before any approximate reasoning. If Eq. 6 is violated, the candidate is invalid regardless of how small a local sensitivity estimate happens to be.</w:t>
       </w:r>
     </w:p>
     <w:bookmarkEnd w:id="39"/>
@@ -3021,7 +3299,7 @@
               <w:jc w:val="right"/>
             </w:pPr>
             <w:r>
-              <w:t>(6)</w:t>
+              <w:t>(7)</w:t>
             </w:r>
           </w:p>
         </w:tc>
@@ -3266,7 +3544,7 @@
               <w:jc w:val="right"/>
             </w:pPr>
             <w:r>
-              <w:t>(7)</w:t>
+              <w:t>(8)</w:t>
             </w:r>
           </w:p>
         </w:tc>
@@ -3469,7 +3747,7 @@
               <w:jc w:val="right"/>
             </w:pPr>
             <w:r>
-              <w:t>(8)</w:t>
+              <w:t>(9)</w:t>
             </w:r>
           </w:p>
         </w:tc>
@@ -3492,7 +3770,7 @@
         <w:t xml:space="preserve">Full</w:t>
       </w:r>
       <w:r>
-        <w:t xml:space="preserve">. Equation 8 is the reference formulation; production support is limited to the stated DAG case.</w:t>
+        <w:t xml:space="preserve">. Equation 9 is the reference formulation; production support is limited to the stated DAG case.</w:t>
       </w:r>
     </w:p>
     <w:bookmarkEnd w:id="40"/>
@@ -3699,7 +3977,7 @@
               <w:jc w:val="right"/>
             </w:pPr>
             <w:r>
-              <w:t>(9)</w:t>
+              <w:t>(10)</w:t>
             </w:r>
           </w:p>
         </w:tc>
@@ -3768,7 +4046,7 @@
       </w:r>
     </w:p>
     <w:bookmarkEnd w:id="41"/>
-    <w:bookmarkStart w:id="42" w:name="revision-criticality"/>
+    <w:bookmarkStart w:id="42" w:name="normalized-certificate-ratio"/>
     <w:p>
       <w:pPr>
         <w:pStyle w:val="Heading2"/>
@@ -3783,7 +4061,7 @@
         <w:tab/>
       </w:r>
       <w:r>
-        <w:t xml:space="preserve">Revision criticality</w:t>
+        <w:t xml:space="preserve">Normalized certificate ratio</w:t>
       </w:r>
     </w:p>
     <w:p>
@@ -3791,7 +4069,7 @@
         <w:pStyle w:val="FirstParagraph"/>
       </w:pPr>
       <w:r>
-        <w:t xml:space="preserve">We use</w:t>
+        <w:t xml:space="preserve">For search and diagnosis we summarize all output constraints with the worst normalized certified residual. We call this scalar the</w:t>
       </w:r>
       <w:r>
         <w:t xml:space="preserve"> </w:t>
@@ -3807,7 +4085,7 @@
         <w:t xml:space="preserve"> </w:t>
       </w:r>
       <w:r>
-        <w:t xml:space="preserve">for the worst normalized certified residual of a candidate cone</w:t>
+        <w:t xml:space="preserve">of a candidate cone</w:t>
       </w:r>
     </w:p>
     <w:tbl>
@@ -4224,7 +4502,7 @@
               <w:jc w:val="right"/>
             </w:pPr>
             <w:r>
-              <w:t>(10)</w:t>
+              <w:t>(11)</w:t>
             </w:r>
           </w:p>
         </w:tc>
@@ -4507,7 +4785,7 @@
               <w:jc w:val="right"/>
             </w:pPr>
             <w:r>
-              <w:t>(11)</w:t>
+              <w:t>(12)</w:t>
             </w:r>
           </w:p>
         </w:tc>
@@ -4600,7 +4878,7 @@
         <w:t xml:space="preserve"> </w:t>
       </w:r>
       <w:r>
-        <w:t xml:space="preserve">means the effective value after the renderer’s clamp and cutoff rules, not simply the raw value from Eq. 11. For an edited set</w:t>
+        <w:t xml:space="preserve">means the effective value after the renderer’s clamp and cutoff rules, not simply the raw value from Eq. 12. For an edited set</w:t>
       </w:r>
       <w:r>
         <w:t xml:space="preserve"> </w:t>
@@ -4778,7 +5056,7 @@
               <w:jc w:val="right"/>
             </w:pPr>
             <w:r>
-              <w:t>(12)</w:t>
+              <w:t>(13)</w:t>
             </w:r>
           </w:p>
         </w:tc>
@@ -5218,7 +5496,7 @@
               <w:jc w:val="right"/>
             </w:pPr>
             <w:r>
-              <w:t>(13)</w:t>
+              <w:t>(14)</w:t>
             </w:r>
           </w:p>
         </w:tc>
@@ -5659,7 +5937,7 @@
         </m:sSub>
       </m:oMath>
       <w:r>
-        <w:t xml:space="preserve">. The image-level certificate takes the maximum of Eq. 13 over the declared protected pixels. The supplement gives the algebra in more detail.</w:t>
+        <w:t xml:space="preserve">. The image-level certificate takes the maximum of Eq. 14 over the declared protected pixels. The supplement gives the algebra in more detail.</w:t>
       </w:r>
     </w:p>
     <w:bookmarkEnd w:id="45"/>
@@ -5677,7 +5955,7 @@
         <w:pStyle w:val="FirstParagraph"/>
       </w:pPr>
       <w:r>
-        <w:t xml:space="preserve">Equation 13 is intentionally general, but it is insensitive to how small an opacity-only edit is: the before/after opacity masses can remain large even when their difference is tiny. For paired Gaussian records whose position, projected covariance, depth order, rotation, and spherical-harmonic color are unchanged, the implementation uses the compositor’s coordinate-wise Lipschitz property in effective alpha. Let</w:t>
+        <w:t xml:space="preserve">Equation 14 is intentionally general, but it is insensitive to how small an opacity-only edit is: the before/after opacity masses can remain large even when their difference is tiny. For paired Gaussian records whose position, projected covariance, depth order, rotation, and spherical-harmonic color are unchanged, the implementation uses the compositor’s coordinate-wise Lipschitz property in effective alpha. Let</w:t>
       </w:r>
       <w:r>
         <w:t xml:space="preserve"> </w:t>
@@ -6003,7 +6281,7 @@
               <w:jc w:val="right"/>
             </w:pPr>
             <w:r>
-              <w:t>(14)</w:t>
+              <w:t>(15)</w:t>
             </w:r>
           </w:p>
         </w:tc>
@@ -6053,7 +6331,7 @@
         </m:r>
       </m:oMath>
       <w:r>
-        <w:t xml:space="preserve">. The allowance is added only where an opacity delta is actually admitted, so pixels outside changed support retain a zero bound. The routine fails closed if any paired primitive changes geometry, rotation, covariance, spherical-harmonic coefficients, or camera visibility unexpectedly. V5 and v6 use this refinement for opacity residuals; their translation control continues to use Eq. 13.</w:t>
+        <w:t xml:space="preserve">. The allowance is added only where an opacity delta is actually admitted, so pixels outside changed support retain a zero bound. The routine fails closed if any paired primitive changes geometry, rotation, covariance, spherical-harmonic coefficients, or camera visibility unexpectedly. V5 and v6 use this refinement for opacity residuals; their translation control continues to use Eq. 14.</w:t>
       </w:r>
     </w:p>
     <w:bookmarkEnd w:id="46"/>
@@ -6436,7 +6714,7 @@
               <w:jc w:val="right"/>
             </w:pPr>
             <w:r>
-              <w:t>(15)</w:t>
+              <w:t>(16)</w:t>
             </w:r>
           </w:p>
         </w:tc>
@@ -6447,7 +6725,7 @@
         <w:pStyle w:val="FirstParagraph"/>
       </w:pPr>
       <w:r>
-        <w:t xml:space="preserve">If validation, reprojection, or disocclusion can itself change, MAVEB does not apply Eq. 15; it promotes the relation to</w:t>
+        <w:t xml:space="preserve">If validation, reprojection, or disocclusion can itself change, MAVEB does not apply Eq. 16; it promotes the relation to</w:t>
       </w:r>
       <w:r>
         <w:t xml:space="preserve"> </w:t>
@@ -6466,7 +6744,7 @@
       </w:r>
     </w:p>
     <w:bookmarkEnd w:id="48"/>
-    <w:bookmarkStart w:id="49" w:name="X62e354406816ed1168c1ad132bd8541650ea272"/>
+    <w:bookmarkStart w:id="49" w:name="X29e4cdf6404c848e9fc1574c22c6334d8dee7b2"/>
     <w:p>
       <w:pPr>
         <w:pStyle w:val="Heading2"/>
@@ -6481,7 +6759,7 @@
         <w:tab/>
       </w:r>
       <w:r>
-        <w:t xml:space="preserve">Greedy feasible-cone search and crossover</w:t>
+        <w:t xml:space="preserve">Cone selection and automatic full fallback</w:t>
       </w:r>
     </w:p>
     <w:p>
@@ -6948,7 +7226,7 @@
               <w:jc w:val="right"/>
             </w:pPr>
             <w:r>
-              <w:t>(16)</w:t>
+              <w:t>(17)</w:t>
             </w:r>
           </w:p>
         </w:tc>
@@ -6976,7 +7254,7 @@
     </w:p>
     <w:bookmarkEnd w:id="49"/>
     <w:bookmarkEnd w:id="50"/>
-    <w:bookmarkStart w:id="55" w:name="system-implementation"/>
+    <w:bookmarkStart w:id="56" w:name="system-implementation"/>
     <w:p>
       <w:pPr>
         <w:pStyle w:val="Heading1"/>
@@ -6999,15 +7277,33 @@
         <w:pStyle w:val="FirstParagraph"/>
       </w:pPr>
       <w:r>
-        <w:t xml:space="preserve">Throughout this section, MAVEB names the experimental CBRC research system and AETHER names its underlying native persistent-world software stack. MAVEB keeps the scientific reference path separate from the production-oriented AETHER execution path. The dense Python certifier follows the mathematical contract directly and serves as a falsification and regression reference. The native C++23 AETHER implementation uses a sparse typed revision graph, sparse analytic propagation over supported DAG exteriors, exact predecessor checks, greedy feasible-cone search, and deterministic certificate serialization. For the frozen campaign, the bound production output-cone graph is evaluated by both the native planner and the Python reference planner; their final decisions are compared rather than assumed equivalent.</w:t>
-      </w:r>
-    </w:p>
-    <w:bookmarkStart w:id="51" w:name="revision-transactions."/>
+        <w:t xml:space="preserve">MAVEB is the experimental implementation of CBRC and AETHER is the underlying C++23 persistent-3D software stack. The native path uses a sparse typed revision graph, sparse analytic propagation over supported DAG exteriors, exact predecessor closure, work-aware cone search, and deterministic certificate serialization. A separate dense Python implementation follows the mathematical contract directly and is used as a reference check. The native and Python planners evaluate the same campaign inputs and their final decisions are compared rather than assumed equivalent.</w:t>
+      </w:r>
+    </w:p>
+    <w:bookmarkStart w:id="51" w:name="dependency-construction."/>
     <w:p>
       <w:pPr>
         <w:pStyle w:val="Heading4"/>
       </w:pPr>
       <w:r>
+        <w:t xml:space="preserve">Dependency construction.</w:t>
+      </w:r>
+    </w:p>
+    <w:p>
+      <w:pPr>
+        <w:pStyle w:val="FirstParagraph"/>
+      </w:pPr>
+      <w:r>
+        <w:t xml:space="preserve">The graph is built from explicit state relations already present in the engine. Observation identifiers map to reconstruction blocks; reconstruction blocks own mesh regions; persistent Gaussian entities map to GPU publication ranges; temporal tiles record the screen-space history they retain. These relations become exact edges when stale state could invalidate identity, ownership, topology, publication, or temporal validity. Analytic edges are enabled only for implemented bounded mechanisms such as Gaussian display-space influence and stable temporal blending. There is no learned dependency discovery in the reported planner, and previous edit outcomes are not used as correctness evidence.</w:t>
+      </w:r>
+    </w:p>
+    <w:bookmarkEnd w:id="51"/>
+    <w:bookmarkStart w:id="52" w:name="revision-transactions."/>
+    <w:p>
+      <w:pPr>
+        <w:pStyle w:val="Heading4"/>
+      </w:pPr>
+      <w:r>
         <w:t xml:space="preserve">Revision transactions.</w:t>
       </w:r>
     </w:p>
@@ -7019,8 +7315,8 @@
         <w:t xml:space="preserve">The production path records persistent Gaussian entity translations, immutable before/after sidecars, exact camera binding, a production image certificate, and the planner’s temporal repair or retention decision. In headless operation, the system loads a persistent world, applies indexed Gaussian transactions, writes the new durable revision and sidecars, evaluates the Gaussian certificate, runs the output-cone planner, and emits canonical evidence JSON. If the consistency checks do not pass, the revision fails closed instead of publishing a partly updated world.</w:t>
       </w:r>
     </w:p>
-    <w:bookmarkEnd w:id="51"/>
-    <w:bookmarkStart w:id="52" w:name="cross-derived-state-accounting."/>
+    <w:bookmarkEnd w:id="52"/>
+    <w:bookmarkStart w:id="53" w:name="cross-derived-state-accounting."/>
     <w:p>
       <w:pPr>
         <w:pStyle w:val="Heading4"/>
@@ -7052,8 +7348,8 @@
         <w:t xml:space="preserve">tracks observation, TSDF, mesh, texture-page, material, Gaussian, GPU-publication, and temporal work; ledger/mesher disagreement is an error. Counts retain their native units until a versioned calibration is applied. The frozen public campaign calibrates only four measured domains: Gaussian inspection, Gaussian update, GPU publication bytes, and temporal invalidation pixels.</w:t>
       </w:r>
     </w:p>
-    <w:bookmarkEnd w:id="52"/>
-    <w:bookmarkStart w:id="53" w:name="independent-oracle."/>
+    <w:bookmarkEnd w:id="53"/>
+    <w:bookmarkStart w:id="54" w:name="independent-oracle."/>
     <w:p>
       <w:pPr>
         <w:pStyle w:val="Heading4"/>
@@ -7070,8 +7366,8 @@
         <w:t xml:space="preserve">The Gaussian oracle is independent of the planner. It renders before and full-after states, then forms a support replay from full-after values on the selected support and before-state values outside it. The per-pixel exterior residual is checked against Eq. 1; certificate disagreement or a residual above the emitted bound is a correctness failure. Evidence bundles record hashes, workflow IDs, and native/reference output-cone parity.</w:t>
       </w:r>
     </w:p>
-    <w:bookmarkEnd w:id="53"/>
-    <w:bookmarkStart w:id="54" w:name="representation-scope."/>
+    <w:bookmarkEnd w:id="54"/>
+    <w:bookmarkStart w:id="55" w:name="representation-scope."/>
     <w:p>
       <w:pPr>
         <w:pStyle w:val="Heading4"/>
@@ -7085,7 +7381,7 @@
         <w:pStyle w:val="FirstParagraph"/>
       </w:pPr>
       <w:r>
-        <w:t xml:space="preserve">The paper-grade campaign contains two representation classes. Seventy-two scenes from 3RScan</w:t>
+        <w:t xml:space="preserve">The broad campaign contains two representation classes. Seventy-two scenes from 3RScan</w:t>
       </w:r>
       <w:r>
         <w:t xml:space="preserve"> </w:t>
@@ -7166,9 +7462,9 @@
         <w:t xml:space="preserve">render fidelity is measured within the evaluated representation, separately from reconstruction quality against original camera photographs.</w:t>
       </w:r>
     </w:p>
-    <w:bookmarkEnd w:id="54"/>
     <w:bookmarkEnd w:id="55"/>
-    <w:bookmarkStart w:id="61" w:name="evaluation"/>
+    <w:bookmarkEnd w:id="56"/>
+    <w:bookmarkStart w:id="62" w:name="evaluation"/>
     <w:p>
       <w:pPr>
         <w:pStyle w:val="Heading1"/>
@@ -7186,7 +7482,7 @@
         <w:t xml:space="preserve">Evaluation</w:t>
       </w:r>
     </w:p>
-    <w:bookmarkStart w:id="58" w:name="questions-and-frozen-protocol"/>
+    <w:bookmarkStart w:id="59" w:name="questions-and-protocol"/>
     <w:p>
       <w:pPr>
         <w:pStyle w:val="Heading2"/>
@@ -7201,7 +7497,7 @@
         <w:tab/>
       </w:r>
       <w:r>
-        <w:t xml:space="preserve">Questions and frozen protocol</w:t>
+        <w:t xml:space="preserve">Questions and protocol</w:t>
       </w:r>
     </w:p>
     <w:p>
@@ -7209,7 +7505,7 @@
         <w:pStyle w:val="FirstParagraph"/>
       </w:pPr>
       <w:r>
-        <w:t xml:space="preserve">The paper-grade evaluation asks six questions. RQ1 tests whether every published</w:t>
+        <w:t xml:space="preserve">We evaluate CBRC as an incremental graphics-systems algorithm rather than as a reconstruction-quality method. Four questions drive the experiments. First, when the planner publishes a</w:t>
       </w:r>
       <w:r>
         <w:t xml:space="preserve"> </w:t>
@@ -7224,10 +7520,74 @@
         <w:t xml:space="preserve"> </w:t>
       </w:r>
       <w:r>
-        <w:t xml:space="preserve">decision satisfies the emitted certificate under independent full-after replay. RQ2 measures how often the fail-closed rule selects</w:t>
-      </w:r>
-      <w:r>
-        <w:t xml:space="preserve"> </w:t>
+        <w:t xml:space="preserve">result, does independent full-after replay stay within the emitted bound and declared tolerance? Second, how does the opportunity for locality change with coupling strength and edit type? Third, how much calibrated work does the selected decision require relative to a full rebuild? Fourth, do those behaviors persist across dataset families, seeded and trained Gaussian representations, and alternative selection policies?</w:t>
+      </w:r>
+    </w:p>
+    <w:p>
+      <w:pPr>
+        <w:pStyle w:val="BodyText"/>
+      </w:pPr>
+      <w:r>
+        <w:t xml:space="preserve">The broad campaign is fixed before outcome inspection. It contains 1,275 revisions over 85 scenes: 600 cases on 40 3RScan reference/rescan worlds</w:t>
+      </w:r>
+      <w:r>
+        <w:t xml:space="preserve"> </w:t>
+      </w:r>
+      <w:r>
+        <w:t xml:space="preserve">(Wald et al. 2019)</w:t>
+      </w:r>
+      <w:r>
+        <w:t xml:space="preserve">, 300 cases on 20 ARKitScenes worlds</w:t>
+      </w:r>
+      <w:r>
+        <w:t xml:space="preserve"> </w:t>
+      </w:r>
+      <w:r>
+        <w:t xml:space="preserve">(Baruch et al. 2021)</w:t>
+      </w:r>
+      <w:r>
+        <w:t xml:space="preserve">, 180 cases on 12 Bonn dynamic RGB-D sequences</w:t>
+      </w:r>
+      <w:r>
+        <w:t xml:space="preserve"> </w:t>
+      </w:r>
+      <w:r>
+        <w:t xml:space="preserve">(Palazzolo et al. 2019)</w:t>
+      </w:r>
+      <w:r>
+        <w:t xml:space="preserve">, and 195 cases on 13 pinned pretrained GraphDECO 3DGS scenes drawn from Mip-NeRF 360, Tanks &amp; Temples, and Deep Blending</w:t>
+      </w:r>
+      <w:r>
+        <w:t xml:space="preserve"> </w:t>
+      </w:r>
+      <w:r>
+        <w:t xml:space="preserve">(Kerbl et al. 2023; Barron et al. 2022; Knapitsch et al. 2017; Hedman et al. 2018)</w:t>
+      </w:r>
+      <w:r>
+        <w:t xml:space="preserve">. Every scene contributes the same 15-case coupling template. The evaluated edit families are translation, rotation, uniform-scale, and opacity. Fallbacks remain part of the evaluation because returning</w:t>
+      </w:r>
+      <w:r>
+        <w:t xml:space="preserve"> </w:t>
+      </w:r>
+      <w:r>
+        <w:rPr>
+          <w:smallCaps/>
+        </w:rPr>
+        <w:t xml:space="preserve">Full</w:t>
+      </w:r>
+      <w:r>
+        <w:t xml:space="preserve"> </w:t>
+      </w:r>
+      <w:r>
+        <w:t xml:space="preserve">is an explicit algorithmic outcome rather than a discarded case.</w:t>
+      </w:r>
+    </w:p>
+    <w:p>
+      <w:pPr>
+        <w:pStyle w:val="BodyText"/>
+      </w:pPr>
+      <w:r>
+        <w:t xml:space="preserve">Each case records the source edit, chosen cone, decision (</w:t>
       </w:r>
       <w:r>
         <w:rPr>
@@ -7239,7 +7599,7 @@
         <w:t xml:space="preserve"> </w:t>
       </w:r>
       <w:r>
-        <w:t xml:space="preserve">versus</w:t>
+        <w:t xml:space="preserve">or</w:t>
       </w:r>
       <w:r>
         <w:t xml:space="preserve"> </w:t>
@@ -7251,74 +7611,7 @@
         <w:t xml:space="preserve">Full</w:t>
       </w:r>
       <w:r>
-        <w:t xml:space="preserve"> </w:t>
-      </w:r>
-      <w:r>
-        <w:t xml:space="preserve">as coupling increases. RQ3 measures calibrated selected work relative to the frozen full baseline. RQ4 tests whether the behavior persists across datasets and across seeded versus trained Gaussian representations. RQ5 tests translation, rotation, uniform-scale, and opacity edits under the same revision contract. RQ6 compares the resulting decisions with full, exact, fixed-radius, changed-fraction, empirical-order, and mechanism-ablation policies.</w:t>
-      </w:r>
-    </w:p>
-    <w:p>
-      <w:pPr>
-        <w:pStyle w:val="BodyText"/>
-      </w:pPr>
-      <w:r>
-        <w:t xml:space="preserve">The campaign is frozen before outcome inspection. It contains 1,275 revisions over 85 scenes: 600 cases on 40 3RScan reference/rescan worlds</w:t>
-      </w:r>
-      <w:r>
-        <w:t xml:space="preserve"> </w:t>
-      </w:r>
-      <w:r>
-        <w:t xml:space="preserve">(Wald et al. 2019)</w:t>
-      </w:r>
-      <w:r>
-        <w:t xml:space="preserve">, 300 cases on 20 ARKitScenes worlds</w:t>
-      </w:r>
-      <w:r>
-        <w:t xml:space="preserve"> </w:t>
-      </w:r>
-      <w:r>
-        <w:t xml:space="preserve">(Baruch et al. 2021)</w:t>
-      </w:r>
-      <w:r>
-        <w:t xml:space="preserve">, 180 cases on 12 Bonn dynamic RGB-D sequences</w:t>
-      </w:r>
-      <w:r>
-        <w:t xml:space="preserve"> </w:t>
-      </w:r>
-      <w:r>
-        <w:t xml:space="preserve">(Palazzolo et al. 2019)</w:t>
-      </w:r>
-      <w:r>
-        <w:t xml:space="preserve">, and 195 cases on 13 pinned pretrained GraphDECO 3DGS scenes drawn from Mip-NeRF 360, Tanks &amp; Temples, and Deep Blending</w:t>
-      </w:r>
-      <w:r>
-        <w:t xml:space="preserve"> </w:t>
-      </w:r>
-      <w:r>
-        <w:t xml:space="preserve">(Kerbl et al. 2023; Barron et al. 2022; Knapitsch et al. 2017; Hedman et al. 2018)</w:t>
-      </w:r>
-      <w:r>
-        <w:t xml:space="preserve">. Every scene contributes the same 15-case coupling template, while edit family rotates through translation, rotation, uniform scale, and opacity. The frozen protocol therefore separates outcome inspection from threshold or case construction.</w:t>
-      </w:r>
-    </w:p>
-    <w:p>
-      <w:pPr>
-        <w:pStyle w:val="BodyText"/>
-      </w:pPr>
-      <w:r>
-        <w:t xml:space="preserve">Each case records the source edit, chosen cone, decision (</w:t>
-      </w:r>
-      <w:r>
-        <w:rPr>
-          <w:smallCaps/>
-        </w:rPr>
-        <w:t xml:space="preserve">Local</w:t>
-      </w:r>
-      <w:r>
-        <w:t xml:space="preserve"> </w:t>
-      </w:r>
-      <w:r>
-        <w:t xml:space="preserve">or</w:t>
+        <w:t xml:space="preserve">), certificate, independent full-after replay, work, baselines, ablations, and provenance. The visual audit compares the selected output with the independent</w:t>
       </w:r>
       <w:r>
         <w:t xml:space="preserve"> </w:t>
@@ -7330,22 +7623,10 @@
         <w:t xml:space="preserve">Full</w:t>
       </w:r>
       <w:r>
-        <w:t xml:space="preserve">), certificate, independent full-after replay, work, baselines, ablations, and provenance. Fallbacks stay in the dataset because they are part of the method’s behavior. The final visual audit compares the selected output with the independent</w:t>
-      </w:r>
-      <w:r>
-        <w:t xml:space="preserve"> </w:t>
-      </w:r>
-      <w:r>
-        <w:rPr>
-          <w:smallCaps/>
-        </w:rPr>
-        <w:t xml:space="preserve">Full</w:t>
-      </w:r>
-      <w:r>
         <w:t xml:space="preserve">-after render at the same camera.</w:t>
       </w:r>
     </w:p>
-    <w:bookmarkStart w:id="56" w:name="work-metric."/>
+    <w:bookmarkStart w:id="57" w:name="work-metric."/>
     <w:p>
       <w:pPr>
         <w:pStyle w:val="Heading4"/>
@@ -7359,11 +7640,11 @@
         <w:pStyle w:val="FirstParagraph"/>
       </w:pPr>
       <w:r>
-        <w:t xml:space="preserve">The headline work ratio uses the frozen heterogeneous work model from Eq. 4. The four calibrated domains are Gaussian inspection, Gaussian update, GPU publication bytes, and temporal invalidation pixels. Bootstrap intervals use 5,000 resamples. The work ratio is an execution-independent accounting metric; paired local-versus-full wall-clock timing remains outside the current claim.</w:t>
-      </w:r>
-    </w:p>
-    <w:bookmarkEnd w:id="56"/>
-    <w:bookmarkStart w:id="57" w:name="statistical-reporting."/>
+        <w:t xml:space="preserve">The headline work ratio uses the frozen heterogeneous work model from Eq. 5. The four calibrated domains are Gaussian inspection, Gaussian update, GPU publication bytes, and temporal invalidation pixels. Bootstrap intervals use 5,000 resamples. The work ratio is an execution-independent accounting metric; paired local-versus-full wall-clock timing remains outside the current claim.</w:t>
+      </w:r>
+    </w:p>
+    <w:bookmarkEnd w:id="57"/>
+    <w:bookmarkStart w:id="58" w:name="statistical-reporting."/>
     <w:p>
       <w:pPr>
         <w:pStyle w:val="Heading4"/>
@@ -7380,9 +7661,9 @@
         <w:t xml:space="preserve">Local and violation rates in the broad campaign use Wilson 95% intervals. Median work ratios use bootstrap 95% intervals. Paired baseline comparisons count cases in which both policies certify, then report which policy uses less calibrated work, ties, and an exact two-sided sign test when the comparison is informative. The confirmatory residual study uses the scene as its primary sampling unit. Its 95% intervals resample scenes within each fixed dataset stratum, preserving the five-scene-per-dataset design in every bootstrap replicate; the 3,840 parameter cases are pooled evidence, not 3,840 independent samples.</w:t>
       </w:r>
     </w:p>
-    <w:bookmarkEnd w:id="57"/>
     <w:bookmarkEnd w:id="58"/>
-    <w:bookmarkStart w:id="59" w:name="residual-sensitive-protocol"/>
+    <w:bookmarkEnd w:id="59"/>
+    <w:bookmarkStart w:id="60" w:name="residual-sensitive-protocol"/>
     <w:p>
       <w:pPr>
         <w:pStyle w:val="Heading2"/>
@@ -7583,8 +7864,8 @@
         <w:t xml:space="preserve">V6 is a confirmatory breadth run of the unchanged v5 mechanism. Thresholds, residual scales, edit magnitudes, locality profiles, and the control family remain fixed. Five deterministically ranked scenes are selected from each of 3RScan, ARKitScenes, Bonn RGB-D Dynamic, and trained GraphDECO 3DGS, giving 20 scenes and 3,840 pooled parameter cases. Confirmation gates are fixed before execution, and outcome inspection cannot trigger scene or case replacement.</w:t>
       </w:r>
     </w:p>
-    <w:bookmarkEnd w:id="59"/>
-    <w:bookmarkStart w:id="60" w:name="baselines-and-ablations"/>
+    <w:bookmarkEnd w:id="60"/>
+    <w:bookmarkStart w:id="61" w:name="baselines-and-ablations"/>
     <w:p>
       <w:pPr>
         <w:pStyle w:val="Heading2"/>
@@ -7622,9 +7903,9 @@
         <w:t xml:space="preserve">, exact-only repair, fixed graph radii, changed-fraction selection, empirical ordering followed by analytic re-certification, and CBRC. Structural ablations remove individual mechanisms while retaining the frozen campaign. We preserve neutral ablations as neutral results. A mechanism can remain important to the contract even when this real matrix does not separate its aggregate work from the full method; deterministic mechanism-isolation tests are retained separately for falsifiability.</w:t>
       </w:r>
     </w:p>
-    <w:bookmarkEnd w:id="60"/>
     <w:bookmarkEnd w:id="61"/>
-    <w:bookmarkStart w:id="73" w:name="sec:results"/>
+    <w:bookmarkEnd w:id="62"/>
+    <w:bookmarkStart w:id="74" w:name="sec:results"/>
     <w:p>
       <w:pPr>
         <w:pStyle w:val="Heading1"/>
@@ -7642,7 +7923,7 @@
         <w:t xml:space="preserve">Results</w:t>
       </w:r>
     </w:p>
-    <w:bookmarkStart w:id="63" w:name="overall-paper-grade-campaign"/>
+    <w:bookmarkStart w:id="64" w:name="overall-broad-campaign"/>
     <w:p>
       <w:pPr>
         <w:pStyle w:val="Heading2"/>
@@ -7657,7 +7938,7 @@
         <w:tab/>
       </w:r>
       <w:r>
-        <w:t xml:space="preserve">Overall paper-grade campaign</w:t>
+        <w:t xml:space="preserve">Overall broad campaign</w:t>
       </w:r>
     </w:p>
     <w:p>
@@ -7860,7 +8141,7 @@
               <w:jc w:val="right"/>
             </w:pPr>
             <w:r>
-              <w:t>(17)</w:t>
+              <w:t>(18)</w:t>
             </w:r>
           </w:p>
         </w:tc>
@@ -7886,7 +8167,7 @@
         <w:t xml:space="preserve">. The minimum observed ratio is 0.07030; fallback cases have ratio 1 by construction.</w:t>
       </w:r>
     </w:p>
-    <w:bookmarkStart w:id="62" w:name="tab:datasets"/>
+    <w:bookmarkStart w:id="63" w:name="tab:datasets"/>
     <w:p>
       <w:pPr>
         <w:pStyle w:val="TableCaption"/>
@@ -7896,7 +8177,7 @@
         <w:t xml:space="preserve">Table 2. </w:t>
       </w:r>
       <w:r>
-        <w:t xml:space="preserve">Paper-grade results by dataset/representation. Work is calibrated selected work divided by the frozen</w:t>
+        <w:t xml:space="preserve">Results by dataset/representation. Work is calibrated selected work divided by the frozen</w:t>
       </w:r>
       <w:r>
         <w:t xml:space="preserve"> </w:t>
@@ -7920,7 +8201,7 @@
         <w:tblLayout w:type="fixed"/>
         <w:tblLook w:firstRow="1" w:lastRow="0" w:firstColumn="0" w:lastColumn="0" w:noHBand="0" w:noVBand="0" w:val="0020"/>
         <w:jc w:val="start"/>
-        <w:tblCaption w:val="Paper-grade results by dataset/representation. Work is calibrated selected work divided by the frozen Full baseline. Confidence intervals are Wilson intervals for local rate and bootstrap intervals for median work."/>
+        <w:tblCaption w:val="Results by dataset/representation. Work is calibrated selected work divided by the frozen Full baseline. Confidence intervals are Wilson intervals for local rate and bootstrap intervals for median work."/>
         <w:tblBorders>
           <w:top w:val="single" w:sz="4" w:color="B0B0B0"/>
           <w:bottom w:val="single" w:sz="4" w:color="B0B0B0"/>
@@ -8646,7 +8927,7 @@
         </w:tc>
       </w:tr>
     </w:tbl>
-    <w:bookmarkEnd w:id="62"/>
+    <w:bookmarkEnd w:id="63"/>
     <w:p>
       <w:pPr>
         <w:pStyle w:val="BodyText"/>
@@ -8655,8 +8936,8 @@
         <w:t xml:space="preserve">The identical 73.33% local rate across datasets is a consequence of applying the same frozen 15-case coupling template to every scene; it should not be interpreted as evidence that the datasets behave identically. Dataset-dependent work differs substantially: the median ratio is 0.341 on 3RScan and 0.519 on trained 3DGS.</w:t>
       </w:r>
     </w:p>
-    <w:bookmarkEnd w:id="63"/>
-    <w:bookmarkStart w:id="65" w:name="coupling-controls-fallback-behavior"/>
+    <w:bookmarkEnd w:id="64"/>
+    <w:bookmarkStart w:id="66" w:name="coupling-controls-fallback-behavior"/>
     <w:p>
       <w:pPr>
         <w:pStyle w:val="Heading2"/>
@@ -8682,7 +8963,7 @@
         <w:t xml:space="preserve">The fail-closed envelope becomes visible when the campaign is grouped by coupling regime. All low and medium cases remain local. High coupling produces 170 local repairs and 85 fallbacks, while adversarial coupling produces 85 local repairs and 255 fallbacks. The frozen matrix therefore shows a monotonic shift toward fallback as coupling strengthens.</w:t>
       </w:r>
     </w:p>
-    <w:bookmarkStart w:id="64" w:name="tab:coupling"/>
+    <w:bookmarkStart w:id="65" w:name="tab:coupling"/>
     <w:p>
       <w:pPr>
         <w:pStyle w:val="TableCaption"/>
@@ -9208,9 +9489,9 @@
         </w:tc>
       </w:tr>
     </w:tbl>
-    <w:bookmarkEnd w:id="64"/>
     <w:bookmarkEnd w:id="65"/>
-    <w:bookmarkStart w:id="67" w:name="generalization-across-edit-families"/>
+    <w:bookmarkEnd w:id="66"/>
+    <w:bookmarkStart w:id="68" w:name="generalization-across-edit-families"/>
     <w:p>
       <w:pPr>
         <w:pStyle w:val="Heading2"/>
@@ -9236,7 +9517,7 @@
         <w:t xml:space="preserve">The same revision contract is exercised across four edit families. Opacity remains local in all 255 cases. Translation and rotation each remain local in 255 of 340 cases. Uniform scale is the hardest family in the frozen matrix, with 170 local repairs and 170 fallbacks. No edit family contains an observed certificate violation.</w:t>
       </w:r>
     </w:p>
-    <w:bookmarkStart w:id="66" w:name="tab:edits"/>
+    <w:bookmarkStart w:id="67" w:name="tab:edits"/>
     <w:p>
       <w:pPr>
         <w:pStyle w:val="TableCaption"/>
@@ -9246,7 +9527,7 @@
         <w:t xml:space="preserve">Table 4. </w:t>
       </w:r>
       <w:r>
-        <w:t xml:space="preserve">Paper-grade outcomes by edit family.</w:t>
+        <w:t xml:space="preserve">Outcomes by edit family.</w:t>
       </w:r>
     </w:p>
     <w:tbl>
@@ -9255,7 +9536,7 @@
         <w:tblLayout w:type="fixed"/>
         <w:tblLook w:firstRow="1" w:lastRow="0" w:firstColumn="0" w:lastColumn="0" w:noHBand="0" w:noVBand="0" w:val="0020"/>
         <w:jc w:val="start"/>
-        <w:tblCaption w:val="Paper-grade outcomes by edit family."/>
+        <w:tblCaption w:val="Outcomes by edit family."/>
         <w:tblBorders>
           <w:top w:val="single" w:sz="4" w:color="B0B0B0"/>
           <w:bottom w:val="single" w:sz="4" w:color="B0B0B0"/>
@@ -9762,9 +10043,9 @@
         </w:tc>
       </w:tr>
     </w:tbl>
-    <w:bookmarkEnd w:id="66"/>
     <w:bookmarkEnd w:id="67"/>
-    <w:bookmarkStart w:id="68" w:name="independent-selected-render-audit"/>
+    <w:bookmarkEnd w:id="68"/>
+    <w:bookmarkStart w:id="69" w:name="independent-selected-render-audit"/>
     <w:p>
       <w:pPr>
         <w:pStyle w:val="Heading2"/>
@@ -10020,7 +10301,7 @@
               <w:jc w:val="right"/>
             </w:pPr>
             <w:r>
-              <w:t>(18)</w:t>
+              <w:t>(19)</w:t>
             </w:r>
           </w:p>
         </w:tc>
@@ -10034,8 +10315,8 @@
         <w:t xml:space="preserve">The separately frozen residual-sensitive sequence below targets exactly this regime without changing the broad campaign.</w:t>
       </w:r>
     </w:p>
-    <w:bookmarkEnd w:id="68"/>
-    <w:bookmarkStart w:id="71" w:name="X24b105bc73302b772c5af53b6ce76fa00fabece"/>
+    <w:bookmarkEnd w:id="69"/>
+    <w:bookmarkStart w:id="72" w:name="X24b105bc73302b772c5af53b6ce76fa00fabece"/>
     <w:p>
       <w:pPr>
         <w:pStyle w:val="Heading2"/>
@@ -10116,7 +10397,7 @@
         <w:t xml:space="preserve">V6 repeats the same mechanism across 20 independent scenes. The confirmatory audit passes every predeclared gate, with no selected-certificate or repair-certificate violation. Non-zero opacity locality occurs in all 20 scenes and all four dataset families; opacity crossover also occurs in all 20 scenes. Across scenes, the mean opacity non-zero-local rate is 0.477, with a dataset-stratified scene-bootstrap 95% interval of [0.432, 0.517]. Translation remains at 0.000 [0.000, 0.000], so the paired opacity-minus-translation difference is numerically the same 0.477 [0.432, 0.517]. The generic audit contains 687 certified non-zero local cases and 151 tolerance-crossover groups.</w:t>
       </w:r>
     </w:p>
-    <w:bookmarkStart w:id="69" w:name="tab:residual-sequence"/>
+    <w:bookmarkStart w:id="70" w:name="tab:residual-sequence"/>
     <w:p>
       <w:pPr>
         <w:pStyle w:val="TableCaption"/>
@@ -10564,7 +10845,7 @@
         </w:tc>
       </w:tr>
     </w:tbl>
-    <w:bookmarkEnd w:id="69"/>
+    <w:bookmarkEnd w:id="70"/>
     <w:p>
       <w:pPr>
         <w:pStyle w:val="BodyText"/>
@@ -10573,7 +10854,7 @@
         <w:t xml:space="preserve">The same-opacity legacy-envelope counterfactual provides a direct mechanism check in v6. Holding the physical opacity edit fixed, the delta-sensitive certificate rescues a mean 0.531 of cases per scene that the legacy envelope would reject (95% interval [0.512, 0.549]); all 20 scenes contain at least one such rescue. The median scene-level ratio of legacy residual bound to delta-sensitive bound is 122.3. This comparison addresses sensitivity; tightness remains a separate question. The accepted cases remain far from the tolerance boundary: the largest scene maximum of measured residual divided by epsilon is 0.0812, the median of those scene maxima is 0.0195, and there are no near-boundary local cases. The median scene-level residual effectivity is approximately 1168, so conservatism remains measured alongside the positive locality result.</w:t>
       </w:r>
     </w:p>
-    <w:bookmarkStart w:id="70" w:name="tab:v6-scene"/>
+    <w:bookmarkStart w:id="71" w:name="tab:v6-scene"/>
     <w:p>
       <w:pPr>
         <w:pStyle w:val="TableCaption"/>
@@ -10949,9 +11230,9 @@
         </w:tc>
       </w:tr>
     </w:tbl>
-    <w:bookmarkEnd w:id="70"/>
     <w:bookmarkEnd w:id="71"/>
-    <w:bookmarkStart w:id="72" w:name="baselines-and-ablations-1"/>
+    <w:bookmarkEnd w:id="72"/>
+    <w:bookmarkStart w:id="73" w:name="baselines-and-ablations-1"/>
     <w:p>
       <w:pPr>
         <w:pStyle w:val="Heading2"/>
@@ -11041,9 +11322,9 @@
         <w:t xml:space="preserve">Several comparisons are neutral. Empirical ordering followed by analytic re-certification ties CBRC in all 1,275 jointly certified cases. Five ablations also tie on aggregate work: Gaussian bound, hard/soft distinction, predecessor closure, QoI specialization, and temporal bound. Exact-only and fixed-radius policies certify 340 of 1,275 cases. The changed-fraction policy certifies 537. Removing fallback leaves 340 certified cases. We retain these results because the experiment characterizes the contract instead of forcing every mechanism to separate.</w:t>
       </w:r>
     </w:p>
-    <w:bookmarkEnd w:id="72"/>
     <w:bookmarkEnd w:id="73"/>
-    <w:bookmarkStart w:id="83" w:name="discussion"/>
+    <w:bookmarkEnd w:id="74"/>
+    <w:bookmarkStart w:id="84" w:name="discussion"/>
     <w:p>
       <w:pPr>
         <w:pStyle w:val="Heading1"/>
@@ -11061,7 +11342,7 @@
         <w:t xml:space="preserve">Discussion</w:t>
       </w:r>
     </w:p>
-    <w:bookmarkStart w:id="74" w:name="what-the-evidence-establishes"/>
+    <w:bookmarkStart w:id="75" w:name="what-the-method-adds"/>
     <w:p>
       <w:pPr>
         <w:pStyle w:val="Heading2"/>
@@ -11076,7 +11357,7 @@
         <w:tab/>
       </w:r>
       <w:r>
-        <w:t xml:space="preserve">What the evidence establishes</w:t>
+        <w:t xml:space="preserve">What the method adds</w:t>
       </w:r>
     </w:p>
     <w:p>
@@ -11084,7 +11365,7 @@
         <w:pStyle w:val="FirstParagraph"/>
       </w:pPr>
       <w:r>
-        <w:t xml:space="preserve">The broad campaign establishes the normal operating envelope: independent replay exercises both local repair and full fallback across four datasets and two representation classes, with work reduction varying by dataset, edit family, and coupling strength. The residual-sensitive sequence answers a different question. V4 shows that a magnitude-insensitive image certificate can erase useful locality even when the repair itself is graded; V5 isolates a certificate change that restores non-zero opacity locality while leaving the translation control unchanged; and V6 tests the same mechanism on a wider frozen scene set. Taken together, the stages separate implementation fidelity, certificate sensitivity, and breadth instead of compressing them into one aggregate success metric.</w:t>
+        <w:t xml:space="preserve">The broad campaign shows where the algorithm is useful and where it deliberately gives up locality. A local update is not accepted because the edit is spatially small; it is accepted only when exact dependencies are closed, the retained exterior is bounded at the protected output, and the estimated work remains below the full baseline. In the 1,275-case campaign that opportunity exists in 935 cases (73.33%) and disappears in 340 cases (26.67%), with fallback becoming more common as coupling strengthens. The method therefore has a measurable operating region rather than assuming that most real edits are local.</w:t>
       </w:r>
     </w:p>
     <w:p>
@@ -11092,11 +11373,11 @@
         <w:pStyle w:val="BodyText"/>
       </w:pPr>
       <w:r>
-        <w:t xml:space="preserve">The result is best understood as a systems contract built from established dependency and error-estimation ideas. Dependency-aware recomputation, self-adjusting computation, norm bounds, and goal-oriented error estimation provide the underlying traditions. CBRC specializes them into a persistent captured-world rule that requires exact structural closure, conservative exterior accounting, output-specific tolerances, a frozen work crossover, explicit fallback, immutable evidence, and independent full-after falsification.</w:t>
-      </w:r>
-    </w:p>
-    <w:bookmarkEnd w:id="74"/>
-    <w:bookmarkStart w:id="81" w:name="limitations"/>
+        <w:t xml:space="preserve">The technical contribution is the decision rule across heterogeneous persistent graphics state. Existing reconstruction, Gaussian editing, and continual mapping methods determine how scene state is represented or changed. CBRC sits after an edit has been specified and asks a different systems question: which derived blocks can remain stale without exceeding an output contract? Exact graph closure handles structural correctness, analytic bounds handle supported finite influence, the work model handles whether reuse is worthwhile, and the independent full-after path checks the resulting certificate. The broad campaign exercises implementation fidelity; the residual-sensitive sequence separately tests whether bounded non-zero output error can be admitted rather than forcing exact equality.</w:t>
+      </w:r>
+    </w:p>
+    <w:bookmarkEnd w:id="75"/>
+    <w:bookmarkStart w:id="82" w:name="limitations"/>
     <w:p>
       <w:pPr>
         <w:pStyle w:val="Heading2"/>
@@ -11114,7 +11395,7 @@
         <w:t xml:space="preserve">Limitations</w:t>
       </w:r>
     </w:p>
-    <w:bookmarkStart w:id="75" w:name="X3dd20d9e9f03d02c05d7041b35ed7e30f0fc43a"/>
+    <w:bookmarkStart w:id="76" w:name="X3dd20d9e9f03d02c05d7041b35ed7e30f0fc43a"/>
     <w:p>
       <w:pPr>
         <w:pStyle w:val="Heading4"/>
@@ -11131,8 +11412,8 @@
         <w:t xml:space="preserve">The broad campaign is exact at the audited 8-bit raster, while v5 and v6 demonstrate certified non-zero residuals. That closes the earlier evidence gap while leaving certificate tightness unresolved. Accepted v6 cases remain comfortably inside the tolerance boundary and residual effectivity remains high (Table 6), showing substantial safety margin alongside substantial conservatism. The supported claim is repeatable residual-sensitive locality under the tested opacity-only assumptions; tighter display-space error estimation remains open.</w:t>
       </w:r>
     </w:p>
-    <w:bookmarkEnd w:id="75"/>
-    <w:bookmarkStart w:id="76" w:name="X5849c22a44d2c0856a55e902847917a7307dde0"/>
+    <w:bookmarkEnd w:id="76"/>
+    <w:bookmarkStart w:id="77" w:name="X5849c22a44d2c0856a55e902847917a7307dde0"/>
     <w:p>
       <w:pPr>
         <w:pStyle w:val="Heading4"/>
@@ -11149,8 +11430,8 @@
         <w:t xml:space="preserve">The headline work result is a frozen four-domain accounting ratio. It captures heterogeneous work under a versioned calibration while omitting allocator behavior, synchronization, cache locality, command submission, and pipeline overlap. Paired end-to-end timing therefore remains a separate matched-runtime study.</w:t>
       </w:r>
     </w:p>
-    <w:bookmarkEnd w:id="76"/>
-    <w:bookmarkStart w:id="77" w:name="X2365b001744f4c2f543c90fcb9e5db402bb7d25"/>
+    <w:bookmarkEnd w:id="77"/>
+    <w:bookmarkStart w:id="78" w:name="X2365b001744f4c2f543c90fcb9e5db402bb7d25"/>
     <w:p>
       <w:pPr>
         <w:pStyle w:val="Heading4"/>
@@ -11164,11 +11445,11 @@
         <w:pStyle w:val="FirstParagraph"/>
       </w:pPr>
       <w:r>
-        <w:t xml:space="preserve">The broad campaign is materially wider than the earlier four-scene experiment: it contains 72 dataset-native geometry worlds and 13 trained 3DGS scenes. Even so, the measured revision path concentrates on Gaussian inspection/update, GPU publication, and temporal output invalidation. The wider observation/TSDF/mesh/texture/material ledger is implemented and regression-tested; an equally broad paper-grade performance campaign for that ledger remains future work.</w:t>
-      </w:r>
-    </w:p>
-    <w:bookmarkEnd w:id="77"/>
-    <w:bookmarkStart w:id="78" w:name="Xa0683ce4ad7cba86b3be8bf2130203078c33852"/>
+        <w:t xml:space="preserve">The broad campaign is materially wider than the earlier four-scene experiment: it contains 72 dataset-native geometry worlds and 13 trained 3DGS scenes. Even so, the measured revision path concentrates on Gaussian inspection/update, GPU publication, and temporal output invalidation. The wider observation/TSDF/mesh/texture/material ledger is implemented and regression-tested; an equally broad performance campaign for that wider ledger remains future work.</w:t>
+      </w:r>
+    </w:p>
+    <w:bookmarkEnd w:id="78"/>
+    <w:bookmarkStart w:id="79" w:name="Xa0683ce4ad7cba86b3be8bf2130203078c33852"/>
     <w:p>
       <w:pPr>
         <w:pStyle w:val="Heading4"/>
@@ -11197,8 +11478,8 @@
         <w:t xml:space="preserve">equality therefore measures revision fidelity within each evaluated representation. Photorealistic reconstruction quality against held-out photographs lies outside this benchmark’s scope.</w:t>
       </w:r>
     </w:p>
-    <w:bookmarkEnd w:id="78"/>
-    <w:bookmarkStart w:id="79" w:name="X3685eeeb62b2a4a177916a1d22ac9c0ec887228"/>
+    <w:bookmarkEnd w:id="79"/>
+    <w:bookmarkStart w:id="80" w:name="X3685eeeb62b2a4a177916a1d22ac9c0ec887228"/>
     <w:p>
       <w:pPr>
         <w:pStyle w:val="Heading4"/>
@@ -11212,11 +11493,11 @@
         <w:pStyle w:val="FirstParagraph"/>
       </w:pPr>
       <w:r>
-        <w:t xml:space="preserve">Several ablations tie the full method on aggregate work and certification. We keep those ties visible. The mechanism-isolation tests establish that those components can become consequential under controlled stress, while the paper-grade matrix shows limited influence from them on aggregate real-scene outcomes.</w:t>
-      </w:r>
-    </w:p>
-    <w:bookmarkEnd w:id="79"/>
-    <w:bookmarkStart w:id="80" w:name="X689c205daaaf6af64c9bf5871238fbb527c769c"/>
+        <w:t xml:space="preserve">Several ablations tie the full method on aggregate work and certification. We keep those ties visible. The mechanism-isolation tests establish that those components can become consequential under controlled stress, while the broad matrix shows limited influence from them on aggregate real-scene outcomes.</w:t>
+      </w:r>
+    </w:p>
+    <w:bookmarkEnd w:id="80"/>
+    <w:bookmarkStart w:id="81" w:name="X689c205daaaf6af64c9bf5871238fbb527c769c"/>
     <w:p>
       <w:pPr>
         <w:pStyle w:val="Heading4"/>
@@ -11233,9 +11514,9 @@
         <w:t xml:space="preserve">Uniform-scale and adversarial cases trigger many full rebuilds. Those fallbacks are part of the intended behavior: when exterior influence, temporal stability, or work crossover cannot support a local result, the system prefers a full revision. The selected cones carry no global optimality guarantee.</w:t>
       </w:r>
     </w:p>
-    <w:bookmarkEnd w:id="80"/>
     <w:bookmarkEnd w:id="81"/>
-    <w:bookmarkStart w:id="82" w:name="implications"/>
+    <w:bookmarkEnd w:id="82"/>
+    <w:bookmarkStart w:id="83" w:name="when-the-method-is-useful"/>
     <w:p>
       <w:pPr>
         <w:pStyle w:val="Heading2"/>
@@ -11250,7 +11531,7 @@
         <w:tab/>
       </w:r>
       <w:r>
-        <w:t xml:space="preserve">Implications</w:t>
+        <w:t xml:space="preserve">When the method is useful</w:t>
       </w:r>
     </w:p>
     <w:p>
@@ -11258,7 +11539,7 @@
         <w:pStyle w:val="FirstParagraph"/>
       </w:pPr>
       <w:r>
-        <w:t xml:space="preserve">The main practical lesson is to treat locality as a contract instead of a geometric assumption. A small physical edit is a useful starting cue, but the publishable decision depends on the dependency closure, the protected output, the tolerated residual, and the cost of carrying the repair through derived state. This framing also makes failure informative. A</w:t>
+        <w:t xml:space="preserve">CBRC is useful when the persistent representation exposes stable ownership, publication, and output-influence structure. If every edit globally changes visibility, topology, or temporal validity, the revision cone expands to</w:t>
       </w:r>
       <w:r>
         <w:t xml:space="preserve"> </w:t>
@@ -11273,7 +11554,7 @@
         <w:t xml:space="preserve"> </w:t>
       </w:r>
       <w:r>
-        <w:t xml:space="preserve">result identifies a revision for which the current model cannot justify leaving enough of the world untouched.</w:t>
+        <w:t xml:space="preserve">and the method provides no computational advantage. Likewise, an overly conservative analytic bound can erase locality even when the actual residual is small; the v4 diagnostic demonstrates exactly that failure. The v5/v6 opacity experiment shows the complementary case: making the certificate sensitive to the actual alpha change restores local decisions without changing the physical edit or the translation control.</w:t>
       </w:r>
     </w:p>
     <w:p>
@@ -11281,12 +11562,42 @@
         <w:pStyle w:val="BodyText"/>
       </w:pPr>
       <w:r>
-        <w:t xml:space="preserve">The residual-sensitive experiments make this distinction concrete. A local result can differ measurably from the full-after result and remain admissible when the measured residual stays below both the conservative bound and the declared tolerance. The v4 failure shows that permitting error is insufficient; the certificate must represent residual magnitude. V5 and v6 show that this behavior is repeatable for opacity-only residuals across the tested datasets. The open problem is how far the conservative bound can be tightened while preserving the fail-closed guarantee.</w:t>
-      </w:r>
-    </w:p>
-    <w:bookmarkEnd w:id="82"/>
+        <w:t xml:space="preserve">This distinction is important operationally. A</w:t>
+      </w:r>
+      <w:r>
+        <w:t xml:space="preserve"> </w:t>
+      </w:r>
+      <w:r>
+        <w:rPr>
+          <w:smallCaps/>
+        </w:rPr>
+        <w:t xml:space="preserve">Full</w:t>
+      </w:r>
+      <w:r>
+        <w:t xml:space="preserve"> </w:t>
+      </w:r>
+      <w:r>
+        <w:t xml:space="preserve">result is not hidden as an implementation failure; it states that the current dependency and error model cannot justify leaving enough state untouched. Conversely, a</w:t>
+      </w:r>
+      <w:r>
+        <w:t xml:space="preserve"> </w:t>
+      </w:r>
+      <w:r>
+        <w:rPr>
+          <w:smallCaps/>
+        </w:rPr>
+        <w:t xml:space="preserve">Local</w:t>
+      </w:r>
+      <w:r>
+        <w:t xml:space="preserve"> </w:t>
+      </w:r>
+      <w:r>
+        <w:t xml:space="preserve">result is meaningful only for the declared protected output and tolerance. Improving the method therefore means either exposing more exact dependency structure, deriving tighter conservative bounds, or reducing the actual work of the selected repair—not simply forcing more cases to be local.</w:t>
+      </w:r>
+    </w:p>
     <w:bookmarkEnd w:id="83"/>
-    <w:bookmarkStart w:id="84" w:name="reproducibility-and-artifact-scope"/>
+    <w:bookmarkEnd w:id="84"/>
+    <w:bookmarkStart w:id="85" w:name="reproducibility-and-artifact-scope"/>
     <w:p>
       <w:pPr>
         <w:pStyle w:val="Heading1"/>
@@ -11320,8 +11631,8 @@
         <w:t xml:space="preserve">Public datasets remain upstream assets, and the repository excludes their redistribution. The repository contains the dense reference certifier, native planner and Gaussian oracle, trained and seeded representation paths, baseline and ablation suites, deterministic statistics and visual-audit generators, residual-sensitive certificate tests, regression tests, and storage-safe campaign runners. For double-blind review, identifiable repository and author metadata should be replaced with an anonymized frozen supplement that follows the target venue’s policy.</w:t>
       </w:r>
     </w:p>
-    <w:bookmarkEnd w:id="84"/>
-    <w:bookmarkStart w:id="85" w:name="conclusion"/>
+    <w:bookmarkEnd w:id="85"/>
+    <w:bookmarkStart w:id="86" w:name="conclusion"/>
     <w:p>
       <w:pPr>
         <w:pStyle w:val="Heading1"/>
@@ -11344,7 +11655,7 @@
         <w:pStyle w:val="FirstParagraph"/>
       </w:pPr>
       <w:r>
-        <w:t xml:space="preserve">Criticality-Bounded Revision Cones give persistent 3D systems a way to avoid unnecessary global rebuilds while treating spatial locality as a hypothesis that must earn certification. A repair proceeds only when structural dependencies are closed, the effect left outside the selected region stays within the declared output tolerance, and the work remains worthwhile; otherwise MAVEB rebuilds. In the broad campaign, median calibrated selected work is 0.474 of</w:t>
+        <w:t xml:space="preserve">Persistent 3D reconstructions need an update rule between two extremes: rebuilding the entire scene after every change and trusting a geometrically local edit without accounting for the derived state it leaves behind. CBRC provides that rule. It treats the recomputed state as a revision cone, closes structural dependencies exactly, bounds supported influence outside the cone at the protected output, compares regional work with a full baseline, and returns</w:t>
       </w:r>
       <w:r>
         <w:t xml:space="preserve"> </w:t>
@@ -11356,7 +11667,10 @@
         <w:t xml:space="preserve">Full</w:t>
       </w:r>
       <w:r>
-        <w:t xml:space="preserve">, with both selective maintenance and fail-closed fallback exercised under independent replay. Stronger coupling progressively reduces the opportunity for reuse.</w:t>
+        <w:t xml:space="preserve"> </w:t>
+      </w:r>
+      <w:r>
+        <w:t xml:space="preserve">whenever those conditions do not justify reuse.</w:t>
       </w:r>
     </w:p>
     <w:p>
@@ -11364,11 +11678,11 @@
         <w:pStyle w:val="BodyText"/>
       </w:pPr>
       <w:r>
-        <w:t xml:space="preserve">The residual-sensitive sequence addresses the broad campaign’s exact-output limitation. V4 exposes the original certificate bottleneck, the opacity-delta refinement restores non-zero locality in v5, and the unchanged mechanism survives the 20-scene v6 confirmation. The paired opacity-minus-translation scene-level difference is 0.477 with 95% interval [0.432, 0.517]. Accepted residuals remain far from the tolerance boundary, making certificate tightness the main unresolved technical issue. The practical result is bounded and testable: recomputation shrinks when the dependency and error model can justify it and expands when that justification disappears.</w:t>
-      </w:r>
-    </w:p>
-    <w:bookmarkEnd w:id="85"/>
-    <w:bookmarkStart w:id="137" w:name="acknowledgments"/>
+        <w:t xml:space="preserve">In the 85-scene broad campaign, the algorithm selects 935 local repairs and 340 full fallbacks with no observed certificate violation under independent full-after replay; median calibrated selected work is 0.474 of the full baseline. The separate residual-sensitive study shows why certificate design matters: the original magnitude-insensitive bound rejects every non-zero residual case, while the opacity-delta refinement restores non-zero local decisions in all 20 confirmatory scenes and leaves the unchanged translation control at zero. The remaining challenge is tighter conservative output bounds and matched end-to-end runtime evaluation. The bounded claim is therefore straightforward: persistent graphics state can be recomputed selectively when the implementation can justify both the residual left outside the update and the work saved by retaining it.</w:t>
+      </w:r>
+    </w:p>
+    <w:bookmarkEnd w:id="86"/>
+    <w:bookmarkStart w:id="138" w:name="acknowledgments"/>
     <w:p>
       <w:pPr>
         <w:pStyle w:val="Heading1"/>
@@ -11377,7 +11691,7 @@
         <w:t xml:space="preserve">Acknowledgments</w:t>
       </w:r>
     </w:p>
-    <w:bookmarkStart w:id="86" w:name="dataset-acknowledgments."/>
+    <w:bookmarkStart w:id="87" w:name="dataset-acknowledgments."/>
     <w:p>
       <w:pPr>
         <w:pStyle w:val="Heading4"/>
@@ -11460,8 +11774,8 @@
         <w:t xml:space="preserve">. These citations follow the dataset providers’ requested publication references; upstream assets remain under their original terms and are not redistributed with this repository.</w:t>
       </w:r>
     </w:p>
-    <w:bookmarkEnd w:id="86"/>
-    <w:bookmarkStart w:id="136" w:name="generative-ai-use-disclosure."/>
+    <w:bookmarkEnd w:id="87"/>
+    <w:bookmarkStart w:id="137" w:name="generative-ai-use-disclosure."/>
     <w:p>
       <w:pPr>
         <w:pStyle w:val="Heading4"/>
@@ -11478,8 +11792,8 @@
         <w:t xml:space="preserve">OpenAI ChatGPT was used for literature-search support, software and scripting assistance, debugging, experiment planning, visualization and manuscript tooling, and drafting or language editing. Reported measurements and frozen evidence came from project software and experimental artifacts. The author is responsible for the code, citations, analysis, claims, conclusions, and final text; no generative AI system is listed as an author.</w:t>
       </w:r>
     </w:p>
-    <w:bookmarkStart w:id="135" w:name="refs"/>
-    <w:bookmarkStart w:id="88" w:name="ref-acar2013selfadjusting"/>
+    <w:bookmarkStart w:id="136" w:name="refs"/>
+    <w:bookmarkStart w:id="89" w:name="ref-acar2013selfadjusting"/>
     <w:p>
       <w:pPr>
         <w:pStyle w:val="Bibliography"/>
@@ -11512,7 +11826,7 @@
       <w:r>
         <w:t xml:space="preserve"> </w:t>
       </w:r>
-      <w:hyperlink r:id="rId87">
+      <w:hyperlink r:id="rId88">
         <w:r>
           <w:rPr>
             <w:rStyle w:val="Hyperlink"/>
@@ -11524,8 +11838,8 @@
         <w:t xml:space="preserve">.</w:t>
       </w:r>
     </w:p>
-    <w:bookmarkEnd w:id="88"/>
-    <w:bookmarkStart w:id="89" w:name="ref-ackermann2025clsplats"/>
+    <w:bookmarkEnd w:id="89"/>
+    <w:bookmarkStart w:id="90" w:name="ref-ackermann2025clsplats"/>
     <w:p>
       <w:pPr>
         <w:pStyle w:val="Bibliography"/>
@@ -11559,8 +11873,8 @@
         <w:t xml:space="preserve">, 7808–17.</w:t>
       </w:r>
     </w:p>
-    <w:bookmarkEnd w:id="89"/>
-    <w:bookmarkStart w:id="91" w:name="ref-bala1999raysegment"/>
+    <w:bookmarkEnd w:id="90"/>
+    <w:bookmarkStart w:id="92" w:name="ref-bala1999raysegment"/>
     <w:p>
       <w:pPr>
         <w:pStyle w:val="Bibliography"/>
@@ -11596,7 +11910,7 @@
       <w:r>
         <w:t xml:space="preserve"> </w:t>
       </w:r>
-      <w:hyperlink r:id="rId90">
+      <w:hyperlink r:id="rId91">
         <w:r>
           <w:rPr>
             <w:rStyle w:val="Hyperlink"/>
@@ -11608,8 +11922,8 @@
         <w:t xml:space="preserve">.</w:t>
       </w:r>
     </w:p>
-    <w:bookmarkEnd w:id="91"/>
-    <w:bookmarkStart w:id="93" w:name="ref-barron2022mipnerf360"/>
+    <w:bookmarkEnd w:id="92"/>
+    <w:bookmarkStart w:id="94" w:name="ref-barron2022mipnerf360"/>
     <w:p>
       <w:pPr>
         <w:pStyle w:val="Bibliography"/>
@@ -11645,7 +11959,7 @@
       <w:r>
         <w:t xml:space="preserve"> </w:t>
       </w:r>
-      <w:hyperlink r:id="rId92">
+      <w:hyperlink r:id="rId93">
         <w:r>
           <w:rPr>
             <w:rStyle w:val="Hyperlink"/>
@@ -11657,8 +11971,8 @@
         <w:t xml:space="preserve">.</w:t>
       </w:r>
     </w:p>
-    <w:bookmarkEnd w:id="93"/>
-    <w:bookmarkStart w:id="94" w:name="ref-baruch2021arkitscenes"/>
+    <w:bookmarkEnd w:id="94"/>
+    <w:bookmarkStart w:id="95" w:name="ref-baruch2021arkitscenes"/>
     <w:p>
       <w:pPr>
         <w:pStyle w:val="Bibliography"/>
@@ -11710,8 +12024,8 @@
         <w:t xml:space="preserve">.</w:t>
       </w:r>
     </w:p>
-    <w:bookmarkEnd w:id="94"/>
-    <w:bookmarkStart w:id="96" w:name="ref-chen2024gaussianeditor"/>
+    <w:bookmarkEnd w:id="95"/>
+    <w:bookmarkStart w:id="97" w:name="ref-chen2024gaussianeditor"/>
     <w:p>
       <w:pPr>
         <w:pStyle w:val="Bibliography"/>
@@ -11747,7 +12061,7 @@
       <w:r>
         <w:t xml:space="preserve"> </w:t>
       </w:r>
-      <w:hyperlink r:id="rId95">
+      <w:hyperlink r:id="rId96">
         <w:r>
           <w:rPr>
             <w:rStyle w:val="Hyperlink"/>
@@ -11759,8 +12073,8 @@
         <w:t xml:space="preserve">.</w:t>
       </w:r>
     </w:p>
-    <w:bookmarkEnd w:id="96"/>
-    <w:bookmarkStart w:id="97" w:name="ref-curless1996volumetric"/>
+    <w:bookmarkEnd w:id="97"/>
+    <w:bookmarkStart w:id="98" w:name="ref-curless1996volumetric"/>
     <w:p>
       <w:pPr>
         <w:pStyle w:val="Bibliography"/>
@@ -11794,8 +12108,8 @@
         <w:t xml:space="preserve">, 303–12.</w:t>
       </w:r>
     </w:p>
-    <w:bookmarkEnd w:id="97"/>
-    <w:bookmarkStart w:id="99" w:name="ref-dai2017bundlefusion"/>
+    <w:bookmarkEnd w:id="98"/>
+    <w:bookmarkStart w:id="100" w:name="ref-dai2017bundlefusion"/>
     <w:p>
       <w:pPr>
         <w:pStyle w:val="Bibliography"/>
@@ -11828,7 +12142,7 @@
       <w:r>
         <w:t xml:space="preserve"> </w:t>
       </w:r>
-      <w:hyperlink r:id="rId98">
+      <w:hyperlink r:id="rId99">
         <w:r>
           <w:rPr>
             <w:rStyle w:val="Hyperlink"/>
@@ -11840,8 +12154,8 @@
         <w:t xml:space="preserve">.</w:t>
       </w:r>
     </w:p>
-    <w:bookmarkEnd w:id="99"/>
-    <w:bookmarkStart w:id="100" w:name="ref-ellensohn2026eligsir"/>
+    <w:bookmarkEnd w:id="100"/>
+    <w:bookmarkStart w:id="101" w:name="ref-ellensohn2026eligsir"/>
     <w:p>
       <w:pPr>
         <w:pStyle w:val="Bibliography"/>
@@ -11869,8 +12183,8 @@
         <w:t xml:space="preserve">.</w:t>
       </w:r>
     </w:p>
-    <w:bookmarkEnd w:id="100"/>
-    <w:bookmarkStart w:id="101" w:name="ref-galappaththige2026pixels"/>
+    <w:bookmarkEnd w:id="101"/>
+    <w:bookmarkStart w:id="102" w:name="ref-galappaththige2026pixels"/>
     <w:p>
       <w:pPr>
         <w:pStyle w:val="Bibliography"/>
@@ -11898,8 +12212,8 @@
         <w:t xml:space="preserve">.</w:t>
       </w:r>
     </w:p>
-    <w:bookmarkEnd w:id="101"/>
-    <w:bookmarkStart w:id="103" w:name="ref-hedman2018deepblending"/>
+    <w:bookmarkEnd w:id="102"/>
+    <w:bookmarkStart w:id="104" w:name="ref-hedman2018deepblending"/>
     <w:p>
       <w:pPr>
         <w:pStyle w:val="Bibliography"/>
@@ -11932,7 +12246,7 @@
       <w:r>
         <w:t xml:space="preserve"> </w:t>
       </w:r>
-      <w:hyperlink r:id="rId102">
+      <w:hyperlink r:id="rId103">
         <w:r>
           <w:rPr>
             <w:rStyle w:val="Hyperlink"/>
@@ -11944,8 +12258,8 @@
         <w:t xml:space="preserve">.</w:t>
       </w:r>
     </w:p>
-    <w:bookmarkEnd w:id="103"/>
-    <w:bookmarkStart w:id="105" w:name="ref-huang2024scgs"/>
+    <w:bookmarkEnd w:id="104"/>
+    <w:bookmarkStart w:id="106" w:name="ref-huang2024scgs"/>
     <w:p>
       <w:pPr>
         <w:pStyle w:val="Bibliography"/>
@@ -11981,7 +12295,7 @@
       <w:r>
         <w:t xml:space="preserve"> </w:t>
       </w:r>
-      <w:hyperlink r:id="rId104">
+      <w:hyperlink r:id="rId105">
         <w:r>
           <w:rPr>
             <w:rStyle w:val="Hyperlink"/>
@@ -11993,8 +12307,8 @@
         <w:t xml:space="preserve">.</w:t>
       </w:r>
     </w:p>
-    <w:bookmarkEnd w:id="105"/>
-    <w:bookmarkStart w:id="106" w:name="ref-keetha2024splatam"/>
+    <w:bookmarkEnd w:id="106"/>
+    <w:bookmarkStart w:id="107" w:name="ref-keetha2024splatam"/>
     <w:p>
       <w:pPr>
         <w:pStyle w:val="Bibliography"/>
@@ -12028,8 +12342,8 @@
         <w:t xml:space="preserve">, 21357–66.</w:t>
       </w:r>
     </w:p>
-    <w:bookmarkEnd w:id="106"/>
-    <w:bookmarkStart w:id="108" w:name="ref-kerbl2023gaussians"/>
+    <w:bookmarkEnd w:id="107"/>
+    <w:bookmarkStart w:id="109" w:name="ref-kerbl2023gaussians"/>
     <w:p>
       <w:pPr>
         <w:pStyle w:val="Bibliography"/>
@@ -12062,7 +12376,7 @@
       <w:r>
         <w:t xml:space="preserve"> </w:t>
       </w:r>
-      <w:hyperlink r:id="rId107">
+      <w:hyperlink r:id="rId108">
         <w:r>
           <w:rPr>
             <w:rStyle w:val="Hyperlink"/>
@@ -12074,8 +12388,8 @@
         <w:t xml:space="preserve">.</w:t>
       </w:r>
     </w:p>
-    <w:bookmarkEnd w:id="108"/>
-    <w:bookmarkStart w:id="110" w:name="ref-knapitsch2017tandt"/>
+    <w:bookmarkEnd w:id="109"/>
+    <w:bookmarkStart w:id="111" w:name="ref-knapitsch2017tandt"/>
     <w:p>
       <w:pPr>
         <w:pStyle w:val="Bibliography"/>
@@ -12108,7 +12422,7 @@
       <w:r>
         <w:t xml:space="preserve"> </w:t>
       </w:r>
-      <w:hyperlink r:id="rId109">
+      <w:hyperlink r:id="rId110">
         <w:r>
           <w:rPr>
             <w:rStyle w:val="Hyperlink"/>
@@ -12120,8 +12434,8 @@
         <w:t xml:space="preserve">.</w:t>
       </w:r>
     </w:p>
-    <w:bookmarkEnd w:id="110"/>
-    <w:bookmarkStart w:id="112" w:name="ref-luiten2024dynamic3dgaussians"/>
+    <w:bookmarkEnd w:id="111"/>
+    <w:bookmarkStart w:id="113" w:name="ref-luiten2024dynamic3dgaussians"/>
     <w:p>
       <w:pPr>
         <w:pStyle w:val="Bibliography"/>
@@ -12157,7 +12471,7 @@
       <w:r>
         <w:t xml:space="preserve"> </w:t>
       </w:r>
-      <w:hyperlink r:id="rId111">
+      <w:hyperlink r:id="rId112">
         <w:r>
           <w:rPr>
             <w:rStyle w:val="Hyperlink"/>
@@ -12169,8 +12483,8 @@
         <w:t xml:space="preserve">.</w:t>
       </w:r>
     </w:p>
-    <w:bookmarkEnd w:id="112"/>
-    <w:bookmarkStart w:id="114" w:name="ref-matsuki2024monogs"/>
+    <w:bookmarkEnd w:id="113"/>
+    <w:bookmarkStart w:id="115" w:name="ref-matsuki2024monogs"/>
     <w:p>
       <w:pPr>
         <w:pStyle w:val="Bibliography"/>
@@ -12206,7 +12520,7 @@
       <w:r>
         <w:t xml:space="preserve"> </w:t>
       </w:r>
-      <w:hyperlink r:id="rId113">
+      <w:hyperlink r:id="rId114">
         <w:r>
           <w:rPr>
             <w:rStyle w:val="Hyperlink"/>
@@ -12218,8 +12532,8 @@
         <w:t xml:space="preserve">.</w:t>
       </w:r>
     </w:p>
-    <w:bookmarkEnd w:id="114"/>
-    <w:bookmarkStart w:id="115" w:name="ref-mildenhall2020nerf"/>
+    <w:bookmarkEnd w:id="115"/>
+    <w:bookmarkStart w:id="116" w:name="ref-mildenhall2020nerf"/>
     <w:p>
       <w:pPr>
         <w:pStyle w:val="Bibliography"/>
@@ -12253,8 +12567,8 @@
         <w:t xml:space="preserve">, 405–21.</w:t>
       </w:r>
     </w:p>
-    <w:bookmarkEnd w:id="115"/>
-    <w:bookmarkStart w:id="116" w:name="ref-newcombe2011kinectfusion"/>
+    <w:bookmarkEnd w:id="116"/>
+    <w:bookmarkStart w:id="117" w:name="ref-newcombe2011kinectfusion"/>
     <w:p>
       <w:pPr>
         <w:pStyle w:val="Bibliography"/>
@@ -12288,8 +12602,8 @@
         <w:t xml:space="preserve">, 127–36.</w:t>
       </w:r>
     </w:p>
-    <w:bookmarkEnd w:id="116"/>
-    <w:bookmarkStart w:id="118" w:name="ref-oden2001goal"/>
+    <w:bookmarkEnd w:id="117"/>
+    <w:bookmarkStart w:id="119" w:name="ref-oden2001goal"/>
     <w:p>
       <w:pPr>
         <w:pStyle w:val="Bibliography"/>
@@ -12322,7 +12636,7 @@
       <w:r>
         <w:t xml:space="preserve"> </w:t>
       </w:r>
-      <w:hyperlink r:id="rId117">
+      <w:hyperlink r:id="rId118">
         <w:r>
           <w:rPr>
             <w:rStyle w:val="Hyperlink"/>
@@ -12334,8 +12648,8 @@
         <w:t xml:space="preserve">.</w:t>
       </w:r>
     </w:p>
-    <w:bookmarkEnd w:id="118"/>
-    <w:bookmarkStart w:id="119" w:name="ref-palazzolo2019refusion"/>
+    <w:bookmarkEnd w:id="119"/>
+    <w:bookmarkStart w:id="120" w:name="ref-palazzolo2019refusion"/>
     <w:p>
       <w:pPr>
         <w:pStyle w:val="Bibliography"/>
@@ -12381,8 +12695,8 @@
         <w:t xml:space="preserve">.</w:t>
       </w:r>
     </w:p>
-    <w:bookmarkEnd w:id="119"/>
-    <w:bookmarkStart w:id="121" w:name="ref-pfister2000surfels"/>
+    <w:bookmarkEnd w:id="120"/>
+    <w:bookmarkStart w:id="122" w:name="ref-pfister2000surfels"/>
     <w:p>
       <w:pPr>
         <w:pStyle w:val="Bibliography"/>
@@ -12418,7 +12732,7 @@
       <w:r>
         <w:t xml:space="preserve"> </w:t>
       </w:r>
-      <w:hyperlink r:id="rId120">
+      <w:hyperlink r:id="rId121">
         <w:r>
           <w:rPr>
             <w:rStyle w:val="Hyperlink"/>
@@ -12430,8 +12744,8 @@
         <w:t xml:space="preserve">.</w:t>
       </w:r>
     </w:p>
-    <w:bookmarkEnd w:id="121"/>
-    <w:bookmarkStart w:id="123" w:name="ref-sucar2021imap"/>
+    <w:bookmarkEnd w:id="122"/>
+    <w:bookmarkStart w:id="124" w:name="ref-sucar2021imap"/>
     <w:p>
       <w:pPr>
         <w:pStyle w:val="Bibliography"/>
@@ -12467,7 +12781,7 @@
       <w:r>
         <w:t xml:space="preserve"> </w:t>
       </w:r>
-      <w:hyperlink r:id="rId122">
+      <w:hyperlink r:id="rId123">
         <w:r>
           <w:rPr>
             <w:rStyle w:val="Hyperlink"/>
@@ -12479,8 +12793,8 @@
         <w:t xml:space="preserve">.</w:t>
       </w:r>
     </w:p>
-    <w:bookmarkEnd w:id="123"/>
-    <w:bookmarkStart w:id="124" w:name="ref-wald2019rio"/>
+    <w:bookmarkEnd w:id="124"/>
+    <w:bookmarkStart w:id="125" w:name="ref-wald2019rio"/>
     <w:p>
       <w:pPr>
         <w:pStyle w:val="Bibliography"/>
@@ -12514,8 +12828,8 @@
         <w:t xml:space="preserve">, 7658–67.</w:t>
       </w:r>
     </w:p>
-    <w:bookmarkEnd w:id="124"/>
-    <w:bookmarkStart w:id="125" w:name="ref-whelan2015elasticfusion"/>
+    <w:bookmarkEnd w:id="125"/>
+    <w:bookmarkStart w:id="126" w:name="ref-whelan2015elasticfusion"/>
     <w:p>
       <w:pPr>
         <w:pStyle w:val="Bibliography"/>
@@ -12549,8 +12863,8 @@
         <w:t xml:space="preserve">.</w:t>
       </w:r>
     </w:p>
-    <w:bookmarkEnd w:id="125"/>
-    <w:bookmarkStart w:id="127" w:name="ref-woerister2013lazy"/>
+    <w:bookmarkEnd w:id="126"/>
+    <w:bookmarkStart w:id="128" w:name="ref-woerister2013lazy"/>
     <w:p>
       <w:pPr>
         <w:pStyle w:val="Bibliography"/>
@@ -12586,7 +12900,7 @@
       <w:r>
         <w:t xml:space="preserve"> </w:t>
       </w:r>
-      <w:hyperlink r:id="rId126">
+      <w:hyperlink r:id="rId127">
         <w:r>
           <w:rPr>
             <w:rStyle w:val="Hyperlink"/>
@@ -12598,8 +12912,8 @@
         <w:t xml:space="preserve">.</w:t>
       </w:r>
     </w:p>
-    <w:bookmarkEnd w:id="127"/>
-    <w:bookmarkStart w:id="129" w:name="ref-wu2024fourDGS"/>
+    <w:bookmarkEnd w:id="128"/>
+    <w:bookmarkStart w:id="130" w:name="ref-wu2024fourDGS"/>
     <w:p>
       <w:pPr>
         <w:pStyle w:val="Bibliography"/>
@@ -12635,7 +12949,7 @@
       <w:r>
         <w:t xml:space="preserve"> </w:t>
       </w:r>
-      <w:hyperlink r:id="rId128">
+      <w:hyperlink r:id="rId129">
         <w:r>
           <w:rPr>
             <w:rStyle w:val="Hyperlink"/>
@@ -12647,8 +12961,8 @@
         <w:t xml:space="preserve">.</w:t>
       </w:r>
     </w:p>
-    <w:bookmarkEnd w:id="129"/>
-    <w:bookmarkStart w:id="130" w:name="ref-wu2026cif"/>
+    <w:bookmarkEnd w:id="130"/>
+    <w:bookmarkStart w:id="131" w:name="ref-wu2026cif"/>
     <w:p>
       <w:pPr>
         <w:pStyle w:val="Bibliography"/>
@@ -12682,8 +12996,8 @@
         <w:t xml:space="preserve">, 3783–93.</w:t>
       </w:r>
     </w:p>
-    <w:bookmarkEnd w:id="130"/>
-    <w:bookmarkStart w:id="131" w:name="ref-yugay2026game"/>
+    <w:bookmarkEnd w:id="131"/>
+    <w:bookmarkStart w:id="132" w:name="ref-yugay2026game"/>
     <w:p>
       <w:pPr>
         <w:pStyle w:val="Bibliography"/>
@@ -12717,8 +13031,8 @@
         <w:t xml:space="preserve">, 18903–12.</w:t>
       </w:r>
     </w:p>
-    <w:bookmarkEnd w:id="131"/>
-    <w:bookmarkStart w:id="133" w:name="ref-zeng2025gaussianupdate"/>
+    <w:bookmarkEnd w:id="132"/>
+    <w:bookmarkStart w:id="134" w:name="ref-zeng2025gaussianupdate"/>
     <w:p>
       <w:pPr>
         <w:pStyle w:val="Bibliography"/>
@@ -12754,7 +13068,7 @@
       <w:r>
         <w:t xml:space="preserve"> </w:t>
       </w:r>
-      <w:hyperlink r:id="rId132">
+      <w:hyperlink r:id="rId133">
         <w:r>
           <w:rPr>
             <w:rStyle w:val="Hyperlink"/>
@@ -12766,8 +13080,8 @@
         <w:t xml:space="preserve">.</w:t>
       </w:r>
     </w:p>
-    <w:bookmarkEnd w:id="133"/>
-    <w:bookmarkStart w:id="134" w:name="ref-zhu2022niceslam"/>
+    <w:bookmarkEnd w:id="134"/>
+    <w:bookmarkStart w:id="135" w:name="ref-zhu2022niceslam"/>
     <w:p>
       <w:pPr>
         <w:pStyle w:val="Bibliography"/>
@@ -12801,10 +13115,10 @@
         <w:t xml:space="preserve">, 12786–96.</w:t>
       </w:r>
     </w:p>
-    <w:bookmarkEnd w:id="134"/>
     <w:bookmarkEnd w:id="135"/>
     <w:bookmarkEnd w:id="136"/>
     <w:bookmarkEnd w:id="137"/>
+    <w:bookmarkEnd w:id="138"/>
     <w:sectPr>
       <w:pgSz w:w="12240" w:h="15840"/>
       <w:pgMar w:top="1008" w:bottom="1008" w:left="1008" w:right="1008"/>
@@ -12914,6 +13228,91 @@
       </w:pPr>
     </w:lvl>
   </w:abstractNum>
+  <w:abstractNum w:abstractNumId="99201">
+    <w:nsid w:val="A99201"/>
+    <w:multiLevelType w:val="multilevel"/>
+    <w:lvl w:ilvl="0">
+      <w:start w:val="1"/>
+      <w:numFmt w:val="decimal"/>
+      <w:lvlText w:val="%1."/>
+      <w:lvlJc w:val="left"/>
+      <w:pPr>
+        <w:ind w:left="720" w:hanging="480"/>
+      </w:pPr>
+    </w:lvl>
+    <w:lvl w:ilvl="1">
+      <w:start w:val="1"/>
+      <w:numFmt w:val="lowerLetter"/>
+      <w:lvlText w:val="%2."/>
+      <w:lvlJc w:val="left"/>
+      <w:pPr>
+        <w:ind w:left="1440" w:hanging="480"/>
+      </w:pPr>
+    </w:lvl>
+    <w:lvl w:ilvl="2">
+      <w:start w:val="1"/>
+      <w:numFmt w:val="lowerRoman"/>
+      <w:lvlText w:val="%3."/>
+      <w:lvlJc w:val="left"/>
+      <w:pPr>
+        <w:ind w:left="2160" w:hanging="480"/>
+      </w:pPr>
+    </w:lvl>
+    <w:lvl w:ilvl="3">
+      <w:start w:val="1"/>
+      <w:numFmt w:val="decimal"/>
+      <w:lvlText w:val="%4."/>
+      <w:lvlJc w:val="left"/>
+      <w:pPr>
+        <w:ind w:left="2880" w:hanging="480"/>
+      </w:pPr>
+    </w:lvl>
+    <w:lvl w:ilvl="4">
+      <w:start w:val="1"/>
+      <w:numFmt w:val="lowerLetter"/>
+      <w:lvlText w:val="%5."/>
+      <w:lvlJc w:val="left"/>
+      <w:pPr>
+        <w:ind w:left="3600" w:hanging="480"/>
+      </w:pPr>
+    </w:lvl>
+    <w:lvl w:ilvl="5">
+      <w:start w:val="1"/>
+      <w:numFmt w:val="lowerRoman"/>
+      <w:lvlText w:val="%6."/>
+      <w:lvlJc w:val="left"/>
+      <w:pPr>
+        <w:ind w:left="4320" w:hanging="480"/>
+      </w:pPr>
+    </w:lvl>
+    <w:lvl w:ilvl="6">
+      <w:start w:val="1"/>
+      <w:numFmt w:val="decimal"/>
+      <w:lvlText w:val="%7."/>
+      <w:lvlJc w:val="left"/>
+      <w:pPr>
+        <w:ind w:left="5040" w:hanging="480"/>
+      </w:pPr>
+    </w:lvl>
+    <w:lvl w:ilvl="7">
+      <w:start w:val="1"/>
+      <w:numFmt w:val="lowerLetter"/>
+      <w:lvlText w:val="%8."/>
+      <w:lvlJc w:val="left"/>
+      <w:pPr>
+        <w:ind w:left="5760" w:hanging="480"/>
+      </w:pPr>
+    </w:lvl>
+    <w:lvl w:ilvl="8">
+      <w:start w:val="1"/>
+      <w:numFmt w:val="lowerRoman"/>
+      <w:lvlText w:val="%9."/>
+      <w:lvlJc w:val="left"/>
+      <w:pPr>
+        <w:ind w:left="6480" w:hanging="480"/>
+      </w:pPr>
+    </w:lvl>
+  </w:abstractNum>
   <w:abstractNum w:abstractNumId="991">
     <w:nsid w:val="A991"/>
     <w:multiLevelType w:val="multilevel"/>
@@ -12994,6 +13393,36 @@
     <w:abstractNumId w:val="990"/>
   </w:num>
   <w:num w:numId="1001">
+    <w:abstractNumId w:val="99201"/>
+    <w:lvlOverride w:ilvl="0">
+      <w:startOverride w:val="1"/>
+    </w:lvlOverride>
+    <w:lvlOverride w:ilvl="1">
+      <w:startOverride w:val="1"/>
+    </w:lvlOverride>
+    <w:lvlOverride w:ilvl="2">
+      <w:startOverride w:val="1"/>
+    </w:lvlOverride>
+    <w:lvlOverride w:ilvl="3">
+      <w:startOverride w:val="1"/>
+    </w:lvlOverride>
+    <w:lvlOverride w:ilvl="4">
+      <w:startOverride w:val="1"/>
+    </w:lvlOverride>
+    <w:lvlOverride w:ilvl="5">
+      <w:startOverride w:val="1"/>
+    </w:lvlOverride>
+    <w:lvlOverride w:ilvl="6">
+      <w:startOverride w:val="1"/>
+    </w:lvlOverride>
+    <w:lvlOverride w:ilvl="7">
+      <w:startOverride w:val="1"/>
+    </w:lvlOverride>
+    <w:lvlOverride w:ilvl="8">
+      <w:startOverride w:val="1"/>
+    </w:lvlOverride>
+  </w:num>
+  <w:num w:numId="1002">
     <w:abstractNumId w:val="991"/>
   </w:num>
 </w:numbering>

</xml_diff>